<commit_message>
Docs: Cambios de seccion - Evidencia de Aplicacion
Cambie la seccion de tablero por evidencia de aplicacion. Aparte, agregue dos subtitulos a esta seccion.
</commit_message>
<xml_diff>
--- a/docs/entrega2/EPRO_Entrega2_Grupo9_Plataforma de gestión documental con versiones.docx
+++ b/docs/entrega2/EPRO_Entrega2_Grupo9_Plataforma de gestión documental con versiones.docx
@@ -359,39 +359,8 @@
                 <w:szCs w:val="24"/>
                 <w:lang w:val="es-SV"/>
               </w:rPr>
-              <w:t xml:space="preserve">Ing. </w:t>
-            </w:r>
-            <w:proofErr w:type="spellStart"/>
-            <w:r>
-              <w:rPr>
-                <w:rFonts w:ascii="Arial" w:eastAsia="Calibri" w:hAnsi="Arial" w:cs="Arial"/>
-                <w:sz w:val="24"/>
-                <w:szCs w:val="24"/>
-                <w:lang w:val="es-SV"/>
-              </w:rPr>
-              <w:t>Ruben</w:t>
-            </w:r>
-            <w:proofErr w:type="spellEnd"/>
-            <w:r>
-              <w:rPr>
-                <w:rFonts w:ascii="Arial" w:eastAsia="Calibri" w:hAnsi="Arial" w:cs="Arial"/>
-                <w:sz w:val="24"/>
-                <w:szCs w:val="24"/>
-                <w:lang w:val="es-SV"/>
-              </w:rPr>
-              <w:t xml:space="preserve"> Escobar </w:t>
-            </w:r>
-            <w:proofErr w:type="spellStart"/>
-            <w:r>
-              <w:rPr>
-                <w:rFonts w:ascii="Arial" w:eastAsia="Calibri" w:hAnsi="Arial" w:cs="Arial"/>
-                <w:sz w:val="24"/>
-                <w:szCs w:val="24"/>
-                <w:lang w:val="es-SV"/>
-              </w:rPr>
-              <w:t>Ortegon</w:t>
-            </w:r>
-            <w:proofErr w:type="spellEnd"/>
+              <w:t>Ing. Ruben Escobar Ortegon</w:t>
+            </w:r>
           </w:p>
         </w:tc>
       </w:tr>
@@ -583,7 +552,6 @@
                 <w:szCs w:val="24"/>
               </w:rPr>
             </w:pPr>
-            <w:proofErr w:type="spellStart"/>
             <w:r>
               <w:rPr>
                 <w:rFonts w:ascii="Arial" w:eastAsia="Calibri" w:hAnsi="Arial" w:cs="Arial"/>
@@ -592,18 +560,7 @@
                 <w:sz w:val="24"/>
                 <w:szCs w:val="24"/>
               </w:rPr>
-              <w:t>Alumnos</w:t>
-            </w:r>
-            <w:proofErr w:type="spellEnd"/>
-            <w:r>
-              <w:rPr>
-                <w:rFonts w:ascii="Arial" w:eastAsia="Calibri" w:hAnsi="Arial" w:cs="Arial"/>
-                <w:b/>
-                <w:bCs/>
-                <w:sz w:val="24"/>
-                <w:szCs w:val="24"/>
-              </w:rPr>
-              <w:t>:</w:t>
+              <w:t>Alumnos:</w:t>
             </w:r>
           </w:p>
         </w:tc>
@@ -661,25 +618,7 @@
                 <w:sz w:val="24"/>
                 <w:szCs w:val="24"/>
               </w:rPr>
-              <w:t xml:space="preserve">Cordova </w:t>
-            </w:r>
-            <w:proofErr w:type="spellStart"/>
-            <w:r>
-              <w:rPr>
-                <w:rFonts w:ascii="Arial" w:eastAsia="Calibri" w:hAnsi="Arial" w:cs="Arial"/>
-                <w:sz w:val="24"/>
-                <w:szCs w:val="24"/>
-              </w:rPr>
-              <w:t>Kanter</w:t>
-            </w:r>
-            <w:proofErr w:type="spellEnd"/>
-            <w:r>
-              <w:rPr>
-                <w:rFonts w:ascii="Arial" w:eastAsia="Calibri" w:hAnsi="Arial" w:cs="Arial"/>
-                <w:sz w:val="24"/>
-                <w:szCs w:val="24"/>
-              </w:rPr>
-              <w:t>, Ricardo</w:t>
+              <w:t>Cordova Kanter, Ricardo</w:t>
             </w:r>
           </w:p>
         </w:tc>
@@ -787,18 +726,8 @@
                 <w:sz w:val="24"/>
                 <w:szCs w:val="24"/>
               </w:rPr>
-              <w:t xml:space="preserve">Herrera Cortez Jose </w:t>
-            </w:r>
-            <w:proofErr w:type="spellStart"/>
-            <w:r>
-              <w:rPr>
-                <w:rFonts w:ascii="Arial" w:eastAsia="Calibri" w:hAnsi="Arial" w:cs="Arial"/>
-                <w:sz w:val="24"/>
-                <w:szCs w:val="24"/>
-              </w:rPr>
-              <w:t>Neftali</w:t>
-            </w:r>
-            <w:proofErr w:type="spellEnd"/>
+              <w:t>Herrera Cortez Jose Neftali</w:t>
+            </w:r>
           </w:p>
         </w:tc>
         <w:tc>
@@ -845,23 +774,13 @@
                 <w:szCs w:val="24"/>
               </w:rPr>
             </w:pPr>
-            <w:proofErr w:type="spellStart"/>
             <w:r>
               <w:rPr>
                 <w:rFonts w:ascii="Arial" w:eastAsia="Calibri" w:hAnsi="Arial" w:cs="Arial"/>
                 <w:sz w:val="24"/>
                 <w:szCs w:val="24"/>
               </w:rPr>
-              <w:t>Mejía</w:t>
-            </w:r>
-            <w:proofErr w:type="spellEnd"/>
-            <w:r>
-              <w:rPr>
-                <w:rFonts w:ascii="Arial" w:eastAsia="Calibri" w:hAnsi="Arial" w:cs="Arial"/>
-                <w:sz w:val="24"/>
-                <w:szCs w:val="24"/>
-              </w:rPr>
-              <w:t xml:space="preserve"> Méndez Ronald Joel</w:t>
+              <w:t>Mejía Méndez Ronald Joel</w:t>
             </w:r>
           </w:p>
         </w:tc>
@@ -913,17 +832,8 @@
                 <w:rFonts w:ascii="Arial" w:eastAsia="Calibri" w:hAnsi="Arial" w:cs="Arial"/>
                 <w:sz w:val="24"/>
               </w:rPr>
-              <w:t xml:space="preserve">César Orlando Morales </w:t>
-            </w:r>
-            <w:proofErr w:type="spellStart"/>
-            <w:r>
-              <w:rPr>
-                <w:rFonts w:ascii="Arial" w:eastAsia="Calibri" w:hAnsi="Arial" w:cs="Arial"/>
-                <w:sz w:val="24"/>
-              </w:rPr>
-              <w:t>López</w:t>
-            </w:r>
-            <w:proofErr w:type="spellEnd"/>
+              <w:t>César Orlando Morales López</w:t>
+            </w:r>
           </w:p>
         </w:tc>
         <w:tc>
@@ -3321,10 +3231,44 @@
           <w:szCs w:val="24"/>
           <w:lang w:val="es-SV"/>
         </w:rPr>
-        <w:t xml:space="preserve">Uso específico de </w:t>
+        <w:t>Uso específico de commits en Github</w:t>
       </w:r>
-      <w:proofErr w:type="spellStart"/>
-      <w:r>
+    </w:p>
+    <w:p>
+      <w:pPr>
+        <w:rPr>
+          <w:rFonts w:ascii="Arial" w:hAnsi="Arial" w:cs="Arial"/>
+          <w:lang w:val="es-SV"/>
+        </w:rPr>
+      </w:pPr>
+    </w:p>
+    <w:p>
+      <w:pPr>
+        <w:rPr>
+          <w:rFonts w:ascii="Arial" w:hAnsi="Arial" w:cs="Arial"/>
+          <w:lang w:val="es-SV"/>
+        </w:rPr>
+      </w:pPr>
+    </w:p>
+    <w:p>
+      <w:pPr>
+        <w:rPr>
+          <w:rFonts w:ascii="Arial" w:hAnsi="Arial" w:cs="Arial"/>
+          <w:lang w:val="es-SV"/>
+        </w:rPr>
+      </w:pPr>
+    </w:p>
+    <w:p>
+      <w:pPr>
+        <w:rPr>
+          <w:rFonts w:ascii="Arial" w:hAnsi="Arial" w:cs="Arial"/>
+          <w:lang w:val="es-SV"/>
+        </w:rPr>
+      </w:pPr>
+    </w:p>
+    <w:p>
+      <w:pPr>
+        <w:pStyle w:val="Ttulo2"/>
         <w:rPr>
           <w:rFonts w:ascii="Arial" w:hAnsi="Arial" w:cs="Arial"/>
           <w:color w:val="auto"/>
@@ -3332,9 +3276,7 @@
           <w:szCs w:val="24"/>
           <w:lang w:val="es-SV"/>
         </w:rPr>
-        <w:t>commits</w:t>
-      </w:r>
-      <w:proofErr w:type="spellEnd"/>
+      </w:pPr>
       <w:r>
         <w:rPr>
           <w:rFonts w:ascii="Arial" w:hAnsi="Arial" w:cs="Arial"/>
@@ -3343,10 +3285,40 @@
           <w:szCs w:val="24"/>
           <w:lang w:val="es-SV"/>
         </w:rPr>
-        <w:t xml:space="preserve"> en </w:t>
+        <w:t>Uso de status en el tablero</w:t>
       </w:r>
-      <w:proofErr w:type="spellStart"/>
-      <w:r>
+    </w:p>
+    <w:p>
+      <w:pPr>
+        <w:rPr>
+          <w:lang w:val="es-SV"/>
+        </w:rPr>
+      </w:pPr>
+    </w:p>
+    <w:p>
+      <w:pPr>
+        <w:rPr>
+          <w:lang w:val="es-SV"/>
+        </w:rPr>
+      </w:pPr>
+    </w:p>
+    <w:p>
+      <w:pPr>
+        <w:rPr>
+          <w:lang w:val="es-SV"/>
+        </w:rPr>
+      </w:pPr>
+    </w:p>
+    <w:p>
+      <w:pPr>
+        <w:rPr>
+          <w:lang w:val="es-SV"/>
+        </w:rPr>
+      </w:pPr>
+    </w:p>
+    <w:p>
+      <w:pPr>
+        <w:pStyle w:val="Ttulo2"/>
         <w:rPr>
           <w:rFonts w:ascii="Arial" w:hAnsi="Arial" w:cs="Arial"/>
           <w:color w:val="auto"/>
@@ -3354,45 +3326,8 @@
           <w:szCs w:val="24"/>
           <w:lang w:val="es-SV"/>
         </w:rPr>
-        <w:t>Github</w:t>
-      </w:r>
-      <w:proofErr w:type="spellEnd"/>
-    </w:p>
-    <w:p>
-      <w:pPr>
-        <w:rPr>
-          <w:rFonts w:ascii="Arial" w:hAnsi="Arial" w:cs="Arial"/>
-          <w:lang w:val="es-SV"/>
-        </w:rPr>
-      </w:pPr>
-    </w:p>
-    <w:p>
-      <w:pPr>
-        <w:rPr>
-          <w:rFonts w:ascii="Arial" w:hAnsi="Arial" w:cs="Arial"/>
-          <w:lang w:val="es-SV"/>
-        </w:rPr>
-      </w:pPr>
-    </w:p>
-    <w:p>
-      <w:pPr>
-        <w:rPr>
-          <w:rFonts w:ascii="Arial" w:hAnsi="Arial" w:cs="Arial"/>
-          <w:lang w:val="es-SV"/>
-        </w:rPr>
-      </w:pPr>
-    </w:p>
-    <w:p>
-      <w:pPr>
-        <w:rPr>
-          <w:rFonts w:ascii="Arial" w:hAnsi="Arial" w:cs="Arial"/>
-          <w:lang w:val="es-SV"/>
-        </w:rPr>
-      </w:pPr>
-    </w:p>
-    <w:p>
-      <w:pPr>
-        <w:pStyle w:val="Ttulo2"/>
+      </w:pPr>
+      <w:r>
         <w:rPr>
           <w:rFonts w:ascii="Arial" w:hAnsi="Arial" w:cs="Arial"/>
           <w:color w:val="auto"/>
@@ -3400,8 +3335,40 @@
           <w:szCs w:val="24"/>
           <w:lang w:val="es-SV"/>
         </w:rPr>
-      </w:pPr>
-      <w:r>
+        <w:t>Uso de priorities en el tablero</w:t>
+      </w:r>
+    </w:p>
+    <w:p>
+      <w:pPr>
+        <w:rPr>
+          <w:lang w:val="es-SV"/>
+        </w:rPr>
+      </w:pPr>
+    </w:p>
+    <w:p>
+      <w:pPr>
+        <w:rPr>
+          <w:lang w:val="es-SV"/>
+        </w:rPr>
+      </w:pPr>
+    </w:p>
+    <w:p>
+      <w:pPr>
+        <w:rPr>
+          <w:lang w:val="es-SV"/>
+        </w:rPr>
+      </w:pPr>
+    </w:p>
+    <w:p>
+      <w:pPr>
+        <w:rPr>
+          <w:lang w:val="es-SV"/>
+        </w:rPr>
+      </w:pPr>
+    </w:p>
+    <w:p>
+      <w:pPr>
+        <w:pStyle w:val="Ttulo2"/>
         <w:rPr>
           <w:rFonts w:ascii="Arial" w:hAnsi="Arial" w:cs="Arial"/>
           <w:color w:val="auto"/>
@@ -3409,40 +3376,8 @@
           <w:szCs w:val="24"/>
           <w:lang w:val="es-SV"/>
         </w:rPr>
-        <w:t>Uso de status en el tablero</w:t>
-      </w:r>
-    </w:p>
-    <w:p>
-      <w:pPr>
-        <w:rPr>
-          <w:lang w:val="es-SV"/>
-        </w:rPr>
-      </w:pPr>
-    </w:p>
-    <w:p>
-      <w:pPr>
-        <w:rPr>
-          <w:lang w:val="es-SV"/>
-        </w:rPr>
-      </w:pPr>
-    </w:p>
-    <w:p>
-      <w:pPr>
-        <w:rPr>
-          <w:lang w:val="es-SV"/>
-        </w:rPr>
-      </w:pPr>
-    </w:p>
-    <w:p>
-      <w:pPr>
-        <w:rPr>
-          <w:lang w:val="es-SV"/>
-        </w:rPr>
-      </w:pPr>
-    </w:p>
-    <w:p>
-      <w:pPr>
-        <w:pStyle w:val="Ttulo2"/>
+      </w:pPr>
+      <w:r>
         <w:rPr>
           <w:rFonts w:ascii="Arial" w:hAnsi="Arial" w:cs="Arial"/>
           <w:color w:val="auto"/>
@@ -3450,8 +3385,54 @@
           <w:szCs w:val="24"/>
           <w:lang w:val="es-SV"/>
         </w:rPr>
-      </w:pPr>
-      <w:r>
+        <w:t>Uso de type en el tablero</w:t>
+      </w:r>
+    </w:p>
+    <w:p>
+      <w:pPr>
+        <w:rPr>
+          <w:lang w:val="es-SV"/>
+        </w:rPr>
+      </w:pPr>
+    </w:p>
+    <w:p>
+      <w:pPr>
+        <w:rPr>
+          <w:lang w:val="es-SV"/>
+        </w:rPr>
+      </w:pPr>
+    </w:p>
+    <w:p>
+      <w:pPr>
+        <w:rPr>
+          <w:lang w:val="es-SV"/>
+        </w:rPr>
+      </w:pPr>
+    </w:p>
+    <w:p>
+      <w:pPr>
+        <w:rPr>
+          <w:lang w:val="es-SV"/>
+        </w:rPr>
+      </w:pPr>
+    </w:p>
+    <w:p>
+      <w:pPr>
+        <w:rPr>
+          <w:lang w:val="es-SV"/>
+        </w:rPr>
+      </w:pPr>
+    </w:p>
+    <w:p>
+      <w:pPr>
+        <w:rPr>
+          <w:lang w:val="es-SV"/>
+        </w:rPr>
+      </w:pPr>
+    </w:p>
+    <w:p>
+      <w:pPr>
+        <w:pStyle w:val="Ttulo2"/>
         <w:rPr>
           <w:rFonts w:ascii="Arial" w:hAnsi="Arial" w:cs="Arial"/>
           <w:color w:val="auto"/>
@@ -3459,9 +3440,7 @@
           <w:szCs w:val="24"/>
           <w:lang w:val="es-SV"/>
         </w:rPr>
-        <w:t xml:space="preserve">Uso de </w:t>
-      </w:r>
-      <w:proofErr w:type="spellStart"/>
+      </w:pPr>
       <w:r>
         <w:rPr>
           <w:rFonts w:ascii="Arial" w:hAnsi="Arial" w:cs="Arial"/>
@@ -3470,176 +3449,7 @@
           <w:szCs w:val="24"/>
           <w:lang w:val="es-SV"/>
         </w:rPr>
-        <w:t>priorities</w:t>
-      </w:r>
-      <w:proofErr w:type="spellEnd"/>
-      <w:r>
-        <w:rPr>
-          <w:rFonts w:ascii="Arial" w:hAnsi="Arial" w:cs="Arial"/>
-          <w:color w:val="auto"/>
-          <w:sz w:val="24"/>
-          <w:szCs w:val="24"/>
-          <w:lang w:val="es-SV"/>
-        </w:rPr>
-        <w:t xml:space="preserve"> en el tablero</w:t>
-      </w:r>
-    </w:p>
-    <w:p>
-      <w:pPr>
-        <w:rPr>
-          <w:lang w:val="es-SV"/>
-        </w:rPr>
-      </w:pPr>
-    </w:p>
-    <w:p>
-      <w:pPr>
-        <w:rPr>
-          <w:lang w:val="es-SV"/>
-        </w:rPr>
-      </w:pPr>
-    </w:p>
-    <w:p>
-      <w:pPr>
-        <w:rPr>
-          <w:lang w:val="es-SV"/>
-        </w:rPr>
-      </w:pPr>
-    </w:p>
-    <w:p>
-      <w:pPr>
-        <w:rPr>
-          <w:lang w:val="es-SV"/>
-        </w:rPr>
-      </w:pPr>
-    </w:p>
-    <w:p>
-      <w:pPr>
-        <w:pStyle w:val="Ttulo2"/>
-        <w:rPr>
-          <w:rFonts w:ascii="Arial" w:hAnsi="Arial" w:cs="Arial"/>
-          <w:color w:val="auto"/>
-          <w:sz w:val="24"/>
-          <w:szCs w:val="24"/>
-          <w:lang w:val="es-SV"/>
-        </w:rPr>
-      </w:pPr>
-      <w:r>
-        <w:rPr>
-          <w:rFonts w:ascii="Arial" w:hAnsi="Arial" w:cs="Arial"/>
-          <w:color w:val="auto"/>
-          <w:sz w:val="24"/>
-          <w:szCs w:val="24"/>
-          <w:lang w:val="es-SV"/>
-        </w:rPr>
-        <w:t xml:space="preserve">Uso de </w:t>
-      </w:r>
-      <w:proofErr w:type="spellStart"/>
-      <w:r>
-        <w:rPr>
-          <w:rFonts w:ascii="Arial" w:hAnsi="Arial" w:cs="Arial"/>
-          <w:color w:val="auto"/>
-          <w:sz w:val="24"/>
-          <w:szCs w:val="24"/>
-          <w:lang w:val="es-SV"/>
-        </w:rPr>
-        <w:t>type</w:t>
-      </w:r>
-      <w:proofErr w:type="spellEnd"/>
-      <w:r>
-        <w:rPr>
-          <w:rFonts w:ascii="Arial" w:hAnsi="Arial" w:cs="Arial"/>
-          <w:color w:val="auto"/>
-          <w:sz w:val="24"/>
-          <w:szCs w:val="24"/>
-          <w:lang w:val="es-SV"/>
-        </w:rPr>
-        <w:t xml:space="preserve"> en el tablero</w:t>
-      </w:r>
-    </w:p>
-    <w:p>
-      <w:pPr>
-        <w:rPr>
-          <w:lang w:val="es-SV"/>
-        </w:rPr>
-      </w:pPr>
-    </w:p>
-    <w:p>
-      <w:pPr>
-        <w:rPr>
-          <w:lang w:val="es-SV"/>
-        </w:rPr>
-      </w:pPr>
-    </w:p>
-    <w:p>
-      <w:pPr>
-        <w:rPr>
-          <w:lang w:val="es-SV"/>
-        </w:rPr>
-      </w:pPr>
-    </w:p>
-    <w:p>
-      <w:pPr>
-        <w:rPr>
-          <w:lang w:val="es-SV"/>
-        </w:rPr>
-      </w:pPr>
-    </w:p>
-    <w:p>
-      <w:pPr>
-        <w:rPr>
-          <w:lang w:val="es-SV"/>
-        </w:rPr>
-      </w:pPr>
-    </w:p>
-    <w:p>
-      <w:pPr>
-        <w:rPr>
-          <w:lang w:val="es-SV"/>
-        </w:rPr>
-      </w:pPr>
-    </w:p>
-    <w:p>
-      <w:pPr>
-        <w:pStyle w:val="Ttulo2"/>
-        <w:rPr>
-          <w:rFonts w:ascii="Arial" w:hAnsi="Arial" w:cs="Arial"/>
-          <w:color w:val="auto"/>
-          <w:sz w:val="24"/>
-          <w:szCs w:val="24"/>
-          <w:lang w:val="es-SV"/>
-        </w:rPr>
-      </w:pPr>
-      <w:r>
-        <w:rPr>
-          <w:rFonts w:ascii="Arial" w:hAnsi="Arial" w:cs="Arial"/>
-          <w:color w:val="auto"/>
-          <w:sz w:val="24"/>
-          <w:szCs w:val="24"/>
-          <w:lang w:val="es-SV"/>
-        </w:rPr>
-        <w:t xml:space="preserve">Uso de </w:t>
-      </w:r>
-      <w:proofErr w:type="spellStart"/>
-      <w:r>
-        <w:rPr>
-          <w:rFonts w:ascii="Arial" w:hAnsi="Arial" w:cs="Arial"/>
-          <w:color w:val="auto"/>
-          <w:sz w:val="24"/>
-          <w:szCs w:val="24"/>
-          <w:lang w:val="es-SV"/>
-        </w:rPr>
-        <w:t>assignees</w:t>
-      </w:r>
-      <w:proofErr w:type="spellEnd"/>
-      <w:r>
-        <w:rPr>
-          <w:rFonts w:ascii="Arial" w:hAnsi="Arial" w:cs="Arial"/>
-          <w:color w:val="auto"/>
-          <w:sz w:val="24"/>
-          <w:szCs w:val="24"/>
-          <w:lang w:val="es-SV"/>
-        </w:rPr>
-        <w:t xml:space="preserve"> en el tablero</w:t>
+        <w:t>Uso de assignees en el tablero</w:t>
       </w:r>
     </w:p>
     <w:p>
@@ -3677,7 +3487,7 @@
           <w:lang w:val="es-SV"/>
         </w:rPr>
       </w:pPr>
-      <w:bookmarkStart w:id="15" w:name="_Toc224035381"/>
+      <w:bookmarkStart w:id="15" w:name="_Toc224298485"/>
       <w:r>
         <w:rPr>
           <w:rFonts w:ascii="Arial" w:hAnsi="Arial" w:cs="Arial"/>
@@ -3688,23 +3498,33 @@
           <w:szCs w:val="24"/>
           <w:lang w:val="es-SV"/>
         </w:rPr>
-        <w:t>Tabl</w:t>
+        <w:t>Evidencia de aplicación</w:t>
       </w:r>
-      <w:bookmarkStart w:id="16" w:name="_GoBack"/>
-      <w:bookmarkEnd w:id="16"/>
-      <w:r>
-        <w:rPr>
-          <w:rFonts w:ascii="Arial" w:hAnsi="Arial" w:cs="Arial"/>
-          <w:b/>
-          <w:bCs/>
+      <w:bookmarkEnd w:id="15"/>
+    </w:p>
+    <w:p>
+      <w:pPr>
+        <w:pStyle w:val="Ttulo2"/>
+        <w:rPr>
+          <w:rFonts w:ascii="Arial" w:hAnsi="Arial" w:cs="Arial"/>
           <w:color w:val="auto"/>
           <w:sz w:val="24"/>
           <w:szCs w:val="24"/>
           <w:lang w:val="es-SV"/>
         </w:rPr>
-        <w:t>ero</w:t>
+      </w:pPr>
+      <w:bookmarkStart w:id="16" w:name="_Toc224298486"/>
+      <w:r>
+        <w:rPr>
+          <w:rFonts w:ascii="Arial" w:hAnsi="Arial" w:cs="Arial"/>
+          <w:color w:val="auto"/>
+          <w:sz w:val="24"/>
+          <w:szCs w:val="24"/>
+          <w:lang w:val="es-SV"/>
+        </w:rPr>
+        <w:t>Tablero</w:t>
       </w:r>
-      <w:bookmarkEnd w:id="15"/>
+      <w:bookmarkEnd w:id="16"/>
     </w:p>
     <w:p>
       <w:pPr>
@@ -3731,22 +3551,133 @@
           <w:lang w:val="es-SV"/>
         </w:rPr>
       </w:pPr>
-    </w:p>
-    <w:p>
-      <w:pPr>
-        <w:rPr>
-          <w:rFonts w:ascii="Arial" w:hAnsi="Arial" w:cs="Arial"/>
-          <w:lang w:val="es-SV"/>
-        </w:rPr>
-      </w:pPr>
-    </w:p>
-    <w:p>
-      <w:pPr>
-        <w:rPr>
-          <w:rFonts w:ascii="Arial" w:hAnsi="Arial" w:cs="Arial"/>
-          <w:lang w:val="es-SV"/>
-        </w:rPr>
-      </w:pPr>
+      <w:r>
+        <w:rPr>
+          <w:rFonts w:ascii="Arial" w:hAnsi="Arial" w:cs="Arial"/>
+          <w:noProof/>
+          <w:lang w:val="es-SV" w:eastAsia="es-SV"/>
+        </w:rPr>
+        <w:drawing>
+          <wp:inline distT="0" distB="0" distL="0" distR="0" wp14:anchorId="1DB95ED9" wp14:editId="395CD79B">
+            <wp:extent cx="5943600" cy="1677035"/>
+            <wp:effectExtent l="0" t="0" r="0" b="0"/>
+            <wp:docPr id="15" name="Imagen 15"/>
+            <wp:cNvGraphicFramePr>
+              <a:graphicFrameLocks xmlns:a="http://schemas.openxmlformats.org/drawingml/2006/main" noChangeAspect="1"/>
+            </wp:cNvGraphicFramePr>
+            <a:graphic xmlns:a="http://schemas.openxmlformats.org/drawingml/2006/main">
+              <a:graphicData uri="http://schemas.openxmlformats.org/drawingml/2006/picture">
+                <pic:pic xmlns:pic="http://schemas.openxmlformats.org/drawingml/2006/picture">
+                  <pic:nvPicPr>
+                    <pic:cNvPr id="1" name=""/>
+                    <pic:cNvPicPr/>
+                  </pic:nvPicPr>
+                  <pic:blipFill>
+                    <a:blip r:embed="rId14"/>
+                    <a:stretch>
+                      <a:fillRect/>
+                    </a:stretch>
+                  </pic:blipFill>
+                  <pic:spPr>
+                    <a:xfrm>
+                      <a:off x="0" y="0"/>
+                      <a:ext cx="5943600" cy="1677035"/>
+                    </a:xfrm>
+                    <a:prstGeom prst="rect">
+                      <a:avLst/>
+                    </a:prstGeom>
+                  </pic:spPr>
+                </pic:pic>
+              </a:graphicData>
+            </a:graphic>
+          </wp:inline>
+        </w:drawing>
+      </w:r>
+    </w:p>
+    <w:p>
+      <w:pPr>
+        <w:rPr>
+          <w:rFonts w:ascii="Arial" w:hAnsi="Arial" w:cs="Arial"/>
+          <w:lang w:val="es-SV"/>
+        </w:rPr>
+      </w:pPr>
+    </w:p>
+    <w:p>
+      <w:pPr>
+        <w:pStyle w:val="Ttulo2"/>
+        <w:rPr>
+          <w:rFonts w:ascii="Arial" w:hAnsi="Arial" w:cs="Arial"/>
+          <w:color w:val="auto"/>
+          <w:sz w:val="24"/>
+          <w:szCs w:val="24"/>
+          <w:lang w:val="es-SV"/>
+        </w:rPr>
+      </w:pPr>
+      <w:bookmarkStart w:id="17" w:name="_Toc224298487"/>
+      <w:r>
+        <w:rPr>
+          <w:rFonts w:ascii="Arial" w:hAnsi="Arial" w:cs="Arial"/>
+          <w:color w:val="auto"/>
+          <w:sz w:val="24"/>
+          <w:szCs w:val="24"/>
+          <w:lang w:val="es-SV"/>
+        </w:rPr>
+        <w:lastRenderedPageBreak/>
+        <w:t>Repositorio con commits</w:t>
+      </w:r>
+      <w:bookmarkEnd w:id="17"/>
+    </w:p>
+    <w:p>
+      <w:pPr>
+        <w:rPr>
+          <w:rFonts w:ascii="Arial" w:hAnsi="Arial" w:cs="Arial"/>
+          <w:lang w:val="es-SV"/>
+        </w:rPr>
+      </w:pPr>
+      <w:r>
+        <w:rPr>
+          <w:rFonts w:ascii="Arial" w:hAnsi="Arial" w:cs="Arial"/>
+          <w:noProof/>
+          <w:lang w:val="es-SV" w:eastAsia="es-SV"/>
+        </w:rPr>
+        <w:drawing>
+          <wp:inline distT="0" distB="0" distL="0" distR="0" wp14:anchorId="67F652E0" wp14:editId="3AB1CBC2">
+            <wp:extent cx="5943600" cy="2356485"/>
+            <wp:effectExtent l="0" t="0" r="0" b="5715"/>
+            <wp:docPr id="16" name="Imagen 16"/>
+            <wp:cNvGraphicFramePr>
+              <a:graphicFrameLocks xmlns:a="http://schemas.openxmlformats.org/drawingml/2006/main" noChangeAspect="1"/>
+            </wp:cNvGraphicFramePr>
+            <a:graphic xmlns:a="http://schemas.openxmlformats.org/drawingml/2006/main">
+              <a:graphicData uri="http://schemas.openxmlformats.org/drawingml/2006/picture">
+                <pic:pic xmlns:pic="http://schemas.openxmlformats.org/drawingml/2006/picture">
+                  <pic:nvPicPr>
+                    <pic:cNvPr id="1" name=""/>
+                    <pic:cNvPicPr/>
+                  </pic:nvPicPr>
+                  <pic:blipFill>
+                    <a:blip r:embed="rId15"/>
+                    <a:stretch>
+                      <a:fillRect/>
+                    </a:stretch>
+                  </pic:blipFill>
+                  <pic:spPr>
+                    <a:xfrm>
+                      <a:off x="0" y="0"/>
+                      <a:ext cx="5943600" cy="2356485"/>
+                    </a:xfrm>
+                    <a:prstGeom prst="rect">
+                      <a:avLst/>
+                    </a:prstGeom>
+                  </pic:spPr>
+                </pic:pic>
+              </a:graphicData>
+            </a:graphic>
+          </wp:inline>
+        </w:drawing>
+      </w:r>
+      <w:bookmarkStart w:id="18" w:name="_GoBack"/>
+      <w:bookmarkEnd w:id="18"/>
     </w:p>
     <w:p>
       <w:pPr>
@@ -3786,7 +3717,7 @@
           <w:lang w:val="es-SV"/>
         </w:rPr>
       </w:pPr>
-      <w:bookmarkStart w:id="17" w:name="_Toc224035382"/>
+      <w:bookmarkStart w:id="19" w:name="_Toc224035382"/>
       <w:r>
         <w:rPr>
           <w:rFonts w:ascii="Arial" w:hAnsi="Arial" w:cs="Arial"/>
@@ -3797,23 +3728,9 @@
           <w:szCs w:val="24"/>
           <w:lang w:val="es-SV"/>
         </w:rPr>
-        <w:t xml:space="preserve">Repositorio de </w:t>
+        <w:t>Repositorio de Github</w:t>
       </w:r>
-      <w:proofErr w:type="spellStart"/>
-      <w:r>
-        <w:rPr>
-          <w:rFonts w:ascii="Arial" w:hAnsi="Arial" w:cs="Arial"/>
-          <w:b/>
-          <w:bCs/>
-          <w:color w:val="auto"/>
-          <w:sz w:val="24"/>
-          <w:szCs w:val="24"/>
-          <w:lang w:val="es-SV"/>
-        </w:rPr>
-        <w:t>Github</w:t>
-      </w:r>
-      <w:bookmarkEnd w:id="17"/>
-      <w:proofErr w:type="spellEnd"/>
+      <w:bookmarkEnd w:id="19"/>
     </w:p>
     <w:p>
       <w:pPr>
@@ -3823,7 +3740,7 @@
           <w:lang w:val="es-ES"/>
         </w:rPr>
       </w:pPr>
-      <w:hyperlink r:id="rId14" w:history="1">
+      <w:hyperlink r:id="rId16" w:history="1">
         <w:r>
           <w:rPr>
             <w:rStyle w:val="Hipervnculo"/>
@@ -3873,7 +3790,7 @@
           <w:lang w:val="es-SV"/>
         </w:rPr>
       </w:pPr>
-      <w:bookmarkStart w:id="18" w:name="_Toc224035383"/>
+      <w:bookmarkStart w:id="20" w:name="_Toc224035383"/>
       <w:r>
         <w:rPr>
           <w:rFonts w:ascii="Arial" w:hAnsi="Arial" w:cs="Arial"/>
@@ -3884,10 +3801,9 @@
           <w:szCs w:val="24"/>
           <w:lang w:val="es-SV"/>
         </w:rPr>
-        <w:lastRenderedPageBreak/>
         <w:t>Anexos</w:t>
       </w:r>
-      <w:bookmarkEnd w:id="18"/>
+      <w:bookmarkEnd w:id="20"/>
     </w:p>
     <w:p>
       <w:pPr>
@@ -3898,8 +3814,8 @@
       </w:pPr>
     </w:p>
     <w:sectPr>
-      <w:headerReference w:type="default" r:id="rId15"/>
-      <w:headerReference w:type="first" r:id="rId16"/>
+      <w:headerReference w:type="default" r:id="rId17"/>
+      <w:headerReference w:type="first" r:id="rId18"/>
       <w:pgSz w:w="12240" w:h="15840"/>
       <w:pgMar w:top="1440" w:right="1440" w:bottom="1440" w:left="1440" w:header="720" w:footer="720" w:gutter="0"/>
       <w:pgNumType w:start="1"/>
@@ -4040,7 +3956,7 @@
             <w:noProof/>
             <w:lang w:val="es-ES"/>
           </w:rPr>
-          <w:t>4</w:t>
+          <w:t>5</w:t>
         </w:r>
         <w:r>
           <w:fldChar w:fldCharType="end"/>
@@ -6133,7 +6049,7 @@
 </file>
 
 <file path=customXml/itemProps1.xml><?xml version="1.0" encoding="utf-8"?>
-<ds:datastoreItem xmlns:ds="http://schemas.openxmlformats.org/officeDocument/2006/customXml" ds:itemID="{0AEBB0E4-F4EE-43BC-B6C8-C794F9AD1969}">
+<ds:datastoreItem xmlns:ds="http://schemas.openxmlformats.org/officeDocument/2006/customXml" ds:itemID="{8BA756C7-5BCA-4E3F-8EF3-7F731A932B83}">
   <ds:schemaRefs>
     <ds:schemaRef ds:uri="http://schemas.openxmlformats.org/officeDocument/2006/bibliography"/>
   </ds:schemaRefs>

</xml_diff>

<commit_message>
Docs: Se agregaron los diagramas.
Se agregaron los diagramas AS-IS Y TO-BE
</commit_message>
<xml_diff>
--- a/docs/entrega2/EPRO_Entrega2_Grupo9_Plataforma de gestión documental con versiones.docx
+++ b/docs/entrega2/EPRO_Entrega2_Grupo9_Plataforma de gestión documental con versiones.docx
@@ -1,6 +1,6 @@
 
 <file path=word/document.xml><?xml version="1.0" encoding="utf-8"?>
-<w:document xmlns:wpc="http://schemas.microsoft.com/office/word/2010/wordprocessingCanvas" xmlns:cx="http://schemas.microsoft.com/office/drawing/2014/chartex" xmlns:mc="http://schemas.openxmlformats.org/markup-compatibility/2006" xmlns:o="urn:schemas-microsoft-com:office:office" xmlns:r="http://schemas.openxmlformats.org/officeDocument/2006/relationships" xmlns:m="http://schemas.openxmlformats.org/officeDocument/2006/math" xmlns:v="urn:schemas-microsoft-com:vml" xmlns:wp14="http://schemas.microsoft.com/office/word/2010/wordprocessingDrawing" xmlns:wp="http://schemas.openxmlformats.org/drawingml/2006/wordprocessingDrawing" xmlns:w10="urn:schemas-microsoft-com:office:word" xmlns:w="http://schemas.openxmlformats.org/wordprocessingml/2006/main" xmlns:w14="http://schemas.microsoft.com/office/word/2010/wordml" xmlns:w15="http://schemas.microsoft.com/office/word/2012/wordml" xmlns:w16se="http://schemas.microsoft.com/office/word/2015/wordml/symex" xmlns:wpg="http://schemas.microsoft.com/office/word/2010/wordprocessingGroup" xmlns:wpi="http://schemas.microsoft.com/office/word/2010/wordprocessingInk" xmlns:wne="http://schemas.microsoft.com/office/word/2006/wordml" xmlns:wps="http://schemas.microsoft.com/office/word/2010/wordprocessingShape" mc:Ignorable="w14 w15 w16se wp14">
+<w:document xmlns:wpc="http://schemas.microsoft.com/office/word/2010/wordprocessingCanvas" xmlns:cx="http://schemas.microsoft.com/office/drawing/2014/chartex" xmlns:cx1="http://schemas.microsoft.com/office/drawing/2015/9/8/chartex" xmlns:cx2="http://schemas.microsoft.com/office/drawing/2015/10/21/chartex" xmlns:cx3="http://schemas.microsoft.com/office/drawing/2016/5/9/chartex" xmlns:cx4="http://schemas.microsoft.com/office/drawing/2016/5/10/chartex" xmlns:cx5="http://schemas.microsoft.com/office/drawing/2016/5/11/chartex" xmlns:cx6="http://schemas.microsoft.com/office/drawing/2016/5/12/chartex" xmlns:cx7="http://schemas.microsoft.com/office/drawing/2016/5/13/chartex" xmlns:cx8="http://schemas.microsoft.com/office/drawing/2016/5/14/chartex" xmlns:mc="http://schemas.openxmlformats.org/markup-compatibility/2006" xmlns:aink="http://schemas.microsoft.com/office/drawing/2016/ink" xmlns:am3d="http://schemas.microsoft.com/office/drawing/2017/model3d" xmlns:o="urn:schemas-microsoft-com:office:office" xmlns:oel="http://schemas.microsoft.com/office/2019/extlst" xmlns:r="http://schemas.openxmlformats.org/officeDocument/2006/relationships" xmlns:m="http://schemas.openxmlformats.org/officeDocument/2006/math" xmlns:v="urn:schemas-microsoft-com:vml" xmlns:wp14="http://schemas.microsoft.com/office/word/2010/wordprocessingDrawing" xmlns:wp="http://schemas.openxmlformats.org/drawingml/2006/wordprocessingDrawing" xmlns:w10="urn:schemas-microsoft-com:office:word" xmlns:w="http://schemas.openxmlformats.org/wordprocessingml/2006/main" xmlns:w14="http://schemas.microsoft.com/office/word/2010/wordml" xmlns:w15="http://schemas.microsoft.com/office/word/2012/wordml" xmlns:w16cex="http://schemas.microsoft.com/office/word/2018/wordml/cex" xmlns:w16cid="http://schemas.microsoft.com/office/word/2016/wordml/cid" xmlns:w16="http://schemas.microsoft.com/office/word/2018/wordml" xmlns:w16sdtdh="http://schemas.microsoft.com/office/word/2020/wordml/sdtdatahash" xmlns:w16se="http://schemas.microsoft.com/office/word/2015/wordml/symex" xmlns:wpg="http://schemas.microsoft.com/office/word/2010/wordprocessingGroup" xmlns:wpi="http://schemas.microsoft.com/office/word/2010/wordprocessingInk" xmlns:wne="http://schemas.microsoft.com/office/word/2006/wordml" xmlns:wps="http://schemas.microsoft.com/office/word/2010/wordprocessingShape" mc:Ignorable="w14 w15 w16se w16cid w16 w16cex w16sdtdh wp14">
   <w:body>
     <w:p>
       <w:pPr>
@@ -359,8 +359,39 @@
                 <w:szCs w:val="24"/>
                 <w:lang w:val="es-SV"/>
               </w:rPr>
-              <w:t>Ing. Ruben Escobar Ortegon</w:t>
-            </w:r>
+              <w:t xml:space="preserve">Ing. </w:t>
+            </w:r>
+            <w:proofErr w:type="spellStart"/>
+            <w:r>
+              <w:rPr>
+                <w:rFonts w:ascii="Arial" w:eastAsia="Calibri" w:hAnsi="Arial" w:cs="Arial"/>
+                <w:sz w:val="24"/>
+                <w:szCs w:val="24"/>
+                <w:lang w:val="es-SV"/>
+              </w:rPr>
+              <w:t>Ruben</w:t>
+            </w:r>
+            <w:proofErr w:type="spellEnd"/>
+            <w:r>
+              <w:rPr>
+                <w:rFonts w:ascii="Arial" w:eastAsia="Calibri" w:hAnsi="Arial" w:cs="Arial"/>
+                <w:sz w:val="24"/>
+                <w:szCs w:val="24"/>
+                <w:lang w:val="es-SV"/>
+              </w:rPr>
+              <w:t xml:space="preserve"> Escobar </w:t>
+            </w:r>
+            <w:proofErr w:type="spellStart"/>
+            <w:r>
+              <w:rPr>
+                <w:rFonts w:ascii="Arial" w:eastAsia="Calibri" w:hAnsi="Arial" w:cs="Arial"/>
+                <w:sz w:val="24"/>
+                <w:szCs w:val="24"/>
+                <w:lang w:val="es-SV"/>
+              </w:rPr>
+              <w:t>Ortegon</w:t>
+            </w:r>
+            <w:proofErr w:type="spellEnd"/>
           </w:p>
         </w:tc>
       </w:tr>
@@ -552,6 +583,7 @@
                 <w:szCs w:val="24"/>
               </w:rPr>
             </w:pPr>
+            <w:proofErr w:type="spellStart"/>
             <w:r>
               <w:rPr>
                 <w:rFonts w:ascii="Arial" w:eastAsia="Calibri" w:hAnsi="Arial" w:cs="Arial"/>
@@ -560,7 +592,18 @@
                 <w:sz w:val="24"/>
                 <w:szCs w:val="24"/>
               </w:rPr>
-              <w:t>Alumnos:</w:t>
+              <w:t>Alumnos</w:t>
+            </w:r>
+            <w:proofErr w:type="spellEnd"/>
+            <w:r>
+              <w:rPr>
+                <w:rFonts w:ascii="Arial" w:eastAsia="Calibri" w:hAnsi="Arial" w:cs="Arial"/>
+                <w:b/>
+                <w:bCs/>
+                <w:sz w:val="24"/>
+                <w:szCs w:val="24"/>
+              </w:rPr>
+              <w:t>:</w:t>
             </w:r>
           </w:p>
         </w:tc>
@@ -947,7 +990,27 @@
                 <w:szCs w:val="24"/>
                 <w:lang w:val="es-SV"/>
               </w:rPr>
-              <w:t>15 de Febrero 2026</w:t>
+              <w:t xml:space="preserve">15 de </w:t>
+            </w:r>
+            <w:proofErr w:type="gramStart"/>
+            <w:r>
+              <w:rPr>
+                <w:rFonts w:ascii="Arial" w:eastAsia="Calibri" w:hAnsi="Arial" w:cs="Arial"/>
+                <w:sz w:val="24"/>
+                <w:szCs w:val="24"/>
+                <w:lang w:val="es-SV"/>
+              </w:rPr>
+              <w:t>Febrero</w:t>
+            </w:r>
+            <w:proofErr w:type="gramEnd"/>
+            <w:r>
+              <w:rPr>
+                <w:rFonts w:ascii="Arial" w:eastAsia="Calibri" w:hAnsi="Arial" w:cs="Arial"/>
+                <w:sz w:val="24"/>
+                <w:szCs w:val="24"/>
+                <w:lang w:val="es-SV"/>
+              </w:rPr>
+              <w:t xml:space="preserve"> 2026</w:t>
             </w:r>
           </w:p>
         </w:tc>
@@ -2810,11 +2873,54 @@
     </w:p>
     <w:p>
       <w:pPr>
-        <w:rPr>
-          <w:rFonts w:ascii="Arial" w:hAnsi="Arial" w:cs="Arial"/>
-          <w:lang w:val="es-SV"/>
-        </w:rPr>
-      </w:pPr>
+        <w:jc w:val="center"/>
+        <w:rPr>
+          <w:rFonts w:ascii="Arial" w:hAnsi="Arial" w:cs="Arial"/>
+          <w:lang w:val="es-SV"/>
+        </w:rPr>
+      </w:pPr>
+      <w:r>
+        <w:rPr>
+          <w:bCs/>
+          <w:noProof/>
+          <w:lang w:val="es-SV" w:eastAsia="es-SV"/>
+        </w:rPr>
+        <w:drawing>
+          <wp:inline distT="0" distB="0" distL="0" distR="0" wp14:anchorId="5E76C779" wp14:editId="0DCF558F">
+            <wp:extent cx="3558848" cy="5730737"/>
+            <wp:effectExtent l="0" t="0" r="3810" b="3810"/>
+            <wp:docPr id="6" name="Imagen 6"/>
+            <wp:cNvGraphicFramePr>
+              <a:graphicFrameLocks xmlns:a="http://schemas.openxmlformats.org/drawingml/2006/main" noChangeAspect="1"/>
+            </wp:cNvGraphicFramePr>
+            <a:graphic xmlns:a="http://schemas.openxmlformats.org/drawingml/2006/main">
+              <a:graphicData uri="http://schemas.openxmlformats.org/drawingml/2006/picture">
+                <pic:pic xmlns:pic="http://schemas.openxmlformats.org/drawingml/2006/picture">
+                  <pic:nvPicPr>
+                    <pic:cNvPr id="1" name=""/>
+                    <pic:cNvPicPr/>
+                  </pic:nvPicPr>
+                  <pic:blipFill>
+                    <a:blip r:embed="rId13"/>
+                    <a:stretch>
+                      <a:fillRect/>
+                    </a:stretch>
+                  </pic:blipFill>
+                  <pic:spPr>
+                    <a:xfrm>
+                      <a:off x="0" y="0"/>
+                      <a:ext cx="3558848" cy="5730737"/>
+                    </a:xfrm>
+                    <a:prstGeom prst="rect">
+                      <a:avLst/>
+                    </a:prstGeom>
+                  </pic:spPr>
+                </pic:pic>
+              </a:graphicData>
+            </a:graphic>
+          </wp:inline>
+        </w:drawing>
+      </w:r>
     </w:p>
     <w:p>
       <w:pPr>
@@ -2876,692 +2982,23 @@
     </w:p>
     <w:p>
       <w:pPr>
-        <w:rPr>
-          <w:rFonts w:ascii="Arial" w:hAnsi="Arial" w:cs="Arial"/>
-          <w:lang w:val="es-SV"/>
-        </w:rPr>
-      </w:pPr>
-    </w:p>
-    <w:p>
-      <w:pPr>
-        <w:rPr>
-          <w:rFonts w:ascii="Arial" w:hAnsi="Arial" w:cs="Arial"/>
-          <w:lang w:val="es-SV"/>
-        </w:rPr>
-      </w:pPr>
-    </w:p>
-    <w:p>
-      <w:pPr>
-        <w:rPr>
-          <w:rFonts w:ascii="Arial" w:hAnsi="Arial" w:cs="Arial"/>
-          <w:lang w:val="es-SV"/>
-        </w:rPr>
-      </w:pPr>
-    </w:p>
-    <w:p>
-      <w:pPr>
-        <w:rPr>
-          <w:rFonts w:ascii="Arial" w:hAnsi="Arial" w:cs="Arial"/>
-          <w:lang w:val="es-SV"/>
-        </w:rPr>
-      </w:pPr>
-    </w:p>
-    <w:p>
-      <w:pPr>
-        <w:pStyle w:val="Ttulo2"/>
-        <w:rPr>
-          <w:rFonts w:ascii="Arial" w:hAnsi="Arial" w:cs="Arial"/>
-          <w:color w:val="auto"/>
-          <w:sz w:val="24"/>
-          <w:szCs w:val="24"/>
-          <w:lang w:val="es-SV"/>
-        </w:rPr>
-      </w:pPr>
-      <w:bookmarkStart w:id="9" w:name="_Toc224035373"/>
+        <w:jc w:val="center"/>
+        <w:rPr>
+          <w:rFonts w:ascii="Arial" w:hAnsi="Arial" w:cs="Arial"/>
+          <w:lang w:val="es-SV"/>
+        </w:rPr>
+      </w:pPr>
       <w:r>
         <w:rPr>
-          <w:rFonts w:ascii="Arial" w:hAnsi="Arial" w:cs="Arial"/>
-          <w:color w:val="auto"/>
-          <w:sz w:val="24"/>
-          <w:szCs w:val="24"/>
-          <w:lang w:val="es-SV"/>
-        </w:rPr>
-        <w:t>Buscar un documento en los archivos locales</w:t>
-      </w:r>
-      <w:bookmarkEnd w:id="9"/>
-    </w:p>
-    <w:p>
-      <w:pPr>
-        <w:rPr>
-          <w:rFonts w:ascii="Arial" w:hAnsi="Arial" w:cs="Arial"/>
-          <w:lang w:val="es-SV"/>
-        </w:rPr>
-      </w:pPr>
-    </w:p>
-    <w:p>
-      <w:pPr>
-        <w:rPr>
-          <w:rFonts w:ascii="Arial" w:hAnsi="Arial" w:cs="Arial"/>
-          <w:lang w:val="es-SV"/>
-        </w:rPr>
-      </w:pPr>
-    </w:p>
-    <w:p>
-      <w:pPr>
-        <w:rPr>
-          <w:rFonts w:ascii="Arial" w:hAnsi="Arial" w:cs="Arial"/>
-          <w:lang w:val="es-SV"/>
-        </w:rPr>
-      </w:pPr>
-    </w:p>
-    <w:p>
-      <w:pPr>
-        <w:rPr>
-          <w:rFonts w:ascii="Arial" w:hAnsi="Arial" w:cs="Arial"/>
-          <w:lang w:val="es-SV"/>
-        </w:rPr>
-      </w:pPr>
-    </w:p>
-    <w:p>
-      <w:pPr>
-        <w:rPr>
-          <w:rFonts w:ascii="Arial" w:hAnsi="Arial" w:cs="Arial"/>
-          <w:lang w:val="es-SV"/>
-        </w:rPr>
-      </w:pPr>
-    </w:p>
-    <w:p>
-      <w:pPr>
-        <w:pStyle w:val="Ttulo1"/>
-        <w:spacing w:line="360" w:lineRule="auto"/>
-        <w:rPr>
-          <w:rFonts w:ascii="Arial" w:hAnsi="Arial" w:cs="Arial"/>
-          <w:b/>
           <w:bCs/>
-          <w:color w:val="auto"/>
-          <w:sz w:val="24"/>
-          <w:szCs w:val="24"/>
-          <w:lang w:val="es-SV"/>
-        </w:rPr>
-      </w:pPr>
-      <w:bookmarkStart w:id="10" w:name="_Toc224035374"/>
-      <w:r>
-        <w:rPr>
-          <w:rFonts w:ascii="Arial" w:hAnsi="Arial" w:cs="Arial"/>
-          <w:b/>
-          <w:bCs/>
-          <w:color w:val="auto"/>
-          <w:sz w:val="24"/>
-          <w:szCs w:val="24"/>
-          <w:lang w:val="es-SV"/>
-        </w:rPr>
-        <w:t>Diagramas TO-BE</w:t>
-      </w:r>
-      <w:bookmarkEnd w:id="10"/>
-    </w:p>
-    <w:p>
-      <w:pPr>
-        <w:pStyle w:val="Ttulo2"/>
-        <w:rPr>
-          <w:rFonts w:ascii="Arial" w:hAnsi="Arial" w:cs="Arial"/>
-          <w:color w:val="auto"/>
-          <w:sz w:val="24"/>
-          <w:szCs w:val="24"/>
-          <w:lang w:val="es-SV"/>
-        </w:rPr>
-      </w:pPr>
-      <w:bookmarkStart w:id="11" w:name="_Toc224035375"/>
-      <w:r>
-        <w:rPr>
-          <w:rFonts w:ascii="Arial" w:hAnsi="Arial" w:cs="Arial"/>
-          <w:color w:val="auto"/>
-          <w:sz w:val="24"/>
-          <w:szCs w:val="24"/>
-          <w:lang w:val="es-SV"/>
-        </w:rPr>
-        <w:t>Buscar un documento</w:t>
-      </w:r>
-      <w:bookmarkEnd w:id="11"/>
-    </w:p>
-    <w:p>
-      <w:pPr>
-        <w:rPr>
-          <w:rFonts w:ascii="Arial" w:hAnsi="Arial" w:cs="Arial"/>
-          <w:lang w:val="es-SV"/>
-        </w:rPr>
-      </w:pPr>
-    </w:p>
-    <w:p>
-      <w:pPr>
-        <w:rPr>
-          <w:rFonts w:ascii="Arial" w:hAnsi="Arial" w:cs="Arial"/>
-          <w:lang w:val="es-SV"/>
-        </w:rPr>
-      </w:pPr>
-    </w:p>
-    <w:p>
-      <w:pPr>
-        <w:pStyle w:val="Ttulo2"/>
-        <w:rPr>
-          <w:rFonts w:ascii="Arial" w:hAnsi="Arial" w:cs="Arial"/>
-          <w:color w:val="auto"/>
-          <w:sz w:val="24"/>
-          <w:szCs w:val="24"/>
-          <w:lang w:val="es-SV"/>
-        </w:rPr>
-      </w:pPr>
-      <w:bookmarkStart w:id="12" w:name="_Toc224035376"/>
-      <w:r>
-        <w:rPr>
-          <w:rFonts w:ascii="Arial" w:hAnsi="Arial" w:cs="Arial"/>
-          <w:color w:val="auto"/>
-          <w:sz w:val="24"/>
-          <w:szCs w:val="24"/>
-          <w:lang w:val="es-SV"/>
-        </w:rPr>
-        <w:t>Subir un documento</w:t>
-      </w:r>
-      <w:bookmarkEnd w:id="12"/>
-    </w:p>
-    <w:p>
-      <w:pPr>
-        <w:rPr>
-          <w:rFonts w:ascii="Arial" w:hAnsi="Arial" w:cs="Arial"/>
-          <w:lang w:val="es-SV"/>
-        </w:rPr>
-      </w:pPr>
-    </w:p>
-    <w:p>
-      <w:pPr>
-        <w:rPr>
-          <w:rFonts w:ascii="Arial" w:hAnsi="Arial" w:cs="Arial"/>
-          <w:lang w:val="es-SV"/>
-        </w:rPr>
-      </w:pPr>
-    </w:p>
-    <w:p>
-      <w:pPr>
-        <w:pStyle w:val="Ttulo2"/>
-        <w:rPr>
-          <w:rFonts w:ascii="Arial" w:hAnsi="Arial" w:cs="Arial"/>
-          <w:color w:val="auto"/>
-          <w:sz w:val="24"/>
-          <w:szCs w:val="24"/>
-          <w:lang w:val="es-SV"/>
-        </w:rPr>
-      </w:pPr>
-      <w:bookmarkStart w:id="13" w:name="_Toc224035377"/>
-      <w:r>
-        <w:rPr>
-          <w:rFonts w:ascii="Arial" w:hAnsi="Arial" w:cs="Arial"/>
-          <w:color w:val="auto"/>
-          <w:sz w:val="24"/>
-          <w:szCs w:val="24"/>
-          <w:lang w:val="es-SV"/>
-        </w:rPr>
-        <w:t>Crear un nuevo usuario</w:t>
-      </w:r>
-      <w:bookmarkEnd w:id="13"/>
-    </w:p>
-    <w:p>
-      <w:pPr>
-        <w:rPr>
-          <w:rFonts w:ascii="Arial" w:hAnsi="Arial" w:cs="Arial"/>
-          <w:lang w:val="es-SV"/>
-        </w:rPr>
-      </w:pPr>
-    </w:p>
-    <w:p>
-      <w:pPr>
-        <w:rPr>
-          <w:rFonts w:ascii="Arial" w:hAnsi="Arial" w:cs="Arial"/>
-          <w:lang w:val="es-SV"/>
-        </w:rPr>
-      </w:pPr>
-    </w:p>
-    <w:p>
-      <w:pPr>
-        <w:rPr>
-          <w:rFonts w:ascii="Arial" w:hAnsi="Arial" w:cs="Arial"/>
-          <w:lang w:val="es-SV"/>
-        </w:rPr>
-      </w:pPr>
-    </w:p>
-    <w:p>
-      <w:pPr>
-        <w:rPr>
-          <w:rFonts w:ascii="Arial" w:hAnsi="Arial" w:cs="Arial"/>
-          <w:lang w:val="es-SV"/>
-        </w:rPr>
-      </w:pPr>
-    </w:p>
-    <w:p>
-      <w:pPr>
-        <w:rPr>
-          <w:rFonts w:ascii="Arial" w:hAnsi="Arial" w:cs="Arial"/>
-          <w:lang w:val="es-SV"/>
-        </w:rPr>
-      </w:pPr>
-    </w:p>
-    <w:p>
-      <w:pPr>
-        <w:rPr>
-          <w:rFonts w:ascii="Arial" w:hAnsi="Arial" w:cs="Arial"/>
-          <w:lang w:val="es-SV"/>
-        </w:rPr>
-      </w:pPr>
-    </w:p>
-    <w:p>
-      <w:pPr>
-        <w:rPr>
-          <w:rFonts w:ascii="Arial" w:hAnsi="Arial" w:cs="Arial"/>
-          <w:lang w:val="es-SV"/>
-        </w:rPr>
-      </w:pPr>
-    </w:p>
-    <w:p>
-      <w:pPr>
-        <w:rPr>
-          <w:rFonts w:ascii="Arial" w:hAnsi="Arial" w:cs="Arial"/>
-          <w:lang w:val="es-SV"/>
-        </w:rPr>
-      </w:pPr>
-    </w:p>
-    <w:p>
-      <w:pPr>
-        <w:rPr>
-          <w:rFonts w:ascii="Arial" w:hAnsi="Arial" w:cs="Arial"/>
-          <w:lang w:val="es-SV"/>
-        </w:rPr>
-      </w:pPr>
-    </w:p>
-    <w:p>
-      <w:pPr>
-        <w:rPr>
-          <w:rFonts w:ascii="Arial" w:hAnsi="Arial" w:cs="Arial"/>
-          <w:lang w:val="es-SV"/>
-        </w:rPr>
-      </w:pPr>
-    </w:p>
-    <w:p>
-      <w:pPr>
-        <w:pStyle w:val="Ttulo1"/>
-        <w:spacing w:line="360" w:lineRule="auto"/>
-        <w:rPr>
-          <w:rFonts w:ascii="Arial" w:hAnsi="Arial" w:cs="Arial"/>
-          <w:b/>
-          <w:bCs/>
-          <w:color w:val="auto"/>
-          <w:sz w:val="24"/>
-          <w:szCs w:val="24"/>
-          <w:lang w:val="es-SV"/>
-        </w:rPr>
-      </w:pPr>
-      <w:bookmarkStart w:id="14" w:name="_Toc224035378"/>
-      <w:r>
-        <w:rPr>
-          <w:rFonts w:ascii="Arial" w:hAnsi="Arial" w:cs="Arial"/>
-          <w:b/>
-          <w:bCs/>
-          <w:color w:val="auto"/>
-          <w:sz w:val="24"/>
-          <w:szCs w:val="24"/>
-          <w:lang w:val="es-SV"/>
-        </w:rPr>
-        <w:t>Mejoras concretas</w:t>
-      </w:r>
-      <w:bookmarkEnd w:id="14"/>
-    </w:p>
-    <w:p>
-      <w:pPr>
-        <w:pStyle w:val="Ttulo2"/>
-        <w:rPr>
-          <w:rFonts w:ascii="Arial" w:hAnsi="Arial" w:cs="Arial"/>
-          <w:color w:val="auto"/>
-          <w:sz w:val="24"/>
-          <w:szCs w:val="24"/>
-          <w:lang w:val="es-SV"/>
-        </w:rPr>
-      </w:pPr>
-      <w:r>
-        <w:rPr>
-          <w:rFonts w:ascii="Arial" w:hAnsi="Arial" w:cs="Arial"/>
-          <w:color w:val="auto"/>
-          <w:sz w:val="24"/>
-          <w:szCs w:val="24"/>
-          <w:lang w:val="es-SV"/>
-        </w:rPr>
-        <w:t>Uso específico de commits en Github</w:t>
-      </w:r>
-    </w:p>
-    <w:p>
-      <w:pPr>
-        <w:rPr>
-          <w:rFonts w:ascii="Arial" w:hAnsi="Arial" w:cs="Arial"/>
-          <w:lang w:val="es-SV"/>
-        </w:rPr>
-      </w:pPr>
-    </w:p>
-    <w:p>
-      <w:pPr>
-        <w:rPr>
-          <w:rFonts w:ascii="Arial" w:hAnsi="Arial" w:cs="Arial"/>
-          <w:lang w:val="es-SV"/>
-        </w:rPr>
-      </w:pPr>
-    </w:p>
-    <w:p>
-      <w:pPr>
-        <w:rPr>
-          <w:rFonts w:ascii="Arial" w:hAnsi="Arial" w:cs="Arial"/>
-          <w:lang w:val="es-SV"/>
-        </w:rPr>
-      </w:pPr>
-    </w:p>
-    <w:p>
-      <w:pPr>
-        <w:rPr>
-          <w:rFonts w:ascii="Arial" w:hAnsi="Arial" w:cs="Arial"/>
-          <w:lang w:val="es-SV"/>
-        </w:rPr>
-      </w:pPr>
-    </w:p>
-    <w:p>
-      <w:pPr>
-        <w:pStyle w:val="Ttulo2"/>
-        <w:rPr>
-          <w:rFonts w:ascii="Arial" w:hAnsi="Arial" w:cs="Arial"/>
-          <w:color w:val="auto"/>
-          <w:sz w:val="24"/>
-          <w:szCs w:val="24"/>
-          <w:lang w:val="es-SV"/>
-        </w:rPr>
-      </w:pPr>
-      <w:r>
-        <w:rPr>
-          <w:rFonts w:ascii="Arial" w:hAnsi="Arial" w:cs="Arial"/>
-          <w:color w:val="auto"/>
-          <w:sz w:val="24"/>
-          <w:szCs w:val="24"/>
-          <w:lang w:val="es-SV"/>
-        </w:rPr>
-        <w:t>Uso de status en el tablero</w:t>
-      </w:r>
-    </w:p>
-    <w:p>
-      <w:pPr>
-        <w:rPr>
-          <w:lang w:val="es-SV"/>
-        </w:rPr>
-      </w:pPr>
-    </w:p>
-    <w:p>
-      <w:pPr>
-        <w:rPr>
-          <w:lang w:val="es-SV"/>
-        </w:rPr>
-      </w:pPr>
-    </w:p>
-    <w:p>
-      <w:pPr>
-        <w:rPr>
-          <w:lang w:val="es-SV"/>
-        </w:rPr>
-      </w:pPr>
-    </w:p>
-    <w:p>
-      <w:pPr>
-        <w:rPr>
-          <w:lang w:val="es-SV"/>
-        </w:rPr>
-      </w:pPr>
-    </w:p>
-    <w:p>
-      <w:pPr>
-        <w:pStyle w:val="Ttulo2"/>
-        <w:rPr>
-          <w:rFonts w:ascii="Arial" w:hAnsi="Arial" w:cs="Arial"/>
-          <w:color w:val="auto"/>
-          <w:sz w:val="24"/>
-          <w:szCs w:val="24"/>
-          <w:lang w:val="es-SV"/>
-        </w:rPr>
-      </w:pPr>
-      <w:r>
-        <w:rPr>
-          <w:rFonts w:ascii="Arial" w:hAnsi="Arial" w:cs="Arial"/>
-          <w:color w:val="auto"/>
-          <w:sz w:val="24"/>
-          <w:szCs w:val="24"/>
-          <w:lang w:val="es-SV"/>
-        </w:rPr>
-        <w:t>Uso de priorities en el tablero</w:t>
-      </w:r>
-    </w:p>
-    <w:p>
-      <w:pPr>
-        <w:rPr>
-          <w:lang w:val="es-SV"/>
-        </w:rPr>
-      </w:pPr>
-    </w:p>
-    <w:p>
-      <w:pPr>
-        <w:rPr>
-          <w:lang w:val="es-SV"/>
-        </w:rPr>
-      </w:pPr>
-    </w:p>
-    <w:p>
-      <w:pPr>
-        <w:rPr>
-          <w:lang w:val="es-SV"/>
-        </w:rPr>
-      </w:pPr>
-    </w:p>
-    <w:p>
-      <w:pPr>
-        <w:rPr>
-          <w:lang w:val="es-SV"/>
-        </w:rPr>
-      </w:pPr>
-    </w:p>
-    <w:p>
-      <w:pPr>
-        <w:pStyle w:val="Ttulo2"/>
-        <w:rPr>
-          <w:rFonts w:ascii="Arial" w:hAnsi="Arial" w:cs="Arial"/>
-          <w:color w:val="auto"/>
-          <w:sz w:val="24"/>
-          <w:szCs w:val="24"/>
-          <w:lang w:val="es-SV"/>
-        </w:rPr>
-      </w:pPr>
-      <w:r>
-        <w:rPr>
-          <w:rFonts w:ascii="Arial" w:hAnsi="Arial" w:cs="Arial"/>
-          <w:color w:val="auto"/>
-          <w:sz w:val="24"/>
-          <w:szCs w:val="24"/>
-          <w:lang w:val="es-SV"/>
-        </w:rPr>
-        <w:t>Uso de type en el tablero</w:t>
-      </w:r>
-    </w:p>
-    <w:p>
-      <w:pPr>
-        <w:rPr>
-          <w:lang w:val="es-SV"/>
-        </w:rPr>
-      </w:pPr>
-    </w:p>
-    <w:p>
-      <w:pPr>
-        <w:rPr>
-          <w:lang w:val="es-SV"/>
-        </w:rPr>
-      </w:pPr>
-    </w:p>
-    <w:p>
-      <w:pPr>
-        <w:rPr>
-          <w:lang w:val="es-SV"/>
-        </w:rPr>
-      </w:pPr>
-    </w:p>
-    <w:p>
-      <w:pPr>
-        <w:rPr>
-          <w:lang w:val="es-SV"/>
-        </w:rPr>
-      </w:pPr>
-    </w:p>
-    <w:p>
-      <w:pPr>
-        <w:rPr>
-          <w:lang w:val="es-SV"/>
-        </w:rPr>
-      </w:pPr>
-    </w:p>
-    <w:p>
-      <w:pPr>
-        <w:rPr>
-          <w:lang w:val="es-SV"/>
-        </w:rPr>
-      </w:pPr>
-    </w:p>
-    <w:p>
-      <w:pPr>
-        <w:pStyle w:val="Ttulo2"/>
-        <w:rPr>
-          <w:rFonts w:ascii="Arial" w:hAnsi="Arial" w:cs="Arial"/>
-          <w:color w:val="auto"/>
-          <w:sz w:val="24"/>
-          <w:szCs w:val="24"/>
-          <w:lang w:val="es-SV"/>
-        </w:rPr>
-      </w:pPr>
-      <w:r>
-        <w:rPr>
-          <w:rFonts w:ascii="Arial" w:hAnsi="Arial" w:cs="Arial"/>
-          <w:color w:val="auto"/>
-          <w:sz w:val="24"/>
-          <w:szCs w:val="24"/>
-          <w:lang w:val="es-SV"/>
-        </w:rPr>
-        <w:t>Uso de assignees en el tablero</w:t>
-      </w:r>
-    </w:p>
-    <w:p>
-      <w:pPr>
-        <w:rPr>
-          <w:lang w:val="es-SV"/>
-        </w:rPr>
-      </w:pPr>
-    </w:p>
-    <w:p>
-      <w:pPr>
-        <w:rPr>
-          <w:lang w:val="es-SV"/>
-        </w:rPr>
-      </w:pPr>
-    </w:p>
-    <w:p>
-      <w:pPr>
-        <w:rPr>
-          <w:lang w:val="es-SV"/>
-        </w:rPr>
-      </w:pPr>
-    </w:p>
-    <w:p>
-      <w:pPr>
-        <w:pStyle w:val="Ttulo1"/>
-        <w:spacing w:line="360" w:lineRule="auto"/>
-        <w:rPr>
-          <w:rFonts w:ascii="Arial" w:hAnsi="Arial" w:cs="Arial"/>
-          <w:b/>
-          <w:bCs/>
-          <w:color w:val="auto"/>
-          <w:sz w:val="24"/>
-          <w:szCs w:val="24"/>
-          <w:lang w:val="es-SV"/>
-        </w:rPr>
-      </w:pPr>
-      <w:bookmarkStart w:id="15" w:name="_Toc224298485"/>
-      <w:r>
-        <w:rPr>
-          <w:rFonts w:ascii="Arial" w:hAnsi="Arial" w:cs="Arial"/>
-          <w:b/>
-          <w:bCs/>
-          <w:color w:val="auto"/>
-          <w:sz w:val="24"/>
-          <w:szCs w:val="24"/>
-          <w:lang w:val="es-SV"/>
-        </w:rPr>
-        <w:t>Evidencia de aplicación</w:t>
-      </w:r>
-      <w:bookmarkEnd w:id="15"/>
-    </w:p>
-    <w:p>
-      <w:pPr>
-        <w:pStyle w:val="Ttulo2"/>
-        <w:rPr>
-          <w:rFonts w:ascii="Arial" w:hAnsi="Arial" w:cs="Arial"/>
-          <w:color w:val="auto"/>
-          <w:sz w:val="24"/>
-          <w:szCs w:val="24"/>
-          <w:lang w:val="es-SV"/>
-        </w:rPr>
-      </w:pPr>
-      <w:bookmarkStart w:id="16" w:name="_Toc224298486"/>
-      <w:r>
-        <w:rPr>
-          <w:rFonts w:ascii="Arial" w:hAnsi="Arial" w:cs="Arial"/>
-          <w:color w:val="auto"/>
-          <w:sz w:val="24"/>
-          <w:szCs w:val="24"/>
-          <w:lang w:val="es-SV"/>
-        </w:rPr>
-        <w:t>Tablero</w:t>
-      </w:r>
-      <w:bookmarkEnd w:id="16"/>
-    </w:p>
-    <w:p>
-      <w:pPr>
-        <w:rPr>
-          <w:rFonts w:ascii="Arial" w:hAnsi="Arial" w:cs="Arial"/>
-          <w:lang w:val="es-SV"/>
-        </w:rPr>
-      </w:pPr>
-      <w:hyperlink r:id="rId13" w:history="1">
-        <w:r>
-          <w:rPr>
-            <w:rStyle w:val="Hipervnculo"/>
-            <w:rFonts w:ascii="Arial" w:hAnsi="Arial" w:cs="Arial"/>
-            <w:lang w:val="es-SV"/>
-          </w:rPr>
-          <w:t>https://github.com/users/2915762023/projects/1/</w:t>
-        </w:r>
-      </w:hyperlink>
-    </w:p>
-    <w:p>
-      <w:pPr>
-        <w:rPr>
-          <w:rFonts w:ascii="Arial" w:hAnsi="Arial" w:cs="Arial"/>
-          <w:lang w:val="es-SV"/>
-        </w:rPr>
-      </w:pPr>
-      <w:r>
-        <w:rPr>
-          <w:rFonts w:ascii="Arial" w:hAnsi="Arial" w:cs="Arial"/>
           <w:noProof/>
           <w:lang w:val="es-SV" w:eastAsia="es-SV"/>
         </w:rPr>
         <w:drawing>
-          <wp:inline distT="0" distB="0" distL="0" distR="0" wp14:anchorId="1DB95ED9" wp14:editId="395CD79B">
-            <wp:extent cx="5943600" cy="1677035"/>
+          <wp:inline distT="0" distB="0" distL="0" distR="0" wp14:anchorId="6F872713" wp14:editId="2EF2EA2E">
+            <wp:extent cx="3589331" cy="5875529"/>
             <wp:effectExtent l="0" t="0" r="0" b="0"/>
-            <wp:docPr id="15" name="Imagen 15"/>
+            <wp:docPr id="9" name="Imagen 9"/>
             <wp:cNvGraphicFramePr>
               <a:graphicFrameLocks xmlns:a="http://schemas.openxmlformats.org/drawingml/2006/main" noChangeAspect="1"/>
             </wp:cNvGraphicFramePr>
@@ -3581,7 +3018,7 @@
                   <pic:spPr>
                     <a:xfrm>
                       <a:off x="0" y="0"/>
-                      <a:ext cx="5943600" cy="1677035"/>
+                      <a:ext cx="3589331" cy="5875529"/>
                     </a:xfrm>
                     <a:prstGeom prst="rect">
                       <a:avLst/>
@@ -3604,6 +3041,30 @@
     </w:p>
     <w:p>
       <w:pPr>
+        <w:rPr>
+          <w:rFonts w:ascii="Arial" w:hAnsi="Arial" w:cs="Arial"/>
+          <w:lang w:val="es-SV"/>
+        </w:rPr>
+      </w:pPr>
+    </w:p>
+    <w:p>
+      <w:pPr>
+        <w:rPr>
+          <w:rFonts w:ascii="Arial" w:hAnsi="Arial" w:cs="Arial"/>
+          <w:lang w:val="es-SV"/>
+        </w:rPr>
+      </w:pPr>
+    </w:p>
+    <w:p>
+      <w:pPr>
+        <w:rPr>
+          <w:rFonts w:ascii="Arial" w:hAnsi="Arial" w:cs="Arial"/>
+          <w:lang w:val="es-SV"/>
+        </w:rPr>
+      </w:pPr>
+    </w:p>
+    <w:p>
+      <w:pPr>
         <w:pStyle w:val="Ttulo2"/>
         <w:rPr>
           <w:rFonts w:ascii="Arial" w:hAnsi="Arial" w:cs="Arial"/>
@@ -3613,7 +3074,7 @@
           <w:lang w:val="es-SV"/>
         </w:rPr>
       </w:pPr>
-      <w:bookmarkStart w:id="17" w:name="_Toc224298487"/>
+      <w:bookmarkStart w:id="9" w:name="_Toc224035373"/>
       <w:r>
         <w:rPr>
           <w:rFonts w:ascii="Arial" w:hAnsi="Arial" w:cs="Arial"/>
@@ -3623,12 +3084,13 @@
           <w:lang w:val="es-SV"/>
         </w:rPr>
         <w:lastRenderedPageBreak/>
-        <w:t>Repositorio con commits</w:t>
+        <w:t>Buscar un documento en los archivos locales</w:t>
       </w:r>
-      <w:bookmarkEnd w:id="17"/>
-    </w:p>
-    <w:p>
-      <w:pPr>
+      <w:bookmarkEnd w:id="9"/>
+    </w:p>
+    <w:p>
+      <w:pPr>
+        <w:jc w:val="center"/>
         <w:rPr>
           <w:rFonts w:ascii="Arial" w:hAnsi="Arial" w:cs="Arial"/>
           <w:lang w:val="es-SV"/>
@@ -3636,15 +3098,15 @@
       </w:pPr>
       <w:r>
         <w:rPr>
-          <w:rFonts w:ascii="Arial" w:hAnsi="Arial" w:cs="Arial"/>
+          <w:bCs/>
           <w:noProof/>
           <w:lang w:val="es-SV" w:eastAsia="es-SV"/>
         </w:rPr>
         <w:drawing>
-          <wp:inline distT="0" distB="0" distL="0" distR="0" wp14:anchorId="67F652E0" wp14:editId="3AB1CBC2">
-            <wp:extent cx="5943600" cy="2356485"/>
-            <wp:effectExtent l="0" t="0" r="0" b="5715"/>
-            <wp:docPr id="16" name="Imagen 16"/>
+          <wp:inline distT="0" distB="0" distL="0" distR="0" wp14:anchorId="050A79CB" wp14:editId="7DEF1125">
+            <wp:extent cx="3368332" cy="5730737"/>
+            <wp:effectExtent l="0" t="0" r="3810" b="3810"/>
+            <wp:docPr id="10" name="Imagen 10"/>
             <wp:cNvGraphicFramePr>
               <a:graphicFrameLocks xmlns:a="http://schemas.openxmlformats.org/drawingml/2006/main" noChangeAspect="1"/>
             </wp:cNvGraphicFramePr>
@@ -3664,6 +3126,1075 @@
                   <pic:spPr>
                     <a:xfrm>
                       <a:off x="0" y="0"/>
+                      <a:ext cx="3368332" cy="5730737"/>
+                    </a:xfrm>
+                    <a:prstGeom prst="rect">
+                      <a:avLst/>
+                    </a:prstGeom>
+                  </pic:spPr>
+                </pic:pic>
+              </a:graphicData>
+            </a:graphic>
+          </wp:inline>
+        </w:drawing>
+      </w:r>
+    </w:p>
+    <w:p>
+      <w:pPr>
+        <w:rPr>
+          <w:rFonts w:ascii="Arial" w:hAnsi="Arial" w:cs="Arial"/>
+          <w:lang w:val="es-SV"/>
+        </w:rPr>
+      </w:pPr>
+    </w:p>
+    <w:p>
+      <w:pPr>
+        <w:rPr>
+          <w:rFonts w:ascii="Arial" w:hAnsi="Arial" w:cs="Arial"/>
+          <w:lang w:val="es-SV"/>
+        </w:rPr>
+      </w:pPr>
+    </w:p>
+    <w:p>
+      <w:pPr>
+        <w:rPr>
+          <w:rFonts w:ascii="Arial" w:hAnsi="Arial" w:cs="Arial"/>
+          <w:lang w:val="es-SV"/>
+        </w:rPr>
+      </w:pPr>
+    </w:p>
+    <w:p>
+      <w:pPr>
+        <w:rPr>
+          <w:rFonts w:ascii="Arial" w:hAnsi="Arial" w:cs="Arial"/>
+          <w:lang w:val="es-SV"/>
+        </w:rPr>
+      </w:pPr>
+    </w:p>
+    <w:p>
+      <w:pPr>
+        <w:pStyle w:val="Ttulo1"/>
+        <w:spacing w:line="360" w:lineRule="auto"/>
+        <w:rPr>
+          <w:rFonts w:ascii="Arial" w:hAnsi="Arial" w:cs="Arial"/>
+          <w:b/>
+          <w:bCs/>
+          <w:color w:val="auto"/>
+          <w:sz w:val="24"/>
+          <w:szCs w:val="24"/>
+          <w:lang w:val="es-SV"/>
+        </w:rPr>
+      </w:pPr>
+      <w:bookmarkStart w:id="10" w:name="_Toc224035374"/>
+      <w:r>
+        <w:rPr>
+          <w:rFonts w:ascii="Arial" w:hAnsi="Arial" w:cs="Arial"/>
+          <w:b/>
+          <w:bCs/>
+          <w:color w:val="auto"/>
+          <w:sz w:val="24"/>
+          <w:szCs w:val="24"/>
+          <w:lang w:val="es-SV"/>
+        </w:rPr>
+        <w:lastRenderedPageBreak/>
+        <w:t>Diagramas TO-BE</w:t>
+      </w:r>
+      <w:bookmarkEnd w:id="10"/>
+    </w:p>
+    <w:p>
+      <w:pPr>
+        <w:pStyle w:val="Ttulo2"/>
+        <w:rPr>
+          <w:rFonts w:ascii="Arial" w:hAnsi="Arial" w:cs="Arial"/>
+          <w:color w:val="auto"/>
+          <w:sz w:val="24"/>
+          <w:szCs w:val="24"/>
+          <w:lang w:val="es-SV"/>
+        </w:rPr>
+      </w:pPr>
+      <w:bookmarkStart w:id="11" w:name="_Toc224035375"/>
+      <w:r>
+        <w:rPr>
+          <w:rFonts w:ascii="Arial" w:hAnsi="Arial" w:cs="Arial"/>
+          <w:color w:val="auto"/>
+          <w:sz w:val="24"/>
+          <w:szCs w:val="24"/>
+          <w:lang w:val="es-SV"/>
+        </w:rPr>
+        <w:t>Buscar un documento</w:t>
+      </w:r>
+      <w:bookmarkEnd w:id="11"/>
+    </w:p>
+    <w:p>
+      <w:pPr>
+        <w:jc w:val="center"/>
+        <w:rPr>
+          <w:rFonts w:ascii="Arial" w:hAnsi="Arial" w:cs="Arial"/>
+          <w:lang w:val="es-SV"/>
+        </w:rPr>
+      </w:pPr>
+      <w:r>
+        <w:rPr>
+          <w:noProof/>
+          <w:lang w:val="es-SV" w:eastAsia="es-SV"/>
+        </w:rPr>
+        <w:drawing>
+          <wp:inline distT="0" distB="0" distL="0" distR="0" wp14:anchorId="4225CF94" wp14:editId="3F992CD1">
+            <wp:extent cx="5159187" cy="5273497"/>
+            <wp:effectExtent l="0" t="0" r="3810" b="3810"/>
+            <wp:docPr id="11" name="Imagen 11"/>
+            <wp:cNvGraphicFramePr>
+              <a:graphicFrameLocks xmlns:a="http://schemas.openxmlformats.org/drawingml/2006/main" noChangeAspect="1"/>
+            </wp:cNvGraphicFramePr>
+            <a:graphic xmlns:a="http://schemas.openxmlformats.org/drawingml/2006/main">
+              <a:graphicData uri="http://schemas.openxmlformats.org/drawingml/2006/picture">
+                <pic:pic xmlns:pic="http://schemas.openxmlformats.org/drawingml/2006/picture">
+                  <pic:nvPicPr>
+                    <pic:cNvPr id="1" name=""/>
+                    <pic:cNvPicPr/>
+                  </pic:nvPicPr>
+                  <pic:blipFill>
+                    <a:blip r:embed="rId16"/>
+                    <a:stretch>
+                      <a:fillRect/>
+                    </a:stretch>
+                  </pic:blipFill>
+                  <pic:spPr>
+                    <a:xfrm>
+                      <a:off x="0" y="0"/>
+                      <a:ext cx="5159187" cy="5273497"/>
+                    </a:xfrm>
+                    <a:prstGeom prst="rect">
+                      <a:avLst/>
+                    </a:prstGeom>
+                  </pic:spPr>
+                </pic:pic>
+              </a:graphicData>
+            </a:graphic>
+          </wp:inline>
+        </w:drawing>
+      </w:r>
+    </w:p>
+    <w:p>
+      <w:pPr>
+        <w:rPr>
+          <w:rFonts w:ascii="Arial" w:hAnsi="Arial" w:cs="Arial"/>
+          <w:lang w:val="es-SV"/>
+        </w:rPr>
+      </w:pPr>
+    </w:p>
+    <w:p>
+      <w:pPr>
+        <w:rPr>
+          <w:rFonts w:ascii="Arial" w:hAnsi="Arial" w:cs="Arial"/>
+          <w:lang w:val="es-SV"/>
+        </w:rPr>
+      </w:pPr>
+    </w:p>
+    <w:p>
+      <w:pPr>
+        <w:rPr>
+          <w:rFonts w:ascii="Arial" w:hAnsi="Arial" w:cs="Arial"/>
+          <w:lang w:val="es-SV"/>
+        </w:rPr>
+      </w:pPr>
+    </w:p>
+    <w:p>
+      <w:pPr>
+        <w:rPr>
+          <w:rFonts w:ascii="Arial" w:hAnsi="Arial" w:cs="Arial"/>
+          <w:lang w:val="es-SV"/>
+        </w:rPr>
+      </w:pPr>
+    </w:p>
+    <w:p>
+      <w:pPr>
+        <w:rPr>
+          <w:rFonts w:ascii="Arial" w:hAnsi="Arial" w:cs="Arial"/>
+          <w:lang w:val="es-SV"/>
+        </w:rPr>
+      </w:pPr>
+    </w:p>
+    <w:p>
+      <w:pPr>
+        <w:rPr>
+          <w:rFonts w:ascii="Arial" w:hAnsi="Arial" w:cs="Arial"/>
+          <w:lang w:val="es-SV"/>
+        </w:rPr>
+      </w:pPr>
+    </w:p>
+    <w:p>
+      <w:pPr>
+        <w:pStyle w:val="Ttulo2"/>
+        <w:rPr>
+          <w:rFonts w:ascii="Arial" w:hAnsi="Arial" w:cs="Arial"/>
+          <w:color w:val="auto"/>
+          <w:sz w:val="24"/>
+          <w:szCs w:val="24"/>
+          <w:lang w:val="es-SV"/>
+        </w:rPr>
+      </w:pPr>
+      <w:bookmarkStart w:id="12" w:name="_Toc224035376"/>
+      <w:r>
+        <w:rPr>
+          <w:rFonts w:ascii="Arial" w:hAnsi="Arial" w:cs="Arial"/>
+          <w:color w:val="auto"/>
+          <w:sz w:val="24"/>
+          <w:szCs w:val="24"/>
+          <w:lang w:val="es-SV"/>
+        </w:rPr>
+        <w:lastRenderedPageBreak/>
+        <w:t>Subir un documento</w:t>
+      </w:r>
+      <w:bookmarkEnd w:id="12"/>
+    </w:p>
+    <w:p>
+      <w:pPr>
+        <w:jc w:val="center"/>
+        <w:rPr>
+          <w:rFonts w:ascii="Arial" w:hAnsi="Arial" w:cs="Arial"/>
+          <w:lang w:val="es-SV"/>
+        </w:rPr>
+      </w:pPr>
+      <w:r>
+        <w:rPr>
+          <w:noProof/>
+          <w:lang w:val="es-SV" w:eastAsia="es-SV"/>
+        </w:rPr>
+        <w:drawing>
+          <wp:inline distT="0" distB="0" distL="0" distR="0" wp14:anchorId="4CB784CB" wp14:editId="211C1BD7">
+            <wp:extent cx="5943600" cy="5568950"/>
+            <wp:effectExtent l="0" t="0" r="0" b="0"/>
+            <wp:docPr id="12" name="Imagen 12"/>
+            <wp:cNvGraphicFramePr>
+              <a:graphicFrameLocks xmlns:a="http://schemas.openxmlformats.org/drawingml/2006/main" noChangeAspect="1"/>
+            </wp:cNvGraphicFramePr>
+            <a:graphic xmlns:a="http://schemas.openxmlformats.org/drawingml/2006/main">
+              <a:graphicData uri="http://schemas.openxmlformats.org/drawingml/2006/picture">
+                <pic:pic xmlns:pic="http://schemas.openxmlformats.org/drawingml/2006/picture">
+                  <pic:nvPicPr>
+                    <pic:cNvPr id="1" name=""/>
+                    <pic:cNvPicPr/>
+                  </pic:nvPicPr>
+                  <pic:blipFill>
+                    <a:blip r:embed="rId17"/>
+                    <a:stretch>
+                      <a:fillRect/>
+                    </a:stretch>
+                  </pic:blipFill>
+                  <pic:spPr>
+                    <a:xfrm>
+                      <a:off x="0" y="0"/>
+                      <a:ext cx="5943600" cy="5568950"/>
+                    </a:xfrm>
+                    <a:prstGeom prst="rect">
+                      <a:avLst/>
+                    </a:prstGeom>
+                  </pic:spPr>
+                </pic:pic>
+              </a:graphicData>
+            </a:graphic>
+          </wp:inline>
+        </w:drawing>
+      </w:r>
+    </w:p>
+    <w:p>
+      <w:pPr>
+        <w:rPr>
+          <w:rFonts w:ascii="Arial" w:hAnsi="Arial" w:cs="Arial"/>
+          <w:lang w:val="es-SV"/>
+        </w:rPr>
+      </w:pPr>
+    </w:p>
+    <w:p>
+      <w:pPr>
+        <w:rPr>
+          <w:rFonts w:ascii="Arial" w:hAnsi="Arial" w:cs="Arial"/>
+          <w:lang w:val="es-SV"/>
+        </w:rPr>
+      </w:pPr>
+    </w:p>
+    <w:p>
+      <w:pPr>
+        <w:rPr>
+          <w:rFonts w:ascii="Arial" w:hAnsi="Arial" w:cs="Arial"/>
+          <w:lang w:val="es-SV"/>
+        </w:rPr>
+      </w:pPr>
+    </w:p>
+    <w:p>
+      <w:pPr>
+        <w:rPr>
+          <w:rFonts w:ascii="Arial" w:hAnsi="Arial" w:cs="Arial"/>
+          <w:lang w:val="es-SV"/>
+        </w:rPr>
+      </w:pPr>
+    </w:p>
+    <w:p>
+      <w:pPr>
+        <w:rPr>
+          <w:rFonts w:ascii="Arial" w:hAnsi="Arial" w:cs="Arial"/>
+          <w:lang w:val="es-SV"/>
+        </w:rPr>
+      </w:pPr>
+    </w:p>
+    <w:p>
+      <w:pPr>
+        <w:rPr>
+          <w:rFonts w:ascii="Arial" w:hAnsi="Arial" w:cs="Arial"/>
+          <w:lang w:val="es-SV"/>
+        </w:rPr>
+      </w:pPr>
+    </w:p>
+    <w:p>
+      <w:pPr>
+        <w:rPr>
+          <w:rFonts w:ascii="Arial" w:hAnsi="Arial" w:cs="Arial"/>
+          <w:lang w:val="es-SV"/>
+        </w:rPr>
+      </w:pPr>
+    </w:p>
+    <w:p>
+      <w:pPr>
+        <w:pStyle w:val="Ttulo2"/>
+        <w:rPr>
+          <w:rFonts w:ascii="Arial" w:hAnsi="Arial" w:cs="Arial"/>
+          <w:color w:val="auto"/>
+          <w:sz w:val="24"/>
+          <w:szCs w:val="24"/>
+          <w:lang w:val="es-SV"/>
+        </w:rPr>
+      </w:pPr>
+      <w:bookmarkStart w:id="13" w:name="_Toc224035377"/>
+      <w:r>
+        <w:rPr>
+          <w:rFonts w:ascii="Arial" w:hAnsi="Arial" w:cs="Arial"/>
+          <w:color w:val="auto"/>
+          <w:sz w:val="24"/>
+          <w:szCs w:val="24"/>
+          <w:lang w:val="es-SV"/>
+        </w:rPr>
+        <w:lastRenderedPageBreak/>
+        <w:t>Crear un nuevo usuario</w:t>
+      </w:r>
+      <w:bookmarkEnd w:id="13"/>
+    </w:p>
+    <w:p>
+      <w:pPr>
+        <w:jc w:val="center"/>
+        <w:rPr>
+          <w:rFonts w:ascii="Arial" w:hAnsi="Arial" w:cs="Arial"/>
+          <w:lang w:val="es-SV"/>
+        </w:rPr>
+      </w:pPr>
+      <w:r>
+        <w:rPr>
+          <w:noProof/>
+          <w:lang w:val="es-SV" w:eastAsia="es-SV"/>
+        </w:rPr>
+        <w:drawing>
+          <wp:inline distT="0" distB="0" distL="0" distR="0" wp14:anchorId="5EC47ABE" wp14:editId="32A5AA8F">
+            <wp:extent cx="5532599" cy="5166808"/>
+            <wp:effectExtent l="0" t="0" r="0" b="0"/>
+            <wp:docPr id="13" name="Imagen 13"/>
+            <wp:cNvGraphicFramePr>
+              <a:graphicFrameLocks xmlns:a="http://schemas.openxmlformats.org/drawingml/2006/main" noChangeAspect="1"/>
+            </wp:cNvGraphicFramePr>
+            <a:graphic xmlns:a="http://schemas.openxmlformats.org/drawingml/2006/main">
+              <a:graphicData uri="http://schemas.openxmlformats.org/drawingml/2006/picture">
+                <pic:pic xmlns:pic="http://schemas.openxmlformats.org/drawingml/2006/picture">
+                  <pic:nvPicPr>
+                    <pic:cNvPr id="1" name=""/>
+                    <pic:cNvPicPr/>
+                  </pic:nvPicPr>
+                  <pic:blipFill>
+                    <a:blip r:embed="rId18"/>
+                    <a:stretch>
+                      <a:fillRect/>
+                    </a:stretch>
+                  </pic:blipFill>
+                  <pic:spPr>
+                    <a:xfrm>
+                      <a:off x="0" y="0"/>
+                      <a:ext cx="5532599" cy="5166808"/>
+                    </a:xfrm>
+                    <a:prstGeom prst="rect">
+                      <a:avLst/>
+                    </a:prstGeom>
+                  </pic:spPr>
+                </pic:pic>
+              </a:graphicData>
+            </a:graphic>
+          </wp:inline>
+        </w:drawing>
+      </w:r>
+    </w:p>
+    <w:p>
+      <w:pPr>
+        <w:rPr>
+          <w:rFonts w:ascii="Arial" w:hAnsi="Arial" w:cs="Arial"/>
+          <w:lang w:val="es-SV"/>
+        </w:rPr>
+      </w:pPr>
+    </w:p>
+    <w:p>
+      <w:pPr>
+        <w:rPr>
+          <w:rFonts w:ascii="Arial" w:hAnsi="Arial" w:cs="Arial"/>
+          <w:lang w:val="es-SV"/>
+        </w:rPr>
+      </w:pPr>
+    </w:p>
+    <w:p>
+      <w:pPr>
+        <w:rPr>
+          <w:rFonts w:ascii="Arial" w:hAnsi="Arial" w:cs="Arial"/>
+          <w:lang w:val="es-SV"/>
+        </w:rPr>
+      </w:pPr>
+    </w:p>
+    <w:p>
+      <w:pPr>
+        <w:rPr>
+          <w:rFonts w:ascii="Arial" w:hAnsi="Arial" w:cs="Arial"/>
+          <w:lang w:val="es-SV"/>
+        </w:rPr>
+      </w:pPr>
+    </w:p>
+    <w:p>
+      <w:pPr>
+        <w:rPr>
+          <w:rFonts w:ascii="Arial" w:hAnsi="Arial" w:cs="Arial"/>
+          <w:lang w:val="es-SV"/>
+        </w:rPr>
+      </w:pPr>
+    </w:p>
+    <w:p>
+      <w:pPr>
+        <w:rPr>
+          <w:rFonts w:ascii="Arial" w:hAnsi="Arial" w:cs="Arial"/>
+          <w:lang w:val="es-SV"/>
+        </w:rPr>
+      </w:pPr>
+    </w:p>
+    <w:p>
+      <w:pPr>
+        <w:rPr>
+          <w:rFonts w:ascii="Arial" w:hAnsi="Arial" w:cs="Arial"/>
+          <w:lang w:val="es-SV"/>
+        </w:rPr>
+      </w:pPr>
+    </w:p>
+    <w:p>
+      <w:pPr>
+        <w:rPr>
+          <w:rFonts w:ascii="Arial" w:hAnsi="Arial" w:cs="Arial"/>
+          <w:lang w:val="es-SV"/>
+        </w:rPr>
+      </w:pPr>
+    </w:p>
+    <w:p>
+      <w:pPr>
+        <w:rPr>
+          <w:rFonts w:ascii="Arial" w:hAnsi="Arial" w:cs="Arial"/>
+          <w:lang w:val="es-SV"/>
+        </w:rPr>
+      </w:pPr>
+    </w:p>
+    <w:p>
+      <w:pPr>
+        <w:pStyle w:val="Ttulo1"/>
+        <w:spacing w:line="360" w:lineRule="auto"/>
+        <w:rPr>
+          <w:rFonts w:ascii="Arial" w:hAnsi="Arial" w:cs="Arial"/>
+          <w:b/>
+          <w:bCs/>
+          <w:color w:val="auto"/>
+          <w:sz w:val="24"/>
+          <w:szCs w:val="24"/>
+          <w:lang w:val="es-SV"/>
+        </w:rPr>
+      </w:pPr>
+      <w:bookmarkStart w:id="14" w:name="_Toc224035378"/>
+      <w:r>
+        <w:rPr>
+          <w:rFonts w:ascii="Arial" w:hAnsi="Arial" w:cs="Arial"/>
+          <w:b/>
+          <w:bCs/>
+          <w:color w:val="auto"/>
+          <w:sz w:val="24"/>
+          <w:szCs w:val="24"/>
+          <w:lang w:val="es-SV"/>
+        </w:rPr>
+        <w:lastRenderedPageBreak/>
+        <w:t>Mejoras concretas</w:t>
+      </w:r>
+      <w:bookmarkEnd w:id="14"/>
+    </w:p>
+    <w:p>
+      <w:pPr>
+        <w:pStyle w:val="Ttulo2"/>
+        <w:rPr>
+          <w:rFonts w:ascii="Arial" w:hAnsi="Arial" w:cs="Arial"/>
+          <w:color w:val="auto"/>
+          <w:sz w:val="24"/>
+          <w:szCs w:val="24"/>
+          <w:lang w:val="es-SV"/>
+        </w:rPr>
+      </w:pPr>
+      <w:r>
+        <w:rPr>
+          <w:rFonts w:ascii="Arial" w:hAnsi="Arial" w:cs="Arial"/>
+          <w:color w:val="auto"/>
+          <w:sz w:val="24"/>
+          <w:szCs w:val="24"/>
+          <w:lang w:val="es-SV"/>
+        </w:rPr>
+        <w:t xml:space="preserve">Uso específico de </w:t>
+      </w:r>
+      <w:proofErr w:type="spellStart"/>
+      <w:r>
+        <w:rPr>
+          <w:rFonts w:ascii="Arial" w:hAnsi="Arial" w:cs="Arial"/>
+          <w:color w:val="auto"/>
+          <w:sz w:val="24"/>
+          <w:szCs w:val="24"/>
+          <w:lang w:val="es-SV"/>
+        </w:rPr>
+        <w:t>commits</w:t>
+      </w:r>
+      <w:proofErr w:type="spellEnd"/>
+      <w:r>
+        <w:rPr>
+          <w:rFonts w:ascii="Arial" w:hAnsi="Arial" w:cs="Arial"/>
+          <w:color w:val="auto"/>
+          <w:sz w:val="24"/>
+          <w:szCs w:val="24"/>
+          <w:lang w:val="es-SV"/>
+        </w:rPr>
+        <w:t xml:space="preserve"> en </w:t>
+      </w:r>
+      <w:proofErr w:type="spellStart"/>
+      <w:r>
+        <w:rPr>
+          <w:rFonts w:ascii="Arial" w:hAnsi="Arial" w:cs="Arial"/>
+          <w:color w:val="auto"/>
+          <w:sz w:val="24"/>
+          <w:szCs w:val="24"/>
+          <w:lang w:val="es-SV"/>
+        </w:rPr>
+        <w:t>Github</w:t>
+      </w:r>
+      <w:proofErr w:type="spellEnd"/>
+    </w:p>
+    <w:p>
+      <w:pPr>
+        <w:rPr>
+          <w:rFonts w:ascii="Arial" w:hAnsi="Arial" w:cs="Arial"/>
+          <w:lang w:val="es-SV"/>
+        </w:rPr>
+      </w:pPr>
+    </w:p>
+    <w:p>
+      <w:pPr>
+        <w:rPr>
+          <w:rFonts w:ascii="Arial" w:hAnsi="Arial" w:cs="Arial"/>
+          <w:lang w:val="es-SV"/>
+        </w:rPr>
+      </w:pPr>
+    </w:p>
+    <w:p>
+      <w:pPr>
+        <w:rPr>
+          <w:rFonts w:ascii="Arial" w:hAnsi="Arial" w:cs="Arial"/>
+          <w:lang w:val="es-SV"/>
+        </w:rPr>
+      </w:pPr>
+    </w:p>
+    <w:p>
+      <w:pPr>
+        <w:rPr>
+          <w:rFonts w:ascii="Arial" w:hAnsi="Arial" w:cs="Arial"/>
+          <w:lang w:val="es-SV"/>
+        </w:rPr>
+      </w:pPr>
+    </w:p>
+    <w:p>
+      <w:pPr>
+        <w:pStyle w:val="Ttulo2"/>
+        <w:rPr>
+          <w:rFonts w:ascii="Arial" w:hAnsi="Arial" w:cs="Arial"/>
+          <w:color w:val="auto"/>
+          <w:sz w:val="24"/>
+          <w:szCs w:val="24"/>
+          <w:lang w:val="es-SV"/>
+        </w:rPr>
+      </w:pPr>
+      <w:r>
+        <w:rPr>
+          <w:rFonts w:ascii="Arial" w:hAnsi="Arial" w:cs="Arial"/>
+          <w:color w:val="auto"/>
+          <w:sz w:val="24"/>
+          <w:szCs w:val="24"/>
+          <w:lang w:val="es-SV"/>
+        </w:rPr>
+        <w:t>Uso de status en el tablero</w:t>
+      </w:r>
+    </w:p>
+    <w:p>
+      <w:pPr>
+        <w:rPr>
+          <w:lang w:val="es-SV"/>
+        </w:rPr>
+      </w:pPr>
+    </w:p>
+    <w:p>
+      <w:pPr>
+        <w:rPr>
+          <w:lang w:val="es-SV"/>
+        </w:rPr>
+      </w:pPr>
+    </w:p>
+    <w:p>
+      <w:pPr>
+        <w:rPr>
+          <w:lang w:val="es-SV"/>
+        </w:rPr>
+      </w:pPr>
+    </w:p>
+    <w:p>
+      <w:pPr>
+        <w:rPr>
+          <w:lang w:val="es-SV"/>
+        </w:rPr>
+      </w:pPr>
+    </w:p>
+    <w:p>
+      <w:pPr>
+        <w:pStyle w:val="Ttulo2"/>
+        <w:rPr>
+          <w:rFonts w:ascii="Arial" w:hAnsi="Arial" w:cs="Arial"/>
+          <w:color w:val="auto"/>
+          <w:sz w:val="24"/>
+          <w:szCs w:val="24"/>
+          <w:lang w:val="es-SV"/>
+        </w:rPr>
+      </w:pPr>
+      <w:r>
+        <w:rPr>
+          <w:rFonts w:ascii="Arial" w:hAnsi="Arial" w:cs="Arial"/>
+          <w:color w:val="auto"/>
+          <w:sz w:val="24"/>
+          <w:szCs w:val="24"/>
+          <w:lang w:val="es-SV"/>
+        </w:rPr>
+        <w:t xml:space="preserve">Uso de </w:t>
+      </w:r>
+      <w:proofErr w:type="spellStart"/>
+      <w:r>
+        <w:rPr>
+          <w:rFonts w:ascii="Arial" w:hAnsi="Arial" w:cs="Arial"/>
+          <w:color w:val="auto"/>
+          <w:sz w:val="24"/>
+          <w:szCs w:val="24"/>
+          <w:lang w:val="es-SV"/>
+        </w:rPr>
+        <w:t>priorities</w:t>
+      </w:r>
+      <w:proofErr w:type="spellEnd"/>
+      <w:r>
+        <w:rPr>
+          <w:rFonts w:ascii="Arial" w:hAnsi="Arial" w:cs="Arial"/>
+          <w:color w:val="auto"/>
+          <w:sz w:val="24"/>
+          <w:szCs w:val="24"/>
+          <w:lang w:val="es-SV"/>
+        </w:rPr>
+        <w:t xml:space="preserve"> en el tablero</w:t>
+      </w:r>
+    </w:p>
+    <w:p>
+      <w:pPr>
+        <w:rPr>
+          <w:lang w:val="es-SV"/>
+        </w:rPr>
+      </w:pPr>
+    </w:p>
+    <w:p>
+      <w:pPr>
+        <w:rPr>
+          <w:lang w:val="es-SV"/>
+        </w:rPr>
+      </w:pPr>
+    </w:p>
+    <w:p>
+      <w:pPr>
+        <w:rPr>
+          <w:lang w:val="es-SV"/>
+        </w:rPr>
+      </w:pPr>
+    </w:p>
+    <w:p>
+      <w:pPr>
+        <w:rPr>
+          <w:lang w:val="es-SV"/>
+        </w:rPr>
+      </w:pPr>
+    </w:p>
+    <w:p>
+      <w:pPr>
+        <w:pStyle w:val="Ttulo2"/>
+        <w:rPr>
+          <w:rFonts w:ascii="Arial" w:hAnsi="Arial" w:cs="Arial"/>
+          <w:color w:val="auto"/>
+          <w:sz w:val="24"/>
+          <w:szCs w:val="24"/>
+          <w:lang w:val="es-SV"/>
+        </w:rPr>
+      </w:pPr>
+      <w:r>
+        <w:rPr>
+          <w:rFonts w:ascii="Arial" w:hAnsi="Arial" w:cs="Arial"/>
+          <w:color w:val="auto"/>
+          <w:sz w:val="24"/>
+          <w:szCs w:val="24"/>
+          <w:lang w:val="es-SV"/>
+        </w:rPr>
+        <w:t xml:space="preserve">Uso de </w:t>
+      </w:r>
+      <w:proofErr w:type="spellStart"/>
+      <w:r>
+        <w:rPr>
+          <w:rFonts w:ascii="Arial" w:hAnsi="Arial" w:cs="Arial"/>
+          <w:color w:val="auto"/>
+          <w:sz w:val="24"/>
+          <w:szCs w:val="24"/>
+          <w:lang w:val="es-SV"/>
+        </w:rPr>
+        <w:t>type</w:t>
+      </w:r>
+      <w:proofErr w:type="spellEnd"/>
+      <w:r>
+        <w:rPr>
+          <w:rFonts w:ascii="Arial" w:hAnsi="Arial" w:cs="Arial"/>
+          <w:color w:val="auto"/>
+          <w:sz w:val="24"/>
+          <w:szCs w:val="24"/>
+          <w:lang w:val="es-SV"/>
+        </w:rPr>
+        <w:t xml:space="preserve"> en el tablero</w:t>
+      </w:r>
+    </w:p>
+    <w:p>
+      <w:pPr>
+        <w:rPr>
+          <w:lang w:val="es-SV"/>
+        </w:rPr>
+      </w:pPr>
+    </w:p>
+    <w:p>
+      <w:pPr>
+        <w:rPr>
+          <w:lang w:val="es-SV"/>
+        </w:rPr>
+      </w:pPr>
+    </w:p>
+    <w:p>
+      <w:pPr>
+        <w:rPr>
+          <w:lang w:val="es-SV"/>
+        </w:rPr>
+      </w:pPr>
+    </w:p>
+    <w:p>
+      <w:pPr>
+        <w:rPr>
+          <w:lang w:val="es-SV"/>
+        </w:rPr>
+      </w:pPr>
+    </w:p>
+    <w:p>
+      <w:pPr>
+        <w:rPr>
+          <w:lang w:val="es-SV"/>
+        </w:rPr>
+      </w:pPr>
+    </w:p>
+    <w:p>
+      <w:pPr>
+        <w:rPr>
+          <w:lang w:val="es-SV"/>
+        </w:rPr>
+      </w:pPr>
+    </w:p>
+    <w:p>
+      <w:pPr>
+        <w:pStyle w:val="Ttulo2"/>
+        <w:rPr>
+          <w:rFonts w:ascii="Arial" w:hAnsi="Arial" w:cs="Arial"/>
+          <w:color w:val="auto"/>
+          <w:sz w:val="24"/>
+          <w:szCs w:val="24"/>
+          <w:lang w:val="es-SV"/>
+        </w:rPr>
+      </w:pPr>
+      <w:r>
+        <w:rPr>
+          <w:rFonts w:ascii="Arial" w:hAnsi="Arial" w:cs="Arial"/>
+          <w:color w:val="auto"/>
+          <w:sz w:val="24"/>
+          <w:szCs w:val="24"/>
+          <w:lang w:val="es-SV"/>
+        </w:rPr>
+        <w:t xml:space="preserve">Uso de </w:t>
+      </w:r>
+      <w:proofErr w:type="spellStart"/>
+      <w:r>
+        <w:rPr>
+          <w:rFonts w:ascii="Arial" w:hAnsi="Arial" w:cs="Arial"/>
+          <w:color w:val="auto"/>
+          <w:sz w:val="24"/>
+          <w:szCs w:val="24"/>
+          <w:lang w:val="es-SV"/>
+        </w:rPr>
+        <w:t>assignees</w:t>
+      </w:r>
+      <w:proofErr w:type="spellEnd"/>
+      <w:r>
+        <w:rPr>
+          <w:rFonts w:ascii="Arial" w:hAnsi="Arial" w:cs="Arial"/>
+          <w:color w:val="auto"/>
+          <w:sz w:val="24"/>
+          <w:szCs w:val="24"/>
+          <w:lang w:val="es-SV"/>
+        </w:rPr>
+        <w:t xml:space="preserve"> en el tablero</w:t>
+      </w:r>
+    </w:p>
+    <w:p>
+      <w:pPr>
+        <w:rPr>
+          <w:lang w:val="es-SV"/>
+        </w:rPr>
+      </w:pPr>
+    </w:p>
+    <w:p>
+      <w:pPr>
+        <w:rPr>
+          <w:lang w:val="es-SV"/>
+        </w:rPr>
+      </w:pPr>
+    </w:p>
+    <w:p>
+      <w:pPr>
+        <w:rPr>
+          <w:lang w:val="es-SV"/>
+        </w:rPr>
+      </w:pPr>
+    </w:p>
+    <w:p>
+      <w:pPr>
+        <w:pStyle w:val="Ttulo1"/>
+        <w:spacing w:line="360" w:lineRule="auto"/>
+        <w:rPr>
+          <w:rFonts w:ascii="Arial" w:hAnsi="Arial" w:cs="Arial"/>
+          <w:b/>
+          <w:bCs/>
+          <w:color w:val="auto"/>
+          <w:sz w:val="24"/>
+          <w:szCs w:val="24"/>
+          <w:lang w:val="es-SV"/>
+        </w:rPr>
+      </w:pPr>
+      <w:bookmarkStart w:id="15" w:name="_Toc224298485"/>
+      <w:r>
+        <w:rPr>
+          <w:rFonts w:ascii="Arial" w:hAnsi="Arial" w:cs="Arial"/>
+          <w:b/>
+          <w:bCs/>
+          <w:color w:val="auto"/>
+          <w:sz w:val="24"/>
+          <w:szCs w:val="24"/>
+          <w:lang w:val="es-SV"/>
+        </w:rPr>
+        <w:lastRenderedPageBreak/>
+        <w:t>Evidencia de aplicación</w:t>
+      </w:r>
+      <w:bookmarkEnd w:id="15"/>
+    </w:p>
+    <w:p>
+      <w:pPr>
+        <w:pStyle w:val="Ttulo2"/>
+        <w:rPr>
+          <w:rFonts w:ascii="Arial" w:hAnsi="Arial" w:cs="Arial"/>
+          <w:color w:val="auto"/>
+          <w:sz w:val="24"/>
+          <w:szCs w:val="24"/>
+          <w:lang w:val="es-SV"/>
+        </w:rPr>
+      </w:pPr>
+      <w:bookmarkStart w:id="16" w:name="_Toc224298486"/>
+      <w:r>
+        <w:rPr>
+          <w:rFonts w:ascii="Arial" w:hAnsi="Arial" w:cs="Arial"/>
+          <w:color w:val="auto"/>
+          <w:sz w:val="24"/>
+          <w:szCs w:val="24"/>
+          <w:lang w:val="es-SV"/>
+        </w:rPr>
+        <w:t>Tablero</w:t>
+      </w:r>
+      <w:bookmarkEnd w:id="16"/>
+    </w:p>
+    <w:p>
+      <w:pPr>
+        <w:rPr>
+          <w:rFonts w:ascii="Arial" w:hAnsi="Arial" w:cs="Arial"/>
+          <w:lang w:val="es-SV"/>
+        </w:rPr>
+      </w:pPr>
+      <w:hyperlink r:id="rId19" w:history="1">
+        <w:r>
+          <w:rPr>
+            <w:rStyle w:val="Hipervnculo"/>
+            <w:rFonts w:ascii="Arial" w:hAnsi="Arial" w:cs="Arial"/>
+            <w:lang w:val="es-SV"/>
+          </w:rPr>
+          <w:t>https://github.com/users/2915762023/projects/1/</w:t>
+        </w:r>
+      </w:hyperlink>
+    </w:p>
+    <w:p>
+      <w:pPr>
+        <w:rPr>
+          <w:rFonts w:ascii="Arial" w:hAnsi="Arial" w:cs="Arial"/>
+          <w:lang w:val="es-SV"/>
+        </w:rPr>
+      </w:pPr>
+      <w:r>
+        <w:rPr>
+          <w:rFonts w:ascii="Arial" w:hAnsi="Arial" w:cs="Arial"/>
+          <w:noProof/>
+          <w:lang w:val="es-SV" w:eastAsia="es-SV"/>
+        </w:rPr>
+        <w:drawing>
+          <wp:inline distT="0" distB="0" distL="0" distR="0" wp14:anchorId="1DB95ED9" wp14:editId="395CD79B">
+            <wp:extent cx="5943600" cy="1677035"/>
+            <wp:effectExtent l="0" t="0" r="0" b="0"/>
+            <wp:docPr id="15" name="Imagen 15"/>
+            <wp:cNvGraphicFramePr>
+              <a:graphicFrameLocks xmlns:a="http://schemas.openxmlformats.org/drawingml/2006/main" noChangeAspect="1"/>
+            </wp:cNvGraphicFramePr>
+            <a:graphic xmlns:a="http://schemas.openxmlformats.org/drawingml/2006/main">
+              <a:graphicData uri="http://schemas.openxmlformats.org/drawingml/2006/picture">
+                <pic:pic xmlns:pic="http://schemas.openxmlformats.org/drawingml/2006/picture">
+                  <pic:nvPicPr>
+                    <pic:cNvPr id="1" name=""/>
+                    <pic:cNvPicPr/>
+                  </pic:nvPicPr>
+                  <pic:blipFill>
+                    <a:blip r:embed="rId20"/>
+                    <a:stretch>
+                      <a:fillRect/>
+                    </a:stretch>
+                  </pic:blipFill>
+                  <pic:spPr>
+                    <a:xfrm>
+                      <a:off x="0" y="0"/>
+                      <a:ext cx="5943600" cy="1677035"/>
+                    </a:xfrm>
+                    <a:prstGeom prst="rect">
+                      <a:avLst/>
+                    </a:prstGeom>
+                  </pic:spPr>
+                </pic:pic>
+              </a:graphicData>
+            </a:graphic>
+          </wp:inline>
+        </w:drawing>
+      </w:r>
+    </w:p>
+    <w:p>
+      <w:pPr>
+        <w:rPr>
+          <w:rFonts w:ascii="Arial" w:hAnsi="Arial" w:cs="Arial"/>
+          <w:lang w:val="es-SV"/>
+        </w:rPr>
+      </w:pPr>
+    </w:p>
+    <w:p>
+      <w:pPr>
+        <w:pStyle w:val="Ttulo2"/>
+        <w:rPr>
+          <w:rFonts w:ascii="Arial" w:hAnsi="Arial" w:cs="Arial"/>
+          <w:color w:val="auto"/>
+          <w:sz w:val="24"/>
+          <w:szCs w:val="24"/>
+          <w:lang w:val="es-SV"/>
+        </w:rPr>
+      </w:pPr>
+      <w:bookmarkStart w:id="17" w:name="_Toc224298487"/>
+      <w:r>
+        <w:rPr>
+          <w:rFonts w:ascii="Arial" w:hAnsi="Arial" w:cs="Arial"/>
+          <w:color w:val="auto"/>
+          <w:sz w:val="24"/>
+          <w:szCs w:val="24"/>
+          <w:lang w:val="es-SV"/>
+        </w:rPr>
+        <w:t xml:space="preserve">Repositorio con </w:t>
+      </w:r>
+      <w:proofErr w:type="spellStart"/>
+      <w:r>
+        <w:rPr>
+          <w:rFonts w:ascii="Arial" w:hAnsi="Arial" w:cs="Arial"/>
+          <w:color w:val="auto"/>
+          <w:sz w:val="24"/>
+          <w:szCs w:val="24"/>
+          <w:lang w:val="es-SV"/>
+        </w:rPr>
+        <w:t>commits</w:t>
+      </w:r>
+      <w:bookmarkEnd w:id="17"/>
+      <w:proofErr w:type="spellEnd"/>
+    </w:p>
+    <w:p>
+      <w:pPr>
+        <w:rPr>
+          <w:rFonts w:ascii="Arial" w:hAnsi="Arial" w:cs="Arial"/>
+          <w:lang w:val="es-SV"/>
+        </w:rPr>
+      </w:pPr>
+      <w:r>
+        <w:rPr>
+          <w:rFonts w:ascii="Arial" w:hAnsi="Arial" w:cs="Arial"/>
+          <w:noProof/>
+          <w:lang w:val="es-SV" w:eastAsia="es-SV"/>
+        </w:rPr>
+        <w:drawing>
+          <wp:inline distT="0" distB="0" distL="0" distR="0" wp14:anchorId="67F652E0" wp14:editId="3AB1CBC2">
+            <wp:extent cx="5943600" cy="2356485"/>
+            <wp:effectExtent l="0" t="0" r="0" b="5715"/>
+            <wp:docPr id="16" name="Imagen 16"/>
+            <wp:cNvGraphicFramePr>
+              <a:graphicFrameLocks xmlns:a="http://schemas.openxmlformats.org/drawingml/2006/main" noChangeAspect="1"/>
+            </wp:cNvGraphicFramePr>
+            <a:graphic xmlns:a="http://schemas.openxmlformats.org/drawingml/2006/main">
+              <a:graphicData uri="http://schemas.openxmlformats.org/drawingml/2006/picture">
+                <pic:pic xmlns:pic="http://schemas.openxmlformats.org/drawingml/2006/picture">
+                  <pic:nvPicPr>
+                    <pic:cNvPr id="1" name=""/>
+                    <pic:cNvPicPr/>
+                  </pic:nvPicPr>
+                  <pic:blipFill>
+                    <a:blip r:embed="rId21"/>
+                    <a:stretch>
+                      <a:fillRect/>
+                    </a:stretch>
+                  </pic:blipFill>
+                  <pic:spPr>
+                    <a:xfrm>
+                      <a:off x="0" y="0"/>
                       <a:ext cx="5943600" cy="2356485"/>
                     </a:xfrm>
                     <a:prstGeom prst="rect">
@@ -3676,8 +4207,6 @@
           </wp:inline>
         </w:drawing>
       </w:r>
-      <w:bookmarkStart w:id="18" w:name="_GoBack"/>
-      <w:bookmarkEnd w:id="18"/>
     </w:p>
     <w:p>
       <w:pPr>
@@ -3717,7 +4246,7 @@
           <w:lang w:val="es-SV"/>
         </w:rPr>
       </w:pPr>
-      <w:bookmarkStart w:id="19" w:name="_Toc224035382"/>
+      <w:bookmarkStart w:id="18" w:name="_Toc224035382"/>
       <w:r>
         <w:rPr>
           <w:rFonts w:ascii="Arial" w:hAnsi="Arial" w:cs="Arial"/>
@@ -3728,9 +4257,23 @@
           <w:szCs w:val="24"/>
           <w:lang w:val="es-SV"/>
         </w:rPr>
-        <w:t>Repositorio de Github</w:t>
+        <w:t xml:space="preserve">Repositorio de </w:t>
       </w:r>
-      <w:bookmarkEnd w:id="19"/>
+      <w:proofErr w:type="spellStart"/>
+      <w:r>
+        <w:rPr>
+          <w:rFonts w:ascii="Arial" w:hAnsi="Arial" w:cs="Arial"/>
+          <w:b/>
+          <w:bCs/>
+          <w:color w:val="auto"/>
+          <w:sz w:val="24"/>
+          <w:szCs w:val="24"/>
+          <w:lang w:val="es-SV"/>
+        </w:rPr>
+        <w:t>Github</w:t>
+      </w:r>
+      <w:bookmarkEnd w:id="18"/>
+      <w:proofErr w:type="spellEnd"/>
     </w:p>
     <w:p>
       <w:pPr>
@@ -3740,7 +4283,7 @@
           <w:lang w:val="es-ES"/>
         </w:rPr>
       </w:pPr>
-      <w:hyperlink r:id="rId16" w:history="1">
+      <w:hyperlink r:id="rId22" w:history="1">
         <w:r>
           <w:rPr>
             <w:rStyle w:val="Hipervnculo"/>
@@ -3790,7 +4333,7 @@
           <w:lang w:val="es-SV"/>
         </w:rPr>
       </w:pPr>
-      <w:bookmarkStart w:id="20" w:name="_Toc224035383"/>
+      <w:bookmarkStart w:id="19" w:name="_Toc224035383"/>
       <w:r>
         <w:rPr>
           <w:rFonts w:ascii="Arial" w:hAnsi="Arial" w:cs="Arial"/>
@@ -3803,7 +4346,7 @@
         </w:rPr>
         <w:t>Anexos</w:t>
       </w:r>
-      <w:bookmarkEnd w:id="20"/>
+      <w:bookmarkEnd w:id="19"/>
     </w:p>
     <w:p>
       <w:pPr>
@@ -3814,8 +4357,8 @@
       </w:pPr>
     </w:p>
     <w:sectPr>
-      <w:headerReference w:type="default" r:id="rId17"/>
-      <w:headerReference w:type="first" r:id="rId18"/>
+      <w:headerReference w:type="default" r:id="rId23"/>
+      <w:headerReference w:type="first" r:id="rId24"/>
       <w:pgSz w:w="12240" w:h="15840"/>
       <w:pgMar w:top="1440" w:right="1440" w:bottom="1440" w:left="1440" w:header="720" w:footer="720" w:gutter="0"/>
       <w:pgNumType w:start="1"/>
@@ -3828,7 +4371,7 @@
 </file>
 
 <file path=word/endnotes.xml><?xml version="1.0" encoding="utf-8"?>
-<w:endnotes xmlns:wpc="http://schemas.microsoft.com/office/word/2010/wordprocessingCanvas" xmlns:cx="http://schemas.microsoft.com/office/drawing/2014/chartex" xmlns:mc="http://schemas.openxmlformats.org/markup-compatibility/2006" xmlns:o="urn:schemas-microsoft-com:office:office" xmlns:r="http://schemas.openxmlformats.org/officeDocument/2006/relationships" xmlns:m="http://schemas.openxmlformats.org/officeDocument/2006/math" xmlns:v="urn:schemas-microsoft-com:vml" xmlns:wp14="http://schemas.microsoft.com/office/word/2010/wordprocessingDrawing" xmlns:wp="http://schemas.openxmlformats.org/drawingml/2006/wordprocessingDrawing" xmlns:w10="urn:schemas-microsoft-com:office:word" xmlns:w="http://schemas.openxmlformats.org/wordprocessingml/2006/main" xmlns:w14="http://schemas.microsoft.com/office/word/2010/wordml" xmlns:w15="http://schemas.microsoft.com/office/word/2012/wordml" xmlns:w16se="http://schemas.microsoft.com/office/word/2015/wordml/symex" xmlns:wpg="http://schemas.microsoft.com/office/word/2010/wordprocessingGroup" xmlns:wpi="http://schemas.microsoft.com/office/word/2010/wordprocessingInk" xmlns:wne="http://schemas.microsoft.com/office/word/2006/wordml" xmlns:wps="http://schemas.microsoft.com/office/word/2010/wordprocessingShape" mc:Ignorable="w14 w15 w16se wp14">
+<w:endnotes xmlns:wpc="http://schemas.microsoft.com/office/word/2010/wordprocessingCanvas" xmlns:cx="http://schemas.microsoft.com/office/drawing/2014/chartex" xmlns:cx1="http://schemas.microsoft.com/office/drawing/2015/9/8/chartex" xmlns:cx2="http://schemas.microsoft.com/office/drawing/2015/10/21/chartex" xmlns:cx3="http://schemas.microsoft.com/office/drawing/2016/5/9/chartex" xmlns:cx4="http://schemas.microsoft.com/office/drawing/2016/5/10/chartex" xmlns:cx5="http://schemas.microsoft.com/office/drawing/2016/5/11/chartex" xmlns:cx6="http://schemas.microsoft.com/office/drawing/2016/5/12/chartex" xmlns:cx7="http://schemas.microsoft.com/office/drawing/2016/5/13/chartex" xmlns:cx8="http://schemas.microsoft.com/office/drawing/2016/5/14/chartex" xmlns:mc="http://schemas.openxmlformats.org/markup-compatibility/2006" xmlns:aink="http://schemas.microsoft.com/office/drawing/2016/ink" xmlns:am3d="http://schemas.microsoft.com/office/drawing/2017/model3d" xmlns:o="urn:schemas-microsoft-com:office:office" xmlns:oel="http://schemas.microsoft.com/office/2019/extlst" xmlns:r="http://schemas.openxmlformats.org/officeDocument/2006/relationships" xmlns:m="http://schemas.openxmlformats.org/officeDocument/2006/math" xmlns:v="urn:schemas-microsoft-com:vml" xmlns:wp14="http://schemas.microsoft.com/office/word/2010/wordprocessingDrawing" xmlns:wp="http://schemas.openxmlformats.org/drawingml/2006/wordprocessingDrawing" xmlns:w10="urn:schemas-microsoft-com:office:word" xmlns:w="http://schemas.openxmlformats.org/wordprocessingml/2006/main" xmlns:w14="http://schemas.microsoft.com/office/word/2010/wordml" xmlns:w15="http://schemas.microsoft.com/office/word/2012/wordml" xmlns:w16cex="http://schemas.microsoft.com/office/word/2018/wordml/cex" xmlns:w16cid="http://schemas.microsoft.com/office/word/2016/wordml/cid" xmlns:w16="http://schemas.microsoft.com/office/word/2018/wordml" xmlns:w16sdtdh="http://schemas.microsoft.com/office/word/2020/wordml/sdtdatahash" xmlns:w16se="http://schemas.microsoft.com/office/word/2015/wordml/symex" xmlns:wpg="http://schemas.microsoft.com/office/word/2010/wordprocessingGroup" xmlns:wpi="http://schemas.microsoft.com/office/word/2010/wordprocessingInk" xmlns:wne="http://schemas.microsoft.com/office/word/2006/wordml" xmlns:wps="http://schemas.microsoft.com/office/word/2010/wordprocessingShape" mc:Ignorable="w14 w15 w16se w16cid w16 w16cex w16sdtdh wp14">
   <w:endnote w:type="separator" w:id="-1">
     <w:p>
       <w:pPr>
@@ -3853,7 +4396,7 @@
 </file>
 
 <file path=word/footer1.xml><?xml version="1.0" encoding="utf-8"?>
-<w:ftr xmlns:wpc="http://schemas.microsoft.com/office/word/2010/wordprocessingCanvas" xmlns:cx="http://schemas.microsoft.com/office/drawing/2014/chartex" xmlns:mc="http://schemas.openxmlformats.org/markup-compatibility/2006" xmlns:o="urn:schemas-microsoft-com:office:office" xmlns:r="http://schemas.openxmlformats.org/officeDocument/2006/relationships" xmlns:m="http://schemas.openxmlformats.org/officeDocument/2006/math" xmlns:v="urn:schemas-microsoft-com:vml" xmlns:wp14="http://schemas.microsoft.com/office/word/2010/wordprocessingDrawing" xmlns:wp="http://schemas.openxmlformats.org/drawingml/2006/wordprocessingDrawing" xmlns:w10="urn:schemas-microsoft-com:office:word" xmlns:w="http://schemas.openxmlformats.org/wordprocessingml/2006/main" xmlns:w14="http://schemas.microsoft.com/office/word/2010/wordml" xmlns:w15="http://schemas.microsoft.com/office/word/2012/wordml" xmlns:w16se="http://schemas.microsoft.com/office/word/2015/wordml/symex" xmlns:wpg="http://schemas.microsoft.com/office/word/2010/wordprocessingGroup" xmlns:wpi="http://schemas.microsoft.com/office/word/2010/wordprocessingInk" xmlns:wne="http://schemas.microsoft.com/office/word/2006/wordml" xmlns:wps="http://schemas.microsoft.com/office/word/2010/wordprocessingShape" mc:Ignorable="w14 w15 w16se wp14">
+<w:ftr xmlns:wpc="http://schemas.microsoft.com/office/word/2010/wordprocessingCanvas" xmlns:cx="http://schemas.microsoft.com/office/drawing/2014/chartex" xmlns:cx1="http://schemas.microsoft.com/office/drawing/2015/9/8/chartex" xmlns:cx2="http://schemas.microsoft.com/office/drawing/2015/10/21/chartex" xmlns:cx3="http://schemas.microsoft.com/office/drawing/2016/5/9/chartex" xmlns:cx4="http://schemas.microsoft.com/office/drawing/2016/5/10/chartex" xmlns:cx5="http://schemas.microsoft.com/office/drawing/2016/5/11/chartex" xmlns:cx6="http://schemas.microsoft.com/office/drawing/2016/5/12/chartex" xmlns:cx7="http://schemas.microsoft.com/office/drawing/2016/5/13/chartex" xmlns:cx8="http://schemas.microsoft.com/office/drawing/2016/5/14/chartex" xmlns:mc="http://schemas.openxmlformats.org/markup-compatibility/2006" xmlns:aink="http://schemas.microsoft.com/office/drawing/2016/ink" xmlns:am3d="http://schemas.microsoft.com/office/drawing/2017/model3d" xmlns:o="urn:schemas-microsoft-com:office:office" xmlns:oel="http://schemas.microsoft.com/office/2019/extlst" xmlns:r="http://schemas.openxmlformats.org/officeDocument/2006/relationships" xmlns:m="http://schemas.openxmlformats.org/officeDocument/2006/math" xmlns:v="urn:schemas-microsoft-com:vml" xmlns:wp14="http://schemas.microsoft.com/office/word/2010/wordprocessingDrawing" xmlns:wp="http://schemas.openxmlformats.org/drawingml/2006/wordprocessingDrawing" xmlns:w10="urn:schemas-microsoft-com:office:word" xmlns:w="http://schemas.openxmlformats.org/wordprocessingml/2006/main" xmlns:w14="http://schemas.microsoft.com/office/word/2010/wordml" xmlns:w15="http://schemas.microsoft.com/office/word/2012/wordml" xmlns:w16cex="http://schemas.microsoft.com/office/word/2018/wordml/cex" xmlns:w16cid="http://schemas.microsoft.com/office/word/2016/wordml/cid" xmlns:w16="http://schemas.microsoft.com/office/word/2018/wordml" xmlns:w16sdtdh="http://schemas.microsoft.com/office/word/2020/wordml/sdtdatahash" xmlns:w16se="http://schemas.microsoft.com/office/word/2015/wordml/symex" xmlns:wpg="http://schemas.microsoft.com/office/word/2010/wordprocessingGroup" xmlns:wpi="http://schemas.microsoft.com/office/word/2010/wordprocessingInk" xmlns:wne="http://schemas.microsoft.com/office/word/2006/wordml" xmlns:wps="http://schemas.microsoft.com/office/word/2010/wordprocessingShape" mc:Ignorable="w14 w15 w16se w16cid w16 w16cex w16sdtdh wp14">
   <w:p>
     <w:pPr>
       <w:pStyle w:val="Piedepgina"/>
@@ -3869,7 +4412,7 @@
 </file>
 
 <file path=word/footnotes.xml><?xml version="1.0" encoding="utf-8"?>
-<w:footnotes xmlns:wpc="http://schemas.microsoft.com/office/word/2010/wordprocessingCanvas" xmlns:cx="http://schemas.microsoft.com/office/drawing/2014/chartex" xmlns:mc="http://schemas.openxmlformats.org/markup-compatibility/2006" xmlns:o="urn:schemas-microsoft-com:office:office" xmlns:r="http://schemas.openxmlformats.org/officeDocument/2006/relationships" xmlns:m="http://schemas.openxmlformats.org/officeDocument/2006/math" xmlns:v="urn:schemas-microsoft-com:vml" xmlns:wp14="http://schemas.microsoft.com/office/word/2010/wordprocessingDrawing" xmlns:wp="http://schemas.openxmlformats.org/drawingml/2006/wordprocessingDrawing" xmlns:w10="urn:schemas-microsoft-com:office:word" xmlns:w="http://schemas.openxmlformats.org/wordprocessingml/2006/main" xmlns:w14="http://schemas.microsoft.com/office/word/2010/wordml" xmlns:w15="http://schemas.microsoft.com/office/word/2012/wordml" xmlns:w16se="http://schemas.microsoft.com/office/word/2015/wordml/symex" xmlns:wpg="http://schemas.microsoft.com/office/word/2010/wordprocessingGroup" xmlns:wpi="http://schemas.microsoft.com/office/word/2010/wordprocessingInk" xmlns:wne="http://schemas.microsoft.com/office/word/2006/wordml" xmlns:wps="http://schemas.microsoft.com/office/word/2010/wordprocessingShape" mc:Ignorable="w14 w15 w16se wp14">
+<w:footnotes xmlns:wpc="http://schemas.microsoft.com/office/word/2010/wordprocessingCanvas" xmlns:cx="http://schemas.microsoft.com/office/drawing/2014/chartex" xmlns:cx1="http://schemas.microsoft.com/office/drawing/2015/9/8/chartex" xmlns:cx2="http://schemas.microsoft.com/office/drawing/2015/10/21/chartex" xmlns:cx3="http://schemas.microsoft.com/office/drawing/2016/5/9/chartex" xmlns:cx4="http://schemas.microsoft.com/office/drawing/2016/5/10/chartex" xmlns:cx5="http://schemas.microsoft.com/office/drawing/2016/5/11/chartex" xmlns:cx6="http://schemas.microsoft.com/office/drawing/2016/5/12/chartex" xmlns:cx7="http://schemas.microsoft.com/office/drawing/2016/5/13/chartex" xmlns:cx8="http://schemas.microsoft.com/office/drawing/2016/5/14/chartex" xmlns:mc="http://schemas.openxmlformats.org/markup-compatibility/2006" xmlns:aink="http://schemas.microsoft.com/office/drawing/2016/ink" xmlns:am3d="http://schemas.microsoft.com/office/drawing/2017/model3d" xmlns:o="urn:schemas-microsoft-com:office:office" xmlns:oel="http://schemas.microsoft.com/office/2019/extlst" xmlns:r="http://schemas.openxmlformats.org/officeDocument/2006/relationships" xmlns:m="http://schemas.openxmlformats.org/officeDocument/2006/math" xmlns:v="urn:schemas-microsoft-com:vml" xmlns:wp14="http://schemas.microsoft.com/office/word/2010/wordprocessingDrawing" xmlns:wp="http://schemas.openxmlformats.org/drawingml/2006/wordprocessingDrawing" xmlns:w10="urn:schemas-microsoft-com:office:word" xmlns:w="http://schemas.openxmlformats.org/wordprocessingml/2006/main" xmlns:w14="http://schemas.microsoft.com/office/word/2010/wordml" xmlns:w15="http://schemas.microsoft.com/office/word/2012/wordml" xmlns:w16cex="http://schemas.microsoft.com/office/word/2018/wordml/cex" xmlns:w16cid="http://schemas.microsoft.com/office/word/2016/wordml/cid" xmlns:w16="http://schemas.microsoft.com/office/word/2018/wordml" xmlns:w16sdtdh="http://schemas.microsoft.com/office/word/2020/wordml/sdtdatahash" xmlns:w16se="http://schemas.microsoft.com/office/word/2015/wordml/symex" xmlns:wpg="http://schemas.microsoft.com/office/word/2010/wordprocessingGroup" xmlns:wpi="http://schemas.microsoft.com/office/word/2010/wordprocessingInk" xmlns:wne="http://schemas.microsoft.com/office/word/2006/wordml" xmlns:wps="http://schemas.microsoft.com/office/word/2010/wordprocessingShape" mc:Ignorable="w14 w15 w16se w16cid w16 w16cex w16sdtdh wp14">
   <w:footnote w:type="separator" w:id="-1">
     <w:p>
       <w:pPr>
@@ -3894,7 +4437,7 @@
 </file>
 
 <file path=word/header1.xml><?xml version="1.0" encoding="utf-8"?>
-<w:hdr xmlns:wpc="http://schemas.microsoft.com/office/word/2010/wordprocessingCanvas" xmlns:cx="http://schemas.microsoft.com/office/drawing/2014/chartex" xmlns:mc="http://schemas.openxmlformats.org/markup-compatibility/2006" xmlns:o="urn:schemas-microsoft-com:office:office" xmlns:r="http://schemas.openxmlformats.org/officeDocument/2006/relationships" xmlns:m="http://schemas.openxmlformats.org/officeDocument/2006/math" xmlns:v="urn:schemas-microsoft-com:vml" xmlns:wp14="http://schemas.microsoft.com/office/word/2010/wordprocessingDrawing" xmlns:wp="http://schemas.openxmlformats.org/drawingml/2006/wordprocessingDrawing" xmlns:w10="urn:schemas-microsoft-com:office:word" xmlns:w="http://schemas.openxmlformats.org/wordprocessingml/2006/main" xmlns:w14="http://schemas.microsoft.com/office/word/2010/wordml" xmlns:w15="http://schemas.microsoft.com/office/word/2012/wordml" xmlns:w16se="http://schemas.microsoft.com/office/word/2015/wordml/symex" xmlns:wpg="http://schemas.microsoft.com/office/word/2010/wordprocessingGroup" xmlns:wpi="http://schemas.microsoft.com/office/word/2010/wordprocessingInk" xmlns:wne="http://schemas.microsoft.com/office/word/2006/wordml" xmlns:wps="http://schemas.microsoft.com/office/word/2010/wordprocessingShape" mc:Ignorable="w14 w15 w16se wp14">
+<w:hdr xmlns:wpc="http://schemas.microsoft.com/office/word/2010/wordprocessingCanvas" xmlns:cx="http://schemas.microsoft.com/office/drawing/2014/chartex" xmlns:cx1="http://schemas.microsoft.com/office/drawing/2015/9/8/chartex" xmlns:cx2="http://schemas.microsoft.com/office/drawing/2015/10/21/chartex" xmlns:cx3="http://schemas.microsoft.com/office/drawing/2016/5/9/chartex" xmlns:cx4="http://schemas.microsoft.com/office/drawing/2016/5/10/chartex" xmlns:cx5="http://schemas.microsoft.com/office/drawing/2016/5/11/chartex" xmlns:cx6="http://schemas.microsoft.com/office/drawing/2016/5/12/chartex" xmlns:cx7="http://schemas.microsoft.com/office/drawing/2016/5/13/chartex" xmlns:cx8="http://schemas.microsoft.com/office/drawing/2016/5/14/chartex" xmlns:mc="http://schemas.openxmlformats.org/markup-compatibility/2006" xmlns:aink="http://schemas.microsoft.com/office/drawing/2016/ink" xmlns:am3d="http://schemas.microsoft.com/office/drawing/2017/model3d" xmlns:o="urn:schemas-microsoft-com:office:office" xmlns:oel="http://schemas.microsoft.com/office/2019/extlst" xmlns:r="http://schemas.openxmlformats.org/officeDocument/2006/relationships" xmlns:m="http://schemas.openxmlformats.org/officeDocument/2006/math" xmlns:v="urn:schemas-microsoft-com:vml" xmlns:wp14="http://schemas.microsoft.com/office/word/2010/wordprocessingDrawing" xmlns:wp="http://schemas.openxmlformats.org/drawingml/2006/wordprocessingDrawing" xmlns:w10="urn:schemas-microsoft-com:office:word" xmlns:w="http://schemas.openxmlformats.org/wordprocessingml/2006/main" xmlns:w14="http://schemas.microsoft.com/office/word/2010/wordml" xmlns:w15="http://schemas.microsoft.com/office/word/2012/wordml" xmlns:w16cex="http://schemas.microsoft.com/office/word/2018/wordml/cex" xmlns:w16cid="http://schemas.microsoft.com/office/word/2016/wordml/cid" xmlns:w16="http://schemas.microsoft.com/office/word/2018/wordml" xmlns:w16sdtdh="http://schemas.microsoft.com/office/word/2020/wordml/sdtdatahash" xmlns:w16se="http://schemas.microsoft.com/office/word/2015/wordml/symex" xmlns:wpg="http://schemas.microsoft.com/office/word/2010/wordprocessingGroup" xmlns:wpi="http://schemas.microsoft.com/office/word/2010/wordprocessingInk" xmlns:wne="http://schemas.microsoft.com/office/word/2006/wordml" xmlns:wps="http://schemas.microsoft.com/office/word/2010/wordprocessingShape" mc:Ignorable="w14 w15 w16se w16cid w16 w16cex w16sdtdh wp14">
   <w:p>
     <w:pPr>
       <w:pStyle w:val="Encabezado"/>
@@ -3910,7 +4453,7 @@
 </file>
 
 <file path=word/header2.xml><?xml version="1.0" encoding="utf-8"?>
-<w:hdr xmlns:wpc="http://schemas.microsoft.com/office/word/2010/wordprocessingCanvas" xmlns:cx="http://schemas.microsoft.com/office/drawing/2014/chartex" xmlns:mc="http://schemas.openxmlformats.org/markup-compatibility/2006" xmlns:o="urn:schemas-microsoft-com:office:office" xmlns:r="http://schemas.openxmlformats.org/officeDocument/2006/relationships" xmlns:m="http://schemas.openxmlformats.org/officeDocument/2006/math" xmlns:v="urn:schemas-microsoft-com:vml" xmlns:wp14="http://schemas.microsoft.com/office/word/2010/wordprocessingDrawing" xmlns:wp="http://schemas.openxmlformats.org/drawingml/2006/wordprocessingDrawing" xmlns:w10="urn:schemas-microsoft-com:office:word" xmlns:w="http://schemas.openxmlformats.org/wordprocessingml/2006/main" xmlns:w14="http://schemas.microsoft.com/office/word/2010/wordml" xmlns:w15="http://schemas.microsoft.com/office/word/2012/wordml" xmlns:w16se="http://schemas.microsoft.com/office/word/2015/wordml/symex" xmlns:wpg="http://schemas.microsoft.com/office/word/2010/wordprocessingGroup" xmlns:wpi="http://schemas.microsoft.com/office/word/2010/wordprocessingInk" xmlns:wne="http://schemas.microsoft.com/office/word/2006/wordml" xmlns:wps="http://schemas.microsoft.com/office/word/2010/wordprocessingShape" mc:Ignorable="w14 w15 w16se wp14">
+<w:hdr xmlns:wpc="http://schemas.microsoft.com/office/word/2010/wordprocessingCanvas" xmlns:cx="http://schemas.microsoft.com/office/drawing/2014/chartex" xmlns:cx1="http://schemas.microsoft.com/office/drawing/2015/9/8/chartex" xmlns:cx2="http://schemas.microsoft.com/office/drawing/2015/10/21/chartex" xmlns:cx3="http://schemas.microsoft.com/office/drawing/2016/5/9/chartex" xmlns:cx4="http://schemas.microsoft.com/office/drawing/2016/5/10/chartex" xmlns:cx5="http://schemas.microsoft.com/office/drawing/2016/5/11/chartex" xmlns:cx6="http://schemas.microsoft.com/office/drawing/2016/5/12/chartex" xmlns:cx7="http://schemas.microsoft.com/office/drawing/2016/5/13/chartex" xmlns:cx8="http://schemas.microsoft.com/office/drawing/2016/5/14/chartex" xmlns:mc="http://schemas.openxmlformats.org/markup-compatibility/2006" xmlns:aink="http://schemas.microsoft.com/office/drawing/2016/ink" xmlns:am3d="http://schemas.microsoft.com/office/drawing/2017/model3d" xmlns:o="urn:schemas-microsoft-com:office:office" xmlns:oel="http://schemas.microsoft.com/office/2019/extlst" xmlns:r="http://schemas.openxmlformats.org/officeDocument/2006/relationships" xmlns:m="http://schemas.openxmlformats.org/officeDocument/2006/math" xmlns:v="urn:schemas-microsoft-com:vml" xmlns:wp14="http://schemas.microsoft.com/office/word/2010/wordprocessingDrawing" xmlns:wp="http://schemas.openxmlformats.org/drawingml/2006/wordprocessingDrawing" xmlns:w10="urn:schemas-microsoft-com:office:word" xmlns:w="http://schemas.openxmlformats.org/wordprocessingml/2006/main" xmlns:w14="http://schemas.microsoft.com/office/word/2010/wordml" xmlns:w15="http://schemas.microsoft.com/office/word/2012/wordml" xmlns:w16cex="http://schemas.microsoft.com/office/word/2018/wordml/cex" xmlns:w16cid="http://schemas.microsoft.com/office/word/2016/wordml/cid" xmlns:w16="http://schemas.microsoft.com/office/word/2018/wordml" xmlns:w16sdtdh="http://schemas.microsoft.com/office/word/2020/wordml/sdtdatahash" xmlns:w16se="http://schemas.microsoft.com/office/word/2015/wordml/symex" xmlns:wpg="http://schemas.microsoft.com/office/word/2010/wordprocessingGroup" xmlns:wpi="http://schemas.microsoft.com/office/word/2010/wordprocessingInk" xmlns:wne="http://schemas.microsoft.com/office/word/2006/wordml" xmlns:wps="http://schemas.microsoft.com/office/word/2010/wordprocessingShape" mc:Ignorable="w14 w15 w16se w16cid w16 w16cex w16sdtdh wp14">
   <w:p>
     <w:pPr>
       <w:pStyle w:val="Encabezado"/>
@@ -3926,7 +4469,7 @@
 </file>
 
 <file path=word/header3.xml><?xml version="1.0" encoding="utf-8"?>
-<w:hdr xmlns:wpc="http://schemas.microsoft.com/office/word/2010/wordprocessingCanvas" xmlns:cx="http://schemas.microsoft.com/office/drawing/2014/chartex" xmlns:mc="http://schemas.openxmlformats.org/markup-compatibility/2006" xmlns:o="urn:schemas-microsoft-com:office:office" xmlns:r="http://schemas.openxmlformats.org/officeDocument/2006/relationships" xmlns:m="http://schemas.openxmlformats.org/officeDocument/2006/math" xmlns:v="urn:schemas-microsoft-com:vml" xmlns:wp14="http://schemas.microsoft.com/office/word/2010/wordprocessingDrawing" xmlns:wp="http://schemas.openxmlformats.org/drawingml/2006/wordprocessingDrawing" xmlns:w10="urn:schemas-microsoft-com:office:word" xmlns:w="http://schemas.openxmlformats.org/wordprocessingml/2006/main" xmlns:w14="http://schemas.microsoft.com/office/word/2010/wordml" xmlns:w15="http://schemas.microsoft.com/office/word/2012/wordml" xmlns:w16se="http://schemas.microsoft.com/office/word/2015/wordml/symex" xmlns:wpg="http://schemas.microsoft.com/office/word/2010/wordprocessingGroup" xmlns:wpi="http://schemas.microsoft.com/office/word/2010/wordprocessingInk" xmlns:wne="http://schemas.microsoft.com/office/word/2006/wordml" xmlns:wps="http://schemas.microsoft.com/office/word/2010/wordprocessingShape" mc:Ignorable="w14 w15 w16se wp14">
+<w:hdr xmlns:wpc="http://schemas.microsoft.com/office/word/2010/wordprocessingCanvas" xmlns:cx="http://schemas.microsoft.com/office/drawing/2014/chartex" xmlns:cx1="http://schemas.microsoft.com/office/drawing/2015/9/8/chartex" xmlns:cx2="http://schemas.microsoft.com/office/drawing/2015/10/21/chartex" xmlns:cx3="http://schemas.microsoft.com/office/drawing/2016/5/9/chartex" xmlns:cx4="http://schemas.microsoft.com/office/drawing/2016/5/10/chartex" xmlns:cx5="http://schemas.microsoft.com/office/drawing/2016/5/11/chartex" xmlns:cx6="http://schemas.microsoft.com/office/drawing/2016/5/12/chartex" xmlns:cx7="http://schemas.microsoft.com/office/drawing/2016/5/13/chartex" xmlns:cx8="http://schemas.microsoft.com/office/drawing/2016/5/14/chartex" xmlns:mc="http://schemas.openxmlformats.org/markup-compatibility/2006" xmlns:aink="http://schemas.microsoft.com/office/drawing/2016/ink" xmlns:am3d="http://schemas.microsoft.com/office/drawing/2017/model3d" xmlns:o="urn:schemas-microsoft-com:office:office" xmlns:oel="http://schemas.microsoft.com/office/2019/extlst" xmlns:r="http://schemas.openxmlformats.org/officeDocument/2006/relationships" xmlns:m="http://schemas.openxmlformats.org/officeDocument/2006/math" xmlns:v="urn:schemas-microsoft-com:vml" xmlns:wp14="http://schemas.microsoft.com/office/word/2010/wordprocessingDrawing" xmlns:wp="http://schemas.openxmlformats.org/drawingml/2006/wordprocessingDrawing" xmlns:w10="urn:schemas-microsoft-com:office:word" xmlns:w="http://schemas.openxmlformats.org/wordprocessingml/2006/main" xmlns:w14="http://schemas.microsoft.com/office/word/2010/wordml" xmlns:w15="http://schemas.microsoft.com/office/word/2012/wordml" xmlns:w16cex="http://schemas.microsoft.com/office/word/2018/wordml/cex" xmlns:w16cid="http://schemas.microsoft.com/office/word/2016/wordml/cid" xmlns:w16="http://schemas.microsoft.com/office/word/2018/wordml" xmlns:w16sdtdh="http://schemas.microsoft.com/office/word/2020/wordml/sdtdatahash" xmlns:w16se="http://schemas.microsoft.com/office/word/2015/wordml/symex" xmlns:wpg="http://schemas.microsoft.com/office/word/2010/wordprocessingGroup" xmlns:wpi="http://schemas.microsoft.com/office/word/2010/wordprocessingInk" xmlns:wne="http://schemas.microsoft.com/office/word/2006/wordml" xmlns:wps="http://schemas.microsoft.com/office/word/2010/wordprocessingShape" mc:Ignorable="w14 w15 w16se w16cid w16 w16cex w16sdtdh wp14">
   <w:sdt>
     <w:sdtPr>
       <w:id w:val="-1484083713"/>
@@ -3935,7 +4478,6 @@
         <w:docPartUnique/>
       </w:docPartObj>
     </w:sdtPr>
-    <w:sdtEndPr/>
     <w:sdtContent>
       <w:p>
         <w:pPr>
@@ -3973,7 +4515,7 @@
 </file>
 
 <file path=word/header4.xml><?xml version="1.0" encoding="utf-8"?>
-<w:hdr xmlns:wpc="http://schemas.microsoft.com/office/word/2010/wordprocessingCanvas" xmlns:cx="http://schemas.microsoft.com/office/drawing/2014/chartex" xmlns:mc="http://schemas.openxmlformats.org/markup-compatibility/2006" xmlns:o="urn:schemas-microsoft-com:office:office" xmlns:r="http://schemas.openxmlformats.org/officeDocument/2006/relationships" xmlns:m="http://schemas.openxmlformats.org/officeDocument/2006/math" xmlns:v="urn:schemas-microsoft-com:vml" xmlns:wp14="http://schemas.microsoft.com/office/word/2010/wordprocessingDrawing" xmlns:wp="http://schemas.openxmlformats.org/drawingml/2006/wordprocessingDrawing" xmlns:w10="urn:schemas-microsoft-com:office:word" xmlns:w="http://schemas.openxmlformats.org/wordprocessingml/2006/main" xmlns:w14="http://schemas.microsoft.com/office/word/2010/wordml" xmlns:w15="http://schemas.microsoft.com/office/word/2012/wordml" xmlns:w16se="http://schemas.microsoft.com/office/word/2015/wordml/symex" xmlns:wpg="http://schemas.microsoft.com/office/word/2010/wordprocessingGroup" xmlns:wpi="http://schemas.microsoft.com/office/word/2010/wordprocessingInk" xmlns:wne="http://schemas.microsoft.com/office/word/2006/wordml" xmlns:wps="http://schemas.microsoft.com/office/word/2010/wordprocessingShape" mc:Ignorable="w14 w15 w16se wp14">
+<w:hdr xmlns:wpc="http://schemas.microsoft.com/office/word/2010/wordprocessingCanvas" xmlns:cx="http://schemas.microsoft.com/office/drawing/2014/chartex" xmlns:cx1="http://schemas.microsoft.com/office/drawing/2015/9/8/chartex" xmlns:cx2="http://schemas.microsoft.com/office/drawing/2015/10/21/chartex" xmlns:cx3="http://schemas.microsoft.com/office/drawing/2016/5/9/chartex" xmlns:cx4="http://schemas.microsoft.com/office/drawing/2016/5/10/chartex" xmlns:cx5="http://schemas.microsoft.com/office/drawing/2016/5/11/chartex" xmlns:cx6="http://schemas.microsoft.com/office/drawing/2016/5/12/chartex" xmlns:cx7="http://schemas.microsoft.com/office/drawing/2016/5/13/chartex" xmlns:cx8="http://schemas.microsoft.com/office/drawing/2016/5/14/chartex" xmlns:mc="http://schemas.openxmlformats.org/markup-compatibility/2006" xmlns:aink="http://schemas.microsoft.com/office/drawing/2016/ink" xmlns:am3d="http://schemas.microsoft.com/office/drawing/2017/model3d" xmlns:o="urn:schemas-microsoft-com:office:office" xmlns:oel="http://schemas.microsoft.com/office/2019/extlst" xmlns:r="http://schemas.openxmlformats.org/officeDocument/2006/relationships" xmlns:m="http://schemas.openxmlformats.org/officeDocument/2006/math" xmlns:v="urn:schemas-microsoft-com:vml" xmlns:wp14="http://schemas.microsoft.com/office/word/2010/wordprocessingDrawing" xmlns:wp="http://schemas.openxmlformats.org/drawingml/2006/wordprocessingDrawing" xmlns:w10="urn:schemas-microsoft-com:office:word" xmlns:w="http://schemas.openxmlformats.org/wordprocessingml/2006/main" xmlns:w14="http://schemas.microsoft.com/office/word/2010/wordml" xmlns:w15="http://schemas.microsoft.com/office/word/2012/wordml" xmlns:w16cex="http://schemas.microsoft.com/office/word/2018/wordml/cex" xmlns:w16cid="http://schemas.microsoft.com/office/word/2016/wordml/cid" xmlns:w16="http://schemas.microsoft.com/office/word/2018/wordml" xmlns:w16sdtdh="http://schemas.microsoft.com/office/word/2020/wordml/sdtdatahash" xmlns:w16se="http://schemas.microsoft.com/office/word/2015/wordml/symex" xmlns:wpg="http://schemas.microsoft.com/office/word/2010/wordprocessingGroup" xmlns:wpi="http://schemas.microsoft.com/office/word/2010/wordprocessingInk" xmlns:wne="http://schemas.microsoft.com/office/word/2006/wordml" xmlns:wps="http://schemas.microsoft.com/office/word/2010/wordprocessingShape" mc:Ignorable="w14 w15 w16se w16cid w16 w16cex w16sdtdh wp14">
   <w:sdt>
     <w:sdtPr>
       <w:id w:val="-139118505"/>
@@ -3982,7 +4524,6 @@
         <w:docPartUnique/>
       </w:docPartObj>
     </w:sdtPr>
-    <w:sdtEndPr/>
     <w:sdtContent>
       <w:p>
         <w:pPr>
@@ -4020,7 +4561,7 @@
 </file>
 
 <file path=word/numbering.xml><?xml version="1.0" encoding="utf-8"?>
-<w:numbering xmlns:wpc="http://schemas.microsoft.com/office/word/2010/wordprocessingCanvas" xmlns:cx="http://schemas.microsoft.com/office/drawing/2014/chartex" xmlns:mc="http://schemas.openxmlformats.org/markup-compatibility/2006" xmlns:o="urn:schemas-microsoft-com:office:office" xmlns:r="http://schemas.openxmlformats.org/officeDocument/2006/relationships" xmlns:m="http://schemas.openxmlformats.org/officeDocument/2006/math" xmlns:v="urn:schemas-microsoft-com:vml" xmlns:wp14="http://schemas.microsoft.com/office/word/2010/wordprocessingDrawing" xmlns:wp="http://schemas.openxmlformats.org/drawingml/2006/wordprocessingDrawing" xmlns:w10="urn:schemas-microsoft-com:office:word" xmlns:w="http://schemas.openxmlformats.org/wordprocessingml/2006/main" xmlns:w14="http://schemas.microsoft.com/office/word/2010/wordml" xmlns:w15="http://schemas.microsoft.com/office/word/2012/wordml" xmlns:w16se="http://schemas.microsoft.com/office/word/2015/wordml/symex" xmlns:wpg="http://schemas.microsoft.com/office/word/2010/wordprocessingGroup" xmlns:wpi="http://schemas.microsoft.com/office/word/2010/wordprocessingInk" xmlns:wne="http://schemas.microsoft.com/office/word/2006/wordml" xmlns:wps="http://schemas.microsoft.com/office/word/2010/wordprocessingShape" mc:Ignorable="w14 w15 w16se wp14">
+<w:numbering xmlns:wpc="http://schemas.microsoft.com/office/word/2010/wordprocessingCanvas" xmlns:cx="http://schemas.microsoft.com/office/drawing/2014/chartex" xmlns:cx1="http://schemas.microsoft.com/office/drawing/2015/9/8/chartex" xmlns:cx2="http://schemas.microsoft.com/office/drawing/2015/10/21/chartex" xmlns:cx3="http://schemas.microsoft.com/office/drawing/2016/5/9/chartex" xmlns:cx4="http://schemas.microsoft.com/office/drawing/2016/5/10/chartex" xmlns:cx5="http://schemas.microsoft.com/office/drawing/2016/5/11/chartex" xmlns:cx6="http://schemas.microsoft.com/office/drawing/2016/5/12/chartex" xmlns:cx7="http://schemas.microsoft.com/office/drawing/2016/5/13/chartex" xmlns:cx8="http://schemas.microsoft.com/office/drawing/2016/5/14/chartex" xmlns:mc="http://schemas.openxmlformats.org/markup-compatibility/2006" xmlns:aink="http://schemas.microsoft.com/office/drawing/2016/ink" xmlns:am3d="http://schemas.microsoft.com/office/drawing/2017/model3d" xmlns:o="urn:schemas-microsoft-com:office:office" xmlns:oel="http://schemas.microsoft.com/office/2019/extlst" xmlns:r="http://schemas.openxmlformats.org/officeDocument/2006/relationships" xmlns:m="http://schemas.openxmlformats.org/officeDocument/2006/math" xmlns:v="urn:schemas-microsoft-com:vml" xmlns:wp14="http://schemas.microsoft.com/office/word/2010/wordprocessingDrawing" xmlns:wp="http://schemas.openxmlformats.org/drawingml/2006/wordprocessingDrawing" xmlns:w10="urn:schemas-microsoft-com:office:word" xmlns:w="http://schemas.openxmlformats.org/wordprocessingml/2006/main" xmlns:w14="http://schemas.microsoft.com/office/word/2010/wordml" xmlns:w15="http://schemas.microsoft.com/office/word/2012/wordml" xmlns:w16cex="http://schemas.microsoft.com/office/word/2018/wordml/cex" xmlns:w16cid="http://schemas.microsoft.com/office/word/2016/wordml/cid" xmlns:w16="http://schemas.microsoft.com/office/word/2018/wordml" xmlns:w16sdtdh="http://schemas.microsoft.com/office/word/2020/wordml/sdtdatahash" xmlns:w16se="http://schemas.microsoft.com/office/word/2015/wordml/symex" xmlns:wpg="http://schemas.microsoft.com/office/word/2010/wordprocessingGroup" xmlns:wpi="http://schemas.microsoft.com/office/word/2010/wordprocessingInk" xmlns:wne="http://schemas.microsoft.com/office/word/2006/wordml" xmlns:wps="http://schemas.microsoft.com/office/word/2010/wordprocessingShape" mc:Ignorable="w14 w15 w16se w16cid w16 w16cex w16sdtdh wp14">
   <w:abstractNum w:abstractNumId="0" w15:restartNumberingAfterBreak="0">
     <w:nsid w:val="14151BD6"/>
     <w:multiLevelType w:val="hybridMultilevel"/>
@@ -4618,29 +5159,29 @@
       </w:pPr>
     </w:lvl>
   </w:abstractNum>
-  <w:num w:numId="1">
+  <w:num w:numId="1" w16cid:durableId="1467505533">
     <w:abstractNumId w:val="3"/>
   </w:num>
-  <w:num w:numId="2">
+  <w:num w:numId="2" w16cid:durableId="1702051499">
     <w:abstractNumId w:val="4"/>
   </w:num>
-  <w:num w:numId="3">
+  <w:num w:numId="3" w16cid:durableId="666833500">
     <w:abstractNumId w:val="0"/>
   </w:num>
-  <w:num w:numId="4">
+  <w:num w:numId="4" w16cid:durableId="398865724">
     <w:abstractNumId w:val="1"/>
   </w:num>
-  <w:num w:numId="5">
+  <w:num w:numId="5" w16cid:durableId="307367556">
     <w:abstractNumId w:val="2"/>
   </w:num>
-  <w:num w:numId="6">
+  <w:num w:numId="6" w16cid:durableId="2040011748">
     <w:abstractNumId w:val="5"/>
   </w:num>
 </w:numbering>
 </file>
 
 <file path=word/styles.xml><?xml version="1.0" encoding="utf-8"?>
-<w:styles xmlns:mc="http://schemas.openxmlformats.org/markup-compatibility/2006" xmlns:r="http://schemas.openxmlformats.org/officeDocument/2006/relationships" xmlns:w="http://schemas.openxmlformats.org/wordprocessingml/2006/main" xmlns:w14="http://schemas.microsoft.com/office/word/2010/wordml" xmlns:w15="http://schemas.microsoft.com/office/word/2012/wordml" xmlns:w16se="http://schemas.microsoft.com/office/word/2015/wordml/symex" mc:Ignorable="w14 w15 w16se">
+<w:styles xmlns:mc="http://schemas.openxmlformats.org/markup-compatibility/2006" xmlns:r="http://schemas.openxmlformats.org/officeDocument/2006/relationships" xmlns:w="http://schemas.openxmlformats.org/wordprocessingml/2006/main" xmlns:w14="http://schemas.microsoft.com/office/word/2010/wordml" xmlns:w15="http://schemas.microsoft.com/office/word/2012/wordml" xmlns:w16cex="http://schemas.microsoft.com/office/word/2018/wordml/cex" xmlns:w16cid="http://schemas.microsoft.com/office/word/2016/wordml/cid" xmlns:w16="http://schemas.microsoft.com/office/word/2018/wordml" xmlns:w16sdtdh="http://schemas.microsoft.com/office/word/2020/wordml/sdtdatahash" xmlns:w16se="http://schemas.microsoft.com/office/word/2015/wordml/symex" mc:Ignorable="w14 w15 w16se w16cid w16 w16cex w16sdtdh">
   <w:docDefaults>
     <w:rPrDefault>
       <w:rPr>
@@ -4658,7 +5199,7 @@
       </w:pPr>
     </w:pPrDefault>
   </w:docDefaults>
-  <w:latentStyles w:defLockedState="0" w:defUIPriority="99" w:defSemiHidden="0" w:defUnhideWhenUsed="0" w:defQFormat="0" w:count="371">
+  <w:latentStyles w:defLockedState="0" w:defUIPriority="99" w:defSemiHidden="0" w:defUnhideWhenUsed="0" w:defQFormat="0" w:count="376">
     <w:lsdException w:name="Normal" w:uiPriority="0" w:qFormat="1"/>
     <w:lsdException w:name="heading 1" w:uiPriority="9" w:qFormat="1"/>
     <w:lsdException w:name="heading 2" w:semiHidden="1" w:uiPriority="9" w:unhideWhenUsed="1" w:qFormat="1"/>
@@ -5030,6 +5571,11 @@
     <w:lsdException w:name="List Table 5 Dark Accent 6" w:uiPriority="50"/>
     <w:lsdException w:name="List Table 6 Colorful Accent 6" w:uiPriority="51"/>
     <w:lsdException w:name="List Table 7 Colorful Accent 6" w:uiPriority="52"/>
+    <w:lsdException w:name="Mention" w:semiHidden="1" w:unhideWhenUsed="1"/>
+    <w:lsdException w:name="Smart Hyperlink" w:semiHidden="1" w:unhideWhenUsed="1"/>
+    <w:lsdException w:name="Hashtag" w:semiHidden="1" w:unhideWhenUsed="1"/>
+    <w:lsdException w:name="Unresolved Mention" w:semiHidden="1" w:unhideWhenUsed="1"/>
+    <w:lsdException w:name="Smart Link" w:semiHidden="1" w:unhideWhenUsed="1"/>
   </w:latentStyles>
   <w:style w:type="paragraph" w:default="1" w:styleId="Normal">
     <w:name w:val="Normal"/>
@@ -5734,8 +6280,8 @@
     <w:uiPriority w:val="99"/>
     <w:rsid w:val="008724CC"/>
   </w:style>
-  <w:style w:type="character" w:customStyle="1" w:styleId="UnresolvedMention">
-    <w:name w:val="Unresolved Mention"/>
+  <w:style w:type="character" w:customStyle="1" w:styleId="Mencinsinresolver1">
+    <w:name w:val="Mención sin resolver1"/>
     <w:basedOn w:val="Fuentedeprrafopredeter"/>
     <w:uiPriority w:val="99"/>
     <w:semiHidden/>

</xml_diff>

<commit_message>
Docs_Contexto de la empresa y diagnostico del proceso
Se agregó el Contexto de la empresa, el Diagnóstico del proceso,
el Problema actual, Diagnóstico de la solución y la Conclusión del diagnóstico.
</commit_message>
<xml_diff>
--- a/docs/entrega2/EPRO_Entrega2_Grupo9_Plataforma de gestión documental con versiones.docx
+++ b/docs/entrega2/EPRO_Entrega2_Grupo9_Plataforma de gestión documental con versiones.docx
@@ -1,6 +1,6 @@
 
 <file path=word/document.xml><?xml version="1.0" encoding="utf-8"?>
-<w:document xmlns:wpc="http://schemas.microsoft.com/office/word/2010/wordprocessingCanvas" xmlns:cx="http://schemas.microsoft.com/office/drawing/2014/chartex" xmlns:cx1="http://schemas.microsoft.com/office/drawing/2015/9/8/chartex" xmlns:cx2="http://schemas.microsoft.com/office/drawing/2015/10/21/chartex" xmlns:cx3="http://schemas.microsoft.com/office/drawing/2016/5/9/chartex" xmlns:cx4="http://schemas.microsoft.com/office/drawing/2016/5/10/chartex" xmlns:cx5="http://schemas.microsoft.com/office/drawing/2016/5/11/chartex" xmlns:cx6="http://schemas.microsoft.com/office/drawing/2016/5/12/chartex" xmlns:cx7="http://schemas.microsoft.com/office/drawing/2016/5/13/chartex" xmlns:cx8="http://schemas.microsoft.com/office/drawing/2016/5/14/chartex" xmlns:mc="http://schemas.openxmlformats.org/markup-compatibility/2006" xmlns:aink="http://schemas.microsoft.com/office/drawing/2016/ink" xmlns:am3d="http://schemas.microsoft.com/office/drawing/2017/model3d" xmlns:o="urn:schemas-microsoft-com:office:office" xmlns:oel="http://schemas.microsoft.com/office/2019/extlst" xmlns:r="http://schemas.openxmlformats.org/officeDocument/2006/relationships" xmlns:m="http://schemas.openxmlformats.org/officeDocument/2006/math" xmlns:v="urn:schemas-microsoft-com:vml" xmlns:wp14="http://schemas.microsoft.com/office/word/2010/wordprocessingDrawing" xmlns:wp="http://schemas.openxmlformats.org/drawingml/2006/wordprocessingDrawing" xmlns:w10="urn:schemas-microsoft-com:office:word" xmlns:w="http://schemas.openxmlformats.org/wordprocessingml/2006/main" xmlns:w14="http://schemas.microsoft.com/office/word/2010/wordml" xmlns:w15="http://schemas.microsoft.com/office/word/2012/wordml" xmlns:w16cex="http://schemas.microsoft.com/office/word/2018/wordml/cex" xmlns:w16cid="http://schemas.microsoft.com/office/word/2016/wordml/cid" xmlns:w16="http://schemas.microsoft.com/office/word/2018/wordml" xmlns:w16sdtdh="http://schemas.microsoft.com/office/word/2020/wordml/sdtdatahash" xmlns:w16se="http://schemas.microsoft.com/office/word/2015/wordml/symex" xmlns:wpg="http://schemas.microsoft.com/office/word/2010/wordprocessingGroup" xmlns:wpi="http://schemas.microsoft.com/office/word/2010/wordprocessingInk" xmlns:wne="http://schemas.microsoft.com/office/word/2006/wordml" xmlns:wps="http://schemas.microsoft.com/office/word/2010/wordprocessingShape" mc:Ignorable="w14 w15 w16se w16cid w16 w16cex w16sdtdh wp14">
+<w:document xmlns:wpc="http://schemas.microsoft.com/office/word/2010/wordprocessingCanvas" xmlns:cx="http://schemas.microsoft.com/office/drawing/2014/chartex" xmlns:cx1="http://schemas.microsoft.com/office/drawing/2015/9/8/chartex" xmlns:cx2="http://schemas.microsoft.com/office/drawing/2015/10/21/chartex" xmlns:cx3="http://schemas.microsoft.com/office/drawing/2016/5/9/chartex" xmlns:cx4="http://schemas.microsoft.com/office/drawing/2016/5/10/chartex" xmlns:cx5="http://schemas.microsoft.com/office/drawing/2016/5/11/chartex" xmlns:cx6="http://schemas.microsoft.com/office/drawing/2016/5/12/chartex" xmlns:cx7="http://schemas.microsoft.com/office/drawing/2016/5/13/chartex" xmlns:cx8="http://schemas.microsoft.com/office/drawing/2016/5/14/chartex" xmlns:mc="http://schemas.openxmlformats.org/markup-compatibility/2006" xmlns:aink="http://schemas.microsoft.com/office/drawing/2016/ink" xmlns:am3d="http://schemas.microsoft.com/office/drawing/2017/model3d" xmlns:o="urn:schemas-microsoft-com:office:office" xmlns:oel="http://schemas.microsoft.com/office/2019/extlst" xmlns:r="http://schemas.openxmlformats.org/officeDocument/2006/relationships" xmlns:m="http://schemas.openxmlformats.org/officeDocument/2006/math" xmlns:v="urn:schemas-microsoft-com:vml" xmlns:wp14="http://schemas.microsoft.com/office/word/2010/wordprocessingDrawing" xmlns:wp="http://schemas.openxmlformats.org/drawingml/2006/wordprocessingDrawing" xmlns:w10="urn:schemas-microsoft-com:office:word" xmlns:w="http://schemas.openxmlformats.org/wordprocessingml/2006/main" xmlns:w14="http://schemas.microsoft.com/office/word/2010/wordml" xmlns:w15="http://schemas.microsoft.com/office/word/2012/wordml" xmlns:w16cex="http://schemas.microsoft.com/office/word/2018/wordml/cex" xmlns:w16cid="http://schemas.microsoft.com/office/word/2016/wordml/cid" xmlns:w16="http://schemas.microsoft.com/office/word/2018/wordml" xmlns:w16du="http://schemas.microsoft.com/office/word/2023/wordml/word16du" xmlns:w16sdtdh="http://schemas.microsoft.com/office/word/2020/wordml/sdtdatahash" xmlns:w16sdtfl="http://schemas.microsoft.com/office/word/2024/wordml/sdtformatlock" xmlns:w16se="http://schemas.microsoft.com/office/word/2015/wordml/symex" xmlns:wpg="http://schemas.microsoft.com/office/word/2010/wordprocessingGroup" xmlns:wpi="http://schemas.microsoft.com/office/word/2010/wordprocessingInk" xmlns:wne="http://schemas.microsoft.com/office/word/2006/wordml" xmlns:wps="http://schemas.microsoft.com/office/word/2010/wordprocessingShape" mc:Ignorable="w14 w15 w16se w16cid w16 w16cex w16sdtdh w16sdtfl w16du wp14">
   <w:body>
     <w:p>
       <w:pPr>
@@ -359,39 +359,8 @@
                 <w:szCs w:val="24"/>
                 <w:lang w:val="es-SV"/>
               </w:rPr>
-              <w:t xml:space="preserve">Ing. </w:t>
-            </w:r>
-            <w:proofErr w:type="spellStart"/>
-            <w:r>
-              <w:rPr>
-                <w:rFonts w:ascii="Arial" w:eastAsia="Calibri" w:hAnsi="Arial" w:cs="Arial"/>
-                <w:sz w:val="24"/>
-                <w:szCs w:val="24"/>
-                <w:lang w:val="es-SV"/>
-              </w:rPr>
-              <w:t>Ruben</w:t>
-            </w:r>
-            <w:proofErr w:type="spellEnd"/>
-            <w:r>
-              <w:rPr>
-                <w:rFonts w:ascii="Arial" w:eastAsia="Calibri" w:hAnsi="Arial" w:cs="Arial"/>
-                <w:sz w:val="24"/>
-                <w:szCs w:val="24"/>
-                <w:lang w:val="es-SV"/>
-              </w:rPr>
-              <w:t xml:space="preserve"> Escobar </w:t>
-            </w:r>
-            <w:proofErr w:type="spellStart"/>
-            <w:r>
-              <w:rPr>
-                <w:rFonts w:ascii="Arial" w:eastAsia="Calibri" w:hAnsi="Arial" w:cs="Arial"/>
-                <w:sz w:val="24"/>
-                <w:szCs w:val="24"/>
-                <w:lang w:val="es-SV"/>
-              </w:rPr>
-              <w:t>Ortegon</w:t>
-            </w:r>
-            <w:proofErr w:type="spellEnd"/>
+              <w:t>Ing. Ruben Escobar Ortegon</w:t>
+            </w:r>
           </w:p>
         </w:tc>
       </w:tr>
@@ -2521,7 +2490,112 @@
       <w:pPr>
         <w:rPr>
           <w:rFonts w:ascii="Arial" w:hAnsi="Arial" w:cs="Arial"/>
-          <w:lang w:val="es-SV"/>
+          <w:lang w:val="es-ES"/>
+        </w:rPr>
+      </w:pPr>
+      <w:r>
+        <w:rPr>
+          <w:rFonts w:ascii="Arial" w:hAnsi="Arial" w:cs="Arial"/>
+          <w:lang w:val="es-ES"/>
+        </w:rPr>
+        <w:t xml:space="preserve">La empresa “Soluciones Tecnológicas” se basa en San Salvador y se dedica consultorías tecnológicas y desarrollo de software para empresas. Esta compañía cuenta con 50 distintos empleados, los cuales están en distintas áreas, como la de consultorías, la de desarrollo de software y la administrativa. </w:t>
+      </w:r>
+    </w:p>
+    <w:p>
+      <w:pPr>
+        <w:rPr>
+          <w:rFonts w:ascii="Arial" w:hAnsi="Arial" w:cs="Arial"/>
+          <w:lang w:val="es-ES"/>
+        </w:rPr>
+      </w:pPr>
+      <w:r>
+        <w:rPr>
+          <w:rFonts w:ascii="Arial" w:hAnsi="Arial" w:cs="Arial"/>
+          <w:lang w:val="es-ES"/>
+        </w:rPr>
+        <w:t>Actualmente, la empresa realiza la gestión de documentos por medio de correos electrónicos, archivos locales y carpetas compartidas. Sin embargo, la falta de estos documentos en un área centralizada, a la cual todos los empleados tienen acceso, causa problemas a los empleados y a la empresa, tal y como:</w:t>
+      </w:r>
+    </w:p>
+    <w:p>
+      <w:pPr>
+        <w:pStyle w:val="Prrafodelista"/>
+        <w:numPr>
+          <w:ilvl w:val="0"/>
+          <w:numId w:val="7"/>
+        </w:numPr>
+        <w:rPr>
+          <w:rFonts w:ascii="Arial" w:hAnsi="Arial" w:cs="Arial"/>
+          <w:lang w:val="es-ES"/>
+        </w:rPr>
+      </w:pPr>
+      <w:r>
+        <w:rPr>
+          <w:rFonts w:ascii="Arial" w:hAnsi="Arial" w:cs="Arial"/>
+          <w:lang w:val="es-ES"/>
+        </w:rPr>
+        <w:t xml:space="preserve">Dificultades para identificar la versión más reciente del documento, lo que lleva a que se ocupen versiones anticuadas y esto afecta en las consultorías y en el desarrollo de software ya que no se cuenta con la información actual y relevante. </w:t>
+      </w:r>
+    </w:p>
+    <w:p>
+      <w:pPr>
+        <w:pStyle w:val="Prrafodelista"/>
+        <w:numPr>
+          <w:ilvl w:val="0"/>
+          <w:numId w:val="7"/>
+        </w:numPr>
+        <w:rPr>
+          <w:rFonts w:ascii="Arial" w:hAnsi="Arial" w:cs="Arial"/>
+          <w:lang w:val="es-ES"/>
+        </w:rPr>
+      </w:pPr>
+      <w:r>
+        <w:rPr>
+          <w:rFonts w:ascii="Arial" w:hAnsi="Arial" w:cs="Arial"/>
+          <w:lang w:val="es-ES"/>
+        </w:rPr>
+        <w:t xml:space="preserve">Hay una falta de control sobre la aprobación de archivos, aunque un jefe pueda aprobar un archivo como el más reciente y el que se debe ocupar, al no tener un lugar centralizado, los empleados pueden no darse cuenta de esto y ocupar las versiones anteriores. </w:t>
+      </w:r>
+    </w:p>
+    <w:p>
+      <w:pPr>
+        <w:pStyle w:val="Prrafodelista"/>
+        <w:numPr>
+          <w:ilvl w:val="0"/>
+          <w:numId w:val="7"/>
+        </w:numPr>
+        <w:rPr>
+          <w:rFonts w:ascii="Arial" w:hAnsi="Arial" w:cs="Arial"/>
+          <w:lang w:val="es-ES"/>
+        </w:rPr>
+      </w:pPr>
+      <w:r>
+        <w:rPr>
+          <w:rFonts w:ascii="Arial" w:hAnsi="Arial" w:cs="Arial"/>
+          <w:lang w:val="es-ES"/>
+        </w:rPr>
+        <w:t xml:space="preserve">Errores al no ocupar información o normativas actualizadas. Lo que afecta el trabajo de los empleados y la reputación de la empresa. </w:t>
+      </w:r>
+    </w:p>
+    <w:p>
+      <w:pPr>
+        <w:rPr>
+          <w:rFonts w:ascii="Arial" w:hAnsi="Arial" w:cs="Arial"/>
+          <w:lang w:val="es-ES"/>
+        </w:rPr>
+      </w:pPr>
+      <w:r>
+        <w:rPr>
+          <w:rFonts w:ascii="Arial" w:hAnsi="Arial" w:cs="Arial"/>
+          <w:lang w:val="es-ES"/>
+        </w:rPr>
+        <w:t xml:space="preserve">Debido a que la gran mayoría de los problemas viene a ser la falta de un lugar centralizado, en el cual se guardan las distintas versiones de los documentos, se hizo una investigación, la cual fue de una encuesta, con la cual se planeaba definir los requerimientos para una página web centralizada. Es basada en estos resultados con los cuales se definieron los requerimientos y el diagnóstico del proceso. </w:t>
+      </w:r>
+    </w:p>
+    <w:p>
+      <w:pPr>
+        <w:rPr>
+          <w:rFonts w:ascii="Arial" w:hAnsi="Arial" w:cs="Arial"/>
+          <w:lang w:val="es-ES"/>
         </w:rPr>
       </w:pPr>
     </w:p>
@@ -2654,15 +2728,111 @@
       <w:pPr>
         <w:rPr>
           <w:rFonts w:ascii="Arial" w:hAnsi="Arial" w:cs="Arial"/>
-          <w:lang w:val="es-SV"/>
-        </w:rPr>
-      </w:pPr>
-    </w:p>
-    <w:p>
-      <w:pPr>
-        <w:rPr>
-          <w:rFonts w:ascii="Arial" w:hAnsi="Arial" w:cs="Arial"/>
-          <w:lang w:val="es-SV"/>
+          <w:lang w:val="es-ES"/>
+        </w:rPr>
+      </w:pPr>
+      <w:r>
+        <w:rPr>
+          <w:rFonts w:ascii="Arial" w:hAnsi="Arial" w:cs="Arial"/>
+          <w:lang w:val="es-ES"/>
+        </w:rPr>
+        <w:t xml:space="preserve">El problema actual que tiene la empresa es que no tiene un sistema centralizado de gestión de documentos, lo cual lleva a problemas por el uso de documentos no actualizados e información vieja. </w:t>
+      </w:r>
+    </w:p>
+    <w:p>
+      <w:pPr>
+        <w:rPr>
+          <w:rFonts w:ascii="Arial" w:hAnsi="Arial" w:cs="Arial"/>
+          <w:lang w:val="es-ES"/>
+        </w:rPr>
+      </w:pPr>
+      <w:r>
+        <w:rPr>
+          <w:rFonts w:ascii="Arial" w:hAnsi="Arial" w:cs="Arial"/>
+          <w:lang w:val="es-ES"/>
+        </w:rPr>
+        <w:t xml:space="preserve">Como ejemplo, podemos decir que un empleado quiere revisar un documento donde se especifica que se necesita entregar para una consultoría, el empleado tuviera que realizar </w:t>
+      </w:r>
+      <w:r>
+        <w:rPr>
+          <w:rFonts w:ascii="Arial" w:hAnsi="Arial" w:cs="Arial"/>
+          <w:lang w:val="es-ES"/>
+        </w:rPr>
+        <w:t>uno</w:t>
+      </w:r>
+      <w:r>
+        <w:rPr>
+          <w:rFonts w:ascii="Arial" w:hAnsi="Arial" w:cs="Arial"/>
+          <w:lang w:val="es-ES"/>
+        </w:rPr>
+        <w:t xml:space="preserve"> de estos tres procedimientos:</w:t>
+      </w:r>
+    </w:p>
+    <w:p>
+      <w:pPr>
+        <w:pStyle w:val="Prrafodelista"/>
+        <w:numPr>
+          <w:ilvl w:val="0"/>
+          <w:numId w:val="8"/>
+        </w:numPr>
+        <w:rPr>
+          <w:rFonts w:ascii="Arial" w:hAnsi="Arial" w:cs="Arial"/>
+          <w:lang w:val="es-ES"/>
+        </w:rPr>
+      </w:pPr>
+      <w:r>
+        <w:rPr>
+          <w:rFonts w:ascii="Arial" w:hAnsi="Arial" w:cs="Arial"/>
+          <w:lang w:val="es-ES"/>
+        </w:rPr>
+        <w:t xml:space="preserve">buscar en sus correos la versión más reciente de dicho documento, una vez la encuentra, tuviera que cumplir con lo que pide el documento. Sin embargo, esto puede causar problemas, puede que la versión que el busco y encontró sea una versión más antigua y no la más actualizada, por lo cual puede no cumplir con lo que se necesita actualmente y lo que causaría que se entregara una consultoría incompleta. Aparte de esto, el empleado perdería tiempo innecesariamente al tener que buscar por todos sus correos el documento que se necesita, si se considera que uno tiene que buscar muchos documentos, esto lleva a una pérdida de tiempo. </w:t>
+      </w:r>
+    </w:p>
+    <w:p>
+      <w:pPr>
+        <w:pStyle w:val="Prrafodelista"/>
+        <w:numPr>
+          <w:ilvl w:val="0"/>
+          <w:numId w:val="8"/>
+        </w:numPr>
+        <w:rPr>
+          <w:rFonts w:ascii="Arial" w:hAnsi="Arial" w:cs="Arial"/>
+          <w:lang w:val="es-ES"/>
+        </w:rPr>
+      </w:pPr>
+      <w:r>
+        <w:rPr>
+          <w:rFonts w:ascii="Arial" w:hAnsi="Arial" w:cs="Arial"/>
+          <w:lang w:val="es-ES"/>
+        </w:rPr>
+        <w:t xml:space="preserve">El empleado pudiera buscar en sus archivos locales (ya que para ahorrar tiempo este baja la versión más reciente) para poder ocuparlo, de esta manera, el empleado pierde menos tiempo al buscar el documento. Sin embargo, el empleado puede no haberse fijado que hay una versión más reciente que él no ha bajado en sus archivos locales, lo que lleva a que él ocupe una versión anticuada del documento que no tiene todos los requisitos que se necesitan y que, una vez más, lleva a que se entregara una consultoría incompleta. </w:t>
+      </w:r>
+    </w:p>
+    <w:p>
+      <w:pPr>
+        <w:pStyle w:val="Prrafodelista"/>
+        <w:numPr>
+          <w:ilvl w:val="0"/>
+          <w:numId w:val="8"/>
+        </w:numPr>
+        <w:rPr>
+          <w:rFonts w:ascii="Arial" w:hAnsi="Arial" w:cs="Arial"/>
+          <w:lang w:val="es-ES"/>
+        </w:rPr>
+      </w:pPr>
+      <w:r>
+        <w:rPr>
+          <w:rFonts w:ascii="Arial" w:hAnsi="Arial" w:cs="Arial"/>
+          <w:lang w:val="es-ES"/>
+        </w:rPr>
+        <w:t xml:space="preserve">Finalmente, el empleado pudiera hacer uso de un sistema de archivos compartidos entre todos los empleados, en los cuales, se pudieran buscar los documentos más recientes para utilizarlos. Otra vez, el empleado gana tiempo al hacer esto, ya que no tiene que buscar el mismo las versiones más recientes. Sin embargo, como con los archivos locales, esto depende de que alguien este subiendo los archivos más recientes y que se aseguren de que sean la versión correcta para que todos puedan ocuparlos. Si hubiera una nueva versión que no se ha subido, entonces todo el trabajo que hicieron los empleados no sería el correcto, ya que no se cumple con los requisitos actuales necesarios. </w:t>
+      </w:r>
+    </w:p>
+    <w:p>
+      <w:pPr>
+        <w:rPr>
+          <w:rFonts w:ascii="Arial" w:hAnsi="Arial" w:cs="Arial"/>
+          <w:lang w:val="es-ES"/>
         </w:rPr>
       </w:pPr>
     </w:p>
@@ -2694,6 +2864,7 @@
           <w:szCs w:val="24"/>
           <w:lang w:val="es-SV"/>
         </w:rPr>
+        <w:lastRenderedPageBreak/>
         <w:t>Diagnóstico de la solución</w:t>
       </w:r>
       <w:bookmarkEnd w:id="4"/>
@@ -2702,25 +2873,319 @@
       <w:pPr>
         <w:rPr>
           <w:rFonts w:ascii="Arial" w:hAnsi="Arial" w:cs="Arial"/>
-          <w:lang w:val="es-SV"/>
-        </w:rPr>
-      </w:pPr>
-    </w:p>
-    <w:p>
-      <w:pPr>
-        <w:rPr>
-          <w:rFonts w:ascii="Arial" w:hAnsi="Arial" w:cs="Arial"/>
-          <w:lang w:val="es-SV"/>
-        </w:rPr>
-      </w:pPr>
-    </w:p>
-    <w:p>
-      <w:pPr>
-        <w:rPr>
-          <w:rFonts w:ascii="Arial" w:hAnsi="Arial" w:cs="Arial"/>
-          <w:lang w:val="es-SV"/>
-        </w:rPr>
-      </w:pPr>
+          <w:lang w:val="es-ES"/>
+        </w:rPr>
+      </w:pPr>
+      <w:r>
+        <w:rPr>
+          <w:rFonts w:ascii="Arial" w:hAnsi="Arial" w:cs="Arial"/>
+          <w:lang w:val="es-ES"/>
+        </w:rPr>
+        <w:t xml:space="preserve">Basándonos en una encuesta que realizamos, podemos ver cuáles son los problemas más serios que sufren los empleados. En esta encuesta, entrevistamos a 42 empleados para poder diagnosticar los problemas que ellos sufren con sus documentos y poder así tener una idea más clara de cómo mejorar este proceso. En base a esta encuesta, también sacamos los requerimientos funcionales y no funcionales para poder definir cómo debe funcionar el sistema de gestión de documentos. </w:t>
+      </w:r>
+    </w:p>
+    <w:p>
+      <w:pPr>
+        <w:rPr>
+          <w:rFonts w:ascii="Arial" w:hAnsi="Arial" w:cs="Arial"/>
+          <w:lang w:val="es-ES"/>
+        </w:rPr>
+      </w:pPr>
+      <w:r>
+        <w:rPr>
+          <w:rFonts w:ascii="Arial" w:hAnsi="Arial" w:cs="Arial"/>
+          <w:lang w:val="es-ES"/>
+        </w:rPr>
+        <w:t>El 90.5% de los empleados mencionaron que con gran frecuencia ocupan documentos internos</w:t>
+      </w:r>
+      <w:r>
+        <w:rPr>
+          <w:rStyle w:val="Refdenotaalpie"/>
+          <w:rFonts w:ascii="Arial" w:hAnsi="Arial" w:cs="Arial"/>
+          <w:lang w:val="es-ES"/>
+        </w:rPr>
+        <w:footnoteReference w:id="1"/>
+      </w:r>
+      <w:r>
+        <w:rPr>
+          <w:rFonts w:ascii="Arial" w:hAnsi="Arial" w:cs="Arial"/>
+          <w:lang w:val="es-ES"/>
+        </w:rPr>
+        <w:t xml:space="preserve">, lo que nos muestra que si </w:t>
+      </w:r>
+      <w:proofErr w:type="gramStart"/>
+      <w:r>
+        <w:rPr>
+          <w:rFonts w:ascii="Arial" w:hAnsi="Arial" w:cs="Arial"/>
+          <w:lang w:val="es-ES"/>
+        </w:rPr>
+        <w:t>pueden</w:t>
+      </w:r>
+      <w:proofErr w:type="gramEnd"/>
+      <w:r>
+        <w:rPr>
+          <w:rFonts w:ascii="Arial" w:hAnsi="Arial" w:cs="Arial"/>
+          <w:lang w:val="es-ES"/>
+        </w:rPr>
+        <w:t xml:space="preserve"> haber problemas serios si es que se están ocupando documentos anticuados, ya que esto puede afectar a la mayoría de los empleados. Los empleados también mencionaron que 38.1% ocupan los documentos todos los días y el 42.9% un par de veces por semana</w:t>
+      </w:r>
+      <w:r>
+        <w:rPr>
+          <w:rStyle w:val="Refdenotaalpie"/>
+          <w:rFonts w:ascii="Arial" w:hAnsi="Arial" w:cs="Arial"/>
+          <w:lang w:val="es-ES"/>
+        </w:rPr>
+        <w:footnoteReference w:id="2"/>
+      </w:r>
+      <w:r>
+        <w:rPr>
+          <w:rFonts w:ascii="Arial" w:hAnsi="Arial" w:cs="Arial"/>
+          <w:lang w:val="es-ES"/>
+        </w:rPr>
+        <w:t xml:space="preserve">, esto nos muestra que el 81% de los empleados tienden a ocupar la documentación interna todas las semanas, lo que puede llevar a una gran cantidad de problemas al ocupar la documentación antigua. </w:t>
+      </w:r>
+    </w:p>
+    <w:p>
+      <w:pPr>
+        <w:rPr>
+          <w:rFonts w:ascii="Arial" w:hAnsi="Arial" w:cs="Arial"/>
+          <w:lang w:val="es-ES"/>
+        </w:rPr>
+      </w:pPr>
+      <w:r>
+        <w:rPr>
+          <w:rFonts w:ascii="Arial" w:hAnsi="Arial" w:cs="Arial"/>
+          <w:lang w:val="es-ES"/>
+        </w:rPr>
+        <w:t>La gestión de documentos se hace por medio de correos electrónicos (42.9%), carpetas compartidas (35.7%) y archivos locales (16.7%)</w:t>
+      </w:r>
+      <w:r>
+        <w:rPr>
+          <w:rStyle w:val="Refdenotaalpie"/>
+          <w:rFonts w:ascii="Arial" w:hAnsi="Arial" w:cs="Arial"/>
+          <w:lang w:val="es-ES"/>
+        </w:rPr>
+        <w:footnoteReference w:id="3"/>
+      </w:r>
+      <w:r>
+        <w:rPr>
+          <w:rFonts w:ascii="Arial" w:hAnsi="Arial" w:cs="Arial"/>
+          <w:lang w:val="es-ES"/>
+        </w:rPr>
+        <w:t>. Ahí vemos que la manera en la cual se gestionan los documentos no es óptima, ya que, como mencionamos anteriormente, estos 3 métodos pueden llevar a problemas como la pérdida de tiempo y el uso de documentación vieja, la cual afecta el rendimiento y la reputación de la empresa.</w:t>
+      </w:r>
+    </w:p>
+    <w:p>
+      <w:pPr>
+        <w:rPr>
+          <w:rFonts w:ascii="Arial" w:hAnsi="Arial" w:cs="Arial"/>
+          <w:lang w:val="es-ES"/>
+        </w:rPr>
+      </w:pPr>
+      <w:r>
+        <w:rPr>
+          <w:rFonts w:ascii="Arial" w:hAnsi="Arial" w:cs="Arial"/>
+          <w:lang w:val="es-ES"/>
+        </w:rPr>
+        <w:t>El 78.6% de los empleados han tenido problemas con versiones obsoletas o incorrectas</w:t>
+      </w:r>
+      <w:r>
+        <w:rPr>
+          <w:rStyle w:val="Refdenotaalpie"/>
+          <w:rFonts w:ascii="Arial" w:hAnsi="Arial" w:cs="Arial"/>
+          <w:lang w:val="es-ES"/>
+        </w:rPr>
+        <w:footnoteReference w:id="4"/>
+      </w:r>
+      <w:r>
+        <w:rPr>
+          <w:rFonts w:ascii="Arial" w:hAnsi="Arial" w:cs="Arial"/>
+          <w:lang w:val="es-ES"/>
+        </w:rPr>
+        <w:t xml:space="preserve">, lo cual es un problema serio, debido a que más de ¾ de los empleados se ha visto afectado por esto. El uso de documentos anticuados puede retrasar los proyectos de la empresa o incluso causar la entrega de documentos con errores o incompletos, lo cual afecta a la empresa. Estos errores pueden causar que la empresa se atrase, dañar la reputación de la empresa (lo cual le puede costar proyectos) e incluso causar que se entreguen documentos erróneos. </w:t>
+      </w:r>
+    </w:p>
+    <w:p>
+      <w:pPr>
+        <w:rPr>
+          <w:rFonts w:ascii="Arial" w:hAnsi="Arial" w:cs="Arial"/>
+          <w:lang w:val="es-ES"/>
+        </w:rPr>
+      </w:pPr>
+      <w:r>
+        <w:rPr>
+          <w:rFonts w:ascii="Arial" w:hAnsi="Arial" w:cs="Arial"/>
+          <w:lang w:val="es-ES"/>
+        </w:rPr>
+        <w:t>Un punto importante para la gestión de documento es que se puedan mostrar no solo las versiones más recientes, sino también las viejas, para poder así modernizar antiguos proyectos que se hayan hecho. Si se cuentan con las versiones anteriores y la más reciente, se puede hacer una comparación para poder así actualizar documentos a una versión más reciente. El 33.3% de los encuestados están de acuerdo que es muy importante mantener las versiones viejas y el 42.9% lo consideran importante</w:t>
+      </w:r>
+      <w:r>
+        <w:rPr>
+          <w:rStyle w:val="Refdenotaalpie"/>
+          <w:rFonts w:ascii="Arial" w:hAnsi="Arial" w:cs="Arial"/>
+          <w:lang w:val="es-ES"/>
+        </w:rPr>
+        <w:footnoteReference w:id="5"/>
+      </w:r>
+      <w:r>
+        <w:rPr>
+          <w:rFonts w:ascii="Arial" w:hAnsi="Arial" w:cs="Arial"/>
+          <w:lang w:val="es-ES"/>
+        </w:rPr>
+        <w:t xml:space="preserve">. </w:t>
+      </w:r>
+    </w:p>
+    <w:p>
+      <w:pPr>
+        <w:rPr>
+          <w:rFonts w:ascii="Arial" w:hAnsi="Arial" w:cs="Arial"/>
+          <w:lang w:val="es-ES"/>
+        </w:rPr>
+      </w:pPr>
+      <w:r>
+        <w:rPr>
+          <w:rFonts w:ascii="Arial" w:hAnsi="Arial" w:cs="Arial"/>
+          <w:lang w:val="es-ES"/>
+        </w:rPr>
+        <w:lastRenderedPageBreak/>
+        <w:t>Podemos ver que un sistema de gestión de documentos es importante ya que le ahorraría tiempo y problemas a la empresa y a sus empleados. Sin embargo, todavía tiene que verse como es que se tiene que estructurar. Un punto importante según los encuestados (92.9%)</w:t>
+      </w:r>
+      <w:r>
+        <w:rPr>
+          <w:rStyle w:val="Refdenotaalpie"/>
+          <w:rFonts w:ascii="Arial" w:hAnsi="Arial" w:cs="Arial"/>
+          <w:lang w:val="es-ES"/>
+        </w:rPr>
+        <w:footnoteReference w:id="6"/>
+      </w:r>
+      <w:r>
+        <w:rPr>
+          <w:rFonts w:ascii="Arial" w:hAnsi="Arial" w:cs="Arial"/>
+          <w:lang w:val="es-ES"/>
+        </w:rPr>
+        <w:t xml:space="preserve"> es que el sistema tenga un usuarios y contraseñas y que estos tengan distintos roles y permisos en el sistema (64.3%)</w:t>
+      </w:r>
+      <w:r>
+        <w:rPr>
+          <w:rStyle w:val="Refdenotaalpie"/>
+          <w:rFonts w:ascii="Arial" w:hAnsi="Arial" w:cs="Arial"/>
+          <w:lang w:val="es-ES"/>
+        </w:rPr>
+        <w:footnoteReference w:id="7"/>
+      </w:r>
+      <w:r>
+        <w:rPr>
+          <w:rFonts w:ascii="Arial" w:hAnsi="Arial" w:cs="Arial"/>
+          <w:lang w:val="es-ES"/>
+        </w:rPr>
+        <w:t xml:space="preserve">. El sistema que deseamos implementar contaría con 3 tipos de usuarios distintos, los empleados que pueden subir y revisar los documentos, los jefes que pueden aprobar o rechazar los documentos y el administrador, el cual puede agregar nuevos usuarios y asignarles permisos. </w:t>
+      </w:r>
+    </w:p>
+    <w:p>
+      <w:pPr>
+        <w:rPr>
+          <w:rFonts w:ascii="Arial" w:hAnsi="Arial" w:cs="Arial"/>
+          <w:lang w:val="es-ES"/>
+        </w:rPr>
+      </w:pPr>
+      <w:r>
+        <w:rPr>
+          <w:rFonts w:ascii="Arial" w:hAnsi="Arial" w:cs="Arial"/>
+          <w:lang w:val="es-ES"/>
+        </w:rPr>
+        <w:t>El 97.6% de los empleados</w:t>
+      </w:r>
+      <w:r>
+        <w:rPr>
+          <w:rStyle w:val="Refdenotaalpie"/>
+          <w:rFonts w:ascii="Arial" w:hAnsi="Arial" w:cs="Arial"/>
+          <w:lang w:val="es-ES"/>
+        </w:rPr>
+        <w:footnoteReference w:id="8"/>
+      </w:r>
+      <w:r>
+        <w:rPr>
+          <w:rFonts w:ascii="Arial" w:hAnsi="Arial" w:cs="Arial"/>
+          <w:lang w:val="es-ES"/>
+        </w:rPr>
+        <w:t xml:space="preserve"> están de acuerdo que haya un proceso de aprobación a la documentación (lo cual harían los usuarios de los jefes), ya que esto permitirá que hubiera un buen control de dicha documentación, ya </w:t>
+      </w:r>
+      <w:proofErr w:type="gramStart"/>
+      <w:r>
+        <w:rPr>
+          <w:rFonts w:ascii="Arial" w:hAnsi="Arial" w:cs="Arial"/>
+          <w:lang w:val="es-ES"/>
+        </w:rPr>
+        <w:t>que</w:t>
+      </w:r>
+      <w:proofErr w:type="gramEnd"/>
+      <w:r>
+        <w:rPr>
+          <w:rFonts w:ascii="Arial" w:hAnsi="Arial" w:cs="Arial"/>
+          <w:lang w:val="es-ES"/>
+        </w:rPr>
+        <w:t xml:space="preserve"> aunque cualquier empleado puede subir un documento, este tiene que ser aprobado para que se guarde en el sitio web, si se rechaza, el documento no se subirá. </w:t>
+      </w:r>
+    </w:p>
+    <w:p>
+      <w:pPr>
+        <w:rPr>
+          <w:rFonts w:ascii="Arial" w:hAnsi="Arial" w:cs="Arial"/>
+          <w:lang w:val="es-ES"/>
+        </w:rPr>
+      </w:pPr>
+      <w:r>
+        <w:rPr>
+          <w:rFonts w:ascii="Arial" w:hAnsi="Arial" w:cs="Arial"/>
+          <w:lang w:val="es-ES"/>
+        </w:rPr>
+        <w:t>El 69% de los empleados</w:t>
+      </w:r>
+      <w:r>
+        <w:rPr>
+          <w:rStyle w:val="Refdenotaalpie"/>
+          <w:rFonts w:ascii="Arial" w:hAnsi="Arial" w:cs="Arial"/>
+          <w:lang w:val="es-ES"/>
+        </w:rPr>
+        <w:footnoteReference w:id="9"/>
+      </w:r>
+      <w:r>
+        <w:rPr>
+          <w:rFonts w:ascii="Arial" w:hAnsi="Arial" w:cs="Arial"/>
+          <w:lang w:val="es-ES"/>
+        </w:rPr>
+        <w:t xml:space="preserve"> están de acuerdo que sería de gran utilidad que se pudieran dejar comentarios en los documentos y sus distintas versiones, para que así se pueda interactuar entre ellos sobre posibles preguntas que tengan los empleados y que puedan quedar guardadas las preguntas y respuestas para que todos puedan verlas. </w:t>
+      </w:r>
+    </w:p>
+    <w:p>
+      <w:pPr>
+        <w:rPr>
+          <w:rFonts w:ascii="Arial" w:hAnsi="Arial" w:cs="Arial"/>
+          <w:lang w:val="es-ES"/>
+        </w:rPr>
+      </w:pPr>
+      <w:r>
+        <w:rPr>
+          <w:rFonts w:ascii="Arial" w:hAnsi="Arial" w:cs="Arial"/>
+          <w:lang w:val="es-ES"/>
+        </w:rPr>
+        <w:t>Finalmente, el 59.5% de los empleados</w:t>
+      </w:r>
+      <w:r>
+        <w:rPr>
+          <w:rStyle w:val="Refdenotaalpie"/>
+          <w:rFonts w:ascii="Arial" w:hAnsi="Arial" w:cs="Arial"/>
+          <w:lang w:val="es-ES"/>
+        </w:rPr>
+        <w:footnoteReference w:id="10"/>
+      </w:r>
+      <w:r>
+        <w:rPr>
+          <w:rFonts w:ascii="Arial" w:hAnsi="Arial" w:cs="Arial"/>
+          <w:lang w:val="es-ES"/>
+        </w:rPr>
+        <w:t xml:space="preserve"> descargarían los documentos en su computadora para poder acceder a ellos de una maneras más rápida y simple, y de esa forma agilizar el proceso. </w:t>
+      </w:r>
     </w:p>
     <w:p>
       <w:pPr>
@@ -2758,57 +3223,16 @@
       <w:pPr>
         <w:rPr>
           <w:rFonts w:ascii="Arial" w:hAnsi="Arial" w:cs="Arial"/>
-          <w:lang w:val="es-SV"/>
-        </w:rPr>
-      </w:pPr>
-    </w:p>
-    <w:p>
-      <w:pPr>
-        <w:rPr>
-          <w:rFonts w:ascii="Arial" w:hAnsi="Arial" w:cs="Arial"/>
-          <w:lang w:val="es-SV"/>
-        </w:rPr>
-      </w:pPr>
-    </w:p>
-    <w:p>
-      <w:pPr>
-        <w:rPr>
-          <w:rFonts w:ascii="Arial" w:hAnsi="Arial" w:cs="Arial"/>
-          <w:lang w:val="es-SV"/>
-        </w:rPr>
-      </w:pPr>
-    </w:p>
-    <w:p>
-      <w:pPr>
-        <w:rPr>
-          <w:rFonts w:ascii="Arial" w:hAnsi="Arial" w:cs="Arial"/>
-          <w:lang w:val="es-SV"/>
-        </w:rPr>
-      </w:pPr>
-    </w:p>
-    <w:p>
-      <w:pPr>
-        <w:rPr>
-          <w:rFonts w:ascii="Arial" w:hAnsi="Arial" w:cs="Arial"/>
-          <w:lang w:val="es-SV"/>
-        </w:rPr>
-      </w:pPr>
-    </w:p>
-    <w:p>
-      <w:pPr>
-        <w:rPr>
-          <w:rFonts w:ascii="Arial" w:hAnsi="Arial" w:cs="Arial"/>
-          <w:lang w:val="es-SV"/>
-        </w:rPr>
-      </w:pPr>
-    </w:p>
-    <w:p>
-      <w:pPr>
-        <w:rPr>
-          <w:rFonts w:ascii="Arial" w:hAnsi="Arial" w:cs="Arial"/>
-          <w:lang w:val="es-SV"/>
-        </w:rPr>
-      </w:pPr>
+          <w:lang w:val="es-ES"/>
+        </w:rPr>
+      </w:pPr>
+      <w:r>
+        <w:rPr>
+          <w:rFonts w:ascii="Arial" w:hAnsi="Arial" w:cs="Arial"/>
+          <w:lang w:val="es-ES"/>
+        </w:rPr>
+        <w:t xml:space="preserve">Por medio de la encuesta es que hemos logrado no solo identificar los requerimientos funcionales y no funcionales del proyecto, sino también tener una idea clara de que es lo que se necesita y como poder implementarlo. Nos concentraremos en un sitio web al que se pueda acceder por medio de usuarios y contraseñas (con distintos tipos de usuarios) en el cual se pueden subir documentos, aprobar los documentos para que se guarden en el sitio web con sus respectivas versiones anteriores, bajar los documentos, dejar comentarios y que se pueda ver una bitácora de quien aprobó y quien subió el documento. </w:t>
+      </w:r>
     </w:p>
     <w:p>
       <w:pPr>
@@ -2835,6 +3259,7 @@
           <w:szCs w:val="24"/>
           <w:lang w:val="es-SV"/>
         </w:rPr>
+        <w:lastRenderedPageBreak/>
         <w:t>Diagramas AS-IS</w:t>
       </w:r>
       <w:bookmarkEnd w:id="6"/>
@@ -2966,6 +3391,7 @@
           <w:szCs w:val="24"/>
           <w:lang w:val="es-SV"/>
         </w:rPr>
+        <w:lastRenderedPageBreak/>
         <w:t>Buscar un documento en los archivos compartidos</w:t>
       </w:r>
       <w:bookmarkEnd w:id="8"/>
@@ -4371,7 +4797,7 @@
 </file>
 
 <file path=word/endnotes.xml><?xml version="1.0" encoding="utf-8"?>
-<w:endnotes xmlns:wpc="http://schemas.microsoft.com/office/word/2010/wordprocessingCanvas" xmlns:cx="http://schemas.microsoft.com/office/drawing/2014/chartex" xmlns:cx1="http://schemas.microsoft.com/office/drawing/2015/9/8/chartex" xmlns:cx2="http://schemas.microsoft.com/office/drawing/2015/10/21/chartex" xmlns:cx3="http://schemas.microsoft.com/office/drawing/2016/5/9/chartex" xmlns:cx4="http://schemas.microsoft.com/office/drawing/2016/5/10/chartex" xmlns:cx5="http://schemas.microsoft.com/office/drawing/2016/5/11/chartex" xmlns:cx6="http://schemas.microsoft.com/office/drawing/2016/5/12/chartex" xmlns:cx7="http://schemas.microsoft.com/office/drawing/2016/5/13/chartex" xmlns:cx8="http://schemas.microsoft.com/office/drawing/2016/5/14/chartex" xmlns:mc="http://schemas.openxmlformats.org/markup-compatibility/2006" xmlns:aink="http://schemas.microsoft.com/office/drawing/2016/ink" xmlns:am3d="http://schemas.microsoft.com/office/drawing/2017/model3d" xmlns:o="urn:schemas-microsoft-com:office:office" xmlns:oel="http://schemas.microsoft.com/office/2019/extlst" xmlns:r="http://schemas.openxmlformats.org/officeDocument/2006/relationships" xmlns:m="http://schemas.openxmlformats.org/officeDocument/2006/math" xmlns:v="urn:schemas-microsoft-com:vml" xmlns:wp14="http://schemas.microsoft.com/office/word/2010/wordprocessingDrawing" xmlns:wp="http://schemas.openxmlformats.org/drawingml/2006/wordprocessingDrawing" xmlns:w10="urn:schemas-microsoft-com:office:word" xmlns:w="http://schemas.openxmlformats.org/wordprocessingml/2006/main" xmlns:w14="http://schemas.microsoft.com/office/word/2010/wordml" xmlns:w15="http://schemas.microsoft.com/office/word/2012/wordml" xmlns:w16cex="http://schemas.microsoft.com/office/word/2018/wordml/cex" xmlns:w16cid="http://schemas.microsoft.com/office/word/2016/wordml/cid" xmlns:w16="http://schemas.microsoft.com/office/word/2018/wordml" xmlns:w16sdtdh="http://schemas.microsoft.com/office/word/2020/wordml/sdtdatahash" xmlns:w16se="http://schemas.microsoft.com/office/word/2015/wordml/symex" xmlns:wpg="http://schemas.microsoft.com/office/word/2010/wordprocessingGroup" xmlns:wpi="http://schemas.microsoft.com/office/word/2010/wordprocessingInk" xmlns:wne="http://schemas.microsoft.com/office/word/2006/wordml" xmlns:wps="http://schemas.microsoft.com/office/word/2010/wordprocessingShape" mc:Ignorable="w14 w15 w16se w16cid w16 w16cex w16sdtdh wp14">
+<w:endnotes xmlns:wpc="http://schemas.microsoft.com/office/word/2010/wordprocessingCanvas" xmlns:cx="http://schemas.microsoft.com/office/drawing/2014/chartex" xmlns:cx1="http://schemas.microsoft.com/office/drawing/2015/9/8/chartex" xmlns:cx2="http://schemas.microsoft.com/office/drawing/2015/10/21/chartex" xmlns:cx3="http://schemas.microsoft.com/office/drawing/2016/5/9/chartex" xmlns:cx4="http://schemas.microsoft.com/office/drawing/2016/5/10/chartex" xmlns:cx5="http://schemas.microsoft.com/office/drawing/2016/5/11/chartex" xmlns:cx6="http://schemas.microsoft.com/office/drawing/2016/5/12/chartex" xmlns:cx7="http://schemas.microsoft.com/office/drawing/2016/5/13/chartex" xmlns:cx8="http://schemas.microsoft.com/office/drawing/2016/5/14/chartex" xmlns:mc="http://schemas.openxmlformats.org/markup-compatibility/2006" xmlns:aink="http://schemas.microsoft.com/office/drawing/2016/ink" xmlns:am3d="http://schemas.microsoft.com/office/drawing/2017/model3d" xmlns:o="urn:schemas-microsoft-com:office:office" xmlns:oel="http://schemas.microsoft.com/office/2019/extlst" xmlns:r="http://schemas.openxmlformats.org/officeDocument/2006/relationships" xmlns:m="http://schemas.openxmlformats.org/officeDocument/2006/math" xmlns:v="urn:schemas-microsoft-com:vml" xmlns:wp14="http://schemas.microsoft.com/office/word/2010/wordprocessingDrawing" xmlns:wp="http://schemas.openxmlformats.org/drawingml/2006/wordprocessingDrawing" xmlns:w10="urn:schemas-microsoft-com:office:word" xmlns:w="http://schemas.openxmlformats.org/wordprocessingml/2006/main" xmlns:w14="http://schemas.microsoft.com/office/word/2010/wordml" xmlns:w15="http://schemas.microsoft.com/office/word/2012/wordml" xmlns:w16cex="http://schemas.microsoft.com/office/word/2018/wordml/cex" xmlns:w16cid="http://schemas.microsoft.com/office/word/2016/wordml/cid" xmlns:w16="http://schemas.microsoft.com/office/word/2018/wordml" xmlns:w16du="http://schemas.microsoft.com/office/word/2023/wordml/word16du" xmlns:w16sdtdh="http://schemas.microsoft.com/office/word/2020/wordml/sdtdatahash" xmlns:w16sdtfl="http://schemas.microsoft.com/office/word/2024/wordml/sdtformatlock" xmlns:w16se="http://schemas.microsoft.com/office/word/2015/wordml/symex" xmlns:wpg="http://schemas.microsoft.com/office/word/2010/wordprocessingGroup" xmlns:wpi="http://schemas.microsoft.com/office/word/2010/wordprocessingInk" xmlns:wne="http://schemas.microsoft.com/office/word/2006/wordml" xmlns:wps="http://schemas.microsoft.com/office/word/2010/wordprocessingShape" mc:Ignorable="w14 w15 w16se w16cid w16 w16cex w16sdtdh w16sdtfl w16du wp14">
   <w:endnote w:type="separator" w:id="-1">
     <w:p>
       <w:pPr>
@@ -4396,7 +4822,7 @@
 </file>
 
 <file path=word/footer1.xml><?xml version="1.0" encoding="utf-8"?>
-<w:ftr xmlns:wpc="http://schemas.microsoft.com/office/word/2010/wordprocessingCanvas" xmlns:cx="http://schemas.microsoft.com/office/drawing/2014/chartex" xmlns:cx1="http://schemas.microsoft.com/office/drawing/2015/9/8/chartex" xmlns:cx2="http://schemas.microsoft.com/office/drawing/2015/10/21/chartex" xmlns:cx3="http://schemas.microsoft.com/office/drawing/2016/5/9/chartex" xmlns:cx4="http://schemas.microsoft.com/office/drawing/2016/5/10/chartex" xmlns:cx5="http://schemas.microsoft.com/office/drawing/2016/5/11/chartex" xmlns:cx6="http://schemas.microsoft.com/office/drawing/2016/5/12/chartex" xmlns:cx7="http://schemas.microsoft.com/office/drawing/2016/5/13/chartex" xmlns:cx8="http://schemas.microsoft.com/office/drawing/2016/5/14/chartex" xmlns:mc="http://schemas.openxmlformats.org/markup-compatibility/2006" xmlns:aink="http://schemas.microsoft.com/office/drawing/2016/ink" xmlns:am3d="http://schemas.microsoft.com/office/drawing/2017/model3d" xmlns:o="urn:schemas-microsoft-com:office:office" xmlns:oel="http://schemas.microsoft.com/office/2019/extlst" xmlns:r="http://schemas.openxmlformats.org/officeDocument/2006/relationships" xmlns:m="http://schemas.openxmlformats.org/officeDocument/2006/math" xmlns:v="urn:schemas-microsoft-com:vml" xmlns:wp14="http://schemas.microsoft.com/office/word/2010/wordprocessingDrawing" xmlns:wp="http://schemas.openxmlformats.org/drawingml/2006/wordprocessingDrawing" xmlns:w10="urn:schemas-microsoft-com:office:word" xmlns:w="http://schemas.openxmlformats.org/wordprocessingml/2006/main" xmlns:w14="http://schemas.microsoft.com/office/word/2010/wordml" xmlns:w15="http://schemas.microsoft.com/office/word/2012/wordml" xmlns:w16cex="http://schemas.microsoft.com/office/word/2018/wordml/cex" xmlns:w16cid="http://schemas.microsoft.com/office/word/2016/wordml/cid" xmlns:w16="http://schemas.microsoft.com/office/word/2018/wordml" xmlns:w16sdtdh="http://schemas.microsoft.com/office/word/2020/wordml/sdtdatahash" xmlns:w16se="http://schemas.microsoft.com/office/word/2015/wordml/symex" xmlns:wpg="http://schemas.microsoft.com/office/word/2010/wordprocessingGroup" xmlns:wpi="http://schemas.microsoft.com/office/word/2010/wordprocessingInk" xmlns:wne="http://schemas.microsoft.com/office/word/2006/wordml" xmlns:wps="http://schemas.microsoft.com/office/word/2010/wordprocessingShape" mc:Ignorable="w14 w15 w16se w16cid w16 w16cex w16sdtdh wp14">
+<w:ftr xmlns:wpc="http://schemas.microsoft.com/office/word/2010/wordprocessingCanvas" xmlns:cx="http://schemas.microsoft.com/office/drawing/2014/chartex" xmlns:cx1="http://schemas.microsoft.com/office/drawing/2015/9/8/chartex" xmlns:cx2="http://schemas.microsoft.com/office/drawing/2015/10/21/chartex" xmlns:cx3="http://schemas.microsoft.com/office/drawing/2016/5/9/chartex" xmlns:cx4="http://schemas.microsoft.com/office/drawing/2016/5/10/chartex" xmlns:cx5="http://schemas.microsoft.com/office/drawing/2016/5/11/chartex" xmlns:cx6="http://schemas.microsoft.com/office/drawing/2016/5/12/chartex" xmlns:cx7="http://schemas.microsoft.com/office/drawing/2016/5/13/chartex" xmlns:cx8="http://schemas.microsoft.com/office/drawing/2016/5/14/chartex" xmlns:mc="http://schemas.openxmlformats.org/markup-compatibility/2006" xmlns:aink="http://schemas.microsoft.com/office/drawing/2016/ink" xmlns:am3d="http://schemas.microsoft.com/office/drawing/2017/model3d" xmlns:o="urn:schemas-microsoft-com:office:office" xmlns:oel="http://schemas.microsoft.com/office/2019/extlst" xmlns:r="http://schemas.openxmlformats.org/officeDocument/2006/relationships" xmlns:m="http://schemas.openxmlformats.org/officeDocument/2006/math" xmlns:v="urn:schemas-microsoft-com:vml" xmlns:wp14="http://schemas.microsoft.com/office/word/2010/wordprocessingDrawing" xmlns:wp="http://schemas.openxmlformats.org/drawingml/2006/wordprocessingDrawing" xmlns:w10="urn:schemas-microsoft-com:office:word" xmlns:w="http://schemas.openxmlformats.org/wordprocessingml/2006/main" xmlns:w14="http://schemas.microsoft.com/office/word/2010/wordml" xmlns:w15="http://schemas.microsoft.com/office/word/2012/wordml" xmlns:w16cex="http://schemas.microsoft.com/office/word/2018/wordml/cex" xmlns:w16cid="http://schemas.microsoft.com/office/word/2016/wordml/cid" xmlns:w16="http://schemas.microsoft.com/office/word/2018/wordml" xmlns:w16du="http://schemas.microsoft.com/office/word/2023/wordml/word16du" xmlns:w16sdtdh="http://schemas.microsoft.com/office/word/2020/wordml/sdtdatahash" xmlns:w16sdtfl="http://schemas.microsoft.com/office/word/2024/wordml/sdtformatlock" xmlns:w16se="http://schemas.microsoft.com/office/word/2015/wordml/symex" xmlns:wpg="http://schemas.microsoft.com/office/word/2010/wordprocessingGroup" xmlns:wpi="http://schemas.microsoft.com/office/word/2010/wordprocessingInk" xmlns:wne="http://schemas.microsoft.com/office/word/2006/wordml" xmlns:wps="http://schemas.microsoft.com/office/word/2010/wordprocessingShape" mc:Ignorable="w14 w15 w16se w16cid w16 w16cex w16sdtdh w16sdtfl w16du wp14">
   <w:p>
     <w:pPr>
       <w:pStyle w:val="Piedepgina"/>
@@ -4412,7 +4838,7 @@
 </file>
 
 <file path=word/footnotes.xml><?xml version="1.0" encoding="utf-8"?>
-<w:footnotes xmlns:wpc="http://schemas.microsoft.com/office/word/2010/wordprocessingCanvas" xmlns:cx="http://schemas.microsoft.com/office/drawing/2014/chartex" xmlns:cx1="http://schemas.microsoft.com/office/drawing/2015/9/8/chartex" xmlns:cx2="http://schemas.microsoft.com/office/drawing/2015/10/21/chartex" xmlns:cx3="http://schemas.microsoft.com/office/drawing/2016/5/9/chartex" xmlns:cx4="http://schemas.microsoft.com/office/drawing/2016/5/10/chartex" xmlns:cx5="http://schemas.microsoft.com/office/drawing/2016/5/11/chartex" xmlns:cx6="http://schemas.microsoft.com/office/drawing/2016/5/12/chartex" xmlns:cx7="http://schemas.microsoft.com/office/drawing/2016/5/13/chartex" xmlns:cx8="http://schemas.microsoft.com/office/drawing/2016/5/14/chartex" xmlns:mc="http://schemas.openxmlformats.org/markup-compatibility/2006" xmlns:aink="http://schemas.microsoft.com/office/drawing/2016/ink" xmlns:am3d="http://schemas.microsoft.com/office/drawing/2017/model3d" xmlns:o="urn:schemas-microsoft-com:office:office" xmlns:oel="http://schemas.microsoft.com/office/2019/extlst" xmlns:r="http://schemas.openxmlformats.org/officeDocument/2006/relationships" xmlns:m="http://schemas.openxmlformats.org/officeDocument/2006/math" xmlns:v="urn:schemas-microsoft-com:vml" xmlns:wp14="http://schemas.microsoft.com/office/word/2010/wordprocessingDrawing" xmlns:wp="http://schemas.openxmlformats.org/drawingml/2006/wordprocessingDrawing" xmlns:w10="urn:schemas-microsoft-com:office:word" xmlns:w="http://schemas.openxmlformats.org/wordprocessingml/2006/main" xmlns:w14="http://schemas.microsoft.com/office/word/2010/wordml" xmlns:w15="http://schemas.microsoft.com/office/word/2012/wordml" xmlns:w16cex="http://schemas.microsoft.com/office/word/2018/wordml/cex" xmlns:w16cid="http://schemas.microsoft.com/office/word/2016/wordml/cid" xmlns:w16="http://schemas.microsoft.com/office/word/2018/wordml" xmlns:w16sdtdh="http://schemas.microsoft.com/office/word/2020/wordml/sdtdatahash" xmlns:w16se="http://schemas.microsoft.com/office/word/2015/wordml/symex" xmlns:wpg="http://schemas.microsoft.com/office/word/2010/wordprocessingGroup" xmlns:wpi="http://schemas.microsoft.com/office/word/2010/wordprocessingInk" xmlns:wne="http://schemas.microsoft.com/office/word/2006/wordml" xmlns:wps="http://schemas.microsoft.com/office/word/2010/wordprocessingShape" mc:Ignorable="w14 w15 w16se w16cid w16 w16cex w16sdtdh wp14">
+<w:footnotes xmlns:wpc="http://schemas.microsoft.com/office/word/2010/wordprocessingCanvas" xmlns:cx="http://schemas.microsoft.com/office/drawing/2014/chartex" xmlns:cx1="http://schemas.microsoft.com/office/drawing/2015/9/8/chartex" xmlns:cx2="http://schemas.microsoft.com/office/drawing/2015/10/21/chartex" xmlns:cx3="http://schemas.microsoft.com/office/drawing/2016/5/9/chartex" xmlns:cx4="http://schemas.microsoft.com/office/drawing/2016/5/10/chartex" xmlns:cx5="http://schemas.microsoft.com/office/drawing/2016/5/11/chartex" xmlns:cx6="http://schemas.microsoft.com/office/drawing/2016/5/12/chartex" xmlns:cx7="http://schemas.microsoft.com/office/drawing/2016/5/13/chartex" xmlns:cx8="http://schemas.microsoft.com/office/drawing/2016/5/14/chartex" xmlns:mc="http://schemas.openxmlformats.org/markup-compatibility/2006" xmlns:aink="http://schemas.microsoft.com/office/drawing/2016/ink" xmlns:am3d="http://schemas.microsoft.com/office/drawing/2017/model3d" xmlns:o="urn:schemas-microsoft-com:office:office" xmlns:oel="http://schemas.microsoft.com/office/2019/extlst" xmlns:r="http://schemas.openxmlformats.org/officeDocument/2006/relationships" xmlns:m="http://schemas.openxmlformats.org/officeDocument/2006/math" xmlns:v="urn:schemas-microsoft-com:vml" xmlns:wp14="http://schemas.microsoft.com/office/word/2010/wordprocessingDrawing" xmlns:wp="http://schemas.openxmlformats.org/drawingml/2006/wordprocessingDrawing" xmlns:w10="urn:schemas-microsoft-com:office:word" xmlns:w="http://schemas.openxmlformats.org/wordprocessingml/2006/main" xmlns:w14="http://schemas.microsoft.com/office/word/2010/wordml" xmlns:w15="http://schemas.microsoft.com/office/word/2012/wordml" xmlns:w16cex="http://schemas.microsoft.com/office/word/2018/wordml/cex" xmlns:w16cid="http://schemas.microsoft.com/office/word/2016/wordml/cid" xmlns:w16="http://schemas.microsoft.com/office/word/2018/wordml" xmlns:w16du="http://schemas.microsoft.com/office/word/2023/wordml/word16du" xmlns:w16sdtdh="http://schemas.microsoft.com/office/word/2020/wordml/sdtdatahash" xmlns:w16sdtfl="http://schemas.microsoft.com/office/word/2024/wordml/sdtformatlock" xmlns:w16se="http://schemas.microsoft.com/office/word/2015/wordml/symex" xmlns:wpg="http://schemas.microsoft.com/office/word/2010/wordprocessingGroup" xmlns:wpi="http://schemas.microsoft.com/office/word/2010/wordprocessingInk" xmlns:wne="http://schemas.microsoft.com/office/word/2006/wordml" xmlns:wps="http://schemas.microsoft.com/office/word/2010/wordprocessingShape" mc:Ignorable="w14 w15 w16se w16cid w16 w16cex w16sdtdh w16sdtfl w16du wp14">
   <w:footnote w:type="separator" w:id="-1">
     <w:p>
       <w:pPr>
@@ -4430,6 +4856,266 @@
       </w:pPr>
       <w:r>
         <w:continuationSeparator/>
+      </w:r>
+    </w:p>
+  </w:footnote>
+  <w:footnote w:id="1">
+    <w:p>
+      <w:pPr>
+        <w:pStyle w:val="Textonotapie"/>
+        <w:rPr>
+          <w:rFonts w:ascii="Arial" w:hAnsi="Arial" w:cs="Arial"/>
+          <w:lang w:val="es-SV"/>
+        </w:rPr>
+      </w:pPr>
+      <w:r>
+        <w:rPr>
+          <w:rStyle w:val="Refdenotaalpie"/>
+          <w:rFonts w:ascii="Arial" w:hAnsi="Arial" w:cs="Arial"/>
+        </w:rPr>
+        <w:footnoteRef/>
+      </w:r>
+      <w:r>
+        <w:rPr>
+          <w:rFonts w:ascii="Arial" w:hAnsi="Arial" w:cs="Arial"/>
+          <w:lang w:val="es-SV"/>
+        </w:rPr>
+        <w:t xml:space="preserve"> La primera pregunta de la encuesta, la cual está en anexos.</w:t>
+      </w:r>
+    </w:p>
+  </w:footnote>
+  <w:footnote w:id="2">
+    <w:p>
+      <w:pPr>
+        <w:pStyle w:val="Textonotapie"/>
+        <w:rPr>
+          <w:rFonts w:ascii="Arial" w:hAnsi="Arial" w:cs="Arial"/>
+          <w:lang w:val="es-SV"/>
+        </w:rPr>
+      </w:pPr>
+      <w:r>
+        <w:rPr>
+          <w:rStyle w:val="Refdenotaalpie"/>
+          <w:rFonts w:ascii="Arial" w:hAnsi="Arial" w:cs="Arial"/>
+        </w:rPr>
+        <w:footnoteRef/>
+      </w:r>
+      <w:r>
+        <w:rPr>
+          <w:rFonts w:ascii="Arial" w:hAnsi="Arial" w:cs="Arial"/>
+          <w:lang w:val="es-SV"/>
+        </w:rPr>
+        <w:t xml:space="preserve"> La segunda pregunta de la encuesta.</w:t>
+      </w:r>
+    </w:p>
+  </w:footnote>
+  <w:footnote w:id="3">
+    <w:p>
+      <w:pPr>
+        <w:pStyle w:val="Textonotapie"/>
+        <w:rPr>
+          <w:rFonts w:ascii="Arial" w:hAnsi="Arial" w:cs="Arial"/>
+          <w:lang w:val="es-SV"/>
+        </w:rPr>
+      </w:pPr>
+      <w:r>
+        <w:rPr>
+          <w:rStyle w:val="Refdenotaalpie"/>
+          <w:rFonts w:ascii="Arial" w:hAnsi="Arial" w:cs="Arial"/>
+        </w:rPr>
+        <w:footnoteRef/>
+      </w:r>
+      <w:r>
+        <w:rPr>
+          <w:rFonts w:ascii="Arial" w:hAnsi="Arial" w:cs="Arial"/>
+          <w:lang w:val="es-SV"/>
+        </w:rPr>
+        <w:t xml:space="preserve"> Según la tercera pregunta de la encuesta.</w:t>
+      </w:r>
+    </w:p>
+  </w:footnote>
+  <w:footnote w:id="4">
+    <w:p>
+      <w:pPr>
+        <w:pStyle w:val="Textonotapie"/>
+        <w:rPr>
+          <w:rFonts w:ascii="Arial" w:hAnsi="Arial" w:cs="Arial"/>
+          <w:lang w:val="es-SV"/>
+        </w:rPr>
+      </w:pPr>
+      <w:r>
+        <w:rPr>
+          <w:rStyle w:val="Refdenotaalpie"/>
+          <w:rFonts w:ascii="Arial" w:hAnsi="Arial" w:cs="Arial"/>
+        </w:rPr>
+        <w:footnoteRef/>
+      </w:r>
+      <w:r>
+        <w:rPr>
+          <w:rFonts w:ascii="Arial" w:hAnsi="Arial" w:cs="Arial"/>
+          <w:lang w:val="es-SV"/>
+        </w:rPr>
+        <w:t xml:space="preserve"> Según la cuarta pregunta de la encuesta. </w:t>
+      </w:r>
+    </w:p>
+  </w:footnote>
+  <w:footnote w:id="5">
+    <w:p>
+      <w:pPr>
+        <w:pStyle w:val="Textonotapie"/>
+        <w:rPr>
+          <w:lang w:val="es-SV"/>
+        </w:rPr>
+      </w:pPr>
+      <w:r>
+        <w:rPr>
+          <w:rStyle w:val="Refdenotaalpie"/>
+          <w:rFonts w:ascii="Arial" w:hAnsi="Arial" w:cs="Arial"/>
+        </w:rPr>
+        <w:footnoteRef/>
+      </w:r>
+      <w:r>
+        <w:rPr>
+          <w:rFonts w:ascii="Arial" w:hAnsi="Arial" w:cs="Arial"/>
+          <w:lang w:val="es-SV"/>
+        </w:rPr>
+        <w:t xml:space="preserve"> Según la quinta pregunta de la encuesta.</w:t>
+      </w:r>
+      <w:r>
+        <w:rPr>
+          <w:lang w:val="es-SV"/>
+        </w:rPr>
+        <w:t xml:space="preserve"> </w:t>
+      </w:r>
+    </w:p>
+  </w:footnote>
+  <w:footnote w:id="6">
+    <w:p>
+      <w:pPr>
+        <w:pStyle w:val="Textonotapie"/>
+        <w:rPr>
+          <w:rFonts w:ascii="Arial" w:hAnsi="Arial" w:cs="Arial"/>
+          <w:lang w:val="es-SV"/>
+        </w:rPr>
+      </w:pPr>
+      <w:r>
+        <w:rPr>
+          <w:rStyle w:val="Refdenotaalpie"/>
+          <w:rFonts w:ascii="Arial" w:hAnsi="Arial" w:cs="Arial"/>
+        </w:rPr>
+        <w:footnoteRef/>
+      </w:r>
+      <w:r>
+        <w:rPr>
+          <w:rFonts w:ascii="Arial" w:hAnsi="Arial" w:cs="Arial"/>
+          <w:lang w:val="es-SV"/>
+        </w:rPr>
+        <w:t xml:space="preserve"> Según la sexta pregunta de la encuesta. </w:t>
+      </w:r>
+    </w:p>
+  </w:footnote>
+  <w:footnote w:id="7">
+    <w:p>
+      <w:pPr>
+        <w:pStyle w:val="Textonotapie"/>
+        <w:rPr>
+          <w:rFonts w:ascii="Arial" w:hAnsi="Arial" w:cs="Arial"/>
+          <w:lang w:val="es-SV"/>
+        </w:rPr>
+      </w:pPr>
+      <w:r>
+        <w:rPr>
+          <w:rStyle w:val="Refdenotaalpie"/>
+          <w:rFonts w:ascii="Arial" w:hAnsi="Arial" w:cs="Arial"/>
+        </w:rPr>
+        <w:footnoteRef/>
+      </w:r>
+      <w:r>
+        <w:rPr>
+          <w:rFonts w:ascii="Arial" w:hAnsi="Arial" w:cs="Arial"/>
+          <w:lang w:val="es-SV"/>
+        </w:rPr>
+        <w:t xml:space="preserve"> Según la séptima pregunta de la encuesta. </w:t>
+      </w:r>
+    </w:p>
+  </w:footnote>
+  <w:footnote w:id="8">
+    <w:p>
+      <w:pPr>
+        <w:pStyle w:val="Textonotapie"/>
+        <w:rPr>
+          <w:rFonts w:ascii="Arial" w:hAnsi="Arial" w:cs="Arial"/>
+          <w:lang w:val="es-SV"/>
+        </w:rPr>
+      </w:pPr>
+      <w:r>
+        <w:rPr>
+          <w:rStyle w:val="Refdenotaalpie"/>
+          <w:rFonts w:ascii="Arial" w:hAnsi="Arial" w:cs="Arial"/>
+        </w:rPr>
+        <w:footnoteRef/>
+      </w:r>
+      <w:r>
+        <w:rPr>
+          <w:rFonts w:ascii="Arial" w:hAnsi="Arial" w:cs="Arial"/>
+          <w:lang w:val="es-SV"/>
+        </w:rPr>
+        <w:t xml:space="preserve"> Según la octava pregunta de la encuesta.</w:t>
+      </w:r>
+    </w:p>
+  </w:footnote>
+  <w:footnote w:id="9">
+    <w:p>
+      <w:pPr>
+        <w:pStyle w:val="Textonotapie"/>
+        <w:rPr>
+          <w:rFonts w:ascii="Arial" w:hAnsi="Arial" w:cs="Arial"/>
+          <w:lang w:val="es-SV"/>
+        </w:rPr>
+      </w:pPr>
+      <w:r>
+        <w:rPr>
+          <w:rStyle w:val="Refdenotaalpie"/>
+          <w:rFonts w:ascii="Arial" w:hAnsi="Arial" w:cs="Arial"/>
+        </w:rPr>
+        <w:footnoteRef/>
+      </w:r>
+      <w:r>
+        <w:rPr>
+          <w:rFonts w:ascii="Arial" w:hAnsi="Arial" w:cs="Arial"/>
+          <w:lang w:val="es-SV"/>
+        </w:rPr>
+        <w:t xml:space="preserve"> Según la novena pregunta de la encuesta.</w:t>
+      </w:r>
+    </w:p>
+  </w:footnote>
+  <w:footnote w:id="10">
+    <w:p>
+      <w:pPr>
+        <w:pStyle w:val="Textonotapie"/>
+        <w:rPr>
+          <w:lang w:val="es-SV"/>
+        </w:rPr>
+      </w:pPr>
+      <w:r>
+        <w:rPr>
+          <w:rStyle w:val="Refdenotaalpie"/>
+          <w:rFonts w:ascii="Arial" w:hAnsi="Arial" w:cs="Arial"/>
+        </w:rPr>
+        <w:footnoteRef/>
+      </w:r>
+      <w:r>
+        <w:rPr>
+          <w:rFonts w:ascii="Arial" w:hAnsi="Arial" w:cs="Arial"/>
+          <w:lang w:val="es-SV"/>
+        </w:rPr>
+        <w:t xml:space="preserve"> Según la décima pregunta de la encuesta.</w:t>
+      </w:r>
+      <w:r>
+        <w:rPr>
+          <w:lang w:val="es-SV"/>
+        </w:rPr>
+        <w:t xml:space="preserve"> </w:t>
       </w:r>
     </w:p>
   </w:footnote>
@@ -4437,7 +5123,7 @@
 </file>
 
 <file path=word/header1.xml><?xml version="1.0" encoding="utf-8"?>
-<w:hdr xmlns:wpc="http://schemas.microsoft.com/office/word/2010/wordprocessingCanvas" xmlns:cx="http://schemas.microsoft.com/office/drawing/2014/chartex" xmlns:cx1="http://schemas.microsoft.com/office/drawing/2015/9/8/chartex" xmlns:cx2="http://schemas.microsoft.com/office/drawing/2015/10/21/chartex" xmlns:cx3="http://schemas.microsoft.com/office/drawing/2016/5/9/chartex" xmlns:cx4="http://schemas.microsoft.com/office/drawing/2016/5/10/chartex" xmlns:cx5="http://schemas.microsoft.com/office/drawing/2016/5/11/chartex" xmlns:cx6="http://schemas.microsoft.com/office/drawing/2016/5/12/chartex" xmlns:cx7="http://schemas.microsoft.com/office/drawing/2016/5/13/chartex" xmlns:cx8="http://schemas.microsoft.com/office/drawing/2016/5/14/chartex" xmlns:mc="http://schemas.openxmlformats.org/markup-compatibility/2006" xmlns:aink="http://schemas.microsoft.com/office/drawing/2016/ink" xmlns:am3d="http://schemas.microsoft.com/office/drawing/2017/model3d" xmlns:o="urn:schemas-microsoft-com:office:office" xmlns:oel="http://schemas.microsoft.com/office/2019/extlst" xmlns:r="http://schemas.openxmlformats.org/officeDocument/2006/relationships" xmlns:m="http://schemas.openxmlformats.org/officeDocument/2006/math" xmlns:v="urn:schemas-microsoft-com:vml" xmlns:wp14="http://schemas.microsoft.com/office/word/2010/wordprocessingDrawing" xmlns:wp="http://schemas.openxmlformats.org/drawingml/2006/wordprocessingDrawing" xmlns:w10="urn:schemas-microsoft-com:office:word" xmlns:w="http://schemas.openxmlformats.org/wordprocessingml/2006/main" xmlns:w14="http://schemas.microsoft.com/office/word/2010/wordml" xmlns:w15="http://schemas.microsoft.com/office/word/2012/wordml" xmlns:w16cex="http://schemas.microsoft.com/office/word/2018/wordml/cex" xmlns:w16cid="http://schemas.microsoft.com/office/word/2016/wordml/cid" xmlns:w16="http://schemas.microsoft.com/office/word/2018/wordml" xmlns:w16sdtdh="http://schemas.microsoft.com/office/word/2020/wordml/sdtdatahash" xmlns:w16se="http://schemas.microsoft.com/office/word/2015/wordml/symex" xmlns:wpg="http://schemas.microsoft.com/office/word/2010/wordprocessingGroup" xmlns:wpi="http://schemas.microsoft.com/office/word/2010/wordprocessingInk" xmlns:wne="http://schemas.microsoft.com/office/word/2006/wordml" xmlns:wps="http://schemas.microsoft.com/office/word/2010/wordprocessingShape" mc:Ignorable="w14 w15 w16se w16cid w16 w16cex w16sdtdh wp14">
+<w:hdr xmlns:wpc="http://schemas.microsoft.com/office/word/2010/wordprocessingCanvas" xmlns:cx="http://schemas.microsoft.com/office/drawing/2014/chartex" xmlns:cx1="http://schemas.microsoft.com/office/drawing/2015/9/8/chartex" xmlns:cx2="http://schemas.microsoft.com/office/drawing/2015/10/21/chartex" xmlns:cx3="http://schemas.microsoft.com/office/drawing/2016/5/9/chartex" xmlns:cx4="http://schemas.microsoft.com/office/drawing/2016/5/10/chartex" xmlns:cx5="http://schemas.microsoft.com/office/drawing/2016/5/11/chartex" xmlns:cx6="http://schemas.microsoft.com/office/drawing/2016/5/12/chartex" xmlns:cx7="http://schemas.microsoft.com/office/drawing/2016/5/13/chartex" xmlns:cx8="http://schemas.microsoft.com/office/drawing/2016/5/14/chartex" xmlns:mc="http://schemas.openxmlformats.org/markup-compatibility/2006" xmlns:aink="http://schemas.microsoft.com/office/drawing/2016/ink" xmlns:am3d="http://schemas.microsoft.com/office/drawing/2017/model3d" xmlns:o="urn:schemas-microsoft-com:office:office" xmlns:oel="http://schemas.microsoft.com/office/2019/extlst" xmlns:r="http://schemas.openxmlformats.org/officeDocument/2006/relationships" xmlns:m="http://schemas.openxmlformats.org/officeDocument/2006/math" xmlns:v="urn:schemas-microsoft-com:vml" xmlns:wp14="http://schemas.microsoft.com/office/word/2010/wordprocessingDrawing" xmlns:wp="http://schemas.openxmlformats.org/drawingml/2006/wordprocessingDrawing" xmlns:w10="urn:schemas-microsoft-com:office:word" xmlns:w="http://schemas.openxmlformats.org/wordprocessingml/2006/main" xmlns:w14="http://schemas.microsoft.com/office/word/2010/wordml" xmlns:w15="http://schemas.microsoft.com/office/word/2012/wordml" xmlns:w16cex="http://schemas.microsoft.com/office/word/2018/wordml/cex" xmlns:w16cid="http://schemas.microsoft.com/office/word/2016/wordml/cid" xmlns:w16="http://schemas.microsoft.com/office/word/2018/wordml" xmlns:w16du="http://schemas.microsoft.com/office/word/2023/wordml/word16du" xmlns:w16sdtdh="http://schemas.microsoft.com/office/word/2020/wordml/sdtdatahash" xmlns:w16sdtfl="http://schemas.microsoft.com/office/word/2024/wordml/sdtformatlock" xmlns:w16se="http://schemas.microsoft.com/office/word/2015/wordml/symex" xmlns:wpg="http://schemas.microsoft.com/office/word/2010/wordprocessingGroup" xmlns:wpi="http://schemas.microsoft.com/office/word/2010/wordprocessingInk" xmlns:wne="http://schemas.microsoft.com/office/word/2006/wordml" xmlns:wps="http://schemas.microsoft.com/office/word/2010/wordprocessingShape" mc:Ignorable="w14 w15 w16se w16cid w16 w16cex w16sdtdh w16sdtfl w16du wp14">
   <w:p>
     <w:pPr>
       <w:pStyle w:val="Encabezado"/>
@@ -4453,7 +5139,7 @@
 </file>
 
 <file path=word/header2.xml><?xml version="1.0" encoding="utf-8"?>
-<w:hdr xmlns:wpc="http://schemas.microsoft.com/office/word/2010/wordprocessingCanvas" xmlns:cx="http://schemas.microsoft.com/office/drawing/2014/chartex" xmlns:cx1="http://schemas.microsoft.com/office/drawing/2015/9/8/chartex" xmlns:cx2="http://schemas.microsoft.com/office/drawing/2015/10/21/chartex" xmlns:cx3="http://schemas.microsoft.com/office/drawing/2016/5/9/chartex" xmlns:cx4="http://schemas.microsoft.com/office/drawing/2016/5/10/chartex" xmlns:cx5="http://schemas.microsoft.com/office/drawing/2016/5/11/chartex" xmlns:cx6="http://schemas.microsoft.com/office/drawing/2016/5/12/chartex" xmlns:cx7="http://schemas.microsoft.com/office/drawing/2016/5/13/chartex" xmlns:cx8="http://schemas.microsoft.com/office/drawing/2016/5/14/chartex" xmlns:mc="http://schemas.openxmlformats.org/markup-compatibility/2006" xmlns:aink="http://schemas.microsoft.com/office/drawing/2016/ink" xmlns:am3d="http://schemas.microsoft.com/office/drawing/2017/model3d" xmlns:o="urn:schemas-microsoft-com:office:office" xmlns:oel="http://schemas.microsoft.com/office/2019/extlst" xmlns:r="http://schemas.openxmlformats.org/officeDocument/2006/relationships" xmlns:m="http://schemas.openxmlformats.org/officeDocument/2006/math" xmlns:v="urn:schemas-microsoft-com:vml" xmlns:wp14="http://schemas.microsoft.com/office/word/2010/wordprocessingDrawing" xmlns:wp="http://schemas.openxmlformats.org/drawingml/2006/wordprocessingDrawing" xmlns:w10="urn:schemas-microsoft-com:office:word" xmlns:w="http://schemas.openxmlformats.org/wordprocessingml/2006/main" xmlns:w14="http://schemas.microsoft.com/office/word/2010/wordml" xmlns:w15="http://schemas.microsoft.com/office/word/2012/wordml" xmlns:w16cex="http://schemas.microsoft.com/office/word/2018/wordml/cex" xmlns:w16cid="http://schemas.microsoft.com/office/word/2016/wordml/cid" xmlns:w16="http://schemas.microsoft.com/office/word/2018/wordml" xmlns:w16sdtdh="http://schemas.microsoft.com/office/word/2020/wordml/sdtdatahash" xmlns:w16se="http://schemas.microsoft.com/office/word/2015/wordml/symex" xmlns:wpg="http://schemas.microsoft.com/office/word/2010/wordprocessingGroup" xmlns:wpi="http://schemas.microsoft.com/office/word/2010/wordprocessingInk" xmlns:wne="http://schemas.microsoft.com/office/word/2006/wordml" xmlns:wps="http://schemas.microsoft.com/office/word/2010/wordprocessingShape" mc:Ignorable="w14 w15 w16se w16cid w16 w16cex w16sdtdh wp14">
+<w:hdr xmlns:wpc="http://schemas.microsoft.com/office/word/2010/wordprocessingCanvas" xmlns:cx="http://schemas.microsoft.com/office/drawing/2014/chartex" xmlns:cx1="http://schemas.microsoft.com/office/drawing/2015/9/8/chartex" xmlns:cx2="http://schemas.microsoft.com/office/drawing/2015/10/21/chartex" xmlns:cx3="http://schemas.microsoft.com/office/drawing/2016/5/9/chartex" xmlns:cx4="http://schemas.microsoft.com/office/drawing/2016/5/10/chartex" xmlns:cx5="http://schemas.microsoft.com/office/drawing/2016/5/11/chartex" xmlns:cx6="http://schemas.microsoft.com/office/drawing/2016/5/12/chartex" xmlns:cx7="http://schemas.microsoft.com/office/drawing/2016/5/13/chartex" xmlns:cx8="http://schemas.microsoft.com/office/drawing/2016/5/14/chartex" xmlns:mc="http://schemas.openxmlformats.org/markup-compatibility/2006" xmlns:aink="http://schemas.microsoft.com/office/drawing/2016/ink" xmlns:am3d="http://schemas.microsoft.com/office/drawing/2017/model3d" xmlns:o="urn:schemas-microsoft-com:office:office" xmlns:oel="http://schemas.microsoft.com/office/2019/extlst" xmlns:r="http://schemas.openxmlformats.org/officeDocument/2006/relationships" xmlns:m="http://schemas.openxmlformats.org/officeDocument/2006/math" xmlns:v="urn:schemas-microsoft-com:vml" xmlns:wp14="http://schemas.microsoft.com/office/word/2010/wordprocessingDrawing" xmlns:wp="http://schemas.openxmlformats.org/drawingml/2006/wordprocessingDrawing" xmlns:w10="urn:schemas-microsoft-com:office:word" xmlns:w="http://schemas.openxmlformats.org/wordprocessingml/2006/main" xmlns:w14="http://schemas.microsoft.com/office/word/2010/wordml" xmlns:w15="http://schemas.microsoft.com/office/word/2012/wordml" xmlns:w16cex="http://schemas.microsoft.com/office/word/2018/wordml/cex" xmlns:w16cid="http://schemas.microsoft.com/office/word/2016/wordml/cid" xmlns:w16="http://schemas.microsoft.com/office/word/2018/wordml" xmlns:w16du="http://schemas.microsoft.com/office/word/2023/wordml/word16du" xmlns:w16sdtdh="http://schemas.microsoft.com/office/word/2020/wordml/sdtdatahash" xmlns:w16sdtfl="http://schemas.microsoft.com/office/word/2024/wordml/sdtformatlock" xmlns:w16se="http://schemas.microsoft.com/office/word/2015/wordml/symex" xmlns:wpg="http://schemas.microsoft.com/office/word/2010/wordprocessingGroup" xmlns:wpi="http://schemas.microsoft.com/office/word/2010/wordprocessingInk" xmlns:wne="http://schemas.microsoft.com/office/word/2006/wordml" xmlns:wps="http://schemas.microsoft.com/office/word/2010/wordprocessingShape" mc:Ignorable="w14 w15 w16se w16cid w16 w16cex w16sdtdh w16sdtfl w16du wp14">
   <w:p>
     <w:pPr>
       <w:pStyle w:val="Encabezado"/>
@@ -4469,7 +5155,7 @@
 </file>
 
 <file path=word/header3.xml><?xml version="1.0" encoding="utf-8"?>
-<w:hdr xmlns:wpc="http://schemas.microsoft.com/office/word/2010/wordprocessingCanvas" xmlns:cx="http://schemas.microsoft.com/office/drawing/2014/chartex" xmlns:cx1="http://schemas.microsoft.com/office/drawing/2015/9/8/chartex" xmlns:cx2="http://schemas.microsoft.com/office/drawing/2015/10/21/chartex" xmlns:cx3="http://schemas.microsoft.com/office/drawing/2016/5/9/chartex" xmlns:cx4="http://schemas.microsoft.com/office/drawing/2016/5/10/chartex" xmlns:cx5="http://schemas.microsoft.com/office/drawing/2016/5/11/chartex" xmlns:cx6="http://schemas.microsoft.com/office/drawing/2016/5/12/chartex" xmlns:cx7="http://schemas.microsoft.com/office/drawing/2016/5/13/chartex" xmlns:cx8="http://schemas.microsoft.com/office/drawing/2016/5/14/chartex" xmlns:mc="http://schemas.openxmlformats.org/markup-compatibility/2006" xmlns:aink="http://schemas.microsoft.com/office/drawing/2016/ink" xmlns:am3d="http://schemas.microsoft.com/office/drawing/2017/model3d" xmlns:o="urn:schemas-microsoft-com:office:office" xmlns:oel="http://schemas.microsoft.com/office/2019/extlst" xmlns:r="http://schemas.openxmlformats.org/officeDocument/2006/relationships" xmlns:m="http://schemas.openxmlformats.org/officeDocument/2006/math" xmlns:v="urn:schemas-microsoft-com:vml" xmlns:wp14="http://schemas.microsoft.com/office/word/2010/wordprocessingDrawing" xmlns:wp="http://schemas.openxmlformats.org/drawingml/2006/wordprocessingDrawing" xmlns:w10="urn:schemas-microsoft-com:office:word" xmlns:w="http://schemas.openxmlformats.org/wordprocessingml/2006/main" xmlns:w14="http://schemas.microsoft.com/office/word/2010/wordml" xmlns:w15="http://schemas.microsoft.com/office/word/2012/wordml" xmlns:w16cex="http://schemas.microsoft.com/office/word/2018/wordml/cex" xmlns:w16cid="http://schemas.microsoft.com/office/word/2016/wordml/cid" xmlns:w16="http://schemas.microsoft.com/office/word/2018/wordml" xmlns:w16sdtdh="http://schemas.microsoft.com/office/word/2020/wordml/sdtdatahash" xmlns:w16se="http://schemas.microsoft.com/office/word/2015/wordml/symex" xmlns:wpg="http://schemas.microsoft.com/office/word/2010/wordprocessingGroup" xmlns:wpi="http://schemas.microsoft.com/office/word/2010/wordprocessingInk" xmlns:wne="http://schemas.microsoft.com/office/word/2006/wordml" xmlns:wps="http://schemas.microsoft.com/office/word/2010/wordprocessingShape" mc:Ignorable="w14 w15 w16se w16cid w16 w16cex w16sdtdh wp14">
+<w:hdr xmlns:wpc="http://schemas.microsoft.com/office/word/2010/wordprocessingCanvas" xmlns:cx="http://schemas.microsoft.com/office/drawing/2014/chartex" xmlns:cx1="http://schemas.microsoft.com/office/drawing/2015/9/8/chartex" xmlns:cx2="http://schemas.microsoft.com/office/drawing/2015/10/21/chartex" xmlns:cx3="http://schemas.microsoft.com/office/drawing/2016/5/9/chartex" xmlns:cx4="http://schemas.microsoft.com/office/drawing/2016/5/10/chartex" xmlns:cx5="http://schemas.microsoft.com/office/drawing/2016/5/11/chartex" xmlns:cx6="http://schemas.microsoft.com/office/drawing/2016/5/12/chartex" xmlns:cx7="http://schemas.microsoft.com/office/drawing/2016/5/13/chartex" xmlns:cx8="http://schemas.microsoft.com/office/drawing/2016/5/14/chartex" xmlns:mc="http://schemas.openxmlformats.org/markup-compatibility/2006" xmlns:aink="http://schemas.microsoft.com/office/drawing/2016/ink" xmlns:am3d="http://schemas.microsoft.com/office/drawing/2017/model3d" xmlns:o="urn:schemas-microsoft-com:office:office" xmlns:oel="http://schemas.microsoft.com/office/2019/extlst" xmlns:r="http://schemas.openxmlformats.org/officeDocument/2006/relationships" xmlns:m="http://schemas.openxmlformats.org/officeDocument/2006/math" xmlns:v="urn:schemas-microsoft-com:vml" xmlns:wp14="http://schemas.microsoft.com/office/word/2010/wordprocessingDrawing" xmlns:wp="http://schemas.openxmlformats.org/drawingml/2006/wordprocessingDrawing" xmlns:w10="urn:schemas-microsoft-com:office:word" xmlns:w="http://schemas.openxmlformats.org/wordprocessingml/2006/main" xmlns:w14="http://schemas.microsoft.com/office/word/2010/wordml" xmlns:w15="http://schemas.microsoft.com/office/word/2012/wordml" xmlns:w16cex="http://schemas.microsoft.com/office/word/2018/wordml/cex" xmlns:w16cid="http://schemas.microsoft.com/office/word/2016/wordml/cid" xmlns:w16="http://schemas.microsoft.com/office/word/2018/wordml" xmlns:w16du="http://schemas.microsoft.com/office/word/2023/wordml/word16du" xmlns:w16sdtdh="http://schemas.microsoft.com/office/word/2020/wordml/sdtdatahash" xmlns:w16sdtfl="http://schemas.microsoft.com/office/word/2024/wordml/sdtformatlock" xmlns:w16se="http://schemas.microsoft.com/office/word/2015/wordml/symex" xmlns:wpg="http://schemas.microsoft.com/office/word/2010/wordprocessingGroup" xmlns:wpi="http://schemas.microsoft.com/office/word/2010/wordprocessingInk" xmlns:wne="http://schemas.microsoft.com/office/word/2006/wordml" xmlns:wps="http://schemas.microsoft.com/office/word/2010/wordprocessingShape" mc:Ignorable="w14 w15 w16se w16cid w16 w16cex w16sdtdh w16sdtfl w16du wp14">
   <w:sdt>
     <w:sdtPr>
       <w:id w:val="-1484083713"/>
@@ -4515,7 +5201,7 @@
 </file>
 
 <file path=word/header4.xml><?xml version="1.0" encoding="utf-8"?>
-<w:hdr xmlns:wpc="http://schemas.microsoft.com/office/word/2010/wordprocessingCanvas" xmlns:cx="http://schemas.microsoft.com/office/drawing/2014/chartex" xmlns:cx1="http://schemas.microsoft.com/office/drawing/2015/9/8/chartex" xmlns:cx2="http://schemas.microsoft.com/office/drawing/2015/10/21/chartex" xmlns:cx3="http://schemas.microsoft.com/office/drawing/2016/5/9/chartex" xmlns:cx4="http://schemas.microsoft.com/office/drawing/2016/5/10/chartex" xmlns:cx5="http://schemas.microsoft.com/office/drawing/2016/5/11/chartex" xmlns:cx6="http://schemas.microsoft.com/office/drawing/2016/5/12/chartex" xmlns:cx7="http://schemas.microsoft.com/office/drawing/2016/5/13/chartex" xmlns:cx8="http://schemas.microsoft.com/office/drawing/2016/5/14/chartex" xmlns:mc="http://schemas.openxmlformats.org/markup-compatibility/2006" xmlns:aink="http://schemas.microsoft.com/office/drawing/2016/ink" xmlns:am3d="http://schemas.microsoft.com/office/drawing/2017/model3d" xmlns:o="urn:schemas-microsoft-com:office:office" xmlns:oel="http://schemas.microsoft.com/office/2019/extlst" xmlns:r="http://schemas.openxmlformats.org/officeDocument/2006/relationships" xmlns:m="http://schemas.openxmlformats.org/officeDocument/2006/math" xmlns:v="urn:schemas-microsoft-com:vml" xmlns:wp14="http://schemas.microsoft.com/office/word/2010/wordprocessingDrawing" xmlns:wp="http://schemas.openxmlformats.org/drawingml/2006/wordprocessingDrawing" xmlns:w10="urn:schemas-microsoft-com:office:word" xmlns:w="http://schemas.openxmlformats.org/wordprocessingml/2006/main" xmlns:w14="http://schemas.microsoft.com/office/word/2010/wordml" xmlns:w15="http://schemas.microsoft.com/office/word/2012/wordml" xmlns:w16cex="http://schemas.microsoft.com/office/word/2018/wordml/cex" xmlns:w16cid="http://schemas.microsoft.com/office/word/2016/wordml/cid" xmlns:w16="http://schemas.microsoft.com/office/word/2018/wordml" xmlns:w16sdtdh="http://schemas.microsoft.com/office/word/2020/wordml/sdtdatahash" xmlns:w16se="http://schemas.microsoft.com/office/word/2015/wordml/symex" xmlns:wpg="http://schemas.microsoft.com/office/word/2010/wordprocessingGroup" xmlns:wpi="http://schemas.microsoft.com/office/word/2010/wordprocessingInk" xmlns:wne="http://schemas.microsoft.com/office/word/2006/wordml" xmlns:wps="http://schemas.microsoft.com/office/word/2010/wordprocessingShape" mc:Ignorable="w14 w15 w16se w16cid w16 w16cex w16sdtdh wp14">
+<w:hdr xmlns:wpc="http://schemas.microsoft.com/office/word/2010/wordprocessingCanvas" xmlns:cx="http://schemas.microsoft.com/office/drawing/2014/chartex" xmlns:cx1="http://schemas.microsoft.com/office/drawing/2015/9/8/chartex" xmlns:cx2="http://schemas.microsoft.com/office/drawing/2015/10/21/chartex" xmlns:cx3="http://schemas.microsoft.com/office/drawing/2016/5/9/chartex" xmlns:cx4="http://schemas.microsoft.com/office/drawing/2016/5/10/chartex" xmlns:cx5="http://schemas.microsoft.com/office/drawing/2016/5/11/chartex" xmlns:cx6="http://schemas.microsoft.com/office/drawing/2016/5/12/chartex" xmlns:cx7="http://schemas.microsoft.com/office/drawing/2016/5/13/chartex" xmlns:cx8="http://schemas.microsoft.com/office/drawing/2016/5/14/chartex" xmlns:mc="http://schemas.openxmlformats.org/markup-compatibility/2006" xmlns:aink="http://schemas.microsoft.com/office/drawing/2016/ink" xmlns:am3d="http://schemas.microsoft.com/office/drawing/2017/model3d" xmlns:o="urn:schemas-microsoft-com:office:office" xmlns:oel="http://schemas.microsoft.com/office/2019/extlst" xmlns:r="http://schemas.openxmlformats.org/officeDocument/2006/relationships" xmlns:m="http://schemas.openxmlformats.org/officeDocument/2006/math" xmlns:v="urn:schemas-microsoft-com:vml" xmlns:wp14="http://schemas.microsoft.com/office/word/2010/wordprocessingDrawing" xmlns:wp="http://schemas.openxmlformats.org/drawingml/2006/wordprocessingDrawing" xmlns:w10="urn:schemas-microsoft-com:office:word" xmlns:w="http://schemas.openxmlformats.org/wordprocessingml/2006/main" xmlns:w14="http://schemas.microsoft.com/office/word/2010/wordml" xmlns:w15="http://schemas.microsoft.com/office/word/2012/wordml" xmlns:w16cex="http://schemas.microsoft.com/office/word/2018/wordml/cex" xmlns:w16cid="http://schemas.microsoft.com/office/word/2016/wordml/cid" xmlns:w16="http://schemas.microsoft.com/office/word/2018/wordml" xmlns:w16du="http://schemas.microsoft.com/office/word/2023/wordml/word16du" xmlns:w16sdtdh="http://schemas.microsoft.com/office/word/2020/wordml/sdtdatahash" xmlns:w16sdtfl="http://schemas.microsoft.com/office/word/2024/wordml/sdtformatlock" xmlns:w16se="http://schemas.microsoft.com/office/word/2015/wordml/symex" xmlns:wpg="http://schemas.microsoft.com/office/word/2010/wordprocessingGroup" xmlns:wpi="http://schemas.microsoft.com/office/word/2010/wordprocessingInk" xmlns:wne="http://schemas.microsoft.com/office/word/2006/wordml" xmlns:wps="http://schemas.microsoft.com/office/word/2010/wordprocessingShape" mc:Ignorable="w14 w15 w16se w16cid w16 w16cex w16sdtdh w16sdtfl w16du wp14">
   <w:sdt>
     <w:sdtPr>
       <w:id w:val="-139118505"/>
@@ -4561,7 +5247,7 @@
 </file>
 
 <file path=word/numbering.xml><?xml version="1.0" encoding="utf-8"?>
-<w:numbering xmlns:wpc="http://schemas.microsoft.com/office/word/2010/wordprocessingCanvas" xmlns:cx="http://schemas.microsoft.com/office/drawing/2014/chartex" xmlns:cx1="http://schemas.microsoft.com/office/drawing/2015/9/8/chartex" xmlns:cx2="http://schemas.microsoft.com/office/drawing/2015/10/21/chartex" xmlns:cx3="http://schemas.microsoft.com/office/drawing/2016/5/9/chartex" xmlns:cx4="http://schemas.microsoft.com/office/drawing/2016/5/10/chartex" xmlns:cx5="http://schemas.microsoft.com/office/drawing/2016/5/11/chartex" xmlns:cx6="http://schemas.microsoft.com/office/drawing/2016/5/12/chartex" xmlns:cx7="http://schemas.microsoft.com/office/drawing/2016/5/13/chartex" xmlns:cx8="http://schemas.microsoft.com/office/drawing/2016/5/14/chartex" xmlns:mc="http://schemas.openxmlformats.org/markup-compatibility/2006" xmlns:aink="http://schemas.microsoft.com/office/drawing/2016/ink" xmlns:am3d="http://schemas.microsoft.com/office/drawing/2017/model3d" xmlns:o="urn:schemas-microsoft-com:office:office" xmlns:oel="http://schemas.microsoft.com/office/2019/extlst" xmlns:r="http://schemas.openxmlformats.org/officeDocument/2006/relationships" xmlns:m="http://schemas.openxmlformats.org/officeDocument/2006/math" xmlns:v="urn:schemas-microsoft-com:vml" xmlns:wp14="http://schemas.microsoft.com/office/word/2010/wordprocessingDrawing" xmlns:wp="http://schemas.openxmlformats.org/drawingml/2006/wordprocessingDrawing" xmlns:w10="urn:schemas-microsoft-com:office:word" xmlns:w="http://schemas.openxmlformats.org/wordprocessingml/2006/main" xmlns:w14="http://schemas.microsoft.com/office/word/2010/wordml" xmlns:w15="http://schemas.microsoft.com/office/word/2012/wordml" xmlns:w16cex="http://schemas.microsoft.com/office/word/2018/wordml/cex" xmlns:w16cid="http://schemas.microsoft.com/office/word/2016/wordml/cid" xmlns:w16="http://schemas.microsoft.com/office/word/2018/wordml" xmlns:w16sdtdh="http://schemas.microsoft.com/office/word/2020/wordml/sdtdatahash" xmlns:w16se="http://schemas.microsoft.com/office/word/2015/wordml/symex" xmlns:wpg="http://schemas.microsoft.com/office/word/2010/wordprocessingGroup" xmlns:wpi="http://schemas.microsoft.com/office/word/2010/wordprocessingInk" xmlns:wne="http://schemas.microsoft.com/office/word/2006/wordml" xmlns:wps="http://schemas.microsoft.com/office/word/2010/wordprocessingShape" mc:Ignorable="w14 w15 w16se w16cid w16 w16cex w16sdtdh wp14">
+<w:numbering xmlns:wpc="http://schemas.microsoft.com/office/word/2010/wordprocessingCanvas" xmlns:cx="http://schemas.microsoft.com/office/drawing/2014/chartex" xmlns:cx1="http://schemas.microsoft.com/office/drawing/2015/9/8/chartex" xmlns:cx2="http://schemas.microsoft.com/office/drawing/2015/10/21/chartex" xmlns:cx3="http://schemas.microsoft.com/office/drawing/2016/5/9/chartex" xmlns:cx4="http://schemas.microsoft.com/office/drawing/2016/5/10/chartex" xmlns:cx5="http://schemas.microsoft.com/office/drawing/2016/5/11/chartex" xmlns:cx6="http://schemas.microsoft.com/office/drawing/2016/5/12/chartex" xmlns:cx7="http://schemas.microsoft.com/office/drawing/2016/5/13/chartex" xmlns:cx8="http://schemas.microsoft.com/office/drawing/2016/5/14/chartex" xmlns:mc="http://schemas.openxmlformats.org/markup-compatibility/2006" xmlns:aink="http://schemas.microsoft.com/office/drawing/2016/ink" xmlns:am3d="http://schemas.microsoft.com/office/drawing/2017/model3d" xmlns:o="urn:schemas-microsoft-com:office:office" xmlns:oel="http://schemas.microsoft.com/office/2019/extlst" xmlns:r="http://schemas.openxmlformats.org/officeDocument/2006/relationships" xmlns:m="http://schemas.openxmlformats.org/officeDocument/2006/math" xmlns:v="urn:schemas-microsoft-com:vml" xmlns:wp14="http://schemas.microsoft.com/office/word/2010/wordprocessingDrawing" xmlns:wp="http://schemas.openxmlformats.org/drawingml/2006/wordprocessingDrawing" xmlns:w10="urn:schemas-microsoft-com:office:word" xmlns:w="http://schemas.openxmlformats.org/wordprocessingml/2006/main" xmlns:w14="http://schemas.microsoft.com/office/word/2010/wordml" xmlns:w15="http://schemas.microsoft.com/office/word/2012/wordml" xmlns:w16cex="http://schemas.microsoft.com/office/word/2018/wordml/cex" xmlns:w16cid="http://schemas.microsoft.com/office/word/2016/wordml/cid" xmlns:w16="http://schemas.microsoft.com/office/word/2018/wordml" xmlns:w16du="http://schemas.microsoft.com/office/word/2023/wordml/word16du" xmlns:w16sdtdh="http://schemas.microsoft.com/office/word/2020/wordml/sdtdatahash" xmlns:w16sdtfl="http://schemas.microsoft.com/office/word/2024/wordml/sdtformatlock" xmlns:w16se="http://schemas.microsoft.com/office/word/2015/wordml/symex" xmlns:wpg="http://schemas.microsoft.com/office/word/2010/wordprocessingGroup" xmlns:wpi="http://schemas.microsoft.com/office/word/2010/wordprocessingInk" xmlns:wne="http://schemas.microsoft.com/office/word/2006/wordml" xmlns:wps="http://schemas.microsoft.com/office/word/2010/wordprocessingShape" mc:Ignorable="w14 w15 w16se w16cid w16 w16cex w16sdtdh w16sdtfl w16du wp14">
   <w:abstractNum w:abstractNumId="0" w15:restartNumberingAfterBreak="0">
     <w:nsid w:val="14151BD6"/>
     <w:multiLevelType w:val="hybridMultilevel"/>
@@ -4762,95 +5448,9 @@
     </w:lvl>
   </w:abstractNum>
   <w:abstractNum w:abstractNumId="2" w15:restartNumberingAfterBreak="0">
-    <w:nsid w:val="4EBE21F7"/>
+    <w:nsid w:val="3B9460BF"/>
     <w:multiLevelType w:val="hybridMultilevel"/>
-    <w:tmpl w:val="0AE43FAE"/>
-    <w:lvl w:ilvl="0" w:tplc="FFFFFFFF">
-      <w:start w:val="1"/>
-      <w:numFmt w:val="decimal"/>
-      <w:lvlText w:val="%1."/>
-      <w:lvlJc w:val="left"/>
-      <w:pPr>
-        <w:ind w:left="720" w:hanging="360"/>
-      </w:pPr>
-    </w:lvl>
-    <w:lvl w:ilvl="1" w:tplc="FFFFFFFF">
-      <w:start w:val="1"/>
-      <w:numFmt w:val="lowerLetter"/>
-      <w:lvlText w:val="%2."/>
-      <w:lvlJc w:val="left"/>
-      <w:pPr>
-        <w:ind w:left="1440" w:hanging="360"/>
-      </w:pPr>
-    </w:lvl>
-    <w:lvl w:ilvl="2" w:tplc="FFFFFFFF">
-      <w:start w:val="1"/>
-      <w:numFmt w:val="lowerRoman"/>
-      <w:lvlText w:val="%3."/>
-      <w:lvlJc w:val="right"/>
-      <w:pPr>
-        <w:ind w:left="2160" w:hanging="180"/>
-      </w:pPr>
-    </w:lvl>
-    <w:lvl w:ilvl="3" w:tplc="FFFFFFFF" w:tentative="1">
-      <w:start w:val="1"/>
-      <w:numFmt w:val="decimal"/>
-      <w:lvlText w:val="%4."/>
-      <w:lvlJc w:val="left"/>
-      <w:pPr>
-        <w:ind w:left="2880" w:hanging="360"/>
-      </w:pPr>
-    </w:lvl>
-    <w:lvl w:ilvl="4" w:tplc="FFFFFFFF" w:tentative="1">
-      <w:start w:val="1"/>
-      <w:numFmt w:val="lowerLetter"/>
-      <w:lvlText w:val="%5."/>
-      <w:lvlJc w:val="left"/>
-      <w:pPr>
-        <w:ind w:left="3600" w:hanging="360"/>
-      </w:pPr>
-    </w:lvl>
-    <w:lvl w:ilvl="5" w:tplc="FFFFFFFF" w:tentative="1">
-      <w:start w:val="1"/>
-      <w:numFmt w:val="lowerRoman"/>
-      <w:lvlText w:val="%6."/>
-      <w:lvlJc w:val="right"/>
-      <w:pPr>
-        <w:ind w:left="4320" w:hanging="180"/>
-      </w:pPr>
-    </w:lvl>
-    <w:lvl w:ilvl="6" w:tplc="FFFFFFFF" w:tentative="1">
-      <w:start w:val="1"/>
-      <w:numFmt w:val="decimal"/>
-      <w:lvlText w:val="%7."/>
-      <w:lvlJc w:val="left"/>
-      <w:pPr>
-        <w:ind w:left="5040" w:hanging="360"/>
-      </w:pPr>
-    </w:lvl>
-    <w:lvl w:ilvl="7" w:tplc="FFFFFFFF" w:tentative="1">
-      <w:start w:val="1"/>
-      <w:numFmt w:val="lowerLetter"/>
-      <w:lvlText w:val="%8."/>
-      <w:lvlJc w:val="left"/>
-      <w:pPr>
-        <w:ind w:left="5760" w:hanging="360"/>
-      </w:pPr>
-    </w:lvl>
-    <w:lvl w:ilvl="8" w:tplc="FFFFFFFF" w:tentative="1">
-      <w:start w:val="1"/>
-      <w:numFmt w:val="lowerRoman"/>
-      <w:lvlText w:val="%9."/>
-      <w:lvlJc w:val="right"/>
-      <w:pPr>
-        <w:ind w:left="6480" w:hanging="180"/>
-      </w:pPr>
-    </w:lvl>
-  </w:abstractNum>
-  <w:abstractNum w:abstractNumId="3" w15:restartNumberingAfterBreak="0">
-    <w:nsid w:val="6DF926CF"/>
-    <w:multiLevelType w:val="hybridMultilevel"/>
-    <w:tmpl w:val="08B0CCF8"/>
+    <w:tmpl w:val="B5A4D66A"/>
     <w:lvl w:ilvl="0" w:tplc="04090001">
       <w:start w:val="1"/>
       <w:numFmt w:val="bullet"/>
@@ -4960,10 +5560,182 @@
       </w:rPr>
     </w:lvl>
   </w:abstractNum>
+  <w:abstractNum w:abstractNumId="3" w15:restartNumberingAfterBreak="0">
+    <w:nsid w:val="43B83B4D"/>
+    <w:multiLevelType w:val="hybridMultilevel"/>
+    <w:tmpl w:val="5CC66BDE"/>
+    <w:lvl w:ilvl="0" w:tplc="440A000F">
+      <w:start w:val="1"/>
+      <w:numFmt w:val="decimal"/>
+      <w:lvlText w:val="%1."/>
+      <w:lvlJc w:val="left"/>
+      <w:pPr>
+        <w:ind w:left="720" w:hanging="360"/>
+      </w:pPr>
+    </w:lvl>
+    <w:lvl w:ilvl="1" w:tplc="440A0019" w:tentative="1">
+      <w:start w:val="1"/>
+      <w:numFmt w:val="lowerLetter"/>
+      <w:lvlText w:val="%2."/>
+      <w:lvlJc w:val="left"/>
+      <w:pPr>
+        <w:ind w:left="1440" w:hanging="360"/>
+      </w:pPr>
+    </w:lvl>
+    <w:lvl w:ilvl="2" w:tplc="440A001B" w:tentative="1">
+      <w:start w:val="1"/>
+      <w:numFmt w:val="lowerRoman"/>
+      <w:lvlText w:val="%3."/>
+      <w:lvlJc w:val="right"/>
+      <w:pPr>
+        <w:ind w:left="2160" w:hanging="180"/>
+      </w:pPr>
+    </w:lvl>
+    <w:lvl w:ilvl="3" w:tplc="440A000F" w:tentative="1">
+      <w:start w:val="1"/>
+      <w:numFmt w:val="decimal"/>
+      <w:lvlText w:val="%4."/>
+      <w:lvlJc w:val="left"/>
+      <w:pPr>
+        <w:ind w:left="2880" w:hanging="360"/>
+      </w:pPr>
+    </w:lvl>
+    <w:lvl w:ilvl="4" w:tplc="440A0019" w:tentative="1">
+      <w:start w:val="1"/>
+      <w:numFmt w:val="lowerLetter"/>
+      <w:lvlText w:val="%5."/>
+      <w:lvlJc w:val="left"/>
+      <w:pPr>
+        <w:ind w:left="3600" w:hanging="360"/>
+      </w:pPr>
+    </w:lvl>
+    <w:lvl w:ilvl="5" w:tplc="440A001B" w:tentative="1">
+      <w:start w:val="1"/>
+      <w:numFmt w:val="lowerRoman"/>
+      <w:lvlText w:val="%6."/>
+      <w:lvlJc w:val="right"/>
+      <w:pPr>
+        <w:ind w:left="4320" w:hanging="180"/>
+      </w:pPr>
+    </w:lvl>
+    <w:lvl w:ilvl="6" w:tplc="440A000F" w:tentative="1">
+      <w:start w:val="1"/>
+      <w:numFmt w:val="decimal"/>
+      <w:lvlText w:val="%7."/>
+      <w:lvlJc w:val="left"/>
+      <w:pPr>
+        <w:ind w:left="5040" w:hanging="360"/>
+      </w:pPr>
+    </w:lvl>
+    <w:lvl w:ilvl="7" w:tplc="440A0019" w:tentative="1">
+      <w:start w:val="1"/>
+      <w:numFmt w:val="lowerLetter"/>
+      <w:lvlText w:val="%8."/>
+      <w:lvlJc w:val="left"/>
+      <w:pPr>
+        <w:ind w:left="5760" w:hanging="360"/>
+      </w:pPr>
+    </w:lvl>
+    <w:lvl w:ilvl="8" w:tplc="440A001B" w:tentative="1">
+      <w:start w:val="1"/>
+      <w:numFmt w:val="lowerRoman"/>
+      <w:lvlText w:val="%9."/>
+      <w:lvlJc w:val="right"/>
+      <w:pPr>
+        <w:ind w:left="6480" w:hanging="180"/>
+      </w:pPr>
+    </w:lvl>
+  </w:abstractNum>
   <w:abstractNum w:abstractNumId="4" w15:restartNumberingAfterBreak="0">
-    <w:nsid w:val="73776FBC"/>
+    <w:nsid w:val="4EBE21F7"/>
     <w:multiLevelType w:val="hybridMultilevel"/>
-    <w:tmpl w:val="A48E68F8"/>
+    <w:tmpl w:val="0AE43FAE"/>
+    <w:lvl w:ilvl="0" w:tplc="FFFFFFFF">
+      <w:start w:val="1"/>
+      <w:numFmt w:val="decimal"/>
+      <w:lvlText w:val="%1."/>
+      <w:lvlJc w:val="left"/>
+      <w:pPr>
+        <w:ind w:left="720" w:hanging="360"/>
+      </w:pPr>
+    </w:lvl>
+    <w:lvl w:ilvl="1" w:tplc="FFFFFFFF">
+      <w:start w:val="1"/>
+      <w:numFmt w:val="lowerLetter"/>
+      <w:lvlText w:val="%2."/>
+      <w:lvlJc w:val="left"/>
+      <w:pPr>
+        <w:ind w:left="1440" w:hanging="360"/>
+      </w:pPr>
+    </w:lvl>
+    <w:lvl w:ilvl="2" w:tplc="FFFFFFFF">
+      <w:start w:val="1"/>
+      <w:numFmt w:val="lowerRoman"/>
+      <w:lvlText w:val="%3."/>
+      <w:lvlJc w:val="right"/>
+      <w:pPr>
+        <w:ind w:left="2160" w:hanging="180"/>
+      </w:pPr>
+    </w:lvl>
+    <w:lvl w:ilvl="3" w:tplc="FFFFFFFF" w:tentative="1">
+      <w:start w:val="1"/>
+      <w:numFmt w:val="decimal"/>
+      <w:lvlText w:val="%4."/>
+      <w:lvlJc w:val="left"/>
+      <w:pPr>
+        <w:ind w:left="2880" w:hanging="360"/>
+      </w:pPr>
+    </w:lvl>
+    <w:lvl w:ilvl="4" w:tplc="FFFFFFFF" w:tentative="1">
+      <w:start w:val="1"/>
+      <w:numFmt w:val="lowerLetter"/>
+      <w:lvlText w:val="%5."/>
+      <w:lvlJc w:val="left"/>
+      <w:pPr>
+        <w:ind w:left="3600" w:hanging="360"/>
+      </w:pPr>
+    </w:lvl>
+    <w:lvl w:ilvl="5" w:tplc="FFFFFFFF" w:tentative="1">
+      <w:start w:val="1"/>
+      <w:numFmt w:val="lowerRoman"/>
+      <w:lvlText w:val="%6."/>
+      <w:lvlJc w:val="right"/>
+      <w:pPr>
+        <w:ind w:left="4320" w:hanging="180"/>
+      </w:pPr>
+    </w:lvl>
+    <w:lvl w:ilvl="6" w:tplc="FFFFFFFF" w:tentative="1">
+      <w:start w:val="1"/>
+      <w:numFmt w:val="decimal"/>
+      <w:lvlText w:val="%7."/>
+      <w:lvlJc w:val="left"/>
+      <w:pPr>
+        <w:ind w:left="5040" w:hanging="360"/>
+      </w:pPr>
+    </w:lvl>
+    <w:lvl w:ilvl="7" w:tplc="FFFFFFFF" w:tentative="1">
+      <w:start w:val="1"/>
+      <w:numFmt w:val="lowerLetter"/>
+      <w:lvlText w:val="%8."/>
+      <w:lvlJc w:val="left"/>
+      <w:pPr>
+        <w:ind w:left="5760" w:hanging="360"/>
+      </w:pPr>
+    </w:lvl>
+    <w:lvl w:ilvl="8" w:tplc="FFFFFFFF" w:tentative="1">
+      <w:start w:val="1"/>
+      <w:numFmt w:val="lowerRoman"/>
+      <w:lvlText w:val="%9."/>
+      <w:lvlJc w:val="right"/>
+      <w:pPr>
+        <w:ind w:left="6480" w:hanging="180"/>
+      </w:pPr>
+    </w:lvl>
+  </w:abstractNum>
+  <w:abstractNum w:abstractNumId="5" w15:restartNumberingAfterBreak="0">
+    <w:nsid w:val="6DF926CF"/>
+    <w:multiLevelType w:val="hybridMultilevel"/>
+    <w:tmpl w:val="08B0CCF8"/>
     <w:lvl w:ilvl="0" w:tplc="04090001">
       <w:start w:val="1"/>
       <w:numFmt w:val="bullet"/>
@@ -5073,7 +5845,120 @@
       </w:rPr>
     </w:lvl>
   </w:abstractNum>
-  <w:abstractNum w:abstractNumId="5" w15:restartNumberingAfterBreak="0">
+  <w:abstractNum w:abstractNumId="6" w15:restartNumberingAfterBreak="0">
+    <w:nsid w:val="73776FBC"/>
+    <w:multiLevelType w:val="hybridMultilevel"/>
+    <w:tmpl w:val="A48E68F8"/>
+    <w:lvl w:ilvl="0" w:tplc="04090001">
+      <w:start w:val="1"/>
+      <w:numFmt w:val="bullet"/>
+      <w:lvlText w:val=""/>
+      <w:lvlJc w:val="left"/>
+      <w:pPr>
+        <w:ind w:left="720" w:hanging="360"/>
+      </w:pPr>
+      <w:rPr>
+        <w:rFonts w:ascii="Symbol" w:hAnsi="Symbol" w:hint="default"/>
+      </w:rPr>
+    </w:lvl>
+    <w:lvl w:ilvl="1" w:tplc="04090003" w:tentative="1">
+      <w:start w:val="1"/>
+      <w:numFmt w:val="bullet"/>
+      <w:lvlText w:val="o"/>
+      <w:lvlJc w:val="left"/>
+      <w:pPr>
+        <w:ind w:left="1440" w:hanging="360"/>
+      </w:pPr>
+      <w:rPr>
+        <w:rFonts w:ascii="Courier New" w:hAnsi="Courier New" w:cs="Courier New" w:hint="default"/>
+      </w:rPr>
+    </w:lvl>
+    <w:lvl w:ilvl="2" w:tplc="04090005" w:tentative="1">
+      <w:start w:val="1"/>
+      <w:numFmt w:val="bullet"/>
+      <w:lvlText w:val=""/>
+      <w:lvlJc w:val="left"/>
+      <w:pPr>
+        <w:ind w:left="2160" w:hanging="360"/>
+      </w:pPr>
+      <w:rPr>
+        <w:rFonts w:ascii="Wingdings" w:hAnsi="Wingdings" w:hint="default"/>
+      </w:rPr>
+    </w:lvl>
+    <w:lvl w:ilvl="3" w:tplc="04090001" w:tentative="1">
+      <w:start w:val="1"/>
+      <w:numFmt w:val="bullet"/>
+      <w:lvlText w:val=""/>
+      <w:lvlJc w:val="left"/>
+      <w:pPr>
+        <w:ind w:left="2880" w:hanging="360"/>
+      </w:pPr>
+      <w:rPr>
+        <w:rFonts w:ascii="Symbol" w:hAnsi="Symbol" w:hint="default"/>
+      </w:rPr>
+    </w:lvl>
+    <w:lvl w:ilvl="4" w:tplc="04090003" w:tentative="1">
+      <w:start w:val="1"/>
+      <w:numFmt w:val="bullet"/>
+      <w:lvlText w:val="o"/>
+      <w:lvlJc w:val="left"/>
+      <w:pPr>
+        <w:ind w:left="3600" w:hanging="360"/>
+      </w:pPr>
+      <w:rPr>
+        <w:rFonts w:ascii="Courier New" w:hAnsi="Courier New" w:cs="Courier New" w:hint="default"/>
+      </w:rPr>
+    </w:lvl>
+    <w:lvl w:ilvl="5" w:tplc="04090005" w:tentative="1">
+      <w:start w:val="1"/>
+      <w:numFmt w:val="bullet"/>
+      <w:lvlText w:val=""/>
+      <w:lvlJc w:val="left"/>
+      <w:pPr>
+        <w:ind w:left="4320" w:hanging="360"/>
+      </w:pPr>
+      <w:rPr>
+        <w:rFonts w:ascii="Wingdings" w:hAnsi="Wingdings" w:hint="default"/>
+      </w:rPr>
+    </w:lvl>
+    <w:lvl w:ilvl="6" w:tplc="04090001" w:tentative="1">
+      <w:start w:val="1"/>
+      <w:numFmt w:val="bullet"/>
+      <w:lvlText w:val=""/>
+      <w:lvlJc w:val="left"/>
+      <w:pPr>
+        <w:ind w:left="5040" w:hanging="360"/>
+      </w:pPr>
+      <w:rPr>
+        <w:rFonts w:ascii="Symbol" w:hAnsi="Symbol" w:hint="default"/>
+      </w:rPr>
+    </w:lvl>
+    <w:lvl w:ilvl="7" w:tplc="04090003" w:tentative="1">
+      <w:start w:val="1"/>
+      <w:numFmt w:val="bullet"/>
+      <w:lvlText w:val="o"/>
+      <w:lvlJc w:val="left"/>
+      <w:pPr>
+        <w:ind w:left="5760" w:hanging="360"/>
+      </w:pPr>
+      <w:rPr>
+        <w:rFonts w:ascii="Courier New" w:hAnsi="Courier New" w:cs="Courier New" w:hint="default"/>
+      </w:rPr>
+    </w:lvl>
+    <w:lvl w:ilvl="8" w:tplc="04090005" w:tentative="1">
+      <w:start w:val="1"/>
+      <w:numFmt w:val="bullet"/>
+      <w:lvlText w:val=""/>
+      <w:lvlJc w:val="left"/>
+      <w:pPr>
+        <w:ind w:left="6480" w:hanging="360"/>
+      </w:pPr>
+      <w:rPr>
+        <w:rFonts w:ascii="Wingdings" w:hAnsi="Wingdings" w:hint="default"/>
+      </w:rPr>
+    </w:lvl>
+  </w:abstractNum>
+  <w:abstractNum w:abstractNumId="7" w15:restartNumberingAfterBreak="0">
     <w:nsid w:val="76C25579"/>
     <w:multiLevelType w:val="hybridMultilevel"/>
     <w:tmpl w:val="B1802E90"/>
@@ -5160,10 +6045,10 @@
     </w:lvl>
   </w:abstractNum>
   <w:num w:numId="1" w16cid:durableId="1467505533">
-    <w:abstractNumId w:val="3"/>
+    <w:abstractNumId w:val="5"/>
   </w:num>
   <w:num w:numId="2" w16cid:durableId="1702051499">
-    <w:abstractNumId w:val="4"/>
+    <w:abstractNumId w:val="6"/>
   </w:num>
   <w:num w:numId="3" w16cid:durableId="666833500">
     <w:abstractNumId w:val="0"/>
@@ -5172,16 +6057,22 @@
     <w:abstractNumId w:val="1"/>
   </w:num>
   <w:num w:numId="5" w16cid:durableId="307367556">
+    <w:abstractNumId w:val="4"/>
+  </w:num>
+  <w:num w:numId="6" w16cid:durableId="2040011748">
+    <w:abstractNumId w:val="7"/>
+  </w:num>
+  <w:num w:numId="7" w16cid:durableId="34238990">
     <w:abstractNumId w:val="2"/>
   </w:num>
-  <w:num w:numId="6" w16cid:durableId="2040011748">
-    <w:abstractNumId w:val="5"/>
+  <w:num w:numId="8" w16cid:durableId="234514778">
+    <w:abstractNumId w:val="3"/>
   </w:num>
 </w:numbering>
 </file>
 
 <file path=word/styles.xml><?xml version="1.0" encoding="utf-8"?>
-<w:styles xmlns:mc="http://schemas.openxmlformats.org/markup-compatibility/2006" xmlns:r="http://schemas.openxmlformats.org/officeDocument/2006/relationships" xmlns:w="http://schemas.openxmlformats.org/wordprocessingml/2006/main" xmlns:w14="http://schemas.microsoft.com/office/word/2010/wordml" xmlns:w15="http://schemas.microsoft.com/office/word/2012/wordml" xmlns:w16cex="http://schemas.microsoft.com/office/word/2018/wordml/cex" xmlns:w16cid="http://schemas.microsoft.com/office/word/2016/wordml/cid" xmlns:w16="http://schemas.microsoft.com/office/word/2018/wordml" xmlns:w16sdtdh="http://schemas.microsoft.com/office/word/2020/wordml/sdtdatahash" xmlns:w16se="http://schemas.microsoft.com/office/word/2015/wordml/symex" mc:Ignorable="w14 w15 w16se w16cid w16 w16cex w16sdtdh">
+<w:styles xmlns:mc="http://schemas.openxmlformats.org/markup-compatibility/2006" xmlns:r="http://schemas.openxmlformats.org/officeDocument/2006/relationships" xmlns:w="http://schemas.openxmlformats.org/wordprocessingml/2006/main" xmlns:w14="http://schemas.microsoft.com/office/word/2010/wordml" xmlns:w15="http://schemas.microsoft.com/office/word/2012/wordml" xmlns:w16cex="http://schemas.microsoft.com/office/word/2018/wordml/cex" xmlns:w16cid="http://schemas.microsoft.com/office/word/2016/wordml/cid" xmlns:w16="http://schemas.microsoft.com/office/word/2018/wordml" xmlns:w16du="http://schemas.microsoft.com/office/word/2023/wordml/word16du" xmlns:w16sdtdh="http://schemas.microsoft.com/office/word/2020/wordml/sdtdatahash" xmlns:w16sdtfl="http://schemas.microsoft.com/office/word/2024/wordml/sdtformatlock" xmlns:w16se="http://schemas.microsoft.com/office/word/2015/wordml/symex" mc:Ignorable="w14 w15 w16se w16cid w16 w16cex w16sdtdh w16sdtfl w16du">
   <w:docDefaults>
     <w:rPrDefault>
       <w:rPr>
@@ -6292,6 +7183,45 @@
       <w:shd w:val="clear" w:color="auto" w:fill="E1DFDD"/>
     </w:rPr>
   </w:style>
+  <w:style w:type="paragraph" w:styleId="Textonotapie">
+    <w:name w:val="footnote text"/>
+    <w:basedOn w:val="Normal"/>
+    <w:link w:val="TextonotapieCar"/>
+    <w:uiPriority w:val="99"/>
+    <w:semiHidden/>
+    <w:unhideWhenUsed/>
+    <w:rsid w:val="00C94EB4"/>
+    <w:pPr>
+      <w:spacing w:after="0" w:line="240" w:lineRule="auto"/>
+    </w:pPr>
+    <w:rPr>
+      <w:sz w:val="20"/>
+      <w:szCs w:val="20"/>
+    </w:rPr>
+  </w:style>
+  <w:style w:type="character" w:customStyle="1" w:styleId="TextonotapieCar">
+    <w:name w:val="Texto nota pie Car"/>
+    <w:basedOn w:val="Fuentedeprrafopredeter"/>
+    <w:link w:val="Textonotapie"/>
+    <w:uiPriority w:val="99"/>
+    <w:semiHidden/>
+    <w:rsid w:val="00C94EB4"/>
+    <w:rPr>
+      <w:sz w:val="20"/>
+      <w:szCs w:val="20"/>
+    </w:rPr>
+  </w:style>
+  <w:style w:type="character" w:styleId="Refdenotaalpie">
+    <w:name w:val="footnote reference"/>
+    <w:basedOn w:val="Fuentedeprrafopredeter"/>
+    <w:uiPriority w:val="99"/>
+    <w:semiHidden/>
+    <w:unhideWhenUsed/>
+    <w:rsid w:val="00C94EB4"/>
+    <w:rPr>
+      <w:vertAlign w:val="superscript"/>
+    </w:rPr>
+  </w:style>
 </w:styles>
 </file>
 

</xml_diff>

<commit_message>
Docs: Cambios en diagnostico del proceso
Pequeños cambios en diagnostico del proceso, se agregaron  debilidades del proceso identificadas según enfoque CMMI  y cambios en conclusión del diagnostico.
</commit_message>
<xml_diff>
--- a/docs/entrega2/EPRO_Entrega2_Grupo9_Plataforma de gestión documental con versiones.docx
+++ b/docs/entrega2/EPRO_Entrega2_Grupo9_Plataforma de gestión documental con versiones.docx
@@ -552,7 +552,6 @@
                 <w:szCs w:val="24"/>
               </w:rPr>
             </w:pPr>
-            <w:proofErr w:type="spellStart"/>
             <w:r>
               <w:rPr>
                 <w:rFonts w:ascii="Arial" w:eastAsia="Calibri" w:hAnsi="Arial" w:cs="Arial"/>
@@ -561,18 +560,7 @@
                 <w:sz w:val="24"/>
                 <w:szCs w:val="24"/>
               </w:rPr>
-              <w:t>Alumnos</w:t>
-            </w:r>
-            <w:proofErr w:type="spellEnd"/>
-            <w:r>
-              <w:rPr>
-                <w:rFonts w:ascii="Arial" w:eastAsia="Calibri" w:hAnsi="Arial" w:cs="Arial"/>
-                <w:b/>
-                <w:bCs/>
-                <w:sz w:val="24"/>
-                <w:szCs w:val="24"/>
-              </w:rPr>
-              <w:t>:</w:t>
+              <w:t>Alumnos:</w:t>
             </w:r>
           </w:p>
         </w:tc>
@@ -844,7 +832,28 @@
                 <w:rFonts w:ascii="Arial" w:eastAsia="Calibri" w:hAnsi="Arial" w:cs="Arial"/>
                 <w:sz w:val="24"/>
               </w:rPr>
-              <w:t>César Orlando Morales López</w:t>
+              <w:t>Morales López</w:t>
+            </w:r>
+            <w:r>
+              <w:rPr>
+                <w:rFonts w:ascii="Arial" w:eastAsia="Calibri" w:hAnsi="Arial" w:cs="Arial"/>
+                <w:sz w:val="24"/>
+              </w:rPr>
+              <w:t xml:space="preserve"> </w:t>
+            </w:r>
+            <w:r>
+              <w:rPr>
+                <w:rFonts w:ascii="Arial" w:eastAsia="Calibri" w:hAnsi="Arial" w:cs="Arial"/>
+                <w:sz w:val="24"/>
+              </w:rPr>
+              <w:t xml:space="preserve"> </w:t>
+            </w:r>
+            <w:r>
+              <w:rPr>
+                <w:rFonts w:ascii="Arial" w:eastAsia="Calibri" w:hAnsi="Arial" w:cs="Arial"/>
+                <w:sz w:val="24"/>
+              </w:rPr>
+              <w:t>César Orlando</w:t>
             </w:r>
           </w:p>
         </w:tc>
@@ -959,9 +968,8 @@
                 <w:szCs w:val="24"/>
                 <w:lang w:val="es-SV"/>
               </w:rPr>
-              <w:t xml:space="preserve">15 de </w:t>
-            </w:r>
-            <w:proofErr w:type="gramStart"/>
+              <w:t>1</w:t>
+            </w:r>
             <w:r>
               <w:rPr>
                 <w:rFonts w:ascii="Arial" w:eastAsia="Calibri" w:hAnsi="Arial" w:cs="Arial"/>
@@ -969,9 +977,26 @@
                 <w:szCs w:val="24"/>
                 <w:lang w:val="es-SV"/>
               </w:rPr>
-              <w:t>Febrero</w:t>
-            </w:r>
-            <w:proofErr w:type="gramEnd"/>
+              <w:t>8</w:t>
+            </w:r>
+            <w:r>
+              <w:rPr>
+                <w:rFonts w:ascii="Arial" w:eastAsia="Calibri" w:hAnsi="Arial" w:cs="Arial"/>
+                <w:sz w:val="24"/>
+                <w:szCs w:val="24"/>
+                <w:lang w:val="es-SV"/>
+              </w:rPr>
+              <w:t xml:space="preserve"> de </w:t>
+            </w:r>
+            <w:r>
+              <w:rPr>
+                <w:rFonts w:ascii="Arial" w:eastAsia="Calibri" w:hAnsi="Arial" w:cs="Arial"/>
+                <w:sz w:val="24"/>
+                <w:szCs w:val="24"/>
+                <w:lang w:val="es-SV"/>
+              </w:rPr>
+              <w:t>Marzo</w:t>
+            </w:r>
             <w:r>
               <w:rPr>
                 <w:rFonts w:ascii="Arial" w:eastAsia="Calibri" w:hAnsi="Arial" w:cs="Arial"/>
@@ -2498,22 +2523,72 @@
           <w:rFonts w:ascii="Arial" w:hAnsi="Arial" w:cs="Arial"/>
           <w:lang w:val="es-ES"/>
         </w:rPr>
-        <w:t xml:space="preserve">La empresa “Soluciones Tecnológicas” se basa en San Salvador y se dedica consultorías tecnológicas y desarrollo de software para empresas. Esta compañía cuenta con 50 distintos empleados, los cuales están en distintas áreas, como la de consultorías, la de desarrollo de software y la administrativa. </w:t>
-      </w:r>
-    </w:p>
-    <w:p>
-      <w:pPr>
-        <w:rPr>
-          <w:rFonts w:ascii="Arial" w:hAnsi="Arial" w:cs="Arial"/>
-          <w:lang w:val="es-ES"/>
-        </w:rPr>
-      </w:pPr>
-      <w:r>
-        <w:rPr>
-          <w:rFonts w:ascii="Arial" w:hAnsi="Arial" w:cs="Arial"/>
-          <w:lang w:val="es-ES"/>
-        </w:rPr>
-        <w:t>Actualmente, la empresa realiza la gestión de documentos por medio de correos electrónicos, archivos locales y carpetas compartidas. Sin embargo, la falta de estos documentos en un área centralizada, a la cual todos los empleados tienen acceso, causa problemas a los empleados y a la empresa, tal y como:</w:t>
+        <w:t xml:space="preserve">La empresa “Soluciones Tecnológicas” </w:t>
+      </w:r>
+      <w:r>
+        <w:rPr>
+          <w:rFonts w:ascii="Arial" w:hAnsi="Arial" w:cs="Arial"/>
+          <w:lang w:val="es-ES"/>
+        </w:rPr>
+        <w:t>ubicada</w:t>
+      </w:r>
+      <w:r>
+        <w:rPr>
+          <w:rFonts w:ascii="Arial" w:hAnsi="Arial" w:cs="Arial"/>
+          <w:lang w:val="es-ES"/>
+        </w:rPr>
+        <w:t xml:space="preserve"> en San Salvador y se dedica </w:t>
+      </w:r>
+      <w:r>
+        <w:rPr>
+          <w:rFonts w:ascii="Arial" w:hAnsi="Arial" w:cs="Arial"/>
+          <w:lang w:val="es-ES"/>
+        </w:rPr>
+        <w:t xml:space="preserve">a </w:t>
+      </w:r>
+      <w:r>
+        <w:rPr>
+          <w:rFonts w:ascii="Arial" w:hAnsi="Arial" w:cs="Arial"/>
+          <w:lang w:val="es-ES"/>
+        </w:rPr>
+        <w:t xml:space="preserve">consultorías tecnológicas y desarrollo de software para empresas. Esta compañía cuenta con 50 distintos empleados, los cuales están en distintas áreas, como la de consultorías, la de desarrollo de software y la administrativa. </w:t>
+      </w:r>
+    </w:p>
+    <w:p>
+      <w:pPr>
+        <w:rPr>
+          <w:rFonts w:ascii="Arial" w:hAnsi="Arial" w:cs="Arial"/>
+          <w:lang w:val="es-ES"/>
+        </w:rPr>
+      </w:pPr>
+      <w:r>
+        <w:rPr>
+          <w:rFonts w:ascii="Arial" w:hAnsi="Arial" w:cs="Arial"/>
+          <w:lang w:val="es-ES"/>
+        </w:rPr>
+        <w:t>Actualmente, la empresa realiza la gestión de documentos por medio de correos electrónicos, archivos locales y carpetas compartidas. Sin embargo, la falta de estos documentos en un área centralizada, a la cual todos los empleados tienen acceso, causa problemas a los empleados y a la empresa</w:t>
+      </w:r>
+      <w:r>
+        <w:rPr>
+          <w:rFonts w:ascii="Arial" w:hAnsi="Arial" w:cs="Arial"/>
+          <w:lang w:val="es-ES"/>
+        </w:rPr>
+        <w:t>.</w:t>
+      </w:r>
+    </w:p>
+    <w:p>
+      <w:pPr>
+        <w:spacing w:after="0"/>
+        <w:rPr>
+          <w:rFonts w:ascii="Arial" w:hAnsi="Arial" w:cs="Arial"/>
+          <w:lang w:val="es-ES"/>
+        </w:rPr>
+      </w:pPr>
+      <w:r>
+        <w:rPr>
+          <w:rFonts w:ascii="Arial" w:hAnsi="Arial" w:cs="Arial"/>
+        </w:rPr>
+        <w:t>Entre los principales problemas identificados se encuentran:</w:t>
       </w:r>
     </w:p>
     <w:p>
@@ -2665,14 +2740,6 @@
     </w:p>
     <w:p>
       <w:pPr>
-        <w:rPr>
-          <w:rFonts w:ascii="Arial" w:hAnsi="Arial" w:cs="Arial"/>
-          <w:lang w:val="es-SV"/>
-        </w:rPr>
-      </w:pPr>
-    </w:p>
-    <w:p>
-      <w:pPr>
         <w:pStyle w:val="Ttulo1"/>
         <w:spacing w:line="360" w:lineRule="auto"/>
         <w:rPr>
@@ -2696,6 +2763,7 @@
           <w:szCs w:val="24"/>
           <w:lang w:val="es-SV"/>
         </w:rPr>
+        <w:lastRenderedPageBreak/>
         <w:t>Diagnóstico del Proceso</w:t>
       </w:r>
       <w:bookmarkEnd w:id="2"/>
@@ -2783,9 +2851,35 @@
       <w:r>
         <w:rPr>
           <w:rFonts w:ascii="Arial" w:hAnsi="Arial" w:cs="Arial"/>
-          <w:lang w:val="es-ES"/>
-        </w:rPr>
-        <w:t xml:space="preserve">buscar en sus correos la versión más reciente de dicho documento, una vez la encuentra, tuviera que cumplir con lo que pide el documento. Sin embargo, esto puede causar problemas, puede que la versión que el busco y encontró sea una versión más antigua y no la más actualizada, por lo cual puede no cumplir con lo que se necesita actualmente y lo que causaría que se entregara una consultoría incompleta. Aparte de esto, el empleado perdería tiempo innecesariamente al tener que buscar por todos sus correos el documento que se necesita, si se considera que uno tiene que buscar muchos documentos, esto lleva a una pérdida de tiempo. </w:t>
+        </w:rPr>
+        <w:t xml:space="preserve">Búsqueda en correos electrónicos. </w:t>
+      </w:r>
+      <w:r>
+        <w:rPr>
+          <w:rFonts w:ascii="Arial" w:hAnsi="Arial" w:cs="Arial"/>
+        </w:rPr>
+        <w:t>Empleado bu</w:t>
+      </w:r>
+      <w:r>
+        <w:rPr>
+          <w:rFonts w:ascii="Arial" w:hAnsi="Arial" w:cs="Arial"/>
+          <w:lang w:val="es-ES"/>
+        </w:rPr>
+        <w:t>sca</w:t>
+      </w:r>
+      <w:r>
+        <w:rPr>
+          <w:rFonts w:ascii="Arial" w:hAnsi="Arial" w:cs="Arial"/>
+          <w:lang w:val="es-ES"/>
+        </w:rPr>
+        <w:t xml:space="preserve"> </w:t>
+      </w:r>
+      <w:r>
+        <w:rPr>
+          <w:rFonts w:ascii="Arial" w:hAnsi="Arial" w:cs="Arial"/>
+          <w:lang w:val="es-ES"/>
+        </w:rPr>
+        <w:t xml:space="preserve">en sus correos la versión más reciente de dicho documento, una vez la encuentra, tuviera que cumplir con lo que pide el documento. Sin embargo, esto puede causar problemas, puede que la versión que el busco y encontró sea una versión más antigua y no la más actualizada, por lo cual puede no cumplir con lo que se necesita actualmente y lo que causaría que se entregara una consultoría incompleta. Aparte de esto, el empleado perdería tiempo innecesariamente al tener que buscar por todos sus correos el documento que se necesita, si se considera que uno tiene que buscar muchos documentos, esto lleva a una pérdida de tiempo. </w:t>
       </w:r>
     </w:p>
     <w:p>
@@ -2803,6 +2897,19 @@
       <w:r>
         <w:rPr>
           <w:rFonts w:ascii="Arial" w:hAnsi="Arial" w:cs="Arial"/>
+        </w:rPr>
+        <w:t>Uso de archivos almacenados localmente</w:t>
+      </w:r>
+      <w:r>
+        <w:rPr>
+          <w:rFonts w:ascii="Arial" w:hAnsi="Arial" w:cs="Arial"/>
+          <w:lang w:val="es-ES"/>
+        </w:rPr>
+        <w:t xml:space="preserve">. </w:t>
+      </w:r>
+      <w:r>
+        <w:rPr>
+          <w:rFonts w:ascii="Arial" w:hAnsi="Arial" w:cs="Arial"/>
           <w:lang w:val="es-ES"/>
         </w:rPr>
         <w:t xml:space="preserve">El empleado pudiera buscar en sus archivos locales (ya que para ahorrar tiempo este baja la versión más reciente) para poder ocuparlo, de esta manera, el empleado pierde menos tiempo al buscar el documento. Sin embargo, el empleado puede no haberse fijado que hay una versión más reciente que él no ha bajado en sus archivos locales, lo que lleva a que él ocupe una versión anticuada del documento que no tiene todos los requisitos que se necesitan y que, una vez más, lleva a que se entregara una consultoría incompleta. </w:t>
@@ -2823,9 +2930,35 @@
       <w:r>
         <w:rPr>
           <w:rFonts w:ascii="Arial" w:hAnsi="Arial" w:cs="Arial"/>
-          <w:lang w:val="es-ES"/>
-        </w:rPr>
-        <w:t xml:space="preserve">Finalmente, el empleado pudiera hacer uso de un sistema de archivos compartidos entre todos los empleados, en los cuales, se pudieran buscar los documentos más recientes para utilizarlos. Otra vez, el empleado gana tiempo al hacer esto, ya que no tiene que buscar el mismo las versiones más recientes. Sin embargo, como con los archivos locales, esto depende de que alguien este subiendo los archivos más recientes y que se aseguren de que sean la versión correcta para que todos puedan ocuparlos. Si hubiera una nueva versión que no se ha subido, entonces todo el trabajo que hicieron los empleados no sería el correcto, ya que no se cumple con los requisitos actuales necesarios. </w:t>
+        </w:rPr>
+        <w:t xml:space="preserve">Uso de carpetas </w:t>
+      </w:r>
+      <w:r>
+        <w:rPr>
+          <w:rFonts w:ascii="Arial" w:hAnsi="Arial" w:cs="Arial"/>
+        </w:rPr>
+        <w:t>compartidas</w:t>
+      </w:r>
+      <w:r>
+        <w:rPr>
+          <w:rFonts w:ascii="Arial" w:hAnsi="Arial" w:cs="Arial"/>
+          <w:lang w:val="es-ES"/>
+        </w:rPr>
+        <w:t xml:space="preserve">. </w:t>
+      </w:r>
+      <w:r>
+        <w:rPr>
+          <w:rFonts w:ascii="Arial" w:hAnsi="Arial" w:cs="Arial"/>
+          <w:lang w:val="es-ES"/>
+        </w:rPr>
+        <w:t>E</w:t>
+      </w:r>
+      <w:r>
+        <w:rPr>
+          <w:rFonts w:ascii="Arial" w:hAnsi="Arial" w:cs="Arial"/>
+          <w:lang w:val="es-ES"/>
+        </w:rPr>
+        <w:t xml:space="preserve">l empleado pudiera hacer uso de un sistema de archivos compartidos entre todos los empleados, en los cuales, se pudieran buscar los documentos más recientes para utilizarlos. Otra vez, el empleado gana tiempo al hacer esto, ya que no tiene que buscar el mismo las versiones más recientes. Sin embargo, como con los archivos locales, esto depende de que alguien este subiendo los archivos más recientes y que se aseguren de que sean la versión correcta para que todos puedan ocuparlos. Si hubiera una nueva versión que no se ha subido, entonces todo el trabajo que hicieron los empleados no sería el correcto, ya que no se cumple con los requisitos actuales necesarios. </w:t>
       </w:r>
     </w:p>
     <w:p>
@@ -2911,23 +3044,7 @@
           <w:rFonts w:ascii="Arial" w:hAnsi="Arial" w:cs="Arial"/>
           <w:lang w:val="es-ES"/>
         </w:rPr>
-        <w:t xml:space="preserve">, lo que nos muestra que si </w:t>
-      </w:r>
-      <w:proofErr w:type="gramStart"/>
-      <w:r>
-        <w:rPr>
-          <w:rFonts w:ascii="Arial" w:hAnsi="Arial" w:cs="Arial"/>
-          <w:lang w:val="es-ES"/>
-        </w:rPr>
-        <w:t>pueden</w:t>
-      </w:r>
-      <w:proofErr w:type="gramEnd"/>
-      <w:r>
-        <w:rPr>
-          <w:rFonts w:ascii="Arial" w:hAnsi="Arial" w:cs="Arial"/>
-          <w:lang w:val="es-ES"/>
-        </w:rPr>
-        <w:t xml:space="preserve"> haber problemas serios si es que se están ocupando documentos anticuados, ya que esto puede afectar a la mayoría de los empleados. Los empleados también mencionaron que 38.1% ocupan los documentos todos los días y el 42.9% un par de veces por semana</w:t>
+        <w:t>, lo que nos muestra que si pueden haber problemas serios si es que se están ocupando documentos anticuados, ya que esto puede afectar a la mayoría de los empleados. Los empleados también mencionaron que 38.1% ocupan los documentos todos los días y el 42.9% un par de veces por semana</w:t>
       </w:r>
       <w:r>
         <w:rPr>
@@ -3108,23 +3225,7 @@
           <w:rFonts w:ascii="Arial" w:hAnsi="Arial" w:cs="Arial"/>
           <w:lang w:val="es-ES"/>
         </w:rPr>
-        <w:t xml:space="preserve"> están de acuerdo que haya un proceso de aprobación a la documentación (lo cual harían los usuarios de los jefes), ya que esto permitirá que hubiera un buen control de dicha documentación, ya </w:t>
-      </w:r>
-      <w:proofErr w:type="gramStart"/>
-      <w:r>
-        <w:rPr>
-          <w:rFonts w:ascii="Arial" w:hAnsi="Arial" w:cs="Arial"/>
-          <w:lang w:val="es-ES"/>
-        </w:rPr>
-        <w:t>que</w:t>
-      </w:r>
-      <w:proofErr w:type="gramEnd"/>
-      <w:r>
-        <w:rPr>
-          <w:rFonts w:ascii="Arial" w:hAnsi="Arial" w:cs="Arial"/>
-          <w:lang w:val="es-ES"/>
-        </w:rPr>
-        <w:t xml:space="preserve"> aunque cualquier empleado puede subir un documento, este tiene que ser aprobado para que se guarde en el sitio web, si se rechaza, el documento no se subirá. </w:t>
+        <w:t xml:space="preserve"> están de acuerdo que haya un proceso de aprobación a la documentación (lo cual harían los usuarios de los jefes), ya que esto permitirá que hubiera un buen control de dicha documentación, ya que aunque cualquier empleado puede subir un documento, este tiene que ser aprobado para que se guarde en el sitio web, si se rechaza, el documento no se subirá. </w:t>
       </w:r>
     </w:p>
     <w:p>
@@ -3185,6 +3286,213 @@
           <w:lang w:val="es-ES"/>
         </w:rPr>
         <w:t xml:space="preserve"> descargarían los documentos en su computadora para poder acceder a ellos de una maneras más rápida y simple, y de esa forma agilizar el proceso. </w:t>
+      </w:r>
+    </w:p>
+    <w:p>
+      <w:pPr>
+        <w:spacing w:after="0"/>
+        <w:rPr>
+          <w:rFonts w:ascii="Arial" w:hAnsi="Arial" w:cs="Arial"/>
+          <w:b/>
+          <w:bCs/>
+          <w:lang w:val="es-SV"/>
+        </w:rPr>
+      </w:pPr>
+      <w:r>
+        <w:rPr>
+          <w:rFonts w:ascii="Arial" w:hAnsi="Arial" w:cs="Arial"/>
+          <w:b/>
+          <w:bCs/>
+          <w:lang w:val="es-SV"/>
+        </w:rPr>
+        <w:t>Debilidades del proceso identificadas (según enfoque CMMI)</w:t>
+      </w:r>
+    </w:p>
+    <w:p>
+      <w:pPr>
+        <w:spacing w:after="0"/>
+        <w:rPr>
+          <w:rFonts w:ascii="Arial" w:hAnsi="Arial" w:cs="Arial"/>
+          <w:lang w:val="es-SV"/>
+        </w:rPr>
+      </w:pPr>
+      <w:r>
+        <w:rPr>
+          <w:rFonts w:ascii="Arial" w:hAnsi="Arial" w:cs="Arial"/>
+          <w:lang w:val="es-SV"/>
+        </w:rPr>
+        <w:t>A partir del análisis de los resultados de la encuesta, se identificaron varias debilidades en el proceso actual de gestión documental:</w:t>
+      </w:r>
+    </w:p>
+    <w:p>
+      <w:pPr>
+        <w:spacing w:after="0"/>
+        <w:rPr>
+          <w:rFonts w:ascii="Arial" w:hAnsi="Arial" w:cs="Arial"/>
+          <w:lang w:val="es-SV"/>
+        </w:rPr>
+      </w:pPr>
+      <w:r>
+        <w:rPr>
+          <w:rFonts w:ascii="Arial" w:hAnsi="Arial" w:cs="Arial"/>
+          <w:lang w:val="es-SV"/>
+        </w:rPr>
+        <w:t>Falta de repositorio centralizado</w:t>
+      </w:r>
+      <w:r>
+        <w:rPr>
+          <w:rFonts w:ascii="Arial" w:hAnsi="Arial" w:cs="Arial"/>
+          <w:lang w:val="es-SV"/>
+        </w:rPr>
+        <w:br/>
+        <w:t>Los documentos se encuentran distribuidos entre correos electrónicos, carpetas compartidas y archivos locales.</w:t>
+      </w:r>
+    </w:p>
+    <w:p>
+      <w:pPr>
+        <w:spacing w:after="0"/>
+        <w:rPr>
+          <w:rFonts w:ascii="Arial" w:hAnsi="Arial" w:cs="Arial"/>
+          <w:lang w:val="es-SV"/>
+        </w:rPr>
+      </w:pPr>
+    </w:p>
+    <w:p>
+      <w:pPr>
+        <w:spacing w:after="0"/>
+        <w:rPr>
+          <w:rFonts w:ascii="Arial" w:hAnsi="Arial" w:cs="Arial"/>
+          <w:lang w:val="es-SV"/>
+        </w:rPr>
+      </w:pPr>
+      <w:r>
+        <w:rPr>
+          <w:rFonts w:ascii="Arial" w:hAnsi="Arial" w:cs="Arial"/>
+          <w:lang w:val="es-SV"/>
+        </w:rPr>
+        <w:t>Falta de control de versiones</w:t>
+      </w:r>
+      <w:r>
+        <w:rPr>
+          <w:rFonts w:ascii="Arial" w:hAnsi="Arial" w:cs="Arial"/>
+          <w:lang w:val="es-SV"/>
+        </w:rPr>
+        <w:t>.</w:t>
+      </w:r>
+      <w:r>
+        <w:rPr>
+          <w:rFonts w:ascii="Arial" w:hAnsi="Arial" w:cs="Arial"/>
+          <w:lang w:val="es-SV"/>
+        </w:rPr>
+        <w:br/>
+        <w:t>No existe un mecanismo que permita identificar claramente la versión más reciente de un documento.</w:t>
+      </w:r>
+    </w:p>
+    <w:p>
+      <w:pPr>
+        <w:spacing w:after="0"/>
+        <w:rPr>
+          <w:rFonts w:ascii="Arial" w:hAnsi="Arial" w:cs="Arial"/>
+          <w:lang w:val="es-SV"/>
+        </w:rPr>
+      </w:pPr>
+    </w:p>
+    <w:p>
+      <w:pPr>
+        <w:rPr>
+          <w:rFonts w:ascii="Arial" w:hAnsi="Arial" w:cs="Arial"/>
+          <w:lang w:val="es-SV"/>
+        </w:rPr>
+      </w:pPr>
+      <w:r>
+        <w:rPr>
+          <w:rFonts w:ascii="Arial" w:hAnsi="Arial" w:cs="Arial"/>
+          <w:lang w:val="es-SV"/>
+        </w:rPr>
+        <w:t>Falta de trazabilidad</w:t>
+      </w:r>
+      <w:r>
+        <w:rPr>
+          <w:rFonts w:ascii="Arial" w:hAnsi="Arial" w:cs="Arial"/>
+          <w:lang w:val="es-SV"/>
+        </w:rPr>
+        <w:t>.</w:t>
+      </w:r>
+      <w:r>
+        <w:rPr>
+          <w:rFonts w:ascii="Arial" w:hAnsi="Arial" w:cs="Arial"/>
+          <w:lang w:val="es-SV"/>
+        </w:rPr>
+        <w:br/>
+        <w:t>No se puede identificar fácilmente quién creó, modificó o aprobó un documento</w:t>
+      </w:r>
+      <w:r>
+        <w:rPr>
+          <w:rFonts w:ascii="Arial" w:hAnsi="Arial" w:cs="Arial"/>
+          <w:lang w:val="es-SV"/>
+        </w:rPr>
+        <w:t>.</w:t>
+      </w:r>
+    </w:p>
+    <w:p>
+      <w:pPr>
+        <w:rPr>
+          <w:rFonts w:ascii="Arial" w:hAnsi="Arial" w:cs="Arial"/>
+          <w:lang w:val="es-SV"/>
+        </w:rPr>
+      </w:pPr>
+      <w:r>
+        <w:rPr>
+          <w:rFonts w:ascii="Arial" w:hAnsi="Arial" w:cs="Arial"/>
+          <w:lang w:val="es-SV"/>
+        </w:rPr>
+        <w:lastRenderedPageBreak/>
+        <w:t>Ausencia de proceso formal de aprobación</w:t>
+      </w:r>
+      <w:r>
+        <w:rPr>
+          <w:rFonts w:ascii="Arial" w:hAnsi="Arial" w:cs="Arial"/>
+          <w:lang w:val="es-SV"/>
+        </w:rPr>
+        <w:t>.</w:t>
+      </w:r>
+      <w:r>
+        <w:rPr>
+          <w:rFonts w:ascii="Arial" w:hAnsi="Arial" w:cs="Arial"/>
+          <w:lang w:val="es-SV"/>
+        </w:rPr>
+        <w:br/>
+        <w:t>Los documentos pueden ser utilizados sin haber pasado por un proceso formal de validación.</w:t>
+      </w:r>
+    </w:p>
+    <w:p>
+      <w:pPr>
+        <w:rPr>
+          <w:rFonts w:ascii="Arial" w:hAnsi="Arial" w:cs="Arial"/>
+          <w:lang w:val="es-SV"/>
+        </w:rPr>
+      </w:pPr>
+      <w:r>
+        <w:rPr>
+          <w:rFonts w:ascii="Arial" w:hAnsi="Arial" w:cs="Arial"/>
+          <w:lang w:val="es-SV"/>
+        </w:rPr>
+        <w:t>Falta de control de accesos y roles</w:t>
+      </w:r>
+      <w:r>
+        <w:rPr>
+          <w:rFonts w:ascii="Arial" w:hAnsi="Arial" w:cs="Arial"/>
+          <w:lang w:val="es-SV"/>
+        </w:rPr>
+        <w:t>.</w:t>
+      </w:r>
+      <w:r>
+        <w:rPr>
+          <w:rFonts w:ascii="Arial" w:hAnsi="Arial" w:cs="Arial"/>
+          <w:lang w:val="es-SV"/>
+        </w:rPr>
+        <w:br/>
+        <w:t>Actualmente no existe una estructura clara de permisos para gestionar quién puede crear, modificar o aprobar documentos.</w:t>
       </w:r>
     </w:p>
     <w:p>
@@ -3223,16 +3531,128 @@
       <w:pPr>
         <w:rPr>
           <w:rFonts w:ascii="Arial" w:hAnsi="Arial" w:cs="Arial"/>
-          <w:lang w:val="es-ES"/>
-        </w:rPr>
-      </w:pPr>
-      <w:r>
-        <w:rPr>
-          <w:rFonts w:ascii="Arial" w:hAnsi="Arial" w:cs="Arial"/>
-          <w:lang w:val="es-ES"/>
-        </w:rPr>
-        <w:t xml:space="preserve">Por medio de la encuesta es que hemos logrado no solo identificar los requerimientos funcionales y no funcionales del proyecto, sino también tener una idea clara de que es lo que se necesita y como poder implementarlo. Nos concentraremos en un sitio web al que se pueda acceder por medio de usuarios y contraseñas (con distintos tipos de usuarios) en el cual se pueden subir documentos, aprobar los documentos para que se guarden en el sitio web con sus respectivas versiones anteriores, bajar los documentos, dejar comentarios y que se pueda ver una bitácora de quien aprobó y quien subió el documento. </w:t>
-      </w:r>
+          <w:lang w:val="es-SV"/>
+        </w:rPr>
+      </w:pPr>
+      <w:bookmarkStart w:id="6" w:name="_Toc224035370"/>
+      <w:r>
+        <w:rPr>
+          <w:rFonts w:ascii="Arial" w:hAnsi="Arial" w:cs="Arial"/>
+          <w:lang w:val="es-SV"/>
+        </w:rPr>
+        <w:t>Los resultados de la encuesta muestran que la gestión documental actual presenta diversas debilidades que afectan la eficiencia del trabajo dentro de la empresa. La falta de un sistema centralizado, el uso de versiones incorrectas de documentos y la ausencia de procesos formales de control y aprobación generan riesgos para la calidad del trabajo y la organización de la información.</w:t>
+      </w:r>
+    </w:p>
+    <w:p>
+      <w:pPr>
+        <w:rPr>
+          <w:rFonts w:ascii="Arial" w:hAnsi="Arial" w:cs="Arial"/>
+          <w:lang w:val="es-SV"/>
+        </w:rPr>
+      </w:pPr>
+      <w:r>
+        <w:rPr>
+          <w:rFonts w:ascii="Arial" w:hAnsi="Arial" w:cs="Arial"/>
+          <w:lang w:val="es-SV"/>
+        </w:rPr>
+        <w:t>Por lo tanto, es necesario implementar mejoras en el proceso de gestión documental que permitan establecer control de versiones, trazabilidad de cambios, roles definidos y un proceso formal de aprobación de documentos.</w:t>
+      </w:r>
+    </w:p>
+    <w:p>
+      <w:pPr>
+        <w:rPr>
+          <w:rFonts w:ascii="Arial" w:hAnsi="Arial" w:cs="Arial"/>
+          <w:lang w:val="es-SV"/>
+        </w:rPr>
+      </w:pPr>
+    </w:p>
+    <w:p>
+      <w:pPr>
+        <w:rPr>
+          <w:rFonts w:ascii="Arial" w:hAnsi="Arial" w:cs="Arial"/>
+          <w:lang w:val="es-SV"/>
+        </w:rPr>
+      </w:pPr>
+    </w:p>
+    <w:p>
+      <w:pPr>
+        <w:rPr>
+          <w:rFonts w:ascii="Arial" w:hAnsi="Arial" w:cs="Arial"/>
+          <w:lang w:val="es-SV"/>
+        </w:rPr>
+      </w:pPr>
+    </w:p>
+    <w:p>
+      <w:pPr>
+        <w:rPr>
+          <w:rFonts w:ascii="Arial" w:hAnsi="Arial" w:cs="Arial"/>
+          <w:lang w:val="es-SV"/>
+        </w:rPr>
+      </w:pPr>
+    </w:p>
+    <w:p>
+      <w:pPr>
+        <w:rPr>
+          <w:rFonts w:ascii="Arial" w:hAnsi="Arial" w:cs="Arial"/>
+          <w:lang w:val="es-SV"/>
+        </w:rPr>
+      </w:pPr>
+    </w:p>
+    <w:p>
+      <w:pPr>
+        <w:rPr>
+          <w:rFonts w:ascii="Arial" w:hAnsi="Arial" w:cs="Arial"/>
+          <w:lang w:val="es-SV"/>
+        </w:rPr>
+      </w:pPr>
+    </w:p>
+    <w:p>
+      <w:pPr>
+        <w:rPr>
+          <w:rFonts w:ascii="Arial" w:hAnsi="Arial" w:cs="Arial"/>
+          <w:lang w:val="es-SV"/>
+        </w:rPr>
+      </w:pPr>
+    </w:p>
+    <w:p>
+      <w:pPr>
+        <w:rPr>
+          <w:rFonts w:ascii="Arial" w:hAnsi="Arial" w:cs="Arial"/>
+          <w:lang w:val="es-SV"/>
+        </w:rPr>
+      </w:pPr>
+    </w:p>
+    <w:p>
+      <w:pPr>
+        <w:rPr>
+          <w:rFonts w:ascii="Arial" w:hAnsi="Arial" w:cs="Arial"/>
+          <w:lang w:val="es-SV"/>
+        </w:rPr>
+      </w:pPr>
+    </w:p>
+    <w:p>
+      <w:pPr>
+        <w:rPr>
+          <w:rFonts w:ascii="Arial" w:hAnsi="Arial" w:cs="Arial"/>
+          <w:lang w:val="es-SV"/>
+        </w:rPr>
+      </w:pPr>
+    </w:p>
+    <w:p>
+      <w:pPr>
+        <w:rPr>
+          <w:rFonts w:ascii="Arial" w:hAnsi="Arial" w:cs="Arial"/>
+          <w:lang w:val="es-SV"/>
+        </w:rPr>
+      </w:pPr>
+    </w:p>
+    <w:p>
+      <w:pPr>
+        <w:rPr>
+          <w:rFonts w:ascii="Arial" w:hAnsi="Arial" w:cs="Arial"/>
+          <w:lang w:val="es-SV"/>
+        </w:rPr>
+      </w:pPr>
     </w:p>
     <w:p>
       <w:pPr>
@@ -3248,7 +3668,6 @@
           <w:lang w:val="es-SV"/>
         </w:rPr>
       </w:pPr>
-      <w:bookmarkStart w:id="6" w:name="_Toc224035370"/>
       <w:r>
         <w:rPr>
           <w:rFonts w:ascii="Arial" w:hAnsi="Arial" w:cs="Arial"/>
@@ -4076,10 +4495,44 @@
           <w:szCs w:val="24"/>
           <w:lang w:val="es-SV"/>
         </w:rPr>
-        <w:t xml:space="preserve">Uso específico de </w:t>
-      </w:r>
-      <w:proofErr w:type="spellStart"/>
-      <w:r>
+        <w:t>Uso específico de commits en Github</w:t>
+      </w:r>
+    </w:p>
+    <w:p>
+      <w:pPr>
+        <w:rPr>
+          <w:rFonts w:ascii="Arial" w:hAnsi="Arial" w:cs="Arial"/>
+          <w:lang w:val="es-SV"/>
+        </w:rPr>
+      </w:pPr>
+    </w:p>
+    <w:p>
+      <w:pPr>
+        <w:rPr>
+          <w:rFonts w:ascii="Arial" w:hAnsi="Arial" w:cs="Arial"/>
+          <w:lang w:val="es-SV"/>
+        </w:rPr>
+      </w:pPr>
+    </w:p>
+    <w:p>
+      <w:pPr>
+        <w:rPr>
+          <w:rFonts w:ascii="Arial" w:hAnsi="Arial" w:cs="Arial"/>
+          <w:lang w:val="es-SV"/>
+        </w:rPr>
+      </w:pPr>
+    </w:p>
+    <w:p>
+      <w:pPr>
+        <w:rPr>
+          <w:rFonts w:ascii="Arial" w:hAnsi="Arial" w:cs="Arial"/>
+          <w:lang w:val="es-SV"/>
+        </w:rPr>
+      </w:pPr>
+    </w:p>
+    <w:p>
+      <w:pPr>
+        <w:pStyle w:val="Ttulo2"/>
         <w:rPr>
           <w:rFonts w:ascii="Arial" w:hAnsi="Arial" w:cs="Arial"/>
           <w:color w:val="auto"/>
@@ -4087,9 +4540,7 @@
           <w:szCs w:val="24"/>
           <w:lang w:val="es-SV"/>
         </w:rPr>
-        <w:t>commits</w:t>
-      </w:r>
-      <w:proofErr w:type="spellEnd"/>
+      </w:pPr>
       <w:r>
         <w:rPr>
           <w:rFonts w:ascii="Arial" w:hAnsi="Arial" w:cs="Arial"/>
@@ -4098,10 +4549,40 @@
           <w:szCs w:val="24"/>
           <w:lang w:val="es-SV"/>
         </w:rPr>
-        <w:t xml:space="preserve"> en </w:t>
-      </w:r>
-      <w:proofErr w:type="spellStart"/>
-      <w:r>
+        <w:t>Uso de status en el tablero</w:t>
+      </w:r>
+    </w:p>
+    <w:p>
+      <w:pPr>
+        <w:rPr>
+          <w:lang w:val="es-SV"/>
+        </w:rPr>
+      </w:pPr>
+    </w:p>
+    <w:p>
+      <w:pPr>
+        <w:rPr>
+          <w:lang w:val="es-SV"/>
+        </w:rPr>
+      </w:pPr>
+    </w:p>
+    <w:p>
+      <w:pPr>
+        <w:rPr>
+          <w:lang w:val="es-SV"/>
+        </w:rPr>
+      </w:pPr>
+    </w:p>
+    <w:p>
+      <w:pPr>
+        <w:rPr>
+          <w:lang w:val="es-SV"/>
+        </w:rPr>
+      </w:pPr>
+    </w:p>
+    <w:p>
+      <w:pPr>
+        <w:pStyle w:val="Ttulo2"/>
         <w:rPr>
           <w:rFonts w:ascii="Arial" w:hAnsi="Arial" w:cs="Arial"/>
           <w:color w:val="auto"/>
@@ -4109,45 +4590,8 @@
           <w:szCs w:val="24"/>
           <w:lang w:val="es-SV"/>
         </w:rPr>
-        <w:t>Github</w:t>
-      </w:r>
-      <w:proofErr w:type="spellEnd"/>
-    </w:p>
-    <w:p>
-      <w:pPr>
-        <w:rPr>
-          <w:rFonts w:ascii="Arial" w:hAnsi="Arial" w:cs="Arial"/>
-          <w:lang w:val="es-SV"/>
-        </w:rPr>
-      </w:pPr>
-    </w:p>
-    <w:p>
-      <w:pPr>
-        <w:rPr>
-          <w:rFonts w:ascii="Arial" w:hAnsi="Arial" w:cs="Arial"/>
-          <w:lang w:val="es-SV"/>
-        </w:rPr>
-      </w:pPr>
-    </w:p>
-    <w:p>
-      <w:pPr>
-        <w:rPr>
-          <w:rFonts w:ascii="Arial" w:hAnsi="Arial" w:cs="Arial"/>
-          <w:lang w:val="es-SV"/>
-        </w:rPr>
-      </w:pPr>
-    </w:p>
-    <w:p>
-      <w:pPr>
-        <w:rPr>
-          <w:rFonts w:ascii="Arial" w:hAnsi="Arial" w:cs="Arial"/>
-          <w:lang w:val="es-SV"/>
-        </w:rPr>
-      </w:pPr>
-    </w:p>
-    <w:p>
-      <w:pPr>
-        <w:pStyle w:val="Ttulo2"/>
+      </w:pPr>
+      <w:r>
         <w:rPr>
           <w:rFonts w:ascii="Arial" w:hAnsi="Arial" w:cs="Arial"/>
           <w:color w:val="auto"/>
@@ -4155,8 +4599,40 @@
           <w:szCs w:val="24"/>
           <w:lang w:val="es-SV"/>
         </w:rPr>
-      </w:pPr>
-      <w:r>
+        <w:t>Uso de priorities en el tablero</w:t>
+      </w:r>
+    </w:p>
+    <w:p>
+      <w:pPr>
+        <w:rPr>
+          <w:lang w:val="es-SV"/>
+        </w:rPr>
+      </w:pPr>
+    </w:p>
+    <w:p>
+      <w:pPr>
+        <w:rPr>
+          <w:lang w:val="es-SV"/>
+        </w:rPr>
+      </w:pPr>
+    </w:p>
+    <w:p>
+      <w:pPr>
+        <w:rPr>
+          <w:lang w:val="es-SV"/>
+        </w:rPr>
+      </w:pPr>
+    </w:p>
+    <w:p>
+      <w:pPr>
+        <w:rPr>
+          <w:lang w:val="es-SV"/>
+        </w:rPr>
+      </w:pPr>
+    </w:p>
+    <w:p>
+      <w:pPr>
+        <w:pStyle w:val="Ttulo2"/>
         <w:rPr>
           <w:rFonts w:ascii="Arial" w:hAnsi="Arial" w:cs="Arial"/>
           <w:color w:val="auto"/>
@@ -4164,40 +4640,8 @@
           <w:szCs w:val="24"/>
           <w:lang w:val="es-SV"/>
         </w:rPr>
-        <w:t>Uso de status en el tablero</w:t>
-      </w:r>
-    </w:p>
-    <w:p>
-      <w:pPr>
-        <w:rPr>
-          <w:lang w:val="es-SV"/>
-        </w:rPr>
-      </w:pPr>
-    </w:p>
-    <w:p>
-      <w:pPr>
-        <w:rPr>
-          <w:lang w:val="es-SV"/>
-        </w:rPr>
-      </w:pPr>
-    </w:p>
-    <w:p>
-      <w:pPr>
-        <w:rPr>
-          <w:lang w:val="es-SV"/>
-        </w:rPr>
-      </w:pPr>
-    </w:p>
-    <w:p>
-      <w:pPr>
-        <w:rPr>
-          <w:lang w:val="es-SV"/>
-        </w:rPr>
-      </w:pPr>
-    </w:p>
-    <w:p>
-      <w:pPr>
-        <w:pStyle w:val="Ttulo2"/>
+      </w:pPr>
+      <w:r>
         <w:rPr>
           <w:rFonts w:ascii="Arial" w:hAnsi="Arial" w:cs="Arial"/>
           <w:color w:val="auto"/>
@@ -4205,8 +4649,54 @@
           <w:szCs w:val="24"/>
           <w:lang w:val="es-SV"/>
         </w:rPr>
-      </w:pPr>
-      <w:r>
+        <w:t>Uso de type en el tablero</w:t>
+      </w:r>
+    </w:p>
+    <w:p>
+      <w:pPr>
+        <w:rPr>
+          <w:lang w:val="es-SV"/>
+        </w:rPr>
+      </w:pPr>
+    </w:p>
+    <w:p>
+      <w:pPr>
+        <w:rPr>
+          <w:lang w:val="es-SV"/>
+        </w:rPr>
+      </w:pPr>
+    </w:p>
+    <w:p>
+      <w:pPr>
+        <w:rPr>
+          <w:lang w:val="es-SV"/>
+        </w:rPr>
+      </w:pPr>
+    </w:p>
+    <w:p>
+      <w:pPr>
+        <w:rPr>
+          <w:lang w:val="es-SV"/>
+        </w:rPr>
+      </w:pPr>
+    </w:p>
+    <w:p>
+      <w:pPr>
+        <w:rPr>
+          <w:lang w:val="es-SV"/>
+        </w:rPr>
+      </w:pPr>
+    </w:p>
+    <w:p>
+      <w:pPr>
+        <w:rPr>
+          <w:lang w:val="es-SV"/>
+        </w:rPr>
+      </w:pPr>
+    </w:p>
+    <w:p>
+      <w:pPr>
+        <w:pStyle w:val="Ttulo2"/>
         <w:rPr>
           <w:rFonts w:ascii="Arial" w:hAnsi="Arial" w:cs="Arial"/>
           <w:color w:val="auto"/>
@@ -4214,9 +4704,7 @@
           <w:szCs w:val="24"/>
           <w:lang w:val="es-SV"/>
         </w:rPr>
-        <w:t xml:space="preserve">Uso de </w:t>
-      </w:r>
-      <w:proofErr w:type="spellStart"/>
+      </w:pPr>
       <w:r>
         <w:rPr>
           <w:rFonts w:ascii="Arial" w:hAnsi="Arial" w:cs="Arial"/>
@@ -4225,176 +4713,7 @@
           <w:szCs w:val="24"/>
           <w:lang w:val="es-SV"/>
         </w:rPr>
-        <w:t>priorities</w:t>
-      </w:r>
-      <w:proofErr w:type="spellEnd"/>
-      <w:r>
-        <w:rPr>
-          <w:rFonts w:ascii="Arial" w:hAnsi="Arial" w:cs="Arial"/>
-          <w:color w:val="auto"/>
-          <w:sz w:val="24"/>
-          <w:szCs w:val="24"/>
-          <w:lang w:val="es-SV"/>
-        </w:rPr>
-        <w:t xml:space="preserve"> en el tablero</w:t>
-      </w:r>
-    </w:p>
-    <w:p>
-      <w:pPr>
-        <w:rPr>
-          <w:lang w:val="es-SV"/>
-        </w:rPr>
-      </w:pPr>
-    </w:p>
-    <w:p>
-      <w:pPr>
-        <w:rPr>
-          <w:lang w:val="es-SV"/>
-        </w:rPr>
-      </w:pPr>
-    </w:p>
-    <w:p>
-      <w:pPr>
-        <w:rPr>
-          <w:lang w:val="es-SV"/>
-        </w:rPr>
-      </w:pPr>
-    </w:p>
-    <w:p>
-      <w:pPr>
-        <w:rPr>
-          <w:lang w:val="es-SV"/>
-        </w:rPr>
-      </w:pPr>
-    </w:p>
-    <w:p>
-      <w:pPr>
-        <w:pStyle w:val="Ttulo2"/>
-        <w:rPr>
-          <w:rFonts w:ascii="Arial" w:hAnsi="Arial" w:cs="Arial"/>
-          <w:color w:val="auto"/>
-          <w:sz w:val="24"/>
-          <w:szCs w:val="24"/>
-          <w:lang w:val="es-SV"/>
-        </w:rPr>
-      </w:pPr>
-      <w:r>
-        <w:rPr>
-          <w:rFonts w:ascii="Arial" w:hAnsi="Arial" w:cs="Arial"/>
-          <w:color w:val="auto"/>
-          <w:sz w:val="24"/>
-          <w:szCs w:val="24"/>
-          <w:lang w:val="es-SV"/>
-        </w:rPr>
-        <w:t xml:space="preserve">Uso de </w:t>
-      </w:r>
-      <w:proofErr w:type="spellStart"/>
-      <w:r>
-        <w:rPr>
-          <w:rFonts w:ascii="Arial" w:hAnsi="Arial" w:cs="Arial"/>
-          <w:color w:val="auto"/>
-          <w:sz w:val="24"/>
-          <w:szCs w:val="24"/>
-          <w:lang w:val="es-SV"/>
-        </w:rPr>
-        <w:t>type</w:t>
-      </w:r>
-      <w:proofErr w:type="spellEnd"/>
-      <w:r>
-        <w:rPr>
-          <w:rFonts w:ascii="Arial" w:hAnsi="Arial" w:cs="Arial"/>
-          <w:color w:val="auto"/>
-          <w:sz w:val="24"/>
-          <w:szCs w:val="24"/>
-          <w:lang w:val="es-SV"/>
-        </w:rPr>
-        <w:t xml:space="preserve"> en el tablero</w:t>
-      </w:r>
-    </w:p>
-    <w:p>
-      <w:pPr>
-        <w:rPr>
-          <w:lang w:val="es-SV"/>
-        </w:rPr>
-      </w:pPr>
-    </w:p>
-    <w:p>
-      <w:pPr>
-        <w:rPr>
-          <w:lang w:val="es-SV"/>
-        </w:rPr>
-      </w:pPr>
-    </w:p>
-    <w:p>
-      <w:pPr>
-        <w:rPr>
-          <w:lang w:val="es-SV"/>
-        </w:rPr>
-      </w:pPr>
-    </w:p>
-    <w:p>
-      <w:pPr>
-        <w:rPr>
-          <w:lang w:val="es-SV"/>
-        </w:rPr>
-      </w:pPr>
-    </w:p>
-    <w:p>
-      <w:pPr>
-        <w:rPr>
-          <w:lang w:val="es-SV"/>
-        </w:rPr>
-      </w:pPr>
-    </w:p>
-    <w:p>
-      <w:pPr>
-        <w:rPr>
-          <w:lang w:val="es-SV"/>
-        </w:rPr>
-      </w:pPr>
-    </w:p>
-    <w:p>
-      <w:pPr>
-        <w:pStyle w:val="Ttulo2"/>
-        <w:rPr>
-          <w:rFonts w:ascii="Arial" w:hAnsi="Arial" w:cs="Arial"/>
-          <w:color w:val="auto"/>
-          <w:sz w:val="24"/>
-          <w:szCs w:val="24"/>
-          <w:lang w:val="es-SV"/>
-        </w:rPr>
-      </w:pPr>
-      <w:r>
-        <w:rPr>
-          <w:rFonts w:ascii="Arial" w:hAnsi="Arial" w:cs="Arial"/>
-          <w:color w:val="auto"/>
-          <w:sz w:val="24"/>
-          <w:szCs w:val="24"/>
-          <w:lang w:val="es-SV"/>
-        </w:rPr>
-        <w:t xml:space="preserve">Uso de </w:t>
-      </w:r>
-      <w:proofErr w:type="spellStart"/>
-      <w:r>
-        <w:rPr>
-          <w:rFonts w:ascii="Arial" w:hAnsi="Arial" w:cs="Arial"/>
-          <w:color w:val="auto"/>
-          <w:sz w:val="24"/>
-          <w:szCs w:val="24"/>
-          <w:lang w:val="es-SV"/>
-        </w:rPr>
-        <w:t>assignees</w:t>
-      </w:r>
-      <w:proofErr w:type="spellEnd"/>
-      <w:r>
-        <w:rPr>
-          <w:rFonts w:ascii="Arial" w:hAnsi="Arial" w:cs="Arial"/>
-          <w:color w:val="auto"/>
-          <w:sz w:val="24"/>
-          <w:szCs w:val="24"/>
-          <w:lang w:val="es-SV"/>
-        </w:rPr>
-        <w:t xml:space="preserve"> en el tablero</w:t>
+        <w:t>Uso de assignees en el tablero</w:t>
       </w:r>
     </w:p>
     <w:p>
@@ -4568,21 +4887,9 @@
           <w:szCs w:val="24"/>
           <w:lang w:val="es-SV"/>
         </w:rPr>
-        <w:t xml:space="preserve">Repositorio con </w:t>
-      </w:r>
-      <w:proofErr w:type="spellStart"/>
-      <w:r>
-        <w:rPr>
-          <w:rFonts w:ascii="Arial" w:hAnsi="Arial" w:cs="Arial"/>
-          <w:color w:val="auto"/>
-          <w:sz w:val="24"/>
-          <w:szCs w:val="24"/>
-          <w:lang w:val="es-SV"/>
-        </w:rPr>
-        <w:t>commits</w:t>
+        <w:t>Repositorio con commits</w:t>
       </w:r>
       <w:bookmarkEnd w:id="17"/>
-      <w:proofErr w:type="spellEnd"/>
     </w:p>
     <w:p>
       <w:pPr>
@@ -4683,23 +4990,9 @@
           <w:szCs w:val="24"/>
           <w:lang w:val="es-SV"/>
         </w:rPr>
-        <w:t xml:space="preserve">Repositorio de </w:t>
-      </w:r>
-      <w:proofErr w:type="spellStart"/>
-      <w:r>
-        <w:rPr>
-          <w:rFonts w:ascii="Arial" w:hAnsi="Arial" w:cs="Arial"/>
-          <w:b/>
-          <w:bCs/>
-          <w:color w:val="auto"/>
-          <w:sz w:val="24"/>
-          <w:szCs w:val="24"/>
-          <w:lang w:val="es-SV"/>
-        </w:rPr>
-        <w:t>Github</w:t>
+        <w:t>Repositorio de Github</w:t>
       </w:r>
       <w:bookmarkEnd w:id="18"/>
-      <w:proofErr w:type="spellEnd"/>
     </w:p>
     <w:p>
       <w:pPr>

</xml_diff>

<commit_message>
Docs: Formato del documento
Se arreglo el formato del documento para que cumpla con los requisitos.
</commit_message>
<xml_diff>
--- a/docs/entrega2/EPRO_Entrega2_Grupo9_Plataforma de gestión documental con versiones.docx
+++ b/docs/entrega2/EPRO_Entrega2_Grupo9_Plataforma de gestión documental con versiones.docx
@@ -1,6 +1,6 @@
 
 <file path=word/document.xml><?xml version="1.0" encoding="utf-8"?>
-<w:document xmlns:wpc="http://schemas.microsoft.com/office/word/2010/wordprocessingCanvas" xmlns:cx="http://schemas.microsoft.com/office/drawing/2014/chartex" xmlns:cx1="http://schemas.microsoft.com/office/drawing/2015/9/8/chartex" xmlns:cx2="http://schemas.microsoft.com/office/drawing/2015/10/21/chartex" xmlns:cx3="http://schemas.microsoft.com/office/drawing/2016/5/9/chartex" xmlns:cx4="http://schemas.microsoft.com/office/drawing/2016/5/10/chartex" xmlns:cx5="http://schemas.microsoft.com/office/drawing/2016/5/11/chartex" xmlns:cx6="http://schemas.microsoft.com/office/drawing/2016/5/12/chartex" xmlns:cx7="http://schemas.microsoft.com/office/drawing/2016/5/13/chartex" xmlns:cx8="http://schemas.microsoft.com/office/drawing/2016/5/14/chartex" xmlns:mc="http://schemas.openxmlformats.org/markup-compatibility/2006" xmlns:aink="http://schemas.microsoft.com/office/drawing/2016/ink" xmlns:am3d="http://schemas.microsoft.com/office/drawing/2017/model3d" xmlns:o="urn:schemas-microsoft-com:office:office" xmlns:oel="http://schemas.microsoft.com/office/2019/extlst" xmlns:r="http://schemas.openxmlformats.org/officeDocument/2006/relationships" xmlns:m="http://schemas.openxmlformats.org/officeDocument/2006/math" xmlns:v="urn:schemas-microsoft-com:vml" xmlns:wp14="http://schemas.microsoft.com/office/word/2010/wordprocessingDrawing" xmlns:wp="http://schemas.openxmlformats.org/drawingml/2006/wordprocessingDrawing" xmlns:w10="urn:schemas-microsoft-com:office:word" xmlns:w="http://schemas.openxmlformats.org/wordprocessingml/2006/main" xmlns:w14="http://schemas.microsoft.com/office/word/2010/wordml" xmlns:w15="http://schemas.microsoft.com/office/word/2012/wordml" xmlns:w16cex="http://schemas.microsoft.com/office/word/2018/wordml/cex" xmlns:w16cid="http://schemas.microsoft.com/office/word/2016/wordml/cid" xmlns:w16="http://schemas.microsoft.com/office/word/2018/wordml" xmlns:w16du="http://schemas.microsoft.com/office/word/2023/wordml/word16du" xmlns:w16sdtdh="http://schemas.microsoft.com/office/word/2020/wordml/sdtdatahash" xmlns:w16sdtfl="http://schemas.microsoft.com/office/word/2024/wordml/sdtformatlock" xmlns:w16se="http://schemas.microsoft.com/office/word/2015/wordml/symex" xmlns:wpg="http://schemas.microsoft.com/office/word/2010/wordprocessingGroup" xmlns:wpi="http://schemas.microsoft.com/office/word/2010/wordprocessingInk" xmlns:wne="http://schemas.microsoft.com/office/word/2006/wordml" xmlns:wps="http://schemas.microsoft.com/office/word/2010/wordprocessingShape" mc:Ignorable="w14 w15 w16se w16cid w16 w16cex w16sdtdh w16sdtfl w16du wp14">
+<w:document xmlns:wpc="http://schemas.microsoft.com/office/word/2010/wordprocessingCanvas" xmlns:cx="http://schemas.microsoft.com/office/drawing/2014/chartex" xmlns:mc="http://schemas.openxmlformats.org/markup-compatibility/2006" xmlns:o="urn:schemas-microsoft-com:office:office" xmlns:r="http://schemas.openxmlformats.org/officeDocument/2006/relationships" xmlns:m="http://schemas.openxmlformats.org/officeDocument/2006/math" xmlns:v="urn:schemas-microsoft-com:vml" xmlns:wp14="http://schemas.microsoft.com/office/word/2010/wordprocessingDrawing" xmlns:wp="http://schemas.openxmlformats.org/drawingml/2006/wordprocessingDrawing" xmlns:w10="urn:schemas-microsoft-com:office:word" xmlns:w="http://schemas.openxmlformats.org/wordprocessingml/2006/main" xmlns:w14="http://schemas.microsoft.com/office/word/2010/wordml" xmlns:w15="http://schemas.microsoft.com/office/word/2012/wordml" xmlns:w16se="http://schemas.microsoft.com/office/word/2015/wordml/symex" xmlns:wpg="http://schemas.microsoft.com/office/word/2010/wordprocessingGroup" xmlns:wpi="http://schemas.microsoft.com/office/word/2010/wordprocessingInk" xmlns:wne="http://schemas.microsoft.com/office/word/2006/wordml" xmlns:wps="http://schemas.microsoft.com/office/word/2010/wordprocessingShape" mc:Ignorable="w14 w15 w16se wp14">
   <w:body>
     <w:p>
       <w:pPr>
@@ -234,7 +234,8 @@
       </w:tblPr>
       <w:tblGrid>
         <w:gridCol w:w="2430"/>
-        <w:gridCol w:w="4954"/>
+        <w:gridCol w:w="1262"/>
+        <w:gridCol w:w="3692"/>
         <w:gridCol w:w="2290"/>
       </w:tblGrid>
       <w:tr>
@@ -276,7 +277,7 @@
         <w:tc>
           <w:tcPr>
             <w:tcW w:w="7244" w:type="dxa"/>
-            <w:gridSpan w:val="2"/>
+            <w:gridSpan w:val="3"/>
             <w:hideMark/>
           </w:tcPr>
           <w:p>
@@ -339,7 +340,7 @@
         <w:tc>
           <w:tcPr>
             <w:tcW w:w="7244" w:type="dxa"/>
-            <w:gridSpan w:val="2"/>
+            <w:gridSpan w:val="3"/>
             <w:hideMark/>
           </w:tcPr>
           <w:p>
@@ -402,7 +403,7 @@
         <w:tc>
           <w:tcPr>
             <w:tcW w:w="7244" w:type="dxa"/>
-            <w:gridSpan w:val="2"/>
+            <w:gridSpan w:val="3"/>
             <w:hideMark/>
           </w:tcPr>
           <w:p>
@@ -486,7 +487,7 @@
         <w:tc>
           <w:tcPr>
             <w:tcW w:w="7244" w:type="dxa"/>
-            <w:gridSpan w:val="2"/>
+            <w:gridSpan w:val="3"/>
           </w:tcPr>
           <w:p>
             <w:pPr>
@@ -538,7 +539,7 @@
         </w:trPr>
         <w:tc>
           <w:tcPr>
-            <w:tcW w:w="7384" w:type="dxa"/>
+            <w:tcW w:w="3692" w:type="dxa"/>
             <w:gridSpan w:val="2"/>
             <w:vAlign w:val="center"/>
             <w:hideMark/>
@@ -548,8 +549,6 @@
               <w:spacing w:line="480" w:lineRule="auto"/>
               <w:rPr>
                 <w:rFonts w:ascii="Arial" w:eastAsia="Calibri" w:hAnsi="Arial" w:cs="Arial"/>
-                <w:sz w:val="24"/>
-                <w:szCs w:val="24"/>
               </w:rPr>
             </w:pPr>
             <w:proofErr w:type="spellStart"/>
@@ -573,6 +572,32 @@
                 <w:szCs w:val="24"/>
               </w:rPr>
               <w:t>:</w:t>
+            </w:r>
+          </w:p>
+        </w:tc>
+        <w:tc>
+          <w:tcPr>
+            <w:tcW w:w="3692" w:type="dxa"/>
+            <w:vAlign w:val="center"/>
+          </w:tcPr>
+          <w:p>
+            <w:pPr>
+              <w:spacing w:line="480" w:lineRule="auto"/>
+              <w:rPr>
+                <w:rFonts w:ascii="Arial" w:eastAsia="Calibri" w:hAnsi="Arial" w:cs="Arial"/>
+                <w:sz w:val="24"/>
+                <w:szCs w:val="24"/>
+              </w:rPr>
+            </w:pPr>
+            <w:r>
+              <w:rPr>
+                <w:rFonts w:ascii="Arial" w:eastAsia="Calibri" w:hAnsi="Arial" w:cs="Arial"/>
+                <w:b/>
+                <w:bCs/>
+                <w:sz w:val="24"/>
+                <w:szCs w:val="24"/>
+              </w:rPr>
+              <w:t>Carnet:</w:t>
             </w:r>
           </w:p>
         </w:tc>
@@ -590,6 +615,7 @@
                 <w:bCs/>
                 <w:sz w:val="24"/>
                 <w:szCs w:val="24"/>
+                <w:lang w:val="es-SV"/>
               </w:rPr>
             </w:pPr>
             <w:r>
@@ -599,8 +625,9 @@
                 <w:bCs/>
                 <w:sz w:val="24"/>
                 <w:szCs w:val="24"/>
-              </w:rPr>
-              <w:t>Carnet:</w:t>
+                <w:lang w:val="es-SV"/>
+              </w:rPr>
+              <w:t>Participación:</w:t>
             </w:r>
           </w:p>
         </w:tc>
@@ -611,7 +638,7 @@
         </w:trPr>
         <w:tc>
           <w:tcPr>
-            <w:tcW w:w="7384" w:type="dxa"/>
+            <w:tcW w:w="3692" w:type="dxa"/>
             <w:gridSpan w:val="2"/>
             <w:vAlign w:val="center"/>
           </w:tcPr>
@@ -620,8 +647,6 @@
               <w:spacing w:line="480" w:lineRule="auto"/>
               <w:rPr>
                 <w:rFonts w:ascii="Arial" w:eastAsia="Calibri" w:hAnsi="Arial" w:cs="Arial"/>
-                <w:sz w:val="24"/>
-                <w:szCs w:val="24"/>
               </w:rPr>
             </w:pPr>
             <w:r>
@@ -630,7 +655,49 @@
                 <w:sz w:val="24"/>
                 <w:szCs w:val="24"/>
               </w:rPr>
-              <w:t>Cordova Kanter, Ricardo</w:t>
+              <w:t xml:space="preserve">Cordova </w:t>
+            </w:r>
+            <w:proofErr w:type="spellStart"/>
+            <w:r>
+              <w:rPr>
+                <w:rFonts w:ascii="Arial" w:eastAsia="Calibri" w:hAnsi="Arial" w:cs="Arial"/>
+                <w:sz w:val="24"/>
+                <w:szCs w:val="24"/>
+              </w:rPr>
+              <w:t>Kanter</w:t>
+            </w:r>
+            <w:proofErr w:type="spellEnd"/>
+            <w:r>
+              <w:rPr>
+                <w:rFonts w:ascii="Arial" w:eastAsia="Calibri" w:hAnsi="Arial" w:cs="Arial"/>
+                <w:sz w:val="24"/>
+                <w:szCs w:val="24"/>
+              </w:rPr>
+              <w:t>, Ricardo</w:t>
+            </w:r>
+          </w:p>
+        </w:tc>
+        <w:tc>
+          <w:tcPr>
+            <w:tcW w:w="3692" w:type="dxa"/>
+            <w:vAlign w:val="center"/>
+          </w:tcPr>
+          <w:p>
+            <w:pPr>
+              <w:spacing w:line="480" w:lineRule="auto"/>
+              <w:rPr>
+                <w:rFonts w:ascii="Arial" w:eastAsia="Calibri" w:hAnsi="Arial" w:cs="Arial"/>
+                <w:sz w:val="24"/>
+                <w:szCs w:val="24"/>
+              </w:rPr>
+            </w:pPr>
+            <w:r>
+              <w:rPr>
+                <w:rFonts w:ascii="Arial" w:eastAsia="Calibri" w:hAnsi="Arial" w:cs="Arial"/>
+                <w:sz w:val="24"/>
+                <w:szCs w:val="24"/>
+              </w:rPr>
+              <w:t>29-1576-2023</w:t>
             </w:r>
           </w:p>
         </w:tc>
@@ -642,6 +709,7 @@
           <w:p>
             <w:pPr>
               <w:spacing w:line="480" w:lineRule="auto"/>
+              <w:jc w:val="center"/>
               <w:rPr>
                 <w:rFonts w:ascii="Arial" w:eastAsia="Calibri" w:hAnsi="Arial" w:cs="Arial"/>
                 <w:sz w:val="24"/>
@@ -654,7 +722,354 @@
                 <w:sz w:val="24"/>
                 <w:szCs w:val="24"/>
               </w:rPr>
-              <w:t>29-1576-2023</w:t>
+              <w:t>20%</w:t>
+            </w:r>
+          </w:p>
+        </w:tc>
+      </w:tr>
+      <w:tr>
+        <w:trPr>
+          <w:trHeight w:val="85"/>
+        </w:trPr>
+        <w:tc>
+          <w:tcPr>
+            <w:tcW w:w="3692" w:type="dxa"/>
+            <w:gridSpan w:val="2"/>
+            <w:vAlign w:val="center"/>
+          </w:tcPr>
+          <w:p>
+            <w:pPr>
+              <w:spacing w:line="480" w:lineRule="auto"/>
+              <w:rPr>
+                <w:rFonts w:ascii="Arial" w:eastAsia="Calibri" w:hAnsi="Arial" w:cs="Arial"/>
+              </w:rPr>
+            </w:pPr>
+            <w:r>
+              <w:rPr>
+                <w:rFonts w:ascii="Arial" w:eastAsia="Calibri" w:hAnsi="Arial" w:cs="Arial"/>
+                <w:sz w:val="24"/>
+                <w:szCs w:val="24"/>
+              </w:rPr>
+              <w:t>Gomez Alfaro Marvin Enrique</w:t>
+            </w:r>
+          </w:p>
+        </w:tc>
+        <w:tc>
+          <w:tcPr>
+            <w:tcW w:w="3692" w:type="dxa"/>
+            <w:vAlign w:val="center"/>
+          </w:tcPr>
+          <w:p>
+            <w:pPr>
+              <w:spacing w:line="480" w:lineRule="auto"/>
+              <w:rPr>
+                <w:rFonts w:ascii="Arial" w:eastAsia="Calibri" w:hAnsi="Arial" w:cs="Arial"/>
+                <w:sz w:val="24"/>
+                <w:szCs w:val="24"/>
+              </w:rPr>
+            </w:pPr>
+            <w:r>
+              <w:rPr>
+                <w:rFonts w:ascii="Arial" w:eastAsia="Calibri" w:hAnsi="Arial" w:cs="Arial"/>
+                <w:sz w:val="24"/>
+                <w:szCs w:val="24"/>
+              </w:rPr>
+              <w:t>29-4990-2022</w:t>
+            </w:r>
+          </w:p>
+        </w:tc>
+        <w:tc>
+          <w:tcPr>
+            <w:tcW w:w="2290" w:type="dxa"/>
+            <w:vAlign w:val="center"/>
+          </w:tcPr>
+          <w:p>
+            <w:pPr>
+              <w:spacing w:line="480" w:lineRule="auto"/>
+              <w:jc w:val="center"/>
+              <w:rPr>
+                <w:rFonts w:ascii="Arial" w:eastAsia="Calibri" w:hAnsi="Arial" w:cs="Arial"/>
+                <w:sz w:val="24"/>
+                <w:szCs w:val="24"/>
+              </w:rPr>
+            </w:pPr>
+            <w:r>
+              <w:rPr>
+                <w:rFonts w:ascii="Arial" w:eastAsia="Calibri" w:hAnsi="Arial" w:cs="Arial"/>
+                <w:sz w:val="24"/>
+                <w:szCs w:val="24"/>
+              </w:rPr>
+              <w:t>20%</w:t>
+            </w:r>
+          </w:p>
+        </w:tc>
+      </w:tr>
+      <w:tr>
+        <w:trPr>
+          <w:trHeight w:val="346"/>
+        </w:trPr>
+        <w:tc>
+          <w:tcPr>
+            <w:tcW w:w="3692" w:type="dxa"/>
+            <w:gridSpan w:val="2"/>
+            <w:vAlign w:val="center"/>
+          </w:tcPr>
+          <w:p>
+            <w:pPr>
+              <w:spacing w:line="480" w:lineRule="auto"/>
+              <w:rPr>
+                <w:rFonts w:ascii="Arial" w:eastAsia="Calibri" w:hAnsi="Arial" w:cs="Arial"/>
+              </w:rPr>
+            </w:pPr>
+            <w:r>
+              <w:rPr>
+                <w:rFonts w:ascii="Arial" w:eastAsia="Calibri" w:hAnsi="Arial" w:cs="Arial"/>
+                <w:sz w:val="24"/>
+                <w:szCs w:val="24"/>
+              </w:rPr>
+              <w:t xml:space="preserve">Herrera Cortez Jose </w:t>
+            </w:r>
+            <w:proofErr w:type="spellStart"/>
+            <w:r>
+              <w:rPr>
+                <w:rFonts w:ascii="Arial" w:eastAsia="Calibri" w:hAnsi="Arial" w:cs="Arial"/>
+                <w:sz w:val="24"/>
+                <w:szCs w:val="24"/>
+              </w:rPr>
+              <w:t>Neftali</w:t>
+            </w:r>
+            <w:proofErr w:type="spellEnd"/>
+          </w:p>
+        </w:tc>
+        <w:tc>
+          <w:tcPr>
+            <w:tcW w:w="3692" w:type="dxa"/>
+            <w:vAlign w:val="center"/>
+          </w:tcPr>
+          <w:p>
+            <w:pPr>
+              <w:spacing w:line="480" w:lineRule="auto"/>
+              <w:rPr>
+                <w:rFonts w:ascii="Arial" w:eastAsia="Calibri" w:hAnsi="Arial" w:cs="Arial"/>
+                <w:sz w:val="24"/>
+                <w:szCs w:val="24"/>
+              </w:rPr>
+            </w:pPr>
+            <w:r>
+              <w:rPr>
+                <w:rFonts w:ascii="Arial" w:eastAsia="Calibri" w:hAnsi="Arial" w:cs="Arial"/>
+                <w:sz w:val="24"/>
+                <w:szCs w:val="24"/>
+              </w:rPr>
+              <w:t>29-4238-2022</w:t>
+            </w:r>
+          </w:p>
+        </w:tc>
+        <w:tc>
+          <w:tcPr>
+            <w:tcW w:w="2290" w:type="dxa"/>
+            <w:vAlign w:val="center"/>
+          </w:tcPr>
+          <w:p>
+            <w:pPr>
+              <w:spacing w:line="480" w:lineRule="auto"/>
+              <w:jc w:val="center"/>
+              <w:rPr>
+                <w:rFonts w:ascii="Arial" w:eastAsia="Calibri" w:hAnsi="Arial" w:cs="Arial"/>
+                <w:sz w:val="24"/>
+                <w:szCs w:val="24"/>
+              </w:rPr>
+            </w:pPr>
+            <w:r>
+              <w:rPr>
+                <w:rFonts w:ascii="Arial" w:eastAsia="Calibri" w:hAnsi="Arial" w:cs="Arial"/>
+                <w:sz w:val="24"/>
+                <w:szCs w:val="24"/>
+              </w:rPr>
+              <w:t>20%</w:t>
+            </w:r>
+          </w:p>
+        </w:tc>
+      </w:tr>
+      <w:tr>
+        <w:trPr>
+          <w:trHeight w:val="85"/>
+        </w:trPr>
+        <w:tc>
+          <w:tcPr>
+            <w:tcW w:w="3692" w:type="dxa"/>
+            <w:gridSpan w:val="2"/>
+            <w:vAlign w:val="center"/>
+          </w:tcPr>
+          <w:p>
+            <w:pPr>
+              <w:spacing w:line="480" w:lineRule="auto"/>
+              <w:rPr>
+                <w:rFonts w:ascii="Arial" w:eastAsia="Calibri" w:hAnsi="Arial" w:cs="Arial"/>
+              </w:rPr>
+            </w:pPr>
+            <w:proofErr w:type="spellStart"/>
+            <w:r>
+              <w:rPr>
+                <w:rFonts w:ascii="Arial" w:eastAsia="Calibri" w:hAnsi="Arial" w:cs="Arial"/>
+                <w:sz w:val="24"/>
+                <w:szCs w:val="24"/>
+              </w:rPr>
+              <w:t>Mejía</w:t>
+            </w:r>
+            <w:proofErr w:type="spellEnd"/>
+            <w:r>
+              <w:rPr>
+                <w:rFonts w:ascii="Arial" w:eastAsia="Calibri" w:hAnsi="Arial" w:cs="Arial"/>
+                <w:sz w:val="24"/>
+                <w:szCs w:val="24"/>
+              </w:rPr>
+              <w:t xml:space="preserve"> Méndez Ronald Joel</w:t>
+            </w:r>
+          </w:p>
+        </w:tc>
+        <w:tc>
+          <w:tcPr>
+            <w:tcW w:w="3692" w:type="dxa"/>
+            <w:vAlign w:val="center"/>
+          </w:tcPr>
+          <w:p>
+            <w:pPr>
+              <w:spacing w:line="480" w:lineRule="auto"/>
+              <w:rPr>
+                <w:rFonts w:ascii="Arial" w:eastAsia="Calibri" w:hAnsi="Arial" w:cs="Arial"/>
+                <w:sz w:val="24"/>
+                <w:szCs w:val="24"/>
+              </w:rPr>
+            </w:pPr>
+            <w:r>
+              <w:rPr>
+                <w:rFonts w:ascii="Arial" w:eastAsia="Calibri" w:hAnsi="Arial" w:cs="Arial"/>
+                <w:sz w:val="24"/>
+                <w:szCs w:val="24"/>
+              </w:rPr>
+              <w:t>29-4391-2022</w:t>
+            </w:r>
+          </w:p>
+        </w:tc>
+        <w:tc>
+          <w:tcPr>
+            <w:tcW w:w="2290" w:type="dxa"/>
+            <w:vAlign w:val="center"/>
+          </w:tcPr>
+          <w:p>
+            <w:pPr>
+              <w:spacing w:line="480" w:lineRule="auto"/>
+              <w:jc w:val="center"/>
+              <w:rPr>
+                <w:rFonts w:ascii="Arial" w:eastAsia="Calibri" w:hAnsi="Arial" w:cs="Arial"/>
+                <w:sz w:val="24"/>
+                <w:szCs w:val="24"/>
+              </w:rPr>
+            </w:pPr>
+            <w:r>
+              <w:rPr>
+                <w:rFonts w:ascii="Arial" w:eastAsia="Calibri" w:hAnsi="Arial" w:cs="Arial"/>
+                <w:sz w:val="24"/>
+                <w:szCs w:val="24"/>
+              </w:rPr>
+              <w:t>20%</w:t>
+            </w:r>
+          </w:p>
+        </w:tc>
+      </w:tr>
+      <w:tr>
+        <w:trPr>
+          <w:trHeight w:val="85"/>
+        </w:trPr>
+        <w:tc>
+          <w:tcPr>
+            <w:tcW w:w="3692" w:type="dxa"/>
+            <w:gridSpan w:val="2"/>
+            <w:vAlign w:val="center"/>
+          </w:tcPr>
+          <w:p>
+            <w:pPr>
+              <w:spacing w:line="480" w:lineRule="auto"/>
+              <w:rPr>
+                <w:rFonts w:ascii="Arial" w:eastAsia="Calibri" w:hAnsi="Arial" w:cs="Arial"/>
+              </w:rPr>
+            </w:pPr>
+            <w:r>
+              <w:rPr>
+                <w:rFonts w:ascii="Arial" w:eastAsia="Calibri" w:hAnsi="Arial" w:cs="Arial"/>
+                <w:sz w:val="24"/>
+              </w:rPr>
+              <w:t xml:space="preserve">Morales </w:t>
+            </w:r>
+            <w:proofErr w:type="spellStart"/>
+            <w:r>
+              <w:rPr>
+                <w:rFonts w:ascii="Arial" w:eastAsia="Calibri" w:hAnsi="Arial" w:cs="Arial"/>
+                <w:sz w:val="24"/>
+              </w:rPr>
+              <w:t>López</w:t>
+            </w:r>
+            <w:proofErr w:type="spellEnd"/>
+            <w:r>
+              <w:rPr>
+                <w:rFonts w:ascii="Arial" w:eastAsia="Calibri" w:hAnsi="Arial" w:cs="Arial"/>
+                <w:sz w:val="24"/>
+              </w:rPr>
+              <w:t xml:space="preserve"> </w:t>
+            </w:r>
+            <w:r>
+              <w:rPr>
+                <w:rFonts w:ascii="Arial" w:eastAsia="Calibri" w:hAnsi="Arial" w:cs="Arial"/>
+                <w:sz w:val="24"/>
+              </w:rPr>
+              <w:t xml:space="preserve"> César Orlando</w:t>
+            </w:r>
+          </w:p>
+        </w:tc>
+        <w:tc>
+          <w:tcPr>
+            <w:tcW w:w="3692" w:type="dxa"/>
+            <w:vAlign w:val="center"/>
+          </w:tcPr>
+          <w:p>
+            <w:pPr>
+              <w:spacing w:line="480" w:lineRule="auto"/>
+              <w:rPr>
+                <w:rFonts w:ascii="Arial" w:eastAsia="Calibri" w:hAnsi="Arial" w:cs="Arial"/>
+                <w:sz w:val="24"/>
+              </w:rPr>
+            </w:pPr>
+            <w:r>
+              <w:rPr>
+                <w:rFonts w:ascii="Arial" w:eastAsia="Calibri" w:hAnsi="Arial" w:cs="Arial"/>
+                <w:sz w:val="24"/>
+              </w:rPr>
+              <w:t>29-0827-2023</w:t>
+            </w:r>
+          </w:p>
+        </w:tc>
+        <w:tc>
+          <w:tcPr>
+            <w:tcW w:w="2290" w:type="dxa"/>
+            <w:vAlign w:val="center"/>
+          </w:tcPr>
+          <w:p>
+            <w:pPr>
+              <w:spacing w:line="480" w:lineRule="auto"/>
+              <w:jc w:val="center"/>
+              <w:rPr>
+                <w:rFonts w:ascii="Arial" w:eastAsia="Calibri" w:hAnsi="Arial" w:cs="Arial"/>
+                <w:sz w:val="24"/>
+              </w:rPr>
+            </w:pPr>
+            <w:r>
+              <w:rPr>
+                <w:rFonts w:ascii="Arial" w:eastAsia="Calibri" w:hAnsi="Arial" w:cs="Arial"/>
+                <w:sz w:val="24"/>
+                <w:szCs w:val="24"/>
+              </w:rPr>
+              <w:t>20%</w:t>
             </w:r>
           </w:p>
         </w:tc>
@@ -666,249 +1081,7 @@
         <w:tc>
           <w:tcPr>
             <w:tcW w:w="7384" w:type="dxa"/>
-            <w:gridSpan w:val="2"/>
-            <w:vAlign w:val="center"/>
-          </w:tcPr>
-          <w:p>
-            <w:pPr>
-              <w:spacing w:line="480" w:lineRule="auto"/>
-              <w:rPr>
-                <w:rFonts w:ascii="Arial" w:eastAsia="Calibri" w:hAnsi="Arial" w:cs="Arial"/>
-                <w:sz w:val="24"/>
-                <w:szCs w:val="24"/>
-              </w:rPr>
-            </w:pPr>
-            <w:r>
-              <w:rPr>
-                <w:rFonts w:ascii="Arial" w:eastAsia="Calibri" w:hAnsi="Arial" w:cs="Arial"/>
-                <w:sz w:val="24"/>
-                <w:szCs w:val="24"/>
-              </w:rPr>
-              <w:t>Gomez Alfaro Marvin Enrique</w:t>
-            </w:r>
-          </w:p>
-        </w:tc>
-        <w:tc>
-          <w:tcPr>
-            <w:tcW w:w="2290" w:type="dxa"/>
-            <w:vAlign w:val="center"/>
-          </w:tcPr>
-          <w:p>
-            <w:pPr>
-              <w:spacing w:line="480" w:lineRule="auto"/>
-              <w:rPr>
-                <w:rFonts w:ascii="Arial" w:eastAsia="Calibri" w:hAnsi="Arial" w:cs="Arial"/>
-                <w:sz w:val="24"/>
-                <w:szCs w:val="24"/>
-              </w:rPr>
-            </w:pPr>
-            <w:r>
-              <w:rPr>
-                <w:rFonts w:ascii="Arial" w:eastAsia="Calibri" w:hAnsi="Arial" w:cs="Arial"/>
-                <w:sz w:val="24"/>
-                <w:szCs w:val="24"/>
-              </w:rPr>
-              <w:t>29-4990-2022</w:t>
-            </w:r>
-          </w:p>
-        </w:tc>
-      </w:tr>
-      <w:tr>
-        <w:trPr>
-          <w:trHeight w:val="346"/>
-        </w:trPr>
-        <w:tc>
-          <w:tcPr>
-            <w:tcW w:w="7384" w:type="dxa"/>
-            <w:gridSpan w:val="2"/>
-            <w:vAlign w:val="center"/>
-          </w:tcPr>
-          <w:p>
-            <w:pPr>
-              <w:spacing w:line="480" w:lineRule="auto"/>
-              <w:rPr>
-                <w:rFonts w:ascii="Arial" w:eastAsia="Calibri" w:hAnsi="Arial" w:cs="Arial"/>
-                <w:sz w:val="24"/>
-                <w:szCs w:val="24"/>
-              </w:rPr>
-            </w:pPr>
-            <w:r>
-              <w:rPr>
-                <w:rFonts w:ascii="Arial" w:eastAsia="Calibri" w:hAnsi="Arial" w:cs="Arial"/>
-                <w:sz w:val="24"/>
-                <w:szCs w:val="24"/>
-              </w:rPr>
-              <w:t>Herrera Cortez Jose Neftali</w:t>
-            </w:r>
-          </w:p>
-        </w:tc>
-        <w:tc>
-          <w:tcPr>
-            <w:tcW w:w="2290" w:type="dxa"/>
-            <w:vAlign w:val="center"/>
-          </w:tcPr>
-          <w:p>
-            <w:pPr>
-              <w:spacing w:line="480" w:lineRule="auto"/>
-              <w:rPr>
-                <w:rFonts w:ascii="Arial" w:eastAsia="Calibri" w:hAnsi="Arial" w:cs="Arial"/>
-                <w:sz w:val="24"/>
-                <w:szCs w:val="24"/>
-              </w:rPr>
-            </w:pPr>
-            <w:r>
-              <w:rPr>
-                <w:rFonts w:ascii="Arial" w:eastAsia="Calibri" w:hAnsi="Arial" w:cs="Arial"/>
-                <w:sz w:val="24"/>
-                <w:szCs w:val="24"/>
-              </w:rPr>
-              <w:t>29-4238-2022</w:t>
-            </w:r>
-          </w:p>
-        </w:tc>
-      </w:tr>
-      <w:tr>
-        <w:trPr>
-          <w:trHeight w:val="85"/>
-        </w:trPr>
-        <w:tc>
-          <w:tcPr>
-            <w:tcW w:w="7384" w:type="dxa"/>
-            <w:gridSpan w:val="2"/>
-            <w:vAlign w:val="center"/>
-          </w:tcPr>
-          <w:p>
-            <w:pPr>
-              <w:spacing w:line="480" w:lineRule="auto"/>
-              <w:rPr>
-                <w:rFonts w:ascii="Arial" w:eastAsia="Calibri" w:hAnsi="Arial" w:cs="Arial"/>
-                <w:sz w:val="24"/>
-                <w:szCs w:val="24"/>
-              </w:rPr>
-            </w:pPr>
-            <w:r>
-              <w:rPr>
-                <w:rFonts w:ascii="Arial" w:eastAsia="Calibri" w:hAnsi="Arial" w:cs="Arial"/>
-                <w:sz w:val="24"/>
-                <w:szCs w:val="24"/>
-              </w:rPr>
-              <w:t>Mejía Méndez Ronald Joel</w:t>
-            </w:r>
-          </w:p>
-        </w:tc>
-        <w:tc>
-          <w:tcPr>
-            <w:tcW w:w="2290" w:type="dxa"/>
-            <w:vAlign w:val="center"/>
-          </w:tcPr>
-          <w:p>
-            <w:pPr>
-              <w:spacing w:line="480" w:lineRule="auto"/>
-              <w:rPr>
-                <w:rFonts w:ascii="Arial" w:eastAsia="Calibri" w:hAnsi="Arial" w:cs="Arial"/>
-                <w:sz w:val="24"/>
-                <w:szCs w:val="24"/>
-              </w:rPr>
-            </w:pPr>
-            <w:r>
-              <w:rPr>
-                <w:rFonts w:ascii="Arial" w:eastAsia="Calibri" w:hAnsi="Arial" w:cs="Arial"/>
-                <w:sz w:val="24"/>
-                <w:szCs w:val="24"/>
-              </w:rPr>
-              <w:t>29-4391-2022</w:t>
-            </w:r>
-          </w:p>
-        </w:tc>
-      </w:tr>
-      <w:tr>
-        <w:trPr>
-          <w:trHeight w:val="85"/>
-        </w:trPr>
-        <w:tc>
-          <w:tcPr>
-            <w:tcW w:w="7384" w:type="dxa"/>
-            <w:gridSpan w:val="2"/>
-            <w:vAlign w:val="center"/>
-          </w:tcPr>
-          <w:p>
-            <w:pPr>
-              <w:spacing w:line="480" w:lineRule="auto"/>
-              <w:rPr>
-                <w:rFonts w:ascii="Arial" w:eastAsia="Calibri" w:hAnsi="Arial" w:cs="Arial"/>
-                <w:sz w:val="24"/>
-              </w:rPr>
-            </w:pPr>
-            <w:r>
-              <w:rPr>
-                <w:rFonts w:ascii="Arial" w:eastAsia="Calibri" w:hAnsi="Arial" w:cs="Arial"/>
-                <w:sz w:val="24"/>
-              </w:rPr>
-              <w:t xml:space="preserve">Morales </w:t>
-            </w:r>
-            <w:proofErr w:type="gramStart"/>
-            <w:r>
-              <w:rPr>
-                <w:rFonts w:ascii="Arial" w:eastAsia="Calibri" w:hAnsi="Arial" w:cs="Arial"/>
-                <w:sz w:val="24"/>
-              </w:rPr>
-              <w:t>López</w:t>
-            </w:r>
-            <w:r>
-              <w:rPr>
-                <w:rFonts w:ascii="Arial" w:eastAsia="Calibri" w:hAnsi="Arial" w:cs="Arial"/>
-                <w:sz w:val="24"/>
-              </w:rPr>
-              <w:t xml:space="preserve"> </w:t>
-            </w:r>
-            <w:r>
-              <w:rPr>
-                <w:rFonts w:ascii="Arial" w:eastAsia="Calibri" w:hAnsi="Arial" w:cs="Arial"/>
-                <w:sz w:val="24"/>
-              </w:rPr>
-              <w:t xml:space="preserve"> César</w:t>
-            </w:r>
-            <w:proofErr w:type="gramEnd"/>
-            <w:r>
-              <w:rPr>
-                <w:rFonts w:ascii="Arial" w:eastAsia="Calibri" w:hAnsi="Arial" w:cs="Arial"/>
-                <w:sz w:val="24"/>
-              </w:rPr>
-              <w:t xml:space="preserve"> Orlando</w:t>
-            </w:r>
-          </w:p>
-        </w:tc>
-        <w:tc>
-          <w:tcPr>
-            <w:tcW w:w="2290" w:type="dxa"/>
-            <w:vAlign w:val="center"/>
-          </w:tcPr>
-          <w:p>
-            <w:pPr>
-              <w:spacing w:line="480" w:lineRule="auto"/>
-              <w:rPr>
-                <w:rFonts w:ascii="Arial" w:eastAsia="Calibri" w:hAnsi="Arial" w:cs="Arial"/>
-                <w:sz w:val="24"/>
-              </w:rPr>
-            </w:pPr>
-            <w:r>
-              <w:rPr>
-                <w:rFonts w:ascii="Arial" w:eastAsia="Calibri" w:hAnsi="Arial" w:cs="Arial"/>
-                <w:sz w:val="24"/>
-              </w:rPr>
-              <w:t>29-0827-2023</w:t>
-            </w:r>
-          </w:p>
-        </w:tc>
-      </w:tr>
-      <w:tr>
-        <w:trPr>
-          <w:trHeight w:val="85"/>
-        </w:trPr>
-        <w:tc>
-          <w:tcPr>
-            <w:tcW w:w="7384" w:type="dxa"/>
-            <w:gridSpan w:val="2"/>
+            <w:gridSpan w:val="3"/>
             <w:vAlign w:val="center"/>
           </w:tcPr>
           <w:p>
@@ -946,7 +1119,7 @@
         <w:tc>
           <w:tcPr>
             <w:tcW w:w="9674" w:type="dxa"/>
-            <w:gridSpan w:val="3"/>
+            <w:gridSpan w:val="4"/>
             <w:vAlign w:val="bottom"/>
           </w:tcPr>
           <w:p>
@@ -989,7 +1162,7 @@
                 <w:szCs w:val="24"/>
                 <w:lang w:val="es-SV"/>
               </w:rPr>
-              <w:t>1</w:t>
+              <w:t xml:space="preserve">20 </w:t>
             </w:r>
             <w:r>
               <w:rPr>
@@ -998,7 +1171,7 @@
                 <w:szCs w:val="24"/>
                 <w:lang w:val="es-SV"/>
               </w:rPr>
-              <w:t>8</w:t>
+              <w:t xml:space="preserve">de </w:t>
             </w:r>
             <w:r>
               <w:rPr>
@@ -1007,19 +1180,8 @@
                 <w:szCs w:val="24"/>
                 <w:lang w:val="es-SV"/>
               </w:rPr>
-              <w:t xml:space="preserve"> de </w:t>
-            </w:r>
-            <w:proofErr w:type="gramStart"/>
-            <w:r>
-              <w:rPr>
-                <w:rFonts w:ascii="Arial" w:eastAsia="Calibri" w:hAnsi="Arial" w:cs="Arial"/>
-                <w:sz w:val="24"/>
-                <w:szCs w:val="24"/>
-                <w:lang w:val="es-SV"/>
-              </w:rPr>
               <w:t>Marzo</w:t>
             </w:r>
-            <w:proofErr w:type="gramEnd"/>
             <w:r>
               <w:rPr>
                 <w:rFonts w:ascii="Arial" w:eastAsia="Calibri" w:hAnsi="Arial" w:cs="Arial"/>
@@ -1088,7 +1250,7 @@
       <w:sdtContent>
         <w:p>
           <w:pPr>
-            <w:pStyle w:val="TOCHeading"/>
+            <w:pStyle w:val="TtuloTDC"/>
           </w:pPr>
           <w:r>
             <w:t>Contenido</w:t>
@@ -1096,7 +1258,7 @@
         </w:p>
         <w:p>
           <w:pPr>
-            <w:pStyle w:val="TOC1"/>
+            <w:pStyle w:val="TDC1"/>
             <w:tabs>
               <w:tab w:val="right" w:leader="dot" w:pos="9350"/>
             </w:tabs>
@@ -1115,10 +1277,10 @@
           <w:r>
             <w:fldChar w:fldCharType="separate"/>
           </w:r>
-          <w:hyperlink w:anchor="_Toc224035365" w:history="1">
-            <w:r>
-              <w:rPr>
-                <w:rStyle w:val="Hyperlink"/>
+          <w:hyperlink w:anchor="_Toc224570635" w:history="1">
+            <w:r>
+              <w:rPr>
+                <w:rStyle w:val="Hipervnculo"/>
                 <w:rFonts w:ascii="Arial" w:hAnsi="Arial" w:cs="Arial"/>
                 <w:b/>
                 <w:bCs/>
@@ -1145,7 +1307,7 @@
                 <w:noProof/>
                 <w:webHidden/>
               </w:rPr>
-              <w:instrText xml:space="preserve"> PAGEREF _Toc224035365 \h </w:instrText>
+              <w:instrText xml:space="preserve"> PAGEREF _Toc224570635 \h </w:instrText>
             </w:r>
             <w:r>
               <w:rPr>
@@ -1178,7 +1340,7 @@
         </w:p>
         <w:p>
           <w:pPr>
-            <w:pStyle w:val="TOC1"/>
+            <w:pStyle w:val="TDC1"/>
             <w:tabs>
               <w:tab w:val="right" w:leader="dot" w:pos="9350"/>
             </w:tabs>
@@ -1188,10 +1350,10 @@
               <w:lang w:eastAsia="es-SV"/>
             </w:rPr>
           </w:pPr>
-          <w:hyperlink w:anchor="_Toc224035366" w:history="1">
-            <w:r>
-              <w:rPr>
-                <w:rStyle w:val="Hyperlink"/>
+          <w:hyperlink w:anchor="_Toc224570636" w:history="1">
+            <w:r>
+              <w:rPr>
+                <w:rStyle w:val="Hipervnculo"/>
                 <w:rFonts w:ascii="Arial" w:hAnsi="Arial" w:cs="Arial"/>
                 <w:b/>
                 <w:bCs/>
@@ -1218,7 +1380,7 @@
                 <w:noProof/>
                 <w:webHidden/>
               </w:rPr>
-              <w:instrText xml:space="preserve"> PAGEREF _Toc224035366 \h </w:instrText>
+              <w:instrText xml:space="preserve"> PAGEREF _Toc224570636 \h </w:instrText>
             </w:r>
             <w:r>
               <w:rPr>
@@ -1238,7 +1400,7 @@
                 <w:noProof/>
                 <w:webHidden/>
               </w:rPr>
-              <w:t>1</w:t>
+              <w:t>2</w:t>
             </w:r>
             <w:r>
               <w:rPr>
@@ -1251,7 +1413,7 @@
         </w:p>
         <w:p>
           <w:pPr>
-            <w:pStyle w:val="TOC2"/>
+            <w:pStyle w:val="TDC2"/>
             <w:tabs>
               <w:tab w:val="right" w:leader="dot" w:pos="9350"/>
             </w:tabs>
@@ -1261,10 +1423,10 @@
               <w:lang w:eastAsia="es-SV"/>
             </w:rPr>
           </w:pPr>
-          <w:hyperlink w:anchor="_Toc224035367" w:history="1">
-            <w:r>
-              <w:rPr>
-                <w:rStyle w:val="Hyperlink"/>
+          <w:hyperlink w:anchor="_Toc224570637" w:history="1">
+            <w:r>
+              <w:rPr>
+                <w:rStyle w:val="Hipervnculo"/>
                 <w:rFonts w:ascii="Arial" w:hAnsi="Arial" w:cs="Arial"/>
                 <w:noProof/>
               </w:rPr>
@@ -1289,7 +1451,7 @@
                 <w:noProof/>
                 <w:webHidden/>
               </w:rPr>
-              <w:instrText xml:space="preserve"> PAGEREF _Toc224035367 \h </w:instrText>
+              <w:instrText xml:space="preserve"> PAGEREF _Toc224570637 \h </w:instrText>
             </w:r>
             <w:r>
               <w:rPr>
@@ -1309,7 +1471,7 @@
                 <w:noProof/>
                 <w:webHidden/>
               </w:rPr>
-              <w:t>1</w:t>
+              <w:t>2</w:t>
             </w:r>
             <w:r>
               <w:rPr>
@@ -1322,7 +1484,7 @@
         </w:p>
         <w:p>
           <w:pPr>
-            <w:pStyle w:val="TOC2"/>
+            <w:pStyle w:val="TDC2"/>
             <w:tabs>
               <w:tab w:val="right" w:leader="dot" w:pos="9350"/>
             </w:tabs>
@@ -1332,10 +1494,10 @@
               <w:lang w:eastAsia="es-SV"/>
             </w:rPr>
           </w:pPr>
-          <w:hyperlink w:anchor="_Toc224035368" w:history="1">
-            <w:r>
-              <w:rPr>
-                <w:rStyle w:val="Hyperlink"/>
+          <w:hyperlink w:anchor="_Toc224570638" w:history="1">
+            <w:r>
+              <w:rPr>
+                <w:rStyle w:val="Hipervnculo"/>
                 <w:rFonts w:ascii="Arial" w:hAnsi="Arial" w:cs="Arial"/>
                 <w:noProof/>
               </w:rPr>
@@ -1360,7 +1522,7 @@
                 <w:noProof/>
                 <w:webHidden/>
               </w:rPr>
-              <w:instrText xml:space="preserve"> PAGEREF _Toc224035368 \h </w:instrText>
+              <w:instrText xml:space="preserve"> PAGEREF _Toc224570638 \h </w:instrText>
             </w:r>
             <w:r>
               <w:rPr>
@@ -1380,7 +1542,7 @@
                 <w:noProof/>
                 <w:webHidden/>
               </w:rPr>
-              <w:t>1</w:t>
+              <w:t>3</w:t>
             </w:r>
             <w:r>
               <w:rPr>
@@ -1393,7 +1555,7 @@
         </w:p>
         <w:p>
           <w:pPr>
-            <w:pStyle w:val="TOC2"/>
+            <w:pStyle w:val="TDC2"/>
             <w:tabs>
               <w:tab w:val="right" w:leader="dot" w:pos="9350"/>
             </w:tabs>
@@ -1403,14 +1565,14 @@
               <w:lang w:eastAsia="es-SV"/>
             </w:rPr>
           </w:pPr>
-          <w:hyperlink w:anchor="_Toc224035369" w:history="1">
-            <w:r>
-              <w:rPr>
-                <w:rStyle w:val="Hyperlink"/>
+          <w:hyperlink w:anchor="_Toc224570639" w:history="1">
+            <w:r>
+              <w:rPr>
+                <w:rStyle w:val="Hipervnculo"/>
                 <w:rFonts w:ascii="Arial" w:hAnsi="Arial" w:cs="Arial"/>
                 <w:noProof/>
               </w:rPr>
-              <w:t>Conclusión del diagnostico</w:t>
+              <w:t>Debilidades del proceso identificadas (según enfoque CMMI)</w:t>
             </w:r>
             <w:r>
               <w:rPr>
@@ -1431,7 +1593,7 @@
                 <w:noProof/>
                 <w:webHidden/>
               </w:rPr>
-              <w:instrText xml:space="preserve"> PAGEREF _Toc224035369 \h </w:instrText>
+              <w:instrText xml:space="preserve"> PAGEREF _Toc224570639 \h </w:instrText>
             </w:r>
             <w:r>
               <w:rPr>
@@ -1451,7 +1613,7 @@
                 <w:noProof/>
                 <w:webHidden/>
               </w:rPr>
-              <w:t>1</w:t>
+              <w:t>4</w:t>
             </w:r>
             <w:r>
               <w:rPr>
@@ -1464,7 +1626,7 @@
         </w:p>
         <w:p>
           <w:pPr>
-            <w:pStyle w:val="TOC1"/>
+            <w:pStyle w:val="TDC2"/>
             <w:tabs>
               <w:tab w:val="right" w:leader="dot" w:pos="9350"/>
             </w:tabs>
@@ -1474,16 +1636,14 @@
               <w:lang w:eastAsia="es-SV"/>
             </w:rPr>
           </w:pPr>
-          <w:hyperlink w:anchor="_Toc224035370" w:history="1">
-            <w:r>
-              <w:rPr>
-                <w:rStyle w:val="Hyperlink"/>
+          <w:hyperlink w:anchor="_Toc224570640" w:history="1">
+            <w:r>
+              <w:rPr>
+                <w:rStyle w:val="Hipervnculo"/>
                 <w:rFonts w:ascii="Arial" w:hAnsi="Arial" w:cs="Arial"/>
-                <w:b/>
-                <w:bCs/>
-                <w:noProof/>
-              </w:rPr>
-              <w:t>Diagramas AS-IS</w:t>
+                <w:noProof/>
+              </w:rPr>
+              <w:t>Conclusión del diagnostico</w:t>
             </w:r>
             <w:r>
               <w:rPr>
@@ -1504,7 +1664,7 @@
                 <w:noProof/>
                 <w:webHidden/>
               </w:rPr>
-              <w:instrText xml:space="preserve"> PAGEREF _Toc224035370 \h </w:instrText>
+              <w:instrText xml:space="preserve"> PAGEREF _Toc224570640 \h </w:instrText>
             </w:r>
             <w:r>
               <w:rPr>
@@ -1524,7 +1684,7 @@
                 <w:noProof/>
                 <w:webHidden/>
               </w:rPr>
-              <w:t>2</w:t>
+              <w:t>5</w:t>
             </w:r>
             <w:r>
               <w:rPr>
@@ -1537,7 +1697,7 @@
         </w:p>
         <w:p>
           <w:pPr>
-            <w:pStyle w:val="TOC2"/>
+            <w:pStyle w:val="TDC1"/>
             <w:tabs>
               <w:tab w:val="right" w:leader="dot" w:pos="9350"/>
             </w:tabs>
@@ -1547,14 +1707,16 @@
               <w:lang w:eastAsia="es-SV"/>
             </w:rPr>
           </w:pPr>
-          <w:hyperlink w:anchor="_Toc224035371" w:history="1">
-            <w:r>
-              <w:rPr>
-                <w:rStyle w:val="Hyperlink"/>
+          <w:hyperlink w:anchor="_Toc224570641" w:history="1">
+            <w:r>
+              <w:rPr>
+                <w:rStyle w:val="Hipervnculo"/>
                 <w:rFonts w:ascii="Arial" w:hAnsi="Arial" w:cs="Arial"/>
-                <w:noProof/>
-              </w:rPr>
-              <w:t>Buscar un documento en el correo</w:t>
+                <w:b/>
+                <w:bCs/>
+                <w:noProof/>
+              </w:rPr>
+              <w:t>Diagramas AS-IS</w:t>
             </w:r>
             <w:r>
               <w:rPr>
@@ -1575,7 +1737,7 @@
                 <w:noProof/>
                 <w:webHidden/>
               </w:rPr>
-              <w:instrText xml:space="preserve"> PAGEREF _Toc224035371 \h </w:instrText>
+              <w:instrText xml:space="preserve"> PAGEREF _Toc224570641 \h </w:instrText>
             </w:r>
             <w:r>
               <w:rPr>
@@ -1595,7 +1757,7 @@
                 <w:noProof/>
                 <w:webHidden/>
               </w:rPr>
-              <w:t>2</w:t>
+              <w:t>6</w:t>
             </w:r>
             <w:r>
               <w:rPr>
@@ -1608,7 +1770,7 @@
         </w:p>
         <w:p>
           <w:pPr>
-            <w:pStyle w:val="TOC2"/>
+            <w:pStyle w:val="TDC2"/>
             <w:tabs>
               <w:tab w:val="right" w:leader="dot" w:pos="9350"/>
             </w:tabs>
@@ -1618,14 +1780,14 @@
               <w:lang w:eastAsia="es-SV"/>
             </w:rPr>
           </w:pPr>
-          <w:hyperlink w:anchor="_Toc224035372" w:history="1">
-            <w:r>
-              <w:rPr>
-                <w:rStyle w:val="Hyperlink"/>
+          <w:hyperlink w:anchor="_Toc224570642" w:history="1">
+            <w:r>
+              <w:rPr>
+                <w:rStyle w:val="Hipervnculo"/>
                 <w:rFonts w:ascii="Arial" w:hAnsi="Arial" w:cs="Arial"/>
                 <w:noProof/>
               </w:rPr>
-              <w:t>Buscar un documento en los archivos compartidos</w:t>
+              <w:t>Buscar un documento en el correo</w:t>
             </w:r>
             <w:r>
               <w:rPr>
@@ -1646,7 +1808,7 @@
                 <w:noProof/>
                 <w:webHidden/>
               </w:rPr>
-              <w:instrText xml:space="preserve"> PAGEREF _Toc224035372 \h </w:instrText>
+              <w:instrText xml:space="preserve"> PAGEREF _Toc224570642 \h </w:instrText>
             </w:r>
             <w:r>
               <w:rPr>
@@ -1666,7 +1828,7 @@
                 <w:noProof/>
                 <w:webHidden/>
               </w:rPr>
-              <w:t>2</w:t>
+              <w:t>6</w:t>
             </w:r>
             <w:r>
               <w:rPr>
@@ -1679,7 +1841,7 @@
         </w:p>
         <w:p>
           <w:pPr>
-            <w:pStyle w:val="TOC2"/>
+            <w:pStyle w:val="TDC2"/>
             <w:tabs>
               <w:tab w:val="right" w:leader="dot" w:pos="9350"/>
             </w:tabs>
@@ -1689,14 +1851,14 @@
               <w:lang w:eastAsia="es-SV"/>
             </w:rPr>
           </w:pPr>
-          <w:hyperlink w:anchor="_Toc224035373" w:history="1">
-            <w:r>
-              <w:rPr>
-                <w:rStyle w:val="Hyperlink"/>
+          <w:hyperlink w:anchor="_Toc224570643" w:history="1">
+            <w:r>
+              <w:rPr>
+                <w:rStyle w:val="Hipervnculo"/>
                 <w:rFonts w:ascii="Arial" w:hAnsi="Arial" w:cs="Arial"/>
                 <w:noProof/>
               </w:rPr>
-              <w:t>Buscar un documento en los archivos locales</w:t>
+              <w:t>Buscar un documento en los archivos compartidos</w:t>
             </w:r>
             <w:r>
               <w:rPr>
@@ -1717,7 +1879,7 @@
                 <w:noProof/>
                 <w:webHidden/>
               </w:rPr>
-              <w:instrText xml:space="preserve"> PAGEREF _Toc224035373 \h </w:instrText>
+              <w:instrText xml:space="preserve"> PAGEREF _Toc224570643 \h </w:instrText>
             </w:r>
             <w:r>
               <w:rPr>
@@ -1737,7 +1899,7 @@
                 <w:noProof/>
                 <w:webHidden/>
               </w:rPr>
-              <w:t>2</w:t>
+              <w:t>7</w:t>
             </w:r>
             <w:r>
               <w:rPr>
@@ -1750,7 +1912,7 @@
         </w:p>
         <w:p>
           <w:pPr>
-            <w:pStyle w:val="TOC1"/>
+            <w:pStyle w:val="TDC2"/>
             <w:tabs>
               <w:tab w:val="right" w:leader="dot" w:pos="9350"/>
             </w:tabs>
@@ -1760,16 +1922,14 @@
               <w:lang w:eastAsia="es-SV"/>
             </w:rPr>
           </w:pPr>
-          <w:hyperlink w:anchor="_Toc224035374" w:history="1">
-            <w:r>
-              <w:rPr>
-                <w:rStyle w:val="Hyperlink"/>
+          <w:hyperlink w:anchor="_Toc224570644" w:history="1">
+            <w:r>
+              <w:rPr>
+                <w:rStyle w:val="Hipervnculo"/>
                 <w:rFonts w:ascii="Arial" w:hAnsi="Arial" w:cs="Arial"/>
-                <w:b/>
-                <w:bCs/>
-                <w:noProof/>
-              </w:rPr>
-              <w:t>Diagramas TO-BE</w:t>
+                <w:noProof/>
+              </w:rPr>
+              <w:t>Buscar un documento en los archivos locales</w:t>
             </w:r>
             <w:r>
               <w:rPr>
@@ -1790,7 +1950,7 @@
                 <w:noProof/>
                 <w:webHidden/>
               </w:rPr>
-              <w:instrText xml:space="preserve"> PAGEREF _Toc224035374 \h </w:instrText>
+              <w:instrText xml:space="preserve"> PAGEREF _Toc224570644 \h </w:instrText>
             </w:r>
             <w:r>
               <w:rPr>
@@ -1810,7 +1970,7 @@
                 <w:noProof/>
                 <w:webHidden/>
               </w:rPr>
-              <w:t>2</w:t>
+              <w:t>8</w:t>
             </w:r>
             <w:r>
               <w:rPr>
@@ -1823,7 +1983,7 @@
         </w:p>
         <w:p>
           <w:pPr>
-            <w:pStyle w:val="TOC2"/>
+            <w:pStyle w:val="TDC1"/>
             <w:tabs>
               <w:tab w:val="right" w:leader="dot" w:pos="9350"/>
             </w:tabs>
@@ -1833,14 +1993,16 @@
               <w:lang w:eastAsia="es-SV"/>
             </w:rPr>
           </w:pPr>
-          <w:hyperlink w:anchor="_Toc224035375" w:history="1">
-            <w:r>
-              <w:rPr>
-                <w:rStyle w:val="Hyperlink"/>
+          <w:hyperlink w:anchor="_Toc224570645" w:history="1">
+            <w:r>
+              <w:rPr>
+                <w:rStyle w:val="Hipervnculo"/>
                 <w:rFonts w:ascii="Arial" w:hAnsi="Arial" w:cs="Arial"/>
-                <w:noProof/>
-              </w:rPr>
-              <w:t>Buscar un documento</w:t>
+                <w:b/>
+                <w:bCs/>
+                <w:noProof/>
+              </w:rPr>
+              <w:t>Diagramas TO-BE</w:t>
             </w:r>
             <w:r>
               <w:rPr>
@@ -1861,7 +2023,7 @@
                 <w:noProof/>
                 <w:webHidden/>
               </w:rPr>
-              <w:instrText xml:space="preserve"> PAGEREF _Toc224035375 \h </w:instrText>
+              <w:instrText xml:space="preserve"> PAGEREF _Toc224570645 \h </w:instrText>
             </w:r>
             <w:r>
               <w:rPr>
@@ -1881,7 +2043,7 @@
                 <w:noProof/>
                 <w:webHidden/>
               </w:rPr>
-              <w:t>2</w:t>
+              <w:t>9</w:t>
             </w:r>
             <w:r>
               <w:rPr>
@@ -1894,7 +2056,7 @@
         </w:p>
         <w:p>
           <w:pPr>
-            <w:pStyle w:val="TOC2"/>
+            <w:pStyle w:val="TDC2"/>
             <w:tabs>
               <w:tab w:val="right" w:leader="dot" w:pos="9350"/>
             </w:tabs>
@@ -1904,14 +2066,14 @@
               <w:lang w:eastAsia="es-SV"/>
             </w:rPr>
           </w:pPr>
-          <w:hyperlink w:anchor="_Toc224035376" w:history="1">
-            <w:r>
-              <w:rPr>
-                <w:rStyle w:val="Hyperlink"/>
+          <w:hyperlink w:anchor="_Toc224570646" w:history="1">
+            <w:r>
+              <w:rPr>
+                <w:rStyle w:val="Hipervnculo"/>
                 <w:rFonts w:ascii="Arial" w:hAnsi="Arial" w:cs="Arial"/>
                 <w:noProof/>
               </w:rPr>
-              <w:t>Subir un documento</w:t>
+              <w:t>Buscar un documento</w:t>
             </w:r>
             <w:r>
               <w:rPr>
@@ -1932,7 +2094,7 @@
                 <w:noProof/>
                 <w:webHidden/>
               </w:rPr>
-              <w:instrText xml:space="preserve"> PAGEREF _Toc224035376 \h </w:instrText>
+              <w:instrText xml:space="preserve"> PAGEREF _Toc224570646 \h </w:instrText>
             </w:r>
             <w:r>
               <w:rPr>
@@ -1952,7 +2114,7 @@
                 <w:noProof/>
                 <w:webHidden/>
               </w:rPr>
-              <w:t>2</w:t>
+              <w:t>9</w:t>
             </w:r>
             <w:r>
               <w:rPr>
@@ -1965,7 +2127,7 @@
         </w:p>
         <w:p>
           <w:pPr>
-            <w:pStyle w:val="TOC2"/>
+            <w:pStyle w:val="TDC2"/>
             <w:tabs>
               <w:tab w:val="right" w:leader="dot" w:pos="9350"/>
             </w:tabs>
@@ -1975,14 +2137,14 @@
               <w:lang w:eastAsia="es-SV"/>
             </w:rPr>
           </w:pPr>
-          <w:hyperlink w:anchor="_Toc224035377" w:history="1">
-            <w:r>
-              <w:rPr>
-                <w:rStyle w:val="Hyperlink"/>
+          <w:hyperlink w:anchor="_Toc224570647" w:history="1">
+            <w:r>
+              <w:rPr>
+                <w:rStyle w:val="Hipervnculo"/>
                 <w:rFonts w:ascii="Arial" w:hAnsi="Arial" w:cs="Arial"/>
                 <w:noProof/>
               </w:rPr>
-              <w:t>Crear un nuevo usuario</w:t>
+              <w:t>Subir un documento</w:t>
             </w:r>
             <w:r>
               <w:rPr>
@@ -2003,7 +2165,7 @@
                 <w:noProof/>
                 <w:webHidden/>
               </w:rPr>
-              <w:instrText xml:space="preserve"> PAGEREF _Toc224035377 \h </w:instrText>
+              <w:instrText xml:space="preserve"> PAGEREF _Toc224570647 \h </w:instrText>
             </w:r>
             <w:r>
               <w:rPr>
@@ -2023,7 +2185,7 @@
                 <w:noProof/>
                 <w:webHidden/>
               </w:rPr>
-              <w:t>3</w:t>
+              <w:t>10</w:t>
             </w:r>
             <w:r>
               <w:rPr>
@@ -2036,7 +2198,7 @@
         </w:p>
         <w:p>
           <w:pPr>
-            <w:pStyle w:val="TOC1"/>
+            <w:pStyle w:val="TDC2"/>
             <w:tabs>
               <w:tab w:val="right" w:leader="dot" w:pos="9350"/>
             </w:tabs>
@@ -2046,16 +2208,14 @@
               <w:lang w:eastAsia="es-SV"/>
             </w:rPr>
           </w:pPr>
-          <w:hyperlink w:anchor="_Toc224035378" w:history="1">
-            <w:r>
-              <w:rPr>
-                <w:rStyle w:val="Hyperlink"/>
+          <w:hyperlink w:anchor="_Toc224570648" w:history="1">
+            <w:r>
+              <w:rPr>
+                <w:rStyle w:val="Hipervnculo"/>
                 <w:rFonts w:ascii="Arial" w:hAnsi="Arial" w:cs="Arial"/>
-                <w:b/>
-                <w:bCs/>
-                <w:noProof/>
-              </w:rPr>
-              <w:t>Mejoras concretas</w:t>
+                <w:noProof/>
+              </w:rPr>
+              <w:t>Crear un nuevo usuario</w:t>
             </w:r>
             <w:r>
               <w:rPr>
@@ -2076,7 +2236,7 @@
                 <w:noProof/>
                 <w:webHidden/>
               </w:rPr>
-              <w:instrText xml:space="preserve"> PAGEREF _Toc224035378 \h </w:instrText>
+              <w:instrText xml:space="preserve"> PAGEREF _Toc224570648 \h </w:instrText>
             </w:r>
             <w:r>
               <w:rPr>
@@ -2096,7 +2256,7 @@
                 <w:noProof/>
                 <w:webHidden/>
               </w:rPr>
-              <w:t>3</w:t>
+              <w:t>11</w:t>
             </w:r>
             <w:r>
               <w:rPr>
@@ -2109,7 +2269,7 @@
         </w:p>
         <w:p>
           <w:pPr>
-            <w:pStyle w:val="TOC2"/>
+            <w:pStyle w:val="TDC1"/>
             <w:tabs>
               <w:tab w:val="right" w:leader="dot" w:pos="9350"/>
             </w:tabs>
@@ -2119,14 +2279,16 @@
               <w:lang w:eastAsia="es-SV"/>
             </w:rPr>
           </w:pPr>
-          <w:hyperlink w:anchor="_Toc224035379" w:history="1">
-            <w:r>
-              <w:rPr>
-                <w:rStyle w:val="Hyperlink"/>
+          <w:hyperlink w:anchor="_Toc224570649" w:history="1">
+            <w:r>
+              <w:rPr>
+                <w:rStyle w:val="Hipervnculo"/>
                 <w:rFonts w:ascii="Arial" w:hAnsi="Arial" w:cs="Arial"/>
-                <w:noProof/>
-              </w:rPr>
-              <w:t>Requerimientos Funcionales</w:t>
+                <w:b/>
+                <w:bCs/>
+                <w:noProof/>
+              </w:rPr>
+              <w:t>Evidencia de aplicación</w:t>
             </w:r>
             <w:r>
               <w:rPr>
@@ -2147,7 +2309,7 @@
                 <w:noProof/>
                 <w:webHidden/>
               </w:rPr>
-              <w:instrText xml:space="preserve"> PAGEREF _Toc224035379 \h </w:instrText>
+              <w:instrText xml:space="preserve"> PAGEREF _Toc224570649 \h </w:instrText>
             </w:r>
             <w:r>
               <w:rPr>
@@ -2167,7 +2329,7 @@
                 <w:noProof/>
                 <w:webHidden/>
               </w:rPr>
-              <w:t>3</w:t>
+              <w:t>15</w:t>
             </w:r>
             <w:r>
               <w:rPr>
@@ -2180,7 +2342,7 @@
         </w:p>
         <w:p>
           <w:pPr>
-            <w:pStyle w:val="TOC2"/>
+            <w:pStyle w:val="TDC2"/>
             <w:tabs>
               <w:tab w:val="right" w:leader="dot" w:pos="9350"/>
             </w:tabs>
@@ -2190,14 +2352,14 @@
               <w:lang w:eastAsia="es-SV"/>
             </w:rPr>
           </w:pPr>
-          <w:hyperlink w:anchor="_Toc224035380" w:history="1">
-            <w:r>
-              <w:rPr>
-                <w:rStyle w:val="Hyperlink"/>
+          <w:hyperlink w:anchor="_Toc224570650" w:history="1">
+            <w:r>
+              <w:rPr>
+                <w:rStyle w:val="Hipervnculo"/>
                 <w:rFonts w:ascii="Arial" w:hAnsi="Arial" w:cs="Arial"/>
                 <w:noProof/>
               </w:rPr>
-              <w:t>Requerimientos no Funcionales</w:t>
+              <w:t>Tablero</w:t>
             </w:r>
             <w:r>
               <w:rPr>
@@ -2218,7 +2380,7 @@
                 <w:noProof/>
                 <w:webHidden/>
               </w:rPr>
-              <w:instrText xml:space="preserve"> PAGEREF _Toc224035380 \h </w:instrText>
+              <w:instrText xml:space="preserve"> PAGEREF _Toc224570650 \h </w:instrText>
             </w:r>
             <w:r>
               <w:rPr>
@@ -2238,7 +2400,7 @@
                 <w:noProof/>
                 <w:webHidden/>
               </w:rPr>
-              <w:t>3</w:t>
+              <w:t>15</w:t>
             </w:r>
             <w:r>
               <w:rPr>
@@ -2251,7 +2413,7 @@
         </w:p>
         <w:p>
           <w:pPr>
-            <w:pStyle w:val="TOC1"/>
+            <w:pStyle w:val="TDC2"/>
             <w:tabs>
               <w:tab w:val="right" w:leader="dot" w:pos="9350"/>
             </w:tabs>
@@ -2261,16 +2423,14 @@
               <w:lang w:eastAsia="es-SV"/>
             </w:rPr>
           </w:pPr>
-          <w:hyperlink w:anchor="_Toc224035381" w:history="1">
-            <w:r>
-              <w:rPr>
-                <w:rStyle w:val="Hyperlink"/>
+          <w:hyperlink w:anchor="_Toc224570651" w:history="1">
+            <w:r>
+              <w:rPr>
+                <w:rStyle w:val="Hipervnculo"/>
                 <w:rFonts w:ascii="Arial" w:hAnsi="Arial" w:cs="Arial"/>
-                <w:b/>
-                <w:bCs/>
-                <w:noProof/>
-              </w:rPr>
-              <w:t>Tablero</w:t>
+                <w:noProof/>
+              </w:rPr>
+              <w:t>Repositorio con commits</w:t>
             </w:r>
             <w:r>
               <w:rPr>
@@ -2291,7 +2451,7 @@
                 <w:noProof/>
                 <w:webHidden/>
               </w:rPr>
-              <w:instrText xml:space="preserve"> PAGEREF _Toc224035381 \h </w:instrText>
+              <w:instrText xml:space="preserve"> PAGEREF _Toc224570651 \h </w:instrText>
             </w:r>
             <w:r>
               <w:rPr>
@@ -2311,7 +2471,7 @@
                 <w:noProof/>
                 <w:webHidden/>
               </w:rPr>
-              <w:t>3</w:t>
+              <w:t>15</w:t>
             </w:r>
             <w:r>
               <w:rPr>
@@ -2324,7 +2484,7 @@
         </w:p>
         <w:p>
           <w:pPr>
-            <w:pStyle w:val="TOC1"/>
+            <w:pStyle w:val="TDC1"/>
             <w:tabs>
               <w:tab w:val="right" w:leader="dot" w:pos="9350"/>
             </w:tabs>
@@ -2334,10 +2494,10 @@
               <w:lang w:eastAsia="es-SV"/>
             </w:rPr>
           </w:pPr>
-          <w:hyperlink w:anchor="_Toc224035382" w:history="1">
-            <w:r>
-              <w:rPr>
-                <w:rStyle w:val="Hyperlink"/>
+          <w:hyperlink w:anchor="_Toc224570652" w:history="1">
+            <w:r>
+              <w:rPr>
+                <w:rStyle w:val="Hipervnculo"/>
                 <w:rFonts w:ascii="Arial" w:hAnsi="Arial" w:cs="Arial"/>
                 <w:b/>
                 <w:bCs/>
@@ -2364,7 +2524,7 @@
                 <w:noProof/>
                 <w:webHidden/>
               </w:rPr>
-              <w:instrText xml:space="preserve"> PAGEREF _Toc224035382 \h </w:instrText>
+              <w:instrText xml:space="preserve"> PAGEREF _Toc224570652 \h </w:instrText>
             </w:r>
             <w:r>
               <w:rPr>
@@ -2384,7 +2544,7 @@
                 <w:noProof/>
                 <w:webHidden/>
               </w:rPr>
-              <w:t>4</w:t>
+              <w:t>16</w:t>
             </w:r>
             <w:r>
               <w:rPr>
@@ -2397,7 +2557,7 @@
         </w:p>
         <w:p>
           <w:pPr>
-            <w:pStyle w:val="TOC1"/>
+            <w:pStyle w:val="TDC1"/>
             <w:tabs>
               <w:tab w:val="right" w:leader="dot" w:pos="9350"/>
             </w:tabs>
@@ -2407,10 +2567,10 @@
               <w:lang w:eastAsia="es-SV"/>
             </w:rPr>
           </w:pPr>
-          <w:hyperlink w:anchor="_Toc224035383" w:history="1">
-            <w:r>
-              <w:rPr>
-                <w:rStyle w:val="Hyperlink"/>
+          <w:hyperlink w:anchor="_Toc224570653" w:history="1">
+            <w:r>
+              <w:rPr>
+                <w:rStyle w:val="Hipervnculo"/>
                 <w:rFonts w:ascii="Arial" w:hAnsi="Arial" w:cs="Arial"/>
                 <w:b/>
                 <w:bCs/>
@@ -2437,7 +2597,7 @@
                 <w:noProof/>
                 <w:webHidden/>
               </w:rPr>
-              <w:instrText xml:space="preserve"> PAGEREF _Toc224035383 \h </w:instrText>
+              <w:instrText xml:space="preserve"> PAGEREF _Toc224570653 \h </w:instrText>
             </w:r>
             <w:r>
               <w:rPr>
@@ -2457,7 +2617,7 @@
                 <w:noProof/>
                 <w:webHidden/>
               </w:rPr>
-              <w:t>4</w:t>
+              <w:t>17</w:t>
             </w:r>
             <w:r>
               <w:rPr>
@@ -2506,7 +2666,7 @@
     </w:p>
     <w:p>
       <w:pPr>
-        <w:pStyle w:val="Heading1"/>
+        <w:pStyle w:val="Ttulo1"/>
         <w:spacing w:line="360" w:lineRule="auto"/>
         <w:rPr>
           <w:rFonts w:ascii="Arial" w:hAnsi="Arial" w:cs="Arial"/>
@@ -2518,7 +2678,7 @@
           <w:lang w:val="es-SV"/>
         </w:rPr>
       </w:pPr>
-      <w:bookmarkStart w:id="1" w:name="_Toc224035365"/>
+      <w:bookmarkStart w:id="1" w:name="_Toc224570635"/>
       <w:r>
         <w:rPr>
           <w:rFonts w:ascii="Arial" w:hAnsi="Arial" w:cs="Arial"/>
@@ -2529,6 +2689,7 @@
           <w:szCs w:val="24"/>
           <w:lang w:val="es-SV"/>
         </w:rPr>
+        <w:lastRenderedPageBreak/>
         <w:t>Contexto de la Empresa</w:t>
       </w:r>
       <w:bookmarkEnd w:id="1"/>
@@ -2616,7 +2777,7 @@
     </w:p>
     <w:p>
       <w:pPr>
-        <w:pStyle w:val="ListParagraph"/>
+        <w:pStyle w:val="Prrafodelista"/>
         <w:numPr>
           <w:ilvl w:val="0"/>
           <w:numId w:val="7"/>
@@ -2636,7 +2797,7 @@
     </w:p>
     <w:p>
       <w:pPr>
-        <w:pStyle w:val="ListParagraph"/>
+        <w:pStyle w:val="Prrafodelista"/>
         <w:numPr>
           <w:ilvl w:val="0"/>
           <w:numId w:val="7"/>
@@ -2656,7 +2817,7 @@
     </w:p>
     <w:p>
       <w:pPr>
-        <w:pStyle w:val="ListParagraph"/>
+        <w:pStyle w:val="Prrafodelista"/>
         <w:numPr>
           <w:ilvl w:val="0"/>
           <w:numId w:val="7"/>
@@ -2763,7 +2924,7 @@
     </w:p>
     <w:p>
       <w:pPr>
-        <w:pStyle w:val="Heading1"/>
+        <w:pStyle w:val="Ttulo1"/>
         <w:spacing w:line="360" w:lineRule="auto"/>
         <w:rPr>
           <w:rFonts w:ascii="Arial" w:hAnsi="Arial" w:cs="Arial"/>
@@ -2775,7 +2936,7 @@
           <w:lang w:val="es-SV"/>
         </w:rPr>
       </w:pPr>
-      <w:bookmarkStart w:id="2" w:name="_Toc224035366"/>
+      <w:bookmarkStart w:id="2" w:name="_Toc224570636"/>
       <w:r>
         <w:rPr>
           <w:rFonts w:ascii="Arial" w:hAnsi="Arial" w:cs="Arial"/>
@@ -2786,13 +2947,14 @@
           <w:szCs w:val="24"/>
           <w:lang w:val="es-SV"/>
         </w:rPr>
+        <w:lastRenderedPageBreak/>
         <w:t>Diagnóstico del Proceso</w:t>
       </w:r>
       <w:bookmarkEnd w:id="2"/>
     </w:p>
     <w:p>
       <w:pPr>
-        <w:pStyle w:val="Heading2"/>
+        <w:pStyle w:val="Ttulo2"/>
         <w:rPr>
           <w:rFonts w:ascii="Arial" w:hAnsi="Arial" w:cs="Arial"/>
           <w:color w:val="auto"/>
@@ -2801,7 +2963,7 @@
           <w:lang w:val="es-SV"/>
         </w:rPr>
       </w:pPr>
-      <w:bookmarkStart w:id="3" w:name="_Toc224035367"/>
+      <w:bookmarkStart w:id="3" w:name="_Toc224570637"/>
       <w:r>
         <w:rPr>
           <w:rFonts w:ascii="Arial" w:hAnsi="Arial" w:cs="Arial"/>
@@ -2860,7 +3022,7 @@
     </w:p>
     <w:p>
       <w:pPr>
-        <w:pStyle w:val="ListParagraph"/>
+        <w:pStyle w:val="Prrafodelista"/>
         <w:numPr>
           <w:ilvl w:val="0"/>
           <w:numId w:val="8"/>
@@ -2901,7 +3063,7 @@
     </w:p>
     <w:p>
       <w:pPr>
-        <w:pStyle w:val="ListParagraph"/>
+        <w:pStyle w:val="Prrafodelista"/>
         <w:numPr>
           <w:ilvl w:val="0"/>
           <w:numId w:val="8"/>
@@ -2935,7 +3097,7 @@
     </w:p>
     <w:p>
       <w:pPr>
-        <w:pStyle w:val="ListParagraph"/>
+        <w:pStyle w:val="Prrafodelista"/>
         <w:numPr>
           <w:ilvl w:val="0"/>
           <w:numId w:val="8"/>
@@ -2992,7 +3154,7 @@
     </w:p>
     <w:p>
       <w:pPr>
-        <w:pStyle w:val="Heading2"/>
+        <w:pStyle w:val="Ttulo2"/>
         <w:rPr>
           <w:rFonts w:ascii="Arial" w:hAnsi="Arial" w:cs="Arial"/>
           <w:color w:val="auto"/>
@@ -3001,7 +3163,7 @@
           <w:lang w:val="es-SV"/>
         </w:rPr>
       </w:pPr>
-      <w:bookmarkStart w:id="4" w:name="_Toc224035368"/>
+      <w:bookmarkStart w:id="4" w:name="_Toc224570638"/>
       <w:r>
         <w:rPr>
           <w:rFonts w:ascii="Arial" w:hAnsi="Arial" w:cs="Arial"/>
@@ -3010,6 +3172,7 @@
           <w:szCs w:val="24"/>
           <w:lang w:val="es-SV"/>
         </w:rPr>
+        <w:lastRenderedPageBreak/>
         <w:t>Diagnóstico de la solución</w:t>
       </w:r>
       <w:bookmarkEnd w:id="4"/>
@@ -3045,7 +3208,7 @@
       </w:r>
       <w:r>
         <w:rPr>
-          <w:rStyle w:val="FootnoteReference"/>
+          <w:rStyle w:val="Refdenotaalpie"/>
           <w:rFonts w:ascii="Arial" w:hAnsi="Arial" w:cs="Arial"/>
           <w:lang w:val="es-ES"/>
         </w:rPr>
@@ -3056,219 +3219,218 @@
           <w:rFonts w:ascii="Arial" w:hAnsi="Arial" w:cs="Arial"/>
           <w:lang w:val="es-ES"/>
         </w:rPr>
-        <w:t xml:space="preserve">, lo que nos muestra que si </w:t>
-      </w:r>
-      <w:proofErr w:type="gramStart"/>
-      <w:r>
-        <w:rPr>
+        <w:t>, lo que nos muestra que si pueden haber problemas serios si es que se están ocupando documentos anticuados, ya que esto puede afectar a la mayoría de los empleados. Los empleados también mencionaron que 38.1% ocupan los documentos todos los días y el 42.9% un par de veces por semana</w:t>
+      </w:r>
+      <w:r>
+        <w:rPr>
+          <w:rStyle w:val="Refdenotaalpie"/>
           <w:rFonts w:ascii="Arial" w:hAnsi="Arial" w:cs="Arial"/>
           <w:lang w:val="es-ES"/>
         </w:rPr>
-        <w:t>pueden</w:t>
-      </w:r>
-      <w:proofErr w:type="gramEnd"/>
+        <w:footnoteReference w:id="2"/>
+      </w:r>
       <w:r>
         <w:rPr>
           <w:rFonts w:ascii="Arial" w:hAnsi="Arial" w:cs="Arial"/>
           <w:lang w:val="es-ES"/>
         </w:rPr>
-        <w:t xml:space="preserve"> haber problemas serios si es que se están ocupando documentos anticuados, ya que esto puede afectar a la mayoría de los empleados. Los empleados también mencionaron que 38.1% ocupan los documentos todos los días y el 42.9% un par de veces por semana</w:t>
-      </w:r>
-      <w:r>
-        <w:rPr>
-          <w:rStyle w:val="FootnoteReference"/>
+        <w:t xml:space="preserve">, esto nos muestra que el 81% de los empleados tienden a ocupar la documentación interna todas las semanas, lo que puede llevar a una gran cantidad de problemas al ocupar la documentación antigua. </w:t>
+      </w:r>
+    </w:p>
+    <w:p>
+      <w:pPr>
+        <w:rPr>
           <w:rFonts w:ascii="Arial" w:hAnsi="Arial" w:cs="Arial"/>
           <w:lang w:val="es-ES"/>
         </w:rPr>
-        <w:footnoteReference w:id="2"/>
-      </w:r>
+      </w:pPr>
       <w:r>
         <w:rPr>
           <w:rFonts w:ascii="Arial" w:hAnsi="Arial" w:cs="Arial"/>
           <w:lang w:val="es-ES"/>
         </w:rPr>
-        <w:t xml:space="preserve">, esto nos muestra que el 81% de los empleados tienden a ocupar la documentación interna todas las semanas, lo que puede llevar a una gran cantidad de problemas al ocupar la documentación antigua. </w:t>
-      </w:r>
-    </w:p>
-    <w:p>
-      <w:pPr>
-        <w:rPr>
+        <w:t>La gestión de documentos se hace por medio de correos electrónicos (42.9%), carpetas compartidas (35.7%) y archivos locales (16.7%)</w:t>
+      </w:r>
+      <w:r>
+        <w:rPr>
+          <w:rStyle w:val="Refdenotaalpie"/>
           <w:rFonts w:ascii="Arial" w:hAnsi="Arial" w:cs="Arial"/>
           <w:lang w:val="es-ES"/>
         </w:rPr>
-      </w:pPr>
+        <w:footnoteReference w:id="3"/>
+      </w:r>
       <w:r>
         <w:rPr>
           <w:rFonts w:ascii="Arial" w:hAnsi="Arial" w:cs="Arial"/>
           <w:lang w:val="es-ES"/>
         </w:rPr>
-        <w:t>La gestión de documentos se hace por medio de correos electrónicos (42.9%), carpetas compartidas (35.7%) y archivos locales (16.7%)</w:t>
-      </w:r>
-      <w:r>
-        <w:rPr>
-          <w:rStyle w:val="FootnoteReference"/>
+        <w:t>. Ahí vemos que la manera en la cual se gestionan los documentos no es óptima, ya que, como mencionamos anteriormente, estos 3 métodos pueden llevar a problemas como la pérdida de tiempo y el uso de documentación vieja, la cual afecta el rendimiento y la reputación de la empresa.</w:t>
+      </w:r>
+    </w:p>
+    <w:p>
+      <w:pPr>
+        <w:rPr>
           <w:rFonts w:ascii="Arial" w:hAnsi="Arial" w:cs="Arial"/>
           <w:lang w:val="es-ES"/>
         </w:rPr>
-        <w:footnoteReference w:id="3"/>
-      </w:r>
+      </w:pPr>
       <w:r>
         <w:rPr>
           <w:rFonts w:ascii="Arial" w:hAnsi="Arial" w:cs="Arial"/>
           <w:lang w:val="es-ES"/>
         </w:rPr>
-        <w:t>. Ahí vemos que la manera en la cual se gestionan los documentos no es óptima, ya que, como mencionamos anteriormente, estos 3 métodos pueden llevar a problemas como la pérdida de tiempo y el uso de documentación vieja, la cual afecta el rendimiento y la reputación de la empresa.</w:t>
-      </w:r>
-    </w:p>
-    <w:p>
-      <w:pPr>
-        <w:rPr>
+        <w:t>El 78.6% de los empleados han tenido problemas con versiones obsoletas o incorrectas</w:t>
+      </w:r>
+      <w:r>
+        <w:rPr>
+          <w:rStyle w:val="Refdenotaalpie"/>
           <w:rFonts w:ascii="Arial" w:hAnsi="Arial" w:cs="Arial"/>
           <w:lang w:val="es-ES"/>
         </w:rPr>
-      </w:pPr>
+        <w:footnoteReference w:id="4"/>
+      </w:r>
       <w:r>
         <w:rPr>
           <w:rFonts w:ascii="Arial" w:hAnsi="Arial" w:cs="Arial"/>
           <w:lang w:val="es-ES"/>
         </w:rPr>
-        <w:t>El 78.6% de los empleados han tenido problemas con versiones obsoletas o incorrectas</w:t>
-      </w:r>
-      <w:r>
-        <w:rPr>
-          <w:rStyle w:val="FootnoteReference"/>
+        <w:t xml:space="preserve">, lo cual es un problema serio, debido a que más de ¾ de los empleados se ha visto afectado por esto. El uso de documentos anticuados puede retrasar los proyectos de la empresa o incluso causar la entrega de documentos con errores o incompletos, lo cual afecta a la empresa. Estos errores pueden causar que la empresa se atrase, dañar la reputación de la empresa (lo cual le puede costar proyectos) e incluso causar que se entreguen documentos erróneos. </w:t>
+      </w:r>
+    </w:p>
+    <w:p>
+      <w:pPr>
+        <w:rPr>
           <w:rFonts w:ascii="Arial" w:hAnsi="Arial" w:cs="Arial"/>
           <w:lang w:val="es-ES"/>
         </w:rPr>
-        <w:footnoteReference w:id="4"/>
-      </w:r>
+      </w:pPr>
       <w:r>
         <w:rPr>
           <w:rFonts w:ascii="Arial" w:hAnsi="Arial" w:cs="Arial"/>
           <w:lang w:val="es-ES"/>
         </w:rPr>
-        <w:t xml:space="preserve">, lo cual es un problema serio, debido a que más de ¾ de los empleados se ha visto afectado por esto. El uso de documentos anticuados puede retrasar los proyectos de la empresa o incluso causar la entrega de documentos con errores o incompletos, lo cual afecta a la empresa. Estos errores pueden causar que la empresa se atrase, dañar la reputación de la empresa (lo cual le puede costar proyectos) e incluso causar que se entreguen documentos erróneos. </w:t>
-      </w:r>
-    </w:p>
-    <w:p>
-      <w:pPr>
-        <w:rPr>
+        <w:t>Un punto importante para la gestión de documento es que se puedan mostrar no solo las versiones más recientes, sino también las viejas, para poder así modernizar antiguos proyectos que se hayan hecho. Si se cuentan con las versiones anteriores y la más reciente, se puede hacer una comparación para poder así actualizar documentos a una versión más reciente. El 33.3% de los encuestados están de acuerdo que es muy importante mantener las versiones viejas y el 42.9% lo consideran importante</w:t>
+      </w:r>
+      <w:r>
+        <w:rPr>
+          <w:rStyle w:val="Refdenotaalpie"/>
           <w:rFonts w:ascii="Arial" w:hAnsi="Arial" w:cs="Arial"/>
           <w:lang w:val="es-ES"/>
         </w:rPr>
-      </w:pPr>
+        <w:footnoteReference w:id="5"/>
+      </w:r>
       <w:r>
         <w:rPr>
           <w:rFonts w:ascii="Arial" w:hAnsi="Arial" w:cs="Arial"/>
           <w:lang w:val="es-ES"/>
         </w:rPr>
-        <w:t>Un punto importante para la gestión de documento es que se puedan mostrar no solo las versiones más recientes, sino también las viejas, para poder así modernizar antiguos proyectos que se hayan hecho. Si se cuentan con las versiones anteriores y la más reciente, se puede hacer una comparación para poder así actualizar documentos a una versión más reciente. El 33.3% de los encuestados están de acuerdo que es muy importante mantener las versiones viejas y el 42.9% lo consideran importante</w:t>
-      </w:r>
-      <w:r>
-        <w:rPr>
-          <w:rStyle w:val="FootnoteReference"/>
+        <w:t xml:space="preserve">. </w:t>
+      </w:r>
+    </w:p>
+    <w:p>
+      <w:pPr>
+        <w:rPr>
           <w:rFonts w:ascii="Arial" w:hAnsi="Arial" w:cs="Arial"/>
           <w:lang w:val="es-ES"/>
         </w:rPr>
-        <w:footnoteReference w:id="5"/>
-      </w:r>
+      </w:pPr>
       <w:r>
         <w:rPr>
           <w:rFonts w:ascii="Arial" w:hAnsi="Arial" w:cs="Arial"/>
           <w:lang w:val="es-ES"/>
         </w:rPr>
-        <w:t xml:space="preserve">. </w:t>
-      </w:r>
-    </w:p>
-    <w:p>
-      <w:pPr>
-        <w:rPr>
+        <w:lastRenderedPageBreak/>
+        <w:t>Podemos ver que un sistema de gestión de documentos es importante ya que le ahorraría tiempo y problemas a la empresa y a sus empleados. Sin embargo, todavía tiene que verse como es que se tiene que estructurar. Un punto importante según los encuestados (92.9%)</w:t>
+      </w:r>
+      <w:r>
+        <w:rPr>
+          <w:rStyle w:val="Refdenotaalpie"/>
           <w:rFonts w:ascii="Arial" w:hAnsi="Arial" w:cs="Arial"/>
           <w:lang w:val="es-ES"/>
         </w:rPr>
-      </w:pPr>
+        <w:footnoteReference w:id="6"/>
+      </w:r>
       <w:r>
         <w:rPr>
           <w:rFonts w:ascii="Arial" w:hAnsi="Arial" w:cs="Arial"/>
           <w:lang w:val="es-ES"/>
         </w:rPr>
-        <w:t>Podemos ver que un sistema de gestión de documentos es importante ya que le ahorraría tiempo y problemas a la empresa y a sus empleados. Sin embargo, todavía tiene que verse como es que se tiene que estructurar. Un punto importante según los encuestados (92.9%)</w:t>
-      </w:r>
-      <w:r>
-        <w:rPr>
-          <w:rStyle w:val="FootnoteReference"/>
+        <w:t xml:space="preserve"> es que el sistema tenga un usuarios y contraseñas y que estos tengan distintos roles y permisos en el sistema (64.3%)</w:t>
+      </w:r>
+      <w:r>
+        <w:rPr>
+          <w:rStyle w:val="Refdenotaalpie"/>
           <w:rFonts w:ascii="Arial" w:hAnsi="Arial" w:cs="Arial"/>
           <w:lang w:val="es-ES"/>
         </w:rPr>
-        <w:footnoteReference w:id="6"/>
+        <w:footnoteReference w:id="7"/>
       </w:r>
       <w:r>
         <w:rPr>
           <w:rFonts w:ascii="Arial" w:hAnsi="Arial" w:cs="Arial"/>
           <w:lang w:val="es-ES"/>
         </w:rPr>
-        <w:t xml:space="preserve"> es que el sistema tenga un usuarios y contraseñas y que estos tengan distintos roles y permisos en el sistema (64.3%)</w:t>
-      </w:r>
-      <w:r>
-        <w:rPr>
-          <w:rStyle w:val="FootnoteReference"/>
+        <w:t xml:space="preserve">. El sistema que deseamos implementar contaría con 3 tipos de usuarios distintos, los empleados que pueden subir y revisar los documentos, los jefes que pueden aprobar o rechazar los documentos y el administrador, el cual puede agregar nuevos usuarios y asignarles permisos. </w:t>
+      </w:r>
+    </w:p>
+    <w:p>
+      <w:pPr>
+        <w:rPr>
           <w:rFonts w:ascii="Arial" w:hAnsi="Arial" w:cs="Arial"/>
           <w:lang w:val="es-ES"/>
         </w:rPr>
-        <w:footnoteReference w:id="7"/>
-      </w:r>
+      </w:pPr>
       <w:r>
         <w:rPr>
           <w:rFonts w:ascii="Arial" w:hAnsi="Arial" w:cs="Arial"/>
           <w:lang w:val="es-ES"/>
         </w:rPr>
-        <w:t xml:space="preserve">. El sistema que deseamos implementar contaría con 3 tipos de usuarios distintos, los empleados que pueden subir y revisar los documentos, los jefes que pueden aprobar o rechazar los documentos y el administrador, el cual puede agregar nuevos usuarios y asignarles permisos. </w:t>
-      </w:r>
-    </w:p>
-    <w:p>
-      <w:pPr>
-        <w:rPr>
+        <w:t>El 97.6% de los empleados</w:t>
+      </w:r>
+      <w:r>
+        <w:rPr>
+          <w:rStyle w:val="Refdenotaalpie"/>
           <w:rFonts w:ascii="Arial" w:hAnsi="Arial" w:cs="Arial"/>
           <w:lang w:val="es-ES"/>
         </w:rPr>
-      </w:pPr>
+        <w:footnoteReference w:id="8"/>
+      </w:r>
       <w:r>
         <w:rPr>
           <w:rFonts w:ascii="Arial" w:hAnsi="Arial" w:cs="Arial"/>
           <w:lang w:val="es-ES"/>
         </w:rPr>
-        <w:t>El 97.6% de los empleados</w:t>
-      </w:r>
-      <w:r>
-        <w:rPr>
-          <w:rStyle w:val="FootnoteReference"/>
+        <w:t xml:space="preserve"> están de acuerdo que haya un proceso de aprobación a la documentación (lo cual harían los usuarios de los jefes), ya que esto permitirá que hubiera un buen control de dicha documentación, ya que aunque cualquier empleado puede subir un documento, este tiene que ser aprobado para que se guarde en el sitio web, si se rechaza, el documento no se subirá. </w:t>
+      </w:r>
+    </w:p>
+    <w:p>
+      <w:pPr>
+        <w:rPr>
           <w:rFonts w:ascii="Arial" w:hAnsi="Arial" w:cs="Arial"/>
           <w:lang w:val="es-ES"/>
         </w:rPr>
-        <w:footnoteReference w:id="8"/>
-      </w:r>
+      </w:pPr>
       <w:r>
         <w:rPr>
           <w:rFonts w:ascii="Arial" w:hAnsi="Arial" w:cs="Arial"/>
           <w:lang w:val="es-ES"/>
         </w:rPr>
-        <w:t xml:space="preserve"> están de acuerdo que haya un proceso de aprobación a la documentación (lo cual harían los usuarios de los jefes), ya que esto permitirá que hubiera un buen control de dicha documentación, ya </w:t>
-      </w:r>
-      <w:proofErr w:type="gramStart"/>
-      <w:r>
-        <w:rPr>
+        <w:t>El 69% de los empleados</w:t>
+      </w:r>
+      <w:r>
+        <w:rPr>
+          <w:rStyle w:val="Refdenotaalpie"/>
           <w:rFonts w:ascii="Arial" w:hAnsi="Arial" w:cs="Arial"/>
           <w:lang w:val="es-ES"/>
         </w:rPr>
-        <w:t>que</w:t>
-      </w:r>
-      <w:proofErr w:type="gramEnd"/>
+        <w:footnoteReference w:id="9"/>
+      </w:r>
       <w:r>
         <w:rPr>
           <w:rFonts w:ascii="Arial" w:hAnsi="Arial" w:cs="Arial"/>
           <w:lang w:val="es-ES"/>
         </w:rPr>
-        <w:t xml:space="preserve"> aunque cualquier empleado puede subir un documento, este tiene que ser aprobado para que se guarde en el sitio web, si se rechaza, el documento no se subirá. </w:t>
+        <w:t xml:space="preserve"> están de acuerdo que sería de gran utilidad que se pudieran dejar comentarios en los documentos y sus distintas versiones, para que así se pueda interactuar entre ellos sobre posibles preguntas que tengan los empleados y que puedan quedar guardadas las preguntas y respuestas para que todos puedan verlas. </w:t>
       </w:r>
     </w:p>
     <w:p>
@@ -3283,22 +3445,22 @@
           <w:rFonts w:ascii="Arial" w:hAnsi="Arial" w:cs="Arial"/>
           <w:lang w:val="es-ES"/>
         </w:rPr>
-        <w:t>El 69% de los empleados</w:t>
-      </w:r>
-      <w:r>
-        <w:rPr>
-          <w:rStyle w:val="FootnoteReference"/>
+        <w:t>Finalmente, el 59.5% de los empleados</w:t>
+      </w:r>
+      <w:r>
+        <w:rPr>
+          <w:rStyle w:val="Refdenotaalpie"/>
           <w:rFonts w:ascii="Arial" w:hAnsi="Arial" w:cs="Arial"/>
           <w:lang w:val="es-ES"/>
         </w:rPr>
-        <w:footnoteReference w:id="9"/>
+        <w:footnoteReference w:id="10"/>
       </w:r>
       <w:r>
         <w:rPr>
           <w:rFonts w:ascii="Arial" w:hAnsi="Arial" w:cs="Arial"/>
           <w:lang w:val="es-ES"/>
         </w:rPr>
-        <w:t xml:space="preserve"> están de acuerdo que sería de gran utilidad que se pudieran dejar comentarios en los documentos y sus distintas versiones, para que así se pueda interactuar entre ellos sobre posibles preguntas que tengan los empleados y que puedan quedar guardadas las preguntas y respuestas para que todos puedan verlas. </w:t>
+        <w:t xml:space="preserve"> descargarían los documentos en su computadora para poder acceder a ellos de una maneras más rápida y simple, y de esa forma agilizar el proceso. </w:t>
       </w:r>
     </w:p>
     <w:p>
@@ -3308,246 +3470,10 @@
           <w:lang w:val="es-ES"/>
         </w:rPr>
       </w:pPr>
-      <w:r>
-        <w:rPr>
-          <w:rFonts w:ascii="Arial" w:hAnsi="Arial" w:cs="Arial"/>
-          <w:lang w:val="es-ES"/>
-        </w:rPr>
-        <w:t>Finalmente, el 59.5% de los empleados</w:t>
-      </w:r>
-      <w:r>
-        <w:rPr>
-          <w:rStyle w:val="FootnoteReference"/>
-          <w:rFonts w:ascii="Arial" w:hAnsi="Arial" w:cs="Arial"/>
-          <w:lang w:val="es-ES"/>
-        </w:rPr>
-        <w:footnoteReference w:id="10"/>
-      </w:r>
-      <w:r>
-        <w:rPr>
-          <w:rFonts w:ascii="Arial" w:hAnsi="Arial" w:cs="Arial"/>
-          <w:lang w:val="es-ES"/>
-        </w:rPr>
-        <w:t xml:space="preserve"> descargarían los documentos en su computadora para poder acceder a ellos de una maneras más rápida y simple, y de esa forma agilizar el proceso. </w:t>
-      </w:r>
-    </w:p>
-    <w:p>
-      <w:pPr>
-        <w:spacing w:after="0"/>
-        <w:rPr>
-          <w:rFonts w:ascii="Arial" w:hAnsi="Arial" w:cs="Arial"/>
-          <w:b/>
-          <w:bCs/>
-          <w:lang w:val="es-SV"/>
-        </w:rPr>
-      </w:pPr>
-      <w:r>
-        <w:rPr>
-          <w:rFonts w:ascii="Arial" w:hAnsi="Arial" w:cs="Arial"/>
-          <w:b/>
-          <w:bCs/>
-          <w:lang w:val="es-SV"/>
-        </w:rPr>
-        <w:t>Debilidades del proceso identificadas (según enfoque CMMI)</w:t>
-      </w:r>
-    </w:p>
-    <w:p>
-      <w:pPr>
-        <w:spacing w:after="0"/>
-        <w:rPr>
-          <w:rFonts w:ascii="Arial" w:hAnsi="Arial" w:cs="Arial"/>
-          <w:lang w:val="es-SV"/>
-        </w:rPr>
-      </w:pPr>
-      <w:r>
-        <w:rPr>
-          <w:rFonts w:ascii="Arial" w:hAnsi="Arial" w:cs="Arial"/>
-          <w:lang w:val="es-SV"/>
-        </w:rPr>
-        <w:t>A partir del análisis de los resultados de la encuesta, se identificaron varias debilidades en el proceso actual de gestión documental:</w:t>
-      </w:r>
-    </w:p>
-    <w:p>
-      <w:pPr>
-        <w:spacing w:after="0"/>
-        <w:rPr>
-          <w:rFonts w:ascii="Arial" w:hAnsi="Arial" w:cs="Arial"/>
-          <w:lang w:val="es-SV"/>
-        </w:rPr>
-      </w:pPr>
-      <w:r>
-        <w:rPr>
-          <w:rFonts w:ascii="Arial" w:hAnsi="Arial" w:cs="Arial"/>
-          <w:lang w:val="es-SV"/>
-        </w:rPr>
-        <w:t>Falta de repositorio centralizado</w:t>
-      </w:r>
-      <w:r>
-        <w:rPr>
-          <w:rFonts w:ascii="Arial" w:hAnsi="Arial" w:cs="Arial"/>
-          <w:lang w:val="es-SV"/>
-        </w:rPr>
-        <w:br/>
-        <w:t>Los documentos se encuentran distribuidos entre correos electrónicos, carpetas compartidas y archivos locales.</w:t>
-      </w:r>
-    </w:p>
-    <w:p>
-      <w:pPr>
-        <w:spacing w:after="0"/>
-        <w:rPr>
-          <w:rFonts w:ascii="Arial" w:hAnsi="Arial" w:cs="Arial"/>
-          <w:lang w:val="es-SV"/>
-        </w:rPr>
-      </w:pPr>
-    </w:p>
-    <w:p>
-      <w:pPr>
-        <w:spacing w:after="0"/>
-        <w:rPr>
-          <w:rFonts w:ascii="Arial" w:hAnsi="Arial" w:cs="Arial"/>
-          <w:lang w:val="es-SV"/>
-        </w:rPr>
-      </w:pPr>
-      <w:r>
-        <w:rPr>
-          <w:rFonts w:ascii="Arial" w:hAnsi="Arial" w:cs="Arial"/>
-          <w:lang w:val="es-SV"/>
-        </w:rPr>
-        <w:t>Falta de control de versiones</w:t>
-      </w:r>
-      <w:r>
-        <w:rPr>
-          <w:rFonts w:ascii="Arial" w:hAnsi="Arial" w:cs="Arial"/>
-          <w:lang w:val="es-SV"/>
-        </w:rPr>
-        <w:t>.</w:t>
-      </w:r>
-      <w:r>
-        <w:rPr>
-          <w:rFonts w:ascii="Arial" w:hAnsi="Arial" w:cs="Arial"/>
-          <w:lang w:val="es-SV"/>
-        </w:rPr>
-        <w:br/>
-        <w:t>No existe un mecanismo que permita identificar claramente la versión más reciente de un documento.</w:t>
-      </w:r>
-    </w:p>
-    <w:p>
-      <w:pPr>
-        <w:spacing w:after="0"/>
-        <w:rPr>
-          <w:rFonts w:ascii="Arial" w:hAnsi="Arial" w:cs="Arial"/>
-          <w:lang w:val="es-SV"/>
-        </w:rPr>
-      </w:pPr>
-    </w:p>
-    <w:p>
-      <w:pPr>
-        <w:rPr>
-          <w:rFonts w:ascii="Arial" w:hAnsi="Arial" w:cs="Arial"/>
-          <w:lang w:val="es-SV"/>
-        </w:rPr>
-      </w:pPr>
-      <w:r>
-        <w:rPr>
-          <w:rFonts w:ascii="Arial" w:hAnsi="Arial" w:cs="Arial"/>
-          <w:lang w:val="es-SV"/>
-        </w:rPr>
-        <w:t>Falta de trazabilidad</w:t>
-      </w:r>
-      <w:r>
-        <w:rPr>
-          <w:rFonts w:ascii="Arial" w:hAnsi="Arial" w:cs="Arial"/>
-          <w:lang w:val="es-SV"/>
-        </w:rPr>
-        <w:t>.</w:t>
-      </w:r>
-      <w:r>
-        <w:rPr>
-          <w:rFonts w:ascii="Arial" w:hAnsi="Arial" w:cs="Arial"/>
-          <w:lang w:val="es-SV"/>
-        </w:rPr>
-        <w:br/>
-        <w:t>No se puede identificar fácilmente quién creó, modificó o aprobó un documento</w:t>
-      </w:r>
-      <w:r>
-        <w:rPr>
-          <w:rFonts w:ascii="Arial" w:hAnsi="Arial" w:cs="Arial"/>
-          <w:lang w:val="es-SV"/>
-        </w:rPr>
-        <w:t>.</w:t>
-      </w:r>
-    </w:p>
-    <w:p>
-      <w:pPr>
-        <w:rPr>
-          <w:rFonts w:ascii="Arial" w:hAnsi="Arial" w:cs="Arial"/>
-          <w:lang w:val="es-SV"/>
-        </w:rPr>
-      </w:pPr>
-      <w:r>
-        <w:rPr>
-          <w:rFonts w:ascii="Arial" w:hAnsi="Arial" w:cs="Arial"/>
-          <w:lang w:val="es-SV"/>
-        </w:rPr>
-        <w:t>Ausencia de proceso formal de aprobación</w:t>
-      </w:r>
-      <w:r>
-        <w:rPr>
-          <w:rFonts w:ascii="Arial" w:hAnsi="Arial" w:cs="Arial"/>
-          <w:lang w:val="es-SV"/>
-        </w:rPr>
-        <w:t>.</w:t>
-      </w:r>
-      <w:r>
-        <w:rPr>
-          <w:rFonts w:ascii="Arial" w:hAnsi="Arial" w:cs="Arial"/>
-          <w:lang w:val="es-SV"/>
-        </w:rPr>
-        <w:br/>
-        <w:t>Los documentos pueden ser utilizados sin haber pasado por un proceso formal de validación.</w:t>
-      </w:r>
-    </w:p>
-    <w:p>
-      <w:pPr>
-        <w:rPr>
-          <w:rFonts w:ascii="Arial" w:hAnsi="Arial" w:cs="Arial"/>
-          <w:lang w:val="es-SV"/>
-        </w:rPr>
-      </w:pPr>
-      <w:r>
-        <w:rPr>
-          <w:rFonts w:ascii="Arial" w:hAnsi="Arial" w:cs="Arial"/>
-          <w:lang w:val="es-SV"/>
-        </w:rPr>
-        <w:t>Falta de control de accesos y roles</w:t>
-      </w:r>
-      <w:r>
-        <w:rPr>
-          <w:rFonts w:ascii="Arial" w:hAnsi="Arial" w:cs="Arial"/>
-          <w:lang w:val="es-SV"/>
-        </w:rPr>
-        <w:t>.</w:t>
-      </w:r>
-      <w:r>
-        <w:rPr>
-          <w:rFonts w:ascii="Arial" w:hAnsi="Arial" w:cs="Arial"/>
-          <w:lang w:val="es-SV"/>
-        </w:rPr>
-        <w:br/>
-        <w:t>Actualmente no existe una estructura clara de permisos para gestionar quién puede crear, modificar o aprobar documentos.</w:t>
-      </w:r>
-    </w:p>
-    <w:p>
-      <w:pPr>
-        <w:rPr>
-          <w:rFonts w:ascii="Arial" w:hAnsi="Arial" w:cs="Arial"/>
-          <w:lang w:val="es-SV"/>
-        </w:rPr>
-      </w:pPr>
-    </w:p>
-    <w:p>
-      <w:pPr>
-        <w:pStyle w:val="Heading2"/>
+    </w:p>
+    <w:p>
+      <w:pPr>
+        <w:pStyle w:val="Ttulo2"/>
         <w:rPr>
           <w:rFonts w:ascii="Arial" w:hAnsi="Arial" w:cs="Arial"/>
           <w:color w:val="auto"/>
@@ -3556,7 +3482,7 @@
           <w:lang w:val="es-SV"/>
         </w:rPr>
       </w:pPr>
-      <w:bookmarkStart w:id="5" w:name="_Toc224035369"/>
+      <w:bookmarkStart w:id="5" w:name="_Toc224570639"/>
       <w:r>
         <w:rPr>
           <w:rFonts w:ascii="Arial" w:hAnsi="Arial" w:cs="Arial"/>
@@ -3565,18 +3491,236 @@
           <w:szCs w:val="24"/>
           <w:lang w:val="es-SV"/>
         </w:rPr>
+        <w:t>Debilidades del proceso identificadas (según enfoque CMMI)</w:t>
+      </w:r>
+      <w:bookmarkEnd w:id="5"/>
+    </w:p>
+    <w:p>
+      <w:pPr>
+        <w:spacing w:after="0"/>
+        <w:rPr>
+          <w:rFonts w:ascii="Arial" w:hAnsi="Arial" w:cs="Arial"/>
+          <w:lang w:val="es-SV"/>
+        </w:rPr>
+      </w:pPr>
+      <w:r>
+        <w:rPr>
+          <w:rFonts w:ascii="Arial" w:hAnsi="Arial" w:cs="Arial"/>
+          <w:lang w:val="es-SV"/>
+        </w:rPr>
+        <w:t>A partir del análisis de los resultados de la encuesta, se identificaron varias debilidades en el proceso actual de gestión documental:</w:t>
+      </w:r>
+    </w:p>
+    <w:p>
+      <w:pPr>
+        <w:spacing w:after="0"/>
+        <w:rPr>
+          <w:rFonts w:ascii="Arial" w:hAnsi="Arial" w:cs="Arial"/>
+          <w:lang w:val="es-SV"/>
+        </w:rPr>
+      </w:pPr>
+      <w:r>
+        <w:rPr>
+          <w:rFonts w:ascii="Arial" w:hAnsi="Arial" w:cs="Arial"/>
+          <w:lang w:val="es-SV"/>
+        </w:rPr>
+        <w:t>Falta de repositorio centralizado</w:t>
+      </w:r>
+      <w:r>
+        <w:rPr>
+          <w:rFonts w:ascii="Arial" w:hAnsi="Arial" w:cs="Arial"/>
+          <w:lang w:val="es-SV"/>
+        </w:rPr>
+        <w:br/>
+        <w:t>Los documentos se encuentran distribuidos entre correos electrónicos, carpetas compartidas y archivos locales.</w:t>
+      </w:r>
+    </w:p>
+    <w:p>
+      <w:pPr>
+        <w:spacing w:after="0"/>
+        <w:rPr>
+          <w:rFonts w:ascii="Arial" w:hAnsi="Arial" w:cs="Arial"/>
+          <w:lang w:val="es-SV"/>
+        </w:rPr>
+      </w:pPr>
+    </w:p>
+    <w:p>
+      <w:pPr>
+        <w:spacing w:after="0"/>
+        <w:rPr>
+          <w:rFonts w:ascii="Arial" w:hAnsi="Arial" w:cs="Arial"/>
+          <w:lang w:val="es-SV"/>
+        </w:rPr>
+      </w:pPr>
+      <w:r>
+        <w:rPr>
+          <w:rFonts w:ascii="Arial" w:hAnsi="Arial" w:cs="Arial"/>
+          <w:lang w:val="es-SV"/>
+        </w:rPr>
+        <w:t>Falta de control de versiones</w:t>
+      </w:r>
+      <w:r>
+        <w:rPr>
+          <w:rFonts w:ascii="Arial" w:hAnsi="Arial" w:cs="Arial"/>
+          <w:lang w:val="es-SV"/>
+        </w:rPr>
+        <w:t>.</w:t>
+      </w:r>
+      <w:r>
+        <w:rPr>
+          <w:rFonts w:ascii="Arial" w:hAnsi="Arial" w:cs="Arial"/>
+          <w:lang w:val="es-SV"/>
+        </w:rPr>
+        <w:br/>
+        <w:t>No existe un mecanismo que permita identificar claramente la versión más reciente de un documento.</w:t>
+      </w:r>
+    </w:p>
+    <w:p>
+      <w:pPr>
+        <w:spacing w:after="0"/>
+        <w:rPr>
+          <w:rFonts w:ascii="Arial" w:hAnsi="Arial" w:cs="Arial"/>
+          <w:lang w:val="es-SV"/>
+        </w:rPr>
+      </w:pPr>
+    </w:p>
+    <w:p>
+      <w:pPr>
+        <w:rPr>
+          <w:rFonts w:ascii="Arial" w:hAnsi="Arial" w:cs="Arial"/>
+          <w:lang w:val="es-SV"/>
+        </w:rPr>
+      </w:pPr>
+      <w:r>
+        <w:rPr>
+          <w:rFonts w:ascii="Arial" w:hAnsi="Arial" w:cs="Arial"/>
+          <w:lang w:val="es-SV"/>
+        </w:rPr>
+        <w:lastRenderedPageBreak/>
+        <w:t>Falta de trazabilidad</w:t>
+      </w:r>
+      <w:r>
+        <w:rPr>
+          <w:rFonts w:ascii="Arial" w:hAnsi="Arial" w:cs="Arial"/>
+          <w:lang w:val="es-SV"/>
+        </w:rPr>
+        <w:t>.</w:t>
+      </w:r>
+      <w:r>
+        <w:rPr>
+          <w:rFonts w:ascii="Arial" w:hAnsi="Arial" w:cs="Arial"/>
+          <w:lang w:val="es-SV"/>
+        </w:rPr>
+        <w:br/>
+        <w:t>No se puede identificar fácilmente quién creó, modificó o aprobó un documento</w:t>
+      </w:r>
+      <w:r>
+        <w:rPr>
+          <w:rFonts w:ascii="Arial" w:hAnsi="Arial" w:cs="Arial"/>
+          <w:lang w:val="es-SV"/>
+        </w:rPr>
+        <w:t>.</w:t>
+      </w:r>
+    </w:p>
+    <w:p>
+      <w:pPr>
+        <w:rPr>
+          <w:rFonts w:ascii="Arial" w:hAnsi="Arial" w:cs="Arial"/>
+          <w:lang w:val="es-SV"/>
+        </w:rPr>
+      </w:pPr>
+      <w:r>
+        <w:rPr>
+          <w:rFonts w:ascii="Arial" w:hAnsi="Arial" w:cs="Arial"/>
+          <w:lang w:val="es-SV"/>
+        </w:rPr>
+        <w:t>Ausencia de proceso formal de aprobación</w:t>
+      </w:r>
+      <w:r>
+        <w:rPr>
+          <w:rFonts w:ascii="Arial" w:hAnsi="Arial" w:cs="Arial"/>
+          <w:lang w:val="es-SV"/>
+        </w:rPr>
+        <w:t>.</w:t>
+      </w:r>
+      <w:r>
+        <w:rPr>
+          <w:rFonts w:ascii="Arial" w:hAnsi="Arial" w:cs="Arial"/>
+          <w:lang w:val="es-SV"/>
+        </w:rPr>
+        <w:br/>
+        <w:t>Los documentos pueden ser utilizados sin haber pasado por un proceso formal de validación.</w:t>
+      </w:r>
+    </w:p>
+    <w:p>
+      <w:pPr>
+        <w:rPr>
+          <w:rFonts w:ascii="Arial" w:hAnsi="Arial" w:cs="Arial"/>
+          <w:lang w:val="es-SV"/>
+        </w:rPr>
+      </w:pPr>
+      <w:r>
+        <w:rPr>
+          <w:rFonts w:ascii="Arial" w:hAnsi="Arial" w:cs="Arial"/>
+          <w:lang w:val="es-SV"/>
+        </w:rPr>
+        <w:t>Falta de control de accesos y roles</w:t>
+      </w:r>
+      <w:r>
+        <w:rPr>
+          <w:rFonts w:ascii="Arial" w:hAnsi="Arial" w:cs="Arial"/>
+          <w:lang w:val="es-SV"/>
+        </w:rPr>
+        <w:t>.</w:t>
+      </w:r>
+      <w:r>
+        <w:rPr>
+          <w:rFonts w:ascii="Arial" w:hAnsi="Arial" w:cs="Arial"/>
+          <w:lang w:val="es-SV"/>
+        </w:rPr>
+        <w:br/>
+        <w:t>Actualmente no existe una estructura clara de permisos para gestionar quién puede crear, modificar o aprobar documentos.</w:t>
+      </w:r>
+    </w:p>
+    <w:p>
+      <w:pPr>
+        <w:rPr>
+          <w:rFonts w:ascii="Arial" w:hAnsi="Arial" w:cs="Arial"/>
+          <w:lang w:val="es-SV"/>
+        </w:rPr>
+      </w:pPr>
+    </w:p>
+    <w:p>
+      <w:pPr>
+        <w:pStyle w:val="Ttulo2"/>
+        <w:rPr>
+          <w:rFonts w:ascii="Arial" w:hAnsi="Arial" w:cs="Arial"/>
+          <w:color w:val="auto"/>
+          <w:sz w:val="24"/>
+          <w:szCs w:val="24"/>
+          <w:lang w:val="es-SV"/>
+        </w:rPr>
+      </w:pPr>
+      <w:bookmarkStart w:id="6" w:name="_Toc224570640"/>
+      <w:r>
+        <w:rPr>
+          <w:rFonts w:ascii="Arial" w:hAnsi="Arial" w:cs="Arial"/>
+          <w:color w:val="auto"/>
+          <w:sz w:val="24"/>
+          <w:szCs w:val="24"/>
+          <w:lang w:val="es-SV"/>
+        </w:rPr>
         <w:t>Conclusión del diagnostico</w:t>
       </w:r>
-      <w:bookmarkEnd w:id="5"/>
-    </w:p>
-    <w:p>
-      <w:pPr>
-        <w:rPr>
-          <w:rFonts w:ascii="Arial" w:hAnsi="Arial" w:cs="Arial"/>
-          <w:lang w:val="es-SV"/>
-        </w:rPr>
-      </w:pPr>
-      <w:bookmarkStart w:id="6" w:name="_Toc224035370"/>
+      <w:bookmarkEnd w:id="6"/>
+    </w:p>
+    <w:p>
+      <w:pPr>
+        <w:rPr>
+          <w:rFonts w:ascii="Arial" w:hAnsi="Arial" w:cs="Arial"/>
+          <w:lang w:val="es-SV"/>
+        </w:rPr>
+      </w:pPr>
       <w:r>
         <w:rPr>
           <w:rFonts w:ascii="Arial" w:hAnsi="Arial" w:cs="Arial"/>
@@ -3698,7 +3842,7 @@
     </w:p>
     <w:p>
       <w:pPr>
-        <w:pStyle w:val="Heading1"/>
+        <w:pStyle w:val="Ttulo1"/>
         <w:spacing w:line="360" w:lineRule="auto"/>
         <w:rPr>
           <w:rFonts w:ascii="Arial" w:hAnsi="Arial" w:cs="Arial"/>
@@ -3710,6 +3854,7 @@
           <w:lang w:val="es-SV"/>
         </w:rPr>
       </w:pPr>
+      <w:bookmarkStart w:id="7" w:name="_Toc224570641"/>
       <w:r>
         <w:rPr>
           <w:rFonts w:ascii="Arial" w:hAnsi="Arial" w:cs="Arial"/>
@@ -3720,13 +3865,14 @@
           <w:szCs w:val="24"/>
           <w:lang w:val="es-SV"/>
         </w:rPr>
+        <w:lastRenderedPageBreak/>
         <w:t>Diagramas AS-IS</w:t>
       </w:r>
-      <w:bookmarkEnd w:id="6"/>
-    </w:p>
-    <w:p>
-      <w:pPr>
-        <w:pStyle w:val="Heading2"/>
+      <w:bookmarkEnd w:id="7"/>
+    </w:p>
+    <w:p>
+      <w:pPr>
+        <w:pStyle w:val="Ttulo2"/>
         <w:rPr>
           <w:rFonts w:ascii="Arial" w:hAnsi="Arial" w:cs="Arial"/>
           <w:color w:val="auto"/>
@@ -3735,7 +3881,7 @@
           <w:lang w:val="es-SV"/>
         </w:rPr>
       </w:pPr>
-      <w:bookmarkStart w:id="7" w:name="_Toc224035371"/>
+      <w:bookmarkStart w:id="8" w:name="_Toc224570642"/>
       <w:r>
         <w:rPr>
           <w:rFonts w:ascii="Arial" w:hAnsi="Arial" w:cs="Arial"/>
@@ -3746,7 +3892,7 @@
         </w:rPr>
         <w:t>Buscar un documento en el correo</w:t>
       </w:r>
-      <w:bookmarkEnd w:id="7"/>
+      <w:bookmarkEnd w:id="8"/>
     </w:p>
     <w:p>
       <w:pPr>
@@ -3833,7 +3979,7 @@
     </w:p>
     <w:p>
       <w:pPr>
-        <w:pStyle w:val="Heading2"/>
+        <w:pStyle w:val="Ttulo2"/>
         <w:rPr>
           <w:rFonts w:ascii="Arial" w:hAnsi="Arial" w:cs="Arial"/>
           <w:color w:val="auto"/>
@@ -3842,7 +3988,7 @@
           <w:lang w:val="es-SV"/>
         </w:rPr>
       </w:pPr>
-      <w:bookmarkStart w:id="8" w:name="_Toc224035372"/>
+      <w:bookmarkStart w:id="9" w:name="_Toc224570643"/>
       <w:r>
         <w:rPr>
           <w:rFonts w:ascii="Arial" w:hAnsi="Arial" w:cs="Arial"/>
@@ -3851,9 +3997,10 @@
           <w:szCs w:val="24"/>
           <w:lang w:val="es-SV"/>
         </w:rPr>
+        <w:lastRenderedPageBreak/>
         <w:t>Buscar un documento en los archivos compartidos</w:t>
       </w:r>
-      <w:bookmarkEnd w:id="8"/>
+      <w:bookmarkEnd w:id="9"/>
       <w:r>
         <w:rPr>
           <w:rFonts w:ascii="Arial" w:hAnsi="Arial" w:cs="Arial"/>
@@ -3950,7 +4097,7 @@
     </w:p>
     <w:p>
       <w:pPr>
-        <w:pStyle w:val="Heading2"/>
+        <w:pStyle w:val="Ttulo2"/>
         <w:rPr>
           <w:rFonts w:ascii="Arial" w:hAnsi="Arial" w:cs="Arial"/>
           <w:color w:val="auto"/>
@@ -3959,7 +4106,7 @@
           <w:lang w:val="es-SV"/>
         </w:rPr>
       </w:pPr>
-      <w:bookmarkStart w:id="9" w:name="_Toc224035373"/>
+      <w:bookmarkStart w:id="10" w:name="_Toc224570644"/>
       <w:r>
         <w:rPr>
           <w:rFonts w:ascii="Arial" w:hAnsi="Arial" w:cs="Arial"/>
@@ -3968,9 +4115,10 @@
           <w:szCs w:val="24"/>
           <w:lang w:val="es-SV"/>
         </w:rPr>
+        <w:lastRenderedPageBreak/>
         <w:t>Buscar un documento en los archivos locales</w:t>
       </w:r>
-      <w:bookmarkEnd w:id="9"/>
+      <w:bookmarkEnd w:id="10"/>
     </w:p>
     <w:p>
       <w:pPr>
@@ -4057,7 +4205,7 @@
     </w:p>
     <w:p>
       <w:pPr>
-        <w:pStyle w:val="Heading1"/>
+        <w:pStyle w:val="Ttulo1"/>
         <w:spacing w:line="360" w:lineRule="auto"/>
         <w:rPr>
           <w:rFonts w:ascii="Arial" w:hAnsi="Arial" w:cs="Arial"/>
@@ -4069,7 +4217,7 @@
           <w:lang w:val="es-SV"/>
         </w:rPr>
       </w:pPr>
-      <w:bookmarkStart w:id="10" w:name="_Toc224035374"/>
+      <w:bookmarkStart w:id="11" w:name="_Toc224570645"/>
       <w:r>
         <w:rPr>
           <w:rFonts w:ascii="Arial" w:hAnsi="Arial" w:cs="Arial"/>
@@ -4080,13 +4228,14 @@
           <w:szCs w:val="24"/>
           <w:lang w:val="es-SV"/>
         </w:rPr>
+        <w:lastRenderedPageBreak/>
         <w:t>Diagramas TO-BE</w:t>
       </w:r>
-      <w:bookmarkEnd w:id="10"/>
-    </w:p>
-    <w:p>
-      <w:pPr>
-        <w:pStyle w:val="Heading2"/>
+      <w:bookmarkEnd w:id="11"/>
+    </w:p>
+    <w:p>
+      <w:pPr>
+        <w:pStyle w:val="Ttulo2"/>
         <w:rPr>
           <w:rFonts w:ascii="Arial" w:hAnsi="Arial" w:cs="Arial"/>
           <w:color w:val="auto"/>
@@ -4095,7 +4244,7 @@
           <w:lang w:val="es-SV"/>
         </w:rPr>
       </w:pPr>
-      <w:bookmarkStart w:id="11" w:name="_Toc224035375"/>
+      <w:bookmarkStart w:id="12" w:name="_Toc224570646"/>
       <w:r>
         <w:rPr>
           <w:rFonts w:ascii="Arial" w:hAnsi="Arial" w:cs="Arial"/>
@@ -4106,7 +4255,7 @@
         </w:rPr>
         <w:t>Buscar un documento</w:t>
       </w:r>
-      <w:bookmarkEnd w:id="11"/>
+      <w:bookmarkEnd w:id="12"/>
     </w:p>
     <w:p>
       <w:pPr>
@@ -4208,7 +4357,7 @@
     </w:p>
     <w:p>
       <w:pPr>
-        <w:pStyle w:val="Heading2"/>
+        <w:pStyle w:val="Ttulo2"/>
         <w:rPr>
           <w:rFonts w:ascii="Arial" w:hAnsi="Arial" w:cs="Arial"/>
           <w:color w:val="auto"/>
@@ -4217,7 +4366,7 @@
           <w:lang w:val="es-SV"/>
         </w:rPr>
       </w:pPr>
-      <w:bookmarkStart w:id="12" w:name="_Toc224035376"/>
+      <w:bookmarkStart w:id="13" w:name="_Toc224570647"/>
       <w:r>
         <w:rPr>
           <w:rFonts w:ascii="Arial" w:hAnsi="Arial" w:cs="Arial"/>
@@ -4226,9 +4375,10 @@
           <w:szCs w:val="24"/>
           <w:lang w:val="es-SV"/>
         </w:rPr>
+        <w:lastRenderedPageBreak/>
         <w:t>Subir un documento</w:t>
       </w:r>
-      <w:bookmarkEnd w:id="12"/>
+      <w:bookmarkEnd w:id="13"/>
     </w:p>
     <w:p>
       <w:pPr>
@@ -4338,7 +4488,7 @@
     </w:p>
     <w:p>
       <w:pPr>
-        <w:pStyle w:val="Heading2"/>
+        <w:pStyle w:val="Ttulo2"/>
         <w:rPr>
           <w:rFonts w:ascii="Arial" w:hAnsi="Arial" w:cs="Arial"/>
           <w:color w:val="auto"/>
@@ -4347,7 +4497,7 @@
           <w:lang w:val="es-SV"/>
         </w:rPr>
       </w:pPr>
-      <w:bookmarkStart w:id="13" w:name="_Toc224035377"/>
+      <w:bookmarkStart w:id="14" w:name="_Toc224570648"/>
       <w:r>
         <w:rPr>
           <w:rFonts w:ascii="Arial" w:hAnsi="Arial" w:cs="Arial"/>
@@ -4356,9 +4506,10 @@
           <w:szCs w:val="24"/>
           <w:lang w:val="es-SV"/>
         </w:rPr>
+        <w:lastRenderedPageBreak/>
         <w:t>Crear un nuevo usuario</w:t>
       </w:r>
-      <w:bookmarkEnd w:id="13"/>
+      <w:bookmarkEnd w:id="14"/>
     </w:p>
     <w:p>
       <w:pPr>
@@ -4491,7 +4642,7 @@
           <w:lang w:val="es-SV"/>
         </w:rPr>
       </w:pPr>
-      <w:bookmarkStart w:id="14" w:name="_Toc224298479"/>
+      <w:bookmarkStart w:id="15" w:name="_Toc224298479"/>
       <w:r>
         <w:rPr>
           <w:rFonts w:ascii="Arial" w:eastAsiaTheme="majorEastAsia" w:hAnsi="Arial" w:cs="Arial"/>
@@ -4499,18 +4650,19 @@
           <w:bCs/>
           <w:lang w:val="es-SV"/>
         </w:rPr>
+        <w:lastRenderedPageBreak/>
         <w:t>Mejoras concretas</w:t>
       </w:r>
-      <w:bookmarkEnd w:id="14"/>
-    </w:p>
-    <w:p>
-      <w:pPr>
-        <w:rPr>
-          <w:rFonts w:ascii="Arial" w:eastAsiaTheme="majorEastAsia" w:hAnsi="Arial" w:cs="Arial"/>
-          <w:lang w:val="es-SV"/>
-        </w:rPr>
-      </w:pPr>
-      <w:bookmarkStart w:id="15" w:name="_Toc224298480"/>
+      <w:bookmarkEnd w:id="15"/>
+    </w:p>
+    <w:p>
+      <w:pPr>
+        <w:rPr>
+          <w:rFonts w:ascii="Arial" w:eastAsiaTheme="majorEastAsia" w:hAnsi="Arial" w:cs="Arial"/>
+          <w:lang w:val="es-SV"/>
+        </w:rPr>
+      </w:pPr>
+      <w:bookmarkStart w:id="16" w:name="_Toc224298480"/>
       <w:r>
         <w:rPr>
           <w:rFonts w:ascii="Arial" w:eastAsiaTheme="majorEastAsia" w:hAnsi="Arial" w:cs="Arial"/>
@@ -4542,7 +4694,7 @@
         </w:rPr>
         <w:t>Github</w:t>
       </w:r>
-      <w:bookmarkEnd w:id="15"/>
+      <w:bookmarkEnd w:id="16"/>
       <w:proofErr w:type="spellEnd"/>
     </w:p>
     <w:p>
@@ -4736,23 +4888,7 @@
           <w:rFonts w:ascii="Arial" w:eastAsiaTheme="majorEastAsia" w:hAnsi="Arial" w:cs="Arial"/>
           <w:lang w:val="es-SV"/>
         </w:rPr>
-        <w:t xml:space="preserve">Nuestra meta con </w:t>
-      </w:r>
-      <w:proofErr w:type="gramStart"/>
-      <w:r>
-        <w:rPr>
-          <w:rFonts w:ascii="Arial" w:eastAsiaTheme="majorEastAsia" w:hAnsi="Arial" w:cs="Arial"/>
-          <w:lang w:val="es-SV"/>
-        </w:rPr>
-        <w:t>esto,</w:t>
-      </w:r>
-      <w:proofErr w:type="gramEnd"/>
-      <w:r>
-        <w:rPr>
-          <w:rFonts w:ascii="Arial" w:eastAsiaTheme="majorEastAsia" w:hAnsi="Arial" w:cs="Arial"/>
-          <w:lang w:val="es-SV"/>
-        </w:rPr>
-        <w:t xml:space="preserve"> es que quede claro que hace cada </w:t>
+        <w:t xml:space="preserve">Nuestra meta con esto, es que quede claro que hace cada </w:t>
       </w:r>
       <w:proofErr w:type="spellStart"/>
       <w:r>
@@ -4786,61 +4922,29 @@
           <w:lang w:val="es-SV"/>
         </w:rPr>
       </w:pPr>
-      <w:bookmarkStart w:id="16" w:name="_Toc224298481"/>
-      <w:r>
-        <w:rPr>
-          <w:rFonts w:ascii="Arial" w:eastAsiaTheme="majorEastAsia" w:hAnsi="Arial" w:cs="Arial"/>
-          <w:lang w:val="es-SV"/>
-        </w:rPr>
-        <w:t xml:space="preserve">Uso de </w:t>
-      </w:r>
-      <w:proofErr w:type="gramStart"/>
-      <w:r>
-        <w:rPr>
-          <w:rFonts w:ascii="Arial" w:eastAsiaTheme="majorEastAsia" w:hAnsi="Arial" w:cs="Arial"/>
-          <w:lang w:val="es-SV"/>
-        </w:rPr>
-        <w:t>status</w:t>
-      </w:r>
-      <w:proofErr w:type="gramEnd"/>
-      <w:r>
-        <w:rPr>
-          <w:rFonts w:ascii="Arial" w:eastAsiaTheme="majorEastAsia" w:hAnsi="Arial" w:cs="Arial"/>
-          <w:lang w:val="es-SV"/>
-        </w:rPr>
-        <w:t xml:space="preserve"> en el tablero</w:t>
-      </w:r>
-      <w:bookmarkEnd w:id="16"/>
-    </w:p>
-    <w:p>
-      <w:pPr>
-        <w:rPr>
-          <w:rFonts w:ascii="Arial" w:eastAsiaTheme="majorEastAsia" w:hAnsi="Arial" w:cs="Arial"/>
-          <w:lang w:val="es-SV"/>
-        </w:rPr>
-      </w:pPr>
-      <w:r>
-        <w:rPr>
-          <w:rFonts w:ascii="Arial" w:eastAsiaTheme="majorEastAsia" w:hAnsi="Arial" w:cs="Arial"/>
-          <w:lang w:val="es-SV"/>
-        </w:rPr>
-        <w:t xml:space="preserve">Ya que estaremos ocupando un tablero para poder así tener un mejor manejo de las tareas de cada uno. En este caso estaremos ocupando un campo de </w:t>
-      </w:r>
-      <w:proofErr w:type="gramStart"/>
-      <w:r>
-        <w:rPr>
-          <w:rFonts w:ascii="Arial" w:eastAsiaTheme="majorEastAsia" w:hAnsi="Arial" w:cs="Arial"/>
-          <w:lang w:val="es-SV"/>
-        </w:rPr>
-        <w:t>status</w:t>
-      </w:r>
-      <w:proofErr w:type="gramEnd"/>
-      <w:r>
-        <w:rPr>
-          <w:rFonts w:ascii="Arial" w:eastAsiaTheme="majorEastAsia" w:hAnsi="Arial" w:cs="Arial"/>
-          <w:lang w:val="es-SV"/>
-        </w:rPr>
-        <w:t>, el cual mostrara como va avanzando cada parte del proyecto. Nos enfocaremos en las siguientes características:</w:t>
+      <w:bookmarkStart w:id="17" w:name="_Toc224298481"/>
+      <w:r>
+        <w:rPr>
+          <w:rFonts w:ascii="Arial" w:eastAsiaTheme="majorEastAsia" w:hAnsi="Arial" w:cs="Arial"/>
+          <w:lang w:val="es-SV"/>
+        </w:rPr>
+        <w:t>Uso de status en el tablero</w:t>
+      </w:r>
+      <w:bookmarkEnd w:id="17"/>
+    </w:p>
+    <w:p>
+      <w:pPr>
+        <w:rPr>
+          <w:rFonts w:ascii="Arial" w:eastAsiaTheme="majorEastAsia" w:hAnsi="Arial" w:cs="Arial"/>
+          <w:lang w:val="es-SV"/>
+        </w:rPr>
+      </w:pPr>
+      <w:r>
+        <w:rPr>
+          <w:rFonts w:ascii="Arial" w:eastAsiaTheme="majorEastAsia" w:hAnsi="Arial" w:cs="Arial"/>
+          <w:lang w:val="es-SV"/>
+        </w:rPr>
+        <w:t>Ya que estaremos ocupando un tablero para poder así tener un mejor manejo de las tareas de cada uno. En este caso estaremos ocupando un campo de status, el cual mostrara como va avanzando cada parte del proyecto. Nos enfocaremos en las siguientes características:</w:t>
       </w:r>
     </w:p>
     <w:p>
@@ -4955,28 +5059,13 @@
           <w:lang w:val="es-SV"/>
         </w:rPr>
       </w:pPr>
-    </w:p>
-    <w:p>
-      <w:pPr>
-        <w:rPr>
-          <w:rFonts w:ascii="Arial" w:eastAsiaTheme="majorEastAsia" w:hAnsi="Arial" w:cs="Arial"/>
-          <w:lang w:val="es-SV"/>
-        </w:rPr>
-      </w:pPr>
-    </w:p>
-    <w:p>
-      <w:pPr>
-        <w:rPr>
-          <w:rFonts w:ascii="Arial" w:eastAsiaTheme="majorEastAsia" w:hAnsi="Arial" w:cs="Arial"/>
-          <w:lang w:val="es-SV"/>
-        </w:rPr>
-      </w:pPr>
-      <w:bookmarkStart w:id="17" w:name="_Toc224298482"/>
-      <w:r>
-        <w:rPr>
-          <w:rFonts w:ascii="Arial" w:eastAsiaTheme="majorEastAsia" w:hAnsi="Arial" w:cs="Arial"/>
-          <w:lang w:val="es-SV"/>
-        </w:rPr>
+      <w:bookmarkStart w:id="18" w:name="_Toc224298482"/>
+      <w:r>
+        <w:rPr>
+          <w:rFonts w:ascii="Arial" w:eastAsiaTheme="majorEastAsia" w:hAnsi="Arial" w:cs="Arial"/>
+          <w:lang w:val="es-SV"/>
+        </w:rPr>
+        <w:lastRenderedPageBreak/>
         <w:t xml:space="preserve">Uso de </w:t>
       </w:r>
       <w:proofErr w:type="spellStart"/>
@@ -4995,7 +5084,7 @@
         </w:rPr>
         <w:t xml:space="preserve"> en el tablero</w:t>
       </w:r>
-      <w:bookmarkEnd w:id="17"/>
+      <w:bookmarkEnd w:id="18"/>
     </w:p>
     <w:p>
       <w:pPr>
@@ -5100,7 +5189,7 @@
           <w:lang w:val="es-SV"/>
         </w:rPr>
       </w:pPr>
-      <w:bookmarkStart w:id="18" w:name="_Toc224298483"/>
+      <w:bookmarkStart w:id="19" w:name="_Toc224298483"/>
       <w:r>
         <w:rPr>
           <w:rFonts w:ascii="Arial" w:eastAsiaTheme="majorEastAsia" w:hAnsi="Arial" w:cs="Arial"/>
@@ -5124,7 +5213,7 @@
         </w:rPr>
         <w:t xml:space="preserve"> en el tablero</w:t>
       </w:r>
-      <w:bookmarkEnd w:id="18"/>
+      <w:bookmarkEnd w:id="19"/>
     </w:p>
     <w:p>
       <w:pPr>
@@ -5389,28 +5478,13 @@
           <w:lang w:val="es-SV"/>
         </w:rPr>
       </w:pPr>
-    </w:p>
-    <w:p>
-      <w:pPr>
-        <w:rPr>
-          <w:rFonts w:ascii="Arial" w:eastAsiaTheme="majorEastAsia" w:hAnsi="Arial" w:cs="Arial"/>
-          <w:lang w:val="es-SV"/>
-        </w:rPr>
-      </w:pPr>
-    </w:p>
-    <w:p>
-      <w:pPr>
-        <w:rPr>
-          <w:rFonts w:ascii="Arial" w:eastAsiaTheme="majorEastAsia" w:hAnsi="Arial" w:cs="Arial"/>
-          <w:lang w:val="es-SV"/>
-        </w:rPr>
-      </w:pPr>
-      <w:bookmarkStart w:id="19" w:name="_Toc224298484"/>
-      <w:r>
-        <w:rPr>
-          <w:rFonts w:ascii="Arial" w:eastAsiaTheme="majorEastAsia" w:hAnsi="Arial" w:cs="Arial"/>
-          <w:lang w:val="es-SV"/>
-        </w:rPr>
+      <w:bookmarkStart w:id="20" w:name="_Toc224298484"/>
+      <w:r>
+        <w:rPr>
+          <w:rFonts w:ascii="Arial" w:eastAsiaTheme="majorEastAsia" w:hAnsi="Arial" w:cs="Arial"/>
+          <w:lang w:val="es-SV"/>
+        </w:rPr>
+        <w:lastRenderedPageBreak/>
         <w:t xml:space="preserve">Uso de </w:t>
       </w:r>
       <w:proofErr w:type="spellStart"/>
@@ -5429,7 +5503,7 @@
         </w:rPr>
         <w:t xml:space="preserve"> en el tablero</w:t>
       </w:r>
-      <w:bookmarkEnd w:id="19"/>
+      <w:bookmarkEnd w:id="20"/>
     </w:p>
     <w:p>
       <w:pPr>
@@ -5462,7 +5536,133 @@
     </w:p>
     <w:p>
       <w:pPr>
-        <w:pStyle w:val="Heading1"/>
+        <w:rPr>
+          <w:lang w:val="es-SV"/>
+        </w:rPr>
+      </w:pPr>
+    </w:p>
+    <w:p>
+      <w:pPr>
+        <w:rPr>
+          <w:lang w:val="es-SV"/>
+        </w:rPr>
+      </w:pPr>
+    </w:p>
+    <w:p>
+      <w:pPr>
+        <w:rPr>
+          <w:lang w:val="es-SV"/>
+        </w:rPr>
+      </w:pPr>
+    </w:p>
+    <w:p>
+      <w:pPr>
+        <w:rPr>
+          <w:lang w:val="es-SV"/>
+        </w:rPr>
+      </w:pPr>
+    </w:p>
+    <w:p>
+      <w:pPr>
+        <w:rPr>
+          <w:lang w:val="es-SV"/>
+        </w:rPr>
+      </w:pPr>
+    </w:p>
+    <w:p>
+      <w:pPr>
+        <w:rPr>
+          <w:lang w:val="es-SV"/>
+        </w:rPr>
+      </w:pPr>
+    </w:p>
+    <w:p>
+      <w:pPr>
+        <w:rPr>
+          <w:lang w:val="es-SV"/>
+        </w:rPr>
+      </w:pPr>
+    </w:p>
+    <w:p>
+      <w:pPr>
+        <w:rPr>
+          <w:lang w:val="es-SV"/>
+        </w:rPr>
+      </w:pPr>
+    </w:p>
+    <w:p>
+      <w:pPr>
+        <w:rPr>
+          <w:lang w:val="es-SV"/>
+        </w:rPr>
+      </w:pPr>
+    </w:p>
+    <w:p>
+      <w:pPr>
+        <w:rPr>
+          <w:lang w:val="es-SV"/>
+        </w:rPr>
+      </w:pPr>
+    </w:p>
+    <w:p>
+      <w:pPr>
+        <w:rPr>
+          <w:lang w:val="es-SV"/>
+        </w:rPr>
+      </w:pPr>
+    </w:p>
+    <w:p>
+      <w:pPr>
+        <w:rPr>
+          <w:lang w:val="es-SV"/>
+        </w:rPr>
+      </w:pPr>
+    </w:p>
+    <w:p>
+      <w:pPr>
+        <w:rPr>
+          <w:lang w:val="es-SV"/>
+        </w:rPr>
+      </w:pPr>
+    </w:p>
+    <w:p>
+      <w:pPr>
+        <w:rPr>
+          <w:lang w:val="es-SV"/>
+        </w:rPr>
+      </w:pPr>
+    </w:p>
+    <w:p>
+      <w:pPr>
+        <w:rPr>
+          <w:lang w:val="es-SV"/>
+        </w:rPr>
+      </w:pPr>
+    </w:p>
+    <w:p>
+      <w:pPr>
+        <w:rPr>
+          <w:lang w:val="es-SV"/>
+        </w:rPr>
+      </w:pPr>
+    </w:p>
+    <w:p>
+      <w:pPr>
+        <w:rPr>
+          <w:lang w:val="es-SV"/>
+        </w:rPr>
+      </w:pPr>
+    </w:p>
+    <w:p>
+      <w:pPr>
+        <w:rPr>
+          <w:lang w:val="es-SV"/>
+        </w:rPr>
+      </w:pPr>
+    </w:p>
+    <w:p>
+      <w:pPr>
+        <w:pStyle w:val="Ttulo1"/>
         <w:spacing w:line="360" w:lineRule="auto"/>
         <w:rPr>
           <w:rFonts w:ascii="Arial" w:hAnsi="Arial" w:cs="Arial"/>
@@ -5474,7 +5674,8 @@
           <w:lang w:val="es-SV"/>
         </w:rPr>
       </w:pPr>
-      <w:bookmarkStart w:id="20" w:name="_Toc224298485"/>
+      <w:bookmarkStart w:id="21" w:name="_Toc224298485"/>
+      <w:bookmarkStart w:id="22" w:name="_Toc224570649"/>
       <w:r>
         <w:rPr>
           <w:rFonts w:ascii="Arial" w:hAnsi="Arial" w:cs="Arial"/>
@@ -5485,23 +5686,29 @@
           <w:szCs w:val="24"/>
           <w:lang w:val="es-SV"/>
         </w:rPr>
-        <w:t>Evidencia de aplicación</w:t>
-      </w:r>
-      <w:bookmarkEnd w:id="20"/>
-    </w:p>
-    <w:p>
-      <w:pPr>
-        <w:pStyle w:val="Heading2"/>
-        <w:rPr>
-          <w:rFonts w:ascii="Arial" w:hAnsi="Arial" w:cs="Arial"/>
+        <w:lastRenderedPageBreak/>
+        <w:t>Evidencia de aplic</w:t>
+      </w:r>
+      <w:bookmarkStart w:id="23" w:name="_GoBack"/>
+      <w:bookmarkEnd w:id="23"/>
+      <w:r>
+        <w:rPr>
+          <w:rFonts w:ascii="Arial" w:hAnsi="Arial" w:cs="Arial"/>
+          <w:b/>
+          <w:bCs/>
           <w:color w:val="auto"/>
           <w:sz w:val="24"/>
           <w:szCs w:val="24"/>
           <w:lang w:val="es-SV"/>
         </w:rPr>
-      </w:pPr>
-      <w:bookmarkStart w:id="21" w:name="_Toc224298486"/>
-      <w:r>
+        <w:t>ación</w:t>
+      </w:r>
+      <w:bookmarkEnd w:id="21"/>
+      <w:bookmarkEnd w:id="22"/>
+    </w:p>
+    <w:p>
+      <w:pPr>
+        <w:pStyle w:val="Ttulo2"/>
         <w:rPr>
           <w:rFonts w:ascii="Arial" w:hAnsi="Arial" w:cs="Arial"/>
           <w:color w:val="auto"/>
@@ -5509,9 +5716,21 @@
           <w:szCs w:val="24"/>
           <w:lang w:val="es-SV"/>
         </w:rPr>
+      </w:pPr>
+      <w:bookmarkStart w:id="24" w:name="_Toc224298486"/>
+      <w:bookmarkStart w:id="25" w:name="_Toc224570650"/>
+      <w:r>
+        <w:rPr>
+          <w:rFonts w:ascii="Arial" w:hAnsi="Arial" w:cs="Arial"/>
+          <w:color w:val="auto"/>
+          <w:sz w:val="24"/>
+          <w:szCs w:val="24"/>
+          <w:lang w:val="es-SV"/>
+        </w:rPr>
         <w:t>Tablero</w:t>
       </w:r>
-      <w:bookmarkEnd w:id="21"/>
+      <w:bookmarkEnd w:id="24"/>
+      <w:bookmarkEnd w:id="25"/>
     </w:p>
     <w:p>
       <w:pPr>
@@ -5523,7 +5742,7 @@
       <w:hyperlink r:id="rId19" w:history="1">
         <w:r>
           <w:rPr>
-            <w:rStyle w:val="Hyperlink"/>
+            <w:rStyle w:val="Hipervnculo"/>
             <w:rFonts w:ascii="Arial" w:hAnsi="Arial" w:cs="Arial"/>
             <w:lang w:val="es-SV"/>
           </w:rPr>
@@ -5591,7 +5810,7 @@
     </w:p>
     <w:p>
       <w:pPr>
-        <w:pStyle w:val="Heading2"/>
+        <w:pStyle w:val="Ttulo2"/>
         <w:rPr>
           <w:rFonts w:ascii="Arial" w:hAnsi="Arial" w:cs="Arial"/>
           <w:color w:val="auto"/>
@@ -5600,7 +5819,8 @@
           <w:lang w:val="es-SV"/>
         </w:rPr>
       </w:pPr>
-      <w:bookmarkStart w:id="22" w:name="_Toc224298487"/>
+      <w:bookmarkStart w:id="26" w:name="_Toc224298487"/>
+      <w:bookmarkStart w:id="27" w:name="_Toc224570651"/>
       <w:r>
         <w:rPr>
           <w:rFonts w:ascii="Arial" w:hAnsi="Arial" w:cs="Arial"/>
@@ -5622,7 +5842,8 @@
         </w:rPr>
         <w:t>commits</w:t>
       </w:r>
-      <w:bookmarkEnd w:id="22"/>
+      <w:bookmarkEnd w:id="26"/>
+      <w:bookmarkEnd w:id="27"/>
       <w:proofErr w:type="spellEnd"/>
     </w:p>
     <w:p>
@@ -5701,7 +5922,31 @@
     </w:p>
     <w:p>
       <w:pPr>
-        <w:pStyle w:val="Heading1"/>
+        <w:rPr>
+          <w:rFonts w:ascii="Arial" w:hAnsi="Arial" w:cs="Arial"/>
+          <w:lang w:val="es-SV"/>
+        </w:rPr>
+      </w:pPr>
+    </w:p>
+    <w:p>
+      <w:pPr>
+        <w:rPr>
+          <w:rFonts w:ascii="Arial" w:hAnsi="Arial" w:cs="Arial"/>
+          <w:lang w:val="es-SV"/>
+        </w:rPr>
+      </w:pPr>
+    </w:p>
+    <w:p>
+      <w:pPr>
+        <w:rPr>
+          <w:rFonts w:ascii="Arial" w:hAnsi="Arial" w:cs="Arial"/>
+          <w:lang w:val="es-SV"/>
+        </w:rPr>
+      </w:pPr>
+    </w:p>
+    <w:p>
+      <w:pPr>
+        <w:pStyle w:val="Ttulo1"/>
         <w:spacing w:line="360" w:lineRule="auto"/>
         <w:rPr>
           <w:rFonts w:ascii="Arial" w:hAnsi="Arial" w:cs="Arial"/>
@@ -5713,7 +5958,7 @@
           <w:lang w:val="es-SV"/>
         </w:rPr>
       </w:pPr>
-      <w:bookmarkStart w:id="23" w:name="_Toc224035382"/>
+      <w:bookmarkStart w:id="28" w:name="_Toc224570652"/>
       <w:r>
         <w:rPr>
           <w:rFonts w:ascii="Arial" w:hAnsi="Arial" w:cs="Arial"/>
@@ -5724,6 +5969,7 @@
           <w:szCs w:val="24"/>
           <w:lang w:val="es-SV"/>
         </w:rPr>
+        <w:lastRenderedPageBreak/>
         <w:t xml:space="preserve">Repositorio de </w:t>
       </w:r>
       <w:proofErr w:type="spellStart"/>
@@ -5739,7 +5985,7 @@
         </w:rPr>
         <w:t>Github</w:t>
       </w:r>
-      <w:bookmarkEnd w:id="23"/>
+      <w:bookmarkEnd w:id="28"/>
       <w:proofErr w:type="spellEnd"/>
     </w:p>
     <w:p>
@@ -5753,7 +5999,7 @@
       <w:hyperlink r:id="rId22" w:history="1">
         <w:r>
           <w:rPr>
-            <w:rStyle w:val="Hyperlink"/>
+            <w:rStyle w:val="Hipervnculo"/>
             <w:rFonts w:ascii="Arial" w:hAnsi="Arial" w:cs="Arial"/>
             <w:color w:val="auto"/>
             <w:lang w:val="es-ES"/>
@@ -5788,7 +6034,167 @@
     </w:p>
     <w:p>
       <w:pPr>
-        <w:pStyle w:val="Heading1"/>
+        <w:rPr>
+          <w:rFonts w:ascii="Arial" w:hAnsi="Arial" w:cs="Arial"/>
+          <w:lang w:val="es-SV"/>
+        </w:rPr>
+      </w:pPr>
+    </w:p>
+    <w:p>
+      <w:pPr>
+        <w:rPr>
+          <w:rFonts w:ascii="Arial" w:hAnsi="Arial" w:cs="Arial"/>
+          <w:lang w:val="es-SV"/>
+        </w:rPr>
+      </w:pPr>
+    </w:p>
+    <w:p>
+      <w:pPr>
+        <w:rPr>
+          <w:rFonts w:ascii="Arial" w:hAnsi="Arial" w:cs="Arial"/>
+          <w:lang w:val="es-SV"/>
+        </w:rPr>
+      </w:pPr>
+    </w:p>
+    <w:p>
+      <w:pPr>
+        <w:rPr>
+          <w:rFonts w:ascii="Arial" w:hAnsi="Arial" w:cs="Arial"/>
+          <w:lang w:val="es-SV"/>
+        </w:rPr>
+      </w:pPr>
+    </w:p>
+    <w:p>
+      <w:pPr>
+        <w:rPr>
+          <w:rFonts w:ascii="Arial" w:hAnsi="Arial" w:cs="Arial"/>
+          <w:lang w:val="es-SV"/>
+        </w:rPr>
+      </w:pPr>
+    </w:p>
+    <w:p>
+      <w:pPr>
+        <w:rPr>
+          <w:rFonts w:ascii="Arial" w:hAnsi="Arial" w:cs="Arial"/>
+          <w:lang w:val="es-SV"/>
+        </w:rPr>
+      </w:pPr>
+    </w:p>
+    <w:p>
+      <w:pPr>
+        <w:rPr>
+          <w:rFonts w:ascii="Arial" w:hAnsi="Arial" w:cs="Arial"/>
+          <w:lang w:val="es-SV"/>
+        </w:rPr>
+      </w:pPr>
+    </w:p>
+    <w:p>
+      <w:pPr>
+        <w:rPr>
+          <w:rFonts w:ascii="Arial" w:hAnsi="Arial" w:cs="Arial"/>
+          <w:lang w:val="es-SV"/>
+        </w:rPr>
+      </w:pPr>
+    </w:p>
+    <w:p>
+      <w:pPr>
+        <w:rPr>
+          <w:rFonts w:ascii="Arial" w:hAnsi="Arial" w:cs="Arial"/>
+          <w:lang w:val="es-SV"/>
+        </w:rPr>
+      </w:pPr>
+    </w:p>
+    <w:p>
+      <w:pPr>
+        <w:rPr>
+          <w:rFonts w:ascii="Arial" w:hAnsi="Arial" w:cs="Arial"/>
+          <w:lang w:val="es-SV"/>
+        </w:rPr>
+      </w:pPr>
+    </w:p>
+    <w:p>
+      <w:pPr>
+        <w:rPr>
+          <w:rFonts w:ascii="Arial" w:hAnsi="Arial" w:cs="Arial"/>
+          <w:lang w:val="es-SV"/>
+        </w:rPr>
+      </w:pPr>
+    </w:p>
+    <w:p>
+      <w:pPr>
+        <w:rPr>
+          <w:rFonts w:ascii="Arial" w:hAnsi="Arial" w:cs="Arial"/>
+          <w:lang w:val="es-SV"/>
+        </w:rPr>
+      </w:pPr>
+    </w:p>
+    <w:p>
+      <w:pPr>
+        <w:rPr>
+          <w:rFonts w:ascii="Arial" w:hAnsi="Arial" w:cs="Arial"/>
+          <w:lang w:val="es-SV"/>
+        </w:rPr>
+      </w:pPr>
+    </w:p>
+    <w:p>
+      <w:pPr>
+        <w:rPr>
+          <w:rFonts w:ascii="Arial" w:hAnsi="Arial" w:cs="Arial"/>
+          <w:lang w:val="es-SV"/>
+        </w:rPr>
+      </w:pPr>
+    </w:p>
+    <w:p>
+      <w:pPr>
+        <w:rPr>
+          <w:rFonts w:ascii="Arial" w:hAnsi="Arial" w:cs="Arial"/>
+          <w:lang w:val="es-SV"/>
+        </w:rPr>
+      </w:pPr>
+    </w:p>
+    <w:p>
+      <w:pPr>
+        <w:rPr>
+          <w:rFonts w:ascii="Arial" w:hAnsi="Arial" w:cs="Arial"/>
+          <w:lang w:val="es-SV"/>
+        </w:rPr>
+      </w:pPr>
+    </w:p>
+    <w:p>
+      <w:pPr>
+        <w:rPr>
+          <w:rFonts w:ascii="Arial" w:hAnsi="Arial" w:cs="Arial"/>
+          <w:lang w:val="es-SV"/>
+        </w:rPr>
+      </w:pPr>
+    </w:p>
+    <w:p>
+      <w:pPr>
+        <w:rPr>
+          <w:rFonts w:ascii="Arial" w:hAnsi="Arial" w:cs="Arial"/>
+          <w:lang w:val="es-SV"/>
+        </w:rPr>
+      </w:pPr>
+    </w:p>
+    <w:p>
+      <w:pPr>
+        <w:rPr>
+          <w:rFonts w:ascii="Arial" w:hAnsi="Arial" w:cs="Arial"/>
+          <w:lang w:val="es-SV"/>
+        </w:rPr>
+      </w:pPr>
+    </w:p>
+    <w:p>
+      <w:pPr>
+        <w:rPr>
+          <w:rFonts w:ascii="Arial" w:hAnsi="Arial" w:cs="Arial"/>
+          <w:lang w:val="es-SV"/>
+        </w:rPr>
+      </w:pPr>
+    </w:p>
+    <w:p>
+      <w:pPr>
+        <w:pStyle w:val="Ttulo1"/>
         <w:spacing w:line="360" w:lineRule="auto"/>
         <w:rPr>
           <w:rFonts w:ascii="Arial" w:hAnsi="Arial" w:cs="Arial"/>
@@ -5800,7 +6206,7 @@
           <w:lang w:val="es-SV"/>
         </w:rPr>
       </w:pPr>
-      <w:bookmarkStart w:id="24" w:name="_Toc224035383"/>
+      <w:bookmarkStart w:id="29" w:name="_Toc224570653"/>
       <w:r>
         <w:rPr>
           <w:rFonts w:ascii="Arial" w:hAnsi="Arial" w:cs="Arial"/>
@@ -5811,9 +6217,10 @@
           <w:szCs w:val="24"/>
           <w:lang w:val="es-SV"/>
         </w:rPr>
+        <w:lastRenderedPageBreak/>
         <w:t>Anexos</w:t>
       </w:r>
-      <w:bookmarkEnd w:id="24"/>
+      <w:bookmarkEnd w:id="29"/>
     </w:p>
     <w:p>
       <w:pPr>
@@ -5838,7 +6245,7 @@
 </file>
 
 <file path=word/endnotes.xml><?xml version="1.0" encoding="utf-8"?>
-<w:endnotes xmlns:wpc="http://schemas.microsoft.com/office/word/2010/wordprocessingCanvas" xmlns:cx="http://schemas.microsoft.com/office/drawing/2014/chartex" xmlns:cx1="http://schemas.microsoft.com/office/drawing/2015/9/8/chartex" xmlns:cx2="http://schemas.microsoft.com/office/drawing/2015/10/21/chartex" xmlns:cx3="http://schemas.microsoft.com/office/drawing/2016/5/9/chartex" xmlns:cx4="http://schemas.microsoft.com/office/drawing/2016/5/10/chartex" xmlns:cx5="http://schemas.microsoft.com/office/drawing/2016/5/11/chartex" xmlns:cx6="http://schemas.microsoft.com/office/drawing/2016/5/12/chartex" xmlns:cx7="http://schemas.microsoft.com/office/drawing/2016/5/13/chartex" xmlns:cx8="http://schemas.microsoft.com/office/drawing/2016/5/14/chartex" xmlns:mc="http://schemas.openxmlformats.org/markup-compatibility/2006" xmlns:aink="http://schemas.microsoft.com/office/drawing/2016/ink" xmlns:am3d="http://schemas.microsoft.com/office/drawing/2017/model3d" xmlns:o="urn:schemas-microsoft-com:office:office" xmlns:oel="http://schemas.microsoft.com/office/2019/extlst" xmlns:r="http://schemas.openxmlformats.org/officeDocument/2006/relationships" xmlns:m="http://schemas.openxmlformats.org/officeDocument/2006/math" xmlns:v="urn:schemas-microsoft-com:vml" xmlns:wp14="http://schemas.microsoft.com/office/word/2010/wordprocessingDrawing" xmlns:wp="http://schemas.openxmlformats.org/drawingml/2006/wordprocessingDrawing" xmlns:w10="urn:schemas-microsoft-com:office:word" xmlns:w="http://schemas.openxmlformats.org/wordprocessingml/2006/main" xmlns:w14="http://schemas.microsoft.com/office/word/2010/wordml" xmlns:w15="http://schemas.microsoft.com/office/word/2012/wordml" xmlns:w16cex="http://schemas.microsoft.com/office/word/2018/wordml/cex" xmlns:w16cid="http://schemas.microsoft.com/office/word/2016/wordml/cid" xmlns:w16="http://schemas.microsoft.com/office/word/2018/wordml" xmlns:w16du="http://schemas.microsoft.com/office/word/2023/wordml/word16du" xmlns:w16sdtdh="http://schemas.microsoft.com/office/word/2020/wordml/sdtdatahash" xmlns:w16sdtfl="http://schemas.microsoft.com/office/word/2024/wordml/sdtformatlock" xmlns:w16se="http://schemas.microsoft.com/office/word/2015/wordml/symex" xmlns:wpg="http://schemas.microsoft.com/office/word/2010/wordprocessingGroup" xmlns:wpi="http://schemas.microsoft.com/office/word/2010/wordprocessingInk" xmlns:wne="http://schemas.microsoft.com/office/word/2006/wordml" xmlns:wps="http://schemas.microsoft.com/office/word/2010/wordprocessingShape" mc:Ignorable="w14 w15 w16se w16cid w16 w16cex w16sdtdh w16sdtfl w16du wp14">
+<w:endnotes xmlns:wpc="http://schemas.microsoft.com/office/word/2010/wordprocessingCanvas" xmlns:cx="http://schemas.microsoft.com/office/drawing/2014/chartex" xmlns:mc="http://schemas.openxmlformats.org/markup-compatibility/2006" xmlns:o="urn:schemas-microsoft-com:office:office" xmlns:r="http://schemas.openxmlformats.org/officeDocument/2006/relationships" xmlns:m="http://schemas.openxmlformats.org/officeDocument/2006/math" xmlns:v="urn:schemas-microsoft-com:vml" xmlns:wp14="http://schemas.microsoft.com/office/word/2010/wordprocessingDrawing" xmlns:wp="http://schemas.openxmlformats.org/drawingml/2006/wordprocessingDrawing" xmlns:w10="urn:schemas-microsoft-com:office:word" xmlns:w="http://schemas.openxmlformats.org/wordprocessingml/2006/main" xmlns:w14="http://schemas.microsoft.com/office/word/2010/wordml" xmlns:w15="http://schemas.microsoft.com/office/word/2012/wordml" xmlns:w16se="http://schemas.microsoft.com/office/word/2015/wordml/symex" xmlns:wpg="http://schemas.microsoft.com/office/word/2010/wordprocessingGroup" xmlns:wpi="http://schemas.microsoft.com/office/word/2010/wordprocessingInk" xmlns:wne="http://schemas.microsoft.com/office/word/2006/wordml" xmlns:wps="http://schemas.microsoft.com/office/word/2010/wordprocessingShape" mc:Ignorable="w14 w15 w16se wp14">
   <w:endnote w:type="separator" w:id="-1">
     <w:p>
       <w:pPr>
@@ -5863,23 +6270,23 @@
 </file>
 
 <file path=word/footer1.xml><?xml version="1.0" encoding="utf-8"?>
-<w:ftr xmlns:wpc="http://schemas.microsoft.com/office/word/2010/wordprocessingCanvas" xmlns:cx="http://schemas.microsoft.com/office/drawing/2014/chartex" xmlns:cx1="http://schemas.microsoft.com/office/drawing/2015/9/8/chartex" xmlns:cx2="http://schemas.microsoft.com/office/drawing/2015/10/21/chartex" xmlns:cx3="http://schemas.microsoft.com/office/drawing/2016/5/9/chartex" xmlns:cx4="http://schemas.microsoft.com/office/drawing/2016/5/10/chartex" xmlns:cx5="http://schemas.microsoft.com/office/drawing/2016/5/11/chartex" xmlns:cx6="http://schemas.microsoft.com/office/drawing/2016/5/12/chartex" xmlns:cx7="http://schemas.microsoft.com/office/drawing/2016/5/13/chartex" xmlns:cx8="http://schemas.microsoft.com/office/drawing/2016/5/14/chartex" xmlns:mc="http://schemas.openxmlformats.org/markup-compatibility/2006" xmlns:aink="http://schemas.microsoft.com/office/drawing/2016/ink" xmlns:am3d="http://schemas.microsoft.com/office/drawing/2017/model3d" xmlns:o="urn:schemas-microsoft-com:office:office" xmlns:oel="http://schemas.microsoft.com/office/2019/extlst" xmlns:r="http://schemas.openxmlformats.org/officeDocument/2006/relationships" xmlns:m="http://schemas.openxmlformats.org/officeDocument/2006/math" xmlns:v="urn:schemas-microsoft-com:vml" xmlns:wp14="http://schemas.microsoft.com/office/word/2010/wordprocessingDrawing" xmlns:wp="http://schemas.openxmlformats.org/drawingml/2006/wordprocessingDrawing" xmlns:w10="urn:schemas-microsoft-com:office:word" xmlns:w="http://schemas.openxmlformats.org/wordprocessingml/2006/main" xmlns:w14="http://schemas.microsoft.com/office/word/2010/wordml" xmlns:w15="http://schemas.microsoft.com/office/word/2012/wordml" xmlns:w16cex="http://schemas.microsoft.com/office/word/2018/wordml/cex" xmlns:w16cid="http://schemas.microsoft.com/office/word/2016/wordml/cid" xmlns:w16="http://schemas.microsoft.com/office/word/2018/wordml" xmlns:w16du="http://schemas.microsoft.com/office/word/2023/wordml/word16du" xmlns:w16sdtdh="http://schemas.microsoft.com/office/word/2020/wordml/sdtdatahash" xmlns:w16sdtfl="http://schemas.microsoft.com/office/word/2024/wordml/sdtformatlock" xmlns:w16se="http://schemas.microsoft.com/office/word/2015/wordml/symex" xmlns:wpg="http://schemas.microsoft.com/office/word/2010/wordprocessingGroup" xmlns:wpi="http://schemas.microsoft.com/office/word/2010/wordprocessingInk" xmlns:wne="http://schemas.microsoft.com/office/word/2006/wordml" xmlns:wps="http://schemas.microsoft.com/office/word/2010/wordprocessingShape" mc:Ignorable="w14 w15 w16se w16cid w16 w16cex w16sdtdh w16sdtfl w16du wp14">
+<w:ftr xmlns:wpc="http://schemas.microsoft.com/office/word/2010/wordprocessingCanvas" xmlns:cx="http://schemas.microsoft.com/office/drawing/2014/chartex" xmlns:mc="http://schemas.openxmlformats.org/markup-compatibility/2006" xmlns:o="urn:schemas-microsoft-com:office:office" xmlns:r="http://schemas.openxmlformats.org/officeDocument/2006/relationships" xmlns:m="http://schemas.openxmlformats.org/officeDocument/2006/math" xmlns:v="urn:schemas-microsoft-com:vml" xmlns:wp14="http://schemas.microsoft.com/office/word/2010/wordprocessingDrawing" xmlns:wp="http://schemas.openxmlformats.org/drawingml/2006/wordprocessingDrawing" xmlns:w10="urn:schemas-microsoft-com:office:word" xmlns:w="http://schemas.openxmlformats.org/wordprocessingml/2006/main" xmlns:w14="http://schemas.microsoft.com/office/word/2010/wordml" xmlns:w15="http://schemas.microsoft.com/office/word/2012/wordml" xmlns:w16se="http://schemas.microsoft.com/office/word/2015/wordml/symex" xmlns:wpg="http://schemas.microsoft.com/office/word/2010/wordprocessingGroup" xmlns:wpi="http://schemas.microsoft.com/office/word/2010/wordprocessingInk" xmlns:wne="http://schemas.microsoft.com/office/word/2006/wordml" xmlns:wps="http://schemas.microsoft.com/office/word/2010/wordprocessingShape" mc:Ignorable="w14 w15 w16se wp14">
   <w:p>
     <w:pPr>
-      <w:pStyle w:val="Footer"/>
+      <w:pStyle w:val="Piedepgina"/>
       <w:jc w:val="right"/>
     </w:pPr>
   </w:p>
   <w:p>
     <w:pPr>
-      <w:pStyle w:val="Footer"/>
+      <w:pStyle w:val="Piedepgina"/>
     </w:pPr>
   </w:p>
 </w:ftr>
 </file>
 
 <file path=word/footnotes.xml><?xml version="1.0" encoding="utf-8"?>
-<w:footnotes xmlns:wpc="http://schemas.microsoft.com/office/word/2010/wordprocessingCanvas" xmlns:cx="http://schemas.microsoft.com/office/drawing/2014/chartex" xmlns:cx1="http://schemas.microsoft.com/office/drawing/2015/9/8/chartex" xmlns:cx2="http://schemas.microsoft.com/office/drawing/2015/10/21/chartex" xmlns:cx3="http://schemas.microsoft.com/office/drawing/2016/5/9/chartex" xmlns:cx4="http://schemas.microsoft.com/office/drawing/2016/5/10/chartex" xmlns:cx5="http://schemas.microsoft.com/office/drawing/2016/5/11/chartex" xmlns:cx6="http://schemas.microsoft.com/office/drawing/2016/5/12/chartex" xmlns:cx7="http://schemas.microsoft.com/office/drawing/2016/5/13/chartex" xmlns:cx8="http://schemas.microsoft.com/office/drawing/2016/5/14/chartex" xmlns:mc="http://schemas.openxmlformats.org/markup-compatibility/2006" xmlns:aink="http://schemas.microsoft.com/office/drawing/2016/ink" xmlns:am3d="http://schemas.microsoft.com/office/drawing/2017/model3d" xmlns:o="urn:schemas-microsoft-com:office:office" xmlns:oel="http://schemas.microsoft.com/office/2019/extlst" xmlns:r="http://schemas.openxmlformats.org/officeDocument/2006/relationships" xmlns:m="http://schemas.openxmlformats.org/officeDocument/2006/math" xmlns:v="urn:schemas-microsoft-com:vml" xmlns:wp14="http://schemas.microsoft.com/office/word/2010/wordprocessingDrawing" xmlns:wp="http://schemas.openxmlformats.org/drawingml/2006/wordprocessingDrawing" xmlns:w10="urn:schemas-microsoft-com:office:word" xmlns:w="http://schemas.openxmlformats.org/wordprocessingml/2006/main" xmlns:w14="http://schemas.microsoft.com/office/word/2010/wordml" xmlns:w15="http://schemas.microsoft.com/office/word/2012/wordml" xmlns:w16cex="http://schemas.microsoft.com/office/word/2018/wordml/cex" xmlns:w16cid="http://schemas.microsoft.com/office/word/2016/wordml/cid" xmlns:w16="http://schemas.microsoft.com/office/word/2018/wordml" xmlns:w16du="http://schemas.microsoft.com/office/word/2023/wordml/word16du" xmlns:w16sdtdh="http://schemas.microsoft.com/office/word/2020/wordml/sdtdatahash" xmlns:w16sdtfl="http://schemas.microsoft.com/office/word/2024/wordml/sdtformatlock" xmlns:w16se="http://schemas.microsoft.com/office/word/2015/wordml/symex" xmlns:wpg="http://schemas.microsoft.com/office/word/2010/wordprocessingGroup" xmlns:wpi="http://schemas.microsoft.com/office/word/2010/wordprocessingInk" xmlns:wne="http://schemas.microsoft.com/office/word/2006/wordml" xmlns:wps="http://schemas.microsoft.com/office/word/2010/wordprocessingShape" mc:Ignorable="w14 w15 w16se w16cid w16 w16cex w16sdtdh w16sdtfl w16du wp14">
+<w:footnotes xmlns:wpc="http://schemas.microsoft.com/office/word/2010/wordprocessingCanvas" xmlns:cx="http://schemas.microsoft.com/office/drawing/2014/chartex" xmlns:mc="http://schemas.openxmlformats.org/markup-compatibility/2006" xmlns:o="urn:schemas-microsoft-com:office:office" xmlns:r="http://schemas.openxmlformats.org/officeDocument/2006/relationships" xmlns:m="http://schemas.openxmlformats.org/officeDocument/2006/math" xmlns:v="urn:schemas-microsoft-com:vml" xmlns:wp14="http://schemas.microsoft.com/office/word/2010/wordprocessingDrawing" xmlns:wp="http://schemas.openxmlformats.org/drawingml/2006/wordprocessingDrawing" xmlns:w10="urn:schemas-microsoft-com:office:word" xmlns:w="http://schemas.openxmlformats.org/wordprocessingml/2006/main" xmlns:w14="http://schemas.microsoft.com/office/word/2010/wordml" xmlns:w15="http://schemas.microsoft.com/office/word/2012/wordml" xmlns:w16se="http://schemas.microsoft.com/office/word/2015/wordml/symex" xmlns:wpg="http://schemas.microsoft.com/office/word/2010/wordprocessingGroup" xmlns:wpi="http://schemas.microsoft.com/office/word/2010/wordprocessingInk" xmlns:wne="http://schemas.microsoft.com/office/word/2006/wordml" xmlns:wps="http://schemas.microsoft.com/office/word/2010/wordprocessingShape" mc:Ignorable="w14 w15 w16se wp14">
   <w:footnote w:type="separator" w:id="-1">
     <w:p>
       <w:pPr>
@@ -5903,15 +6310,15 @@
   <w:footnote w:id="1">
     <w:p>
       <w:pPr>
-        <w:pStyle w:val="FootnoteText"/>
-        <w:rPr>
-          <w:rFonts w:ascii="Arial" w:hAnsi="Arial" w:cs="Arial"/>
-          <w:lang w:val="es-SV"/>
-        </w:rPr>
-      </w:pPr>
-      <w:r>
-        <w:rPr>
-          <w:rStyle w:val="FootnoteReference"/>
+        <w:pStyle w:val="Textonotapie"/>
+        <w:rPr>
+          <w:rFonts w:ascii="Arial" w:hAnsi="Arial" w:cs="Arial"/>
+          <w:lang w:val="es-SV"/>
+        </w:rPr>
+      </w:pPr>
+      <w:r>
+        <w:rPr>
+          <w:rStyle w:val="Refdenotaalpie"/>
           <w:rFonts w:ascii="Arial" w:hAnsi="Arial" w:cs="Arial"/>
         </w:rPr>
         <w:footnoteRef/>
@@ -5928,15 +6335,15 @@
   <w:footnote w:id="2">
     <w:p>
       <w:pPr>
-        <w:pStyle w:val="FootnoteText"/>
-        <w:rPr>
-          <w:rFonts w:ascii="Arial" w:hAnsi="Arial" w:cs="Arial"/>
-          <w:lang w:val="es-SV"/>
-        </w:rPr>
-      </w:pPr>
-      <w:r>
-        <w:rPr>
-          <w:rStyle w:val="FootnoteReference"/>
+        <w:pStyle w:val="Textonotapie"/>
+        <w:rPr>
+          <w:rFonts w:ascii="Arial" w:hAnsi="Arial" w:cs="Arial"/>
+          <w:lang w:val="es-SV"/>
+        </w:rPr>
+      </w:pPr>
+      <w:r>
+        <w:rPr>
+          <w:rStyle w:val="Refdenotaalpie"/>
           <w:rFonts w:ascii="Arial" w:hAnsi="Arial" w:cs="Arial"/>
         </w:rPr>
         <w:footnoteRef/>
@@ -5953,15 +6360,15 @@
   <w:footnote w:id="3">
     <w:p>
       <w:pPr>
-        <w:pStyle w:val="FootnoteText"/>
-        <w:rPr>
-          <w:rFonts w:ascii="Arial" w:hAnsi="Arial" w:cs="Arial"/>
-          <w:lang w:val="es-SV"/>
-        </w:rPr>
-      </w:pPr>
-      <w:r>
-        <w:rPr>
-          <w:rStyle w:val="FootnoteReference"/>
+        <w:pStyle w:val="Textonotapie"/>
+        <w:rPr>
+          <w:rFonts w:ascii="Arial" w:hAnsi="Arial" w:cs="Arial"/>
+          <w:lang w:val="es-SV"/>
+        </w:rPr>
+      </w:pPr>
+      <w:r>
+        <w:rPr>
+          <w:rStyle w:val="Refdenotaalpie"/>
           <w:rFonts w:ascii="Arial" w:hAnsi="Arial" w:cs="Arial"/>
         </w:rPr>
         <w:footnoteRef/>
@@ -5978,15 +6385,15 @@
   <w:footnote w:id="4">
     <w:p>
       <w:pPr>
-        <w:pStyle w:val="FootnoteText"/>
-        <w:rPr>
-          <w:rFonts w:ascii="Arial" w:hAnsi="Arial" w:cs="Arial"/>
-          <w:lang w:val="es-SV"/>
-        </w:rPr>
-      </w:pPr>
-      <w:r>
-        <w:rPr>
-          <w:rStyle w:val="FootnoteReference"/>
+        <w:pStyle w:val="Textonotapie"/>
+        <w:rPr>
+          <w:rFonts w:ascii="Arial" w:hAnsi="Arial" w:cs="Arial"/>
+          <w:lang w:val="es-SV"/>
+        </w:rPr>
+      </w:pPr>
+      <w:r>
+        <w:rPr>
+          <w:rStyle w:val="Refdenotaalpie"/>
           <w:rFonts w:ascii="Arial" w:hAnsi="Arial" w:cs="Arial"/>
         </w:rPr>
         <w:footnoteRef/>
@@ -6003,14 +6410,14 @@
   <w:footnote w:id="5">
     <w:p>
       <w:pPr>
-        <w:pStyle w:val="FootnoteText"/>
-        <w:rPr>
-          <w:lang w:val="es-SV"/>
-        </w:rPr>
-      </w:pPr>
-      <w:r>
-        <w:rPr>
-          <w:rStyle w:val="FootnoteReference"/>
+        <w:pStyle w:val="Textonotapie"/>
+        <w:rPr>
+          <w:lang w:val="es-SV"/>
+        </w:rPr>
+      </w:pPr>
+      <w:r>
+        <w:rPr>
+          <w:rStyle w:val="Refdenotaalpie"/>
           <w:rFonts w:ascii="Arial" w:hAnsi="Arial" w:cs="Arial"/>
         </w:rPr>
         <w:footnoteRef/>
@@ -6033,15 +6440,15 @@
   <w:footnote w:id="6">
     <w:p>
       <w:pPr>
-        <w:pStyle w:val="FootnoteText"/>
-        <w:rPr>
-          <w:rFonts w:ascii="Arial" w:hAnsi="Arial" w:cs="Arial"/>
-          <w:lang w:val="es-SV"/>
-        </w:rPr>
-      </w:pPr>
-      <w:r>
-        <w:rPr>
-          <w:rStyle w:val="FootnoteReference"/>
+        <w:pStyle w:val="Textonotapie"/>
+        <w:rPr>
+          <w:rFonts w:ascii="Arial" w:hAnsi="Arial" w:cs="Arial"/>
+          <w:lang w:val="es-SV"/>
+        </w:rPr>
+      </w:pPr>
+      <w:r>
+        <w:rPr>
+          <w:rStyle w:val="Refdenotaalpie"/>
           <w:rFonts w:ascii="Arial" w:hAnsi="Arial" w:cs="Arial"/>
         </w:rPr>
         <w:footnoteRef/>
@@ -6058,15 +6465,15 @@
   <w:footnote w:id="7">
     <w:p>
       <w:pPr>
-        <w:pStyle w:val="FootnoteText"/>
-        <w:rPr>
-          <w:rFonts w:ascii="Arial" w:hAnsi="Arial" w:cs="Arial"/>
-          <w:lang w:val="es-SV"/>
-        </w:rPr>
-      </w:pPr>
-      <w:r>
-        <w:rPr>
-          <w:rStyle w:val="FootnoteReference"/>
+        <w:pStyle w:val="Textonotapie"/>
+        <w:rPr>
+          <w:rFonts w:ascii="Arial" w:hAnsi="Arial" w:cs="Arial"/>
+          <w:lang w:val="es-SV"/>
+        </w:rPr>
+      </w:pPr>
+      <w:r>
+        <w:rPr>
+          <w:rStyle w:val="Refdenotaalpie"/>
           <w:rFonts w:ascii="Arial" w:hAnsi="Arial" w:cs="Arial"/>
         </w:rPr>
         <w:footnoteRef/>
@@ -6083,15 +6490,15 @@
   <w:footnote w:id="8">
     <w:p>
       <w:pPr>
-        <w:pStyle w:val="FootnoteText"/>
-        <w:rPr>
-          <w:rFonts w:ascii="Arial" w:hAnsi="Arial" w:cs="Arial"/>
-          <w:lang w:val="es-SV"/>
-        </w:rPr>
-      </w:pPr>
-      <w:r>
-        <w:rPr>
-          <w:rStyle w:val="FootnoteReference"/>
+        <w:pStyle w:val="Textonotapie"/>
+        <w:rPr>
+          <w:rFonts w:ascii="Arial" w:hAnsi="Arial" w:cs="Arial"/>
+          <w:lang w:val="es-SV"/>
+        </w:rPr>
+      </w:pPr>
+      <w:r>
+        <w:rPr>
+          <w:rStyle w:val="Refdenotaalpie"/>
           <w:rFonts w:ascii="Arial" w:hAnsi="Arial" w:cs="Arial"/>
         </w:rPr>
         <w:footnoteRef/>
@@ -6108,15 +6515,15 @@
   <w:footnote w:id="9">
     <w:p>
       <w:pPr>
-        <w:pStyle w:val="FootnoteText"/>
-        <w:rPr>
-          <w:rFonts w:ascii="Arial" w:hAnsi="Arial" w:cs="Arial"/>
-          <w:lang w:val="es-SV"/>
-        </w:rPr>
-      </w:pPr>
-      <w:r>
-        <w:rPr>
-          <w:rStyle w:val="FootnoteReference"/>
+        <w:pStyle w:val="Textonotapie"/>
+        <w:rPr>
+          <w:rFonts w:ascii="Arial" w:hAnsi="Arial" w:cs="Arial"/>
+          <w:lang w:val="es-SV"/>
+        </w:rPr>
+      </w:pPr>
+      <w:r>
+        <w:rPr>
+          <w:rStyle w:val="Refdenotaalpie"/>
           <w:rFonts w:ascii="Arial" w:hAnsi="Arial" w:cs="Arial"/>
         </w:rPr>
         <w:footnoteRef/>
@@ -6133,14 +6540,14 @@
   <w:footnote w:id="10">
     <w:p>
       <w:pPr>
-        <w:pStyle w:val="FootnoteText"/>
-        <w:rPr>
-          <w:lang w:val="es-SV"/>
-        </w:rPr>
-      </w:pPr>
-      <w:r>
-        <w:rPr>
-          <w:rStyle w:val="FootnoteReference"/>
+        <w:pStyle w:val="Textonotapie"/>
+        <w:rPr>
+          <w:lang w:val="es-SV"/>
+        </w:rPr>
+      </w:pPr>
+      <w:r>
+        <w:rPr>
+          <w:rStyle w:val="Refdenotaalpie"/>
           <w:rFonts w:ascii="Arial" w:hAnsi="Arial" w:cs="Arial"/>
         </w:rPr>
         <w:footnoteRef/>
@@ -6164,39 +6571,39 @@
 </file>
 
 <file path=word/header1.xml><?xml version="1.0" encoding="utf-8"?>
-<w:hdr xmlns:wpc="http://schemas.microsoft.com/office/word/2010/wordprocessingCanvas" xmlns:cx="http://schemas.microsoft.com/office/drawing/2014/chartex" xmlns:cx1="http://schemas.microsoft.com/office/drawing/2015/9/8/chartex" xmlns:cx2="http://schemas.microsoft.com/office/drawing/2015/10/21/chartex" xmlns:cx3="http://schemas.microsoft.com/office/drawing/2016/5/9/chartex" xmlns:cx4="http://schemas.microsoft.com/office/drawing/2016/5/10/chartex" xmlns:cx5="http://schemas.microsoft.com/office/drawing/2016/5/11/chartex" xmlns:cx6="http://schemas.microsoft.com/office/drawing/2016/5/12/chartex" xmlns:cx7="http://schemas.microsoft.com/office/drawing/2016/5/13/chartex" xmlns:cx8="http://schemas.microsoft.com/office/drawing/2016/5/14/chartex" xmlns:mc="http://schemas.openxmlformats.org/markup-compatibility/2006" xmlns:aink="http://schemas.microsoft.com/office/drawing/2016/ink" xmlns:am3d="http://schemas.microsoft.com/office/drawing/2017/model3d" xmlns:o="urn:schemas-microsoft-com:office:office" xmlns:oel="http://schemas.microsoft.com/office/2019/extlst" xmlns:r="http://schemas.openxmlformats.org/officeDocument/2006/relationships" xmlns:m="http://schemas.openxmlformats.org/officeDocument/2006/math" xmlns:v="urn:schemas-microsoft-com:vml" xmlns:wp14="http://schemas.microsoft.com/office/word/2010/wordprocessingDrawing" xmlns:wp="http://schemas.openxmlformats.org/drawingml/2006/wordprocessingDrawing" xmlns:w10="urn:schemas-microsoft-com:office:word" xmlns:w="http://schemas.openxmlformats.org/wordprocessingml/2006/main" xmlns:w14="http://schemas.microsoft.com/office/word/2010/wordml" xmlns:w15="http://schemas.microsoft.com/office/word/2012/wordml" xmlns:w16cex="http://schemas.microsoft.com/office/word/2018/wordml/cex" xmlns:w16cid="http://schemas.microsoft.com/office/word/2016/wordml/cid" xmlns:w16="http://schemas.microsoft.com/office/word/2018/wordml" xmlns:w16du="http://schemas.microsoft.com/office/word/2023/wordml/word16du" xmlns:w16sdtdh="http://schemas.microsoft.com/office/word/2020/wordml/sdtdatahash" xmlns:w16sdtfl="http://schemas.microsoft.com/office/word/2024/wordml/sdtformatlock" xmlns:w16se="http://schemas.microsoft.com/office/word/2015/wordml/symex" xmlns:wpg="http://schemas.microsoft.com/office/word/2010/wordprocessingGroup" xmlns:wpi="http://schemas.microsoft.com/office/word/2010/wordprocessingInk" xmlns:wne="http://schemas.microsoft.com/office/word/2006/wordml" xmlns:wps="http://schemas.microsoft.com/office/word/2010/wordprocessingShape" mc:Ignorable="w14 w15 w16se w16cid w16 w16cex w16sdtdh w16sdtfl w16du wp14">
+<w:hdr xmlns:wpc="http://schemas.microsoft.com/office/word/2010/wordprocessingCanvas" xmlns:cx="http://schemas.microsoft.com/office/drawing/2014/chartex" xmlns:mc="http://schemas.openxmlformats.org/markup-compatibility/2006" xmlns:o="urn:schemas-microsoft-com:office:office" xmlns:r="http://schemas.openxmlformats.org/officeDocument/2006/relationships" xmlns:m="http://schemas.openxmlformats.org/officeDocument/2006/math" xmlns:v="urn:schemas-microsoft-com:vml" xmlns:wp14="http://schemas.microsoft.com/office/word/2010/wordprocessingDrawing" xmlns:wp="http://schemas.openxmlformats.org/drawingml/2006/wordprocessingDrawing" xmlns:w10="urn:schemas-microsoft-com:office:word" xmlns:w="http://schemas.openxmlformats.org/wordprocessingml/2006/main" xmlns:w14="http://schemas.microsoft.com/office/word/2010/wordml" xmlns:w15="http://schemas.microsoft.com/office/word/2012/wordml" xmlns:w16se="http://schemas.microsoft.com/office/word/2015/wordml/symex" xmlns:wpg="http://schemas.microsoft.com/office/word/2010/wordprocessingGroup" xmlns:wpi="http://schemas.microsoft.com/office/word/2010/wordprocessingInk" xmlns:wne="http://schemas.microsoft.com/office/word/2006/wordml" xmlns:wps="http://schemas.microsoft.com/office/word/2010/wordprocessingShape" mc:Ignorable="w14 w15 w16se wp14">
   <w:p>
     <w:pPr>
-      <w:pStyle w:val="Header"/>
+      <w:pStyle w:val="Encabezado"/>
       <w:jc w:val="right"/>
     </w:pPr>
   </w:p>
   <w:p>
     <w:pPr>
-      <w:pStyle w:val="Header"/>
+      <w:pStyle w:val="Encabezado"/>
     </w:pPr>
   </w:p>
 </w:hdr>
 </file>
 
 <file path=word/header2.xml><?xml version="1.0" encoding="utf-8"?>
-<w:hdr xmlns:wpc="http://schemas.microsoft.com/office/word/2010/wordprocessingCanvas" xmlns:cx="http://schemas.microsoft.com/office/drawing/2014/chartex" xmlns:cx1="http://schemas.microsoft.com/office/drawing/2015/9/8/chartex" xmlns:cx2="http://schemas.microsoft.com/office/drawing/2015/10/21/chartex" xmlns:cx3="http://schemas.microsoft.com/office/drawing/2016/5/9/chartex" xmlns:cx4="http://schemas.microsoft.com/office/drawing/2016/5/10/chartex" xmlns:cx5="http://schemas.microsoft.com/office/drawing/2016/5/11/chartex" xmlns:cx6="http://schemas.microsoft.com/office/drawing/2016/5/12/chartex" xmlns:cx7="http://schemas.microsoft.com/office/drawing/2016/5/13/chartex" xmlns:cx8="http://schemas.microsoft.com/office/drawing/2016/5/14/chartex" xmlns:mc="http://schemas.openxmlformats.org/markup-compatibility/2006" xmlns:aink="http://schemas.microsoft.com/office/drawing/2016/ink" xmlns:am3d="http://schemas.microsoft.com/office/drawing/2017/model3d" xmlns:o="urn:schemas-microsoft-com:office:office" xmlns:oel="http://schemas.microsoft.com/office/2019/extlst" xmlns:r="http://schemas.openxmlformats.org/officeDocument/2006/relationships" xmlns:m="http://schemas.openxmlformats.org/officeDocument/2006/math" xmlns:v="urn:schemas-microsoft-com:vml" xmlns:wp14="http://schemas.microsoft.com/office/word/2010/wordprocessingDrawing" xmlns:wp="http://schemas.openxmlformats.org/drawingml/2006/wordprocessingDrawing" xmlns:w10="urn:schemas-microsoft-com:office:word" xmlns:w="http://schemas.openxmlformats.org/wordprocessingml/2006/main" xmlns:w14="http://schemas.microsoft.com/office/word/2010/wordml" xmlns:w15="http://schemas.microsoft.com/office/word/2012/wordml" xmlns:w16cex="http://schemas.microsoft.com/office/word/2018/wordml/cex" xmlns:w16cid="http://schemas.microsoft.com/office/word/2016/wordml/cid" xmlns:w16="http://schemas.microsoft.com/office/word/2018/wordml" xmlns:w16du="http://schemas.microsoft.com/office/word/2023/wordml/word16du" xmlns:w16sdtdh="http://schemas.microsoft.com/office/word/2020/wordml/sdtdatahash" xmlns:w16sdtfl="http://schemas.microsoft.com/office/word/2024/wordml/sdtformatlock" xmlns:w16se="http://schemas.microsoft.com/office/word/2015/wordml/symex" xmlns:wpg="http://schemas.microsoft.com/office/word/2010/wordprocessingGroup" xmlns:wpi="http://schemas.microsoft.com/office/word/2010/wordprocessingInk" xmlns:wne="http://schemas.microsoft.com/office/word/2006/wordml" xmlns:wps="http://schemas.microsoft.com/office/word/2010/wordprocessingShape" mc:Ignorable="w14 w15 w16se w16cid w16 w16cex w16sdtdh w16sdtfl w16du wp14">
+<w:hdr xmlns:wpc="http://schemas.microsoft.com/office/word/2010/wordprocessingCanvas" xmlns:cx="http://schemas.microsoft.com/office/drawing/2014/chartex" xmlns:mc="http://schemas.openxmlformats.org/markup-compatibility/2006" xmlns:o="urn:schemas-microsoft-com:office:office" xmlns:r="http://schemas.openxmlformats.org/officeDocument/2006/relationships" xmlns:m="http://schemas.openxmlformats.org/officeDocument/2006/math" xmlns:v="urn:schemas-microsoft-com:vml" xmlns:wp14="http://schemas.microsoft.com/office/word/2010/wordprocessingDrawing" xmlns:wp="http://schemas.openxmlformats.org/drawingml/2006/wordprocessingDrawing" xmlns:w10="urn:schemas-microsoft-com:office:word" xmlns:w="http://schemas.openxmlformats.org/wordprocessingml/2006/main" xmlns:w14="http://schemas.microsoft.com/office/word/2010/wordml" xmlns:w15="http://schemas.microsoft.com/office/word/2012/wordml" xmlns:w16se="http://schemas.microsoft.com/office/word/2015/wordml/symex" xmlns:wpg="http://schemas.microsoft.com/office/word/2010/wordprocessingGroup" xmlns:wpi="http://schemas.microsoft.com/office/word/2010/wordprocessingInk" xmlns:wne="http://schemas.microsoft.com/office/word/2006/wordml" xmlns:wps="http://schemas.microsoft.com/office/word/2010/wordprocessingShape" mc:Ignorable="w14 w15 w16se wp14">
   <w:p>
     <w:pPr>
-      <w:pStyle w:val="Header"/>
+      <w:pStyle w:val="Encabezado"/>
       <w:jc w:val="right"/>
     </w:pPr>
   </w:p>
   <w:p>
     <w:pPr>
-      <w:pStyle w:val="Header"/>
+      <w:pStyle w:val="Encabezado"/>
     </w:pPr>
   </w:p>
 </w:hdr>
 </file>
 
 <file path=word/header3.xml><?xml version="1.0" encoding="utf-8"?>
-<w:hdr xmlns:wpc="http://schemas.microsoft.com/office/word/2010/wordprocessingCanvas" xmlns:cx="http://schemas.microsoft.com/office/drawing/2014/chartex" xmlns:cx1="http://schemas.microsoft.com/office/drawing/2015/9/8/chartex" xmlns:cx2="http://schemas.microsoft.com/office/drawing/2015/10/21/chartex" xmlns:cx3="http://schemas.microsoft.com/office/drawing/2016/5/9/chartex" xmlns:cx4="http://schemas.microsoft.com/office/drawing/2016/5/10/chartex" xmlns:cx5="http://schemas.microsoft.com/office/drawing/2016/5/11/chartex" xmlns:cx6="http://schemas.microsoft.com/office/drawing/2016/5/12/chartex" xmlns:cx7="http://schemas.microsoft.com/office/drawing/2016/5/13/chartex" xmlns:cx8="http://schemas.microsoft.com/office/drawing/2016/5/14/chartex" xmlns:mc="http://schemas.openxmlformats.org/markup-compatibility/2006" xmlns:aink="http://schemas.microsoft.com/office/drawing/2016/ink" xmlns:am3d="http://schemas.microsoft.com/office/drawing/2017/model3d" xmlns:o="urn:schemas-microsoft-com:office:office" xmlns:oel="http://schemas.microsoft.com/office/2019/extlst" xmlns:r="http://schemas.openxmlformats.org/officeDocument/2006/relationships" xmlns:m="http://schemas.openxmlformats.org/officeDocument/2006/math" xmlns:v="urn:schemas-microsoft-com:vml" xmlns:wp14="http://schemas.microsoft.com/office/word/2010/wordprocessingDrawing" xmlns:wp="http://schemas.openxmlformats.org/drawingml/2006/wordprocessingDrawing" xmlns:w10="urn:schemas-microsoft-com:office:word" xmlns:w="http://schemas.openxmlformats.org/wordprocessingml/2006/main" xmlns:w14="http://schemas.microsoft.com/office/word/2010/wordml" xmlns:w15="http://schemas.microsoft.com/office/word/2012/wordml" xmlns:w16cex="http://schemas.microsoft.com/office/word/2018/wordml/cex" xmlns:w16cid="http://schemas.microsoft.com/office/word/2016/wordml/cid" xmlns:w16="http://schemas.microsoft.com/office/word/2018/wordml" xmlns:w16du="http://schemas.microsoft.com/office/word/2023/wordml/word16du" xmlns:w16sdtdh="http://schemas.microsoft.com/office/word/2020/wordml/sdtdatahash" xmlns:w16sdtfl="http://schemas.microsoft.com/office/word/2024/wordml/sdtformatlock" xmlns:w16se="http://schemas.microsoft.com/office/word/2015/wordml/symex" xmlns:wpg="http://schemas.microsoft.com/office/word/2010/wordprocessingGroup" xmlns:wpi="http://schemas.microsoft.com/office/word/2010/wordprocessingInk" xmlns:wne="http://schemas.microsoft.com/office/word/2006/wordml" xmlns:wps="http://schemas.microsoft.com/office/word/2010/wordprocessingShape" mc:Ignorable="w14 w15 w16se w16cid w16 w16cex w16sdtdh w16sdtfl w16du wp14">
+<w:hdr xmlns:wpc="http://schemas.microsoft.com/office/word/2010/wordprocessingCanvas" xmlns:cx="http://schemas.microsoft.com/office/drawing/2014/chartex" xmlns:mc="http://schemas.openxmlformats.org/markup-compatibility/2006" xmlns:o="urn:schemas-microsoft-com:office:office" xmlns:r="http://schemas.openxmlformats.org/officeDocument/2006/relationships" xmlns:m="http://schemas.openxmlformats.org/officeDocument/2006/math" xmlns:v="urn:schemas-microsoft-com:vml" xmlns:wp14="http://schemas.microsoft.com/office/word/2010/wordprocessingDrawing" xmlns:wp="http://schemas.openxmlformats.org/drawingml/2006/wordprocessingDrawing" xmlns:w10="urn:schemas-microsoft-com:office:word" xmlns:w="http://schemas.openxmlformats.org/wordprocessingml/2006/main" xmlns:w14="http://schemas.microsoft.com/office/word/2010/wordml" xmlns:w15="http://schemas.microsoft.com/office/word/2012/wordml" xmlns:w16se="http://schemas.microsoft.com/office/word/2015/wordml/symex" xmlns:wpg="http://schemas.microsoft.com/office/word/2010/wordprocessingGroup" xmlns:wpi="http://schemas.microsoft.com/office/word/2010/wordprocessingInk" xmlns:wne="http://schemas.microsoft.com/office/word/2006/wordml" xmlns:wps="http://schemas.microsoft.com/office/word/2010/wordprocessingShape" mc:Ignorable="w14 w15 w16se wp14">
   <w:sdt>
     <w:sdtPr>
       <w:id w:val="-1484083713"/>
@@ -6205,10 +6612,11 @@
         <w:docPartUnique/>
       </w:docPartObj>
     </w:sdtPr>
+    <w:sdtEndPr/>
     <w:sdtContent>
       <w:p>
         <w:pPr>
-          <w:pStyle w:val="Header"/>
+          <w:pStyle w:val="Encabezado"/>
           <w:jc w:val="right"/>
         </w:pPr>
         <w:r>
@@ -6225,7 +6633,7 @@
             <w:noProof/>
             <w:lang w:val="es-ES"/>
           </w:rPr>
-          <w:t>5</w:t>
+          <w:t>15</w:t>
         </w:r>
         <w:r>
           <w:fldChar w:fldCharType="end"/>
@@ -6235,14 +6643,14 @@
   </w:sdt>
   <w:p>
     <w:pPr>
-      <w:pStyle w:val="Header"/>
+      <w:pStyle w:val="Encabezado"/>
     </w:pPr>
   </w:p>
 </w:hdr>
 </file>
 
 <file path=word/header4.xml><?xml version="1.0" encoding="utf-8"?>
-<w:hdr xmlns:wpc="http://schemas.microsoft.com/office/word/2010/wordprocessingCanvas" xmlns:cx="http://schemas.microsoft.com/office/drawing/2014/chartex" xmlns:cx1="http://schemas.microsoft.com/office/drawing/2015/9/8/chartex" xmlns:cx2="http://schemas.microsoft.com/office/drawing/2015/10/21/chartex" xmlns:cx3="http://schemas.microsoft.com/office/drawing/2016/5/9/chartex" xmlns:cx4="http://schemas.microsoft.com/office/drawing/2016/5/10/chartex" xmlns:cx5="http://schemas.microsoft.com/office/drawing/2016/5/11/chartex" xmlns:cx6="http://schemas.microsoft.com/office/drawing/2016/5/12/chartex" xmlns:cx7="http://schemas.microsoft.com/office/drawing/2016/5/13/chartex" xmlns:cx8="http://schemas.microsoft.com/office/drawing/2016/5/14/chartex" xmlns:mc="http://schemas.openxmlformats.org/markup-compatibility/2006" xmlns:aink="http://schemas.microsoft.com/office/drawing/2016/ink" xmlns:am3d="http://schemas.microsoft.com/office/drawing/2017/model3d" xmlns:o="urn:schemas-microsoft-com:office:office" xmlns:oel="http://schemas.microsoft.com/office/2019/extlst" xmlns:r="http://schemas.openxmlformats.org/officeDocument/2006/relationships" xmlns:m="http://schemas.openxmlformats.org/officeDocument/2006/math" xmlns:v="urn:schemas-microsoft-com:vml" xmlns:wp14="http://schemas.microsoft.com/office/word/2010/wordprocessingDrawing" xmlns:wp="http://schemas.openxmlformats.org/drawingml/2006/wordprocessingDrawing" xmlns:w10="urn:schemas-microsoft-com:office:word" xmlns:w="http://schemas.openxmlformats.org/wordprocessingml/2006/main" xmlns:w14="http://schemas.microsoft.com/office/word/2010/wordml" xmlns:w15="http://schemas.microsoft.com/office/word/2012/wordml" xmlns:w16cex="http://schemas.microsoft.com/office/word/2018/wordml/cex" xmlns:w16cid="http://schemas.microsoft.com/office/word/2016/wordml/cid" xmlns:w16="http://schemas.microsoft.com/office/word/2018/wordml" xmlns:w16du="http://schemas.microsoft.com/office/word/2023/wordml/word16du" xmlns:w16sdtdh="http://schemas.microsoft.com/office/word/2020/wordml/sdtdatahash" xmlns:w16sdtfl="http://schemas.microsoft.com/office/word/2024/wordml/sdtformatlock" xmlns:w16se="http://schemas.microsoft.com/office/word/2015/wordml/symex" xmlns:wpg="http://schemas.microsoft.com/office/word/2010/wordprocessingGroup" xmlns:wpi="http://schemas.microsoft.com/office/word/2010/wordprocessingInk" xmlns:wne="http://schemas.microsoft.com/office/word/2006/wordml" xmlns:wps="http://schemas.microsoft.com/office/word/2010/wordprocessingShape" mc:Ignorable="w14 w15 w16se w16cid w16 w16cex w16sdtdh w16sdtfl w16du wp14">
+<w:hdr xmlns:wpc="http://schemas.microsoft.com/office/word/2010/wordprocessingCanvas" xmlns:cx="http://schemas.microsoft.com/office/drawing/2014/chartex" xmlns:mc="http://schemas.openxmlformats.org/markup-compatibility/2006" xmlns:o="urn:schemas-microsoft-com:office:office" xmlns:r="http://schemas.openxmlformats.org/officeDocument/2006/relationships" xmlns:m="http://schemas.openxmlformats.org/officeDocument/2006/math" xmlns:v="urn:schemas-microsoft-com:vml" xmlns:wp14="http://schemas.microsoft.com/office/word/2010/wordprocessingDrawing" xmlns:wp="http://schemas.openxmlformats.org/drawingml/2006/wordprocessingDrawing" xmlns:w10="urn:schemas-microsoft-com:office:word" xmlns:w="http://schemas.openxmlformats.org/wordprocessingml/2006/main" xmlns:w14="http://schemas.microsoft.com/office/word/2010/wordml" xmlns:w15="http://schemas.microsoft.com/office/word/2012/wordml" xmlns:w16se="http://schemas.microsoft.com/office/word/2015/wordml/symex" xmlns:wpg="http://schemas.microsoft.com/office/word/2010/wordprocessingGroup" xmlns:wpi="http://schemas.microsoft.com/office/word/2010/wordprocessingInk" xmlns:wne="http://schemas.microsoft.com/office/word/2006/wordml" xmlns:wps="http://schemas.microsoft.com/office/word/2010/wordprocessingShape" mc:Ignorable="w14 w15 w16se wp14">
   <w:sdt>
     <w:sdtPr>
       <w:id w:val="-139118505"/>
@@ -6251,10 +6659,11 @@
         <w:docPartUnique/>
       </w:docPartObj>
     </w:sdtPr>
+    <w:sdtEndPr/>
     <w:sdtContent>
       <w:p>
         <w:pPr>
-          <w:pStyle w:val="Header"/>
+          <w:pStyle w:val="Encabezado"/>
           <w:jc w:val="right"/>
         </w:pPr>
         <w:r>
@@ -6281,14 +6690,14 @@
   </w:sdt>
   <w:p>
     <w:pPr>
-      <w:pStyle w:val="Header"/>
+      <w:pStyle w:val="Encabezado"/>
     </w:pPr>
   </w:p>
 </w:hdr>
 </file>
 
 <file path=word/numbering.xml><?xml version="1.0" encoding="utf-8"?>
-<w:numbering xmlns:wpc="http://schemas.microsoft.com/office/word/2010/wordprocessingCanvas" xmlns:cx="http://schemas.microsoft.com/office/drawing/2014/chartex" xmlns:cx1="http://schemas.microsoft.com/office/drawing/2015/9/8/chartex" xmlns:cx2="http://schemas.microsoft.com/office/drawing/2015/10/21/chartex" xmlns:cx3="http://schemas.microsoft.com/office/drawing/2016/5/9/chartex" xmlns:cx4="http://schemas.microsoft.com/office/drawing/2016/5/10/chartex" xmlns:cx5="http://schemas.microsoft.com/office/drawing/2016/5/11/chartex" xmlns:cx6="http://schemas.microsoft.com/office/drawing/2016/5/12/chartex" xmlns:cx7="http://schemas.microsoft.com/office/drawing/2016/5/13/chartex" xmlns:cx8="http://schemas.microsoft.com/office/drawing/2016/5/14/chartex" xmlns:mc="http://schemas.openxmlformats.org/markup-compatibility/2006" xmlns:aink="http://schemas.microsoft.com/office/drawing/2016/ink" xmlns:am3d="http://schemas.microsoft.com/office/drawing/2017/model3d" xmlns:o="urn:schemas-microsoft-com:office:office" xmlns:oel="http://schemas.microsoft.com/office/2019/extlst" xmlns:r="http://schemas.openxmlformats.org/officeDocument/2006/relationships" xmlns:m="http://schemas.openxmlformats.org/officeDocument/2006/math" xmlns:v="urn:schemas-microsoft-com:vml" xmlns:wp14="http://schemas.microsoft.com/office/word/2010/wordprocessingDrawing" xmlns:wp="http://schemas.openxmlformats.org/drawingml/2006/wordprocessingDrawing" xmlns:w10="urn:schemas-microsoft-com:office:word" xmlns:w="http://schemas.openxmlformats.org/wordprocessingml/2006/main" xmlns:w14="http://schemas.microsoft.com/office/word/2010/wordml" xmlns:w15="http://schemas.microsoft.com/office/word/2012/wordml" xmlns:w16cex="http://schemas.microsoft.com/office/word/2018/wordml/cex" xmlns:w16cid="http://schemas.microsoft.com/office/word/2016/wordml/cid" xmlns:w16="http://schemas.microsoft.com/office/word/2018/wordml" xmlns:w16du="http://schemas.microsoft.com/office/word/2023/wordml/word16du" xmlns:w16sdtdh="http://schemas.microsoft.com/office/word/2020/wordml/sdtdatahash" xmlns:w16sdtfl="http://schemas.microsoft.com/office/word/2024/wordml/sdtformatlock" xmlns:w16se="http://schemas.microsoft.com/office/word/2015/wordml/symex" xmlns:wpg="http://schemas.microsoft.com/office/word/2010/wordprocessingGroup" xmlns:wpi="http://schemas.microsoft.com/office/word/2010/wordprocessingInk" xmlns:wne="http://schemas.microsoft.com/office/word/2006/wordml" xmlns:wps="http://schemas.microsoft.com/office/word/2010/wordprocessingShape" mc:Ignorable="w14 w15 w16se w16cid w16 w16cex w16sdtdh w16sdtfl w16du wp14">
+<w:numbering xmlns:wpc="http://schemas.microsoft.com/office/word/2010/wordprocessingCanvas" xmlns:cx="http://schemas.microsoft.com/office/drawing/2014/chartex" xmlns:mc="http://schemas.openxmlformats.org/markup-compatibility/2006" xmlns:o="urn:schemas-microsoft-com:office:office" xmlns:r="http://schemas.openxmlformats.org/officeDocument/2006/relationships" xmlns:m="http://schemas.openxmlformats.org/officeDocument/2006/math" xmlns:v="urn:schemas-microsoft-com:vml" xmlns:wp14="http://schemas.microsoft.com/office/word/2010/wordprocessingDrawing" xmlns:wp="http://schemas.openxmlformats.org/drawingml/2006/wordprocessingDrawing" xmlns:w10="urn:schemas-microsoft-com:office:word" xmlns:w="http://schemas.openxmlformats.org/wordprocessingml/2006/main" xmlns:w14="http://schemas.microsoft.com/office/word/2010/wordml" xmlns:w15="http://schemas.microsoft.com/office/word/2012/wordml" xmlns:w16se="http://schemas.microsoft.com/office/word/2015/wordml/symex" xmlns:wpg="http://schemas.microsoft.com/office/word/2010/wordprocessingGroup" xmlns:wpi="http://schemas.microsoft.com/office/word/2010/wordprocessingInk" xmlns:wne="http://schemas.microsoft.com/office/word/2006/wordml" xmlns:wps="http://schemas.microsoft.com/office/word/2010/wordprocessingShape" mc:Ignorable="w14 w15 w16se wp14">
   <w:abstractNum w:abstractNumId="0" w15:restartNumberingAfterBreak="0">
     <w:nsid w:val="056A5EBF"/>
     <w:multiLevelType w:val="hybridMultilevel"/>
@@ -7537,83 +7946,47 @@
       </w:rPr>
     </w:lvl>
   </w:abstractNum>
-  <w:num w:numId="1" w16cid:durableId="1467505533">
+  <w:num w:numId="1">
     <w:abstractNumId w:val="8"/>
   </w:num>
-  <w:num w:numId="2" w16cid:durableId="1702051499">
+  <w:num w:numId="2">
     <w:abstractNumId w:val="9"/>
   </w:num>
-  <w:num w:numId="3" w16cid:durableId="666833500">
+  <w:num w:numId="3">
     <w:abstractNumId w:val="2"/>
   </w:num>
-  <w:num w:numId="4" w16cid:durableId="398865724">
+  <w:num w:numId="4">
     <w:abstractNumId w:val="3"/>
   </w:num>
-  <w:num w:numId="5" w16cid:durableId="307367556">
+  <w:num w:numId="5">
     <w:abstractNumId w:val="7"/>
   </w:num>
-  <w:num w:numId="6" w16cid:durableId="2040011748">
+  <w:num w:numId="6">
     <w:abstractNumId w:val="10"/>
   </w:num>
-  <w:num w:numId="7" w16cid:durableId="34238990">
+  <w:num w:numId="7">
     <w:abstractNumId w:val="5"/>
   </w:num>
-  <w:num w:numId="8" w16cid:durableId="234514778">
+  <w:num w:numId="8">
     <w:abstractNumId w:val="6"/>
   </w:num>
-  <w:num w:numId="9" w16cid:durableId="408499778">
+  <w:num w:numId="9">
     <w:abstractNumId w:val="0"/>
-    <w:lvlOverride w:ilvl="0"/>
-    <w:lvlOverride w:ilvl="1"/>
-    <w:lvlOverride w:ilvl="2"/>
-    <w:lvlOverride w:ilvl="3"/>
-    <w:lvlOverride w:ilvl="4"/>
-    <w:lvlOverride w:ilvl="5"/>
-    <w:lvlOverride w:ilvl="6"/>
-    <w:lvlOverride w:ilvl="7"/>
-    <w:lvlOverride w:ilvl="8"/>
   </w:num>
-  <w:num w:numId="10" w16cid:durableId="845632673">
+  <w:num w:numId="10">
     <w:abstractNumId w:val="4"/>
-    <w:lvlOverride w:ilvl="0"/>
-    <w:lvlOverride w:ilvl="1"/>
-    <w:lvlOverride w:ilvl="2"/>
-    <w:lvlOverride w:ilvl="3"/>
-    <w:lvlOverride w:ilvl="4"/>
-    <w:lvlOverride w:ilvl="5"/>
-    <w:lvlOverride w:ilvl="6"/>
-    <w:lvlOverride w:ilvl="7"/>
-    <w:lvlOverride w:ilvl="8"/>
   </w:num>
-  <w:num w:numId="11" w16cid:durableId="1479105638">
+  <w:num w:numId="11">
     <w:abstractNumId w:val="1"/>
-    <w:lvlOverride w:ilvl="0"/>
-    <w:lvlOverride w:ilvl="1"/>
-    <w:lvlOverride w:ilvl="2"/>
-    <w:lvlOverride w:ilvl="3"/>
-    <w:lvlOverride w:ilvl="4"/>
-    <w:lvlOverride w:ilvl="5"/>
-    <w:lvlOverride w:ilvl="6"/>
-    <w:lvlOverride w:ilvl="7"/>
-    <w:lvlOverride w:ilvl="8"/>
   </w:num>
-  <w:num w:numId="12" w16cid:durableId="551113858">
+  <w:num w:numId="12">
     <w:abstractNumId w:val="11"/>
-    <w:lvlOverride w:ilvl="0"/>
-    <w:lvlOverride w:ilvl="1"/>
-    <w:lvlOverride w:ilvl="2"/>
-    <w:lvlOverride w:ilvl="3"/>
-    <w:lvlOverride w:ilvl="4"/>
-    <w:lvlOverride w:ilvl="5"/>
-    <w:lvlOverride w:ilvl="6"/>
-    <w:lvlOverride w:ilvl="7"/>
-    <w:lvlOverride w:ilvl="8"/>
   </w:num>
 </w:numbering>
 </file>
 
 <file path=word/styles.xml><?xml version="1.0" encoding="utf-8"?>
-<w:styles xmlns:mc="http://schemas.openxmlformats.org/markup-compatibility/2006" xmlns:r="http://schemas.openxmlformats.org/officeDocument/2006/relationships" xmlns:w="http://schemas.openxmlformats.org/wordprocessingml/2006/main" xmlns:w14="http://schemas.microsoft.com/office/word/2010/wordml" xmlns:w15="http://schemas.microsoft.com/office/word/2012/wordml" xmlns:w16cex="http://schemas.microsoft.com/office/word/2018/wordml/cex" xmlns:w16cid="http://schemas.microsoft.com/office/word/2016/wordml/cid" xmlns:w16="http://schemas.microsoft.com/office/word/2018/wordml" xmlns:w16du="http://schemas.microsoft.com/office/word/2023/wordml/word16du" xmlns:w16sdtdh="http://schemas.microsoft.com/office/word/2020/wordml/sdtdatahash" xmlns:w16sdtfl="http://schemas.microsoft.com/office/word/2024/wordml/sdtformatlock" xmlns:w16se="http://schemas.microsoft.com/office/word/2015/wordml/symex" mc:Ignorable="w14 w15 w16se w16cid w16 w16cex w16sdtdh w16sdtfl w16du">
+<w:styles xmlns:mc="http://schemas.openxmlformats.org/markup-compatibility/2006" xmlns:r="http://schemas.openxmlformats.org/officeDocument/2006/relationships" xmlns:w="http://schemas.openxmlformats.org/wordprocessingml/2006/main" xmlns:w14="http://schemas.microsoft.com/office/word/2010/wordml" xmlns:w15="http://schemas.microsoft.com/office/word/2012/wordml" xmlns:w16se="http://schemas.microsoft.com/office/word/2015/wordml/symex" mc:Ignorable="w14 w15 w16se">
   <w:docDefaults>
     <w:rPrDefault>
       <w:rPr>
@@ -7631,7 +8004,7 @@
       </w:pPr>
     </w:pPrDefault>
   </w:docDefaults>
-  <w:latentStyles w:defLockedState="0" w:defUIPriority="99" w:defSemiHidden="0" w:defUnhideWhenUsed="0" w:defQFormat="0" w:count="376">
+  <w:latentStyles w:defLockedState="0" w:defUIPriority="99" w:defSemiHidden="0" w:defUnhideWhenUsed="0" w:defQFormat="0" w:count="371">
     <w:lsdException w:name="Normal" w:uiPriority="0" w:qFormat="1"/>
     <w:lsdException w:name="heading 1" w:uiPriority="9" w:qFormat="1"/>
     <w:lsdException w:name="heading 2" w:semiHidden="1" w:uiPriority="9" w:unhideWhenUsed="1" w:qFormat="1"/>
@@ -8003,21 +8376,16 @@
     <w:lsdException w:name="List Table 5 Dark Accent 6" w:uiPriority="50"/>
     <w:lsdException w:name="List Table 6 Colorful Accent 6" w:uiPriority="51"/>
     <w:lsdException w:name="List Table 7 Colorful Accent 6" w:uiPriority="52"/>
-    <w:lsdException w:name="Mention" w:semiHidden="1" w:unhideWhenUsed="1"/>
-    <w:lsdException w:name="Smart Hyperlink" w:semiHidden="1" w:unhideWhenUsed="1"/>
-    <w:lsdException w:name="Hashtag" w:semiHidden="1" w:unhideWhenUsed="1"/>
-    <w:lsdException w:name="Unresolved Mention" w:semiHidden="1" w:unhideWhenUsed="1"/>
-    <w:lsdException w:name="Smart Link" w:semiHidden="1" w:unhideWhenUsed="1"/>
   </w:latentStyles>
   <w:style w:type="paragraph" w:default="1" w:styleId="Normal">
     <w:name w:val="Normal"/>
     <w:qFormat/>
   </w:style>
-  <w:style w:type="paragraph" w:styleId="Heading1">
+  <w:style w:type="paragraph" w:styleId="Ttulo1">
     <w:name w:val="heading 1"/>
     <w:basedOn w:val="Normal"/>
     <w:next w:val="Normal"/>
-    <w:link w:val="Heading1Char"/>
+    <w:link w:val="Ttulo1Car"/>
     <w:uiPriority w:val="9"/>
     <w:qFormat/>
     <w:rsid w:val="00FD2B2A"/>
@@ -8034,11 +8402,11 @@
       <w:szCs w:val="40"/>
     </w:rPr>
   </w:style>
-  <w:style w:type="paragraph" w:styleId="Heading2">
+  <w:style w:type="paragraph" w:styleId="Ttulo2">
     <w:name w:val="heading 2"/>
     <w:basedOn w:val="Normal"/>
     <w:next w:val="Normal"/>
-    <w:link w:val="Heading2Char"/>
+    <w:link w:val="Ttulo2Car"/>
     <w:uiPriority w:val="9"/>
     <w:unhideWhenUsed/>
     <w:qFormat/>
@@ -8056,11 +8424,11 @@
       <w:szCs w:val="32"/>
     </w:rPr>
   </w:style>
-  <w:style w:type="paragraph" w:styleId="Heading3">
+  <w:style w:type="paragraph" w:styleId="Ttulo3">
     <w:name w:val="heading 3"/>
     <w:basedOn w:val="Normal"/>
     <w:next w:val="Normal"/>
-    <w:link w:val="Heading3Char"/>
+    <w:link w:val="Ttulo3Car"/>
     <w:uiPriority w:val="9"/>
     <w:unhideWhenUsed/>
     <w:qFormat/>
@@ -8078,11 +8446,11 @@
       <w:szCs w:val="28"/>
     </w:rPr>
   </w:style>
-  <w:style w:type="paragraph" w:styleId="Heading4">
+  <w:style w:type="paragraph" w:styleId="Ttulo4">
     <w:name w:val="heading 4"/>
     <w:basedOn w:val="Normal"/>
     <w:next w:val="Normal"/>
-    <w:link w:val="Heading4Char"/>
+    <w:link w:val="Ttulo4Car"/>
     <w:uiPriority w:val="9"/>
     <w:semiHidden/>
     <w:unhideWhenUsed/>
@@ -8101,11 +8469,11 @@
       <w:color w:val="0F4761" w:themeColor="accent1" w:themeShade="BF"/>
     </w:rPr>
   </w:style>
-  <w:style w:type="paragraph" w:styleId="Heading5">
+  <w:style w:type="paragraph" w:styleId="Ttulo5">
     <w:name w:val="heading 5"/>
     <w:basedOn w:val="Normal"/>
     <w:next w:val="Normal"/>
-    <w:link w:val="Heading5Char"/>
+    <w:link w:val="Ttulo5Car"/>
     <w:uiPriority w:val="9"/>
     <w:semiHidden/>
     <w:unhideWhenUsed/>
@@ -8122,11 +8490,11 @@
       <w:color w:val="0F4761" w:themeColor="accent1" w:themeShade="BF"/>
     </w:rPr>
   </w:style>
-  <w:style w:type="paragraph" w:styleId="Heading6">
+  <w:style w:type="paragraph" w:styleId="Ttulo6">
     <w:name w:val="heading 6"/>
     <w:basedOn w:val="Normal"/>
     <w:next w:val="Normal"/>
-    <w:link w:val="Heading6Char"/>
+    <w:link w:val="Ttulo6Car"/>
     <w:uiPriority w:val="9"/>
     <w:semiHidden/>
     <w:unhideWhenUsed/>
@@ -8145,11 +8513,11 @@
       <w:color w:val="595959" w:themeColor="text1" w:themeTint="A6"/>
     </w:rPr>
   </w:style>
-  <w:style w:type="paragraph" w:styleId="Heading7">
+  <w:style w:type="paragraph" w:styleId="Ttulo7">
     <w:name w:val="heading 7"/>
     <w:basedOn w:val="Normal"/>
     <w:next w:val="Normal"/>
-    <w:link w:val="Heading7Char"/>
+    <w:link w:val="Ttulo7Car"/>
     <w:uiPriority w:val="9"/>
     <w:semiHidden/>
     <w:unhideWhenUsed/>
@@ -8166,11 +8534,11 @@
       <w:color w:val="595959" w:themeColor="text1" w:themeTint="A6"/>
     </w:rPr>
   </w:style>
-  <w:style w:type="paragraph" w:styleId="Heading8">
+  <w:style w:type="paragraph" w:styleId="Ttulo8">
     <w:name w:val="heading 8"/>
     <w:basedOn w:val="Normal"/>
     <w:next w:val="Normal"/>
-    <w:link w:val="Heading8Char"/>
+    <w:link w:val="Ttulo8Car"/>
     <w:uiPriority w:val="9"/>
     <w:semiHidden/>
     <w:unhideWhenUsed/>
@@ -8189,11 +8557,11 @@
       <w:color w:val="272727" w:themeColor="text1" w:themeTint="D8"/>
     </w:rPr>
   </w:style>
-  <w:style w:type="paragraph" w:styleId="Heading9">
+  <w:style w:type="paragraph" w:styleId="Ttulo9">
     <w:name w:val="heading 9"/>
     <w:basedOn w:val="Normal"/>
     <w:next w:val="Normal"/>
-    <w:link w:val="Heading9Char"/>
+    <w:link w:val="Ttulo9Car"/>
     <w:uiPriority w:val="9"/>
     <w:semiHidden/>
     <w:unhideWhenUsed/>
@@ -8210,13 +8578,13 @@
       <w:color w:val="272727" w:themeColor="text1" w:themeTint="D8"/>
     </w:rPr>
   </w:style>
-  <w:style w:type="character" w:default="1" w:styleId="DefaultParagraphFont">
+  <w:style w:type="character" w:default="1" w:styleId="Fuentedeprrafopredeter">
     <w:name w:val="Default Paragraph Font"/>
     <w:uiPriority w:val="1"/>
     <w:semiHidden/>
     <w:unhideWhenUsed/>
   </w:style>
-  <w:style w:type="table" w:default="1" w:styleId="TableNormal">
+  <w:style w:type="table" w:default="1" w:styleId="Tablanormal">
     <w:name w:val="Normal Table"/>
     <w:uiPriority w:val="99"/>
     <w:semiHidden/>
@@ -8231,16 +8599,16 @@
       </w:tblCellMar>
     </w:tblPr>
   </w:style>
-  <w:style w:type="numbering" w:default="1" w:styleId="NoList">
+  <w:style w:type="numbering" w:default="1" w:styleId="Sinlista">
     <w:name w:val="No List"/>
     <w:uiPriority w:val="99"/>
     <w:semiHidden/>
     <w:unhideWhenUsed/>
   </w:style>
-  <w:style w:type="character" w:customStyle="1" w:styleId="Heading1Char">
-    <w:name w:val="Heading 1 Char"/>
-    <w:basedOn w:val="DefaultParagraphFont"/>
-    <w:link w:val="Heading1"/>
+  <w:style w:type="character" w:customStyle="1" w:styleId="Ttulo1Car">
+    <w:name w:val="Título 1 Car"/>
+    <w:basedOn w:val="Fuentedeprrafopredeter"/>
+    <w:link w:val="Ttulo1"/>
     <w:uiPriority w:val="9"/>
     <w:rsid w:val="00FD2B2A"/>
     <w:rPr>
@@ -8250,10 +8618,10 @@
       <w:szCs w:val="40"/>
     </w:rPr>
   </w:style>
-  <w:style w:type="character" w:customStyle="1" w:styleId="Heading2Char">
-    <w:name w:val="Heading 2 Char"/>
-    <w:basedOn w:val="DefaultParagraphFont"/>
-    <w:link w:val="Heading2"/>
+  <w:style w:type="character" w:customStyle="1" w:styleId="Ttulo2Car">
+    <w:name w:val="Título 2 Car"/>
+    <w:basedOn w:val="Fuentedeprrafopredeter"/>
+    <w:link w:val="Ttulo2"/>
     <w:uiPriority w:val="9"/>
     <w:rsid w:val="00FD2B2A"/>
     <w:rPr>
@@ -8263,10 +8631,10 @@
       <w:szCs w:val="32"/>
     </w:rPr>
   </w:style>
-  <w:style w:type="character" w:customStyle="1" w:styleId="Heading3Char">
-    <w:name w:val="Heading 3 Char"/>
-    <w:basedOn w:val="DefaultParagraphFont"/>
-    <w:link w:val="Heading3"/>
+  <w:style w:type="character" w:customStyle="1" w:styleId="Ttulo3Car">
+    <w:name w:val="Título 3 Car"/>
+    <w:basedOn w:val="Fuentedeprrafopredeter"/>
+    <w:link w:val="Ttulo3"/>
     <w:uiPriority w:val="9"/>
     <w:rsid w:val="00FD2B2A"/>
     <w:rPr>
@@ -8276,10 +8644,10 @@
       <w:szCs w:val="28"/>
     </w:rPr>
   </w:style>
-  <w:style w:type="character" w:customStyle="1" w:styleId="Heading4Char">
-    <w:name w:val="Heading 4 Char"/>
-    <w:basedOn w:val="DefaultParagraphFont"/>
-    <w:link w:val="Heading4"/>
+  <w:style w:type="character" w:customStyle="1" w:styleId="Ttulo4Car">
+    <w:name w:val="Título 4 Car"/>
+    <w:basedOn w:val="Fuentedeprrafopredeter"/>
+    <w:link w:val="Ttulo4"/>
     <w:uiPriority w:val="9"/>
     <w:semiHidden/>
     <w:rsid w:val="00FD2B2A"/>
@@ -8290,10 +8658,10 @@
       <w:color w:val="0F4761" w:themeColor="accent1" w:themeShade="BF"/>
     </w:rPr>
   </w:style>
-  <w:style w:type="character" w:customStyle="1" w:styleId="Heading5Char">
-    <w:name w:val="Heading 5 Char"/>
-    <w:basedOn w:val="DefaultParagraphFont"/>
-    <w:link w:val="Heading5"/>
+  <w:style w:type="character" w:customStyle="1" w:styleId="Ttulo5Car">
+    <w:name w:val="Título 5 Car"/>
+    <w:basedOn w:val="Fuentedeprrafopredeter"/>
+    <w:link w:val="Ttulo5"/>
     <w:uiPriority w:val="9"/>
     <w:semiHidden/>
     <w:rsid w:val="00FD2B2A"/>
@@ -8302,10 +8670,10 @@
       <w:color w:val="0F4761" w:themeColor="accent1" w:themeShade="BF"/>
     </w:rPr>
   </w:style>
-  <w:style w:type="character" w:customStyle="1" w:styleId="Heading6Char">
-    <w:name w:val="Heading 6 Char"/>
-    <w:basedOn w:val="DefaultParagraphFont"/>
-    <w:link w:val="Heading6"/>
+  <w:style w:type="character" w:customStyle="1" w:styleId="Ttulo6Car">
+    <w:name w:val="Título 6 Car"/>
+    <w:basedOn w:val="Fuentedeprrafopredeter"/>
+    <w:link w:val="Ttulo6"/>
     <w:uiPriority w:val="9"/>
     <w:semiHidden/>
     <w:rsid w:val="00FD2B2A"/>
@@ -8316,10 +8684,10 @@
       <w:color w:val="595959" w:themeColor="text1" w:themeTint="A6"/>
     </w:rPr>
   </w:style>
-  <w:style w:type="character" w:customStyle="1" w:styleId="Heading7Char">
-    <w:name w:val="Heading 7 Char"/>
-    <w:basedOn w:val="DefaultParagraphFont"/>
-    <w:link w:val="Heading7"/>
+  <w:style w:type="character" w:customStyle="1" w:styleId="Ttulo7Car">
+    <w:name w:val="Título 7 Car"/>
+    <w:basedOn w:val="Fuentedeprrafopredeter"/>
+    <w:link w:val="Ttulo7"/>
     <w:uiPriority w:val="9"/>
     <w:semiHidden/>
     <w:rsid w:val="00FD2B2A"/>
@@ -8328,10 +8696,10 @@
       <w:color w:val="595959" w:themeColor="text1" w:themeTint="A6"/>
     </w:rPr>
   </w:style>
-  <w:style w:type="character" w:customStyle="1" w:styleId="Heading8Char">
-    <w:name w:val="Heading 8 Char"/>
-    <w:basedOn w:val="DefaultParagraphFont"/>
-    <w:link w:val="Heading8"/>
+  <w:style w:type="character" w:customStyle="1" w:styleId="Ttulo8Car">
+    <w:name w:val="Título 8 Car"/>
+    <w:basedOn w:val="Fuentedeprrafopredeter"/>
+    <w:link w:val="Ttulo8"/>
     <w:uiPriority w:val="9"/>
     <w:semiHidden/>
     <w:rsid w:val="00FD2B2A"/>
@@ -8342,10 +8710,10 @@
       <w:color w:val="272727" w:themeColor="text1" w:themeTint="D8"/>
     </w:rPr>
   </w:style>
-  <w:style w:type="character" w:customStyle="1" w:styleId="Heading9Char">
-    <w:name w:val="Heading 9 Char"/>
-    <w:basedOn w:val="DefaultParagraphFont"/>
-    <w:link w:val="Heading9"/>
+  <w:style w:type="character" w:customStyle="1" w:styleId="Ttulo9Car">
+    <w:name w:val="Título 9 Car"/>
+    <w:basedOn w:val="Fuentedeprrafopredeter"/>
+    <w:link w:val="Ttulo9"/>
     <w:uiPriority w:val="9"/>
     <w:semiHidden/>
     <w:rsid w:val="00FD2B2A"/>
@@ -8354,11 +8722,11 @@
       <w:color w:val="272727" w:themeColor="text1" w:themeTint="D8"/>
     </w:rPr>
   </w:style>
-  <w:style w:type="paragraph" w:styleId="Title">
+  <w:style w:type="paragraph" w:styleId="Ttulo">
     <w:name w:val="Title"/>
     <w:basedOn w:val="Normal"/>
     <w:next w:val="Normal"/>
-    <w:link w:val="TitleChar"/>
+    <w:link w:val="TtuloCar"/>
     <w:uiPriority w:val="10"/>
     <w:qFormat/>
     <w:rsid w:val="00FD2B2A"/>
@@ -8374,10 +8742,10 @@
       <w:szCs w:val="56"/>
     </w:rPr>
   </w:style>
-  <w:style w:type="character" w:customStyle="1" w:styleId="TitleChar">
-    <w:name w:val="Title Char"/>
-    <w:basedOn w:val="DefaultParagraphFont"/>
-    <w:link w:val="Title"/>
+  <w:style w:type="character" w:customStyle="1" w:styleId="TtuloCar">
+    <w:name w:val="Título Car"/>
+    <w:basedOn w:val="Fuentedeprrafopredeter"/>
+    <w:link w:val="Ttulo"/>
     <w:uiPriority w:val="10"/>
     <w:rsid w:val="00FD2B2A"/>
     <w:rPr>
@@ -8388,11 +8756,11 @@
       <w:szCs w:val="56"/>
     </w:rPr>
   </w:style>
-  <w:style w:type="paragraph" w:styleId="Subtitle">
+  <w:style w:type="paragraph" w:styleId="Subttulo">
     <w:name w:val="Subtitle"/>
     <w:basedOn w:val="Normal"/>
     <w:next w:val="Normal"/>
-    <w:link w:val="SubtitleChar"/>
+    <w:link w:val="SubttuloCar"/>
     <w:uiPriority w:val="11"/>
     <w:qFormat/>
     <w:rsid w:val="00FD2B2A"/>
@@ -8409,10 +8777,10 @@
       <w:szCs w:val="28"/>
     </w:rPr>
   </w:style>
-  <w:style w:type="character" w:customStyle="1" w:styleId="SubtitleChar">
-    <w:name w:val="Subtitle Char"/>
-    <w:basedOn w:val="DefaultParagraphFont"/>
-    <w:link w:val="Subtitle"/>
+  <w:style w:type="character" w:customStyle="1" w:styleId="SubttuloCar">
+    <w:name w:val="Subtítulo Car"/>
+    <w:basedOn w:val="Fuentedeprrafopredeter"/>
+    <w:link w:val="Subttulo"/>
     <w:uiPriority w:val="11"/>
     <w:rsid w:val="00FD2B2A"/>
     <w:rPr>
@@ -8423,11 +8791,11 @@
       <w:szCs w:val="28"/>
     </w:rPr>
   </w:style>
-  <w:style w:type="paragraph" w:styleId="Quote">
+  <w:style w:type="paragraph" w:styleId="Cita">
     <w:name w:val="Quote"/>
     <w:basedOn w:val="Normal"/>
     <w:next w:val="Normal"/>
-    <w:link w:val="QuoteChar"/>
+    <w:link w:val="CitaCar"/>
     <w:uiPriority w:val="29"/>
     <w:qFormat/>
     <w:rsid w:val="00FD2B2A"/>
@@ -8441,10 +8809,10 @@
       <w:color w:val="404040" w:themeColor="text1" w:themeTint="BF"/>
     </w:rPr>
   </w:style>
-  <w:style w:type="character" w:customStyle="1" w:styleId="QuoteChar">
-    <w:name w:val="Quote Char"/>
-    <w:basedOn w:val="DefaultParagraphFont"/>
-    <w:link w:val="Quote"/>
+  <w:style w:type="character" w:customStyle="1" w:styleId="CitaCar">
+    <w:name w:val="Cita Car"/>
+    <w:basedOn w:val="Fuentedeprrafopredeter"/>
+    <w:link w:val="Cita"/>
     <w:uiPriority w:val="29"/>
     <w:rsid w:val="00FD2B2A"/>
     <w:rPr>
@@ -8453,7 +8821,7 @@
       <w:color w:val="404040" w:themeColor="text1" w:themeTint="BF"/>
     </w:rPr>
   </w:style>
-  <w:style w:type="paragraph" w:styleId="ListParagraph">
+  <w:style w:type="paragraph" w:styleId="Prrafodelista">
     <w:name w:val="List Paragraph"/>
     <w:basedOn w:val="Normal"/>
     <w:uiPriority w:val="34"/>
@@ -8464,9 +8832,9 @@
       <w:contextualSpacing/>
     </w:pPr>
   </w:style>
-  <w:style w:type="character" w:styleId="IntenseEmphasis">
+  <w:style w:type="character" w:styleId="nfasisintenso">
     <w:name w:val="Intense Emphasis"/>
-    <w:basedOn w:val="DefaultParagraphFont"/>
+    <w:basedOn w:val="Fuentedeprrafopredeter"/>
     <w:uiPriority w:val="21"/>
     <w:qFormat/>
     <w:rsid w:val="00FD2B2A"/>
@@ -8476,11 +8844,11 @@
       <w:color w:val="0F4761" w:themeColor="accent1" w:themeShade="BF"/>
     </w:rPr>
   </w:style>
-  <w:style w:type="paragraph" w:styleId="IntenseQuote">
+  <w:style w:type="paragraph" w:styleId="Citadestacada">
     <w:name w:val="Intense Quote"/>
     <w:basedOn w:val="Normal"/>
     <w:next w:val="Normal"/>
-    <w:link w:val="IntenseQuoteChar"/>
+    <w:link w:val="CitadestacadaCar"/>
     <w:uiPriority w:val="30"/>
     <w:qFormat/>
     <w:rsid w:val="00FD2B2A"/>
@@ -8499,10 +8867,10 @@
       <w:color w:val="0F4761" w:themeColor="accent1" w:themeShade="BF"/>
     </w:rPr>
   </w:style>
-  <w:style w:type="character" w:customStyle="1" w:styleId="IntenseQuoteChar">
-    <w:name w:val="Intense Quote Char"/>
-    <w:basedOn w:val="DefaultParagraphFont"/>
-    <w:link w:val="IntenseQuote"/>
+  <w:style w:type="character" w:customStyle="1" w:styleId="CitadestacadaCar">
+    <w:name w:val="Cita destacada Car"/>
+    <w:basedOn w:val="Fuentedeprrafopredeter"/>
+    <w:link w:val="Citadestacada"/>
     <w:uiPriority w:val="30"/>
     <w:rsid w:val="00FD2B2A"/>
     <w:rPr>
@@ -8511,9 +8879,9 @@
       <w:color w:val="0F4761" w:themeColor="accent1" w:themeShade="BF"/>
     </w:rPr>
   </w:style>
-  <w:style w:type="character" w:styleId="IntenseReference">
+  <w:style w:type="character" w:styleId="Referenciaintensa">
     <w:name w:val="Intense Reference"/>
-    <w:basedOn w:val="DefaultParagraphFont"/>
+    <w:basedOn w:val="Fuentedeprrafopredeter"/>
     <w:uiPriority w:val="32"/>
     <w:qFormat/>
     <w:rsid w:val="00FD2B2A"/>
@@ -8527,8 +8895,8 @@
   </w:style>
   <w:style w:type="table" w:customStyle="1" w:styleId="TableGrid1">
     <w:name w:val="Table Grid1"/>
-    <w:basedOn w:val="TableNormal"/>
-    <w:next w:val="TableGrid"/>
+    <w:basedOn w:val="Tablanormal"/>
+    <w:next w:val="Tablaconcuadrcula"/>
     <w:uiPriority w:val="39"/>
     <w:rsid w:val="00FD1669"/>
     <w:pPr>
@@ -8553,9 +8921,9 @@
       </w:tblBorders>
     </w:tblPr>
   </w:style>
-  <w:style w:type="character" w:styleId="Hyperlink">
+  <w:style w:type="character" w:styleId="Hipervnculo">
     <w:name w:val="Hyperlink"/>
-    <w:basedOn w:val="DefaultParagraphFont"/>
+    <w:basedOn w:val="Fuentedeprrafopredeter"/>
     <w:uiPriority w:val="99"/>
     <w:unhideWhenUsed/>
     <w:rsid w:val="00FD1669"/>
@@ -8564,9 +8932,9 @@
       <w:u w:val="single"/>
     </w:rPr>
   </w:style>
-  <w:style w:type="paragraph" w:styleId="TOCHeading">
+  <w:style w:type="paragraph" w:styleId="TtuloTDC">
     <w:name w:val="TOC Heading"/>
-    <w:basedOn w:val="Heading1"/>
+    <w:basedOn w:val="Ttulo1"/>
     <w:next w:val="Normal"/>
     <w:uiPriority w:val="39"/>
     <w:unhideWhenUsed/>
@@ -8587,7 +8955,7 @@
       <w14:ligatures w14:val="none"/>
     </w:rPr>
   </w:style>
-  <w:style w:type="paragraph" w:styleId="TOC2">
+  <w:style w:type="paragraph" w:styleId="TDC2">
     <w:name w:val="toc 2"/>
     <w:basedOn w:val="Normal"/>
     <w:next w:val="Normal"/>
@@ -8608,7 +8976,7 @@
       <w14:ligatures w14:val="none"/>
     </w:rPr>
   </w:style>
-  <w:style w:type="paragraph" w:styleId="TOC1">
+  <w:style w:type="paragraph" w:styleId="TDC1">
     <w:name w:val="toc 1"/>
     <w:basedOn w:val="Normal"/>
     <w:next w:val="Normal"/>
@@ -8628,7 +8996,7 @@
       <w14:ligatures w14:val="none"/>
     </w:rPr>
   </w:style>
-  <w:style w:type="paragraph" w:styleId="TOC3">
+  <w:style w:type="paragraph" w:styleId="TDC3">
     <w:name w:val="toc 3"/>
     <w:basedOn w:val="Normal"/>
     <w:next w:val="Normal"/>
@@ -8649,9 +9017,9 @@
       <w14:ligatures w14:val="none"/>
     </w:rPr>
   </w:style>
-  <w:style w:type="table" w:styleId="TableGrid">
+  <w:style w:type="table" w:styleId="Tablaconcuadrcula">
     <w:name w:val="Table Grid"/>
-    <w:basedOn w:val="TableNormal"/>
+    <w:basedOn w:val="Tablanormal"/>
     <w:uiPriority w:val="39"/>
     <w:rsid w:val="00FD1669"/>
     <w:pPr>
@@ -8668,10 +9036,10 @@
       </w:tblBorders>
     </w:tblPr>
   </w:style>
-  <w:style w:type="paragraph" w:styleId="Header">
+  <w:style w:type="paragraph" w:styleId="Encabezado">
     <w:name w:val="header"/>
     <w:basedOn w:val="Normal"/>
-    <w:link w:val="HeaderChar"/>
+    <w:link w:val="EncabezadoCar"/>
     <w:uiPriority w:val="99"/>
     <w:unhideWhenUsed/>
     <w:rsid w:val="008724CC"/>
@@ -8683,17 +9051,17 @@
       <w:spacing w:after="0" w:line="240" w:lineRule="auto"/>
     </w:pPr>
   </w:style>
-  <w:style w:type="character" w:customStyle="1" w:styleId="HeaderChar">
-    <w:name w:val="Header Char"/>
-    <w:basedOn w:val="DefaultParagraphFont"/>
-    <w:link w:val="Header"/>
+  <w:style w:type="character" w:customStyle="1" w:styleId="EncabezadoCar">
+    <w:name w:val="Encabezado Car"/>
+    <w:basedOn w:val="Fuentedeprrafopredeter"/>
+    <w:link w:val="Encabezado"/>
     <w:uiPriority w:val="99"/>
     <w:rsid w:val="008724CC"/>
   </w:style>
-  <w:style w:type="paragraph" w:styleId="Footer">
+  <w:style w:type="paragraph" w:styleId="Piedepgina">
     <w:name w:val="footer"/>
     <w:basedOn w:val="Normal"/>
-    <w:link w:val="FooterChar"/>
+    <w:link w:val="PiedepginaCar"/>
     <w:uiPriority w:val="99"/>
     <w:unhideWhenUsed/>
     <w:rsid w:val="008724CC"/>
@@ -8705,16 +9073,16 @@
       <w:spacing w:after="0" w:line="240" w:lineRule="auto"/>
     </w:pPr>
   </w:style>
-  <w:style w:type="character" w:customStyle="1" w:styleId="FooterChar">
-    <w:name w:val="Footer Char"/>
-    <w:basedOn w:val="DefaultParagraphFont"/>
-    <w:link w:val="Footer"/>
+  <w:style w:type="character" w:customStyle="1" w:styleId="PiedepginaCar">
+    <w:name w:val="Pie de página Car"/>
+    <w:basedOn w:val="Fuentedeprrafopredeter"/>
+    <w:link w:val="Piedepgina"/>
     <w:uiPriority w:val="99"/>
     <w:rsid w:val="008724CC"/>
   </w:style>
   <w:style w:type="character" w:customStyle="1" w:styleId="Mencinsinresolver1">
     <w:name w:val="Mención sin resolver1"/>
-    <w:basedOn w:val="DefaultParagraphFont"/>
+    <w:basedOn w:val="Fuentedeprrafopredeter"/>
     <w:uiPriority w:val="99"/>
     <w:semiHidden/>
     <w:unhideWhenUsed/>
@@ -8724,10 +9092,10 @@
       <w:shd w:val="clear" w:color="auto" w:fill="E1DFDD"/>
     </w:rPr>
   </w:style>
-  <w:style w:type="paragraph" w:styleId="FootnoteText">
+  <w:style w:type="paragraph" w:styleId="Textonotapie">
     <w:name w:val="footnote text"/>
     <w:basedOn w:val="Normal"/>
-    <w:link w:val="FootnoteTextChar"/>
+    <w:link w:val="TextonotapieCar"/>
     <w:uiPriority w:val="99"/>
     <w:semiHidden/>
     <w:unhideWhenUsed/>
@@ -8740,10 +9108,10 @@
       <w:szCs w:val="20"/>
     </w:rPr>
   </w:style>
-  <w:style w:type="character" w:customStyle="1" w:styleId="FootnoteTextChar">
-    <w:name w:val="Footnote Text Char"/>
-    <w:basedOn w:val="DefaultParagraphFont"/>
-    <w:link w:val="FootnoteText"/>
+  <w:style w:type="character" w:customStyle="1" w:styleId="TextonotapieCar">
+    <w:name w:val="Texto nota pie Car"/>
+    <w:basedOn w:val="Fuentedeprrafopredeter"/>
+    <w:link w:val="Textonotapie"/>
     <w:uiPriority w:val="99"/>
     <w:semiHidden/>
     <w:rsid w:val="00C94EB4"/>
@@ -8752,9 +9120,9 @@
       <w:szCs w:val="20"/>
     </w:rPr>
   </w:style>
-  <w:style w:type="character" w:styleId="FootnoteReference">
+  <w:style w:type="character" w:styleId="Refdenotaalpie">
     <w:name w:val="footnote reference"/>
-    <w:basedOn w:val="DefaultParagraphFont"/>
+    <w:basedOn w:val="Fuentedeprrafopredeter"/>
     <w:uiPriority w:val="99"/>
     <w:semiHidden/>
     <w:unhideWhenUsed/>
@@ -9066,7 +9434,7 @@
 </file>
 
 <file path=customXml/itemProps1.xml><?xml version="1.0" encoding="utf-8"?>
-<ds:datastoreItem xmlns:ds="http://schemas.openxmlformats.org/officeDocument/2006/customXml" ds:itemID="{8BA756C7-5BCA-4E3F-8EF3-7F731A932B83}">
+<ds:datastoreItem xmlns:ds="http://schemas.openxmlformats.org/officeDocument/2006/customXml" ds:itemID="{39D31EC9-6653-4018-90C3-8F0850B5DE2A}">
   <ds:schemaRefs>
     <ds:schemaRef ds:uri="http://schemas.openxmlformats.org/officeDocument/2006/bibliography"/>
   </ds:schemaRefs>

</xml_diff>

<commit_message>
Docs: Se agrego una nueva imagen del tablero
Se cambio la imagen que se tenia que mostraba el tablero para poder así demostrar de una manera mas clara como se ha dividido y trabajado en la entrega.
</commit_message>
<xml_diff>
--- a/docs/entrega2/EPRO_Entrega2_Grupo9_Plataforma de gestión documental con versiones.docx
+++ b/docs/entrega2/EPRO_Entrega2_Grupo9_Plataforma de gestión documental con versiones.docx
@@ -5687,28 +5687,25 @@
           <w:lang w:val="es-SV"/>
         </w:rPr>
         <w:lastRenderedPageBreak/>
-        <w:t>Evidencia de aplic</w:t>
-      </w:r>
-      <w:bookmarkStart w:id="23" w:name="_GoBack"/>
-      <w:bookmarkEnd w:id="23"/>
-      <w:r>
-        <w:rPr>
-          <w:rFonts w:ascii="Arial" w:hAnsi="Arial" w:cs="Arial"/>
-          <w:b/>
-          <w:bCs/>
+        <w:t>Evidencia de aplicación</w:t>
+      </w:r>
+      <w:bookmarkEnd w:id="21"/>
+      <w:bookmarkEnd w:id="22"/>
+    </w:p>
+    <w:p>
+      <w:pPr>
+        <w:pStyle w:val="Ttulo2"/>
+        <w:rPr>
+          <w:rFonts w:ascii="Arial" w:hAnsi="Arial" w:cs="Arial"/>
           <w:color w:val="auto"/>
           <w:sz w:val="24"/>
           <w:szCs w:val="24"/>
           <w:lang w:val="es-SV"/>
         </w:rPr>
-        <w:t>ación</w:t>
-      </w:r>
-      <w:bookmarkEnd w:id="21"/>
-      <w:bookmarkEnd w:id="22"/>
-    </w:p>
-    <w:p>
-      <w:pPr>
-        <w:pStyle w:val="Ttulo2"/>
+      </w:pPr>
+      <w:bookmarkStart w:id="23" w:name="_Toc224298486"/>
+      <w:bookmarkStart w:id="24" w:name="_Toc224570650"/>
+      <w:r>
         <w:rPr>
           <w:rFonts w:ascii="Arial" w:hAnsi="Arial" w:cs="Arial"/>
           <w:color w:val="auto"/>
@@ -5716,21 +5713,10 @@
           <w:szCs w:val="24"/>
           <w:lang w:val="es-SV"/>
         </w:rPr>
-      </w:pPr>
-      <w:bookmarkStart w:id="24" w:name="_Toc224298486"/>
-      <w:bookmarkStart w:id="25" w:name="_Toc224570650"/>
-      <w:r>
-        <w:rPr>
-          <w:rFonts w:ascii="Arial" w:hAnsi="Arial" w:cs="Arial"/>
-          <w:color w:val="auto"/>
-          <w:sz w:val="24"/>
-          <w:szCs w:val="24"/>
-          <w:lang w:val="es-SV"/>
-        </w:rPr>
         <w:t>Tablero</w:t>
       </w:r>
+      <w:bookmarkEnd w:id="23"/>
       <w:bookmarkEnd w:id="24"/>
-      <w:bookmarkEnd w:id="25"/>
     </w:p>
     <w:p>
       <w:pPr>
@@ -5760,14 +5746,13 @@
       <w:r>
         <w:rPr>
           <w:rFonts w:ascii="Arial" w:hAnsi="Arial" w:cs="Arial"/>
-          <w:noProof/>
-          <w:lang w:val="es-SV" w:eastAsia="es-SV"/>
+          <w:lang w:val="es-SV"/>
         </w:rPr>
         <w:drawing>
-          <wp:inline distT="0" distB="0" distL="0" distR="0" wp14:anchorId="1DB95ED9" wp14:editId="395CD79B">
-            <wp:extent cx="5943600" cy="1677035"/>
+          <wp:inline distT="0" distB="0" distL="0" distR="0" wp14:anchorId="3F098D4F" wp14:editId="3423ED66">
+            <wp:extent cx="5943600" cy="2009140"/>
             <wp:effectExtent l="0" t="0" r="0" b="0"/>
-            <wp:docPr id="15" name="Imagen 15"/>
+            <wp:docPr id="1" name="Imagen 1"/>
             <wp:cNvGraphicFramePr>
               <a:graphicFrameLocks xmlns:a="http://schemas.openxmlformats.org/drawingml/2006/main" noChangeAspect="1"/>
             </wp:cNvGraphicFramePr>
@@ -5787,7 +5772,7 @@
                   <pic:spPr>
                     <a:xfrm>
                       <a:off x="0" y="0"/>
-                      <a:ext cx="5943600" cy="1677035"/>
+                      <a:ext cx="5943600" cy="2009140"/>
                     </a:xfrm>
                     <a:prstGeom prst="rect">
                       <a:avLst/>
@@ -5819,8 +5804,8 @@
           <w:lang w:val="es-SV"/>
         </w:rPr>
       </w:pPr>
-      <w:bookmarkStart w:id="26" w:name="_Toc224298487"/>
-      <w:bookmarkStart w:id="27" w:name="_Toc224570651"/>
+      <w:bookmarkStart w:id="25" w:name="_Toc224298487"/>
+      <w:bookmarkStart w:id="26" w:name="_Toc224570651"/>
       <w:r>
         <w:rPr>
           <w:rFonts w:ascii="Arial" w:hAnsi="Arial" w:cs="Arial"/>
@@ -5842,8 +5827,8 @@
         </w:rPr>
         <w:t>commits</w:t>
       </w:r>
+      <w:bookmarkEnd w:id="25"/>
       <w:bookmarkEnd w:id="26"/>
-      <w:bookmarkEnd w:id="27"/>
       <w:proofErr w:type="spellEnd"/>
     </w:p>
     <w:p>
@@ -5958,7 +5943,7 @@
           <w:lang w:val="es-SV"/>
         </w:rPr>
       </w:pPr>
-      <w:bookmarkStart w:id="28" w:name="_Toc224570652"/>
+      <w:bookmarkStart w:id="27" w:name="_Toc224570652"/>
       <w:r>
         <w:rPr>
           <w:rFonts w:ascii="Arial" w:hAnsi="Arial" w:cs="Arial"/>
@@ -5985,7 +5970,7 @@
         </w:rPr>
         <w:t>Github</w:t>
       </w:r>
-      <w:bookmarkEnd w:id="28"/>
+      <w:bookmarkEnd w:id="27"/>
       <w:proofErr w:type="spellEnd"/>
     </w:p>
     <w:p>
@@ -6206,7 +6191,7 @@
           <w:lang w:val="es-SV"/>
         </w:rPr>
       </w:pPr>
-      <w:bookmarkStart w:id="29" w:name="_Toc224570653"/>
+      <w:bookmarkStart w:id="28" w:name="_Toc224570653"/>
       <w:r>
         <w:rPr>
           <w:rFonts w:ascii="Arial" w:hAnsi="Arial" w:cs="Arial"/>
@@ -6218,9 +6203,23 @@
           <w:lang w:val="es-SV"/>
         </w:rPr>
         <w:lastRenderedPageBreak/>
-        <w:t>Anexos</w:t>
-      </w:r>
+        <w:t>An</w:t>
+      </w:r>
+      <w:bookmarkStart w:id="29" w:name="_GoBack"/>
       <w:bookmarkEnd w:id="29"/>
+      <w:r>
+        <w:rPr>
+          <w:rFonts w:ascii="Arial" w:hAnsi="Arial" w:cs="Arial"/>
+          <w:b/>
+          <w:bCs/>
+          <w:color w:val="auto"/>
+          <w:sz w:val="24"/>
+          <w:szCs w:val="24"/>
+          <w:lang w:val="es-SV"/>
+        </w:rPr>
+        <w:t>exos</w:t>
+      </w:r>
+      <w:bookmarkEnd w:id="28"/>
     </w:p>
     <w:p>
       <w:pPr>
@@ -6633,7 +6632,7 @@
             <w:noProof/>
             <w:lang w:val="es-ES"/>
           </w:rPr>
-          <w:t>15</w:t>
+          <w:t>17</w:t>
         </w:r>
         <w:r>
           <w:fldChar w:fldCharType="end"/>
@@ -9434,7 +9433,7 @@
 </file>
 
 <file path=customXml/itemProps1.xml><?xml version="1.0" encoding="utf-8"?>
-<ds:datastoreItem xmlns:ds="http://schemas.openxmlformats.org/officeDocument/2006/customXml" ds:itemID="{39D31EC9-6653-4018-90C3-8F0850B5DE2A}">
+<ds:datastoreItem xmlns:ds="http://schemas.openxmlformats.org/officeDocument/2006/customXml" ds:itemID="{E8D93FDD-2AB7-4CBD-ADBF-BEA146B920F5}">
   <ds:schemaRefs>
     <ds:schemaRef ds:uri="http://schemas.openxmlformats.org/officeDocument/2006/bibliography"/>
   </ds:schemaRefs>

</xml_diff>

<commit_message>
Docs: revisión de formato y  agregado de anexos
Se reviso el formato y se agregaron los anexos
</commit_message>
<xml_diff>
--- a/docs/entrega2/EPRO_Entrega2_Grupo9_Plataforma de gestión documental con versiones.docx
+++ b/docs/entrega2/EPRO_Entrega2_Grupo9_Plataforma de gestión documental con versiones.docx
@@ -1,6 +1,6 @@
 
 <file path=word/document.xml><?xml version="1.0" encoding="utf-8"?>
-<w:document xmlns:wpc="http://schemas.microsoft.com/office/word/2010/wordprocessingCanvas" xmlns:cx="http://schemas.microsoft.com/office/drawing/2014/chartex" xmlns:mc="http://schemas.openxmlformats.org/markup-compatibility/2006" xmlns:o="urn:schemas-microsoft-com:office:office" xmlns:r="http://schemas.openxmlformats.org/officeDocument/2006/relationships" xmlns:m="http://schemas.openxmlformats.org/officeDocument/2006/math" xmlns:v="urn:schemas-microsoft-com:vml" xmlns:wp14="http://schemas.microsoft.com/office/word/2010/wordprocessingDrawing" xmlns:wp="http://schemas.openxmlformats.org/drawingml/2006/wordprocessingDrawing" xmlns:w10="urn:schemas-microsoft-com:office:word" xmlns:w="http://schemas.openxmlformats.org/wordprocessingml/2006/main" xmlns:w14="http://schemas.microsoft.com/office/word/2010/wordml" xmlns:w15="http://schemas.microsoft.com/office/word/2012/wordml" xmlns:w16se="http://schemas.microsoft.com/office/word/2015/wordml/symex" xmlns:wpg="http://schemas.microsoft.com/office/word/2010/wordprocessingGroup" xmlns:wpi="http://schemas.microsoft.com/office/word/2010/wordprocessingInk" xmlns:wne="http://schemas.microsoft.com/office/word/2006/wordml" xmlns:wps="http://schemas.microsoft.com/office/word/2010/wordprocessingShape" mc:Ignorable="w14 w15 w16se wp14">
+<w:document xmlns:wpc="http://schemas.microsoft.com/office/word/2010/wordprocessingCanvas" xmlns:cx="http://schemas.microsoft.com/office/drawing/2014/chartex" xmlns:cx1="http://schemas.microsoft.com/office/drawing/2015/9/8/chartex" xmlns:cx2="http://schemas.microsoft.com/office/drawing/2015/10/21/chartex" xmlns:cx3="http://schemas.microsoft.com/office/drawing/2016/5/9/chartex" xmlns:cx4="http://schemas.microsoft.com/office/drawing/2016/5/10/chartex" xmlns:cx5="http://schemas.microsoft.com/office/drawing/2016/5/11/chartex" xmlns:cx6="http://schemas.microsoft.com/office/drawing/2016/5/12/chartex" xmlns:cx7="http://schemas.microsoft.com/office/drawing/2016/5/13/chartex" xmlns:cx8="http://schemas.microsoft.com/office/drawing/2016/5/14/chartex" xmlns:mc="http://schemas.openxmlformats.org/markup-compatibility/2006" xmlns:aink="http://schemas.microsoft.com/office/drawing/2016/ink" xmlns:am3d="http://schemas.microsoft.com/office/drawing/2017/model3d" xmlns:o="urn:schemas-microsoft-com:office:office" xmlns:oel="http://schemas.microsoft.com/office/2019/extlst" xmlns:r="http://schemas.openxmlformats.org/officeDocument/2006/relationships" xmlns:m="http://schemas.openxmlformats.org/officeDocument/2006/math" xmlns:v="urn:schemas-microsoft-com:vml" xmlns:wp14="http://schemas.microsoft.com/office/word/2010/wordprocessingDrawing" xmlns:wp="http://schemas.openxmlformats.org/drawingml/2006/wordprocessingDrawing" xmlns:w10="urn:schemas-microsoft-com:office:word" xmlns:w="http://schemas.openxmlformats.org/wordprocessingml/2006/main" xmlns:w14="http://schemas.microsoft.com/office/word/2010/wordml" xmlns:w15="http://schemas.microsoft.com/office/word/2012/wordml" xmlns:w16cex="http://schemas.microsoft.com/office/word/2018/wordml/cex" xmlns:w16cid="http://schemas.microsoft.com/office/word/2016/wordml/cid" xmlns:w16="http://schemas.microsoft.com/office/word/2018/wordml" xmlns:w16du="http://schemas.microsoft.com/office/word/2023/wordml/word16du" xmlns:w16sdtdh="http://schemas.microsoft.com/office/word/2020/wordml/sdtdatahash" xmlns:w16sdtfl="http://schemas.microsoft.com/office/word/2024/wordml/sdtformatlock" xmlns:w16se="http://schemas.microsoft.com/office/word/2015/wordml/symex" xmlns:wpg="http://schemas.microsoft.com/office/word/2010/wordprocessingGroup" xmlns:wpi="http://schemas.microsoft.com/office/word/2010/wordprocessingInk" xmlns:wne="http://schemas.microsoft.com/office/word/2006/wordml" xmlns:wps="http://schemas.microsoft.com/office/word/2010/wordprocessingShape" mc:Ignorable="w14 w15 w16se w16cid w16 w16cex w16sdtdh w16sdtfl w16du wp14">
   <w:body>
     <w:p>
       <w:pPr>
@@ -655,25 +655,7 @@
                 <w:sz w:val="24"/>
                 <w:szCs w:val="24"/>
               </w:rPr>
-              <w:t xml:space="preserve">Cordova </w:t>
-            </w:r>
-            <w:proofErr w:type="spellStart"/>
-            <w:r>
-              <w:rPr>
-                <w:rFonts w:ascii="Arial" w:eastAsia="Calibri" w:hAnsi="Arial" w:cs="Arial"/>
-                <w:sz w:val="24"/>
-                <w:szCs w:val="24"/>
-              </w:rPr>
-              <w:t>Kanter</w:t>
-            </w:r>
-            <w:proofErr w:type="spellEnd"/>
-            <w:r>
-              <w:rPr>
-                <w:rFonts w:ascii="Arial" w:eastAsia="Calibri" w:hAnsi="Arial" w:cs="Arial"/>
-                <w:sz w:val="24"/>
-                <w:szCs w:val="24"/>
-              </w:rPr>
-              <w:t>, Ricardo</w:t>
+              <w:t>Cordova Kanter, Ricardo</w:t>
             </w:r>
           </w:p>
         </w:tc>
@@ -827,18 +809,8 @@
                 <w:sz w:val="24"/>
                 <w:szCs w:val="24"/>
               </w:rPr>
-              <w:t xml:space="preserve">Herrera Cortez Jose </w:t>
-            </w:r>
-            <w:proofErr w:type="spellStart"/>
-            <w:r>
-              <w:rPr>
-                <w:rFonts w:ascii="Arial" w:eastAsia="Calibri" w:hAnsi="Arial" w:cs="Arial"/>
-                <w:sz w:val="24"/>
-                <w:szCs w:val="24"/>
-              </w:rPr>
-              <w:t>Neftali</w:t>
-            </w:r>
-            <w:proofErr w:type="spellEnd"/>
+              <w:t>Herrera Cortez Jose Neftali</w:t>
+            </w:r>
           </w:p>
         </w:tc>
         <w:tc>
@@ -908,23 +880,13 @@
                 <w:rFonts w:ascii="Arial" w:eastAsia="Calibri" w:hAnsi="Arial" w:cs="Arial"/>
               </w:rPr>
             </w:pPr>
-            <w:proofErr w:type="spellStart"/>
             <w:r>
               <w:rPr>
                 <w:rFonts w:ascii="Arial" w:eastAsia="Calibri" w:hAnsi="Arial" w:cs="Arial"/>
                 <w:sz w:val="24"/>
                 <w:szCs w:val="24"/>
               </w:rPr>
-              <w:t>Mejía</w:t>
-            </w:r>
-            <w:proofErr w:type="spellEnd"/>
-            <w:r>
-              <w:rPr>
-                <w:rFonts w:ascii="Arial" w:eastAsia="Calibri" w:hAnsi="Arial" w:cs="Arial"/>
-                <w:sz w:val="24"/>
-                <w:szCs w:val="24"/>
-              </w:rPr>
-              <w:t xml:space="preserve"> Méndez Ronald Joel</w:t>
+              <w:t>Mejía Méndez Ronald Joel</w:t>
             </w:r>
           </w:p>
         </w:tc>
@@ -1000,30 +962,21 @@
                 <w:rFonts w:ascii="Arial" w:eastAsia="Calibri" w:hAnsi="Arial" w:cs="Arial"/>
                 <w:sz w:val="24"/>
               </w:rPr>
-              <w:t xml:space="preserve">Morales </w:t>
-            </w:r>
-            <w:proofErr w:type="spellStart"/>
+              <w:t>Morales López</w:t>
+            </w:r>
             <w:r>
               <w:rPr>
                 <w:rFonts w:ascii="Arial" w:eastAsia="Calibri" w:hAnsi="Arial" w:cs="Arial"/>
                 <w:sz w:val="24"/>
               </w:rPr>
-              <w:t>López</w:t>
-            </w:r>
-            <w:proofErr w:type="spellEnd"/>
+              <w:t xml:space="preserve"> </w:t>
+            </w:r>
             <w:r>
               <w:rPr>
                 <w:rFonts w:ascii="Arial" w:eastAsia="Calibri" w:hAnsi="Arial" w:cs="Arial"/>
                 <w:sz w:val="24"/>
               </w:rPr>
-              <w:t xml:space="preserve"> </w:t>
-            </w:r>
-            <w:r>
-              <w:rPr>
-                <w:rFonts w:ascii="Arial" w:eastAsia="Calibri" w:hAnsi="Arial" w:cs="Arial"/>
-                <w:sz w:val="24"/>
-              </w:rPr>
-              <w:t xml:space="preserve"> César Orlando</w:t>
+              <w:t>César Orlando</w:t>
             </w:r>
           </w:p>
         </w:tc>
@@ -2646,24 +2599,6 @@
     <w:p/>
     <w:p/>
     <w:p/>
-    <w:p/>
-    <w:p>
-      <w:pPr>
-        <w:rPr>
-          <w:lang w:val="es-ES"/>
-        </w:rPr>
-        <w:sectPr>
-          <w:headerReference w:type="default" r:id="rId10"/>
-          <w:footerReference w:type="default" r:id="rId11"/>
-          <w:headerReference w:type="first" r:id="rId12"/>
-          <w:pgSz w:w="12240" w:h="15840"/>
-          <w:pgMar w:top="1440" w:right="1440" w:bottom="1440" w:left="1440" w:header="720" w:footer="720" w:gutter="0"/>
-          <w:cols w:space="720"/>
-          <w:titlePg/>
-          <w:docGrid w:linePitch="360"/>
-        </w:sectPr>
-      </w:pPr>
-    </w:p>
     <w:p>
       <w:pPr>
         <w:pStyle w:val="Ttulo1"/>
@@ -3465,14 +3400,6 @@
     </w:p>
     <w:p>
       <w:pPr>
-        <w:rPr>
-          <w:rFonts w:ascii="Arial" w:hAnsi="Arial" w:cs="Arial"/>
-          <w:lang w:val="es-ES"/>
-        </w:rPr>
-      </w:pPr>
-    </w:p>
-    <w:p>
-      <w:pPr>
         <w:pStyle w:val="Ttulo2"/>
         <w:rPr>
           <w:rFonts w:ascii="Arial" w:hAnsi="Arial" w:cs="Arial"/>
@@ -3596,7 +3523,6 @@
           <w:rFonts w:ascii="Arial" w:hAnsi="Arial" w:cs="Arial"/>
           <w:lang w:val="es-SV"/>
         </w:rPr>
-        <w:lastRenderedPageBreak/>
         <w:t>Falta de trazabilidad</w:t>
       </w:r>
       <w:r>
@@ -3634,6 +3560,7 @@
           <w:rFonts w:ascii="Arial" w:hAnsi="Arial" w:cs="Arial"/>
           <w:lang w:val="es-SV"/>
         </w:rPr>
+        <w:lastRenderedPageBreak/>
         <w:t>Ausencia de proceso formal de aprobación</w:t>
       </w:r>
       <w:r>
@@ -3681,14 +3608,6 @@
         <w:br/>
         <w:t>Actualmente no existe una estructura clara de permisos para gestionar quién puede crear, modificar o aprobar documentos.</w:t>
       </w:r>
-    </w:p>
-    <w:p>
-      <w:pPr>
-        <w:rPr>
-          <w:rFonts w:ascii="Arial" w:hAnsi="Arial" w:cs="Arial"/>
-          <w:lang w:val="es-SV"/>
-        </w:rPr>
-      </w:pPr>
     </w:p>
     <w:p>
       <w:pPr>
@@ -3743,6 +3662,14 @@
         </w:rPr>
         <w:t>Por lo tanto, es necesario implementar mejoras en el proceso de gestión documental que permitan establecer control de versiones, trazabilidad de cambios, roles definidos y un proceso formal de aprobación de documentos.</w:t>
       </w:r>
+    </w:p>
+    <w:p>
+      <w:pPr>
+        <w:rPr>
+          <w:rFonts w:ascii="Arial" w:hAnsi="Arial" w:cs="Arial"/>
+          <w:lang w:val="es-SV"/>
+        </w:rPr>
+      </w:pPr>
     </w:p>
     <w:p>
       <w:pPr>
@@ -3921,6 +3848,360 @@
             <wp:extent cx="3558848" cy="5730737"/>
             <wp:effectExtent l="0" t="0" r="3810" b="3810"/>
             <wp:docPr id="6" name="Imagen 6"/>
+            <wp:cNvGraphicFramePr>
+              <a:graphicFrameLocks xmlns:a="http://schemas.openxmlformats.org/drawingml/2006/main" noChangeAspect="1"/>
+            </wp:cNvGraphicFramePr>
+            <a:graphic xmlns:a="http://schemas.openxmlformats.org/drawingml/2006/main">
+              <a:graphicData uri="http://schemas.openxmlformats.org/drawingml/2006/picture">
+                <pic:pic xmlns:pic="http://schemas.openxmlformats.org/drawingml/2006/picture">
+                  <pic:nvPicPr>
+                    <pic:cNvPr id="1" name=""/>
+                    <pic:cNvPicPr/>
+                  </pic:nvPicPr>
+                  <pic:blipFill>
+                    <a:blip r:embed="rId10"/>
+                    <a:stretch>
+                      <a:fillRect/>
+                    </a:stretch>
+                  </pic:blipFill>
+                  <pic:spPr>
+                    <a:xfrm>
+                      <a:off x="0" y="0"/>
+                      <a:ext cx="3558848" cy="5730737"/>
+                    </a:xfrm>
+                    <a:prstGeom prst="rect">
+                      <a:avLst/>
+                    </a:prstGeom>
+                  </pic:spPr>
+                </pic:pic>
+              </a:graphicData>
+            </a:graphic>
+          </wp:inline>
+        </w:drawing>
+      </w:r>
+    </w:p>
+    <w:p>
+      <w:pPr>
+        <w:rPr>
+          <w:rFonts w:ascii="Arial" w:hAnsi="Arial" w:cs="Arial"/>
+          <w:lang w:val="es-SV"/>
+        </w:rPr>
+      </w:pPr>
+    </w:p>
+    <w:p>
+      <w:pPr>
+        <w:rPr>
+          <w:rFonts w:ascii="Arial" w:hAnsi="Arial" w:cs="Arial"/>
+          <w:lang w:val="es-SV"/>
+        </w:rPr>
+      </w:pPr>
+    </w:p>
+    <w:p>
+      <w:pPr>
+        <w:rPr>
+          <w:rFonts w:ascii="Arial" w:hAnsi="Arial" w:cs="Arial"/>
+          <w:lang w:val="es-SV"/>
+        </w:rPr>
+      </w:pPr>
+    </w:p>
+    <w:p>
+      <w:pPr>
+        <w:pStyle w:val="Ttulo2"/>
+        <w:rPr>
+          <w:rFonts w:ascii="Arial" w:hAnsi="Arial" w:cs="Arial"/>
+          <w:color w:val="auto"/>
+          <w:sz w:val="24"/>
+          <w:szCs w:val="24"/>
+          <w:lang w:val="es-SV"/>
+        </w:rPr>
+      </w:pPr>
+      <w:bookmarkStart w:id="9" w:name="_Toc224570643"/>
+      <w:r>
+        <w:rPr>
+          <w:rFonts w:ascii="Arial" w:hAnsi="Arial" w:cs="Arial"/>
+          <w:color w:val="auto"/>
+          <w:sz w:val="24"/>
+          <w:szCs w:val="24"/>
+          <w:lang w:val="es-SV"/>
+        </w:rPr>
+        <w:lastRenderedPageBreak/>
+        <w:t>Buscar un documento en los archivos compartidos</w:t>
+      </w:r>
+      <w:bookmarkEnd w:id="9"/>
+      <w:r>
+        <w:rPr>
+          <w:rFonts w:ascii="Arial" w:hAnsi="Arial" w:cs="Arial"/>
+          <w:color w:val="auto"/>
+          <w:sz w:val="24"/>
+          <w:szCs w:val="24"/>
+          <w:lang w:val="es-SV"/>
+        </w:rPr>
+        <w:t xml:space="preserve"> </w:t>
+      </w:r>
+    </w:p>
+    <w:p>
+      <w:pPr>
+        <w:jc w:val="center"/>
+        <w:rPr>
+          <w:rFonts w:ascii="Arial" w:hAnsi="Arial" w:cs="Arial"/>
+          <w:lang w:val="es-SV"/>
+        </w:rPr>
+      </w:pPr>
+      <w:r>
+        <w:rPr>
+          <w:bCs/>
+          <w:noProof/>
+          <w:lang w:val="es-SV" w:eastAsia="es-SV"/>
+        </w:rPr>
+        <w:drawing>
+          <wp:inline distT="0" distB="0" distL="0" distR="0" wp14:anchorId="6F872713" wp14:editId="2EF2EA2E">
+            <wp:extent cx="3589331" cy="5875529"/>
+            <wp:effectExtent l="0" t="0" r="0" b="0"/>
+            <wp:docPr id="9" name="Imagen 9"/>
+            <wp:cNvGraphicFramePr>
+              <a:graphicFrameLocks xmlns:a="http://schemas.openxmlformats.org/drawingml/2006/main" noChangeAspect="1"/>
+            </wp:cNvGraphicFramePr>
+            <a:graphic xmlns:a="http://schemas.openxmlformats.org/drawingml/2006/main">
+              <a:graphicData uri="http://schemas.openxmlformats.org/drawingml/2006/picture">
+                <pic:pic xmlns:pic="http://schemas.openxmlformats.org/drawingml/2006/picture">
+                  <pic:nvPicPr>
+                    <pic:cNvPr id="1" name=""/>
+                    <pic:cNvPicPr/>
+                  </pic:nvPicPr>
+                  <pic:blipFill>
+                    <a:blip r:embed="rId11"/>
+                    <a:stretch>
+                      <a:fillRect/>
+                    </a:stretch>
+                  </pic:blipFill>
+                  <pic:spPr>
+                    <a:xfrm>
+                      <a:off x="0" y="0"/>
+                      <a:ext cx="3589331" cy="5875529"/>
+                    </a:xfrm>
+                    <a:prstGeom prst="rect">
+                      <a:avLst/>
+                    </a:prstGeom>
+                  </pic:spPr>
+                </pic:pic>
+              </a:graphicData>
+            </a:graphic>
+          </wp:inline>
+        </w:drawing>
+      </w:r>
+    </w:p>
+    <w:p>
+      <w:pPr>
+        <w:rPr>
+          <w:rFonts w:ascii="Arial" w:hAnsi="Arial" w:cs="Arial"/>
+          <w:lang w:val="es-SV"/>
+        </w:rPr>
+      </w:pPr>
+    </w:p>
+    <w:p>
+      <w:pPr>
+        <w:rPr>
+          <w:rFonts w:ascii="Arial" w:hAnsi="Arial" w:cs="Arial"/>
+          <w:lang w:val="es-SV"/>
+        </w:rPr>
+      </w:pPr>
+    </w:p>
+    <w:p>
+      <w:pPr>
+        <w:rPr>
+          <w:rFonts w:ascii="Arial" w:hAnsi="Arial" w:cs="Arial"/>
+          <w:lang w:val="es-SV"/>
+        </w:rPr>
+      </w:pPr>
+    </w:p>
+    <w:p>
+      <w:pPr>
+        <w:rPr>
+          <w:rFonts w:ascii="Arial" w:hAnsi="Arial" w:cs="Arial"/>
+          <w:lang w:val="es-SV"/>
+        </w:rPr>
+      </w:pPr>
+    </w:p>
+    <w:p>
+      <w:pPr>
+        <w:pStyle w:val="Ttulo2"/>
+        <w:rPr>
+          <w:rFonts w:ascii="Arial" w:hAnsi="Arial" w:cs="Arial"/>
+          <w:color w:val="auto"/>
+          <w:sz w:val="24"/>
+          <w:szCs w:val="24"/>
+          <w:lang w:val="es-SV"/>
+        </w:rPr>
+      </w:pPr>
+      <w:bookmarkStart w:id="10" w:name="_Toc224570644"/>
+      <w:r>
+        <w:rPr>
+          <w:rFonts w:ascii="Arial" w:hAnsi="Arial" w:cs="Arial"/>
+          <w:color w:val="auto"/>
+          <w:sz w:val="24"/>
+          <w:szCs w:val="24"/>
+          <w:lang w:val="es-SV"/>
+        </w:rPr>
+        <w:lastRenderedPageBreak/>
+        <w:t>Buscar un documento en los archivos locales</w:t>
+      </w:r>
+      <w:bookmarkEnd w:id="10"/>
+    </w:p>
+    <w:p>
+      <w:pPr>
+        <w:jc w:val="center"/>
+        <w:rPr>
+          <w:rFonts w:ascii="Arial" w:hAnsi="Arial" w:cs="Arial"/>
+          <w:lang w:val="es-SV"/>
+        </w:rPr>
+      </w:pPr>
+      <w:r>
+        <w:rPr>
+          <w:bCs/>
+          <w:noProof/>
+          <w:lang w:val="es-SV" w:eastAsia="es-SV"/>
+        </w:rPr>
+        <w:drawing>
+          <wp:inline distT="0" distB="0" distL="0" distR="0" wp14:anchorId="050A79CB" wp14:editId="7DEF1125">
+            <wp:extent cx="3368332" cy="5730737"/>
+            <wp:effectExtent l="0" t="0" r="3810" b="3810"/>
+            <wp:docPr id="10" name="Imagen 10"/>
+            <wp:cNvGraphicFramePr>
+              <a:graphicFrameLocks xmlns:a="http://schemas.openxmlformats.org/drawingml/2006/main" noChangeAspect="1"/>
+            </wp:cNvGraphicFramePr>
+            <a:graphic xmlns:a="http://schemas.openxmlformats.org/drawingml/2006/main">
+              <a:graphicData uri="http://schemas.openxmlformats.org/drawingml/2006/picture">
+                <pic:pic xmlns:pic="http://schemas.openxmlformats.org/drawingml/2006/picture">
+                  <pic:nvPicPr>
+                    <pic:cNvPr id="1" name=""/>
+                    <pic:cNvPicPr/>
+                  </pic:nvPicPr>
+                  <pic:blipFill>
+                    <a:blip r:embed="rId12"/>
+                    <a:stretch>
+                      <a:fillRect/>
+                    </a:stretch>
+                  </pic:blipFill>
+                  <pic:spPr>
+                    <a:xfrm>
+                      <a:off x="0" y="0"/>
+                      <a:ext cx="3368332" cy="5730737"/>
+                    </a:xfrm>
+                    <a:prstGeom prst="rect">
+                      <a:avLst/>
+                    </a:prstGeom>
+                  </pic:spPr>
+                </pic:pic>
+              </a:graphicData>
+            </a:graphic>
+          </wp:inline>
+        </w:drawing>
+      </w:r>
+    </w:p>
+    <w:p>
+      <w:pPr>
+        <w:rPr>
+          <w:rFonts w:ascii="Arial" w:hAnsi="Arial" w:cs="Arial"/>
+          <w:lang w:val="es-SV"/>
+        </w:rPr>
+      </w:pPr>
+    </w:p>
+    <w:p>
+      <w:pPr>
+        <w:rPr>
+          <w:rFonts w:ascii="Arial" w:hAnsi="Arial" w:cs="Arial"/>
+          <w:lang w:val="es-SV"/>
+        </w:rPr>
+      </w:pPr>
+    </w:p>
+    <w:p>
+      <w:pPr>
+        <w:rPr>
+          <w:rFonts w:ascii="Arial" w:hAnsi="Arial" w:cs="Arial"/>
+          <w:lang w:val="es-SV"/>
+        </w:rPr>
+      </w:pPr>
+    </w:p>
+    <w:p>
+      <w:pPr>
+        <w:rPr>
+          <w:rFonts w:ascii="Arial" w:hAnsi="Arial" w:cs="Arial"/>
+          <w:lang w:val="es-SV"/>
+        </w:rPr>
+      </w:pPr>
+    </w:p>
+    <w:p>
+      <w:pPr>
+        <w:pStyle w:val="Ttulo1"/>
+        <w:spacing w:line="360" w:lineRule="auto"/>
+        <w:rPr>
+          <w:rFonts w:ascii="Arial" w:hAnsi="Arial" w:cs="Arial"/>
+          <w:b/>
+          <w:bCs/>
+          <w:color w:val="auto"/>
+          <w:sz w:val="24"/>
+          <w:szCs w:val="24"/>
+          <w:lang w:val="es-SV"/>
+        </w:rPr>
+      </w:pPr>
+      <w:bookmarkStart w:id="11" w:name="_Toc224570645"/>
+      <w:r>
+        <w:rPr>
+          <w:rFonts w:ascii="Arial" w:hAnsi="Arial" w:cs="Arial"/>
+          <w:b/>
+          <w:bCs/>
+          <w:color w:val="auto"/>
+          <w:sz w:val="24"/>
+          <w:szCs w:val="24"/>
+          <w:lang w:val="es-SV"/>
+        </w:rPr>
+        <w:lastRenderedPageBreak/>
+        <w:t>Diagramas TO-BE</w:t>
+      </w:r>
+      <w:bookmarkEnd w:id="11"/>
+    </w:p>
+    <w:p>
+      <w:pPr>
+        <w:pStyle w:val="Ttulo2"/>
+        <w:rPr>
+          <w:rFonts w:ascii="Arial" w:hAnsi="Arial" w:cs="Arial"/>
+          <w:color w:val="auto"/>
+          <w:sz w:val="24"/>
+          <w:szCs w:val="24"/>
+          <w:lang w:val="es-SV"/>
+        </w:rPr>
+      </w:pPr>
+      <w:bookmarkStart w:id="12" w:name="_Toc224570646"/>
+      <w:r>
+        <w:rPr>
+          <w:rFonts w:ascii="Arial" w:hAnsi="Arial" w:cs="Arial"/>
+          <w:color w:val="auto"/>
+          <w:sz w:val="24"/>
+          <w:szCs w:val="24"/>
+          <w:lang w:val="es-SV"/>
+        </w:rPr>
+        <w:t>Buscar un documento</w:t>
+      </w:r>
+      <w:bookmarkEnd w:id="12"/>
+    </w:p>
+    <w:p>
+      <w:pPr>
+        <w:jc w:val="center"/>
+        <w:rPr>
+          <w:rFonts w:ascii="Arial" w:hAnsi="Arial" w:cs="Arial"/>
+          <w:lang w:val="es-SV"/>
+        </w:rPr>
+      </w:pPr>
+      <w:r>
+        <w:rPr>
+          <w:noProof/>
+          <w:lang w:val="es-SV" w:eastAsia="es-SV"/>
+        </w:rPr>
+        <w:drawing>
+          <wp:inline distT="0" distB="0" distL="0" distR="0" wp14:anchorId="4225CF94" wp14:editId="3F992CD1">
+            <wp:extent cx="5159187" cy="5273497"/>
+            <wp:effectExtent l="0" t="0" r="3810" b="3810"/>
+            <wp:docPr id="11" name="Imagen 11"/>
             <wp:cNvGraphicFramePr>
               <a:graphicFrameLocks xmlns:a="http://schemas.openxmlformats.org/drawingml/2006/main" noChangeAspect="1"/>
             </wp:cNvGraphicFramePr>
@@ -3940,7 +4221,7 @@
                   <pic:spPr>
                     <a:xfrm>
                       <a:off x="0" y="0"/>
-                      <a:ext cx="3558848" cy="5730737"/>
+                      <a:ext cx="5159187" cy="5273497"/>
                     </a:xfrm>
                     <a:prstGeom prst="rect">
                       <a:avLst/>
@@ -3979,6 +4260,30 @@
     </w:p>
     <w:p>
       <w:pPr>
+        <w:rPr>
+          <w:rFonts w:ascii="Arial" w:hAnsi="Arial" w:cs="Arial"/>
+          <w:lang w:val="es-SV"/>
+        </w:rPr>
+      </w:pPr>
+    </w:p>
+    <w:p>
+      <w:pPr>
+        <w:rPr>
+          <w:rFonts w:ascii="Arial" w:hAnsi="Arial" w:cs="Arial"/>
+          <w:lang w:val="es-SV"/>
+        </w:rPr>
+      </w:pPr>
+    </w:p>
+    <w:p>
+      <w:pPr>
+        <w:rPr>
+          <w:rFonts w:ascii="Arial" w:hAnsi="Arial" w:cs="Arial"/>
+          <w:lang w:val="es-SV"/>
+        </w:rPr>
+      </w:pPr>
+    </w:p>
+    <w:p>
+      <w:pPr>
         <w:pStyle w:val="Ttulo2"/>
         <w:rPr>
           <w:rFonts w:ascii="Arial" w:hAnsi="Arial" w:cs="Arial"/>
@@ -3988,7 +4293,7 @@
           <w:lang w:val="es-SV"/>
         </w:rPr>
       </w:pPr>
-      <w:bookmarkStart w:id="9" w:name="_Toc224570643"/>
+      <w:bookmarkStart w:id="13" w:name="_Toc224570647"/>
       <w:r>
         <w:rPr>
           <w:rFonts w:ascii="Arial" w:hAnsi="Arial" w:cs="Arial"/>
@@ -3998,19 +4303,9 @@
           <w:lang w:val="es-SV"/>
         </w:rPr>
         <w:lastRenderedPageBreak/>
-        <w:t>Buscar un documento en los archivos compartidos</w:t>
-      </w:r>
-      <w:bookmarkEnd w:id="9"/>
-      <w:r>
-        <w:rPr>
-          <w:rFonts w:ascii="Arial" w:hAnsi="Arial" w:cs="Arial"/>
-          <w:color w:val="auto"/>
-          <w:sz w:val="24"/>
-          <w:szCs w:val="24"/>
-          <w:lang w:val="es-SV"/>
-        </w:rPr>
-        <w:t xml:space="preserve"> </w:t>
-      </w:r>
+        <w:t>Subir un documento</w:t>
+      </w:r>
+      <w:bookmarkEnd w:id="13"/>
     </w:p>
     <w:p>
       <w:pPr>
@@ -4022,15 +4317,14 @@
       </w:pPr>
       <w:r>
         <w:rPr>
-          <w:bCs/>
           <w:noProof/>
           <w:lang w:val="es-SV" w:eastAsia="es-SV"/>
         </w:rPr>
         <w:drawing>
-          <wp:inline distT="0" distB="0" distL="0" distR="0" wp14:anchorId="6F872713" wp14:editId="2EF2EA2E">
-            <wp:extent cx="3589331" cy="5875529"/>
+          <wp:inline distT="0" distB="0" distL="0" distR="0" wp14:anchorId="4CB784CB" wp14:editId="211C1BD7">
+            <wp:extent cx="5943600" cy="5568950"/>
             <wp:effectExtent l="0" t="0" r="0" b="0"/>
-            <wp:docPr id="9" name="Imagen 9"/>
+            <wp:docPr id="12" name="Imagen 12"/>
             <wp:cNvGraphicFramePr>
               <a:graphicFrameLocks xmlns:a="http://schemas.openxmlformats.org/drawingml/2006/main" noChangeAspect="1"/>
             </wp:cNvGraphicFramePr>
@@ -4050,7 +4344,7 @@
                   <pic:spPr>
                     <a:xfrm>
                       <a:off x="0" y="0"/>
-                      <a:ext cx="3589331" cy="5875529"/>
+                      <a:ext cx="5943600" cy="5568950"/>
                     </a:xfrm>
                     <a:prstGeom prst="rect">
                       <a:avLst/>
@@ -4097,6 +4391,30 @@
     </w:p>
     <w:p>
       <w:pPr>
+        <w:rPr>
+          <w:rFonts w:ascii="Arial" w:hAnsi="Arial" w:cs="Arial"/>
+          <w:lang w:val="es-SV"/>
+        </w:rPr>
+      </w:pPr>
+    </w:p>
+    <w:p>
+      <w:pPr>
+        <w:rPr>
+          <w:rFonts w:ascii="Arial" w:hAnsi="Arial" w:cs="Arial"/>
+          <w:lang w:val="es-SV"/>
+        </w:rPr>
+      </w:pPr>
+    </w:p>
+    <w:p>
+      <w:pPr>
+        <w:rPr>
+          <w:rFonts w:ascii="Arial" w:hAnsi="Arial" w:cs="Arial"/>
+          <w:lang w:val="es-SV"/>
+        </w:rPr>
+      </w:pPr>
+    </w:p>
+    <w:p>
+      <w:pPr>
         <w:pStyle w:val="Ttulo2"/>
         <w:rPr>
           <w:rFonts w:ascii="Arial" w:hAnsi="Arial" w:cs="Arial"/>
@@ -4106,7 +4424,7 @@
           <w:lang w:val="es-SV"/>
         </w:rPr>
       </w:pPr>
-      <w:bookmarkStart w:id="10" w:name="_Toc224570644"/>
+      <w:bookmarkStart w:id="14" w:name="_Toc224570648"/>
       <w:r>
         <w:rPr>
           <w:rFonts w:ascii="Arial" w:hAnsi="Arial" w:cs="Arial"/>
@@ -4116,9 +4434,9 @@
           <w:lang w:val="es-SV"/>
         </w:rPr>
         <w:lastRenderedPageBreak/>
-        <w:t>Buscar un documento en los archivos locales</w:t>
-      </w:r>
-      <w:bookmarkEnd w:id="10"/>
+        <w:t>Crear un nuevo usuario</w:t>
+      </w:r>
+      <w:bookmarkEnd w:id="14"/>
     </w:p>
     <w:p>
       <w:pPr>
@@ -4130,15 +4448,14 @@
       </w:pPr>
       <w:r>
         <w:rPr>
-          <w:bCs/>
           <w:noProof/>
           <w:lang w:val="es-SV" w:eastAsia="es-SV"/>
         </w:rPr>
         <w:drawing>
-          <wp:inline distT="0" distB="0" distL="0" distR="0" wp14:anchorId="050A79CB" wp14:editId="7DEF1125">
-            <wp:extent cx="3368332" cy="5730737"/>
-            <wp:effectExtent l="0" t="0" r="3810" b="3810"/>
-            <wp:docPr id="10" name="Imagen 10"/>
+          <wp:inline distT="0" distB="0" distL="0" distR="0" wp14:anchorId="5EC47ABE" wp14:editId="32A5AA8F">
+            <wp:extent cx="5532599" cy="5166808"/>
+            <wp:effectExtent l="0" t="0" r="0" b="0"/>
+            <wp:docPr id="13" name="Imagen 13"/>
             <wp:cNvGraphicFramePr>
               <a:graphicFrameLocks xmlns:a="http://schemas.openxmlformats.org/drawingml/2006/main" noChangeAspect="1"/>
             </wp:cNvGraphicFramePr>
@@ -4158,7 +4475,7 @@
                   <pic:spPr>
                     <a:xfrm>
                       <a:off x="0" y="0"/>
-                      <a:ext cx="3368332" cy="5730737"/>
+                      <a:ext cx="5532599" cy="5166808"/>
                     </a:xfrm>
                     <a:prstGeom prst="rect">
                       <a:avLst/>
@@ -4205,6 +4522,967 @@
     </w:p>
     <w:p>
       <w:pPr>
+        <w:rPr>
+          <w:rFonts w:ascii="Arial" w:hAnsi="Arial" w:cs="Arial"/>
+          <w:lang w:val="es-SV"/>
+        </w:rPr>
+      </w:pPr>
+    </w:p>
+    <w:p>
+      <w:pPr>
+        <w:rPr>
+          <w:rFonts w:ascii="Arial" w:hAnsi="Arial" w:cs="Arial"/>
+          <w:lang w:val="es-SV"/>
+        </w:rPr>
+      </w:pPr>
+    </w:p>
+    <w:p>
+      <w:pPr>
+        <w:rPr>
+          <w:rFonts w:ascii="Arial" w:hAnsi="Arial" w:cs="Arial"/>
+          <w:lang w:val="es-SV"/>
+        </w:rPr>
+      </w:pPr>
+    </w:p>
+    <w:p>
+      <w:pPr>
+        <w:rPr>
+          <w:rFonts w:ascii="Arial" w:hAnsi="Arial" w:cs="Arial"/>
+          <w:lang w:val="es-SV"/>
+        </w:rPr>
+      </w:pPr>
+    </w:p>
+    <w:p>
+      <w:pPr>
+        <w:rPr>
+          <w:rFonts w:ascii="Arial" w:hAnsi="Arial" w:cs="Arial"/>
+          <w:lang w:val="es-SV"/>
+        </w:rPr>
+      </w:pPr>
+    </w:p>
+    <w:p>
+      <w:pPr>
+        <w:rPr>
+          <w:rFonts w:ascii="Arial" w:eastAsiaTheme="majorEastAsia" w:hAnsi="Arial" w:cs="Arial"/>
+          <w:b/>
+          <w:bCs/>
+          <w:lang w:val="es-SV"/>
+        </w:rPr>
+      </w:pPr>
+      <w:bookmarkStart w:id="15" w:name="_Toc224298479"/>
+      <w:r>
+        <w:rPr>
+          <w:rFonts w:ascii="Arial" w:eastAsiaTheme="majorEastAsia" w:hAnsi="Arial" w:cs="Arial"/>
+          <w:b/>
+          <w:bCs/>
+          <w:lang w:val="es-SV"/>
+        </w:rPr>
+        <w:lastRenderedPageBreak/>
+        <w:t>Mejoras concretas</w:t>
+      </w:r>
+      <w:bookmarkEnd w:id="15"/>
+    </w:p>
+    <w:p>
+      <w:pPr>
+        <w:rPr>
+          <w:rFonts w:ascii="Arial" w:eastAsiaTheme="majorEastAsia" w:hAnsi="Arial" w:cs="Arial"/>
+          <w:lang w:val="es-SV"/>
+        </w:rPr>
+      </w:pPr>
+      <w:bookmarkStart w:id="16" w:name="_Toc224298480"/>
+      <w:r>
+        <w:rPr>
+          <w:rFonts w:ascii="Arial" w:eastAsiaTheme="majorEastAsia" w:hAnsi="Arial" w:cs="Arial"/>
+          <w:lang w:val="es-SV"/>
+        </w:rPr>
+        <w:t xml:space="preserve">Uso específico de </w:t>
+      </w:r>
+      <w:proofErr w:type="spellStart"/>
+      <w:r>
+        <w:rPr>
+          <w:rFonts w:ascii="Arial" w:eastAsiaTheme="majorEastAsia" w:hAnsi="Arial" w:cs="Arial"/>
+          <w:lang w:val="es-SV"/>
+        </w:rPr>
+        <w:t>commits</w:t>
+      </w:r>
+      <w:proofErr w:type="spellEnd"/>
+      <w:r>
+        <w:rPr>
+          <w:rFonts w:ascii="Arial" w:eastAsiaTheme="majorEastAsia" w:hAnsi="Arial" w:cs="Arial"/>
+          <w:lang w:val="es-SV"/>
+        </w:rPr>
+        <w:t xml:space="preserve"> en </w:t>
+      </w:r>
+      <w:proofErr w:type="spellStart"/>
+      <w:r>
+        <w:rPr>
+          <w:rFonts w:ascii="Arial" w:eastAsiaTheme="majorEastAsia" w:hAnsi="Arial" w:cs="Arial"/>
+          <w:lang w:val="es-SV"/>
+        </w:rPr>
+        <w:t>Github</w:t>
+      </w:r>
+      <w:bookmarkEnd w:id="16"/>
+      <w:proofErr w:type="spellEnd"/>
+    </w:p>
+    <w:p>
+      <w:pPr>
+        <w:rPr>
+          <w:rFonts w:ascii="Arial" w:eastAsiaTheme="majorEastAsia" w:hAnsi="Arial" w:cs="Arial"/>
+          <w:lang w:val="es-SV"/>
+        </w:rPr>
+      </w:pPr>
+      <w:r>
+        <w:rPr>
+          <w:rFonts w:ascii="Arial" w:eastAsiaTheme="majorEastAsia" w:hAnsi="Arial" w:cs="Arial"/>
+          <w:lang w:val="es-SV"/>
+        </w:rPr>
+        <w:t xml:space="preserve">Estaremos haciendo uso de lenguaje específico para </w:t>
+      </w:r>
+      <w:proofErr w:type="spellStart"/>
+      <w:r>
+        <w:rPr>
+          <w:rFonts w:ascii="Arial" w:eastAsiaTheme="majorEastAsia" w:hAnsi="Arial" w:cs="Arial"/>
+          <w:lang w:val="es-SV"/>
+        </w:rPr>
+        <w:t>commits</w:t>
+      </w:r>
+      <w:proofErr w:type="spellEnd"/>
+      <w:r>
+        <w:rPr>
+          <w:rFonts w:ascii="Arial" w:eastAsiaTheme="majorEastAsia" w:hAnsi="Arial" w:cs="Arial"/>
+          <w:lang w:val="es-SV"/>
+        </w:rPr>
+        <w:t xml:space="preserve"> en </w:t>
+      </w:r>
+      <w:proofErr w:type="spellStart"/>
+      <w:r>
+        <w:rPr>
+          <w:rFonts w:ascii="Arial" w:eastAsiaTheme="majorEastAsia" w:hAnsi="Arial" w:cs="Arial"/>
+          <w:lang w:val="es-SV"/>
+        </w:rPr>
+        <w:t>Github</w:t>
+      </w:r>
+      <w:proofErr w:type="spellEnd"/>
+      <w:r>
+        <w:rPr>
+          <w:rFonts w:ascii="Arial" w:eastAsiaTheme="majorEastAsia" w:hAnsi="Arial" w:cs="Arial"/>
+          <w:lang w:val="es-SV"/>
+        </w:rPr>
+        <w:t xml:space="preserve">, para que quede claro que es lo que se está modificando, agregando o eliminando en el repositorio. Estaremos ocupando las siguientes frases al inicio de cada </w:t>
+      </w:r>
+      <w:proofErr w:type="spellStart"/>
+      <w:r>
+        <w:rPr>
+          <w:rFonts w:ascii="Arial" w:eastAsiaTheme="majorEastAsia" w:hAnsi="Arial" w:cs="Arial"/>
+          <w:lang w:val="es-SV"/>
+        </w:rPr>
+        <w:t>commit</w:t>
+      </w:r>
+      <w:proofErr w:type="spellEnd"/>
+      <w:r>
+        <w:rPr>
+          <w:rFonts w:ascii="Arial" w:eastAsiaTheme="majorEastAsia" w:hAnsi="Arial" w:cs="Arial"/>
+          <w:lang w:val="es-SV"/>
+        </w:rPr>
+        <w:t>:</w:t>
+      </w:r>
+    </w:p>
+    <w:p>
+      <w:pPr>
+        <w:numPr>
+          <w:ilvl w:val="0"/>
+          <w:numId w:val="9"/>
+        </w:numPr>
+        <w:rPr>
+          <w:rFonts w:ascii="Arial" w:eastAsiaTheme="majorEastAsia" w:hAnsi="Arial" w:cs="Arial"/>
+          <w:lang w:val="es-SV"/>
+        </w:rPr>
+      </w:pPr>
+      <w:proofErr w:type="spellStart"/>
+      <w:r>
+        <w:rPr>
+          <w:rFonts w:ascii="Arial" w:eastAsiaTheme="majorEastAsia" w:hAnsi="Arial" w:cs="Arial"/>
+          <w:lang w:val="es-SV"/>
+        </w:rPr>
+        <w:t>Docs</w:t>
+      </w:r>
+      <w:proofErr w:type="spellEnd"/>
+      <w:r>
+        <w:rPr>
+          <w:rFonts w:ascii="Arial" w:eastAsiaTheme="majorEastAsia" w:hAnsi="Arial" w:cs="Arial"/>
+          <w:lang w:val="es-SV"/>
+        </w:rPr>
+        <w:t xml:space="preserve">: Cuando se está modificando, agregando o eliminando algo específico relacionado a la documentación. Nos enfocaremos en estos </w:t>
+      </w:r>
+      <w:proofErr w:type="spellStart"/>
+      <w:r>
+        <w:rPr>
+          <w:rFonts w:ascii="Arial" w:eastAsiaTheme="majorEastAsia" w:hAnsi="Arial" w:cs="Arial"/>
+          <w:lang w:val="es-SV"/>
+        </w:rPr>
+        <w:t>commits</w:t>
+      </w:r>
+      <w:proofErr w:type="spellEnd"/>
+      <w:r>
+        <w:rPr>
+          <w:rFonts w:ascii="Arial" w:eastAsiaTheme="majorEastAsia" w:hAnsi="Arial" w:cs="Arial"/>
+          <w:lang w:val="es-SV"/>
+        </w:rPr>
+        <w:t xml:space="preserve"> específicamente cuando nos enfoquemos en la documentación relacionadas a las entregas. </w:t>
+      </w:r>
+    </w:p>
+    <w:p>
+      <w:pPr>
+        <w:numPr>
+          <w:ilvl w:val="0"/>
+          <w:numId w:val="9"/>
+        </w:numPr>
+        <w:rPr>
+          <w:rFonts w:ascii="Arial" w:eastAsiaTheme="majorEastAsia" w:hAnsi="Arial" w:cs="Arial"/>
+          <w:lang w:val="es-SV"/>
+        </w:rPr>
+      </w:pPr>
+      <w:proofErr w:type="spellStart"/>
+      <w:r>
+        <w:rPr>
+          <w:rFonts w:ascii="Arial" w:eastAsiaTheme="majorEastAsia" w:hAnsi="Arial" w:cs="Arial"/>
+          <w:lang w:val="es-SV"/>
+        </w:rPr>
+        <w:t>Db</w:t>
+      </w:r>
+      <w:proofErr w:type="spellEnd"/>
+      <w:r>
+        <w:rPr>
+          <w:rFonts w:ascii="Arial" w:eastAsiaTheme="majorEastAsia" w:hAnsi="Arial" w:cs="Arial"/>
+          <w:lang w:val="es-SV"/>
+        </w:rPr>
+        <w:t xml:space="preserve">: Cuando se está agregando o eliminando una base de datos. No nos enfocaremos específicamente cuando se modifique una base de datos debido a que esto se realizara mucho cuando estemos probando el sitio web. </w:t>
+      </w:r>
+    </w:p>
+    <w:p>
+      <w:pPr>
+        <w:numPr>
+          <w:ilvl w:val="0"/>
+          <w:numId w:val="9"/>
+        </w:numPr>
+        <w:rPr>
+          <w:rFonts w:ascii="Arial" w:eastAsiaTheme="majorEastAsia" w:hAnsi="Arial" w:cs="Arial"/>
+          <w:lang w:val="es-SV"/>
+        </w:rPr>
+      </w:pPr>
+      <w:proofErr w:type="spellStart"/>
+      <w:r>
+        <w:rPr>
+          <w:rFonts w:ascii="Arial" w:eastAsiaTheme="majorEastAsia" w:hAnsi="Arial" w:cs="Arial"/>
+          <w:lang w:val="es-SV"/>
+        </w:rPr>
+        <w:t>Src</w:t>
+      </w:r>
+      <w:proofErr w:type="spellEnd"/>
+      <w:r>
+        <w:rPr>
+          <w:rFonts w:ascii="Arial" w:eastAsiaTheme="majorEastAsia" w:hAnsi="Arial" w:cs="Arial"/>
+          <w:lang w:val="es-SV"/>
+        </w:rPr>
+        <w:t xml:space="preserve">: Cuando estemos modificando, agregando o eliminando vistas del sitio web. Estos </w:t>
+      </w:r>
+      <w:proofErr w:type="spellStart"/>
+      <w:r>
+        <w:rPr>
+          <w:rFonts w:ascii="Arial" w:eastAsiaTheme="majorEastAsia" w:hAnsi="Arial" w:cs="Arial"/>
+          <w:lang w:val="es-SV"/>
+        </w:rPr>
+        <w:t>commits</w:t>
+      </w:r>
+      <w:proofErr w:type="spellEnd"/>
+      <w:r>
+        <w:rPr>
+          <w:rFonts w:ascii="Arial" w:eastAsiaTheme="majorEastAsia" w:hAnsi="Arial" w:cs="Arial"/>
+          <w:lang w:val="es-SV"/>
+        </w:rPr>
+        <w:t xml:space="preserve"> se enfocarán en los cambios que se realizan al sitio web. </w:t>
+      </w:r>
+    </w:p>
+    <w:p>
+      <w:pPr>
+        <w:rPr>
+          <w:rFonts w:ascii="Arial" w:eastAsiaTheme="majorEastAsia" w:hAnsi="Arial" w:cs="Arial"/>
+          <w:lang w:val="es-SV"/>
+        </w:rPr>
+      </w:pPr>
+      <w:r>
+        <w:rPr>
+          <w:rFonts w:ascii="Arial" w:eastAsiaTheme="majorEastAsia" w:hAnsi="Arial" w:cs="Arial"/>
+          <w:lang w:val="es-SV"/>
+        </w:rPr>
+        <w:t xml:space="preserve">Nuestra meta con </w:t>
+      </w:r>
+      <w:proofErr w:type="gramStart"/>
+      <w:r>
+        <w:rPr>
+          <w:rFonts w:ascii="Arial" w:eastAsiaTheme="majorEastAsia" w:hAnsi="Arial" w:cs="Arial"/>
+          <w:lang w:val="es-SV"/>
+        </w:rPr>
+        <w:t>esto,</w:t>
+      </w:r>
+      <w:proofErr w:type="gramEnd"/>
+      <w:r>
+        <w:rPr>
+          <w:rFonts w:ascii="Arial" w:eastAsiaTheme="majorEastAsia" w:hAnsi="Arial" w:cs="Arial"/>
+          <w:lang w:val="es-SV"/>
+        </w:rPr>
+        <w:t xml:space="preserve"> es que quede claro que hace cada </w:t>
+      </w:r>
+      <w:proofErr w:type="spellStart"/>
+      <w:r>
+        <w:rPr>
+          <w:rFonts w:ascii="Arial" w:eastAsiaTheme="majorEastAsia" w:hAnsi="Arial" w:cs="Arial"/>
+          <w:lang w:val="es-SV"/>
+        </w:rPr>
+        <w:t>commit</w:t>
+      </w:r>
+      <w:proofErr w:type="spellEnd"/>
+      <w:r>
+        <w:rPr>
+          <w:rFonts w:ascii="Arial" w:eastAsiaTheme="majorEastAsia" w:hAnsi="Arial" w:cs="Arial"/>
+          <w:lang w:val="es-SV"/>
+        </w:rPr>
+        <w:t xml:space="preserve"> para poder así tener una línea de tiempo de nuestros cambios y que pueda haber trazabilidad en nuestro proyecto. </w:t>
+      </w:r>
+    </w:p>
+    <w:p>
+      <w:pPr>
+        <w:rPr>
+          <w:rFonts w:ascii="Arial" w:eastAsiaTheme="majorEastAsia" w:hAnsi="Arial" w:cs="Arial"/>
+          <w:lang w:val="es-SV"/>
+        </w:rPr>
+      </w:pPr>
+      <w:bookmarkStart w:id="17" w:name="_Toc224298481"/>
+      <w:r>
+        <w:rPr>
+          <w:rFonts w:ascii="Arial" w:eastAsiaTheme="majorEastAsia" w:hAnsi="Arial" w:cs="Arial"/>
+          <w:lang w:val="es-SV"/>
+        </w:rPr>
+        <w:t xml:space="preserve">Uso de </w:t>
+      </w:r>
+      <w:proofErr w:type="gramStart"/>
+      <w:r>
+        <w:rPr>
+          <w:rFonts w:ascii="Arial" w:eastAsiaTheme="majorEastAsia" w:hAnsi="Arial" w:cs="Arial"/>
+          <w:lang w:val="es-SV"/>
+        </w:rPr>
+        <w:t>status</w:t>
+      </w:r>
+      <w:proofErr w:type="gramEnd"/>
+      <w:r>
+        <w:rPr>
+          <w:rFonts w:ascii="Arial" w:eastAsiaTheme="majorEastAsia" w:hAnsi="Arial" w:cs="Arial"/>
+          <w:lang w:val="es-SV"/>
+        </w:rPr>
+        <w:t xml:space="preserve"> en el tablero</w:t>
+      </w:r>
+      <w:bookmarkEnd w:id="17"/>
+    </w:p>
+    <w:p>
+      <w:pPr>
+        <w:rPr>
+          <w:rFonts w:ascii="Arial" w:eastAsiaTheme="majorEastAsia" w:hAnsi="Arial" w:cs="Arial"/>
+          <w:lang w:val="es-SV"/>
+        </w:rPr>
+      </w:pPr>
+      <w:r>
+        <w:rPr>
+          <w:rFonts w:ascii="Arial" w:eastAsiaTheme="majorEastAsia" w:hAnsi="Arial" w:cs="Arial"/>
+          <w:lang w:val="es-SV"/>
+        </w:rPr>
+        <w:t>Ya que estaremos ocupando un tablero para poder así tener un mejor manejo de las tareas de cada uno. En este caso estaremos ocupando un campo de status, el cual mostrara como va avanzando cada parte del proyecto. Nos enfocaremos en las siguientes características:</w:t>
+      </w:r>
+    </w:p>
+    <w:p>
+      <w:pPr>
+        <w:numPr>
+          <w:ilvl w:val="0"/>
+          <w:numId w:val="10"/>
+        </w:numPr>
+        <w:rPr>
+          <w:rFonts w:ascii="Arial" w:eastAsiaTheme="majorEastAsia" w:hAnsi="Arial" w:cs="Arial"/>
+          <w:lang w:val="es-SV"/>
+        </w:rPr>
+      </w:pPr>
+      <w:r>
+        <w:rPr>
+          <w:rFonts w:ascii="Arial" w:eastAsiaTheme="majorEastAsia" w:hAnsi="Arial" w:cs="Arial"/>
+          <w:lang w:val="es-SV"/>
+        </w:rPr>
+        <w:t>Todo: En este caso, se ha agregado al tablero algo que se tiene que hacer, sin embargo, aún no se ha empezado. Esto funciona para que tengamos una idea clara de que es lo que tenemos que hacer, aunque aún no se haya empezado.</w:t>
+      </w:r>
+    </w:p>
+    <w:p>
+      <w:pPr>
+        <w:numPr>
+          <w:ilvl w:val="0"/>
+          <w:numId w:val="10"/>
+        </w:numPr>
+        <w:rPr>
+          <w:rFonts w:ascii="Arial" w:eastAsiaTheme="majorEastAsia" w:hAnsi="Arial" w:cs="Arial"/>
+          <w:lang w:val="es-SV"/>
+        </w:rPr>
+      </w:pPr>
+      <w:r>
+        <w:rPr>
+          <w:rFonts w:ascii="Arial" w:eastAsiaTheme="majorEastAsia" w:hAnsi="Arial" w:cs="Arial"/>
+          <w:lang w:val="es-SV"/>
+        </w:rPr>
+        <w:t xml:space="preserve"> In </w:t>
+      </w:r>
+      <w:proofErr w:type="spellStart"/>
+      <w:r>
+        <w:rPr>
+          <w:rFonts w:ascii="Arial" w:eastAsiaTheme="majorEastAsia" w:hAnsi="Arial" w:cs="Arial"/>
+          <w:lang w:val="es-SV"/>
+        </w:rPr>
+        <w:t>progress</w:t>
+      </w:r>
+      <w:proofErr w:type="spellEnd"/>
+      <w:r>
+        <w:rPr>
+          <w:rFonts w:ascii="Arial" w:eastAsiaTheme="majorEastAsia" w:hAnsi="Arial" w:cs="Arial"/>
+          <w:lang w:val="es-SV"/>
+        </w:rPr>
+        <w:t xml:space="preserve">: En este caso, se ha empezado a trabajar en la funcionalidad o área específica. Esto demuestra que se está trabajando en ella pero que aún no se ha terminado. Por medio de esto queremos controlar como se va avanzando en el proyecto. </w:t>
+      </w:r>
+    </w:p>
+    <w:p>
+      <w:pPr>
+        <w:numPr>
+          <w:ilvl w:val="0"/>
+          <w:numId w:val="10"/>
+        </w:numPr>
+        <w:rPr>
+          <w:rFonts w:ascii="Arial" w:eastAsiaTheme="majorEastAsia" w:hAnsi="Arial" w:cs="Arial"/>
+          <w:lang w:val="es-SV"/>
+        </w:rPr>
+      </w:pPr>
+      <w:r>
+        <w:rPr>
+          <w:rFonts w:ascii="Arial" w:eastAsiaTheme="majorEastAsia" w:hAnsi="Arial" w:cs="Arial"/>
+          <w:lang w:val="es-SV"/>
+        </w:rPr>
+        <w:t xml:space="preserve">Done: En este caso, se ha terminado con la respectiva parte. Para poder poner algo en done, se tiene que haber hecho el respectivo </w:t>
+      </w:r>
+      <w:proofErr w:type="spellStart"/>
+      <w:r>
+        <w:rPr>
+          <w:rFonts w:ascii="Arial" w:eastAsiaTheme="majorEastAsia" w:hAnsi="Arial" w:cs="Arial"/>
+          <w:lang w:val="es-SV"/>
+        </w:rPr>
+        <w:t>commit</w:t>
+      </w:r>
+      <w:proofErr w:type="spellEnd"/>
+      <w:r>
+        <w:rPr>
+          <w:rFonts w:ascii="Arial" w:eastAsiaTheme="majorEastAsia" w:hAnsi="Arial" w:cs="Arial"/>
+          <w:lang w:val="es-SV"/>
+        </w:rPr>
+        <w:t xml:space="preserve"> en </w:t>
+      </w:r>
+      <w:proofErr w:type="spellStart"/>
+      <w:r>
+        <w:rPr>
+          <w:rFonts w:ascii="Arial" w:eastAsiaTheme="majorEastAsia" w:hAnsi="Arial" w:cs="Arial"/>
+          <w:lang w:val="es-SV"/>
+        </w:rPr>
+        <w:t>Github</w:t>
+      </w:r>
+      <w:proofErr w:type="spellEnd"/>
+      <w:r>
+        <w:rPr>
+          <w:rFonts w:ascii="Arial" w:eastAsiaTheme="majorEastAsia" w:hAnsi="Arial" w:cs="Arial"/>
+          <w:lang w:val="es-SV"/>
+        </w:rPr>
+        <w:t xml:space="preserve"> para poder así declarar que esa parte ya se terminó. </w:t>
+      </w:r>
+    </w:p>
+    <w:p>
+      <w:pPr>
+        <w:ind w:left="720"/>
+        <w:rPr>
+          <w:rFonts w:ascii="Arial" w:eastAsiaTheme="majorEastAsia" w:hAnsi="Arial" w:cs="Arial"/>
+          <w:lang w:val="es-SV"/>
+        </w:rPr>
+      </w:pPr>
+    </w:p>
+    <w:p>
+      <w:pPr>
+        <w:rPr>
+          <w:rFonts w:ascii="Arial" w:eastAsiaTheme="majorEastAsia" w:hAnsi="Arial" w:cs="Arial"/>
+          <w:lang w:val="es-SV"/>
+        </w:rPr>
+      </w:pPr>
+      <w:bookmarkStart w:id="18" w:name="_Toc224298482"/>
+      <w:r>
+        <w:rPr>
+          <w:rFonts w:ascii="Arial" w:eastAsiaTheme="majorEastAsia" w:hAnsi="Arial" w:cs="Arial"/>
+          <w:lang w:val="es-SV"/>
+        </w:rPr>
+        <w:lastRenderedPageBreak/>
+        <w:t xml:space="preserve">Uso de </w:t>
+      </w:r>
+      <w:proofErr w:type="spellStart"/>
+      <w:r>
+        <w:rPr>
+          <w:rFonts w:ascii="Arial" w:eastAsiaTheme="majorEastAsia" w:hAnsi="Arial" w:cs="Arial"/>
+          <w:lang w:val="es-SV"/>
+        </w:rPr>
+        <w:t>priorities</w:t>
+      </w:r>
+      <w:proofErr w:type="spellEnd"/>
+      <w:r>
+        <w:rPr>
+          <w:rFonts w:ascii="Arial" w:eastAsiaTheme="majorEastAsia" w:hAnsi="Arial" w:cs="Arial"/>
+          <w:lang w:val="es-SV"/>
+        </w:rPr>
+        <w:t xml:space="preserve"> en el tablero</w:t>
+      </w:r>
+      <w:bookmarkEnd w:id="18"/>
+    </w:p>
+    <w:p>
+      <w:pPr>
+        <w:rPr>
+          <w:rFonts w:ascii="Arial" w:eastAsiaTheme="majorEastAsia" w:hAnsi="Arial" w:cs="Arial"/>
+          <w:lang w:val="es-SV"/>
+        </w:rPr>
+      </w:pPr>
+      <w:r>
+        <w:rPr>
+          <w:rFonts w:ascii="Arial" w:eastAsiaTheme="majorEastAsia" w:hAnsi="Arial" w:cs="Arial"/>
+          <w:lang w:val="es-SV"/>
+        </w:rPr>
+        <w:t>Estaremos haciendo distintas tareas en todo el proyecto, las cuales pueden variar en su importancia y prioridad, para idear con esto, ocuparemos un campo con prioridades, el cual mostrara que es lo que más urge y lo que es menos importante. Nos enfocaremos en las siguientes características:</w:t>
+      </w:r>
+    </w:p>
+    <w:p>
+      <w:pPr>
+        <w:numPr>
+          <w:ilvl w:val="0"/>
+          <w:numId w:val="11"/>
+        </w:numPr>
+        <w:rPr>
+          <w:rFonts w:ascii="Arial" w:eastAsiaTheme="majorEastAsia" w:hAnsi="Arial" w:cs="Arial"/>
+          <w:lang w:val="es-SV"/>
+        </w:rPr>
+      </w:pPr>
+      <w:r>
+        <w:rPr>
+          <w:rFonts w:ascii="Arial" w:eastAsiaTheme="majorEastAsia" w:hAnsi="Arial" w:cs="Arial"/>
+          <w:lang w:val="es-SV"/>
+        </w:rPr>
+        <w:t>High: En este caso, esta funcionalidad es de las más importantes y urge que se complete lo más rápido posible. Esto puede ser porque es una base para que se agreguen otras partes (como una base de datos para tener una conexión a la base de datos) o porque es algo que se tiene que realizar antes de la siguiente entrega. Es de los más importante que se esto se complete lo más rápido posible y nos debemos enfocar en esto.</w:t>
+      </w:r>
+    </w:p>
+    <w:p>
+      <w:pPr>
+        <w:numPr>
+          <w:ilvl w:val="0"/>
+          <w:numId w:val="11"/>
+        </w:numPr>
+        <w:rPr>
+          <w:rFonts w:ascii="Arial" w:eastAsiaTheme="majorEastAsia" w:hAnsi="Arial" w:cs="Arial"/>
+          <w:lang w:val="es-SV"/>
+        </w:rPr>
+      </w:pPr>
+      <w:r>
+        <w:rPr>
+          <w:rFonts w:ascii="Arial" w:eastAsiaTheme="majorEastAsia" w:hAnsi="Arial" w:cs="Arial"/>
+          <w:lang w:val="es-SV"/>
+        </w:rPr>
+        <w:t xml:space="preserve">Medium: En este caso, esta funcionalidad es de mediana importancia y tiene que completarse, pero no urge tanto como otras funcionalidades. Es importante que esta se cumpla antes de la entrega, pero es aún más importante que se cumplan las de </w:t>
+      </w:r>
+      <w:proofErr w:type="spellStart"/>
+      <w:r>
+        <w:rPr>
+          <w:rFonts w:ascii="Arial" w:eastAsiaTheme="majorEastAsia" w:hAnsi="Arial" w:cs="Arial"/>
+          <w:lang w:val="es-SV"/>
+        </w:rPr>
+        <w:t>high</w:t>
+      </w:r>
+      <w:proofErr w:type="spellEnd"/>
+      <w:r>
+        <w:rPr>
+          <w:rFonts w:ascii="Arial" w:eastAsiaTheme="majorEastAsia" w:hAnsi="Arial" w:cs="Arial"/>
+          <w:lang w:val="es-SV"/>
+        </w:rPr>
+        <w:t xml:space="preserve"> primero. </w:t>
+      </w:r>
+    </w:p>
+    <w:p>
+      <w:pPr>
+        <w:numPr>
+          <w:ilvl w:val="0"/>
+          <w:numId w:val="11"/>
+        </w:numPr>
+        <w:rPr>
+          <w:rFonts w:ascii="Arial" w:eastAsiaTheme="majorEastAsia" w:hAnsi="Arial" w:cs="Arial"/>
+          <w:lang w:val="es-SV"/>
+        </w:rPr>
+      </w:pPr>
+      <w:r>
+        <w:rPr>
+          <w:rFonts w:ascii="Arial" w:eastAsiaTheme="majorEastAsia" w:hAnsi="Arial" w:cs="Arial"/>
+          <w:lang w:val="es-SV"/>
+        </w:rPr>
+        <w:t xml:space="preserve">Low: En este caso, esta funcionalidad se tiene que cumplir, pero no es de suma importancia, esta se puede dejar sin completar hasta la entrega, ya que no urge tanto. Sin embargo, si ha pasado una entrega, es muy probable que la prioridad de esta cambie y habría que enfocarse en ella en ese momento. </w:t>
+      </w:r>
+    </w:p>
+    <w:p>
+      <w:pPr>
+        <w:rPr>
+          <w:rFonts w:ascii="Arial" w:eastAsiaTheme="majorEastAsia" w:hAnsi="Arial" w:cs="Arial"/>
+          <w:lang w:val="es-SV"/>
+        </w:rPr>
+      </w:pPr>
+      <w:bookmarkStart w:id="19" w:name="_Toc224298483"/>
+      <w:r>
+        <w:rPr>
+          <w:rFonts w:ascii="Arial" w:eastAsiaTheme="majorEastAsia" w:hAnsi="Arial" w:cs="Arial"/>
+          <w:lang w:val="es-SV"/>
+        </w:rPr>
+        <w:t xml:space="preserve">Uso de </w:t>
+      </w:r>
+      <w:proofErr w:type="spellStart"/>
+      <w:r>
+        <w:rPr>
+          <w:rFonts w:ascii="Arial" w:eastAsiaTheme="majorEastAsia" w:hAnsi="Arial" w:cs="Arial"/>
+          <w:lang w:val="es-SV"/>
+        </w:rPr>
+        <w:t>type</w:t>
+      </w:r>
+      <w:proofErr w:type="spellEnd"/>
+      <w:r>
+        <w:rPr>
+          <w:rFonts w:ascii="Arial" w:eastAsiaTheme="majorEastAsia" w:hAnsi="Arial" w:cs="Arial"/>
+          <w:lang w:val="es-SV"/>
+        </w:rPr>
+        <w:t xml:space="preserve"> en el tablero</w:t>
+      </w:r>
+      <w:bookmarkEnd w:id="19"/>
+    </w:p>
+    <w:p>
+      <w:pPr>
+        <w:rPr>
+          <w:rFonts w:ascii="Arial" w:eastAsiaTheme="majorEastAsia" w:hAnsi="Arial" w:cs="Arial"/>
+          <w:lang w:val="es-SV"/>
+        </w:rPr>
+      </w:pPr>
+      <w:r>
+        <w:rPr>
+          <w:rFonts w:ascii="Arial" w:eastAsiaTheme="majorEastAsia" w:hAnsi="Arial" w:cs="Arial"/>
+          <w:lang w:val="es-SV"/>
+        </w:rPr>
+        <w:t xml:space="preserve">Estaremos lidiando con las distintas partes necesarias para crear una página web (como las bases de datos, </w:t>
+      </w:r>
+      <w:proofErr w:type="spellStart"/>
+      <w:r>
+        <w:rPr>
+          <w:rFonts w:ascii="Arial" w:eastAsiaTheme="majorEastAsia" w:hAnsi="Arial" w:cs="Arial"/>
+          <w:lang w:val="es-SV"/>
+        </w:rPr>
+        <w:t>front</w:t>
+      </w:r>
+      <w:proofErr w:type="spellEnd"/>
+      <w:r>
+        <w:rPr>
+          <w:rFonts w:ascii="Arial" w:eastAsiaTheme="majorEastAsia" w:hAnsi="Arial" w:cs="Arial"/>
+          <w:lang w:val="es-SV"/>
+        </w:rPr>
+        <w:t xml:space="preserve"> </w:t>
+      </w:r>
+      <w:proofErr w:type="spellStart"/>
+      <w:r>
+        <w:rPr>
+          <w:rFonts w:ascii="Arial" w:eastAsiaTheme="majorEastAsia" w:hAnsi="Arial" w:cs="Arial"/>
+          <w:lang w:val="es-SV"/>
+        </w:rPr>
+        <w:t>end</w:t>
+      </w:r>
+      <w:proofErr w:type="spellEnd"/>
+      <w:r>
+        <w:rPr>
+          <w:rFonts w:ascii="Arial" w:eastAsiaTheme="majorEastAsia" w:hAnsi="Arial" w:cs="Arial"/>
+          <w:lang w:val="es-SV"/>
+        </w:rPr>
+        <w:t xml:space="preserve"> o back </w:t>
+      </w:r>
+      <w:proofErr w:type="spellStart"/>
+      <w:r>
+        <w:rPr>
+          <w:rFonts w:ascii="Arial" w:eastAsiaTheme="majorEastAsia" w:hAnsi="Arial" w:cs="Arial"/>
+          <w:lang w:val="es-SV"/>
+        </w:rPr>
+        <w:t>end</w:t>
+      </w:r>
+      <w:proofErr w:type="spellEnd"/>
+      <w:r>
+        <w:rPr>
+          <w:rFonts w:ascii="Arial" w:eastAsiaTheme="majorEastAsia" w:hAnsi="Arial" w:cs="Arial"/>
+          <w:lang w:val="es-SV"/>
+        </w:rPr>
+        <w:t xml:space="preserve">), por lo que este campo se enfocara en especificar en que se enfoca cada una de las respectivas tareas. Nos enfocaremos en las siguientes características: </w:t>
+      </w:r>
+    </w:p>
+    <w:p>
+      <w:pPr>
+        <w:numPr>
+          <w:ilvl w:val="0"/>
+          <w:numId w:val="12"/>
+        </w:numPr>
+        <w:rPr>
+          <w:rFonts w:ascii="Arial" w:eastAsiaTheme="majorEastAsia" w:hAnsi="Arial" w:cs="Arial"/>
+          <w:lang w:val="es-SV"/>
+        </w:rPr>
+      </w:pPr>
+      <w:proofErr w:type="spellStart"/>
+      <w:r>
+        <w:rPr>
+          <w:rFonts w:ascii="Arial" w:eastAsiaTheme="majorEastAsia" w:hAnsi="Arial" w:cs="Arial"/>
+          <w:lang w:val="es-SV"/>
+        </w:rPr>
+        <w:t>Documentation</w:t>
+      </w:r>
+      <w:proofErr w:type="spellEnd"/>
+      <w:r>
+        <w:rPr>
+          <w:rFonts w:ascii="Arial" w:eastAsiaTheme="majorEastAsia" w:hAnsi="Arial" w:cs="Arial"/>
+          <w:lang w:val="es-SV"/>
+        </w:rPr>
+        <w:t xml:space="preserve">: La respectiva tarea tiene que ver con la documentación que entregaremos cada mes. </w:t>
+      </w:r>
+    </w:p>
+    <w:p>
+      <w:pPr>
+        <w:numPr>
+          <w:ilvl w:val="0"/>
+          <w:numId w:val="12"/>
+        </w:numPr>
+        <w:rPr>
+          <w:rFonts w:ascii="Arial" w:eastAsiaTheme="majorEastAsia" w:hAnsi="Arial" w:cs="Arial"/>
+          <w:lang w:val="es-SV"/>
+        </w:rPr>
+      </w:pPr>
+      <w:proofErr w:type="spellStart"/>
+      <w:r>
+        <w:rPr>
+          <w:rFonts w:ascii="Arial" w:eastAsiaTheme="majorEastAsia" w:hAnsi="Arial" w:cs="Arial"/>
+          <w:lang w:val="es-SV"/>
+        </w:rPr>
+        <w:t>Database</w:t>
+      </w:r>
+      <w:proofErr w:type="spellEnd"/>
+      <w:r>
+        <w:rPr>
+          <w:rFonts w:ascii="Arial" w:eastAsiaTheme="majorEastAsia" w:hAnsi="Arial" w:cs="Arial"/>
+          <w:lang w:val="es-SV"/>
+        </w:rPr>
+        <w:t xml:space="preserve">: La tarea está involucrada con la base de datos. </w:t>
+      </w:r>
+    </w:p>
+    <w:p>
+      <w:pPr>
+        <w:numPr>
+          <w:ilvl w:val="0"/>
+          <w:numId w:val="12"/>
+        </w:numPr>
+        <w:rPr>
+          <w:rFonts w:ascii="Arial" w:eastAsiaTheme="majorEastAsia" w:hAnsi="Arial" w:cs="Arial"/>
+          <w:lang w:val="es-SV"/>
+        </w:rPr>
+      </w:pPr>
+      <w:r>
+        <w:rPr>
+          <w:rFonts w:ascii="Arial" w:eastAsiaTheme="majorEastAsia" w:hAnsi="Arial" w:cs="Arial"/>
+          <w:lang w:val="es-SV"/>
+        </w:rPr>
+        <w:t xml:space="preserve">Front </w:t>
+      </w:r>
+      <w:proofErr w:type="spellStart"/>
+      <w:r>
+        <w:rPr>
+          <w:rFonts w:ascii="Arial" w:eastAsiaTheme="majorEastAsia" w:hAnsi="Arial" w:cs="Arial"/>
+          <w:lang w:val="es-SV"/>
+        </w:rPr>
+        <w:t>end</w:t>
+      </w:r>
+      <w:proofErr w:type="spellEnd"/>
+      <w:r>
+        <w:rPr>
+          <w:rFonts w:ascii="Arial" w:eastAsiaTheme="majorEastAsia" w:hAnsi="Arial" w:cs="Arial"/>
+          <w:lang w:val="es-SV"/>
+        </w:rPr>
+        <w:t xml:space="preserve">: La tarea está involucrada con el </w:t>
+      </w:r>
+      <w:proofErr w:type="spellStart"/>
+      <w:r>
+        <w:rPr>
+          <w:rFonts w:ascii="Arial" w:eastAsiaTheme="majorEastAsia" w:hAnsi="Arial" w:cs="Arial"/>
+          <w:lang w:val="es-SV"/>
+        </w:rPr>
+        <w:t>front</w:t>
+      </w:r>
+      <w:proofErr w:type="spellEnd"/>
+      <w:r>
+        <w:rPr>
+          <w:rFonts w:ascii="Arial" w:eastAsiaTheme="majorEastAsia" w:hAnsi="Arial" w:cs="Arial"/>
+          <w:lang w:val="es-SV"/>
+        </w:rPr>
+        <w:t xml:space="preserve"> </w:t>
+      </w:r>
+      <w:proofErr w:type="spellStart"/>
+      <w:r>
+        <w:rPr>
+          <w:rFonts w:ascii="Arial" w:eastAsiaTheme="majorEastAsia" w:hAnsi="Arial" w:cs="Arial"/>
+          <w:lang w:val="es-SV"/>
+        </w:rPr>
+        <w:t>end</w:t>
+      </w:r>
+      <w:proofErr w:type="spellEnd"/>
+      <w:r>
+        <w:rPr>
+          <w:rFonts w:ascii="Arial" w:eastAsiaTheme="majorEastAsia" w:hAnsi="Arial" w:cs="Arial"/>
+          <w:lang w:val="es-SV"/>
+        </w:rPr>
+        <w:t xml:space="preserve"> del sitio web y cómo se verá el sitio a los usuarios. </w:t>
+      </w:r>
+    </w:p>
+    <w:p>
+      <w:pPr>
+        <w:numPr>
+          <w:ilvl w:val="0"/>
+          <w:numId w:val="12"/>
+        </w:numPr>
+        <w:rPr>
+          <w:rFonts w:ascii="Arial" w:eastAsiaTheme="majorEastAsia" w:hAnsi="Arial" w:cs="Arial"/>
+          <w:lang w:val="es-SV"/>
+        </w:rPr>
+      </w:pPr>
+      <w:r>
+        <w:rPr>
+          <w:rFonts w:ascii="Arial" w:eastAsiaTheme="majorEastAsia" w:hAnsi="Arial" w:cs="Arial"/>
+          <w:lang w:val="es-SV"/>
+        </w:rPr>
+        <w:t xml:space="preserve">Back </w:t>
+      </w:r>
+      <w:proofErr w:type="spellStart"/>
+      <w:r>
+        <w:rPr>
+          <w:rFonts w:ascii="Arial" w:eastAsiaTheme="majorEastAsia" w:hAnsi="Arial" w:cs="Arial"/>
+          <w:lang w:val="es-SV"/>
+        </w:rPr>
+        <w:t>end</w:t>
+      </w:r>
+      <w:proofErr w:type="spellEnd"/>
+      <w:r>
+        <w:rPr>
+          <w:rFonts w:ascii="Arial" w:eastAsiaTheme="majorEastAsia" w:hAnsi="Arial" w:cs="Arial"/>
+          <w:lang w:val="es-SV"/>
+        </w:rPr>
+        <w:t xml:space="preserve">: La tarea está involucrada con el back </w:t>
+      </w:r>
+      <w:proofErr w:type="spellStart"/>
+      <w:r>
+        <w:rPr>
+          <w:rFonts w:ascii="Arial" w:eastAsiaTheme="majorEastAsia" w:hAnsi="Arial" w:cs="Arial"/>
+          <w:lang w:val="es-SV"/>
+        </w:rPr>
+        <w:t>end</w:t>
+      </w:r>
+      <w:proofErr w:type="spellEnd"/>
+      <w:r>
+        <w:rPr>
+          <w:rFonts w:ascii="Arial" w:eastAsiaTheme="majorEastAsia" w:hAnsi="Arial" w:cs="Arial"/>
+          <w:lang w:val="es-SV"/>
+        </w:rPr>
+        <w:t xml:space="preserve"> del sitio web y en cómo se conecta la base de datos a nuestro sitio.  </w:t>
+      </w:r>
+    </w:p>
+    <w:p>
+      <w:pPr>
+        <w:numPr>
+          <w:ilvl w:val="0"/>
+          <w:numId w:val="12"/>
+        </w:numPr>
+        <w:rPr>
+          <w:rFonts w:ascii="Arial" w:eastAsiaTheme="majorEastAsia" w:hAnsi="Arial" w:cs="Arial"/>
+          <w:lang w:val="es-SV"/>
+        </w:rPr>
+      </w:pPr>
+      <w:r>
+        <w:rPr>
+          <w:rFonts w:ascii="Arial" w:eastAsiaTheme="majorEastAsia" w:hAnsi="Arial" w:cs="Arial"/>
+          <w:lang w:val="es-SV"/>
+        </w:rPr>
+        <w:t xml:space="preserve">Other: La tarea está involucrada en otro aspecto importante a la entrega pero que no encaja con los anteriores. </w:t>
+      </w:r>
+    </w:p>
+    <w:p>
+      <w:pPr>
+        <w:ind w:left="720"/>
+        <w:rPr>
+          <w:rFonts w:ascii="Arial" w:eastAsiaTheme="majorEastAsia" w:hAnsi="Arial" w:cs="Arial"/>
+          <w:lang w:val="es-SV"/>
+        </w:rPr>
+      </w:pPr>
+    </w:p>
+    <w:p>
+      <w:pPr>
+        <w:rPr>
+          <w:rFonts w:ascii="Arial" w:eastAsiaTheme="majorEastAsia" w:hAnsi="Arial" w:cs="Arial"/>
+          <w:lang w:val="es-SV"/>
+        </w:rPr>
+      </w:pPr>
+      <w:bookmarkStart w:id="20" w:name="_Toc224298484"/>
+      <w:r>
+        <w:rPr>
+          <w:rFonts w:ascii="Arial" w:eastAsiaTheme="majorEastAsia" w:hAnsi="Arial" w:cs="Arial"/>
+          <w:lang w:val="es-SV"/>
+        </w:rPr>
+        <w:lastRenderedPageBreak/>
+        <w:t xml:space="preserve">Uso de </w:t>
+      </w:r>
+      <w:proofErr w:type="spellStart"/>
+      <w:r>
+        <w:rPr>
+          <w:rFonts w:ascii="Arial" w:eastAsiaTheme="majorEastAsia" w:hAnsi="Arial" w:cs="Arial"/>
+          <w:lang w:val="es-SV"/>
+        </w:rPr>
+        <w:t>assignees</w:t>
+      </w:r>
+      <w:proofErr w:type="spellEnd"/>
+      <w:r>
+        <w:rPr>
+          <w:rFonts w:ascii="Arial" w:eastAsiaTheme="majorEastAsia" w:hAnsi="Arial" w:cs="Arial"/>
+          <w:lang w:val="es-SV"/>
+        </w:rPr>
+        <w:t xml:space="preserve"> en el tablero</w:t>
+      </w:r>
+      <w:bookmarkEnd w:id="20"/>
+    </w:p>
+    <w:p>
+      <w:pPr>
+        <w:rPr>
+          <w:rFonts w:ascii="Arial" w:eastAsiaTheme="majorEastAsia" w:hAnsi="Arial" w:cs="Arial"/>
+          <w:lang w:val="es-SV"/>
+        </w:rPr>
+      </w:pPr>
+      <w:r>
+        <w:rPr>
+          <w:rFonts w:ascii="Arial" w:eastAsiaTheme="majorEastAsia" w:hAnsi="Arial" w:cs="Arial"/>
+          <w:lang w:val="es-SV"/>
+        </w:rPr>
+        <w:t xml:space="preserve">Ya que el proyecto es grande y requiere de distintas partes, vamos a dividir cada una de las tareas entre nosotros. En este caso, vamos a dejar a una o más personas asignadas a cada tarea. De esta manera, sabemos quién está trabajando en que parte y se evita el error de que dos personas distintas estén haciendo la misma tarea de forma separada. </w:t>
+      </w:r>
+    </w:p>
+    <w:p>
+      <w:pPr>
         <w:pStyle w:val="Ttulo1"/>
         <w:spacing w:line="360" w:lineRule="auto"/>
         <w:rPr>
@@ -4217,7 +5495,8 @@
           <w:lang w:val="es-SV"/>
         </w:rPr>
       </w:pPr>
-      <w:bookmarkStart w:id="11" w:name="_Toc224570645"/>
+      <w:bookmarkStart w:id="21" w:name="_Toc224298485"/>
+      <w:bookmarkStart w:id="22" w:name="_Toc224570649"/>
       <w:r>
         <w:rPr>
           <w:rFonts w:ascii="Arial" w:hAnsi="Arial" w:cs="Arial"/>
@@ -4228,10 +5507,10 @@
           <w:szCs w:val="24"/>
           <w:lang w:val="es-SV"/>
         </w:rPr>
-        <w:lastRenderedPageBreak/>
-        <w:t>Diagramas TO-BE</w:t>
-      </w:r>
-      <w:bookmarkEnd w:id="11"/>
+        <w:t>Evidencia de aplicación</w:t>
+      </w:r>
+      <w:bookmarkEnd w:id="21"/>
+      <w:bookmarkEnd w:id="22"/>
     </w:p>
     <w:p>
       <w:pPr>
@@ -4244,7 +5523,8 @@
           <w:lang w:val="es-SV"/>
         </w:rPr>
       </w:pPr>
-      <w:bookmarkStart w:id="12" w:name="_Toc224570646"/>
+      <w:bookmarkStart w:id="23" w:name="_Toc224298486"/>
+      <w:bookmarkStart w:id="24" w:name="_Toc224570650"/>
       <w:r>
         <w:rPr>
           <w:rFonts w:ascii="Arial" w:hAnsi="Arial" w:cs="Arial"/>
@@ -4253,151 +5533,47 @@
           <w:szCs w:val="24"/>
           <w:lang w:val="es-SV"/>
         </w:rPr>
-        <w:t>Buscar un documento</w:t>
-      </w:r>
-      <w:bookmarkEnd w:id="12"/>
-    </w:p>
-    <w:p>
-      <w:pPr>
-        <w:jc w:val="center"/>
-        <w:rPr>
-          <w:rFonts w:ascii="Arial" w:hAnsi="Arial" w:cs="Arial"/>
-          <w:lang w:val="es-SV"/>
-        </w:rPr>
-      </w:pPr>
-      <w:r>
-        <w:rPr>
+        <w:t>Tablero</w:t>
+      </w:r>
+      <w:bookmarkEnd w:id="23"/>
+      <w:bookmarkEnd w:id="24"/>
+    </w:p>
+    <w:p>
+      <w:pPr>
+        <w:rPr>
+          <w:rFonts w:ascii="Arial" w:hAnsi="Arial" w:cs="Arial"/>
+          <w:lang w:val="es-SV"/>
+        </w:rPr>
+      </w:pPr>
+      <w:hyperlink r:id="rId16" w:history="1">
+        <w:r>
+          <w:rPr>
+            <w:rStyle w:val="Hipervnculo"/>
+            <w:rFonts w:ascii="Arial" w:hAnsi="Arial" w:cs="Arial"/>
+            <w:lang w:val="es-SV"/>
+          </w:rPr>
+          <w:t>https://github.com/users/2915762023/projects/1/</w:t>
+        </w:r>
+      </w:hyperlink>
+    </w:p>
+    <w:p>
+      <w:pPr>
+        <w:rPr>
+          <w:rFonts w:ascii="Arial" w:hAnsi="Arial" w:cs="Arial"/>
+          <w:lang w:val="es-SV"/>
+        </w:rPr>
+      </w:pPr>
+      <w:r>
+        <w:rPr>
+          <w:rFonts w:ascii="Arial" w:hAnsi="Arial" w:cs="Arial"/>
           <w:noProof/>
-          <w:lang w:val="es-SV" w:eastAsia="es-SV"/>
+          <w:lang w:val="es-SV"/>
         </w:rPr>
         <w:drawing>
-          <wp:inline distT="0" distB="0" distL="0" distR="0" wp14:anchorId="4225CF94" wp14:editId="3F992CD1">
-            <wp:extent cx="5159187" cy="5273497"/>
-            <wp:effectExtent l="0" t="0" r="3810" b="3810"/>
-            <wp:docPr id="11" name="Imagen 11"/>
-            <wp:cNvGraphicFramePr>
-              <a:graphicFrameLocks xmlns:a="http://schemas.openxmlformats.org/drawingml/2006/main" noChangeAspect="1"/>
-            </wp:cNvGraphicFramePr>
-            <a:graphic xmlns:a="http://schemas.openxmlformats.org/drawingml/2006/main">
-              <a:graphicData uri="http://schemas.openxmlformats.org/drawingml/2006/picture">
-                <pic:pic xmlns:pic="http://schemas.openxmlformats.org/drawingml/2006/picture">
-                  <pic:nvPicPr>
-                    <pic:cNvPr id="1" name=""/>
-                    <pic:cNvPicPr/>
-                  </pic:nvPicPr>
-                  <pic:blipFill>
-                    <a:blip r:embed="rId16"/>
-                    <a:stretch>
-                      <a:fillRect/>
-                    </a:stretch>
-                  </pic:blipFill>
-                  <pic:spPr>
-                    <a:xfrm>
-                      <a:off x="0" y="0"/>
-                      <a:ext cx="5159187" cy="5273497"/>
-                    </a:xfrm>
-                    <a:prstGeom prst="rect">
-                      <a:avLst/>
-                    </a:prstGeom>
-                  </pic:spPr>
-                </pic:pic>
-              </a:graphicData>
-            </a:graphic>
-          </wp:inline>
-        </w:drawing>
-      </w:r>
-    </w:p>
-    <w:p>
-      <w:pPr>
-        <w:rPr>
-          <w:rFonts w:ascii="Arial" w:hAnsi="Arial" w:cs="Arial"/>
-          <w:lang w:val="es-SV"/>
-        </w:rPr>
-      </w:pPr>
-    </w:p>
-    <w:p>
-      <w:pPr>
-        <w:rPr>
-          <w:rFonts w:ascii="Arial" w:hAnsi="Arial" w:cs="Arial"/>
-          <w:lang w:val="es-SV"/>
-        </w:rPr>
-      </w:pPr>
-    </w:p>
-    <w:p>
-      <w:pPr>
-        <w:rPr>
-          <w:rFonts w:ascii="Arial" w:hAnsi="Arial" w:cs="Arial"/>
-          <w:lang w:val="es-SV"/>
-        </w:rPr>
-      </w:pPr>
-    </w:p>
-    <w:p>
-      <w:pPr>
-        <w:rPr>
-          <w:rFonts w:ascii="Arial" w:hAnsi="Arial" w:cs="Arial"/>
-          <w:lang w:val="es-SV"/>
-        </w:rPr>
-      </w:pPr>
-    </w:p>
-    <w:p>
-      <w:pPr>
-        <w:rPr>
-          <w:rFonts w:ascii="Arial" w:hAnsi="Arial" w:cs="Arial"/>
-          <w:lang w:val="es-SV"/>
-        </w:rPr>
-      </w:pPr>
-    </w:p>
-    <w:p>
-      <w:pPr>
-        <w:rPr>
-          <w:rFonts w:ascii="Arial" w:hAnsi="Arial" w:cs="Arial"/>
-          <w:lang w:val="es-SV"/>
-        </w:rPr>
-      </w:pPr>
-    </w:p>
-    <w:p>
-      <w:pPr>
-        <w:pStyle w:val="Ttulo2"/>
-        <w:rPr>
-          <w:rFonts w:ascii="Arial" w:hAnsi="Arial" w:cs="Arial"/>
-          <w:color w:val="auto"/>
-          <w:sz w:val="24"/>
-          <w:szCs w:val="24"/>
-          <w:lang w:val="es-SV"/>
-        </w:rPr>
-      </w:pPr>
-      <w:bookmarkStart w:id="13" w:name="_Toc224570647"/>
-      <w:r>
-        <w:rPr>
-          <w:rFonts w:ascii="Arial" w:hAnsi="Arial" w:cs="Arial"/>
-          <w:color w:val="auto"/>
-          <w:sz w:val="24"/>
-          <w:szCs w:val="24"/>
-          <w:lang w:val="es-SV"/>
-        </w:rPr>
-        <w:lastRenderedPageBreak/>
-        <w:t>Subir un documento</w:t>
-      </w:r>
-      <w:bookmarkEnd w:id="13"/>
-    </w:p>
-    <w:p>
-      <w:pPr>
-        <w:jc w:val="center"/>
-        <w:rPr>
-          <w:rFonts w:ascii="Arial" w:hAnsi="Arial" w:cs="Arial"/>
-          <w:lang w:val="es-SV"/>
-        </w:rPr>
-      </w:pPr>
-      <w:r>
-        <w:rPr>
-          <w:noProof/>
-          <w:lang w:val="es-SV" w:eastAsia="es-SV"/>
-        </w:rPr>
-        <w:drawing>
-          <wp:inline distT="0" distB="0" distL="0" distR="0" wp14:anchorId="4CB784CB" wp14:editId="211C1BD7">
-            <wp:extent cx="5943600" cy="5568950"/>
+          <wp:inline distT="0" distB="0" distL="0" distR="0" wp14:anchorId="3F098D4F" wp14:editId="3423ED66">
+            <wp:extent cx="5943600" cy="2009140"/>
             <wp:effectExtent l="0" t="0" r="0" b="0"/>
-            <wp:docPr id="12" name="Imagen 12"/>
+            <wp:docPr id="1" name="Imagen 1"/>
             <wp:cNvGraphicFramePr>
               <a:graphicFrameLocks xmlns:a="http://schemas.openxmlformats.org/drawingml/2006/main" noChangeAspect="1"/>
             </wp:cNvGraphicFramePr>
@@ -4417,7 +5593,7 @@
                   <pic:spPr>
                     <a:xfrm>
                       <a:off x="0" y="0"/>
-                      <a:ext cx="5943600" cy="5568950"/>
+                      <a:ext cx="5943600" cy="2009140"/>
                     </a:xfrm>
                     <a:prstGeom prst="rect">
                       <a:avLst/>
@@ -4440,54 +5616,6 @@
     </w:p>
     <w:p>
       <w:pPr>
-        <w:rPr>
-          <w:rFonts w:ascii="Arial" w:hAnsi="Arial" w:cs="Arial"/>
-          <w:lang w:val="es-SV"/>
-        </w:rPr>
-      </w:pPr>
-    </w:p>
-    <w:p>
-      <w:pPr>
-        <w:rPr>
-          <w:rFonts w:ascii="Arial" w:hAnsi="Arial" w:cs="Arial"/>
-          <w:lang w:val="es-SV"/>
-        </w:rPr>
-      </w:pPr>
-    </w:p>
-    <w:p>
-      <w:pPr>
-        <w:rPr>
-          <w:rFonts w:ascii="Arial" w:hAnsi="Arial" w:cs="Arial"/>
-          <w:lang w:val="es-SV"/>
-        </w:rPr>
-      </w:pPr>
-    </w:p>
-    <w:p>
-      <w:pPr>
-        <w:rPr>
-          <w:rFonts w:ascii="Arial" w:hAnsi="Arial" w:cs="Arial"/>
-          <w:lang w:val="es-SV"/>
-        </w:rPr>
-      </w:pPr>
-    </w:p>
-    <w:p>
-      <w:pPr>
-        <w:rPr>
-          <w:rFonts w:ascii="Arial" w:hAnsi="Arial" w:cs="Arial"/>
-          <w:lang w:val="es-SV"/>
-        </w:rPr>
-      </w:pPr>
-    </w:p>
-    <w:p>
-      <w:pPr>
-        <w:rPr>
-          <w:rFonts w:ascii="Arial" w:hAnsi="Arial" w:cs="Arial"/>
-          <w:lang w:val="es-SV"/>
-        </w:rPr>
-      </w:pPr>
-    </w:p>
-    <w:p>
-      <w:pPr>
         <w:pStyle w:val="Ttulo2"/>
         <w:rPr>
           <w:rFonts w:ascii="Arial" w:hAnsi="Arial" w:cs="Arial"/>
@@ -4497,7 +5625,8 @@
           <w:lang w:val="es-SV"/>
         </w:rPr>
       </w:pPr>
-      <w:bookmarkStart w:id="14" w:name="_Toc224570648"/>
+      <w:bookmarkStart w:id="25" w:name="_Toc224298487"/>
+      <w:bookmarkStart w:id="26" w:name="_Toc224570651"/>
       <w:r>
         <w:rPr>
           <w:rFonts w:ascii="Arial" w:hAnsi="Arial" w:cs="Arial"/>
@@ -4506,29 +5635,41 @@
           <w:szCs w:val="24"/>
           <w:lang w:val="es-SV"/>
         </w:rPr>
-        <w:lastRenderedPageBreak/>
-        <w:t>Crear un nuevo usuario</w:t>
-      </w:r>
-      <w:bookmarkEnd w:id="14"/>
-    </w:p>
-    <w:p>
-      <w:pPr>
-        <w:jc w:val="center"/>
-        <w:rPr>
-          <w:rFonts w:ascii="Arial" w:hAnsi="Arial" w:cs="Arial"/>
-          <w:lang w:val="es-SV"/>
-        </w:rPr>
-      </w:pPr>
-      <w:r>
-        <w:rPr>
+        <w:t xml:space="preserve">Repositorio con </w:t>
+      </w:r>
+      <w:proofErr w:type="spellStart"/>
+      <w:r>
+        <w:rPr>
+          <w:rFonts w:ascii="Arial" w:hAnsi="Arial" w:cs="Arial"/>
+          <w:color w:val="auto"/>
+          <w:sz w:val="24"/>
+          <w:szCs w:val="24"/>
+          <w:lang w:val="es-SV"/>
+        </w:rPr>
+        <w:t>commits</w:t>
+      </w:r>
+      <w:bookmarkEnd w:id="25"/>
+      <w:bookmarkEnd w:id="26"/>
+      <w:proofErr w:type="spellEnd"/>
+    </w:p>
+    <w:p>
+      <w:pPr>
+        <w:rPr>
+          <w:rFonts w:ascii="Arial" w:hAnsi="Arial" w:cs="Arial"/>
+          <w:lang w:val="es-SV"/>
+        </w:rPr>
+      </w:pPr>
+      <w:r>
+        <w:rPr>
+          <w:rFonts w:ascii="Arial" w:hAnsi="Arial" w:cs="Arial"/>
           <w:noProof/>
           <w:lang w:val="es-SV" w:eastAsia="es-SV"/>
         </w:rPr>
         <w:drawing>
-          <wp:inline distT="0" distB="0" distL="0" distR="0" wp14:anchorId="5EC47ABE" wp14:editId="32A5AA8F">
-            <wp:extent cx="5532599" cy="5166808"/>
-            <wp:effectExtent l="0" t="0" r="0" b="0"/>
-            <wp:docPr id="13" name="Imagen 13"/>
+          <wp:inline distT="0" distB="0" distL="0" distR="0" wp14:anchorId="67F652E0" wp14:editId="3AB1CBC2">
+            <wp:extent cx="5943600" cy="2356485"/>
+            <wp:effectExtent l="0" t="0" r="0" b="5715"/>
+            <wp:docPr id="16" name="Imagen 16"/>
             <wp:cNvGraphicFramePr>
               <a:graphicFrameLocks xmlns:a="http://schemas.openxmlformats.org/drawingml/2006/main" noChangeAspect="1"/>
             </wp:cNvGraphicFramePr>
@@ -4548,7 +5689,7 @@
                   <pic:spPr>
                     <a:xfrm>
                       <a:off x="0" y="0"/>
-                      <a:ext cx="5532599" cy="5166808"/>
+                      <a:ext cx="5943600" cy="2356485"/>
                     </a:xfrm>
                     <a:prstGeom prst="rect">
                       <a:avLst/>
@@ -4571,1097 +5712,6 @@
     </w:p>
     <w:p>
       <w:pPr>
-        <w:rPr>
-          <w:rFonts w:ascii="Arial" w:hAnsi="Arial" w:cs="Arial"/>
-          <w:lang w:val="es-SV"/>
-        </w:rPr>
-      </w:pPr>
-    </w:p>
-    <w:p>
-      <w:pPr>
-        <w:rPr>
-          <w:rFonts w:ascii="Arial" w:hAnsi="Arial" w:cs="Arial"/>
-          <w:lang w:val="es-SV"/>
-        </w:rPr>
-      </w:pPr>
-    </w:p>
-    <w:p>
-      <w:pPr>
-        <w:rPr>
-          <w:rFonts w:ascii="Arial" w:hAnsi="Arial" w:cs="Arial"/>
-          <w:lang w:val="es-SV"/>
-        </w:rPr>
-      </w:pPr>
-    </w:p>
-    <w:p>
-      <w:pPr>
-        <w:rPr>
-          <w:rFonts w:ascii="Arial" w:hAnsi="Arial" w:cs="Arial"/>
-          <w:lang w:val="es-SV"/>
-        </w:rPr>
-      </w:pPr>
-    </w:p>
-    <w:p>
-      <w:pPr>
-        <w:rPr>
-          <w:rFonts w:ascii="Arial" w:hAnsi="Arial" w:cs="Arial"/>
-          <w:lang w:val="es-SV"/>
-        </w:rPr>
-      </w:pPr>
-    </w:p>
-    <w:p>
-      <w:pPr>
-        <w:rPr>
-          <w:rFonts w:ascii="Arial" w:hAnsi="Arial" w:cs="Arial"/>
-          <w:lang w:val="es-SV"/>
-        </w:rPr>
-      </w:pPr>
-    </w:p>
-    <w:p>
-      <w:pPr>
-        <w:rPr>
-          <w:rFonts w:ascii="Arial" w:hAnsi="Arial" w:cs="Arial"/>
-          <w:lang w:val="es-SV"/>
-        </w:rPr>
-      </w:pPr>
-    </w:p>
-    <w:p>
-      <w:pPr>
-        <w:rPr>
-          <w:rFonts w:ascii="Arial" w:hAnsi="Arial" w:cs="Arial"/>
-          <w:lang w:val="es-SV"/>
-        </w:rPr>
-      </w:pPr>
-    </w:p>
-    <w:p>
-      <w:pPr>
-        <w:rPr>
-          <w:rFonts w:ascii="Arial" w:eastAsiaTheme="majorEastAsia" w:hAnsi="Arial" w:cs="Arial"/>
-          <w:b/>
-          <w:bCs/>
-          <w:lang w:val="es-SV"/>
-        </w:rPr>
-      </w:pPr>
-      <w:bookmarkStart w:id="15" w:name="_Toc224298479"/>
-      <w:r>
-        <w:rPr>
-          <w:rFonts w:ascii="Arial" w:eastAsiaTheme="majorEastAsia" w:hAnsi="Arial" w:cs="Arial"/>
-          <w:b/>
-          <w:bCs/>
-          <w:lang w:val="es-SV"/>
-        </w:rPr>
-        <w:lastRenderedPageBreak/>
-        <w:t>Mejoras concretas</w:t>
-      </w:r>
-      <w:bookmarkEnd w:id="15"/>
-    </w:p>
-    <w:p>
-      <w:pPr>
-        <w:rPr>
-          <w:rFonts w:ascii="Arial" w:eastAsiaTheme="majorEastAsia" w:hAnsi="Arial" w:cs="Arial"/>
-          <w:lang w:val="es-SV"/>
-        </w:rPr>
-      </w:pPr>
-      <w:bookmarkStart w:id="16" w:name="_Toc224298480"/>
-      <w:r>
-        <w:rPr>
-          <w:rFonts w:ascii="Arial" w:eastAsiaTheme="majorEastAsia" w:hAnsi="Arial" w:cs="Arial"/>
-          <w:lang w:val="es-SV"/>
-        </w:rPr>
-        <w:t xml:space="preserve">Uso específico de </w:t>
-      </w:r>
-      <w:proofErr w:type="spellStart"/>
-      <w:r>
-        <w:rPr>
-          <w:rFonts w:ascii="Arial" w:eastAsiaTheme="majorEastAsia" w:hAnsi="Arial" w:cs="Arial"/>
-          <w:lang w:val="es-SV"/>
-        </w:rPr>
-        <w:t>commits</w:t>
-      </w:r>
-      <w:proofErr w:type="spellEnd"/>
-      <w:r>
-        <w:rPr>
-          <w:rFonts w:ascii="Arial" w:eastAsiaTheme="majorEastAsia" w:hAnsi="Arial" w:cs="Arial"/>
-          <w:lang w:val="es-SV"/>
-        </w:rPr>
-        <w:t xml:space="preserve"> en </w:t>
-      </w:r>
-      <w:proofErr w:type="spellStart"/>
-      <w:r>
-        <w:rPr>
-          <w:rFonts w:ascii="Arial" w:eastAsiaTheme="majorEastAsia" w:hAnsi="Arial" w:cs="Arial"/>
-          <w:lang w:val="es-SV"/>
-        </w:rPr>
-        <w:t>Github</w:t>
-      </w:r>
-      <w:bookmarkEnd w:id="16"/>
-      <w:proofErr w:type="spellEnd"/>
-    </w:p>
-    <w:p>
-      <w:pPr>
-        <w:rPr>
-          <w:rFonts w:ascii="Arial" w:eastAsiaTheme="majorEastAsia" w:hAnsi="Arial" w:cs="Arial"/>
-          <w:lang w:val="es-SV"/>
-        </w:rPr>
-      </w:pPr>
-      <w:r>
-        <w:rPr>
-          <w:rFonts w:ascii="Arial" w:eastAsiaTheme="majorEastAsia" w:hAnsi="Arial" w:cs="Arial"/>
-          <w:lang w:val="es-SV"/>
-        </w:rPr>
-        <w:t xml:space="preserve">Estaremos haciendo uso de lenguaje específico para </w:t>
-      </w:r>
-      <w:proofErr w:type="spellStart"/>
-      <w:r>
-        <w:rPr>
-          <w:rFonts w:ascii="Arial" w:eastAsiaTheme="majorEastAsia" w:hAnsi="Arial" w:cs="Arial"/>
-          <w:lang w:val="es-SV"/>
-        </w:rPr>
-        <w:t>commits</w:t>
-      </w:r>
-      <w:proofErr w:type="spellEnd"/>
-      <w:r>
-        <w:rPr>
-          <w:rFonts w:ascii="Arial" w:eastAsiaTheme="majorEastAsia" w:hAnsi="Arial" w:cs="Arial"/>
-          <w:lang w:val="es-SV"/>
-        </w:rPr>
-        <w:t xml:space="preserve"> en </w:t>
-      </w:r>
-      <w:proofErr w:type="spellStart"/>
-      <w:r>
-        <w:rPr>
-          <w:rFonts w:ascii="Arial" w:eastAsiaTheme="majorEastAsia" w:hAnsi="Arial" w:cs="Arial"/>
-          <w:lang w:val="es-SV"/>
-        </w:rPr>
-        <w:t>Github</w:t>
-      </w:r>
-      <w:proofErr w:type="spellEnd"/>
-      <w:r>
-        <w:rPr>
-          <w:rFonts w:ascii="Arial" w:eastAsiaTheme="majorEastAsia" w:hAnsi="Arial" w:cs="Arial"/>
-          <w:lang w:val="es-SV"/>
-        </w:rPr>
-        <w:t xml:space="preserve">, para que quede claro que es lo que se está modificando, agregando o eliminando en el repositorio. Estaremos ocupando las siguientes frases al inicio de cada </w:t>
-      </w:r>
-      <w:proofErr w:type="spellStart"/>
-      <w:r>
-        <w:rPr>
-          <w:rFonts w:ascii="Arial" w:eastAsiaTheme="majorEastAsia" w:hAnsi="Arial" w:cs="Arial"/>
-          <w:lang w:val="es-SV"/>
-        </w:rPr>
-        <w:t>commit</w:t>
-      </w:r>
-      <w:proofErr w:type="spellEnd"/>
-      <w:r>
-        <w:rPr>
-          <w:rFonts w:ascii="Arial" w:eastAsiaTheme="majorEastAsia" w:hAnsi="Arial" w:cs="Arial"/>
-          <w:lang w:val="es-SV"/>
-        </w:rPr>
-        <w:t>:</w:t>
-      </w:r>
-    </w:p>
-    <w:p>
-      <w:pPr>
-        <w:numPr>
-          <w:ilvl w:val="0"/>
-          <w:numId w:val="9"/>
-        </w:numPr>
-        <w:rPr>
-          <w:rFonts w:ascii="Arial" w:eastAsiaTheme="majorEastAsia" w:hAnsi="Arial" w:cs="Arial"/>
-          <w:lang w:val="es-SV"/>
-        </w:rPr>
-      </w:pPr>
-      <w:proofErr w:type="spellStart"/>
-      <w:r>
-        <w:rPr>
-          <w:rFonts w:ascii="Arial" w:eastAsiaTheme="majorEastAsia" w:hAnsi="Arial" w:cs="Arial"/>
-          <w:lang w:val="es-SV"/>
-        </w:rPr>
-        <w:t>Docs</w:t>
-      </w:r>
-      <w:proofErr w:type="spellEnd"/>
-      <w:r>
-        <w:rPr>
-          <w:rFonts w:ascii="Arial" w:eastAsiaTheme="majorEastAsia" w:hAnsi="Arial" w:cs="Arial"/>
-          <w:lang w:val="es-SV"/>
-        </w:rPr>
-        <w:t xml:space="preserve">: Cuando se está modificando, agregando o eliminando algo específico relacionado a la documentación. Nos enfocaremos en estos </w:t>
-      </w:r>
-      <w:proofErr w:type="spellStart"/>
-      <w:r>
-        <w:rPr>
-          <w:rFonts w:ascii="Arial" w:eastAsiaTheme="majorEastAsia" w:hAnsi="Arial" w:cs="Arial"/>
-          <w:lang w:val="es-SV"/>
-        </w:rPr>
-        <w:t>commits</w:t>
-      </w:r>
-      <w:proofErr w:type="spellEnd"/>
-      <w:r>
-        <w:rPr>
-          <w:rFonts w:ascii="Arial" w:eastAsiaTheme="majorEastAsia" w:hAnsi="Arial" w:cs="Arial"/>
-          <w:lang w:val="es-SV"/>
-        </w:rPr>
-        <w:t xml:space="preserve"> específicamente cuando nos enfoquemos en la documentación relacionadas a las entregas. </w:t>
-      </w:r>
-    </w:p>
-    <w:p>
-      <w:pPr>
-        <w:numPr>
-          <w:ilvl w:val="0"/>
-          <w:numId w:val="9"/>
-        </w:numPr>
-        <w:rPr>
-          <w:rFonts w:ascii="Arial" w:eastAsiaTheme="majorEastAsia" w:hAnsi="Arial" w:cs="Arial"/>
-          <w:lang w:val="es-SV"/>
-        </w:rPr>
-      </w:pPr>
-      <w:proofErr w:type="spellStart"/>
-      <w:r>
-        <w:rPr>
-          <w:rFonts w:ascii="Arial" w:eastAsiaTheme="majorEastAsia" w:hAnsi="Arial" w:cs="Arial"/>
-          <w:lang w:val="es-SV"/>
-        </w:rPr>
-        <w:t>Db</w:t>
-      </w:r>
-      <w:proofErr w:type="spellEnd"/>
-      <w:r>
-        <w:rPr>
-          <w:rFonts w:ascii="Arial" w:eastAsiaTheme="majorEastAsia" w:hAnsi="Arial" w:cs="Arial"/>
-          <w:lang w:val="es-SV"/>
-        </w:rPr>
-        <w:t xml:space="preserve">: Cuando se está agregando o eliminando una base de datos. No nos enfocaremos específicamente cuando se modifique una base de datos debido a que esto se realizara mucho cuando estemos probando el sitio web. </w:t>
-      </w:r>
-    </w:p>
-    <w:p>
-      <w:pPr>
-        <w:numPr>
-          <w:ilvl w:val="0"/>
-          <w:numId w:val="9"/>
-        </w:numPr>
-        <w:rPr>
-          <w:rFonts w:ascii="Arial" w:eastAsiaTheme="majorEastAsia" w:hAnsi="Arial" w:cs="Arial"/>
-          <w:lang w:val="es-SV"/>
-        </w:rPr>
-      </w:pPr>
-      <w:proofErr w:type="spellStart"/>
-      <w:r>
-        <w:rPr>
-          <w:rFonts w:ascii="Arial" w:eastAsiaTheme="majorEastAsia" w:hAnsi="Arial" w:cs="Arial"/>
-          <w:lang w:val="es-SV"/>
-        </w:rPr>
-        <w:t>Src</w:t>
-      </w:r>
-      <w:proofErr w:type="spellEnd"/>
-      <w:r>
-        <w:rPr>
-          <w:rFonts w:ascii="Arial" w:eastAsiaTheme="majorEastAsia" w:hAnsi="Arial" w:cs="Arial"/>
-          <w:lang w:val="es-SV"/>
-        </w:rPr>
-        <w:t xml:space="preserve">: Cuando estemos modificando, agregando o eliminando vistas del sitio web. Estos </w:t>
-      </w:r>
-      <w:proofErr w:type="spellStart"/>
-      <w:r>
-        <w:rPr>
-          <w:rFonts w:ascii="Arial" w:eastAsiaTheme="majorEastAsia" w:hAnsi="Arial" w:cs="Arial"/>
-          <w:lang w:val="es-SV"/>
-        </w:rPr>
-        <w:t>commits</w:t>
-      </w:r>
-      <w:proofErr w:type="spellEnd"/>
-      <w:r>
-        <w:rPr>
-          <w:rFonts w:ascii="Arial" w:eastAsiaTheme="majorEastAsia" w:hAnsi="Arial" w:cs="Arial"/>
-          <w:lang w:val="es-SV"/>
-        </w:rPr>
-        <w:t xml:space="preserve"> se enfocarán en los cambios que se realizan al sitio web. </w:t>
-      </w:r>
-    </w:p>
-    <w:p>
-      <w:pPr>
-        <w:rPr>
-          <w:rFonts w:ascii="Arial" w:eastAsiaTheme="majorEastAsia" w:hAnsi="Arial" w:cs="Arial"/>
-          <w:lang w:val="es-SV"/>
-        </w:rPr>
-      </w:pPr>
-      <w:r>
-        <w:rPr>
-          <w:rFonts w:ascii="Arial" w:eastAsiaTheme="majorEastAsia" w:hAnsi="Arial" w:cs="Arial"/>
-          <w:lang w:val="es-SV"/>
-        </w:rPr>
-        <w:t xml:space="preserve">Nuestra meta con esto, es que quede claro que hace cada </w:t>
-      </w:r>
-      <w:proofErr w:type="spellStart"/>
-      <w:r>
-        <w:rPr>
-          <w:rFonts w:ascii="Arial" w:eastAsiaTheme="majorEastAsia" w:hAnsi="Arial" w:cs="Arial"/>
-          <w:lang w:val="es-SV"/>
-        </w:rPr>
-        <w:t>commit</w:t>
-      </w:r>
-      <w:proofErr w:type="spellEnd"/>
-      <w:r>
-        <w:rPr>
-          <w:rFonts w:ascii="Arial" w:eastAsiaTheme="majorEastAsia" w:hAnsi="Arial" w:cs="Arial"/>
-          <w:lang w:val="es-SV"/>
-        </w:rPr>
-        <w:t xml:space="preserve"> para poder así tener una línea de tiempo de nuestros cambios y que pueda haber trazabilidad en nuestro proyecto. </w:t>
-      </w:r>
-    </w:p>
-    <w:p>
-      <w:pPr>
-        <w:rPr>
-          <w:rFonts w:ascii="Arial" w:eastAsiaTheme="majorEastAsia" w:hAnsi="Arial" w:cs="Arial"/>
-          <w:lang w:val="es-SV"/>
-        </w:rPr>
-      </w:pPr>
-    </w:p>
-    <w:p>
-      <w:pPr>
-        <w:rPr>
-          <w:rFonts w:ascii="Arial" w:eastAsiaTheme="majorEastAsia" w:hAnsi="Arial" w:cs="Arial"/>
-          <w:lang w:val="es-SV"/>
-        </w:rPr>
-      </w:pPr>
-      <w:bookmarkStart w:id="17" w:name="_Toc224298481"/>
-      <w:r>
-        <w:rPr>
-          <w:rFonts w:ascii="Arial" w:eastAsiaTheme="majorEastAsia" w:hAnsi="Arial" w:cs="Arial"/>
-          <w:lang w:val="es-SV"/>
-        </w:rPr>
-        <w:t>Uso de status en el tablero</w:t>
-      </w:r>
-      <w:bookmarkEnd w:id="17"/>
-    </w:p>
-    <w:p>
-      <w:pPr>
-        <w:rPr>
-          <w:rFonts w:ascii="Arial" w:eastAsiaTheme="majorEastAsia" w:hAnsi="Arial" w:cs="Arial"/>
-          <w:lang w:val="es-SV"/>
-        </w:rPr>
-      </w:pPr>
-      <w:r>
-        <w:rPr>
-          <w:rFonts w:ascii="Arial" w:eastAsiaTheme="majorEastAsia" w:hAnsi="Arial" w:cs="Arial"/>
-          <w:lang w:val="es-SV"/>
-        </w:rPr>
-        <w:t>Ya que estaremos ocupando un tablero para poder así tener un mejor manejo de las tareas de cada uno. En este caso estaremos ocupando un campo de status, el cual mostrara como va avanzando cada parte del proyecto. Nos enfocaremos en las siguientes características:</w:t>
-      </w:r>
-    </w:p>
-    <w:p>
-      <w:pPr>
-        <w:numPr>
-          <w:ilvl w:val="0"/>
-          <w:numId w:val="10"/>
-        </w:numPr>
-        <w:rPr>
-          <w:rFonts w:ascii="Arial" w:eastAsiaTheme="majorEastAsia" w:hAnsi="Arial" w:cs="Arial"/>
-          <w:lang w:val="es-SV"/>
-        </w:rPr>
-      </w:pPr>
-      <w:r>
-        <w:rPr>
-          <w:rFonts w:ascii="Arial" w:eastAsiaTheme="majorEastAsia" w:hAnsi="Arial" w:cs="Arial"/>
-          <w:lang w:val="es-SV"/>
-        </w:rPr>
-        <w:t>Todo: En este caso, se ha agregado al tablero algo que se tiene que hacer, sin embargo, aún no se ha empezado. Esto funciona para que tengamos una idea clara de que es lo que tenemos que hacer, aunque aún no se haya empezado.</w:t>
-      </w:r>
-    </w:p>
-    <w:p>
-      <w:pPr>
-        <w:numPr>
-          <w:ilvl w:val="0"/>
-          <w:numId w:val="10"/>
-        </w:numPr>
-        <w:rPr>
-          <w:rFonts w:ascii="Arial" w:eastAsiaTheme="majorEastAsia" w:hAnsi="Arial" w:cs="Arial"/>
-          <w:lang w:val="es-SV"/>
-        </w:rPr>
-      </w:pPr>
-      <w:r>
-        <w:rPr>
-          <w:rFonts w:ascii="Arial" w:eastAsiaTheme="majorEastAsia" w:hAnsi="Arial" w:cs="Arial"/>
-          <w:lang w:val="es-SV"/>
-        </w:rPr>
-        <w:t xml:space="preserve"> In </w:t>
-      </w:r>
-      <w:proofErr w:type="spellStart"/>
-      <w:r>
-        <w:rPr>
-          <w:rFonts w:ascii="Arial" w:eastAsiaTheme="majorEastAsia" w:hAnsi="Arial" w:cs="Arial"/>
-          <w:lang w:val="es-SV"/>
-        </w:rPr>
-        <w:t>progress</w:t>
-      </w:r>
-      <w:proofErr w:type="spellEnd"/>
-      <w:r>
-        <w:rPr>
-          <w:rFonts w:ascii="Arial" w:eastAsiaTheme="majorEastAsia" w:hAnsi="Arial" w:cs="Arial"/>
-          <w:lang w:val="es-SV"/>
-        </w:rPr>
-        <w:t xml:space="preserve">: En este caso, se ha empezado a trabajar en la funcionalidad o área específica. Esto demuestra que se está trabajando en ella pero que aún no se ha terminado. Por medio de esto queremos controlar como se va avanzando en el proyecto. </w:t>
-      </w:r>
-    </w:p>
-    <w:p>
-      <w:pPr>
-        <w:numPr>
-          <w:ilvl w:val="0"/>
-          <w:numId w:val="10"/>
-        </w:numPr>
-        <w:rPr>
-          <w:rFonts w:ascii="Arial" w:eastAsiaTheme="majorEastAsia" w:hAnsi="Arial" w:cs="Arial"/>
-          <w:lang w:val="es-SV"/>
-        </w:rPr>
-      </w:pPr>
-      <w:r>
-        <w:rPr>
-          <w:rFonts w:ascii="Arial" w:eastAsiaTheme="majorEastAsia" w:hAnsi="Arial" w:cs="Arial"/>
-          <w:lang w:val="es-SV"/>
-        </w:rPr>
-        <w:t xml:space="preserve">Done: En este caso, se ha terminado con la respectiva parte. Para poder poner algo en done, se tiene que haber hecho el respectivo </w:t>
-      </w:r>
-      <w:proofErr w:type="spellStart"/>
-      <w:r>
-        <w:rPr>
-          <w:rFonts w:ascii="Arial" w:eastAsiaTheme="majorEastAsia" w:hAnsi="Arial" w:cs="Arial"/>
-          <w:lang w:val="es-SV"/>
-        </w:rPr>
-        <w:t>commit</w:t>
-      </w:r>
-      <w:proofErr w:type="spellEnd"/>
-      <w:r>
-        <w:rPr>
-          <w:rFonts w:ascii="Arial" w:eastAsiaTheme="majorEastAsia" w:hAnsi="Arial" w:cs="Arial"/>
-          <w:lang w:val="es-SV"/>
-        </w:rPr>
-        <w:t xml:space="preserve"> en </w:t>
-      </w:r>
-      <w:proofErr w:type="spellStart"/>
-      <w:r>
-        <w:rPr>
-          <w:rFonts w:ascii="Arial" w:eastAsiaTheme="majorEastAsia" w:hAnsi="Arial" w:cs="Arial"/>
-          <w:lang w:val="es-SV"/>
-        </w:rPr>
-        <w:t>Github</w:t>
-      </w:r>
-      <w:proofErr w:type="spellEnd"/>
-      <w:r>
-        <w:rPr>
-          <w:rFonts w:ascii="Arial" w:eastAsiaTheme="majorEastAsia" w:hAnsi="Arial" w:cs="Arial"/>
-          <w:lang w:val="es-SV"/>
-        </w:rPr>
-        <w:t xml:space="preserve"> para poder así declarar que esa parte ya se terminó. </w:t>
-      </w:r>
-    </w:p>
-    <w:p>
-      <w:pPr>
-        <w:rPr>
-          <w:rFonts w:ascii="Arial" w:eastAsiaTheme="majorEastAsia" w:hAnsi="Arial" w:cs="Arial"/>
-          <w:lang w:val="es-SV"/>
-        </w:rPr>
-      </w:pPr>
-      <w:bookmarkStart w:id="18" w:name="_Toc224298482"/>
-      <w:r>
-        <w:rPr>
-          <w:rFonts w:ascii="Arial" w:eastAsiaTheme="majorEastAsia" w:hAnsi="Arial" w:cs="Arial"/>
-          <w:lang w:val="es-SV"/>
-        </w:rPr>
-        <w:lastRenderedPageBreak/>
-        <w:t xml:space="preserve">Uso de </w:t>
-      </w:r>
-      <w:proofErr w:type="spellStart"/>
-      <w:r>
-        <w:rPr>
-          <w:rFonts w:ascii="Arial" w:eastAsiaTheme="majorEastAsia" w:hAnsi="Arial" w:cs="Arial"/>
-          <w:lang w:val="es-SV"/>
-        </w:rPr>
-        <w:t>priorities</w:t>
-      </w:r>
-      <w:proofErr w:type="spellEnd"/>
-      <w:r>
-        <w:rPr>
-          <w:rFonts w:ascii="Arial" w:eastAsiaTheme="majorEastAsia" w:hAnsi="Arial" w:cs="Arial"/>
-          <w:lang w:val="es-SV"/>
-        </w:rPr>
-        <w:t xml:space="preserve"> en el tablero</w:t>
-      </w:r>
-      <w:bookmarkEnd w:id="18"/>
-    </w:p>
-    <w:p>
-      <w:pPr>
-        <w:rPr>
-          <w:rFonts w:ascii="Arial" w:eastAsiaTheme="majorEastAsia" w:hAnsi="Arial" w:cs="Arial"/>
-          <w:lang w:val="es-SV"/>
-        </w:rPr>
-      </w:pPr>
-      <w:r>
-        <w:rPr>
-          <w:rFonts w:ascii="Arial" w:eastAsiaTheme="majorEastAsia" w:hAnsi="Arial" w:cs="Arial"/>
-          <w:lang w:val="es-SV"/>
-        </w:rPr>
-        <w:t>Estaremos haciendo distintas tareas en todo el proyecto, las cuales pueden variar en su importancia y prioridad, para idear con esto, ocuparemos un campo con prioridades, el cual mostrara que es lo que más urge y lo que es menos importante. Nos enfocaremos en las siguientes características:</w:t>
-      </w:r>
-    </w:p>
-    <w:p>
-      <w:pPr>
-        <w:numPr>
-          <w:ilvl w:val="0"/>
-          <w:numId w:val="11"/>
-        </w:numPr>
-        <w:rPr>
-          <w:rFonts w:ascii="Arial" w:eastAsiaTheme="majorEastAsia" w:hAnsi="Arial" w:cs="Arial"/>
-          <w:lang w:val="es-SV"/>
-        </w:rPr>
-      </w:pPr>
-      <w:r>
-        <w:rPr>
-          <w:rFonts w:ascii="Arial" w:eastAsiaTheme="majorEastAsia" w:hAnsi="Arial" w:cs="Arial"/>
-          <w:lang w:val="es-SV"/>
-        </w:rPr>
-        <w:t>High: En este caso, esta funcionalidad es de las más importantes y urge que se complete lo más rápido posible. Esto puede ser porque es una base para que se agreguen otras partes (como una base de datos para tener una conexión a la base de datos) o porque es algo que se tiene que realizar antes de la siguiente entrega. Es de los más importante que se esto se complete lo más rápido posible y nos debemos enfocar en esto.</w:t>
-      </w:r>
-    </w:p>
-    <w:p>
-      <w:pPr>
-        <w:numPr>
-          <w:ilvl w:val="0"/>
-          <w:numId w:val="11"/>
-        </w:numPr>
-        <w:rPr>
-          <w:rFonts w:ascii="Arial" w:eastAsiaTheme="majorEastAsia" w:hAnsi="Arial" w:cs="Arial"/>
-          <w:lang w:val="es-SV"/>
-        </w:rPr>
-      </w:pPr>
-      <w:r>
-        <w:rPr>
-          <w:rFonts w:ascii="Arial" w:eastAsiaTheme="majorEastAsia" w:hAnsi="Arial" w:cs="Arial"/>
-          <w:lang w:val="es-SV"/>
-        </w:rPr>
-        <w:t xml:space="preserve">Medium: En este caso, esta funcionalidad es de mediana importancia y tiene que completarse, pero no urge tanto como otras funcionalidades. Es importante que esta se cumpla antes de la entrega, pero es aún más importante que se cumplan las de </w:t>
-      </w:r>
-      <w:proofErr w:type="spellStart"/>
-      <w:r>
-        <w:rPr>
-          <w:rFonts w:ascii="Arial" w:eastAsiaTheme="majorEastAsia" w:hAnsi="Arial" w:cs="Arial"/>
-          <w:lang w:val="es-SV"/>
-        </w:rPr>
-        <w:t>high</w:t>
-      </w:r>
-      <w:proofErr w:type="spellEnd"/>
-      <w:r>
-        <w:rPr>
-          <w:rFonts w:ascii="Arial" w:eastAsiaTheme="majorEastAsia" w:hAnsi="Arial" w:cs="Arial"/>
-          <w:lang w:val="es-SV"/>
-        </w:rPr>
-        <w:t xml:space="preserve"> primero. </w:t>
-      </w:r>
-    </w:p>
-    <w:p>
-      <w:pPr>
-        <w:numPr>
-          <w:ilvl w:val="0"/>
-          <w:numId w:val="11"/>
-        </w:numPr>
-        <w:rPr>
-          <w:rFonts w:ascii="Arial" w:eastAsiaTheme="majorEastAsia" w:hAnsi="Arial" w:cs="Arial"/>
-          <w:lang w:val="es-SV"/>
-        </w:rPr>
-      </w:pPr>
-      <w:r>
-        <w:rPr>
-          <w:rFonts w:ascii="Arial" w:eastAsiaTheme="majorEastAsia" w:hAnsi="Arial" w:cs="Arial"/>
-          <w:lang w:val="es-SV"/>
-        </w:rPr>
-        <w:t xml:space="preserve">Low: En este caso, esta funcionalidad se tiene que cumplir, pero no es de suma importancia, esta se puede dejar sin completar hasta la entrega, ya que no urge tanto. Sin embargo, si ha pasado una entrega, es muy probable que la prioridad de esta cambie y habría que enfocarse en ella en ese momento. </w:t>
-      </w:r>
-    </w:p>
-    <w:p>
-      <w:pPr>
-        <w:rPr>
-          <w:rFonts w:ascii="Arial" w:eastAsiaTheme="majorEastAsia" w:hAnsi="Arial" w:cs="Arial"/>
-          <w:lang w:val="es-SV"/>
-        </w:rPr>
-      </w:pPr>
-    </w:p>
-    <w:p>
-      <w:pPr>
-        <w:rPr>
-          <w:rFonts w:ascii="Arial" w:eastAsiaTheme="majorEastAsia" w:hAnsi="Arial" w:cs="Arial"/>
-          <w:lang w:val="es-SV"/>
-        </w:rPr>
-      </w:pPr>
-      <w:bookmarkStart w:id="19" w:name="_Toc224298483"/>
-      <w:r>
-        <w:rPr>
-          <w:rFonts w:ascii="Arial" w:eastAsiaTheme="majorEastAsia" w:hAnsi="Arial" w:cs="Arial"/>
-          <w:lang w:val="es-SV"/>
-        </w:rPr>
-        <w:t xml:space="preserve">Uso de </w:t>
-      </w:r>
-      <w:proofErr w:type="spellStart"/>
-      <w:r>
-        <w:rPr>
-          <w:rFonts w:ascii="Arial" w:eastAsiaTheme="majorEastAsia" w:hAnsi="Arial" w:cs="Arial"/>
-          <w:lang w:val="es-SV"/>
-        </w:rPr>
-        <w:t>type</w:t>
-      </w:r>
-      <w:proofErr w:type="spellEnd"/>
-      <w:r>
-        <w:rPr>
-          <w:rFonts w:ascii="Arial" w:eastAsiaTheme="majorEastAsia" w:hAnsi="Arial" w:cs="Arial"/>
-          <w:lang w:val="es-SV"/>
-        </w:rPr>
-        <w:t xml:space="preserve"> en el tablero</w:t>
-      </w:r>
-      <w:bookmarkEnd w:id="19"/>
-    </w:p>
-    <w:p>
-      <w:pPr>
-        <w:rPr>
-          <w:rFonts w:ascii="Arial" w:eastAsiaTheme="majorEastAsia" w:hAnsi="Arial" w:cs="Arial"/>
-          <w:lang w:val="es-SV"/>
-        </w:rPr>
-      </w:pPr>
-      <w:r>
-        <w:rPr>
-          <w:rFonts w:ascii="Arial" w:eastAsiaTheme="majorEastAsia" w:hAnsi="Arial" w:cs="Arial"/>
-          <w:lang w:val="es-SV"/>
-        </w:rPr>
-        <w:t xml:space="preserve">Estaremos lidiando con las distintas partes necesarias para crear una página web (como las bases de datos, </w:t>
-      </w:r>
-      <w:proofErr w:type="spellStart"/>
-      <w:r>
-        <w:rPr>
-          <w:rFonts w:ascii="Arial" w:eastAsiaTheme="majorEastAsia" w:hAnsi="Arial" w:cs="Arial"/>
-          <w:lang w:val="es-SV"/>
-        </w:rPr>
-        <w:t>front</w:t>
-      </w:r>
-      <w:proofErr w:type="spellEnd"/>
-      <w:r>
-        <w:rPr>
-          <w:rFonts w:ascii="Arial" w:eastAsiaTheme="majorEastAsia" w:hAnsi="Arial" w:cs="Arial"/>
-          <w:lang w:val="es-SV"/>
-        </w:rPr>
-        <w:t xml:space="preserve"> </w:t>
-      </w:r>
-      <w:proofErr w:type="spellStart"/>
-      <w:r>
-        <w:rPr>
-          <w:rFonts w:ascii="Arial" w:eastAsiaTheme="majorEastAsia" w:hAnsi="Arial" w:cs="Arial"/>
-          <w:lang w:val="es-SV"/>
-        </w:rPr>
-        <w:t>end</w:t>
-      </w:r>
-      <w:proofErr w:type="spellEnd"/>
-      <w:r>
-        <w:rPr>
-          <w:rFonts w:ascii="Arial" w:eastAsiaTheme="majorEastAsia" w:hAnsi="Arial" w:cs="Arial"/>
-          <w:lang w:val="es-SV"/>
-        </w:rPr>
-        <w:t xml:space="preserve"> o back </w:t>
-      </w:r>
-      <w:proofErr w:type="spellStart"/>
-      <w:r>
-        <w:rPr>
-          <w:rFonts w:ascii="Arial" w:eastAsiaTheme="majorEastAsia" w:hAnsi="Arial" w:cs="Arial"/>
-          <w:lang w:val="es-SV"/>
-        </w:rPr>
-        <w:t>end</w:t>
-      </w:r>
-      <w:proofErr w:type="spellEnd"/>
-      <w:r>
-        <w:rPr>
-          <w:rFonts w:ascii="Arial" w:eastAsiaTheme="majorEastAsia" w:hAnsi="Arial" w:cs="Arial"/>
-          <w:lang w:val="es-SV"/>
-        </w:rPr>
-        <w:t xml:space="preserve">), por lo que este campo se enfocara en especificar en que se enfoca cada una de las respectivas tareas. Nos enfocaremos en las siguientes características: </w:t>
-      </w:r>
-    </w:p>
-    <w:p>
-      <w:pPr>
-        <w:numPr>
-          <w:ilvl w:val="0"/>
-          <w:numId w:val="12"/>
-        </w:numPr>
-        <w:rPr>
-          <w:rFonts w:ascii="Arial" w:eastAsiaTheme="majorEastAsia" w:hAnsi="Arial" w:cs="Arial"/>
-          <w:lang w:val="es-SV"/>
-        </w:rPr>
-      </w:pPr>
-      <w:proofErr w:type="spellStart"/>
-      <w:r>
-        <w:rPr>
-          <w:rFonts w:ascii="Arial" w:eastAsiaTheme="majorEastAsia" w:hAnsi="Arial" w:cs="Arial"/>
-          <w:lang w:val="es-SV"/>
-        </w:rPr>
-        <w:t>Documentation</w:t>
-      </w:r>
-      <w:proofErr w:type="spellEnd"/>
-      <w:r>
-        <w:rPr>
-          <w:rFonts w:ascii="Arial" w:eastAsiaTheme="majorEastAsia" w:hAnsi="Arial" w:cs="Arial"/>
-          <w:lang w:val="es-SV"/>
-        </w:rPr>
-        <w:t xml:space="preserve">: La respectiva tarea tiene que ver con la documentación que entregaremos cada mes. </w:t>
-      </w:r>
-    </w:p>
-    <w:p>
-      <w:pPr>
-        <w:numPr>
-          <w:ilvl w:val="0"/>
-          <w:numId w:val="12"/>
-        </w:numPr>
-        <w:rPr>
-          <w:rFonts w:ascii="Arial" w:eastAsiaTheme="majorEastAsia" w:hAnsi="Arial" w:cs="Arial"/>
-          <w:lang w:val="es-SV"/>
-        </w:rPr>
-      </w:pPr>
-      <w:proofErr w:type="spellStart"/>
-      <w:r>
-        <w:rPr>
-          <w:rFonts w:ascii="Arial" w:eastAsiaTheme="majorEastAsia" w:hAnsi="Arial" w:cs="Arial"/>
-          <w:lang w:val="es-SV"/>
-        </w:rPr>
-        <w:t>Database</w:t>
-      </w:r>
-      <w:proofErr w:type="spellEnd"/>
-      <w:r>
-        <w:rPr>
-          <w:rFonts w:ascii="Arial" w:eastAsiaTheme="majorEastAsia" w:hAnsi="Arial" w:cs="Arial"/>
-          <w:lang w:val="es-SV"/>
-        </w:rPr>
-        <w:t xml:space="preserve">: La tarea está involucrada con la base de datos. </w:t>
-      </w:r>
-    </w:p>
-    <w:p>
-      <w:pPr>
-        <w:numPr>
-          <w:ilvl w:val="0"/>
-          <w:numId w:val="12"/>
-        </w:numPr>
-        <w:rPr>
-          <w:rFonts w:ascii="Arial" w:eastAsiaTheme="majorEastAsia" w:hAnsi="Arial" w:cs="Arial"/>
-          <w:lang w:val="es-SV"/>
-        </w:rPr>
-      </w:pPr>
-      <w:r>
-        <w:rPr>
-          <w:rFonts w:ascii="Arial" w:eastAsiaTheme="majorEastAsia" w:hAnsi="Arial" w:cs="Arial"/>
-          <w:lang w:val="es-SV"/>
-        </w:rPr>
-        <w:t xml:space="preserve">Front </w:t>
-      </w:r>
-      <w:proofErr w:type="spellStart"/>
-      <w:r>
-        <w:rPr>
-          <w:rFonts w:ascii="Arial" w:eastAsiaTheme="majorEastAsia" w:hAnsi="Arial" w:cs="Arial"/>
-          <w:lang w:val="es-SV"/>
-        </w:rPr>
-        <w:t>end</w:t>
-      </w:r>
-      <w:proofErr w:type="spellEnd"/>
-      <w:r>
-        <w:rPr>
-          <w:rFonts w:ascii="Arial" w:eastAsiaTheme="majorEastAsia" w:hAnsi="Arial" w:cs="Arial"/>
-          <w:lang w:val="es-SV"/>
-        </w:rPr>
-        <w:t xml:space="preserve">: La tarea está involucrada con el </w:t>
-      </w:r>
-      <w:proofErr w:type="spellStart"/>
-      <w:r>
-        <w:rPr>
-          <w:rFonts w:ascii="Arial" w:eastAsiaTheme="majorEastAsia" w:hAnsi="Arial" w:cs="Arial"/>
-          <w:lang w:val="es-SV"/>
-        </w:rPr>
-        <w:t>front</w:t>
-      </w:r>
-      <w:proofErr w:type="spellEnd"/>
-      <w:r>
-        <w:rPr>
-          <w:rFonts w:ascii="Arial" w:eastAsiaTheme="majorEastAsia" w:hAnsi="Arial" w:cs="Arial"/>
-          <w:lang w:val="es-SV"/>
-        </w:rPr>
-        <w:t xml:space="preserve"> </w:t>
-      </w:r>
-      <w:proofErr w:type="spellStart"/>
-      <w:r>
-        <w:rPr>
-          <w:rFonts w:ascii="Arial" w:eastAsiaTheme="majorEastAsia" w:hAnsi="Arial" w:cs="Arial"/>
-          <w:lang w:val="es-SV"/>
-        </w:rPr>
-        <w:t>end</w:t>
-      </w:r>
-      <w:proofErr w:type="spellEnd"/>
-      <w:r>
-        <w:rPr>
-          <w:rFonts w:ascii="Arial" w:eastAsiaTheme="majorEastAsia" w:hAnsi="Arial" w:cs="Arial"/>
-          <w:lang w:val="es-SV"/>
-        </w:rPr>
-        <w:t xml:space="preserve"> del sitio web y cómo se verá el sitio a los usuarios. </w:t>
-      </w:r>
-    </w:p>
-    <w:p>
-      <w:pPr>
-        <w:numPr>
-          <w:ilvl w:val="0"/>
-          <w:numId w:val="12"/>
-        </w:numPr>
-        <w:rPr>
-          <w:rFonts w:ascii="Arial" w:eastAsiaTheme="majorEastAsia" w:hAnsi="Arial" w:cs="Arial"/>
-          <w:lang w:val="es-SV"/>
-        </w:rPr>
-      </w:pPr>
-      <w:r>
-        <w:rPr>
-          <w:rFonts w:ascii="Arial" w:eastAsiaTheme="majorEastAsia" w:hAnsi="Arial" w:cs="Arial"/>
-          <w:lang w:val="es-SV"/>
-        </w:rPr>
-        <w:t xml:space="preserve">Back </w:t>
-      </w:r>
-      <w:proofErr w:type="spellStart"/>
-      <w:r>
-        <w:rPr>
-          <w:rFonts w:ascii="Arial" w:eastAsiaTheme="majorEastAsia" w:hAnsi="Arial" w:cs="Arial"/>
-          <w:lang w:val="es-SV"/>
-        </w:rPr>
-        <w:t>end</w:t>
-      </w:r>
-      <w:proofErr w:type="spellEnd"/>
-      <w:r>
-        <w:rPr>
-          <w:rFonts w:ascii="Arial" w:eastAsiaTheme="majorEastAsia" w:hAnsi="Arial" w:cs="Arial"/>
-          <w:lang w:val="es-SV"/>
-        </w:rPr>
-        <w:t xml:space="preserve">: La tarea está involucrada con el back </w:t>
-      </w:r>
-      <w:proofErr w:type="spellStart"/>
-      <w:r>
-        <w:rPr>
-          <w:rFonts w:ascii="Arial" w:eastAsiaTheme="majorEastAsia" w:hAnsi="Arial" w:cs="Arial"/>
-          <w:lang w:val="es-SV"/>
-        </w:rPr>
-        <w:t>end</w:t>
-      </w:r>
-      <w:proofErr w:type="spellEnd"/>
-      <w:r>
-        <w:rPr>
-          <w:rFonts w:ascii="Arial" w:eastAsiaTheme="majorEastAsia" w:hAnsi="Arial" w:cs="Arial"/>
-          <w:lang w:val="es-SV"/>
-        </w:rPr>
-        <w:t xml:space="preserve"> del sitio web y en cómo se conecta la base de datos a nuestro sitio.  </w:t>
-      </w:r>
-    </w:p>
-    <w:p>
-      <w:pPr>
-        <w:numPr>
-          <w:ilvl w:val="0"/>
-          <w:numId w:val="12"/>
-        </w:numPr>
-        <w:rPr>
-          <w:rFonts w:ascii="Arial" w:eastAsiaTheme="majorEastAsia" w:hAnsi="Arial" w:cs="Arial"/>
-          <w:lang w:val="es-SV"/>
-        </w:rPr>
-      </w:pPr>
-      <w:r>
-        <w:rPr>
-          <w:rFonts w:ascii="Arial" w:eastAsiaTheme="majorEastAsia" w:hAnsi="Arial" w:cs="Arial"/>
-          <w:lang w:val="es-SV"/>
-        </w:rPr>
-        <w:t xml:space="preserve">Other: La tarea está involucrada en otro aspecto importante a la entrega pero que no encaja con los anteriores. </w:t>
-      </w:r>
-    </w:p>
-    <w:p>
-      <w:pPr>
-        <w:rPr>
-          <w:rFonts w:ascii="Arial" w:eastAsiaTheme="majorEastAsia" w:hAnsi="Arial" w:cs="Arial"/>
-          <w:lang w:val="es-SV"/>
-        </w:rPr>
-      </w:pPr>
-      <w:bookmarkStart w:id="20" w:name="_Toc224298484"/>
-      <w:r>
-        <w:rPr>
-          <w:rFonts w:ascii="Arial" w:eastAsiaTheme="majorEastAsia" w:hAnsi="Arial" w:cs="Arial"/>
-          <w:lang w:val="es-SV"/>
-        </w:rPr>
-        <w:lastRenderedPageBreak/>
-        <w:t xml:space="preserve">Uso de </w:t>
-      </w:r>
-      <w:proofErr w:type="spellStart"/>
-      <w:r>
-        <w:rPr>
-          <w:rFonts w:ascii="Arial" w:eastAsiaTheme="majorEastAsia" w:hAnsi="Arial" w:cs="Arial"/>
-          <w:lang w:val="es-SV"/>
-        </w:rPr>
-        <w:t>assignees</w:t>
-      </w:r>
-      <w:proofErr w:type="spellEnd"/>
-      <w:r>
-        <w:rPr>
-          <w:rFonts w:ascii="Arial" w:eastAsiaTheme="majorEastAsia" w:hAnsi="Arial" w:cs="Arial"/>
-          <w:lang w:val="es-SV"/>
-        </w:rPr>
-        <w:t xml:space="preserve"> en el tablero</w:t>
-      </w:r>
-      <w:bookmarkEnd w:id="20"/>
-    </w:p>
-    <w:p>
-      <w:pPr>
-        <w:rPr>
-          <w:rFonts w:ascii="Arial" w:eastAsiaTheme="majorEastAsia" w:hAnsi="Arial" w:cs="Arial"/>
-          <w:lang w:val="es-SV"/>
-        </w:rPr>
-      </w:pPr>
-      <w:r>
-        <w:rPr>
-          <w:rFonts w:ascii="Arial" w:eastAsiaTheme="majorEastAsia" w:hAnsi="Arial" w:cs="Arial"/>
-          <w:lang w:val="es-SV"/>
-        </w:rPr>
-        <w:t xml:space="preserve">Ya que el proyecto es grande y requiere de distintas partes, vamos a dividir cada una de las tareas entre nosotros. En este caso, vamos a dejar a una o más personas asignadas a cada tarea. De esta manera, sabemos quién está trabajando en que parte y se evita el error de que dos personas distintas estén haciendo la misma tarea de forma separada. </w:t>
-      </w:r>
-    </w:p>
-    <w:p>
-      <w:pPr>
-        <w:rPr>
-          <w:lang w:val="es-SV"/>
-        </w:rPr>
-      </w:pPr>
-    </w:p>
-    <w:p>
-      <w:pPr>
-        <w:rPr>
-          <w:lang w:val="es-SV"/>
-        </w:rPr>
-      </w:pPr>
-    </w:p>
-    <w:p>
-      <w:pPr>
-        <w:rPr>
-          <w:lang w:val="es-SV"/>
-        </w:rPr>
-      </w:pPr>
-    </w:p>
-    <w:p>
-      <w:pPr>
-        <w:rPr>
-          <w:lang w:val="es-SV"/>
-        </w:rPr>
-      </w:pPr>
-    </w:p>
-    <w:p>
-      <w:pPr>
-        <w:rPr>
-          <w:lang w:val="es-SV"/>
-        </w:rPr>
-      </w:pPr>
-    </w:p>
-    <w:p>
-      <w:pPr>
-        <w:rPr>
-          <w:lang w:val="es-SV"/>
-        </w:rPr>
-      </w:pPr>
-    </w:p>
-    <w:p>
-      <w:pPr>
-        <w:rPr>
-          <w:lang w:val="es-SV"/>
-        </w:rPr>
-      </w:pPr>
-    </w:p>
-    <w:p>
-      <w:pPr>
-        <w:rPr>
-          <w:lang w:val="es-SV"/>
-        </w:rPr>
-      </w:pPr>
-    </w:p>
-    <w:p>
-      <w:pPr>
-        <w:rPr>
-          <w:lang w:val="es-SV"/>
-        </w:rPr>
-      </w:pPr>
-    </w:p>
-    <w:p>
-      <w:pPr>
-        <w:rPr>
-          <w:lang w:val="es-SV"/>
-        </w:rPr>
-      </w:pPr>
-    </w:p>
-    <w:p>
-      <w:pPr>
-        <w:rPr>
-          <w:lang w:val="es-SV"/>
-        </w:rPr>
-      </w:pPr>
-    </w:p>
-    <w:p>
-      <w:pPr>
-        <w:rPr>
-          <w:lang w:val="es-SV"/>
-        </w:rPr>
-      </w:pPr>
-    </w:p>
-    <w:p>
-      <w:pPr>
-        <w:rPr>
-          <w:lang w:val="es-SV"/>
-        </w:rPr>
-      </w:pPr>
-    </w:p>
-    <w:p>
-      <w:pPr>
-        <w:rPr>
-          <w:lang w:val="es-SV"/>
-        </w:rPr>
-      </w:pPr>
-    </w:p>
-    <w:p>
-      <w:pPr>
-        <w:rPr>
-          <w:lang w:val="es-SV"/>
-        </w:rPr>
-      </w:pPr>
-    </w:p>
-    <w:p>
-      <w:pPr>
-        <w:rPr>
-          <w:lang w:val="es-SV"/>
-        </w:rPr>
-      </w:pPr>
-    </w:p>
-    <w:p>
-      <w:pPr>
-        <w:rPr>
-          <w:lang w:val="es-SV"/>
-        </w:rPr>
-      </w:pPr>
-    </w:p>
-    <w:p>
-      <w:pPr>
-        <w:rPr>
-          <w:lang w:val="es-SV"/>
-        </w:rPr>
-      </w:pPr>
-    </w:p>
-    <w:p>
-      <w:pPr>
-        <w:rPr>
-          <w:lang w:val="es-SV"/>
-        </w:rPr>
-      </w:pPr>
-    </w:p>
-    <w:p>
-      <w:pPr>
-        <w:rPr>
-          <w:lang w:val="es-SV"/>
-        </w:rPr>
-      </w:pPr>
-    </w:p>
-    <w:p>
-      <w:pPr>
         <w:pStyle w:val="Ttulo1"/>
         <w:spacing w:line="360" w:lineRule="auto"/>
         <w:rPr>
@@ -5674,8 +5724,7 @@
           <w:lang w:val="es-SV"/>
         </w:rPr>
       </w:pPr>
-      <w:bookmarkStart w:id="21" w:name="_Toc224298485"/>
-      <w:bookmarkStart w:id="22" w:name="_Toc224570649"/>
+      <w:bookmarkStart w:id="27" w:name="_Toc224570652"/>
       <w:r>
         <w:rPr>
           <w:rFonts w:ascii="Arial" w:hAnsi="Arial" w:cs="Arial"/>
@@ -5687,42 +5736,30 @@
           <w:lang w:val="es-SV"/>
         </w:rPr>
         <w:lastRenderedPageBreak/>
-        <w:t>Evidencia de aplicación</w:t>
-      </w:r>
-      <w:bookmarkEnd w:id="21"/>
-      <w:bookmarkEnd w:id="22"/>
-    </w:p>
-    <w:p>
-      <w:pPr>
-        <w:pStyle w:val="Ttulo2"/>
-        <w:rPr>
-          <w:rFonts w:ascii="Arial" w:hAnsi="Arial" w:cs="Arial"/>
+        <w:t xml:space="preserve">Repositorio de </w:t>
+      </w:r>
+      <w:proofErr w:type="spellStart"/>
+      <w:r>
+        <w:rPr>
+          <w:rFonts w:ascii="Arial" w:hAnsi="Arial" w:cs="Arial"/>
+          <w:b/>
+          <w:bCs/>
           <w:color w:val="auto"/>
           <w:sz w:val="24"/>
           <w:szCs w:val="24"/>
           <w:lang w:val="es-SV"/>
         </w:rPr>
-      </w:pPr>
-      <w:bookmarkStart w:id="23" w:name="_Toc224298486"/>
-      <w:bookmarkStart w:id="24" w:name="_Toc224570650"/>
-      <w:r>
-        <w:rPr>
-          <w:rFonts w:ascii="Arial" w:hAnsi="Arial" w:cs="Arial"/>
-          <w:color w:val="auto"/>
-          <w:sz w:val="24"/>
-          <w:szCs w:val="24"/>
-          <w:lang w:val="es-SV"/>
-        </w:rPr>
-        <w:t>Tablero</w:t>
-      </w:r>
-      <w:bookmarkEnd w:id="23"/>
-      <w:bookmarkEnd w:id="24"/>
-    </w:p>
-    <w:p>
-      <w:pPr>
-        <w:rPr>
-          <w:rFonts w:ascii="Arial" w:hAnsi="Arial" w:cs="Arial"/>
-          <w:lang w:val="es-SV"/>
+        <w:t>Github</w:t>
+      </w:r>
+      <w:bookmarkEnd w:id="27"/>
+      <w:proofErr w:type="spellEnd"/>
+    </w:p>
+    <w:p>
+      <w:pPr>
+        <w:jc w:val="center"/>
+        <w:rPr>
+          <w:rFonts w:ascii="Arial" w:hAnsi="Arial" w:cs="Arial"/>
+          <w:lang w:val="es-ES"/>
         </w:rPr>
       </w:pPr>
       <w:hyperlink r:id="rId19" w:history="1">
@@ -5730,9 +5767,10 @@
           <w:rPr>
             <w:rStyle w:val="Hipervnculo"/>
             <w:rFonts w:ascii="Arial" w:hAnsi="Arial" w:cs="Arial"/>
-            <w:lang w:val="es-SV"/>
+            <w:color w:val="auto"/>
+            <w:lang w:val="es-ES"/>
           </w:rPr>
-          <w:t>https://github.com/users/2915762023/projects/1/</w:t>
+          <w:t>https://github.com/2915762023/EPRO_Grupo09_PlataformadeGestionDocumentalconVersiones</w:t>
         </w:r>
       </w:hyperlink>
     </w:p>
@@ -5743,16 +5781,230 @@
           <w:lang w:val="es-SV"/>
         </w:rPr>
       </w:pPr>
-      <w:r>
-        <w:rPr>
-          <w:rFonts w:ascii="Arial" w:hAnsi="Arial" w:cs="Arial"/>
-          <w:lang w:val="es-SV"/>
+    </w:p>
+    <w:p>
+      <w:pPr>
+        <w:rPr>
+          <w:rFonts w:ascii="Arial" w:hAnsi="Arial" w:cs="Arial"/>
+          <w:lang w:val="es-SV"/>
+        </w:rPr>
+      </w:pPr>
+    </w:p>
+    <w:p>
+      <w:pPr>
+        <w:rPr>
+          <w:rFonts w:ascii="Arial" w:hAnsi="Arial" w:cs="Arial"/>
+          <w:lang w:val="es-SV"/>
+        </w:rPr>
+      </w:pPr>
+    </w:p>
+    <w:p>
+      <w:pPr>
+        <w:rPr>
+          <w:rFonts w:ascii="Arial" w:hAnsi="Arial" w:cs="Arial"/>
+          <w:lang w:val="es-SV"/>
+        </w:rPr>
+      </w:pPr>
+    </w:p>
+    <w:p>
+      <w:pPr>
+        <w:rPr>
+          <w:rFonts w:ascii="Arial" w:hAnsi="Arial" w:cs="Arial"/>
+          <w:lang w:val="es-SV"/>
+        </w:rPr>
+      </w:pPr>
+    </w:p>
+    <w:p>
+      <w:pPr>
+        <w:rPr>
+          <w:rFonts w:ascii="Arial" w:hAnsi="Arial" w:cs="Arial"/>
+          <w:lang w:val="es-SV"/>
+        </w:rPr>
+      </w:pPr>
+    </w:p>
+    <w:p>
+      <w:pPr>
+        <w:rPr>
+          <w:rFonts w:ascii="Arial" w:hAnsi="Arial" w:cs="Arial"/>
+          <w:lang w:val="es-SV"/>
+        </w:rPr>
+      </w:pPr>
+    </w:p>
+    <w:p>
+      <w:pPr>
+        <w:rPr>
+          <w:rFonts w:ascii="Arial" w:hAnsi="Arial" w:cs="Arial"/>
+          <w:lang w:val="es-SV"/>
+        </w:rPr>
+      </w:pPr>
+    </w:p>
+    <w:p>
+      <w:pPr>
+        <w:rPr>
+          <w:rFonts w:ascii="Arial" w:hAnsi="Arial" w:cs="Arial"/>
+          <w:lang w:val="es-SV"/>
+        </w:rPr>
+      </w:pPr>
+    </w:p>
+    <w:p>
+      <w:pPr>
+        <w:rPr>
+          <w:rFonts w:ascii="Arial" w:hAnsi="Arial" w:cs="Arial"/>
+          <w:lang w:val="es-SV"/>
+        </w:rPr>
+      </w:pPr>
+    </w:p>
+    <w:p>
+      <w:pPr>
+        <w:rPr>
+          <w:rFonts w:ascii="Arial" w:hAnsi="Arial" w:cs="Arial"/>
+          <w:lang w:val="es-SV"/>
+        </w:rPr>
+      </w:pPr>
+    </w:p>
+    <w:p>
+      <w:pPr>
+        <w:rPr>
+          <w:rFonts w:ascii="Arial" w:hAnsi="Arial" w:cs="Arial"/>
+          <w:lang w:val="es-SV"/>
+        </w:rPr>
+      </w:pPr>
+    </w:p>
+    <w:p>
+      <w:pPr>
+        <w:rPr>
+          <w:rFonts w:ascii="Arial" w:hAnsi="Arial" w:cs="Arial"/>
+          <w:lang w:val="es-SV"/>
+        </w:rPr>
+      </w:pPr>
+    </w:p>
+    <w:p>
+      <w:pPr>
+        <w:rPr>
+          <w:rFonts w:ascii="Arial" w:hAnsi="Arial" w:cs="Arial"/>
+          <w:lang w:val="es-SV"/>
+        </w:rPr>
+      </w:pPr>
+    </w:p>
+    <w:p>
+      <w:pPr>
+        <w:rPr>
+          <w:rFonts w:ascii="Arial" w:hAnsi="Arial" w:cs="Arial"/>
+          <w:lang w:val="es-SV"/>
+        </w:rPr>
+      </w:pPr>
+    </w:p>
+    <w:p>
+      <w:pPr>
+        <w:rPr>
+          <w:rFonts w:ascii="Arial" w:hAnsi="Arial" w:cs="Arial"/>
+          <w:lang w:val="es-SV"/>
+        </w:rPr>
+      </w:pPr>
+    </w:p>
+    <w:p>
+      <w:pPr>
+        <w:rPr>
+          <w:rFonts w:ascii="Arial" w:hAnsi="Arial" w:cs="Arial"/>
+          <w:lang w:val="es-SV"/>
+        </w:rPr>
+      </w:pPr>
+    </w:p>
+    <w:p>
+      <w:pPr>
+        <w:rPr>
+          <w:rFonts w:ascii="Arial" w:hAnsi="Arial" w:cs="Arial"/>
+          <w:lang w:val="es-SV"/>
+        </w:rPr>
+      </w:pPr>
+    </w:p>
+    <w:p>
+      <w:pPr>
+        <w:rPr>
+          <w:rFonts w:ascii="Arial" w:hAnsi="Arial" w:cs="Arial"/>
+          <w:lang w:val="es-SV"/>
+        </w:rPr>
+      </w:pPr>
+    </w:p>
+    <w:p>
+      <w:pPr>
+        <w:rPr>
+          <w:rFonts w:ascii="Arial" w:hAnsi="Arial" w:cs="Arial"/>
+          <w:lang w:val="es-SV"/>
+        </w:rPr>
+      </w:pPr>
+    </w:p>
+    <w:p>
+      <w:pPr>
+        <w:rPr>
+          <w:rFonts w:ascii="Arial" w:hAnsi="Arial" w:cs="Arial"/>
+          <w:lang w:val="es-SV"/>
+        </w:rPr>
+      </w:pPr>
+    </w:p>
+    <w:p>
+      <w:pPr>
+        <w:rPr>
+          <w:rFonts w:ascii="Arial" w:hAnsi="Arial" w:cs="Arial"/>
+          <w:lang w:val="es-SV"/>
+        </w:rPr>
+      </w:pPr>
+    </w:p>
+    <w:p>
+      <w:pPr>
+        <w:rPr>
+          <w:rFonts w:ascii="Arial" w:hAnsi="Arial" w:cs="Arial"/>
+          <w:lang w:val="es-SV"/>
+        </w:rPr>
+      </w:pPr>
+    </w:p>
+    <w:p>
+      <w:pPr>
+        <w:pStyle w:val="Ttulo1"/>
+        <w:spacing w:line="360" w:lineRule="auto"/>
+        <w:rPr>
+          <w:rFonts w:ascii="Arial" w:hAnsi="Arial" w:cs="Arial"/>
+          <w:b/>
+          <w:bCs/>
+          <w:color w:val="auto"/>
+          <w:sz w:val="24"/>
+          <w:szCs w:val="24"/>
+          <w:lang w:val="es-SV"/>
+        </w:rPr>
+      </w:pPr>
+      <w:bookmarkStart w:id="28" w:name="_Toc224570653"/>
+      <w:r>
+        <w:rPr>
+          <w:rFonts w:ascii="Arial" w:hAnsi="Arial" w:cs="Arial"/>
+          <w:b/>
+          <w:bCs/>
+          <w:color w:val="auto"/>
+          <w:sz w:val="24"/>
+          <w:szCs w:val="24"/>
+          <w:lang w:val="es-SV"/>
+        </w:rPr>
+        <w:lastRenderedPageBreak/>
+        <w:t>Anexos</w:t>
+      </w:r>
+      <w:bookmarkEnd w:id="28"/>
+    </w:p>
+    <w:p>
+      <w:pPr>
+        <w:jc w:val="center"/>
+        <w:rPr>
+          <w:lang w:val="es-SV"/>
+        </w:rPr>
+      </w:pPr>
+      <w:r>
+        <w:rPr>
+          <w:noProof/>
+          <w:lang w:val="es-SV" w:eastAsia="es-SV"/>
         </w:rPr>
         <w:drawing>
-          <wp:inline distT="0" distB="0" distL="0" distR="0" wp14:anchorId="3F098D4F" wp14:editId="3423ED66">
-            <wp:extent cx="5943600" cy="2009140"/>
+          <wp:inline distT="0" distB="0" distL="0" distR="0" wp14:anchorId="6C9BA05A" wp14:editId="296382E6">
+            <wp:extent cx="4191000" cy="2310581"/>
             <wp:effectExtent l="0" t="0" r="0" b="0"/>
-            <wp:docPr id="1" name="Imagen 1"/>
+            <wp:docPr id="605903340" name="Imagen 605903340"/>
             <wp:cNvGraphicFramePr>
               <a:graphicFrameLocks xmlns:a="http://schemas.openxmlformats.org/drawingml/2006/main" noChangeAspect="1"/>
             </wp:cNvGraphicFramePr>
@@ -5772,7 +6024,7 @@
                   <pic:spPr>
                     <a:xfrm>
                       <a:off x="0" y="0"/>
-                      <a:ext cx="5943600" cy="2009140"/>
+                      <a:ext cx="4203316" cy="2317371"/>
                     </a:xfrm>
                     <a:prstGeom prst="rect">
                       <a:avLst/>
@@ -5787,68 +6039,29 @@
     </w:p>
     <w:p>
       <w:pPr>
-        <w:rPr>
-          <w:rFonts w:ascii="Arial" w:hAnsi="Arial" w:cs="Arial"/>
-          <w:lang w:val="es-SV"/>
-        </w:rPr>
-      </w:pPr>
-    </w:p>
-    <w:p>
-      <w:pPr>
-        <w:pStyle w:val="Ttulo2"/>
-        <w:rPr>
-          <w:rFonts w:ascii="Arial" w:hAnsi="Arial" w:cs="Arial"/>
-          <w:color w:val="auto"/>
-          <w:sz w:val="24"/>
-          <w:szCs w:val="24"/>
-          <w:lang w:val="es-SV"/>
-        </w:rPr>
-      </w:pPr>
-      <w:bookmarkStart w:id="25" w:name="_Toc224298487"/>
-      <w:bookmarkStart w:id="26" w:name="_Toc224570651"/>
-      <w:r>
-        <w:rPr>
-          <w:rFonts w:ascii="Arial" w:hAnsi="Arial" w:cs="Arial"/>
-          <w:color w:val="auto"/>
-          <w:sz w:val="24"/>
-          <w:szCs w:val="24"/>
-          <w:lang w:val="es-SV"/>
-        </w:rPr>
-        <w:t xml:space="preserve">Repositorio con </w:t>
-      </w:r>
-      <w:proofErr w:type="spellStart"/>
-      <w:r>
-        <w:rPr>
-          <w:rFonts w:ascii="Arial" w:hAnsi="Arial" w:cs="Arial"/>
-          <w:color w:val="auto"/>
-          <w:sz w:val="24"/>
-          <w:szCs w:val="24"/>
-          <w:lang w:val="es-SV"/>
-        </w:rPr>
-        <w:t>commits</w:t>
-      </w:r>
-      <w:bookmarkEnd w:id="25"/>
-      <w:bookmarkEnd w:id="26"/>
-      <w:proofErr w:type="spellEnd"/>
-    </w:p>
-    <w:p>
-      <w:pPr>
-        <w:rPr>
-          <w:rFonts w:ascii="Arial" w:hAnsi="Arial" w:cs="Arial"/>
-          <w:lang w:val="es-SV"/>
-        </w:rPr>
-      </w:pPr>
-      <w:r>
-        <w:rPr>
-          <w:rFonts w:ascii="Arial" w:hAnsi="Arial" w:cs="Arial"/>
+        <w:jc w:val="center"/>
+        <w:rPr>
+          <w:lang w:val="es-SV"/>
+        </w:rPr>
+      </w:pPr>
+    </w:p>
+    <w:p>
+      <w:pPr>
+        <w:jc w:val="center"/>
+        <w:rPr>
+          <w:lang w:val="es-SV"/>
+        </w:rPr>
+      </w:pPr>
+      <w:r>
+        <w:rPr>
           <w:noProof/>
           <w:lang w:val="es-SV" w:eastAsia="es-SV"/>
         </w:rPr>
         <w:drawing>
-          <wp:inline distT="0" distB="0" distL="0" distR="0" wp14:anchorId="67F652E0" wp14:editId="3AB1CBC2">
-            <wp:extent cx="5943600" cy="2356485"/>
-            <wp:effectExtent l="0" t="0" r="0" b="5715"/>
-            <wp:docPr id="16" name="Imagen 16"/>
+          <wp:inline distT="0" distB="0" distL="0" distR="0" wp14:anchorId="509D5525" wp14:editId="3ED846F5">
+            <wp:extent cx="4434840" cy="4125856"/>
+            <wp:effectExtent l="0" t="0" r="3810" b="8255"/>
+            <wp:docPr id="2" name="Imagen 2"/>
             <wp:cNvGraphicFramePr>
               <a:graphicFrameLocks xmlns:a="http://schemas.openxmlformats.org/drawingml/2006/main" noChangeAspect="1"/>
             </wp:cNvGraphicFramePr>
@@ -5868,7 +6081,7 @@
                   <pic:spPr>
                     <a:xfrm>
                       <a:off x="0" y="0"/>
-                      <a:ext cx="5943600" cy="2356485"/>
+                      <a:ext cx="4438423" cy="4129190"/>
                     </a:xfrm>
                     <a:prstGeom prst="rect">
                       <a:avLst/>
@@ -5884,342 +6097,264 @@
     <w:p>
       <w:pPr>
         <w:rPr>
-          <w:rFonts w:ascii="Arial" w:hAnsi="Arial" w:cs="Arial"/>
-          <w:lang w:val="es-SV"/>
-        </w:rPr>
-      </w:pPr>
-    </w:p>
-    <w:p>
-      <w:pPr>
-        <w:rPr>
-          <w:rFonts w:ascii="Arial" w:hAnsi="Arial" w:cs="Arial"/>
-          <w:lang w:val="es-SV"/>
-        </w:rPr>
-      </w:pPr>
-    </w:p>
-    <w:p>
-      <w:pPr>
-        <w:rPr>
-          <w:rFonts w:ascii="Arial" w:hAnsi="Arial" w:cs="Arial"/>
-          <w:lang w:val="es-SV"/>
-        </w:rPr>
-      </w:pPr>
-    </w:p>
-    <w:p>
-      <w:pPr>
-        <w:rPr>
-          <w:rFonts w:ascii="Arial" w:hAnsi="Arial" w:cs="Arial"/>
-          <w:lang w:val="es-SV"/>
-        </w:rPr>
-      </w:pPr>
-    </w:p>
-    <w:p>
-      <w:pPr>
-        <w:rPr>
-          <w:rFonts w:ascii="Arial" w:hAnsi="Arial" w:cs="Arial"/>
-          <w:lang w:val="es-SV"/>
-        </w:rPr>
-      </w:pPr>
-    </w:p>
-    <w:p>
-      <w:pPr>
-        <w:rPr>
-          <w:rFonts w:ascii="Arial" w:hAnsi="Arial" w:cs="Arial"/>
-          <w:lang w:val="es-SV"/>
-        </w:rPr>
-      </w:pPr>
-    </w:p>
-    <w:p>
-      <w:pPr>
-        <w:pStyle w:val="Ttulo1"/>
-        <w:spacing w:line="360" w:lineRule="auto"/>
-        <w:rPr>
-          <w:rFonts w:ascii="Arial" w:hAnsi="Arial" w:cs="Arial"/>
-          <w:b/>
-          <w:bCs/>
-          <w:color w:val="auto"/>
-          <w:sz w:val="24"/>
-          <w:szCs w:val="24"/>
-          <w:lang w:val="es-SV"/>
-        </w:rPr>
-      </w:pPr>
-      <w:bookmarkStart w:id="27" w:name="_Toc224570652"/>
-      <w:r>
-        <w:rPr>
-          <w:rFonts w:ascii="Arial" w:hAnsi="Arial" w:cs="Arial"/>
-          <w:b/>
-          <w:bCs/>
-          <w:color w:val="auto"/>
-          <w:sz w:val="24"/>
-          <w:szCs w:val="24"/>
-          <w:lang w:val="es-SV"/>
+          <w:lang w:val="es-SV"/>
+        </w:rPr>
+      </w:pPr>
+    </w:p>
+    <w:p>
+      <w:pPr>
+        <w:jc w:val="center"/>
+        <w:rPr>
+          <w:lang w:val="es-SV"/>
+        </w:rPr>
+      </w:pPr>
+      <w:r>
+        <w:rPr>
+          <w:noProof/>
+          <w:lang w:val="es-SV" w:eastAsia="es-SV"/>
         </w:rPr>
         <w:lastRenderedPageBreak/>
-        <w:t xml:space="preserve">Repositorio de </w:t>
-      </w:r>
-      <w:proofErr w:type="spellStart"/>
-      <w:r>
-        <w:rPr>
-          <w:rFonts w:ascii="Arial" w:hAnsi="Arial" w:cs="Arial"/>
-          <w:b/>
-          <w:bCs/>
-          <w:color w:val="auto"/>
-          <w:sz w:val="24"/>
-          <w:szCs w:val="24"/>
-          <w:lang w:val="es-SV"/>
-        </w:rPr>
-        <w:t>Github</w:t>
-      </w:r>
-      <w:bookmarkEnd w:id="27"/>
-      <w:proofErr w:type="spellEnd"/>
+        <w:drawing>
+          <wp:inline distT="0" distB="0" distL="0" distR="0" wp14:anchorId="2DFB7A5A" wp14:editId="23919847">
+            <wp:extent cx="4594860" cy="2255145"/>
+            <wp:effectExtent l="0" t="0" r="0" b="0"/>
+            <wp:docPr id="3" name="Imagen 3"/>
+            <wp:cNvGraphicFramePr>
+              <a:graphicFrameLocks xmlns:a="http://schemas.openxmlformats.org/drawingml/2006/main" noChangeAspect="1"/>
+            </wp:cNvGraphicFramePr>
+            <a:graphic xmlns:a="http://schemas.openxmlformats.org/drawingml/2006/main">
+              <a:graphicData uri="http://schemas.openxmlformats.org/drawingml/2006/picture">
+                <pic:pic xmlns:pic="http://schemas.openxmlformats.org/drawingml/2006/picture">
+                  <pic:nvPicPr>
+                    <pic:cNvPr id="1" name=""/>
+                    <pic:cNvPicPr/>
+                  </pic:nvPicPr>
+                  <pic:blipFill>
+                    <a:blip r:embed="rId22"/>
+                    <a:stretch>
+                      <a:fillRect/>
+                    </a:stretch>
+                  </pic:blipFill>
+                  <pic:spPr>
+                    <a:xfrm>
+                      <a:off x="0" y="0"/>
+                      <a:ext cx="4605289" cy="2260264"/>
+                    </a:xfrm>
+                    <a:prstGeom prst="rect">
+                      <a:avLst/>
+                    </a:prstGeom>
+                  </pic:spPr>
+                </pic:pic>
+              </a:graphicData>
+            </a:graphic>
+          </wp:inline>
+        </w:drawing>
+      </w:r>
     </w:p>
     <w:p>
       <w:pPr>
         <w:jc w:val="center"/>
         <w:rPr>
-          <w:rFonts w:ascii="Arial" w:hAnsi="Arial" w:cs="Arial"/>
-          <w:lang w:val="es-ES"/>
-        </w:rPr>
-      </w:pPr>
-      <w:hyperlink r:id="rId22" w:history="1">
-        <w:r>
-          <w:rPr>
-            <w:rStyle w:val="Hipervnculo"/>
-            <w:rFonts w:ascii="Arial" w:hAnsi="Arial" w:cs="Arial"/>
-            <w:color w:val="auto"/>
-            <w:lang w:val="es-ES"/>
-          </w:rPr>
-          <w:t>https://github.com/2915762023/EPRO_Grupo09_PlataformadeGestionDocumentalconVersiones</w:t>
-        </w:r>
-      </w:hyperlink>
-    </w:p>
-    <w:p>
-      <w:pPr>
-        <w:rPr>
-          <w:rFonts w:ascii="Arial" w:hAnsi="Arial" w:cs="Arial"/>
-          <w:lang w:val="es-SV"/>
-        </w:rPr>
-      </w:pPr>
-    </w:p>
-    <w:p>
-      <w:pPr>
-        <w:rPr>
-          <w:rFonts w:ascii="Arial" w:hAnsi="Arial" w:cs="Arial"/>
-          <w:lang w:val="es-SV"/>
-        </w:rPr>
-      </w:pPr>
-    </w:p>
-    <w:p>
-      <w:pPr>
-        <w:rPr>
-          <w:rFonts w:ascii="Arial" w:hAnsi="Arial" w:cs="Arial"/>
-          <w:lang w:val="es-SV"/>
-        </w:rPr>
-      </w:pPr>
-    </w:p>
-    <w:p>
-      <w:pPr>
-        <w:rPr>
-          <w:rFonts w:ascii="Arial" w:hAnsi="Arial" w:cs="Arial"/>
-          <w:lang w:val="es-SV"/>
-        </w:rPr>
-      </w:pPr>
-    </w:p>
-    <w:p>
-      <w:pPr>
-        <w:rPr>
-          <w:rFonts w:ascii="Arial" w:hAnsi="Arial" w:cs="Arial"/>
-          <w:lang w:val="es-SV"/>
-        </w:rPr>
-      </w:pPr>
-    </w:p>
-    <w:p>
-      <w:pPr>
-        <w:rPr>
-          <w:rFonts w:ascii="Arial" w:hAnsi="Arial" w:cs="Arial"/>
-          <w:lang w:val="es-SV"/>
-        </w:rPr>
-      </w:pPr>
-    </w:p>
-    <w:p>
-      <w:pPr>
-        <w:rPr>
-          <w:rFonts w:ascii="Arial" w:hAnsi="Arial" w:cs="Arial"/>
-          <w:lang w:val="es-SV"/>
-        </w:rPr>
-      </w:pPr>
-    </w:p>
-    <w:p>
-      <w:pPr>
-        <w:rPr>
-          <w:rFonts w:ascii="Arial" w:hAnsi="Arial" w:cs="Arial"/>
-          <w:lang w:val="es-SV"/>
-        </w:rPr>
-      </w:pPr>
-    </w:p>
-    <w:p>
-      <w:pPr>
-        <w:rPr>
-          <w:rFonts w:ascii="Arial" w:hAnsi="Arial" w:cs="Arial"/>
-          <w:lang w:val="es-SV"/>
-        </w:rPr>
-      </w:pPr>
-    </w:p>
-    <w:p>
-      <w:pPr>
-        <w:rPr>
-          <w:rFonts w:ascii="Arial" w:hAnsi="Arial" w:cs="Arial"/>
-          <w:lang w:val="es-SV"/>
-        </w:rPr>
-      </w:pPr>
-    </w:p>
-    <w:p>
-      <w:pPr>
-        <w:rPr>
-          <w:rFonts w:ascii="Arial" w:hAnsi="Arial" w:cs="Arial"/>
-          <w:lang w:val="es-SV"/>
-        </w:rPr>
-      </w:pPr>
-    </w:p>
-    <w:p>
-      <w:pPr>
-        <w:rPr>
-          <w:rFonts w:ascii="Arial" w:hAnsi="Arial" w:cs="Arial"/>
-          <w:lang w:val="es-SV"/>
-        </w:rPr>
-      </w:pPr>
-    </w:p>
-    <w:p>
-      <w:pPr>
-        <w:rPr>
-          <w:rFonts w:ascii="Arial" w:hAnsi="Arial" w:cs="Arial"/>
-          <w:lang w:val="es-SV"/>
-        </w:rPr>
-      </w:pPr>
-    </w:p>
-    <w:p>
-      <w:pPr>
-        <w:rPr>
-          <w:rFonts w:ascii="Arial" w:hAnsi="Arial" w:cs="Arial"/>
-          <w:lang w:val="es-SV"/>
-        </w:rPr>
-      </w:pPr>
-    </w:p>
-    <w:p>
-      <w:pPr>
-        <w:rPr>
-          <w:rFonts w:ascii="Arial" w:hAnsi="Arial" w:cs="Arial"/>
-          <w:lang w:val="es-SV"/>
-        </w:rPr>
-      </w:pPr>
-    </w:p>
-    <w:p>
-      <w:pPr>
-        <w:rPr>
-          <w:rFonts w:ascii="Arial" w:hAnsi="Arial" w:cs="Arial"/>
-          <w:lang w:val="es-SV"/>
-        </w:rPr>
-      </w:pPr>
-    </w:p>
-    <w:p>
-      <w:pPr>
-        <w:rPr>
-          <w:rFonts w:ascii="Arial" w:hAnsi="Arial" w:cs="Arial"/>
-          <w:lang w:val="es-SV"/>
-        </w:rPr>
-      </w:pPr>
-    </w:p>
-    <w:p>
-      <w:pPr>
-        <w:rPr>
-          <w:rFonts w:ascii="Arial" w:hAnsi="Arial" w:cs="Arial"/>
-          <w:lang w:val="es-SV"/>
-        </w:rPr>
-      </w:pPr>
-    </w:p>
-    <w:p>
-      <w:pPr>
-        <w:rPr>
-          <w:rFonts w:ascii="Arial" w:hAnsi="Arial" w:cs="Arial"/>
-          <w:lang w:val="es-SV"/>
-        </w:rPr>
-      </w:pPr>
-    </w:p>
-    <w:p>
-      <w:pPr>
-        <w:rPr>
-          <w:rFonts w:ascii="Arial" w:hAnsi="Arial" w:cs="Arial"/>
-          <w:lang w:val="es-SV"/>
-        </w:rPr>
-      </w:pPr>
-    </w:p>
-    <w:p>
-      <w:pPr>
-        <w:rPr>
-          <w:rFonts w:ascii="Arial" w:hAnsi="Arial" w:cs="Arial"/>
-          <w:lang w:val="es-SV"/>
-        </w:rPr>
-      </w:pPr>
-    </w:p>
-    <w:p>
-      <w:pPr>
-        <w:rPr>
-          <w:rFonts w:ascii="Arial" w:hAnsi="Arial" w:cs="Arial"/>
-          <w:lang w:val="es-SV"/>
-        </w:rPr>
-      </w:pPr>
-    </w:p>
-    <w:p>
-      <w:pPr>
-        <w:rPr>
-          <w:rFonts w:ascii="Arial" w:hAnsi="Arial" w:cs="Arial"/>
-          <w:lang w:val="es-SV"/>
-        </w:rPr>
-      </w:pPr>
-    </w:p>
-    <w:p>
-      <w:pPr>
-        <w:pStyle w:val="Ttulo1"/>
-        <w:spacing w:line="360" w:lineRule="auto"/>
-        <w:rPr>
-          <w:rFonts w:ascii="Arial" w:hAnsi="Arial" w:cs="Arial"/>
-          <w:b/>
-          <w:bCs/>
-          <w:color w:val="auto"/>
-          <w:sz w:val="24"/>
-          <w:szCs w:val="24"/>
-          <w:lang w:val="es-SV"/>
-        </w:rPr>
-      </w:pPr>
-      <w:bookmarkStart w:id="28" w:name="_Toc224570653"/>
-      <w:r>
-        <w:rPr>
-          <w:rFonts w:ascii="Arial" w:hAnsi="Arial" w:cs="Arial"/>
-          <w:b/>
-          <w:bCs/>
-          <w:color w:val="auto"/>
-          <w:sz w:val="24"/>
-          <w:szCs w:val="24"/>
-          <w:lang w:val="es-SV"/>
+          <w:lang w:val="es-SV"/>
+        </w:rPr>
+      </w:pPr>
+      <w:r>
+        <w:rPr>
+          <w:noProof/>
+          <w:lang w:val="es-SV" w:eastAsia="es-SV"/>
+        </w:rPr>
+        <w:drawing>
+          <wp:inline distT="0" distB="0" distL="0" distR="0" wp14:anchorId="216EB60E" wp14:editId="2F4AEBFD">
+            <wp:extent cx="4739640" cy="4534164"/>
+            <wp:effectExtent l="0" t="0" r="3810" b="0"/>
+            <wp:docPr id="4" name="Imagen 4"/>
+            <wp:cNvGraphicFramePr>
+              <a:graphicFrameLocks xmlns:a="http://schemas.openxmlformats.org/drawingml/2006/main" noChangeAspect="1"/>
+            </wp:cNvGraphicFramePr>
+            <a:graphic xmlns:a="http://schemas.openxmlformats.org/drawingml/2006/main">
+              <a:graphicData uri="http://schemas.openxmlformats.org/drawingml/2006/picture">
+                <pic:pic xmlns:pic="http://schemas.openxmlformats.org/drawingml/2006/picture">
+                  <pic:nvPicPr>
+                    <pic:cNvPr id="1" name=""/>
+                    <pic:cNvPicPr/>
+                  </pic:nvPicPr>
+                  <pic:blipFill>
+                    <a:blip r:embed="rId23"/>
+                    <a:stretch>
+                      <a:fillRect/>
+                    </a:stretch>
+                  </pic:blipFill>
+                  <pic:spPr>
+                    <a:xfrm>
+                      <a:off x="0" y="0"/>
+                      <a:ext cx="4742505" cy="4536905"/>
+                    </a:xfrm>
+                    <a:prstGeom prst="rect">
+                      <a:avLst/>
+                    </a:prstGeom>
+                  </pic:spPr>
+                </pic:pic>
+              </a:graphicData>
+            </a:graphic>
+          </wp:inline>
+        </w:drawing>
+      </w:r>
+    </w:p>
+    <w:p>
+      <w:pPr>
+        <w:jc w:val="center"/>
+        <w:rPr>
+          <w:lang w:val="es-SV"/>
+        </w:rPr>
+      </w:pPr>
+      <w:r>
+        <w:rPr>
+          <w:noProof/>
+          <w:lang w:val="es-SV" w:eastAsia="es-SV"/>
         </w:rPr>
         <w:lastRenderedPageBreak/>
-        <w:t>An</w:t>
-      </w:r>
-      <w:bookmarkStart w:id="29" w:name="_GoBack"/>
-      <w:bookmarkEnd w:id="29"/>
-      <w:r>
-        <w:rPr>
-          <w:rFonts w:ascii="Arial" w:hAnsi="Arial" w:cs="Arial"/>
-          <w:b/>
-          <w:bCs/>
-          <w:color w:val="auto"/>
-          <w:sz w:val="24"/>
-          <w:szCs w:val="24"/>
-          <w:lang w:val="es-SV"/>
-        </w:rPr>
-        <w:t>exos</w:t>
-      </w:r>
-      <w:bookmarkEnd w:id="28"/>
+        <w:drawing>
+          <wp:inline distT="0" distB="0" distL="0" distR="0" wp14:anchorId="62C514F6" wp14:editId="3DC21D13">
+            <wp:extent cx="4617720" cy="2329054"/>
+            <wp:effectExtent l="0" t="0" r="0" b="0"/>
+            <wp:docPr id="5" name="Imagen 5"/>
+            <wp:cNvGraphicFramePr>
+              <a:graphicFrameLocks xmlns:a="http://schemas.openxmlformats.org/drawingml/2006/main" noChangeAspect="1"/>
+            </wp:cNvGraphicFramePr>
+            <a:graphic xmlns:a="http://schemas.openxmlformats.org/drawingml/2006/main">
+              <a:graphicData uri="http://schemas.openxmlformats.org/drawingml/2006/picture">
+                <pic:pic xmlns:pic="http://schemas.openxmlformats.org/drawingml/2006/picture">
+                  <pic:nvPicPr>
+                    <pic:cNvPr id="1" name=""/>
+                    <pic:cNvPicPr/>
+                  </pic:nvPicPr>
+                  <pic:blipFill>
+                    <a:blip r:embed="rId24"/>
+                    <a:stretch>
+                      <a:fillRect/>
+                    </a:stretch>
+                  </pic:blipFill>
+                  <pic:spPr>
+                    <a:xfrm>
+                      <a:off x="0" y="0"/>
+                      <a:ext cx="4628040" cy="2334259"/>
+                    </a:xfrm>
+                    <a:prstGeom prst="rect">
+                      <a:avLst/>
+                    </a:prstGeom>
+                  </pic:spPr>
+                </pic:pic>
+              </a:graphicData>
+            </a:graphic>
+          </wp:inline>
+        </w:drawing>
+      </w:r>
+    </w:p>
+    <w:p>
+      <w:pPr>
+        <w:jc w:val="center"/>
+        <w:rPr>
+          <w:lang w:val="es-SV"/>
+        </w:rPr>
+      </w:pPr>
+      <w:r>
+        <w:rPr>
+          <w:noProof/>
+          <w:lang w:val="es-SV" w:eastAsia="es-SV"/>
+        </w:rPr>
+        <w:drawing>
+          <wp:inline distT="0" distB="0" distL="0" distR="0" wp14:anchorId="23CA6098" wp14:editId="25E8778B">
+            <wp:extent cx="4549534" cy="4671465"/>
+            <wp:effectExtent l="0" t="0" r="3810" b="0"/>
+            <wp:docPr id="7" name="Imagen 7"/>
+            <wp:cNvGraphicFramePr>
+              <a:graphicFrameLocks xmlns:a="http://schemas.openxmlformats.org/drawingml/2006/main" noChangeAspect="1"/>
+            </wp:cNvGraphicFramePr>
+            <a:graphic xmlns:a="http://schemas.openxmlformats.org/drawingml/2006/main">
+              <a:graphicData uri="http://schemas.openxmlformats.org/drawingml/2006/picture">
+                <pic:pic xmlns:pic="http://schemas.openxmlformats.org/drawingml/2006/picture">
+                  <pic:nvPicPr>
+                    <pic:cNvPr id="1" name=""/>
+                    <pic:cNvPicPr/>
+                  </pic:nvPicPr>
+                  <pic:blipFill>
+                    <a:blip r:embed="rId25"/>
+                    <a:stretch>
+                      <a:fillRect/>
+                    </a:stretch>
+                  </pic:blipFill>
+                  <pic:spPr>
+                    <a:xfrm>
+                      <a:off x="0" y="0"/>
+                      <a:ext cx="4549534" cy="4671465"/>
+                    </a:xfrm>
+                    <a:prstGeom prst="rect">
+                      <a:avLst/>
+                    </a:prstGeom>
+                  </pic:spPr>
+                </pic:pic>
+              </a:graphicData>
+            </a:graphic>
+          </wp:inline>
+        </w:drawing>
+      </w:r>
+    </w:p>
+    <w:p>
+      <w:pPr>
+        <w:jc w:val="center"/>
+        <w:rPr>
+          <w:lang w:val="es-SV"/>
+        </w:rPr>
+      </w:pPr>
+      <w:r>
+        <w:rPr>
+          <w:noProof/>
+          <w:lang w:val="es-SV" w:eastAsia="es-SV"/>
+        </w:rPr>
+        <w:lastRenderedPageBreak/>
+        <w:drawing>
+          <wp:inline distT="0" distB="0" distL="0" distR="0" wp14:anchorId="2DF78F3F" wp14:editId="0D3F3350">
+            <wp:extent cx="4580017" cy="2415749"/>
+            <wp:effectExtent l="0" t="0" r="0" b="3810"/>
+            <wp:docPr id="14" name="Imagen 14"/>
+            <wp:cNvGraphicFramePr>
+              <a:graphicFrameLocks xmlns:a="http://schemas.openxmlformats.org/drawingml/2006/main" noChangeAspect="1"/>
+            </wp:cNvGraphicFramePr>
+            <a:graphic xmlns:a="http://schemas.openxmlformats.org/drawingml/2006/main">
+              <a:graphicData uri="http://schemas.openxmlformats.org/drawingml/2006/picture">
+                <pic:pic xmlns:pic="http://schemas.openxmlformats.org/drawingml/2006/picture">
+                  <pic:nvPicPr>
+                    <pic:cNvPr id="1" name=""/>
+                    <pic:cNvPicPr/>
+                  </pic:nvPicPr>
+                  <pic:blipFill>
+                    <a:blip r:embed="rId26"/>
+                    <a:stretch>
+                      <a:fillRect/>
+                    </a:stretch>
+                  </pic:blipFill>
+                  <pic:spPr>
+                    <a:xfrm>
+                      <a:off x="0" y="0"/>
+                      <a:ext cx="4580017" cy="2415749"/>
+                    </a:xfrm>
+                    <a:prstGeom prst="rect">
+                      <a:avLst/>
+                    </a:prstGeom>
+                  </pic:spPr>
+                </pic:pic>
+              </a:graphicData>
+            </a:graphic>
+          </wp:inline>
+        </w:drawing>
+      </w:r>
+    </w:p>
+    <w:p>
+      <w:pPr>
+        <w:rPr>
+          <w:lang w:val="es-SV"/>
+        </w:rPr>
+      </w:pPr>
     </w:p>
     <w:p>
       <w:pPr>
@@ -6230,8 +6365,8 @@
       </w:pPr>
     </w:p>
     <w:sectPr>
-      <w:headerReference w:type="default" r:id="rId23"/>
-      <w:headerReference w:type="first" r:id="rId24"/>
+      <w:headerReference w:type="default" r:id="rId27"/>
+      <w:headerReference w:type="first" r:id="rId28"/>
       <w:pgSz w:w="12240" w:h="15840"/>
       <w:pgMar w:top="1440" w:right="1440" w:bottom="1440" w:left="1440" w:header="720" w:footer="720" w:gutter="0"/>
       <w:pgNumType w:start="1"/>
@@ -6244,7 +6379,7 @@
 </file>
 
 <file path=word/endnotes.xml><?xml version="1.0" encoding="utf-8"?>
-<w:endnotes xmlns:wpc="http://schemas.microsoft.com/office/word/2010/wordprocessingCanvas" xmlns:cx="http://schemas.microsoft.com/office/drawing/2014/chartex" xmlns:mc="http://schemas.openxmlformats.org/markup-compatibility/2006" xmlns:o="urn:schemas-microsoft-com:office:office" xmlns:r="http://schemas.openxmlformats.org/officeDocument/2006/relationships" xmlns:m="http://schemas.openxmlformats.org/officeDocument/2006/math" xmlns:v="urn:schemas-microsoft-com:vml" xmlns:wp14="http://schemas.microsoft.com/office/word/2010/wordprocessingDrawing" xmlns:wp="http://schemas.openxmlformats.org/drawingml/2006/wordprocessingDrawing" xmlns:w10="urn:schemas-microsoft-com:office:word" xmlns:w="http://schemas.openxmlformats.org/wordprocessingml/2006/main" xmlns:w14="http://schemas.microsoft.com/office/word/2010/wordml" xmlns:w15="http://schemas.microsoft.com/office/word/2012/wordml" xmlns:w16se="http://schemas.microsoft.com/office/word/2015/wordml/symex" xmlns:wpg="http://schemas.microsoft.com/office/word/2010/wordprocessingGroup" xmlns:wpi="http://schemas.microsoft.com/office/word/2010/wordprocessingInk" xmlns:wne="http://schemas.microsoft.com/office/word/2006/wordml" xmlns:wps="http://schemas.microsoft.com/office/word/2010/wordprocessingShape" mc:Ignorable="w14 w15 w16se wp14">
+<w:endnotes xmlns:wpc="http://schemas.microsoft.com/office/word/2010/wordprocessingCanvas" xmlns:cx="http://schemas.microsoft.com/office/drawing/2014/chartex" xmlns:cx1="http://schemas.microsoft.com/office/drawing/2015/9/8/chartex" xmlns:cx2="http://schemas.microsoft.com/office/drawing/2015/10/21/chartex" xmlns:cx3="http://schemas.microsoft.com/office/drawing/2016/5/9/chartex" xmlns:cx4="http://schemas.microsoft.com/office/drawing/2016/5/10/chartex" xmlns:cx5="http://schemas.microsoft.com/office/drawing/2016/5/11/chartex" xmlns:cx6="http://schemas.microsoft.com/office/drawing/2016/5/12/chartex" xmlns:cx7="http://schemas.microsoft.com/office/drawing/2016/5/13/chartex" xmlns:cx8="http://schemas.microsoft.com/office/drawing/2016/5/14/chartex" xmlns:mc="http://schemas.openxmlformats.org/markup-compatibility/2006" xmlns:aink="http://schemas.microsoft.com/office/drawing/2016/ink" xmlns:am3d="http://schemas.microsoft.com/office/drawing/2017/model3d" xmlns:o="urn:schemas-microsoft-com:office:office" xmlns:oel="http://schemas.microsoft.com/office/2019/extlst" xmlns:r="http://schemas.openxmlformats.org/officeDocument/2006/relationships" xmlns:m="http://schemas.openxmlformats.org/officeDocument/2006/math" xmlns:v="urn:schemas-microsoft-com:vml" xmlns:wp14="http://schemas.microsoft.com/office/word/2010/wordprocessingDrawing" xmlns:wp="http://schemas.openxmlformats.org/drawingml/2006/wordprocessingDrawing" xmlns:w10="urn:schemas-microsoft-com:office:word" xmlns:w="http://schemas.openxmlformats.org/wordprocessingml/2006/main" xmlns:w14="http://schemas.microsoft.com/office/word/2010/wordml" xmlns:w15="http://schemas.microsoft.com/office/word/2012/wordml" xmlns:w16cex="http://schemas.microsoft.com/office/word/2018/wordml/cex" xmlns:w16cid="http://schemas.microsoft.com/office/word/2016/wordml/cid" xmlns:w16="http://schemas.microsoft.com/office/word/2018/wordml" xmlns:w16du="http://schemas.microsoft.com/office/word/2023/wordml/word16du" xmlns:w16sdtdh="http://schemas.microsoft.com/office/word/2020/wordml/sdtdatahash" xmlns:w16sdtfl="http://schemas.microsoft.com/office/word/2024/wordml/sdtformatlock" xmlns:w16se="http://schemas.microsoft.com/office/word/2015/wordml/symex" xmlns:wpg="http://schemas.microsoft.com/office/word/2010/wordprocessingGroup" xmlns:wpi="http://schemas.microsoft.com/office/word/2010/wordprocessingInk" xmlns:wne="http://schemas.microsoft.com/office/word/2006/wordml" xmlns:wps="http://schemas.microsoft.com/office/word/2010/wordprocessingShape" mc:Ignorable="w14 w15 w16se w16cid w16 w16cex w16sdtdh w16sdtfl w16du wp14">
   <w:endnote w:type="separator" w:id="-1">
     <w:p>
       <w:pPr>
@@ -6268,24 +6403,8 @@
 </w:endnotes>
 </file>
 
-<file path=word/footer1.xml><?xml version="1.0" encoding="utf-8"?>
-<w:ftr xmlns:wpc="http://schemas.microsoft.com/office/word/2010/wordprocessingCanvas" xmlns:cx="http://schemas.microsoft.com/office/drawing/2014/chartex" xmlns:mc="http://schemas.openxmlformats.org/markup-compatibility/2006" xmlns:o="urn:schemas-microsoft-com:office:office" xmlns:r="http://schemas.openxmlformats.org/officeDocument/2006/relationships" xmlns:m="http://schemas.openxmlformats.org/officeDocument/2006/math" xmlns:v="urn:schemas-microsoft-com:vml" xmlns:wp14="http://schemas.microsoft.com/office/word/2010/wordprocessingDrawing" xmlns:wp="http://schemas.openxmlformats.org/drawingml/2006/wordprocessingDrawing" xmlns:w10="urn:schemas-microsoft-com:office:word" xmlns:w="http://schemas.openxmlformats.org/wordprocessingml/2006/main" xmlns:w14="http://schemas.microsoft.com/office/word/2010/wordml" xmlns:w15="http://schemas.microsoft.com/office/word/2012/wordml" xmlns:w16se="http://schemas.microsoft.com/office/word/2015/wordml/symex" xmlns:wpg="http://schemas.microsoft.com/office/word/2010/wordprocessingGroup" xmlns:wpi="http://schemas.microsoft.com/office/word/2010/wordprocessingInk" xmlns:wne="http://schemas.microsoft.com/office/word/2006/wordml" xmlns:wps="http://schemas.microsoft.com/office/word/2010/wordprocessingShape" mc:Ignorable="w14 w15 w16se wp14">
-  <w:p>
-    <w:pPr>
-      <w:pStyle w:val="Piedepgina"/>
-      <w:jc w:val="right"/>
-    </w:pPr>
-  </w:p>
-  <w:p>
-    <w:pPr>
-      <w:pStyle w:val="Piedepgina"/>
-    </w:pPr>
-  </w:p>
-</w:ftr>
-</file>
-
 <file path=word/footnotes.xml><?xml version="1.0" encoding="utf-8"?>
-<w:footnotes xmlns:wpc="http://schemas.microsoft.com/office/word/2010/wordprocessingCanvas" xmlns:cx="http://schemas.microsoft.com/office/drawing/2014/chartex" xmlns:mc="http://schemas.openxmlformats.org/markup-compatibility/2006" xmlns:o="urn:schemas-microsoft-com:office:office" xmlns:r="http://schemas.openxmlformats.org/officeDocument/2006/relationships" xmlns:m="http://schemas.openxmlformats.org/officeDocument/2006/math" xmlns:v="urn:schemas-microsoft-com:vml" xmlns:wp14="http://schemas.microsoft.com/office/word/2010/wordprocessingDrawing" xmlns:wp="http://schemas.openxmlformats.org/drawingml/2006/wordprocessingDrawing" xmlns:w10="urn:schemas-microsoft-com:office:word" xmlns:w="http://schemas.openxmlformats.org/wordprocessingml/2006/main" xmlns:w14="http://schemas.microsoft.com/office/word/2010/wordml" xmlns:w15="http://schemas.microsoft.com/office/word/2012/wordml" xmlns:w16se="http://schemas.microsoft.com/office/word/2015/wordml/symex" xmlns:wpg="http://schemas.microsoft.com/office/word/2010/wordprocessingGroup" xmlns:wpi="http://schemas.microsoft.com/office/word/2010/wordprocessingInk" xmlns:wne="http://schemas.microsoft.com/office/word/2006/wordml" xmlns:wps="http://schemas.microsoft.com/office/word/2010/wordprocessingShape" mc:Ignorable="w14 w15 w16se wp14">
+<w:footnotes xmlns:wpc="http://schemas.microsoft.com/office/word/2010/wordprocessingCanvas" xmlns:cx="http://schemas.microsoft.com/office/drawing/2014/chartex" xmlns:cx1="http://schemas.microsoft.com/office/drawing/2015/9/8/chartex" xmlns:cx2="http://schemas.microsoft.com/office/drawing/2015/10/21/chartex" xmlns:cx3="http://schemas.microsoft.com/office/drawing/2016/5/9/chartex" xmlns:cx4="http://schemas.microsoft.com/office/drawing/2016/5/10/chartex" xmlns:cx5="http://schemas.microsoft.com/office/drawing/2016/5/11/chartex" xmlns:cx6="http://schemas.microsoft.com/office/drawing/2016/5/12/chartex" xmlns:cx7="http://schemas.microsoft.com/office/drawing/2016/5/13/chartex" xmlns:cx8="http://schemas.microsoft.com/office/drawing/2016/5/14/chartex" xmlns:mc="http://schemas.openxmlformats.org/markup-compatibility/2006" xmlns:aink="http://schemas.microsoft.com/office/drawing/2016/ink" xmlns:am3d="http://schemas.microsoft.com/office/drawing/2017/model3d" xmlns:o="urn:schemas-microsoft-com:office:office" xmlns:oel="http://schemas.microsoft.com/office/2019/extlst" xmlns:r="http://schemas.openxmlformats.org/officeDocument/2006/relationships" xmlns:m="http://schemas.openxmlformats.org/officeDocument/2006/math" xmlns:v="urn:schemas-microsoft-com:vml" xmlns:wp14="http://schemas.microsoft.com/office/word/2010/wordprocessingDrawing" xmlns:wp="http://schemas.openxmlformats.org/drawingml/2006/wordprocessingDrawing" xmlns:w10="urn:schemas-microsoft-com:office:word" xmlns:w="http://schemas.openxmlformats.org/wordprocessingml/2006/main" xmlns:w14="http://schemas.microsoft.com/office/word/2010/wordml" xmlns:w15="http://schemas.microsoft.com/office/word/2012/wordml" xmlns:w16cex="http://schemas.microsoft.com/office/word/2018/wordml/cex" xmlns:w16cid="http://schemas.microsoft.com/office/word/2016/wordml/cid" xmlns:w16="http://schemas.microsoft.com/office/word/2018/wordml" xmlns:w16du="http://schemas.microsoft.com/office/word/2023/wordml/word16du" xmlns:w16sdtdh="http://schemas.microsoft.com/office/word/2020/wordml/sdtdatahash" xmlns:w16sdtfl="http://schemas.microsoft.com/office/word/2024/wordml/sdtformatlock" xmlns:w16se="http://schemas.microsoft.com/office/word/2015/wordml/symex" xmlns:wpg="http://schemas.microsoft.com/office/word/2010/wordprocessingGroup" xmlns:wpi="http://schemas.microsoft.com/office/word/2010/wordprocessingInk" xmlns:wne="http://schemas.microsoft.com/office/word/2006/wordml" xmlns:wps="http://schemas.microsoft.com/office/word/2010/wordprocessingShape" mc:Ignorable="w14 w15 w16se w16cid w16 w16cex w16sdtdh w16sdtfl w16du wp14">
   <w:footnote w:type="separator" w:id="-1">
     <w:p>
       <w:pPr>
@@ -6570,39 +6689,7 @@
 </file>
 
 <file path=word/header1.xml><?xml version="1.0" encoding="utf-8"?>
-<w:hdr xmlns:wpc="http://schemas.microsoft.com/office/word/2010/wordprocessingCanvas" xmlns:cx="http://schemas.microsoft.com/office/drawing/2014/chartex" xmlns:mc="http://schemas.openxmlformats.org/markup-compatibility/2006" xmlns:o="urn:schemas-microsoft-com:office:office" xmlns:r="http://schemas.openxmlformats.org/officeDocument/2006/relationships" xmlns:m="http://schemas.openxmlformats.org/officeDocument/2006/math" xmlns:v="urn:schemas-microsoft-com:vml" xmlns:wp14="http://schemas.microsoft.com/office/word/2010/wordprocessingDrawing" xmlns:wp="http://schemas.openxmlformats.org/drawingml/2006/wordprocessingDrawing" xmlns:w10="urn:schemas-microsoft-com:office:word" xmlns:w="http://schemas.openxmlformats.org/wordprocessingml/2006/main" xmlns:w14="http://schemas.microsoft.com/office/word/2010/wordml" xmlns:w15="http://schemas.microsoft.com/office/word/2012/wordml" xmlns:w16se="http://schemas.microsoft.com/office/word/2015/wordml/symex" xmlns:wpg="http://schemas.microsoft.com/office/word/2010/wordprocessingGroup" xmlns:wpi="http://schemas.microsoft.com/office/word/2010/wordprocessingInk" xmlns:wne="http://schemas.microsoft.com/office/word/2006/wordml" xmlns:wps="http://schemas.microsoft.com/office/word/2010/wordprocessingShape" mc:Ignorable="w14 w15 w16se wp14">
-  <w:p>
-    <w:pPr>
-      <w:pStyle w:val="Encabezado"/>
-      <w:jc w:val="right"/>
-    </w:pPr>
-  </w:p>
-  <w:p>
-    <w:pPr>
-      <w:pStyle w:val="Encabezado"/>
-    </w:pPr>
-  </w:p>
-</w:hdr>
-</file>
-
-<file path=word/header2.xml><?xml version="1.0" encoding="utf-8"?>
-<w:hdr xmlns:wpc="http://schemas.microsoft.com/office/word/2010/wordprocessingCanvas" xmlns:cx="http://schemas.microsoft.com/office/drawing/2014/chartex" xmlns:mc="http://schemas.openxmlformats.org/markup-compatibility/2006" xmlns:o="urn:schemas-microsoft-com:office:office" xmlns:r="http://schemas.openxmlformats.org/officeDocument/2006/relationships" xmlns:m="http://schemas.openxmlformats.org/officeDocument/2006/math" xmlns:v="urn:schemas-microsoft-com:vml" xmlns:wp14="http://schemas.microsoft.com/office/word/2010/wordprocessingDrawing" xmlns:wp="http://schemas.openxmlformats.org/drawingml/2006/wordprocessingDrawing" xmlns:w10="urn:schemas-microsoft-com:office:word" xmlns:w="http://schemas.openxmlformats.org/wordprocessingml/2006/main" xmlns:w14="http://schemas.microsoft.com/office/word/2010/wordml" xmlns:w15="http://schemas.microsoft.com/office/word/2012/wordml" xmlns:w16se="http://schemas.microsoft.com/office/word/2015/wordml/symex" xmlns:wpg="http://schemas.microsoft.com/office/word/2010/wordprocessingGroup" xmlns:wpi="http://schemas.microsoft.com/office/word/2010/wordprocessingInk" xmlns:wne="http://schemas.microsoft.com/office/word/2006/wordml" xmlns:wps="http://schemas.microsoft.com/office/word/2010/wordprocessingShape" mc:Ignorable="w14 w15 w16se wp14">
-  <w:p>
-    <w:pPr>
-      <w:pStyle w:val="Encabezado"/>
-      <w:jc w:val="right"/>
-    </w:pPr>
-  </w:p>
-  <w:p>
-    <w:pPr>
-      <w:pStyle w:val="Encabezado"/>
-    </w:pPr>
-  </w:p>
-</w:hdr>
-</file>
-
-<file path=word/header3.xml><?xml version="1.0" encoding="utf-8"?>
-<w:hdr xmlns:wpc="http://schemas.microsoft.com/office/word/2010/wordprocessingCanvas" xmlns:cx="http://schemas.microsoft.com/office/drawing/2014/chartex" xmlns:mc="http://schemas.openxmlformats.org/markup-compatibility/2006" xmlns:o="urn:schemas-microsoft-com:office:office" xmlns:r="http://schemas.openxmlformats.org/officeDocument/2006/relationships" xmlns:m="http://schemas.openxmlformats.org/officeDocument/2006/math" xmlns:v="urn:schemas-microsoft-com:vml" xmlns:wp14="http://schemas.microsoft.com/office/word/2010/wordprocessingDrawing" xmlns:wp="http://schemas.openxmlformats.org/drawingml/2006/wordprocessingDrawing" xmlns:w10="urn:schemas-microsoft-com:office:word" xmlns:w="http://schemas.openxmlformats.org/wordprocessingml/2006/main" xmlns:w14="http://schemas.microsoft.com/office/word/2010/wordml" xmlns:w15="http://schemas.microsoft.com/office/word/2012/wordml" xmlns:w16se="http://schemas.microsoft.com/office/word/2015/wordml/symex" xmlns:wpg="http://schemas.microsoft.com/office/word/2010/wordprocessingGroup" xmlns:wpi="http://schemas.microsoft.com/office/word/2010/wordprocessingInk" xmlns:wne="http://schemas.microsoft.com/office/word/2006/wordml" xmlns:wps="http://schemas.microsoft.com/office/word/2010/wordprocessingShape" mc:Ignorable="w14 w15 w16se wp14">
+<w:hdr xmlns:wpc="http://schemas.microsoft.com/office/word/2010/wordprocessingCanvas" xmlns:cx="http://schemas.microsoft.com/office/drawing/2014/chartex" xmlns:cx1="http://schemas.microsoft.com/office/drawing/2015/9/8/chartex" xmlns:cx2="http://schemas.microsoft.com/office/drawing/2015/10/21/chartex" xmlns:cx3="http://schemas.microsoft.com/office/drawing/2016/5/9/chartex" xmlns:cx4="http://schemas.microsoft.com/office/drawing/2016/5/10/chartex" xmlns:cx5="http://schemas.microsoft.com/office/drawing/2016/5/11/chartex" xmlns:cx6="http://schemas.microsoft.com/office/drawing/2016/5/12/chartex" xmlns:cx7="http://schemas.microsoft.com/office/drawing/2016/5/13/chartex" xmlns:cx8="http://schemas.microsoft.com/office/drawing/2016/5/14/chartex" xmlns:mc="http://schemas.openxmlformats.org/markup-compatibility/2006" xmlns:aink="http://schemas.microsoft.com/office/drawing/2016/ink" xmlns:am3d="http://schemas.microsoft.com/office/drawing/2017/model3d" xmlns:o="urn:schemas-microsoft-com:office:office" xmlns:oel="http://schemas.microsoft.com/office/2019/extlst" xmlns:r="http://schemas.openxmlformats.org/officeDocument/2006/relationships" xmlns:m="http://schemas.openxmlformats.org/officeDocument/2006/math" xmlns:v="urn:schemas-microsoft-com:vml" xmlns:wp14="http://schemas.microsoft.com/office/word/2010/wordprocessingDrawing" xmlns:wp="http://schemas.openxmlformats.org/drawingml/2006/wordprocessingDrawing" xmlns:w10="urn:schemas-microsoft-com:office:word" xmlns:w="http://schemas.openxmlformats.org/wordprocessingml/2006/main" xmlns:w14="http://schemas.microsoft.com/office/word/2010/wordml" xmlns:w15="http://schemas.microsoft.com/office/word/2012/wordml" xmlns:w16cex="http://schemas.microsoft.com/office/word/2018/wordml/cex" xmlns:w16cid="http://schemas.microsoft.com/office/word/2016/wordml/cid" xmlns:w16="http://schemas.microsoft.com/office/word/2018/wordml" xmlns:w16du="http://schemas.microsoft.com/office/word/2023/wordml/word16du" xmlns:w16sdtdh="http://schemas.microsoft.com/office/word/2020/wordml/sdtdatahash" xmlns:w16sdtfl="http://schemas.microsoft.com/office/word/2024/wordml/sdtformatlock" xmlns:w16se="http://schemas.microsoft.com/office/word/2015/wordml/symex" xmlns:wpg="http://schemas.microsoft.com/office/word/2010/wordprocessingGroup" xmlns:wpi="http://schemas.microsoft.com/office/word/2010/wordprocessingInk" xmlns:wne="http://schemas.microsoft.com/office/word/2006/wordml" xmlns:wps="http://schemas.microsoft.com/office/word/2010/wordprocessingShape" mc:Ignorable="w14 w15 w16se w16cid w16 w16cex w16sdtdh w16sdtfl w16du wp14">
   <w:sdt>
     <w:sdtPr>
       <w:id w:val="-1484083713"/>
@@ -6611,7 +6698,6 @@
         <w:docPartUnique/>
       </w:docPartObj>
     </w:sdtPr>
-    <w:sdtEndPr/>
     <w:sdtContent>
       <w:p>
         <w:pPr>
@@ -6648,8 +6734,8 @@
 </w:hdr>
 </file>
 
-<file path=word/header4.xml><?xml version="1.0" encoding="utf-8"?>
-<w:hdr xmlns:wpc="http://schemas.microsoft.com/office/word/2010/wordprocessingCanvas" xmlns:cx="http://schemas.microsoft.com/office/drawing/2014/chartex" xmlns:mc="http://schemas.openxmlformats.org/markup-compatibility/2006" xmlns:o="urn:schemas-microsoft-com:office:office" xmlns:r="http://schemas.openxmlformats.org/officeDocument/2006/relationships" xmlns:m="http://schemas.openxmlformats.org/officeDocument/2006/math" xmlns:v="urn:schemas-microsoft-com:vml" xmlns:wp14="http://schemas.microsoft.com/office/word/2010/wordprocessingDrawing" xmlns:wp="http://schemas.openxmlformats.org/drawingml/2006/wordprocessingDrawing" xmlns:w10="urn:schemas-microsoft-com:office:word" xmlns:w="http://schemas.openxmlformats.org/wordprocessingml/2006/main" xmlns:w14="http://schemas.microsoft.com/office/word/2010/wordml" xmlns:w15="http://schemas.microsoft.com/office/word/2012/wordml" xmlns:w16se="http://schemas.microsoft.com/office/word/2015/wordml/symex" xmlns:wpg="http://schemas.microsoft.com/office/word/2010/wordprocessingGroup" xmlns:wpi="http://schemas.microsoft.com/office/word/2010/wordprocessingInk" xmlns:wne="http://schemas.microsoft.com/office/word/2006/wordml" xmlns:wps="http://schemas.microsoft.com/office/word/2010/wordprocessingShape" mc:Ignorable="w14 w15 w16se wp14">
+<file path=word/header2.xml><?xml version="1.0" encoding="utf-8"?>
+<w:hdr xmlns:wpc="http://schemas.microsoft.com/office/word/2010/wordprocessingCanvas" xmlns:cx="http://schemas.microsoft.com/office/drawing/2014/chartex" xmlns:cx1="http://schemas.microsoft.com/office/drawing/2015/9/8/chartex" xmlns:cx2="http://schemas.microsoft.com/office/drawing/2015/10/21/chartex" xmlns:cx3="http://schemas.microsoft.com/office/drawing/2016/5/9/chartex" xmlns:cx4="http://schemas.microsoft.com/office/drawing/2016/5/10/chartex" xmlns:cx5="http://schemas.microsoft.com/office/drawing/2016/5/11/chartex" xmlns:cx6="http://schemas.microsoft.com/office/drawing/2016/5/12/chartex" xmlns:cx7="http://schemas.microsoft.com/office/drawing/2016/5/13/chartex" xmlns:cx8="http://schemas.microsoft.com/office/drawing/2016/5/14/chartex" xmlns:mc="http://schemas.openxmlformats.org/markup-compatibility/2006" xmlns:aink="http://schemas.microsoft.com/office/drawing/2016/ink" xmlns:am3d="http://schemas.microsoft.com/office/drawing/2017/model3d" xmlns:o="urn:schemas-microsoft-com:office:office" xmlns:oel="http://schemas.microsoft.com/office/2019/extlst" xmlns:r="http://schemas.openxmlformats.org/officeDocument/2006/relationships" xmlns:m="http://schemas.openxmlformats.org/officeDocument/2006/math" xmlns:v="urn:schemas-microsoft-com:vml" xmlns:wp14="http://schemas.microsoft.com/office/word/2010/wordprocessingDrawing" xmlns:wp="http://schemas.openxmlformats.org/drawingml/2006/wordprocessingDrawing" xmlns:w10="urn:schemas-microsoft-com:office:word" xmlns:w="http://schemas.openxmlformats.org/wordprocessingml/2006/main" xmlns:w14="http://schemas.microsoft.com/office/word/2010/wordml" xmlns:w15="http://schemas.microsoft.com/office/word/2012/wordml" xmlns:w16cex="http://schemas.microsoft.com/office/word/2018/wordml/cex" xmlns:w16cid="http://schemas.microsoft.com/office/word/2016/wordml/cid" xmlns:w16="http://schemas.microsoft.com/office/word/2018/wordml" xmlns:w16du="http://schemas.microsoft.com/office/word/2023/wordml/word16du" xmlns:w16sdtdh="http://schemas.microsoft.com/office/word/2020/wordml/sdtdatahash" xmlns:w16sdtfl="http://schemas.microsoft.com/office/word/2024/wordml/sdtformatlock" xmlns:w16se="http://schemas.microsoft.com/office/word/2015/wordml/symex" xmlns:wpg="http://schemas.microsoft.com/office/word/2010/wordprocessingGroup" xmlns:wpi="http://schemas.microsoft.com/office/word/2010/wordprocessingInk" xmlns:wne="http://schemas.microsoft.com/office/word/2006/wordml" xmlns:wps="http://schemas.microsoft.com/office/word/2010/wordprocessingShape" mc:Ignorable="w14 w15 w16se w16cid w16 w16cex w16sdtdh w16sdtfl w16du wp14">
   <w:sdt>
     <w:sdtPr>
       <w:id w:val="-139118505"/>
@@ -6658,7 +6744,6 @@
         <w:docPartUnique/>
       </w:docPartObj>
     </w:sdtPr>
-    <w:sdtEndPr/>
     <w:sdtContent>
       <w:p>
         <w:pPr>
@@ -6696,7 +6781,7 @@
 </file>
 
 <file path=word/numbering.xml><?xml version="1.0" encoding="utf-8"?>
-<w:numbering xmlns:wpc="http://schemas.microsoft.com/office/word/2010/wordprocessingCanvas" xmlns:cx="http://schemas.microsoft.com/office/drawing/2014/chartex" xmlns:mc="http://schemas.openxmlformats.org/markup-compatibility/2006" xmlns:o="urn:schemas-microsoft-com:office:office" xmlns:r="http://schemas.openxmlformats.org/officeDocument/2006/relationships" xmlns:m="http://schemas.openxmlformats.org/officeDocument/2006/math" xmlns:v="urn:schemas-microsoft-com:vml" xmlns:wp14="http://schemas.microsoft.com/office/word/2010/wordprocessingDrawing" xmlns:wp="http://schemas.openxmlformats.org/drawingml/2006/wordprocessingDrawing" xmlns:w10="urn:schemas-microsoft-com:office:word" xmlns:w="http://schemas.openxmlformats.org/wordprocessingml/2006/main" xmlns:w14="http://schemas.microsoft.com/office/word/2010/wordml" xmlns:w15="http://schemas.microsoft.com/office/word/2012/wordml" xmlns:w16se="http://schemas.microsoft.com/office/word/2015/wordml/symex" xmlns:wpg="http://schemas.microsoft.com/office/word/2010/wordprocessingGroup" xmlns:wpi="http://schemas.microsoft.com/office/word/2010/wordprocessingInk" xmlns:wne="http://schemas.microsoft.com/office/word/2006/wordml" xmlns:wps="http://schemas.microsoft.com/office/word/2010/wordprocessingShape" mc:Ignorable="w14 w15 w16se wp14">
+<w:numbering xmlns:wpc="http://schemas.microsoft.com/office/word/2010/wordprocessingCanvas" xmlns:cx="http://schemas.microsoft.com/office/drawing/2014/chartex" xmlns:cx1="http://schemas.microsoft.com/office/drawing/2015/9/8/chartex" xmlns:cx2="http://schemas.microsoft.com/office/drawing/2015/10/21/chartex" xmlns:cx3="http://schemas.microsoft.com/office/drawing/2016/5/9/chartex" xmlns:cx4="http://schemas.microsoft.com/office/drawing/2016/5/10/chartex" xmlns:cx5="http://schemas.microsoft.com/office/drawing/2016/5/11/chartex" xmlns:cx6="http://schemas.microsoft.com/office/drawing/2016/5/12/chartex" xmlns:cx7="http://schemas.microsoft.com/office/drawing/2016/5/13/chartex" xmlns:cx8="http://schemas.microsoft.com/office/drawing/2016/5/14/chartex" xmlns:mc="http://schemas.openxmlformats.org/markup-compatibility/2006" xmlns:aink="http://schemas.microsoft.com/office/drawing/2016/ink" xmlns:am3d="http://schemas.microsoft.com/office/drawing/2017/model3d" xmlns:o="urn:schemas-microsoft-com:office:office" xmlns:oel="http://schemas.microsoft.com/office/2019/extlst" xmlns:r="http://schemas.openxmlformats.org/officeDocument/2006/relationships" xmlns:m="http://schemas.openxmlformats.org/officeDocument/2006/math" xmlns:v="urn:schemas-microsoft-com:vml" xmlns:wp14="http://schemas.microsoft.com/office/word/2010/wordprocessingDrawing" xmlns:wp="http://schemas.openxmlformats.org/drawingml/2006/wordprocessingDrawing" xmlns:w10="urn:schemas-microsoft-com:office:word" xmlns:w="http://schemas.openxmlformats.org/wordprocessingml/2006/main" xmlns:w14="http://schemas.microsoft.com/office/word/2010/wordml" xmlns:w15="http://schemas.microsoft.com/office/word/2012/wordml" xmlns:w16cex="http://schemas.microsoft.com/office/word/2018/wordml/cex" xmlns:w16cid="http://schemas.microsoft.com/office/word/2016/wordml/cid" xmlns:w16="http://schemas.microsoft.com/office/word/2018/wordml" xmlns:w16du="http://schemas.microsoft.com/office/word/2023/wordml/word16du" xmlns:w16sdtdh="http://schemas.microsoft.com/office/word/2020/wordml/sdtdatahash" xmlns:w16sdtfl="http://schemas.microsoft.com/office/word/2024/wordml/sdtformatlock" xmlns:w16se="http://schemas.microsoft.com/office/word/2015/wordml/symex" xmlns:wpg="http://schemas.microsoft.com/office/word/2010/wordprocessingGroup" xmlns:wpi="http://schemas.microsoft.com/office/word/2010/wordprocessingInk" xmlns:wne="http://schemas.microsoft.com/office/word/2006/wordml" xmlns:wps="http://schemas.microsoft.com/office/word/2010/wordprocessingShape" mc:Ignorable="w14 w15 w16se w16cid w16 w16cex w16sdtdh w16sdtfl w16du wp14">
   <w:abstractNum w:abstractNumId="0" w15:restartNumberingAfterBreak="0">
     <w:nsid w:val="056A5EBF"/>
     <w:multiLevelType w:val="hybridMultilevel"/>
@@ -7945,47 +8030,47 @@
       </w:rPr>
     </w:lvl>
   </w:abstractNum>
-  <w:num w:numId="1">
+  <w:num w:numId="1" w16cid:durableId="301496225">
     <w:abstractNumId w:val="8"/>
   </w:num>
-  <w:num w:numId="2">
+  <w:num w:numId="2" w16cid:durableId="274217940">
     <w:abstractNumId w:val="9"/>
   </w:num>
-  <w:num w:numId="3">
+  <w:num w:numId="3" w16cid:durableId="1919778043">
     <w:abstractNumId w:val="2"/>
   </w:num>
-  <w:num w:numId="4">
+  <w:num w:numId="4" w16cid:durableId="1936136686">
     <w:abstractNumId w:val="3"/>
   </w:num>
-  <w:num w:numId="5">
+  <w:num w:numId="5" w16cid:durableId="407268725">
     <w:abstractNumId w:val="7"/>
   </w:num>
-  <w:num w:numId="6">
+  <w:num w:numId="6" w16cid:durableId="1988973450">
     <w:abstractNumId w:val="10"/>
   </w:num>
-  <w:num w:numId="7">
+  <w:num w:numId="7" w16cid:durableId="1389495884">
     <w:abstractNumId w:val="5"/>
   </w:num>
-  <w:num w:numId="8">
+  <w:num w:numId="8" w16cid:durableId="1434591481">
     <w:abstractNumId w:val="6"/>
   </w:num>
-  <w:num w:numId="9">
+  <w:num w:numId="9" w16cid:durableId="529612015">
     <w:abstractNumId w:val="0"/>
   </w:num>
-  <w:num w:numId="10">
+  <w:num w:numId="10" w16cid:durableId="1045183493">
     <w:abstractNumId w:val="4"/>
   </w:num>
-  <w:num w:numId="11">
+  <w:num w:numId="11" w16cid:durableId="2119332228">
     <w:abstractNumId w:val="1"/>
   </w:num>
-  <w:num w:numId="12">
+  <w:num w:numId="12" w16cid:durableId="742024732">
     <w:abstractNumId w:val="11"/>
   </w:num>
 </w:numbering>
 </file>
 
 <file path=word/styles.xml><?xml version="1.0" encoding="utf-8"?>
-<w:styles xmlns:mc="http://schemas.openxmlformats.org/markup-compatibility/2006" xmlns:r="http://schemas.openxmlformats.org/officeDocument/2006/relationships" xmlns:w="http://schemas.openxmlformats.org/wordprocessingml/2006/main" xmlns:w14="http://schemas.microsoft.com/office/word/2010/wordml" xmlns:w15="http://schemas.microsoft.com/office/word/2012/wordml" xmlns:w16se="http://schemas.microsoft.com/office/word/2015/wordml/symex" mc:Ignorable="w14 w15 w16se">
+<w:styles xmlns:mc="http://schemas.openxmlformats.org/markup-compatibility/2006" xmlns:r="http://schemas.openxmlformats.org/officeDocument/2006/relationships" xmlns:w="http://schemas.openxmlformats.org/wordprocessingml/2006/main" xmlns:w14="http://schemas.microsoft.com/office/word/2010/wordml" xmlns:w15="http://schemas.microsoft.com/office/word/2012/wordml" xmlns:w16cex="http://schemas.microsoft.com/office/word/2018/wordml/cex" xmlns:w16cid="http://schemas.microsoft.com/office/word/2016/wordml/cid" xmlns:w16="http://schemas.microsoft.com/office/word/2018/wordml" xmlns:w16du="http://schemas.microsoft.com/office/word/2023/wordml/word16du" xmlns:w16sdtdh="http://schemas.microsoft.com/office/word/2020/wordml/sdtdatahash" xmlns:w16sdtfl="http://schemas.microsoft.com/office/word/2024/wordml/sdtformatlock" xmlns:w16se="http://schemas.microsoft.com/office/word/2015/wordml/symex" mc:Ignorable="w14 w15 w16se w16cid w16 w16cex w16sdtdh w16sdtfl w16du">
   <w:docDefaults>
     <w:rPrDefault>
       <w:rPr>
@@ -8003,7 +8088,7 @@
       </w:pPr>
     </w:pPrDefault>
   </w:docDefaults>
-  <w:latentStyles w:defLockedState="0" w:defUIPriority="99" w:defSemiHidden="0" w:defUnhideWhenUsed="0" w:defQFormat="0" w:count="371">
+  <w:latentStyles w:defLockedState="0" w:defUIPriority="99" w:defSemiHidden="0" w:defUnhideWhenUsed="0" w:defQFormat="0" w:count="376">
     <w:lsdException w:name="Normal" w:uiPriority="0" w:qFormat="1"/>
     <w:lsdException w:name="heading 1" w:uiPriority="9" w:qFormat="1"/>
     <w:lsdException w:name="heading 2" w:semiHidden="1" w:uiPriority="9" w:unhideWhenUsed="1" w:qFormat="1"/>
@@ -8375,6 +8460,11 @@
     <w:lsdException w:name="List Table 5 Dark Accent 6" w:uiPriority="50"/>
     <w:lsdException w:name="List Table 6 Colorful Accent 6" w:uiPriority="51"/>
     <w:lsdException w:name="List Table 7 Colorful Accent 6" w:uiPriority="52"/>
+    <w:lsdException w:name="Mention" w:semiHidden="1" w:unhideWhenUsed="1"/>
+    <w:lsdException w:name="Smart Hyperlink" w:semiHidden="1" w:unhideWhenUsed="1"/>
+    <w:lsdException w:name="Hashtag" w:semiHidden="1" w:unhideWhenUsed="1"/>
+    <w:lsdException w:name="Unresolved Mention" w:semiHidden="1" w:unhideWhenUsed="1"/>
+    <w:lsdException w:name="Smart Link" w:semiHidden="1" w:unhideWhenUsed="1"/>
   </w:latentStyles>
   <w:style w:type="paragraph" w:default="1" w:styleId="Normal">
     <w:name w:val="Normal"/>

</xml_diff>

<commit_message>
Docs: Se actualizo el indice
Se actualizo el indice ya que tenia un pequeño error en la pagina del anexo.
</commit_message>
<xml_diff>
--- a/docs/entrega2/EPRO_Entrega2_Grupo9_Plataforma de gestión documental con versiones.docx
+++ b/docs/entrega2/EPRO_Entrega2_Grupo9_Plataforma de gestión documental con versiones.docx
@@ -1,6 +1,6 @@
 
 <file path=word/document.xml><?xml version="1.0" encoding="utf-8"?>
-<w:document xmlns:wpc="http://schemas.microsoft.com/office/word/2010/wordprocessingCanvas" xmlns:cx="http://schemas.microsoft.com/office/drawing/2014/chartex" xmlns:cx1="http://schemas.microsoft.com/office/drawing/2015/9/8/chartex" xmlns:cx2="http://schemas.microsoft.com/office/drawing/2015/10/21/chartex" xmlns:cx3="http://schemas.microsoft.com/office/drawing/2016/5/9/chartex" xmlns:cx4="http://schemas.microsoft.com/office/drawing/2016/5/10/chartex" xmlns:cx5="http://schemas.microsoft.com/office/drawing/2016/5/11/chartex" xmlns:cx6="http://schemas.microsoft.com/office/drawing/2016/5/12/chartex" xmlns:cx7="http://schemas.microsoft.com/office/drawing/2016/5/13/chartex" xmlns:cx8="http://schemas.microsoft.com/office/drawing/2016/5/14/chartex" xmlns:mc="http://schemas.openxmlformats.org/markup-compatibility/2006" xmlns:aink="http://schemas.microsoft.com/office/drawing/2016/ink" xmlns:am3d="http://schemas.microsoft.com/office/drawing/2017/model3d" xmlns:o="urn:schemas-microsoft-com:office:office" xmlns:oel="http://schemas.microsoft.com/office/2019/extlst" xmlns:r="http://schemas.openxmlformats.org/officeDocument/2006/relationships" xmlns:m="http://schemas.openxmlformats.org/officeDocument/2006/math" xmlns:v="urn:schemas-microsoft-com:vml" xmlns:wp14="http://schemas.microsoft.com/office/word/2010/wordprocessingDrawing" xmlns:wp="http://schemas.openxmlformats.org/drawingml/2006/wordprocessingDrawing" xmlns:w10="urn:schemas-microsoft-com:office:word" xmlns:w="http://schemas.openxmlformats.org/wordprocessingml/2006/main" xmlns:w14="http://schemas.microsoft.com/office/word/2010/wordml" xmlns:w15="http://schemas.microsoft.com/office/word/2012/wordml" xmlns:w16cex="http://schemas.microsoft.com/office/word/2018/wordml/cex" xmlns:w16cid="http://schemas.microsoft.com/office/word/2016/wordml/cid" xmlns:w16="http://schemas.microsoft.com/office/word/2018/wordml" xmlns:w16du="http://schemas.microsoft.com/office/word/2023/wordml/word16du" xmlns:w16sdtdh="http://schemas.microsoft.com/office/word/2020/wordml/sdtdatahash" xmlns:w16sdtfl="http://schemas.microsoft.com/office/word/2024/wordml/sdtformatlock" xmlns:w16se="http://schemas.microsoft.com/office/word/2015/wordml/symex" xmlns:wpg="http://schemas.microsoft.com/office/word/2010/wordprocessingGroup" xmlns:wpi="http://schemas.microsoft.com/office/word/2010/wordprocessingInk" xmlns:wne="http://schemas.microsoft.com/office/word/2006/wordml" xmlns:wps="http://schemas.microsoft.com/office/word/2010/wordprocessingShape" mc:Ignorable="w14 w15 w16se w16cid w16 w16cex w16sdtdh w16sdtfl w16du wp14">
+<w:document xmlns:wpc="http://schemas.microsoft.com/office/word/2010/wordprocessingCanvas" xmlns:cx="http://schemas.microsoft.com/office/drawing/2014/chartex" xmlns:mc="http://schemas.openxmlformats.org/markup-compatibility/2006" xmlns:o="urn:schemas-microsoft-com:office:office" xmlns:r="http://schemas.openxmlformats.org/officeDocument/2006/relationships" xmlns:m="http://schemas.openxmlformats.org/officeDocument/2006/math" xmlns:v="urn:schemas-microsoft-com:vml" xmlns:wp14="http://schemas.microsoft.com/office/word/2010/wordprocessingDrawing" xmlns:wp="http://schemas.openxmlformats.org/drawingml/2006/wordprocessingDrawing" xmlns:w10="urn:schemas-microsoft-com:office:word" xmlns:w="http://schemas.openxmlformats.org/wordprocessingml/2006/main" xmlns:w14="http://schemas.microsoft.com/office/word/2010/wordml" xmlns:w15="http://schemas.microsoft.com/office/word/2012/wordml" xmlns:w16se="http://schemas.microsoft.com/office/word/2015/wordml/symex" xmlns:wpg="http://schemas.microsoft.com/office/word/2010/wordprocessingGroup" xmlns:wpi="http://schemas.microsoft.com/office/word/2010/wordprocessingInk" xmlns:wne="http://schemas.microsoft.com/office/word/2006/wordml" xmlns:wps="http://schemas.microsoft.com/office/word/2010/wordprocessingShape" mc:Ignorable="w14 w15 w16se wp14">
   <w:body>
     <w:p>
       <w:pPr>
@@ -1230,7 +1230,127 @@
           <w:r>
             <w:fldChar w:fldCharType="separate"/>
           </w:r>
-          <w:hyperlink w:anchor="_Toc224570635" w:history="1">
+          <w:bookmarkStart w:id="1" w:name="_GoBack"/>
+          <w:bookmarkEnd w:id="1"/>
+          <w:r>
+            <w:rPr>
+              <w:rStyle w:val="Hipervnculo"/>
+              <w:noProof/>
+            </w:rPr>
+            <w:fldChar w:fldCharType="begin"/>
+          </w:r>
+          <w:r>
+            <w:rPr>
+              <w:rStyle w:val="Hipervnculo"/>
+              <w:noProof/>
+            </w:rPr>
+            <w:instrText xml:space="preserve"> </w:instrText>
+          </w:r>
+          <w:r>
+            <w:rPr>
+              <w:noProof/>
+            </w:rPr>
+            <w:instrText>HYPERLINK \l "_Toc224676897"</w:instrText>
+          </w:r>
+          <w:r>
+            <w:rPr>
+              <w:rStyle w:val="Hipervnculo"/>
+              <w:noProof/>
+            </w:rPr>
+            <w:instrText xml:space="preserve"> </w:instrText>
+          </w:r>
+          <w:r>
+            <w:rPr>
+              <w:rStyle w:val="Hipervnculo"/>
+              <w:noProof/>
+            </w:rPr>
+          </w:r>
+          <w:r>
+            <w:rPr>
+              <w:rStyle w:val="Hipervnculo"/>
+              <w:noProof/>
+            </w:rPr>
+            <w:fldChar w:fldCharType="separate"/>
+          </w:r>
+          <w:r>
+            <w:rPr>
+              <w:rStyle w:val="Hipervnculo"/>
+              <w:rFonts w:ascii="Arial" w:hAnsi="Arial" w:cs="Arial"/>
+              <w:b/>
+              <w:bCs/>
+              <w:noProof/>
+            </w:rPr>
+            <w:t>Contexto de la Empresa</w:t>
+          </w:r>
+          <w:r>
+            <w:rPr>
+              <w:noProof/>
+              <w:webHidden/>
+            </w:rPr>
+            <w:tab/>
+          </w:r>
+          <w:r>
+            <w:rPr>
+              <w:noProof/>
+              <w:webHidden/>
+            </w:rPr>
+            <w:fldChar w:fldCharType="begin"/>
+          </w:r>
+          <w:r>
+            <w:rPr>
+              <w:noProof/>
+              <w:webHidden/>
+            </w:rPr>
+            <w:instrText xml:space="preserve"> PAGEREF _Toc224676897 \h </w:instrText>
+          </w:r>
+          <w:r>
+            <w:rPr>
+              <w:noProof/>
+              <w:webHidden/>
+            </w:rPr>
+          </w:r>
+          <w:r>
+            <w:rPr>
+              <w:noProof/>
+              <w:webHidden/>
+            </w:rPr>
+            <w:fldChar w:fldCharType="separate"/>
+          </w:r>
+          <w:r>
+            <w:rPr>
+              <w:noProof/>
+              <w:webHidden/>
+            </w:rPr>
+            <w:t>3</w:t>
+          </w:r>
+          <w:r>
+            <w:rPr>
+              <w:noProof/>
+              <w:webHidden/>
+            </w:rPr>
+            <w:fldChar w:fldCharType="end"/>
+          </w:r>
+          <w:r>
+            <w:rPr>
+              <w:rStyle w:val="Hipervnculo"/>
+              <w:noProof/>
+            </w:rPr>
+            <w:fldChar w:fldCharType="end"/>
+          </w:r>
+        </w:p>
+        <w:p>
+          <w:pPr>
+            <w:pStyle w:val="TDC1"/>
+            <w:tabs>
+              <w:tab w:val="right" w:leader="dot" w:pos="9350"/>
+            </w:tabs>
+            <w:rPr>
+              <w:rFonts w:cstheme="minorBidi"/>
+              <w:noProof/>
+              <w:lang w:eastAsia="es-SV"/>
+            </w:rPr>
+          </w:pPr>
+          <w:hyperlink w:anchor="_Toc224676898" w:history="1">
             <w:r>
               <w:rPr>
                 <w:rStyle w:val="Hipervnculo"/>
@@ -1239,7 +1359,7 @@
                 <w:bCs/>
                 <w:noProof/>
               </w:rPr>
-              <w:t>Contexto de la Empresa</w:t>
+              <w:t>Diagnóstico del Proceso</w:t>
             </w:r>
             <w:r>
               <w:rPr>
@@ -1260,7 +1380,7 @@
                 <w:noProof/>
                 <w:webHidden/>
               </w:rPr>
-              <w:instrText xml:space="preserve"> PAGEREF _Toc224570635 \h </w:instrText>
+              <w:instrText xml:space="preserve"> PAGEREF _Toc224676898 \h </w:instrText>
             </w:r>
             <w:r>
               <w:rPr>
@@ -1280,7 +1400,291 @@
                 <w:noProof/>
                 <w:webHidden/>
               </w:rPr>
-              <w:t>1</w:t>
+              <w:t>4</w:t>
+            </w:r>
+            <w:r>
+              <w:rPr>
+                <w:noProof/>
+                <w:webHidden/>
+              </w:rPr>
+              <w:fldChar w:fldCharType="end"/>
+            </w:r>
+          </w:hyperlink>
+        </w:p>
+        <w:p>
+          <w:pPr>
+            <w:pStyle w:val="TDC2"/>
+            <w:tabs>
+              <w:tab w:val="right" w:leader="dot" w:pos="9350"/>
+            </w:tabs>
+            <w:rPr>
+              <w:rFonts w:cstheme="minorBidi"/>
+              <w:noProof/>
+              <w:lang w:eastAsia="es-SV"/>
+            </w:rPr>
+          </w:pPr>
+          <w:hyperlink w:anchor="_Toc224676899" w:history="1">
+            <w:r>
+              <w:rPr>
+                <w:rStyle w:val="Hipervnculo"/>
+                <w:rFonts w:ascii="Arial" w:hAnsi="Arial" w:cs="Arial"/>
+                <w:noProof/>
+              </w:rPr>
+              <w:t>Problema actual</w:t>
+            </w:r>
+            <w:r>
+              <w:rPr>
+                <w:noProof/>
+                <w:webHidden/>
+              </w:rPr>
+              <w:tab/>
+            </w:r>
+            <w:r>
+              <w:rPr>
+                <w:noProof/>
+                <w:webHidden/>
+              </w:rPr>
+              <w:fldChar w:fldCharType="begin"/>
+            </w:r>
+            <w:r>
+              <w:rPr>
+                <w:noProof/>
+                <w:webHidden/>
+              </w:rPr>
+              <w:instrText xml:space="preserve"> PAGEREF _Toc224676899 \h </w:instrText>
+            </w:r>
+            <w:r>
+              <w:rPr>
+                <w:noProof/>
+                <w:webHidden/>
+              </w:rPr>
+            </w:r>
+            <w:r>
+              <w:rPr>
+                <w:noProof/>
+                <w:webHidden/>
+              </w:rPr>
+              <w:fldChar w:fldCharType="separate"/>
+            </w:r>
+            <w:r>
+              <w:rPr>
+                <w:noProof/>
+                <w:webHidden/>
+              </w:rPr>
+              <w:t>4</w:t>
+            </w:r>
+            <w:r>
+              <w:rPr>
+                <w:noProof/>
+                <w:webHidden/>
+              </w:rPr>
+              <w:fldChar w:fldCharType="end"/>
+            </w:r>
+          </w:hyperlink>
+        </w:p>
+        <w:p>
+          <w:pPr>
+            <w:pStyle w:val="TDC2"/>
+            <w:tabs>
+              <w:tab w:val="right" w:leader="dot" w:pos="9350"/>
+            </w:tabs>
+            <w:rPr>
+              <w:rFonts w:cstheme="minorBidi"/>
+              <w:noProof/>
+              <w:lang w:eastAsia="es-SV"/>
+            </w:rPr>
+          </w:pPr>
+          <w:hyperlink w:anchor="_Toc224676900" w:history="1">
+            <w:r>
+              <w:rPr>
+                <w:rStyle w:val="Hipervnculo"/>
+                <w:rFonts w:ascii="Arial" w:hAnsi="Arial" w:cs="Arial"/>
+                <w:noProof/>
+              </w:rPr>
+              <w:t>Diagnóstico de la solución</w:t>
+            </w:r>
+            <w:r>
+              <w:rPr>
+                <w:noProof/>
+                <w:webHidden/>
+              </w:rPr>
+              <w:tab/>
+            </w:r>
+            <w:r>
+              <w:rPr>
+                <w:noProof/>
+                <w:webHidden/>
+              </w:rPr>
+              <w:fldChar w:fldCharType="begin"/>
+            </w:r>
+            <w:r>
+              <w:rPr>
+                <w:noProof/>
+                <w:webHidden/>
+              </w:rPr>
+              <w:instrText xml:space="preserve"> PAGEREF _Toc224676900 \h </w:instrText>
+            </w:r>
+            <w:r>
+              <w:rPr>
+                <w:noProof/>
+                <w:webHidden/>
+              </w:rPr>
+            </w:r>
+            <w:r>
+              <w:rPr>
+                <w:noProof/>
+                <w:webHidden/>
+              </w:rPr>
+              <w:fldChar w:fldCharType="separate"/>
+            </w:r>
+            <w:r>
+              <w:rPr>
+                <w:noProof/>
+                <w:webHidden/>
+              </w:rPr>
+              <w:t>5</w:t>
+            </w:r>
+            <w:r>
+              <w:rPr>
+                <w:noProof/>
+                <w:webHidden/>
+              </w:rPr>
+              <w:fldChar w:fldCharType="end"/>
+            </w:r>
+          </w:hyperlink>
+        </w:p>
+        <w:p>
+          <w:pPr>
+            <w:pStyle w:val="TDC2"/>
+            <w:tabs>
+              <w:tab w:val="right" w:leader="dot" w:pos="9350"/>
+            </w:tabs>
+            <w:rPr>
+              <w:rFonts w:cstheme="minorBidi"/>
+              <w:noProof/>
+              <w:lang w:eastAsia="es-SV"/>
+            </w:rPr>
+          </w:pPr>
+          <w:hyperlink w:anchor="_Toc224676901" w:history="1">
+            <w:r>
+              <w:rPr>
+                <w:rStyle w:val="Hipervnculo"/>
+                <w:rFonts w:ascii="Arial" w:hAnsi="Arial" w:cs="Arial"/>
+                <w:noProof/>
+              </w:rPr>
+              <w:t>Debilidades del proceso identificadas (según enfoque CMMI)</w:t>
+            </w:r>
+            <w:r>
+              <w:rPr>
+                <w:noProof/>
+                <w:webHidden/>
+              </w:rPr>
+              <w:tab/>
+            </w:r>
+            <w:r>
+              <w:rPr>
+                <w:noProof/>
+                <w:webHidden/>
+              </w:rPr>
+              <w:fldChar w:fldCharType="begin"/>
+            </w:r>
+            <w:r>
+              <w:rPr>
+                <w:noProof/>
+                <w:webHidden/>
+              </w:rPr>
+              <w:instrText xml:space="preserve"> PAGEREF _Toc224676901 \h </w:instrText>
+            </w:r>
+            <w:r>
+              <w:rPr>
+                <w:noProof/>
+                <w:webHidden/>
+              </w:rPr>
+            </w:r>
+            <w:r>
+              <w:rPr>
+                <w:noProof/>
+                <w:webHidden/>
+              </w:rPr>
+              <w:fldChar w:fldCharType="separate"/>
+            </w:r>
+            <w:r>
+              <w:rPr>
+                <w:noProof/>
+                <w:webHidden/>
+              </w:rPr>
+              <w:t>6</w:t>
+            </w:r>
+            <w:r>
+              <w:rPr>
+                <w:noProof/>
+                <w:webHidden/>
+              </w:rPr>
+              <w:fldChar w:fldCharType="end"/>
+            </w:r>
+          </w:hyperlink>
+        </w:p>
+        <w:p>
+          <w:pPr>
+            <w:pStyle w:val="TDC2"/>
+            <w:tabs>
+              <w:tab w:val="right" w:leader="dot" w:pos="9350"/>
+            </w:tabs>
+            <w:rPr>
+              <w:rFonts w:cstheme="minorBidi"/>
+              <w:noProof/>
+              <w:lang w:eastAsia="es-SV"/>
+            </w:rPr>
+          </w:pPr>
+          <w:hyperlink w:anchor="_Toc224676902" w:history="1">
+            <w:r>
+              <w:rPr>
+                <w:rStyle w:val="Hipervnculo"/>
+                <w:rFonts w:ascii="Arial" w:hAnsi="Arial" w:cs="Arial"/>
+                <w:noProof/>
+              </w:rPr>
+              <w:t>Conclusión del diagnostico</w:t>
+            </w:r>
+            <w:r>
+              <w:rPr>
+                <w:noProof/>
+                <w:webHidden/>
+              </w:rPr>
+              <w:tab/>
+            </w:r>
+            <w:r>
+              <w:rPr>
+                <w:noProof/>
+                <w:webHidden/>
+              </w:rPr>
+              <w:fldChar w:fldCharType="begin"/>
+            </w:r>
+            <w:r>
+              <w:rPr>
+                <w:noProof/>
+                <w:webHidden/>
+              </w:rPr>
+              <w:instrText xml:space="preserve"> PAGEREF _Toc224676902 \h </w:instrText>
+            </w:r>
+            <w:r>
+              <w:rPr>
+                <w:noProof/>
+                <w:webHidden/>
+              </w:rPr>
+            </w:r>
+            <w:r>
+              <w:rPr>
+                <w:noProof/>
+                <w:webHidden/>
+              </w:rPr>
+              <w:fldChar w:fldCharType="separate"/>
+            </w:r>
+            <w:r>
+              <w:rPr>
+                <w:noProof/>
+                <w:webHidden/>
+              </w:rPr>
+              <w:t>7</w:t>
             </w:r>
             <w:r>
               <w:rPr>
@@ -1303,7 +1707,7 @@
               <w:lang w:eastAsia="es-SV"/>
             </w:rPr>
           </w:pPr>
-          <w:hyperlink w:anchor="_Toc224570636" w:history="1">
+          <w:hyperlink w:anchor="_Toc224676903" w:history="1">
             <w:r>
               <w:rPr>
                 <w:rStyle w:val="Hipervnculo"/>
@@ -1312,7 +1716,7 @@
                 <w:bCs/>
                 <w:noProof/>
               </w:rPr>
-              <w:t>Diagnóstico del Proceso</w:t>
+              <w:t>Diagramas AS-IS</w:t>
             </w:r>
             <w:r>
               <w:rPr>
@@ -1333,7 +1737,7 @@
                 <w:noProof/>
                 <w:webHidden/>
               </w:rPr>
-              <w:instrText xml:space="preserve"> PAGEREF _Toc224570636 \h </w:instrText>
+              <w:instrText xml:space="preserve"> PAGEREF _Toc224676903 \h </w:instrText>
             </w:r>
             <w:r>
               <w:rPr>
@@ -1353,7 +1757,7 @@
                 <w:noProof/>
                 <w:webHidden/>
               </w:rPr>
-              <w:t>2</w:t>
+              <w:t>8</w:t>
             </w:r>
             <w:r>
               <w:rPr>
@@ -1376,14 +1780,14 @@
               <w:lang w:eastAsia="es-SV"/>
             </w:rPr>
           </w:pPr>
-          <w:hyperlink w:anchor="_Toc224570637" w:history="1">
+          <w:hyperlink w:anchor="_Toc224676904" w:history="1">
             <w:r>
               <w:rPr>
                 <w:rStyle w:val="Hipervnculo"/>
                 <w:rFonts w:ascii="Arial" w:hAnsi="Arial" w:cs="Arial"/>
                 <w:noProof/>
               </w:rPr>
-              <w:t>Problema actual</w:t>
+              <w:t>Buscar un documento en el correo</w:t>
             </w:r>
             <w:r>
               <w:rPr>
@@ -1404,7 +1808,7 @@
                 <w:noProof/>
                 <w:webHidden/>
               </w:rPr>
-              <w:instrText xml:space="preserve"> PAGEREF _Toc224570637 \h </w:instrText>
+              <w:instrText xml:space="preserve"> PAGEREF _Toc224676904 \h </w:instrText>
             </w:r>
             <w:r>
               <w:rPr>
@@ -1424,7 +1828,7 @@
                 <w:noProof/>
                 <w:webHidden/>
               </w:rPr>
-              <w:t>2</w:t>
+              <w:t>8</w:t>
             </w:r>
             <w:r>
               <w:rPr>
@@ -1447,14 +1851,14 @@
               <w:lang w:eastAsia="es-SV"/>
             </w:rPr>
           </w:pPr>
-          <w:hyperlink w:anchor="_Toc224570638" w:history="1">
+          <w:hyperlink w:anchor="_Toc224676905" w:history="1">
             <w:r>
               <w:rPr>
                 <w:rStyle w:val="Hipervnculo"/>
                 <w:rFonts w:ascii="Arial" w:hAnsi="Arial" w:cs="Arial"/>
                 <w:noProof/>
               </w:rPr>
-              <w:t>Diagnóstico de la solución</w:t>
+              <w:t>Buscar un documento en los archivos compartidos</w:t>
             </w:r>
             <w:r>
               <w:rPr>
@@ -1475,7 +1879,7 @@
                 <w:noProof/>
                 <w:webHidden/>
               </w:rPr>
-              <w:instrText xml:space="preserve"> PAGEREF _Toc224570638 \h </w:instrText>
+              <w:instrText xml:space="preserve"> PAGEREF _Toc224676905 \h </w:instrText>
             </w:r>
             <w:r>
               <w:rPr>
@@ -1495,7 +1899,7 @@
                 <w:noProof/>
                 <w:webHidden/>
               </w:rPr>
-              <w:t>3</w:t>
+              <w:t>9</w:t>
             </w:r>
             <w:r>
               <w:rPr>
@@ -1518,14 +1922,14 @@
               <w:lang w:eastAsia="es-SV"/>
             </w:rPr>
           </w:pPr>
-          <w:hyperlink w:anchor="_Toc224570639" w:history="1">
+          <w:hyperlink w:anchor="_Toc224676906" w:history="1">
             <w:r>
               <w:rPr>
                 <w:rStyle w:val="Hipervnculo"/>
                 <w:rFonts w:ascii="Arial" w:hAnsi="Arial" w:cs="Arial"/>
                 <w:noProof/>
               </w:rPr>
-              <w:t>Debilidades del proceso identificadas (según enfoque CMMI)</w:t>
+              <w:t>Buscar un documento en los archivos locales</w:t>
             </w:r>
             <w:r>
               <w:rPr>
@@ -1546,7 +1950,7 @@
                 <w:noProof/>
                 <w:webHidden/>
               </w:rPr>
-              <w:instrText xml:space="preserve"> PAGEREF _Toc224570639 \h </w:instrText>
+              <w:instrText xml:space="preserve"> PAGEREF _Toc224676906 \h </w:instrText>
             </w:r>
             <w:r>
               <w:rPr>
@@ -1566,7 +1970,80 @@
                 <w:noProof/>
                 <w:webHidden/>
               </w:rPr>
-              <w:t>4</w:t>
+              <w:t>10</w:t>
+            </w:r>
+            <w:r>
+              <w:rPr>
+                <w:noProof/>
+                <w:webHidden/>
+              </w:rPr>
+              <w:fldChar w:fldCharType="end"/>
+            </w:r>
+          </w:hyperlink>
+        </w:p>
+        <w:p>
+          <w:pPr>
+            <w:pStyle w:val="TDC1"/>
+            <w:tabs>
+              <w:tab w:val="right" w:leader="dot" w:pos="9350"/>
+            </w:tabs>
+            <w:rPr>
+              <w:rFonts w:cstheme="minorBidi"/>
+              <w:noProof/>
+              <w:lang w:eastAsia="es-SV"/>
+            </w:rPr>
+          </w:pPr>
+          <w:hyperlink w:anchor="_Toc224676907" w:history="1">
+            <w:r>
+              <w:rPr>
+                <w:rStyle w:val="Hipervnculo"/>
+                <w:rFonts w:ascii="Arial" w:hAnsi="Arial" w:cs="Arial"/>
+                <w:b/>
+                <w:bCs/>
+                <w:noProof/>
+              </w:rPr>
+              <w:t>Diagramas TO-BE</w:t>
+            </w:r>
+            <w:r>
+              <w:rPr>
+                <w:noProof/>
+                <w:webHidden/>
+              </w:rPr>
+              <w:tab/>
+            </w:r>
+            <w:r>
+              <w:rPr>
+                <w:noProof/>
+                <w:webHidden/>
+              </w:rPr>
+              <w:fldChar w:fldCharType="begin"/>
+            </w:r>
+            <w:r>
+              <w:rPr>
+                <w:noProof/>
+                <w:webHidden/>
+              </w:rPr>
+              <w:instrText xml:space="preserve"> PAGEREF _Toc224676907 \h </w:instrText>
+            </w:r>
+            <w:r>
+              <w:rPr>
+                <w:noProof/>
+                <w:webHidden/>
+              </w:rPr>
+            </w:r>
+            <w:r>
+              <w:rPr>
+                <w:noProof/>
+                <w:webHidden/>
+              </w:rPr>
+              <w:fldChar w:fldCharType="separate"/>
+            </w:r>
+            <w:r>
+              <w:rPr>
+                <w:noProof/>
+                <w:webHidden/>
+              </w:rPr>
+              <w:t>11</w:t>
             </w:r>
             <w:r>
               <w:rPr>
@@ -1589,14 +2066,14 @@
               <w:lang w:eastAsia="es-SV"/>
             </w:rPr>
           </w:pPr>
-          <w:hyperlink w:anchor="_Toc224570640" w:history="1">
+          <w:hyperlink w:anchor="_Toc224676908" w:history="1">
             <w:r>
               <w:rPr>
                 <w:rStyle w:val="Hipervnculo"/>
                 <w:rFonts w:ascii="Arial" w:hAnsi="Arial" w:cs="Arial"/>
                 <w:noProof/>
               </w:rPr>
-              <w:t>Conclusión del diagnostico</w:t>
+              <w:t>Buscar un documento</w:t>
             </w:r>
             <w:r>
               <w:rPr>
@@ -1617,7 +2094,7 @@
                 <w:noProof/>
                 <w:webHidden/>
               </w:rPr>
-              <w:instrText xml:space="preserve"> PAGEREF _Toc224570640 \h </w:instrText>
+              <w:instrText xml:space="preserve"> PAGEREF _Toc224676908 \h </w:instrText>
             </w:r>
             <w:r>
               <w:rPr>
@@ -1637,7 +2114,149 @@
                 <w:noProof/>
                 <w:webHidden/>
               </w:rPr>
-              <w:t>5</w:t>
+              <w:t>11</w:t>
+            </w:r>
+            <w:r>
+              <w:rPr>
+                <w:noProof/>
+                <w:webHidden/>
+              </w:rPr>
+              <w:fldChar w:fldCharType="end"/>
+            </w:r>
+          </w:hyperlink>
+        </w:p>
+        <w:p>
+          <w:pPr>
+            <w:pStyle w:val="TDC2"/>
+            <w:tabs>
+              <w:tab w:val="right" w:leader="dot" w:pos="9350"/>
+            </w:tabs>
+            <w:rPr>
+              <w:rFonts w:cstheme="minorBidi"/>
+              <w:noProof/>
+              <w:lang w:eastAsia="es-SV"/>
+            </w:rPr>
+          </w:pPr>
+          <w:hyperlink w:anchor="_Toc224676909" w:history="1">
+            <w:r>
+              <w:rPr>
+                <w:rStyle w:val="Hipervnculo"/>
+                <w:rFonts w:ascii="Arial" w:hAnsi="Arial" w:cs="Arial"/>
+                <w:noProof/>
+              </w:rPr>
+              <w:t>Subir un documento</w:t>
+            </w:r>
+            <w:r>
+              <w:rPr>
+                <w:noProof/>
+                <w:webHidden/>
+              </w:rPr>
+              <w:tab/>
+            </w:r>
+            <w:r>
+              <w:rPr>
+                <w:noProof/>
+                <w:webHidden/>
+              </w:rPr>
+              <w:fldChar w:fldCharType="begin"/>
+            </w:r>
+            <w:r>
+              <w:rPr>
+                <w:noProof/>
+                <w:webHidden/>
+              </w:rPr>
+              <w:instrText xml:space="preserve"> PAGEREF _Toc224676909 \h </w:instrText>
+            </w:r>
+            <w:r>
+              <w:rPr>
+                <w:noProof/>
+                <w:webHidden/>
+              </w:rPr>
+            </w:r>
+            <w:r>
+              <w:rPr>
+                <w:noProof/>
+                <w:webHidden/>
+              </w:rPr>
+              <w:fldChar w:fldCharType="separate"/>
+            </w:r>
+            <w:r>
+              <w:rPr>
+                <w:noProof/>
+                <w:webHidden/>
+              </w:rPr>
+              <w:t>12</w:t>
+            </w:r>
+            <w:r>
+              <w:rPr>
+                <w:noProof/>
+                <w:webHidden/>
+              </w:rPr>
+              <w:fldChar w:fldCharType="end"/>
+            </w:r>
+          </w:hyperlink>
+        </w:p>
+        <w:p>
+          <w:pPr>
+            <w:pStyle w:val="TDC2"/>
+            <w:tabs>
+              <w:tab w:val="right" w:leader="dot" w:pos="9350"/>
+            </w:tabs>
+            <w:rPr>
+              <w:rFonts w:cstheme="minorBidi"/>
+              <w:noProof/>
+              <w:lang w:eastAsia="es-SV"/>
+            </w:rPr>
+          </w:pPr>
+          <w:hyperlink w:anchor="_Toc224676910" w:history="1">
+            <w:r>
+              <w:rPr>
+                <w:rStyle w:val="Hipervnculo"/>
+                <w:rFonts w:ascii="Arial" w:hAnsi="Arial" w:cs="Arial"/>
+                <w:noProof/>
+              </w:rPr>
+              <w:t>Crear un nuevo usuario</w:t>
+            </w:r>
+            <w:r>
+              <w:rPr>
+                <w:noProof/>
+                <w:webHidden/>
+              </w:rPr>
+              <w:tab/>
+            </w:r>
+            <w:r>
+              <w:rPr>
+                <w:noProof/>
+                <w:webHidden/>
+              </w:rPr>
+              <w:fldChar w:fldCharType="begin"/>
+            </w:r>
+            <w:r>
+              <w:rPr>
+                <w:noProof/>
+                <w:webHidden/>
+              </w:rPr>
+              <w:instrText xml:space="preserve"> PAGEREF _Toc224676910 \h </w:instrText>
+            </w:r>
+            <w:r>
+              <w:rPr>
+                <w:noProof/>
+                <w:webHidden/>
+              </w:rPr>
+            </w:r>
+            <w:r>
+              <w:rPr>
+                <w:noProof/>
+                <w:webHidden/>
+              </w:rPr>
+              <w:fldChar w:fldCharType="separate"/>
+            </w:r>
+            <w:r>
+              <w:rPr>
+                <w:noProof/>
+                <w:webHidden/>
+              </w:rPr>
+              <w:t>13</w:t>
             </w:r>
             <w:r>
               <w:rPr>
@@ -1660,7 +2279,7 @@
               <w:lang w:eastAsia="es-SV"/>
             </w:rPr>
           </w:pPr>
-          <w:hyperlink w:anchor="_Toc224570641" w:history="1">
+          <w:hyperlink w:anchor="_Toc224676911" w:history="1">
             <w:r>
               <w:rPr>
                 <w:rStyle w:val="Hipervnculo"/>
@@ -1669,7 +2288,7 @@
                 <w:bCs/>
                 <w:noProof/>
               </w:rPr>
-              <w:t>Diagramas AS-IS</w:t>
+              <w:t>Evidencia de aplicación</w:t>
             </w:r>
             <w:r>
               <w:rPr>
@@ -1690,7 +2309,7 @@
                 <w:noProof/>
                 <w:webHidden/>
               </w:rPr>
-              <w:instrText xml:space="preserve"> PAGEREF _Toc224570641 \h </w:instrText>
+              <w:instrText xml:space="preserve"> PAGEREF _Toc224676911 \h </w:instrText>
             </w:r>
             <w:r>
               <w:rPr>
@@ -1710,7 +2329,7 @@
                 <w:noProof/>
                 <w:webHidden/>
               </w:rPr>
-              <w:t>6</w:t>
+              <w:t>16</w:t>
             </w:r>
             <w:r>
               <w:rPr>
@@ -1733,14 +2352,14 @@
               <w:lang w:eastAsia="es-SV"/>
             </w:rPr>
           </w:pPr>
-          <w:hyperlink w:anchor="_Toc224570642" w:history="1">
+          <w:hyperlink w:anchor="_Toc224676912" w:history="1">
             <w:r>
               <w:rPr>
                 <w:rStyle w:val="Hipervnculo"/>
                 <w:rFonts w:ascii="Arial" w:hAnsi="Arial" w:cs="Arial"/>
                 <w:noProof/>
               </w:rPr>
-              <w:t>Buscar un documento en el correo</w:t>
+              <w:t>Tablero</w:t>
             </w:r>
             <w:r>
               <w:rPr>
@@ -1761,7 +2380,7 @@
                 <w:noProof/>
                 <w:webHidden/>
               </w:rPr>
-              <w:instrText xml:space="preserve"> PAGEREF _Toc224570642 \h </w:instrText>
+              <w:instrText xml:space="preserve"> PAGEREF _Toc224676912 \h </w:instrText>
             </w:r>
             <w:r>
               <w:rPr>
@@ -1781,7 +2400,7 @@
                 <w:noProof/>
                 <w:webHidden/>
               </w:rPr>
-              <w:t>6</w:t>
+              <w:t>16</w:t>
             </w:r>
             <w:r>
               <w:rPr>
@@ -1804,14 +2423,14 @@
               <w:lang w:eastAsia="es-SV"/>
             </w:rPr>
           </w:pPr>
-          <w:hyperlink w:anchor="_Toc224570643" w:history="1">
+          <w:hyperlink w:anchor="_Toc224676913" w:history="1">
             <w:r>
               <w:rPr>
                 <w:rStyle w:val="Hipervnculo"/>
                 <w:rFonts w:ascii="Arial" w:hAnsi="Arial" w:cs="Arial"/>
                 <w:noProof/>
               </w:rPr>
-              <w:t>Buscar un documento en los archivos compartidos</w:t>
+              <w:t>Repositorio con commits</w:t>
             </w:r>
             <w:r>
               <w:rPr>
@@ -1832,7 +2451,7 @@
                 <w:noProof/>
                 <w:webHidden/>
               </w:rPr>
-              <w:instrText xml:space="preserve"> PAGEREF _Toc224570643 \h </w:instrText>
+              <w:instrText xml:space="preserve"> PAGEREF _Toc224676913 \h </w:instrText>
             </w:r>
             <w:r>
               <w:rPr>
@@ -1852,78 +2471,7 @@
                 <w:noProof/>
                 <w:webHidden/>
               </w:rPr>
-              <w:t>7</w:t>
-            </w:r>
-            <w:r>
-              <w:rPr>
-                <w:noProof/>
-                <w:webHidden/>
-              </w:rPr>
-              <w:fldChar w:fldCharType="end"/>
-            </w:r>
-          </w:hyperlink>
-        </w:p>
-        <w:p>
-          <w:pPr>
-            <w:pStyle w:val="TDC2"/>
-            <w:tabs>
-              <w:tab w:val="right" w:leader="dot" w:pos="9350"/>
-            </w:tabs>
-            <w:rPr>
-              <w:rFonts w:cstheme="minorBidi"/>
-              <w:noProof/>
-              <w:lang w:eastAsia="es-SV"/>
-            </w:rPr>
-          </w:pPr>
-          <w:hyperlink w:anchor="_Toc224570644" w:history="1">
-            <w:r>
-              <w:rPr>
-                <w:rStyle w:val="Hipervnculo"/>
-                <w:rFonts w:ascii="Arial" w:hAnsi="Arial" w:cs="Arial"/>
-                <w:noProof/>
-              </w:rPr>
-              <w:t>Buscar un documento en los archivos locales</w:t>
-            </w:r>
-            <w:r>
-              <w:rPr>
-                <w:noProof/>
-                <w:webHidden/>
-              </w:rPr>
-              <w:tab/>
-            </w:r>
-            <w:r>
-              <w:rPr>
-                <w:noProof/>
-                <w:webHidden/>
-              </w:rPr>
-              <w:fldChar w:fldCharType="begin"/>
-            </w:r>
-            <w:r>
-              <w:rPr>
-                <w:noProof/>
-                <w:webHidden/>
-              </w:rPr>
-              <w:instrText xml:space="preserve"> PAGEREF _Toc224570644 \h </w:instrText>
-            </w:r>
-            <w:r>
-              <w:rPr>
-                <w:noProof/>
-                <w:webHidden/>
-              </w:rPr>
-            </w:r>
-            <w:r>
-              <w:rPr>
-                <w:noProof/>
-                <w:webHidden/>
-              </w:rPr>
-              <w:fldChar w:fldCharType="separate"/>
-            </w:r>
-            <w:r>
-              <w:rPr>
-                <w:noProof/>
-                <w:webHidden/>
-              </w:rPr>
-              <w:t>8</w:t>
+              <w:t>16</w:t>
             </w:r>
             <w:r>
               <w:rPr>
@@ -1946,7 +2494,7 @@
               <w:lang w:eastAsia="es-SV"/>
             </w:rPr>
           </w:pPr>
-          <w:hyperlink w:anchor="_Toc224570645" w:history="1">
+          <w:hyperlink w:anchor="_Toc224676914" w:history="1">
             <w:r>
               <w:rPr>
                 <w:rStyle w:val="Hipervnculo"/>
@@ -1955,7 +2503,7 @@
                 <w:bCs/>
                 <w:noProof/>
               </w:rPr>
-              <w:t>Diagramas TO-BE</w:t>
+              <w:t>Repositorio de Github</w:t>
             </w:r>
             <w:r>
               <w:rPr>
@@ -1976,7 +2524,7 @@
                 <w:noProof/>
                 <w:webHidden/>
               </w:rPr>
-              <w:instrText xml:space="preserve"> PAGEREF _Toc224570645 \h </w:instrText>
+              <w:instrText xml:space="preserve"> PAGEREF _Toc224676914 \h </w:instrText>
             </w:r>
             <w:r>
               <w:rPr>
@@ -1996,220 +2544,7 @@
                 <w:noProof/>
                 <w:webHidden/>
               </w:rPr>
-              <w:t>9</w:t>
-            </w:r>
-            <w:r>
-              <w:rPr>
-                <w:noProof/>
-                <w:webHidden/>
-              </w:rPr>
-              <w:fldChar w:fldCharType="end"/>
-            </w:r>
-          </w:hyperlink>
-        </w:p>
-        <w:p>
-          <w:pPr>
-            <w:pStyle w:val="TDC2"/>
-            <w:tabs>
-              <w:tab w:val="right" w:leader="dot" w:pos="9350"/>
-            </w:tabs>
-            <w:rPr>
-              <w:rFonts w:cstheme="minorBidi"/>
-              <w:noProof/>
-              <w:lang w:eastAsia="es-SV"/>
-            </w:rPr>
-          </w:pPr>
-          <w:hyperlink w:anchor="_Toc224570646" w:history="1">
-            <w:r>
-              <w:rPr>
-                <w:rStyle w:val="Hipervnculo"/>
-                <w:rFonts w:ascii="Arial" w:hAnsi="Arial" w:cs="Arial"/>
-                <w:noProof/>
-              </w:rPr>
-              <w:t>Buscar un documento</w:t>
-            </w:r>
-            <w:r>
-              <w:rPr>
-                <w:noProof/>
-                <w:webHidden/>
-              </w:rPr>
-              <w:tab/>
-            </w:r>
-            <w:r>
-              <w:rPr>
-                <w:noProof/>
-                <w:webHidden/>
-              </w:rPr>
-              <w:fldChar w:fldCharType="begin"/>
-            </w:r>
-            <w:r>
-              <w:rPr>
-                <w:noProof/>
-                <w:webHidden/>
-              </w:rPr>
-              <w:instrText xml:space="preserve"> PAGEREF _Toc224570646 \h </w:instrText>
-            </w:r>
-            <w:r>
-              <w:rPr>
-                <w:noProof/>
-                <w:webHidden/>
-              </w:rPr>
-            </w:r>
-            <w:r>
-              <w:rPr>
-                <w:noProof/>
-                <w:webHidden/>
-              </w:rPr>
-              <w:fldChar w:fldCharType="separate"/>
-            </w:r>
-            <w:r>
-              <w:rPr>
-                <w:noProof/>
-                <w:webHidden/>
-              </w:rPr>
-              <w:t>9</w:t>
-            </w:r>
-            <w:r>
-              <w:rPr>
-                <w:noProof/>
-                <w:webHidden/>
-              </w:rPr>
-              <w:fldChar w:fldCharType="end"/>
-            </w:r>
-          </w:hyperlink>
-        </w:p>
-        <w:p>
-          <w:pPr>
-            <w:pStyle w:val="TDC2"/>
-            <w:tabs>
-              <w:tab w:val="right" w:leader="dot" w:pos="9350"/>
-            </w:tabs>
-            <w:rPr>
-              <w:rFonts w:cstheme="minorBidi"/>
-              <w:noProof/>
-              <w:lang w:eastAsia="es-SV"/>
-            </w:rPr>
-          </w:pPr>
-          <w:hyperlink w:anchor="_Toc224570647" w:history="1">
-            <w:r>
-              <w:rPr>
-                <w:rStyle w:val="Hipervnculo"/>
-                <w:rFonts w:ascii="Arial" w:hAnsi="Arial" w:cs="Arial"/>
-                <w:noProof/>
-              </w:rPr>
-              <w:t>Subir un documento</w:t>
-            </w:r>
-            <w:r>
-              <w:rPr>
-                <w:noProof/>
-                <w:webHidden/>
-              </w:rPr>
-              <w:tab/>
-            </w:r>
-            <w:r>
-              <w:rPr>
-                <w:noProof/>
-                <w:webHidden/>
-              </w:rPr>
-              <w:fldChar w:fldCharType="begin"/>
-            </w:r>
-            <w:r>
-              <w:rPr>
-                <w:noProof/>
-                <w:webHidden/>
-              </w:rPr>
-              <w:instrText xml:space="preserve"> PAGEREF _Toc224570647 \h </w:instrText>
-            </w:r>
-            <w:r>
-              <w:rPr>
-                <w:noProof/>
-                <w:webHidden/>
-              </w:rPr>
-            </w:r>
-            <w:r>
-              <w:rPr>
-                <w:noProof/>
-                <w:webHidden/>
-              </w:rPr>
-              <w:fldChar w:fldCharType="separate"/>
-            </w:r>
-            <w:r>
-              <w:rPr>
-                <w:noProof/>
-                <w:webHidden/>
-              </w:rPr>
-              <w:t>10</w:t>
-            </w:r>
-            <w:r>
-              <w:rPr>
-                <w:noProof/>
-                <w:webHidden/>
-              </w:rPr>
-              <w:fldChar w:fldCharType="end"/>
-            </w:r>
-          </w:hyperlink>
-        </w:p>
-        <w:p>
-          <w:pPr>
-            <w:pStyle w:val="TDC2"/>
-            <w:tabs>
-              <w:tab w:val="right" w:leader="dot" w:pos="9350"/>
-            </w:tabs>
-            <w:rPr>
-              <w:rFonts w:cstheme="minorBidi"/>
-              <w:noProof/>
-              <w:lang w:eastAsia="es-SV"/>
-            </w:rPr>
-          </w:pPr>
-          <w:hyperlink w:anchor="_Toc224570648" w:history="1">
-            <w:r>
-              <w:rPr>
-                <w:rStyle w:val="Hipervnculo"/>
-                <w:rFonts w:ascii="Arial" w:hAnsi="Arial" w:cs="Arial"/>
-                <w:noProof/>
-              </w:rPr>
-              <w:t>Crear un nuevo usuario</w:t>
-            </w:r>
-            <w:r>
-              <w:rPr>
-                <w:noProof/>
-                <w:webHidden/>
-              </w:rPr>
-              <w:tab/>
-            </w:r>
-            <w:r>
-              <w:rPr>
-                <w:noProof/>
-                <w:webHidden/>
-              </w:rPr>
-              <w:fldChar w:fldCharType="begin"/>
-            </w:r>
-            <w:r>
-              <w:rPr>
-                <w:noProof/>
-                <w:webHidden/>
-              </w:rPr>
-              <w:instrText xml:space="preserve"> PAGEREF _Toc224570648 \h </w:instrText>
-            </w:r>
-            <w:r>
-              <w:rPr>
-                <w:noProof/>
-                <w:webHidden/>
-              </w:rPr>
-            </w:r>
-            <w:r>
-              <w:rPr>
-                <w:noProof/>
-                <w:webHidden/>
-              </w:rPr>
-              <w:fldChar w:fldCharType="separate"/>
-            </w:r>
-            <w:r>
-              <w:rPr>
-                <w:noProof/>
-                <w:webHidden/>
-              </w:rPr>
-              <w:t>11</w:t>
+              <w:t>17</w:t>
             </w:r>
             <w:r>
               <w:rPr>
@@ -2232,7 +2567,7 @@
               <w:lang w:eastAsia="es-SV"/>
             </w:rPr>
           </w:pPr>
-          <w:hyperlink w:anchor="_Toc224570649" w:history="1">
+          <w:hyperlink w:anchor="_Toc224676915" w:history="1">
             <w:r>
               <w:rPr>
                 <w:rStyle w:val="Hipervnculo"/>
@@ -2241,7 +2576,7 @@
                 <w:bCs/>
                 <w:noProof/>
               </w:rPr>
-              <w:t>Evidencia de aplicación</w:t>
+              <w:t>Anexos</w:t>
             </w:r>
             <w:r>
               <w:rPr>
@@ -2262,7 +2597,7 @@
                 <w:noProof/>
                 <w:webHidden/>
               </w:rPr>
-              <w:instrText xml:space="preserve"> PAGEREF _Toc224570649 \h </w:instrText>
+              <w:instrText xml:space="preserve"> PAGEREF _Toc224676915 \h </w:instrText>
             </w:r>
             <w:r>
               <w:rPr>
@@ -2282,295 +2617,7 @@
                 <w:noProof/>
                 <w:webHidden/>
               </w:rPr>
-              <w:t>15</w:t>
-            </w:r>
-            <w:r>
-              <w:rPr>
-                <w:noProof/>
-                <w:webHidden/>
-              </w:rPr>
-              <w:fldChar w:fldCharType="end"/>
-            </w:r>
-          </w:hyperlink>
-        </w:p>
-        <w:p>
-          <w:pPr>
-            <w:pStyle w:val="TDC2"/>
-            <w:tabs>
-              <w:tab w:val="right" w:leader="dot" w:pos="9350"/>
-            </w:tabs>
-            <w:rPr>
-              <w:rFonts w:cstheme="minorBidi"/>
-              <w:noProof/>
-              <w:lang w:eastAsia="es-SV"/>
-            </w:rPr>
-          </w:pPr>
-          <w:hyperlink w:anchor="_Toc224570650" w:history="1">
-            <w:r>
-              <w:rPr>
-                <w:rStyle w:val="Hipervnculo"/>
-                <w:rFonts w:ascii="Arial" w:hAnsi="Arial" w:cs="Arial"/>
-                <w:noProof/>
-              </w:rPr>
-              <w:t>Tablero</w:t>
-            </w:r>
-            <w:r>
-              <w:rPr>
-                <w:noProof/>
-                <w:webHidden/>
-              </w:rPr>
-              <w:tab/>
-            </w:r>
-            <w:r>
-              <w:rPr>
-                <w:noProof/>
-                <w:webHidden/>
-              </w:rPr>
-              <w:fldChar w:fldCharType="begin"/>
-            </w:r>
-            <w:r>
-              <w:rPr>
-                <w:noProof/>
-                <w:webHidden/>
-              </w:rPr>
-              <w:instrText xml:space="preserve"> PAGEREF _Toc224570650 \h </w:instrText>
-            </w:r>
-            <w:r>
-              <w:rPr>
-                <w:noProof/>
-                <w:webHidden/>
-              </w:rPr>
-            </w:r>
-            <w:r>
-              <w:rPr>
-                <w:noProof/>
-                <w:webHidden/>
-              </w:rPr>
-              <w:fldChar w:fldCharType="separate"/>
-            </w:r>
-            <w:r>
-              <w:rPr>
-                <w:noProof/>
-                <w:webHidden/>
-              </w:rPr>
-              <w:t>15</w:t>
-            </w:r>
-            <w:r>
-              <w:rPr>
-                <w:noProof/>
-                <w:webHidden/>
-              </w:rPr>
-              <w:fldChar w:fldCharType="end"/>
-            </w:r>
-          </w:hyperlink>
-        </w:p>
-        <w:p>
-          <w:pPr>
-            <w:pStyle w:val="TDC2"/>
-            <w:tabs>
-              <w:tab w:val="right" w:leader="dot" w:pos="9350"/>
-            </w:tabs>
-            <w:rPr>
-              <w:rFonts w:cstheme="minorBidi"/>
-              <w:noProof/>
-              <w:lang w:eastAsia="es-SV"/>
-            </w:rPr>
-          </w:pPr>
-          <w:hyperlink w:anchor="_Toc224570651" w:history="1">
-            <w:r>
-              <w:rPr>
-                <w:rStyle w:val="Hipervnculo"/>
-                <w:rFonts w:ascii="Arial" w:hAnsi="Arial" w:cs="Arial"/>
-                <w:noProof/>
-              </w:rPr>
-              <w:t>Repositorio con commits</w:t>
-            </w:r>
-            <w:r>
-              <w:rPr>
-                <w:noProof/>
-                <w:webHidden/>
-              </w:rPr>
-              <w:tab/>
-            </w:r>
-            <w:r>
-              <w:rPr>
-                <w:noProof/>
-                <w:webHidden/>
-              </w:rPr>
-              <w:fldChar w:fldCharType="begin"/>
-            </w:r>
-            <w:r>
-              <w:rPr>
-                <w:noProof/>
-                <w:webHidden/>
-              </w:rPr>
-              <w:instrText xml:space="preserve"> PAGEREF _Toc224570651 \h </w:instrText>
-            </w:r>
-            <w:r>
-              <w:rPr>
-                <w:noProof/>
-                <w:webHidden/>
-              </w:rPr>
-            </w:r>
-            <w:r>
-              <w:rPr>
-                <w:noProof/>
-                <w:webHidden/>
-              </w:rPr>
-              <w:fldChar w:fldCharType="separate"/>
-            </w:r>
-            <w:r>
-              <w:rPr>
-                <w:noProof/>
-                <w:webHidden/>
-              </w:rPr>
-              <w:t>15</w:t>
-            </w:r>
-            <w:r>
-              <w:rPr>
-                <w:noProof/>
-                <w:webHidden/>
-              </w:rPr>
-              <w:fldChar w:fldCharType="end"/>
-            </w:r>
-          </w:hyperlink>
-        </w:p>
-        <w:p>
-          <w:pPr>
-            <w:pStyle w:val="TDC1"/>
-            <w:tabs>
-              <w:tab w:val="right" w:leader="dot" w:pos="9350"/>
-            </w:tabs>
-            <w:rPr>
-              <w:rFonts w:cstheme="minorBidi"/>
-              <w:noProof/>
-              <w:lang w:eastAsia="es-SV"/>
-            </w:rPr>
-          </w:pPr>
-          <w:hyperlink w:anchor="_Toc224570652" w:history="1">
-            <w:r>
-              <w:rPr>
-                <w:rStyle w:val="Hipervnculo"/>
-                <w:rFonts w:ascii="Arial" w:hAnsi="Arial" w:cs="Arial"/>
-                <w:b/>
-                <w:bCs/>
-                <w:noProof/>
-              </w:rPr>
-              <w:t>Repositorio de Github</w:t>
-            </w:r>
-            <w:r>
-              <w:rPr>
-                <w:noProof/>
-                <w:webHidden/>
-              </w:rPr>
-              <w:tab/>
-            </w:r>
-            <w:r>
-              <w:rPr>
-                <w:noProof/>
-                <w:webHidden/>
-              </w:rPr>
-              <w:fldChar w:fldCharType="begin"/>
-            </w:r>
-            <w:r>
-              <w:rPr>
-                <w:noProof/>
-                <w:webHidden/>
-              </w:rPr>
-              <w:instrText xml:space="preserve"> PAGEREF _Toc224570652 \h </w:instrText>
-            </w:r>
-            <w:r>
-              <w:rPr>
-                <w:noProof/>
-                <w:webHidden/>
-              </w:rPr>
-            </w:r>
-            <w:r>
-              <w:rPr>
-                <w:noProof/>
-                <w:webHidden/>
-              </w:rPr>
-              <w:fldChar w:fldCharType="separate"/>
-            </w:r>
-            <w:r>
-              <w:rPr>
-                <w:noProof/>
-                <w:webHidden/>
-              </w:rPr>
-              <w:t>16</w:t>
-            </w:r>
-            <w:r>
-              <w:rPr>
-                <w:noProof/>
-                <w:webHidden/>
-              </w:rPr>
-              <w:fldChar w:fldCharType="end"/>
-            </w:r>
-          </w:hyperlink>
-        </w:p>
-        <w:p>
-          <w:pPr>
-            <w:pStyle w:val="TDC1"/>
-            <w:tabs>
-              <w:tab w:val="right" w:leader="dot" w:pos="9350"/>
-            </w:tabs>
-            <w:rPr>
-              <w:rFonts w:cstheme="minorBidi"/>
-              <w:noProof/>
-              <w:lang w:eastAsia="es-SV"/>
-            </w:rPr>
-          </w:pPr>
-          <w:hyperlink w:anchor="_Toc224570653" w:history="1">
-            <w:r>
-              <w:rPr>
-                <w:rStyle w:val="Hipervnculo"/>
-                <w:rFonts w:ascii="Arial" w:hAnsi="Arial" w:cs="Arial"/>
-                <w:b/>
-                <w:bCs/>
-                <w:noProof/>
-              </w:rPr>
-              <w:t>Anexos</w:t>
-            </w:r>
-            <w:r>
-              <w:rPr>
-                <w:noProof/>
-                <w:webHidden/>
-              </w:rPr>
-              <w:tab/>
-            </w:r>
-            <w:r>
-              <w:rPr>
-                <w:noProof/>
-                <w:webHidden/>
-              </w:rPr>
-              <w:fldChar w:fldCharType="begin"/>
-            </w:r>
-            <w:r>
-              <w:rPr>
-                <w:noProof/>
-                <w:webHidden/>
-              </w:rPr>
-              <w:instrText xml:space="preserve"> PAGEREF _Toc224570653 \h </w:instrText>
-            </w:r>
-            <w:r>
-              <w:rPr>
-                <w:noProof/>
-                <w:webHidden/>
-              </w:rPr>
-            </w:r>
-            <w:r>
-              <w:rPr>
-                <w:noProof/>
-                <w:webHidden/>
-              </w:rPr>
-              <w:fldChar w:fldCharType="separate"/>
-            </w:r>
-            <w:r>
-              <w:rPr>
-                <w:noProof/>
-                <w:webHidden/>
-              </w:rPr>
-              <w:t>17</w:t>
+              <w:t>18</w:t>
             </w:r>
             <w:r>
               <w:rPr>
@@ -2613,7 +2660,7 @@
           <w:lang w:val="es-SV"/>
         </w:rPr>
       </w:pPr>
-      <w:bookmarkStart w:id="1" w:name="_Toc224570635"/>
+      <w:bookmarkStart w:id="2" w:name="_Toc224676897"/>
       <w:r>
         <w:rPr>
           <w:rFonts w:ascii="Arial" w:hAnsi="Arial" w:cs="Arial"/>
@@ -2627,7 +2674,7 @@
         <w:lastRenderedPageBreak/>
         <w:t>Contexto de la Empresa</w:t>
       </w:r>
-      <w:bookmarkEnd w:id="1"/>
+      <w:bookmarkEnd w:id="2"/>
     </w:p>
     <w:p>
       <w:pPr>
@@ -2871,7 +2918,7 @@
           <w:lang w:val="es-SV"/>
         </w:rPr>
       </w:pPr>
-      <w:bookmarkStart w:id="2" w:name="_Toc224570636"/>
+      <w:bookmarkStart w:id="3" w:name="_Toc224676898"/>
       <w:r>
         <w:rPr>
           <w:rFonts w:ascii="Arial" w:hAnsi="Arial" w:cs="Arial"/>
@@ -2885,7 +2932,7 @@
         <w:lastRenderedPageBreak/>
         <w:t>Diagnóstico del Proceso</w:t>
       </w:r>
-      <w:bookmarkEnd w:id="2"/>
+      <w:bookmarkEnd w:id="3"/>
     </w:p>
     <w:p>
       <w:pPr>
@@ -2898,7 +2945,7 @@
           <w:lang w:val="es-SV"/>
         </w:rPr>
       </w:pPr>
-      <w:bookmarkStart w:id="3" w:name="_Toc224570637"/>
+      <w:bookmarkStart w:id="4" w:name="_Toc224676899"/>
       <w:r>
         <w:rPr>
           <w:rFonts w:ascii="Arial" w:hAnsi="Arial" w:cs="Arial"/>
@@ -2909,7 +2956,7 @@
         </w:rPr>
         <w:t>Problema actual</w:t>
       </w:r>
-      <w:bookmarkEnd w:id="3"/>
+      <w:bookmarkEnd w:id="4"/>
     </w:p>
     <w:p>
       <w:pPr>
@@ -3098,7 +3145,7 @@
           <w:lang w:val="es-SV"/>
         </w:rPr>
       </w:pPr>
-      <w:bookmarkStart w:id="4" w:name="_Toc224570638"/>
+      <w:bookmarkStart w:id="5" w:name="_Toc224676900"/>
       <w:r>
         <w:rPr>
           <w:rFonts w:ascii="Arial" w:hAnsi="Arial" w:cs="Arial"/>
@@ -3110,7 +3157,7 @@
         <w:lastRenderedPageBreak/>
         <w:t>Diagnóstico de la solución</w:t>
       </w:r>
-      <w:bookmarkEnd w:id="4"/>
+      <w:bookmarkEnd w:id="5"/>
     </w:p>
     <w:p>
       <w:pPr>
@@ -3409,7 +3456,7 @@
           <w:lang w:val="es-SV"/>
         </w:rPr>
       </w:pPr>
-      <w:bookmarkStart w:id="5" w:name="_Toc224570639"/>
+      <w:bookmarkStart w:id="6" w:name="_Toc224676901"/>
       <w:r>
         <w:rPr>
           <w:rFonts w:ascii="Arial" w:hAnsi="Arial" w:cs="Arial"/>
@@ -3420,7 +3467,7 @@
         </w:rPr>
         <w:t>Debilidades del proceso identificadas (según enfoque CMMI)</w:t>
       </w:r>
-      <w:bookmarkEnd w:id="5"/>
+      <w:bookmarkEnd w:id="6"/>
     </w:p>
     <w:p>
       <w:pPr>
@@ -3620,7 +3667,7 @@
           <w:lang w:val="es-SV"/>
         </w:rPr>
       </w:pPr>
-      <w:bookmarkStart w:id="6" w:name="_Toc224570640"/>
+      <w:bookmarkStart w:id="7" w:name="_Toc224676902"/>
       <w:r>
         <w:rPr>
           <w:rFonts w:ascii="Arial" w:hAnsi="Arial" w:cs="Arial"/>
@@ -3631,7 +3678,7 @@
         </w:rPr>
         <w:t>Conclusión del diagnostico</w:t>
       </w:r>
-      <w:bookmarkEnd w:id="6"/>
+      <w:bookmarkEnd w:id="7"/>
     </w:p>
     <w:p>
       <w:pPr>
@@ -3781,7 +3828,7 @@
           <w:lang w:val="es-SV"/>
         </w:rPr>
       </w:pPr>
-      <w:bookmarkStart w:id="7" w:name="_Toc224570641"/>
+      <w:bookmarkStart w:id="8" w:name="_Toc224676903"/>
       <w:r>
         <w:rPr>
           <w:rFonts w:ascii="Arial" w:hAnsi="Arial" w:cs="Arial"/>
@@ -3795,7 +3842,7 @@
         <w:lastRenderedPageBreak/>
         <w:t>Diagramas AS-IS</w:t>
       </w:r>
-      <w:bookmarkEnd w:id="7"/>
+      <w:bookmarkEnd w:id="8"/>
     </w:p>
     <w:p>
       <w:pPr>
@@ -3808,7 +3855,7 @@
           <w:lang w:val="es-SV"/>
         </w:rPr>
       </w:pPr>
-      <w:bookmarkStart w:id="8" w:name="_Toc224570642"/>
+      <w:bookmarkStart w:id="9" w:name="_Toc224676904"/>
       <w:r>
         <w:rPr>
           <w:rFonts w:ascii="Arial" w:hAnsi="Arial" w:cs="Arial"/>
@@ -3819,7 +3866,7 @@
         </w:rPr>
         <w:t>Buscar un documento en el correo</w:t>
       </w:r>
-      <w:bookmarkEnd w:id="8"/>
+      <w:bookmarkEnd w:id="9"/>
     </w:p>
     <w:p>
       <w:pPr>
@@ -3915,7 +3962,7 @@
           <w:lang w:val="es-SV"/>
         </w:rPr>
       </w:pPr>
-      <w:bookmarkStart w:id="9" w:name="_Toc224570643"/>
+      <w:bookmarkStart w:id="10" w:name="_Toc224676905"/>
       <w:r>
         <w:rPr>
           <w:rFonts w:ascii="Arial" w:hAnsi="Arial" w:cs="Arial"/>
@@ -3927,7 +3974,7 @@
         <w:lastRenderedPageBreak/>
         <w:t>Buscar un documento en los archivos compartidos</w:t>
       </w:r>
-      <w:bookmarkEnd w:id="9"/>
+      <w:bookmarkEnd w:id="10"/>
       <w:r>
         <w:rPr>
           <w:rFonts w:ascii="Arial" w:hAnsi="Arial" w:cs="Arial"/>
@@ -4033,7 +4080,7 @@
           <w:lang w:val="es-SV"/>
         </w:rPr>
       </w:pPr>
-      <w:bookmarkStart w:id="10" w:name="_Toc224570644"/>
+      <w:bookmarkStart w:id="11" w:name="_Toc224676906"/>
       <w:r>
         <w:rPr>
           <w:rFonts w:ascii="Arial" w:hAnsi="Arial" w:cs="Arial"/>
@@ -4045,7 +4092,7 @@
         <w:lastRenderedPageBreak/>
         <w:t>Buscar un documento en los archivos locales</w:t>
       </w:r>
-      <w:bookmarkEnd w:id="10"/>
+      <w:bookmarkEnd w:id="11"/>
     </w:p>
     <w:p>
       <w:pPr>
@@ -4144,7 +4191,7 @@
           <w:lang w:val="es-SV"/>
         </w:rPr>
       </w:pPr>
-      <w:bookmarkStart w:id="11" w:name="_Toc224570645"/>
+      <w:bookmarkStart w:id="12" w:name="_Toc224676907"/>
       <w:r>
         <w:rPr>
           <w:rFonts w:ascii="Arial" w:hAnsi="Arial" w:cs="Arial"/>
@@ -4158,7 +4205,7 @@
         <w:lastRenderedPageBreak/>
         <w:t>Diagramas TO-BE</w:t>
       </w:r>
-      <w:bookmarkEnd w:id="11"/>
+      <w:bookmarkEnd w:id="12"/>
     </w:p>
     <w:p>
       <w:pPr>
@@ -4171,7 +4218,7 @@
           <w:lang w:val="es-SV"/>
         </w:rPr>
       </w:pPr>
-      <w:bookmarkStart w:id="12" w:name="_Toc224570646"/>
+      <w:bookmarkStart w:id="13" w:name="_Toc224676908"/>
       <w:r>
         <w:rPr>
           <w:rFonts w:ascii="Arial" w:hAnsi="Arial" w:cs="Arial"/>
@@ -4182,7 +4229,7 @@
         </w:rPr>
         <w:t>Buscar un documento</w:t>
       </w:r>
-      <w:bookmarkEnd w:id="12"/>
+      <w:bookmarkEnd w:id="13"/>
     </w:p>
     <w:p>
       <w:pPr>
@@ -4293,7 +4340,7 @@
           <w:lang w:val="es-SV"/>
         </w:rPr>
       </w:pPr>
-      <w:bookmarkStart w:id="13" w:name="_Toc224570647"/>
+      <w:bookmarkStart w:id="14" w:name="_Toc224676909"/>
       <w:r>
         <w:rPr>
           <w:rFonts w:ascii="Arial" w:hAnsi="Arial" w:cs="Arial"/>
@@ -4305,7 +4352,7 @@
         <w:lastRenderedPageBreak/>
         <w:t>Subir un documento</w:t>
       </w:r>
-      <w:bookmarkEnd w:id="13"/>
+      <w:bookmarkEnd w:id="14"/>
     </w:p>
     <w:p>
       <w:pPr>
@@ -4424,7 +4471,7 @@
           <w:lang w:val="es-SV"/>
         </w:rPr>
       </w:pPr>
-      <w:bookmarkStart w:id="14" w:name="_Toc224570648"/>
+      <w:bookmarkStart w:id="15" w:name="_Toc224676910"/>
       <w:r>
         <w:rPr>
           <w:rFonts w:ascii="Arial" w:hAnsi="Arial" w:cs="Arial"/>
@@ -4436,7 +4483,7 @@
         <w:lastRenderedPageBreak/>
         <w:t>Crear un nuevo usuario</w:t>
       </w:r>
-      <w:bookmarkEnd w:id="14"/>
+      <w:bookmarkEnd w:id="15"/>
     </w:p>
     <w:p>
       <w:pPr>
@@ -4569,7 +4616,7 @@
           <w:lang w:val="es-SV"/>
         </w:rPr>
       </w:pPr>
-      <w:bookmarkStart w:id="15" w:name="_Toc224298479"/>
+      <w:bookmarkStart w:id="16" w:name="_Toc224298479"/>
       <w:r>
         <w:rPr>
           <w:rFonts w:ascii="Arial" w:eastAsiaTheme="majorEastAsia" w:hAnsi="Arial" w:cs="Arial"/>
@@ -4580,16 +4627,16 @@
         <w:lastRenderedPageBreak/>
         <w:t>Mejoras concretas</w:t>
       </w:r>
-      <w:bookmarkEnd w:id="15"/>
-    </w:p>
-    <w:p>
-      <w:pPr>
-        <w:rPr>
-          <w:rFonts w:ascii="Arial" w:eastAsiaTheme="majorEastAsia" w:hAnsi="Arial" w:cs="Arial"/>
-          <w:lang w:val="es-SV"/>
-        </w:rPr>
-      </w:pPr>
-      <w:bookmarkStart w:id="16" w:name="_Toc224298480"/>
+      <w:bookmarkEnd w:id="16"/>
+    </w:p>
+    <w:p>
+      <w:pPr>
+        <w:rPr>
+          <w:rFonts w:ascii="Arial" w:eastAsiaTheme="majorEastAsia" w:hAnsi="Arial" w:cs="Arial"/>
+          <w:lang w:val="es-SV"/>
+        </w:rPr>
+      </w:pPr>
+      <w:bookmarkStart w:id="17" w:name="_Toc224298480"/>
       <w:r>
         <w:rPr>
           <w:rFonts w:ascii="Arial" w:eastAsiaTheme="majorEastAsia" w:hAnsi="Arial" w:cs="Arial"/>
@@ -4621,7 +4668,7 @@
         </w:rPr>
         <w:t>Github</w:t>
       </w:r>
-      <w:bookmarkEnd w:id="16"/>
+      <w:bookmarkEnd w:id="17"/>
       <w:proofErr w:type="spellEnd"/>
     </w:p>
     <w:p>
@@ -4815,23 +4862,7 @@
           <w:rFonts w:ascii="Arial" w:eastAsiaTheme="majorEastAsia" w:hAnsi="Arial" w:cs="Arial"/>
           <w:lang w:val="es-SV"/>
         </w:rPr>
-        <w:t xml:space="preserve">Nuestra meta con </w:t>
-      </w:r>
-      <w:proofErr w:type="gramStart"/>
-      <w:r>
-        <w:rPr>
-          <w:rFonts w:ascii="Arial" w:eastAsiaTheme="majorEastAsia" w:hAnsi="Arial" w:cs="Arial"/>
-          <w:lang w:val="es-SV"/>
-        </w:rPr>
-        <w:t>esto,</w:t>
-      </w:r>
-      <w:proofErr w:type="gramEnd"/>
-      <w:r>
-        <w:rPr>
-          <w:rFonts w:ascii="Arial" w:eastAsiaTheme="majorEastAsia" w:hAnsi="Arial" w:cs="Arial"/>
-          <w:lang w:val="es-SV"/>
-        </w:rPr>
-        <w:t xml:space="preserve"> es que quede claro que hace cada </w:t>
+        <w:t xml:space="preserve">Nuestra meta con esto, es que quede claro que hace cada </w:t>
       </w:r>
       <w:proofErr w:type="spellStart"/>
       <w:r>
@@ -4857,31 +4888,15 @@
           <w:lang w:val="es-SV"/>
         </w:rPr>
       </w:pPr>
-      <w:bookmarkStart w:id="17" w:name="_Toc224298481"/>
-      <w:r>
-        <w:rPr>
-          <w:rFonts w:ascii="Arial" w:eastAsiaTheme="majorEastAsia" w:hAnsi="Arial" w:cs="Arial"/>
-          <w:lang w:val="es-SV"/>
-        </w:rPr>
-        <w:t xml:space="preserve">Uso de </w:t>
-      </w:r>
-      <w:proofErr w:type="gramStart"/>
-      <w:r>
-        <w:rPr>
-          <w:rFonts w:ascii="Arial" w:eastAsiaTheme="majorEastAsia" w:hAnsi="Arial" w:cs="Arial"/>
-          <w:lang w:val="es-SV"/>
-        </w:rPr>
-        <w:t>status</w:t>
-      </w:r>
-      <w:proofErr w:type="gramEnd"/>
-      <w:r>
-        <w:rPr>
-          <w:rFonts w:ascii="Arial" w:eastAsiaTheme="majorEastAsia" w:hAnsi="Arial" w:cs="Arial"/>
-          <w:lang w:val="es-SV"/>
-        </w:rPr>
-        <w:t xml:space="preserve"> en el tablero</w:t>
-      </w:r>
-      <w:bookmarkEnd w:id="17"/>
+      <w:bookmarkStart w:id="18" w:name="_Toc224298481"/>
+      <w:r>
+        <w:rPr>
+          <w:rFonts w:ascii="Arial" w:eastAsiaTheme="majorEastAsia" w:hAnsi="Arial" w:cs="Arial"/>
+          <w:lang w:val="es-SV"/>
+        </w:rPr>
+        <w:t>Uso de status en el tablero</w:t>
+      </w:r>
+      <w:bookmarkEnd w:id="18"/>
     </w:p>
     <w:p>
       <w:pPr>
@@ -5019,7 +5034,7 @@
           <w:lang w:val="es-SV"/>
         </w:rPr>
       </w:pPr>
-      <w:bookmarkStart w:id="18" w:name="_Toc224298482"/>
+      <w:bookmarkStart w:id="19" w:name="_Toc224298482"/>
       <w:r>
         <w:rPr>
           <w:rFonts w:ascii="Arial" w:eastAsiaTheme="majorEastAsia" w:hAnsi="Arial" w:cs="Arial"/>
@@ -5044,7 +5059,7 @@
         </w:rPr>
         <w:t xml:space="preserve"> en el tablero</w:t>
       </w:r>
-      <w:bookmarkEnd w:id="18"/>
+      <w:bookmarkEnd w:id="19"/>
     </w:p>
     <w:p>
       <w:pPr>
@@ -5141,7 +5156,7 @@
           <w:lang w:val="es-SV"/>
         </w:rPr>
       </w:pPr>
-      <w:bookmarkStart w:id="19" w:name="_Toc224298483"/>
+      <w:bookmarkStart w:id="20" w:name="_Toc224298483"/>
       <w:r>
         <w:rPr>
           <w:rFonts w:ascii="Arial" w:eastAsiaTheme="majorEastAsia" w:hAnsi="Arial" w:cs="Arial"/>
@@ -5165,7 +5180,7 @@
         </w:rPr>
         <w:t xml:space="preserve"> en el tablero</w:t>
       </w:r>
-      <w:bookmarkEnd w:id="19"/>
+      <w:bookmarkEnd w:id="20"/>
     </w:p>
     <w:p>
       <w:pPr>
@@ -5439,7 +5454,7 @@
           <w:lang w:val="es-SV"/>
         </w:rPr>
       </w:pPr>
-      <w:bookmarkStart w:id="20" w:name="_Toc224298484"/>
+      <w:bookmarkStart w:id="21" w:name="_Toc224298484"/>
       <w:r>
         <w:rPr>
           <w:rFonts w:ascii="Arial" w:eastAsiaTheme="majorEastAsia" w:hAnsi="Arial" w:cs="Arial"/>
@@ -5464,7 +5479,7 @@
         </w:rPr>
         <w:t xml:space="preserve"> en el tablero</w:t>
       </w:r>
-      <w:bookmarkEnd w:id="20"/>
+      <w:bookmarkEnd w:id="21"/>
     </w:p>
     <w:p>
       <w:pPr>
@@ -5495,8 +5510,8 @@
           <w:lang w:val="es-SV"/>
         </w:rPr>
       </w:pPr>
-      <w:bookmarkStart w:id="21" w:name="_Toc224298485"/>
-      <w:bookmarkStart w:id="22" w:name="_Toc224570649"/>
+      <w:bookmarkStart w:id="22" w:name="_Toc224298485"/>
+      <w:bookmarkStart w:id="23" w:name="_Toc224676911"/>
       <w:r>
         <w:rPr>
           <w:rFonts w:ascii="Arial" w:hAnsi="Arial" w:cs="Arial"/>
@@ -5509,8 +5524,8 @@
         </w:rPr>
         <w:t>Evidencia de aplicación</w:t>
       </w:r>
-      <w:bookmarkEnd w:id="21"/>
       <w:bookmarkEnd w:id="22"/>
+      <w:bookmarkEnd w:id="23"/>
     </w:p>
     <w:p>
       <w:pPr>
@@ -5523,8 +5538,8 @@
           <w:lang w:val="es-SV"/>
         </w:rPr>
       </w:pPr>
-      <w:bookmarkStart w:id="23" w:name="_Toc224298486"/>
-      <w:bookmarkStart w:id="24" w:name="_Toc224570650"/>
+      <w:bookmarkStart w:id="24" w:name="_Toc224298486"/>
+      <w:bookmarkStart w:id="25" w:name="_Toc224676912"/>
       <w:r>
         <w:rPr>
           <w:rFonts w:ascii="Arial" w:hAnsi="Arial" w:cs="Arial"/>
@@ -5535,8 +5550,8 @@
         </w:rPr>
         <w:t>Tablero</w:t>
       </w:r>
-      <w:bookmarkEnd w:id="23"/>
       <w:bookmarkEnd w:id="24"/>
+      <w:bookmarkEnd w:id="25"/>
     </w:p>
     <w:p>
       <w:pPr>
@@ -5567,7 +5582,7 @@
         <w:rPr>
           <w:rFonts w:ascii="Arial" w:hAnsi="Arial" w:cs="Arial"/>
           <w:noProof/>
-          <w:lang w:val="es-SV"/>
+          <w:lang w:val="es-SV" w:eastAsia="es-SV"/>
         </w:rPr>
         <w:drawing>
           <wp:inline distT="0" distB="0" distL="0" distR="0" wp14:anchorId="3F098D4F" wp14:editId="3423ED66">
@@ -5625,8 +5640,8 @@
           <w:lang w:val="es-SV"/>
         </w:rPr>
       </w:pPr>
-      <w:bookmarkStart w:id="25" w:name="_Toc224298487"/>
-      <w:bookmarkStart w:id="26" w:name="_Toc224570651"/>
+      <w:bookmarkStart w:id="26" w:name="_Toc224298487"/>
+      <w:bookmarkStart w:id="27" w:name="_Toc224676913"/>
       <w:r>
         <w:rPr>
           <w:rFonts w:ascii="Arial" w:hAnsi="Arial" w:cs="Arial"/>
@@ -5648,8 +5663,8 @@
         </w:rPr>
         <w:t>commits</w:t>
       </w:r>
-      <w:bookmarkEnd w:id="25"/>
       <w:bookmarkEnd w:id="26"/>
+      <w:bookmarkEnd w:id="27"/>
       <w:proofErr w:type="spellEnd"/>
     </w:p>
     <w:p>
@@ -5724,7 +5739,7 @@
           <w:lang w:val="es-SV"/>
         </w:rPr>
       </w:pPr>
-      <w:bookmarkStart w:id="27" w:name="_Toc224570652"/>
+      <w:bookmarkStart w:id="28" w:name="_Toc224676914"/>
       <w:r>
         <w:rPr>
           <w:rFonts w:ascii="Arial" w:hAnsi="Arial" w:cs="Arial"/>
@@ -5751,7 +5766,7 @@
         </w:rPr>
         <w:t>Github</w:t>
       </w:r>
-      <w:bookmarkEnd w:id="27"/>
+      <w:bookmarkEnd w:id="28"/>
       <w:proofErr w:type="spellEnd"/>
     </w:p>
     <w:p>
@@ -5972,7 +5987,7 @@
           <w:lang w:val="es-SV"/>
         </w:rPr>
       </w:pPr>
-      <w:bookmarkStart w:id="28" w:name="_Toc224570653"/>
+      <w:bookmarkStart w:id="29" w:name="_Toc224676915"/>
       <w:r>
         <w:rPr>
           <w:rFonts w:ascii="Arial" w:hAnsi="Arial" w:cs="Arial"/>
@@ -5986,7 +6001,7 @@
         <w:lastRenderedPageBreak/>
         <w:t>Anexos</w:t>
       </w:r>
-      <w:bookmarkEnd w:id="28"/>
+      <w:bookmarkEnd w:id="29"/>
     </w:p>
     <w:p>
       <w:pPr>
@@ -6379,7 +6394,7 @@
 </file>
 
 <file path=word/endnotes.xml><?xml version="1.0" encoding="utf-8"?>
-<w:endnotes xmlns:wpc="http://schemas.microsoft.com/office/word/2010/wordprocessingCanvas" xmlns:cx="http://schemas.microsoft.com/office/drawing/2014/chartex" xmlns:cx1="http://schemas.microsoft.com/office/drawing/2015/9/8/chartex" xmlns:cx2="http://schemas.microsoft.com/office/drawing/2015/10/21/chartex" xmlns:cx3="http://schemas.microsoft.com/office/drawing/2016/5/9/chartex" xmlns:cx4="http://schemas.microsoft.com/office/drawing/2016/5/10/chartex" xmlns:cx5="http://schemas.microsoft.com/office/drawing/2016/5/11/chartex" xmlns:cx6="http://schemas.microsoft.com/office/drawing/2016/5/12/chartex" xmlns:cx7="http://schemas.microsoft.com/office/drawing/2016/5/13/chartex" xmlns:cx8="http://schemas.microsoft.com/office/drawing/2016/5/14/chartex" xmlns:mc="http://schemas.openxmlformats.org/markup-compatibility/2006" xmlns:aink="http://schemas.microsoft.com/office/drawing/2016/ink" xmlns:am3d="http://schemas.microsoft.com/office/drawing/2017/model3d" xmlns:o="urn:schemas-microsoft-com:office:office" xmlns:oel="http://schemas.microsoft.com/office/2019/extlst" xmlns:r="http://schemas.openxmlformats.org/officeDocument/2006/relationships" xmlns:m="http://schemas.openxmlformats.org/officeDocument/2006/math" xmlns:v="urn:schemas-microsoft-com:vml" xmlns:wp14="http://schemas.microsoft.com/office/word/2010/wordprocessingDrawing" xmlns:wp="http://schemas.openxmlformats.org/drawingml/2006/wordprocessingDrawing" xmlns:w10="urn:schemas-microsoft-com:office:word" xmlns:w="http://schemas.openxmlformats.org/wordprocessingml/2006/main" xmlns:w14="http://schemas.microsoft.com/office/word/2010/wordml" xmlns:w15="http://schemas.microsoft.com/office/word/2012/wordml" xmlns:w16cex="http://schemas.microsoft.com/office/word/2018/wordml/cex" xmlns:w16cid="http://schemas.microsoft.com/office/word/2016/wordml/cid" xmlns:w16="http://schemas.microsoft.com/office/word/2018/wordml" xmlns:w16du="http://schemas.microsoft.com/office/word/2023/wordml/word16du" xmlns:w16sdtdh="http://schemas.microsoft.com/office/word/2020/wordml/sdtdatahash" xmlns:w16sdtfl="http://schemas.microsoft.com/office/word/2024/wordml/sdtformatlock" xmlns:w16se="http://schemas.microsoft.com/office/word/2015/wordml/symex" xmlns:wpg="http://schemas.microsoft.com/office/word/2010/wordprocessingGroup" xmlns:wpi="http://schemas.microsoft.com/office/word/2010/wordprocessingInk" xmlns:wne="http://schemas.microsoft.com/office/word/2006/wordml" xmlns:wps="http://schemas.microsoft.com/office/word/2010/wordprocessingShape" mc:Ignorable="w14 w15 w16se w16cid w16 w16cex w16sdtdh w16sdtfl w16du wp14">
+<w:endnotes xmlns:wpc="http://schemas.microsoft.com/office/word/2010/wordprocessingCanvas" xmlns:cx="http://schemas.microsoft.com/office/drawing/2014/chartex" xmlns:mc="http://schemas.openxmlformats.org/markup-compatibility/2006" xmlns:o="urn:schemas-microsoft-com:office:office" xmlns:r="http://schemas.openxmlformats.org/officeDocument/2006/relationships" xmlns:m="http://schemas.openxmlformats.org/officeDocument/2006/math" xmlns:v="urn:schemas-microsoft-com:vml" xmlns:wp14="http://schemas.microsoft.com/office/word/2010/wordprocessingDrawing" xmlns:wp="http://schemas.openxmlformats.org/drawingml/2006/wordprocessingDrawing" xmlns:w10="urn:schemas-microsoft-com:office:word" xmlns:w="http://schemas.openxmlformats.org/wordprocessingml/2006/main" xmlns:w14="http://schemas.microsoft.com/office/word/2010/wordml" xmlns:w15="http://schemas.microsoft.com/office/word/2012/wordml" xmlns:w16se="http://schemas.microsoft.com/office/word/2015/wordml/symex" xmlns:wpg="http://schemas.microsoft.com/office/word/2010/wordprocessingGroup" xmlns:wpi="http://schemas.microsoft.com/office/word/2010/wordprocessingInk" xmlns:wne="http://schemas.microsoft.com/office/word/2006/wordml" xmlns:wps="http://schemas.microsoft.com/office/word/2010/wordprocessingShape" mc:Ignorable="w14 w15 w16se wp14">
   <w:endnote w:type="separator" w:id="-1">
     <w:p>
       <w:pPr>
@@ -6404,7 +6419,7 @@
 </file>
 
 <file path=word/footnotes.xml><?xml version="1.0" encoding="utf-8"?>
-<w:footnotes xmlns:wpc="http://schemas.microsoft.com/office/word/2010/wordprocessingCanvas" xmlns:cx="http://schemas.microsoft.com/office/drawing/2014/chartex" xmlns:cx1="http://schemas.microsoft.com/office/drawing/2015/9/8/chartex" xmlns:cx2="http://schemas.microsoft.com/office/drawing/2015/10/21/chartex" xmlns:cx3="http://schemas.microsoft.com/office/drawing/2016/5/9/chartex" xmlns:cx4="http://schemas.microsoft.com/office/drawing/2016/5/10/chartex" xmlns:cx5="http://schemas.microsoft.com/office/drawing/2016/5/11/chartex" xmlns:cx6="http://schemas.microsoft.com/office/drawing/2016/5/12/chartex" xmlns:cx7="http://schemas.microsoft.com/office/drawing/2016/5/13/chartex" xmlns:cx8="http://schemas.microsoft.com/office/drawing/2016/5/14/chartex" xmlns:mc="http://schemas.openxmlformats.org/markup-compatibility/2006" xmlns:aink="http://schemas.microsoft.com/office/drawing/2016/ink" xmlns:am3d="http://schemas.microsoft.com/office/drawing/2017/model3d" xmlns:o="urn:schemas-microsoft-com:office:office" xmlns:oel="http://schemas.microsoft.com/office/2019/extlst" xmlns:r="http://schemas.openxmlformats.org/officeDocument/2006/relationships" xmlns:m="http://schemas.openxmlformats.org/officeDocument/2006/math" xmlns:v="urn:schemas-microsoft-com:vml" xmlns:wp14="http://schemas.microsoft.com/office/word/2010/wordprocessingDrawing" xmlns:wp="http://schemas.openxmlformats.org/drawingml/2006/wordprocessingDrawing" xmlns:w10="urn:schemas-microsoft-com:office:word" xmlns:w="http://schemas.openxmlformats.org/wordprocessingml/2006/main" xmlns:w14="http://schemas.microsoft.com/office/word/2010/wordml" xmlns:w15="http://schemas.microsoft.com/office/word/2012/wordml" xmlns:w16cex="http://schemas.microsoft.com/office/word/2018/wordml/cex" xmlns:w16cid="http://schemas.microsoft.com/office/word/2016/wordml/cid" xmlns:w16="http://schemas.microsoft.com/office/word/2018/wordml" xmlns:w16du="http://schemas.microsoft.com/office/word/2023/wordml/word16du" xmlns:w16sdtdh="http://schemas.microsoft.com/office/word/2020/wordml/sdtdatahash" xmlns:w16sdtfl="http://schemas.microsoft.com/office/word/2024/wordml/sdtformatlock" xmlns:w16se="http://schemas.microsoft.com/office/word/2015/wordml/symex" xmlns:wpg="http://schemas.microsoft.com/office/word/2010/wordprocessingGroup" xmlns:wpi="http://schemas.microsoft.com/office/word/2010/wordprocessingInk" xmlns:wne="http://schemas.microsoft.com/office/word/2006/wordml" xmlns:wps="http://schemas.microsoft.com/office/word/2010/wordprocessingShape" mc:Ignorable="w14 w15 w16se w16cid w16 w16cex w16sdtdh w16sdtfl w16du wp14">
+<w:footnotes xmlns:wpc="http://schemas.microsoft.com/office/word/2010/wordprocessingCanvas" xmlns:cx="http://schemas.microsoft.com/office/drawing/2014/chartex" xmlns:mc="http://schemas.openxmlformats.org/markup-compatibility/2006" xmlns:o="urn:schemas-microsoft-com:office:office" xmlns:r="http://schemas.openxmlformats.org/officeDocument/2006/relationships" xmlns:m="http://schemas.openxmlformats.org/officeDocument/2006/math" xmlns:v="urn:schemas-microsoft-com:vml" xmlns:wp14="http://schemas.microsoft.com/office/word/2010/wordprocessingDrawing" xmlns:wp="http://schemas.openxmlformats.org/drawingml/2006/wordprocessingDrawing" xmlns:w10="urn:schemas-microsoft-com:office:word" xmlns:w="http://schemas.openxmlformats.org/wordprocessingml/2006/main" xmlns:w14="http://schemas.microsoft.com/office/word/2010/wordml" xmlns:w15="http://schemas.microsoft.com/office/word/2012/wordml" xmlns:w16se="http://schemas.microsoft.com/office/word/2015/wordml/symex" xmlns:wpg="http://schemas.microsoft.com/office/word/2010/wordprocessingGroup" xmlns:wpi="http://schemas.microsoft.com/office/word/2010/wordprocessingInk" xmlns:wne="http://schemas.microsoft.com/office/word/2006/wordml" xmlns:wps="http://schemas.microsoft.com/office/word/2010/wordprocessingShape" mc:Ignorable="w14 w15 w16se wp14">
   <w:footnote w:type="separator" w:id="-1">
     <w:p>
       <w:pPr>
@@ -6689,7 +6704,7 @@
 </file>
 
 <file path=word/header1.xml><?xml version="1.0" encoding="utf-8"?>
-<w:hdr xmlns:wpc="http://schemas.microsoft.com/office/word/2010/wordprocessingCanvas" xmlns:cx="http://schemas.microsoft.com/office/drawing/2014/chartex" xmlns:cx1="http://schemas.microsoft.com/office/drawing/2015/9/8/chartex" xmlns:cx2="http://schemas.microsoft.com/office/drawing/2015/10/21/chartex" xmlns:cx3="http://schemas.microsoft.com/office/drawing/2016/5/9/chartex" xmlns:cx4="http://schemas.microsoft.com/office/drawing/2016/5/10/chartex" xmlns:cx5="http://schemas.microsoft.com/office/drawing/2016/5/11/chartex" xmlns:cx6="http://schemas.microsoft.com/office/drawing/2016/5/12/chartex" xmlns:cx7="http://schemas.microsoft.com/office/drawing/2016/5/13/chartex" xmlns:cx8="http://schemas.microsoft.com/office/drawing/2016/5/14/chartex" xmlns:mc="http://schemas.openxmlformats.org/markup-compatibility/2006" xmlns:aink="http://schemas.microsoft.com/office/drawing/2016/ink" xmlns:am3d="http://schemas.microsoft.com/office/drawing/2017/model3d" xmlns:o="urn:schemas-microsoft-com:office:office" xmlns:oel="http://schemas.microsoft.com/office/2019/extlst" xmlns:r="http://schemas.openxmlformats.org/officeDocument/2006/relationships" xmlns:m="http://schemas.openxmlformats.org/officeDocument/2006/math" xmlns:v="urn:schemas-microsoft-com:vml" xmlns:wp14="http://schemas.microsoft.com/office/word/2010/wordprocessingDrawing" xmlns:wp="http://schemas.openxmlformats.org/drawingml/2006/wordprocessingDrawing" xmlns:w10="urn:schemas-microsoft-com:office:word" xmlns:w="http://schemas.openxmlformats.org/wordprocessingml/2006/main" xmlns:w14="http://schemas.microsoft.com/office/word/2010/wordml" xmlns:w15="http://schemas.microsoft.com/office/word/2012/wordml" xmlns:w16cex="http://schemas.microsoft.com/office/word/2018/wordml/cex" xmlns:w16cid="http://schemas.microsoft.com/office/word/2016/wordml/cid" xmlns:w16="http://schemas.microsoft.com/office/word/2018/wordml" xmlns:w16du="http://schemas.microsoft.com/office/word/2023/wordml/word16du" xmlns:w16sdtdh="http://schemas.microsoft.com/office/word/2020/wordml/sdtdatahash" xmlns:w16sdtfl="http://schemas.microsoft.com/office/word/2024/wordml/sdtformatlock" xmlns:w16se="http://schemas.microsoft.com/office/word/2015/wordml/symex" xmlns:wpg="http://schemas.microsoft.com/office/word/2010/wordprocessingGroup" xmlns:wpi="http://schemas.microsoft.com/office/word/2010/wordprocessingInk" xmlns:wne="http://schemas.microsoft.com/office/word/2006/wordml" xmlns:wps="http://schemas.microsoft.com/office/word/2010/wordprocessingShape" mc:Ignorable="w14 w15 w16se w16cid w16 w16cex w16sdtdh w16sdtfl w16du wp14">
+<w:hdr xmlns:wpc="http://schemas.microsoft.com/office/word/2010/wordprocessingCanvas" xmlns:cx="http://schemas.microsoft.com/office/drawing/2014/chartex" xmlns:mc="http://schemas.openxmlformats.org/markup-compatibility/2006" xmlns:o="urn:schemas-microsoft-com:office:office" xmlns:r="http://schemas.openxmlformats.org/officeDocument/2006/relationships" xmlns:m="http://schemas.openxmlformats.org/officeDocument/2006/math" xmlns:v="urn:schemas-microsoft-com:vml" xmlns:wp14="http://schemas.microsoft.com/office/word/2010/wordprocessingDrawing" xmlns:wp="http://schemas.openxmlformats.org/drawingml/2006/wordprocessingDrawing" xmlns:w10="urn:schemas-microsoft-com:office:word" xmlns:w="http://schemas.openxmlformats.org/wordprocessingml/2006/main" xmlns:w14="http://schemas.microsoft.com/office/word/2010/wordml" xmlns:w15="http://schemas.microsoft.com/office/word/2012/wordml" xmlns:w16se="http://schemas.microsoft.com/office/word/2015/wordml/symex" xmlns:wpg="http://schemas.microsoft.com/office/word/2010/wordprocessingGroup" xmlns:wpi="http://schemas.microsoft.com/office/word/2010/wordprocessingInk" xmlns:wne="http://schemas.microsoft.com/office/word/2006/wordml" xmlns:wps="http://schemas.microsoft.com/office/word/2010/wordprocessingShape" mc:Ignorable="w14 w15 w16se wp14">
   <w:sdt>
     <w:sdtPr>
       <w:id w:val="-1484083713"/>
@@ -6698,6 +6713,7 @@
         <w:docPartUnique/>
       </w:docPartObj>
     </w:sdtPr>
+    <w:sdtEndPr/>
     <w:sdtContent>
       <w:p>
         <w:pPr>
@@ -6718,7 +6734,7 @@
             <w:noProof/>
             <w:lang w:val="es-ES"/>
           </w:rPr>
-          <w:t>17</w:t>
+          <w:t>21</w:t>
         </w:r>
         <w:r>
           <w:fldChar w:fldCharType="end"/>
@@ -6735,7 +6751,7 @@
 </file>
 
 <file path=word/header2.xml><?xml version="1.0" encoding="utf-8"?>
-<w:hdr xmlns:wpc="http://schemas.microsoft.com/office/word/2010/wordprocessingCanvas" xmlns:cx="http://schemas.microsoft.com/office/drawing/2014/chartex" xmlns:cx1="http://schemas.microsoft.com/office/drawing/2015/9/8/chartex" xmlns:cx2="http://schemas.microsoft.com/office/drawing/2015/10/21/chartex" xmlns:cx3="http://schemas.microsoft.com/office/drawing/2016/5/9/chartex" xmlns:cx4="http://schemas.microsoft.com/office/drawing/2016/5/10/chartex" xmlns:cx5="http://schemas.microsoft.com/office/drawing/2016/5/11/chartex" xmlns:cx6="http://schemas.microsoft.com/office/drawing/2016/5/12/chartex" xmlns:cx7="http://schemas.microsoft.com/office/drawing/2016/5/13/chartex" xmlns:cx8="http://schemas.microsoft.com/office/drawing/2016/5/14/chartex" xmlns:mc="http://schemas.openxmlformats.org/markup-compatibility/2006" xmlns:aink="http://schemas.microsoft.com/office/drawing/2016/ink" xmlns:am3d="http://schemas.microsoft.com/office/drawing/2017/model3d" xmlns:o="urn:schemas-microsoft-com:office:office" xmlns:oel="http://schemas.microsoft.com/office/2019/extlst" xmlns:r="http://schemas.openxmlformats.org/officeDocument/2006/relationships" xmlns:m="http://schemas.openxmlformats.org/officeDocument/2006/math" xmlns:v="urn:schemas-microsoft-com:vml" xmlns:wp14="http://schemas.microsoft.com/office/word/2010/wordprocessingDrawing" xmlns:wp="http://schemas.openxmlformats.org/drawingml/2006/wordprocessingDrawing" xmlns:w10="urn:schemas-microsoft-com:office:word" xmlns:w="http://schemas.openxmlformats.org/wordprocessingml/2006/main" xmlns:w14="http://schemas.microsoft.com/office/word/2010/wordml" xmlns:w15="http://schemas.microsoft.com/office/word/2012/wordml" xmlns:w16cex="http://schemas.microsoft.com/office/word/2018/wordml/cex" xmlns:w16cid="http://schemas.microsoft.com/office/word/2016/wordml/cid" xmlns:w16="http://schemas.microsoft.com/office/word/2018/wordml" xmlns:w16du="http://schemas.microsoft.com/office/word/2023/wordml/word16du" xmlns:w16sdtdh="http://schemas.microsoft.com/office/word/2020/wordml/sdtdatahash" xmlns:w16sdtfl="http://schemas.microsoft.com/office/word/2024/wordml/sdtformatlock" xmlns:w16se="http://schemas.microsoft.com/office/word/2015/wordml/symex" xmlns:wpg="http://schemas.microsoft.com/office/word/2010/wordprocessingGroup" xmlns:wpi="http://schemas.microsoft.com/office/word/2010/wordprocessingInk" xmlns:wne="http://schemas.microsoft.com/office/word/2006/wordml" xmlns:wps="http://schemas.microsoft.com/office/word/2010/wordprocessingShape" mc:Ignorable="w14 w15 w16se w16cid w16 w16cex w16sdtdh w16sdtfl w16du wp14">
+<w:hdr xmlns:wpc="http://schemas.microsoft.com/office/word/2010/wordprocessingCanvas" xmlns:cx="http://schemas.microsoft.com/office/drawing/2014/chartex" xmlns:mc="http://schemas.openxmlformats.org/markup-compatibility/2006" xmlns:o="urn:schemas-microsoft-com:office:office" xmlns:r="http://schemas.openxmlformats.org/officeDocument/2006/relationships" xmlns:m="http://schemas.openxmlformats.org/officeDocument/2006/math" xmlns:v="urn:schemas-microsoft-com:vml" xmlns:wp14="http://schemas.microsoft.com/office/word/2010/wordprocessingDrawing" xmlns:wp="http://schemas.openxmlformats.org/drawingml/2006/wordprocessingDrawing" xmlns:w10="urn:schemas-microsoft-com:office:word" xmlns:w="http://schemas.openxmlformats.org/wordprocessingml/2006/main" xmlns:w14="http://schemas.microsoft.com/office/word/2010/wordml" xmlns:w15="http://schemas.microsoft.com/office/word/2012/wordml" xmlns:w16se="http://schemas.microsoft.com/office/word/2015/wordml/symex" xmlns:wpg="http://schemas.microsoft.com/office/word/2010/wordprocessingGroup" xmlns:wpi="http://schemas.microsoft.com/office/word/2010/wordprocessingInk" xmlns:wne="http://schemas.microsoft.com/office/word/2006/wordml" xmlns:wps="http://schemas.microsoft.com/office/word/2010/wordprocessingShape" mc:Ignorable="w14 w15 w16se wp14">
   <w:sdt>
     <w:sdtPr>
       <w:id w:val="-139118505"/>
@@ -6744,6 +6760,7 @@
         <w:docPartUnique/>
       </w:docPartObj>
     </w:sdtPr>
+    <w:sdtEndPr/>
     <w:sdtContent>
       <w:p>
         <w:pPr>
@@ -6781,7 +6798,7 @@
 </file>
 
 <file path=word/numbering.xml><?xml version="1.0" encoding="utf-8"?>
-<w:numbering xmlns:wpc="http://schemas.microsoft.com/office/word/2010/wordprocessingCanvas" xmlns:cx="http://schemas.microsoft.com/office/drawing/2014/chartex" xmlns:cx1="http://schemas.microsoft.com/office/drawing/2015/9/8/chartex" xmlns:cx2="http://schemas.microsoft.com/office/drawing/2015/10/21/chartex" xmlns:cx3="http://schemas.microsoft.com/office/drawing/2016/5/9/chartex" xmlns:cx4="http://schemas.microsoft.com/office/drawing/2016/5/10/chartex" xmlns:cx5="http://schemas.microsoft.com/office/drawing/2016/5/11/chartex" xmlns:cx6="http://schemas.microsoft.com/office/drawing/2016/5/12/chartex" xmlns:cx7="http://schemas.microsoft.com/office/drawing/2016/5/13/chartex" xmlns:cx8="http://schemas.microsoft.com/office/drawing/2016/5/14/chartex" xmlns:mc="http://schemas.openxmlformats.org/markup-compatibility/2006" xmlns:aink="http://schemas.microsoft.com/office/drawing/2016/ink" xmlns:am3d="http://schemas.microsoft.com/office/drawing/2017/model3d" xmlns:o="urn:schemas-microsoft-com:office:office" xmlns:oel="http://schemas.microsoft.com/office/2019/extlst" xmlns:r="http://schemas.openxmlformats.org/officeDocument/2006/relationships" xmlns:m="http://schemas.openxmlformats.org/officeDocument/2006/math" xmlns:v="urn:schemas-microsoft-com:vml" xmlns:wp14="http://schemas.microsoft.com/office/word/2010/wordprocessingDrawing" xmlns:wp="http://schemas.openxmlformats.org/drawingml/2006/wordprocessingDrawing" xmlns:w10="urn:schemas-microsoft-com:office:word" xmlns:w="http://schemas.openxmlformats.org/wordprocessingml/2006/main" xmlns:w14="http://schemas.microsoft.com/office/word/2010/wordml" xmlns:w15="http://schemas.microsoft.com/office/word/2012/wordml" xmlns:w16cex="http://schemas.microsoft.com/office/word/2018/wordml/cex" xmlns:w16cid="http://schemas.microsoft.com/office/word/2016/wordml/cid" xmlns:w16="http://schemas.microsoft.com/office/word/2018/wordml" xmlns:w16du="http://schemas.microsoft.com/office/word/2023/wordml/word16du" xmlns:w16sdtdh="http://schemas.microsoft.com/office/word/2020/wordml/sdtdatahash" xmlns:w16sdtfl="http://schemas.microsoft.com/office/word/2024/wordml/sdtformatlock" xmlns:w16se="http://schemas.microsoft.com/office/word/2015/wordml/symex" xmlns:wpg="http://schemas.microsoft.com/office/word/2010/wordprocessingGroup" xmlns:wpi="http://schemas.microsoft.com/office/word/2010/wordprocessingInk" xmlns:wne="http://schemas.microsoft.com/office/word/2006/wordml" xmlns:wps="http://schemas.microsoft.com/office/word/2010/wordprocessingShape" mc:Ignorable="w14 w15 w16se w16cid w16 w16cex w16sdtdh w16sdtfl w16du wp14">
+<w:numbering xmlns:wpc="http://schemas.microsoft.com/office/word/2010/wordprocessingCanvas" xmlns:cx="http://schemas.microsoft.com/office/drawing/2014/chartex" xmlns:mc="http://schemas.openxmlformats.org/markup-compatibility/2006" xmlns:o="urn:schemas-microsoft-com:office:office" xmlns:r="http://schemas.openxmlformats.org/officeDocument/2006/relationships" xmlns:m="http://schemas.openxmlformats.org/officeDocument/2006/math" xmlns:v="urn:schemas-microsoft-com:vml" xmlns:wp14="http://schemas.microsoft.com/office/word/2010/wordprocessingDrawing" xmlns:wp="http://schemas.openxmlformats.org/drawingml/2006/wordprocessingDrawing" xmlns:w10="urn:schemas-microsoft-com:office:word" xmlns:w="http://schemas.openxmlformats.org/wordprocessingml/2006/main" xmlns:w14="http://schemas.microsoft.com/office/word/2010/wordml" xmlns:w15="http://schemas.microsoft.com/office/word/2012/wordml" xmlns:w16se="http://schemas.microsoft.com/office/word/2015/wordml/symex" xmlns:wpg="http://schemas.microsoft.com/office/word/2010/wordprocessingGroup" xmlns:wpi="http://schemas.microsoft.com/office/word/2010/wordprocessingInk" xmlns:wne="http://schemas.microsoft.com/office/word/2006/wordml" xmlns:wps="http://schemas.microsoft.com/office/word/2010/wordprocessingShape" mc:Ignorable="w14 w15 w16se wp14">
   <w:abstractNum w:abstractNumId="0" w15:restartNumberingAfterBreak="0">
     <w:nsid w:val="056A5EBF"/>
     <w:multiLevelType w:val="hybridMultilevel"/>
@@ -8030,47 +8047,47 @@
       </w:rPr>
     </w:lvl>
   </w:abstractNum>
-  <w:num w:numId="1" w16cid:durableId="301496225">
+  <w:num w:numId="1">
     <w:abstractNumId w:val="8"/>
   </w:num>
-  <w:num w:numId="2" w16cid:durableId="274217940">
+  <w:num w:numId="2">
     <w:abstractNumId w:val="9"/>
   </w:num>
-  <w:num w:numId="3" w16cid:durableId="1919778043">
+  <w:num w:numId="3">
     <w:abstractNumId w:val="2"/>
   </w:num>
-  <w:num w:numId="4" w16cid:durableId="1936136686">
+  <w:num w:numId="4">
     <w:abstractNumId w:val="3"/>
   </w:num>
-  <w:num w:numId="5" w16cid:durableId="407268725">
+  <w:num w:numId="5">
     <w:abstractNumId w:val="7"/>
   </w:num>
-  <w:num w:numId="6" w16cid:durableId="1988973450">
+  <w:num w:numId="6">
     <w:abstractNumId w:val="10"/>
   </w:num>
-  <w:num w:numId="7" w16cid:durableId="1389495884">
+  <w:num w:numId="7">
     <w:abstractNumId w:val="5"/>
   </w:num>
-  <w:num w:numId="8" w16cid:durableId="1434591481">
+  <w:num w:numId="8">
     <w:abstractNumId w:val="6"/>
   </w:num>
-  <w:num w:numId="9" w16cid:durableId="529612015">
+  <w:num w:numId="9">
     <w:abstractNumId w:val="0"/>
   </w:num>
-  <w:num w:numId="10" w16cid:durableId="1045183493">
+  <w:num w:numId="10">
     <w:abstractNumId w:val="4"/>
   </w:num>
-  <w:num w:numId="11" w16cid:durableId="2119332228">
+  <w:num w:numId="11">
     <w:abstractNumId w:val="1"/>
   </w:num>
-  <w:num w:numId="12" w16cid:durableId="742024732">
+  <w:num w:numId="12">
     <w:abstractNumId w:val="11"/>
   </w:num>
 </w:numbering>
 </file>
 
 <file path=word/styles.xml><?xml version="1.0" encoding="utf-8"?>
-<w:styles xmlns:mc="http://schemas.openxmlformats.org/markup-compatibility/2006" xmlns:r="http://schemas.openxmlformats.org/officeDocument/2006/relationships" xmlns:w="http://schemas.openxmlformats.org/wordprocessingml/2006/main" xmlns:w14="http://schemas.microsoft.com/office/word/2010/wordml" xmlns:w15="http://schemas.microsoft.com/office/word/2012/wordml" xmlns:w16cex="http://schemas.microsoft.com/office/word/2018/wordml/cex" xmlns:w16cid="http://schemas.microsoft.com/office/word/2016/wordml/cid" xmlns:w16="http://schemas.microsoft.com/office/word/2018/wordml" xmlns:w16du="http://schemas.microsoft.com/office/word/2023/wordml/word16du" xmlns:w16sdtdh="http://schemas.microsoft.com/office/word/2020/wordml/sdtdatahash" xmlns:w16sdtfl="http://schemas.microsoft.com/office/word/2024/wordml/sdtformatlock" xmlns:w16se="http://schemas.microsoft.com/office/word/2015/wordml/symex" mc:Ignorable="w14 w15 w16se w16cid w16 w16cex w16sdtdh w16sdtfl w16du">
+<w:styles xmlns:mc="http://schemas.openxmlformats.org/markup-compatibility/2006" xmlns:r="http://schemas.openxmlformats.org/officeDocument/2006/relationships" xmlns:w="http://schemas.openxmlformats.org/wordprocessingml/2006/main" xmlns:w14="http://schemas.microsoft.com/office/word/2010/wordml" xmlns:w15="http://schemas.microsoft.com/office/word/2012/wordml" xmlns:w16se="http://schemas.microsoft.com/office/word/2015/wordml/symex" mc:Ignorable="w14 w15 w16se">
   <w:docDefaults>
     <w:rPrDefault>
       <w:rPr>
@@ -8088,7 +8105,7 @@
       </w:pPr>
     </w:pPrDefault>
   </w:docDefaults>
-  <w:latentStyles w:defLockedState="0" w:defUIPriority="99" w:defSemiHidden="0" w:defUnhideWhenUsed="0" w:defQFormat="0" w:count="376">
+  <w:latentStyles w:defLockedState="0" w:defUIPriority="99" w:defSemiHidden="0" w:defUnhideWhenUsed="0" w:defQFormat="0" w:count="371">
     <w:lsdException w:name="Normal" w:uiPriority="0" w:qFormat="1"/>
     <w:lsdException w:name="heading 1" w:uiPriority="9" w:qFormat="1"/>
     <w:lsdException w:name="heading 2" w:semiHidden="1" w:uiPriority="9" w:unhideWhenUsed="1" w:qFormat="1"/>
@@ -8460,11 +8477,6 @@
     <w:lsdException w:name="List Table 5 Dark Accent 6" w:uiPriority="50"/>
     <w:lsdException w:name="List Table 6 Colorful Accent 6" w:uiPriority="51"/>
     <w:lsdException w:name="List Table 7 Colorful Accent 6" w:uiPriority="52"/>
-    <w:lsdException w:name="Mention" w:semiHidden="1" w:unhideWhenUsed="1"/>
-    <w:lsdException w:name="Smart Hyperlink" w:semiHidden="1" w:unhideWhenUsed="1"/>
-    <w:lsdException w:name="Hashtag" w:semiHidden="1" w:unhideWhenUsed="1"/>
-    <w:lsdException w:name="Unresolved Mention" w:semiHidden="1" w:unhideWhenUsed="1"/>
-    <w:lsdException w:name="Smart Link" w:semiHidden="1" w:unhideWhenUsed="1"/>
   </w:latentStyles>
   <w:style w:type="paragraph" w:default="1" w:styleId="Normal">
     <w:name w:val="Normal"/>
@@ -9523,7 +9535,7 @@
 </file>
 
 <file path=customXml/itemProps1.xml><?xml version="1.0" encoding="utf-8"?>
-<ds:datastoreItem xmlns:ds="http://schemas.openxmlformats.org/officeDocument/2006/customXml" ds:itemID="{E8D93FDD-2AB7-4CBD-ADBF-BEA146B920F5}">
+<ds:datastoreItem xmlns:ds="http://schemas.openxmlformats.org/officeDocument/2006/customXml" ds:itemID="{BE015C62-294D-415A-AD43-56FB8EF50FB3}">
   <ds:schemaRefs>
     <ds:schemaRef ds:uri="http://schemas.openxmlformats.org/officeDocument/2006/bibliography"/>
   </ds:schemaRefs>

</xml_diff>